<commit_message>
Flex and Python conceptual model files
Added Python file and updates other files.

Change-Id: I50e933ba69252280f1e3db3b463db4a47fa051c7
</commit_message>
<xml_diff>
--- a/HelpResourcesSources/TechnicalNotes/FLEx 9.1 Conceptual Model.docx
+++ b/HelpResourcesSources/TechnicalNotes/FLEx 9.1 Conceptual Model.docx
@@ -6,7 +6,7 @@
       <w:pPr>
         <w:pStyle w:val="Title"/>
       </w:pPr>
-      <w:bookmarkStart w:id="0" w:name="_Toc166826526"/>
+      <w:bookmarkStart w:id="0" w:name="_Toc169516466"/>
       <w:r>
         <w:t xml:space="preserve">FLEx </w:t>
       </w:r>
@@ -37,7 +37,7 @@
         <w:rPr>
           <w:szCs w:val="36"/>
         </w:rPr>
-        <w:t xml:space="preserve">May </w:t>
+        <w:t xml:space="preserve">June </w:t>
       </w:r>
       <w:r>
         <w:rPr>
@@ -49,8 +49,10 @@
         <w:rPr>
           <w:szCs w:val="36"/>
         </w:rPr>
-        <w:t>7</w:t>
-      </w:r>
+        <w:t>8</w:t>
+      </w:r>
+      <w:bookmarkStart w:id="1" w:name="_GoBack"/>
+      <w:bookmarkEnd w:id="1"/>
       <w:r>
         <w:rPr>
           <w:szCs w:val="36"/>
@@ -92,7 +94,7 @@
           <w:lang w:eastAsia="en-US"/>
         </w:rPr>
       </w:pPr>
-      <w:hyperlink w:anchor="_Toc166826526" w:history="1">
+      <w:hyperlink w:anchor="_Toc169516466" w:history="1">
         <w:r>
           <w:rPr>
             <w:rStyle w:val="Hyperlink"/>
@@ -119,7 +121,7 @@
             <w:noProof/>
             <w:webHidden/>
           </w:rPr>
-          <w:instrText xml:space="preserve"> PAGEREF _Toc166826526 \h </w:instrText>
+          <w:instrText xml:space="preserve"> PAGEREF _Toc169516466 \h </w:instrText>
         </w:r>
         <w:r>
           <w:rPr>
@@ -165,7 +167,7 @@
           <w:lang w:eastAsia="en-US"/>
         </w:rPr>
       </w:pPr>
-      <w:hyperlink w:anchor="_Toc166826527" w:history="1">
+      <w:hyperlink w:anchor="_Toc169516467" w:history="1">
         <w:r>
           <w:rPr>
             <w:rStyle w:val="Hyperlink"/>
@@ -209,7 +211,7 @@
             <w:noProof/>
             <w:webHidden/>
           </w:rPr>
-          <w:instrText xml:space="preserve"> PAGEREF _Toc166826527 \h </w:instrText>
+          <w:instrText xml:space="preserve"> PAGEREF _Toc169516467 \h </w:instrText>
         </w:r>
         <w:r>
           <w:rPr>
@@ -255,7 +257,7 @@
           <w:lang w:eastAsia="en-US"/>
         </w:rPr>
       </w:pPr>
-      <w:hyperlink w:anchor="_Toc166826528" w:history="1">
+      <w:hyperlink w:anchor="_Toc169516468" w:history="1">
         <w:r>
           <w:rPr>
             <w:rStyle w:val="Hyperlink"/>
@@ -299,7 +301,7 @@
             <w:noProof/>
             <w:webHidden/>
           </w:rPr>
-          <w:instrText xml:space="preserve"> PAGEREF _Toc166826528 \h </w:instrText>
+          <w:instrText xml:space="preserve"> PAGEREF _Toc169516468 \h </w:instrText>
         </w:r>
         <w:r>
           <w:rPr>
@@ -340,7 +342,7 @@
           <w:szCs w:val="22"/>
         </w:rPr>
       </w:pPr>
-      <w:hyperlink w:anchor="_Toc166826529" w:history="1">
+      <w:hyperlink w:anchor="_Toc169516469" w:history="1">
         <w:r>
           <w:rPr>
             <w:rStyle w:val="Hyperlink"/>
@@ -385,7 +387,7 @@
             <w:noProof/>
             <w:webHidden/>
           </w:rPr>
-          <w:instrText xml:space="preserve"> PAGEREF _Toc166826529 \h </w:instrText>
+          <w:instrText xml:space="preserve"> PAGEREF _Toc169516469 \h </w:instrText>
         </w:r>
         <w:r>
           <w:rPr>
@@ -426,7 +428,7 @@
           <w:szCs w:val="22"/>
         </w:rPr>
       </w:pPr>
-      <w:hyperlink w:anchor="_Toc166826530" w:history="1">
+      <w:hyperlink w:anchor="_Toc169516470" w:history="1">
         <w:r>
           <w:rPr>
             <w:rStyle w:val="Hyperlink"/>
@@ -471,7 +473,7 @@
             <w:noProof/>
             <w:webHidden/>
           </w:rPr>
-          <w:instrText xml:space="preserve"> PAGEREF _Toc166826530 \h </w:instrText>
+          <w:instrText xml:space="preserve"> PAGEREF _Toc169516470 \h </w:instrText>
         </w:r>
         <w:r>
           <w:rPr>
@@ -512,7 +514,7 @@
           <w:szCs w:val="22"/>
         </w:rPr>
       </w:pPr>
-      <w:hyperlink w:anchor="_Toc166826531" w:history="1">
+      <w:hyperlink w:anchor="_Toc169516471" w:history="1">
         <w:r>
           <w:rPr>
             <w:rStyle w:val="Hyperlink"/>
@@ -557,7 +559,7 @@
             <w:noProof/>
             <w:webHidden/>
           </w:rPr>
-          <w:instrText xml:space="preserve"> PAGEREF _Toc166826531 \h </w:instrText>
+          <w:instrText xml:space="preserve"> PAGEREF _Toc169516471 \h </w:instrText>
         </w:r>
         <w:r>
           <w:rPr>
@@ -603,7 +605,7 @@
           <w:lang w:eastAsia="en-US"/>
         </w:rPr>
       </w:pPr>
-      <w:hyperlink w:anchor="_Toc166826532" w:history="1">
+      <w:hyperlink w:anchor="_Toc169516472" w:history="1">
         <w:r>
           <w:rPr>
             <w:rStyle w:val="Hyperlink"/>
@@ -647,7 +649,7 @@
             <w:noProof/>
             <w:webHidden/>
           </w:rPr>
-          <w:instrText xml:space="preserve"> PAGEREF _Toc166826532 \h </w:instrText>
+          <w:instrText xml:space="preserve"> PAGEREF _Toc169516472 \h </w:instrText>
         </w:r>
         <w:r>
           <w:rPr>
@@ -692,7 +694,7 @@
           <w:szCs w:val="22"/>
         </w:rPr>
       </w:pPr>
-      <w:hyperlink w:anchor="_Toc166826533" w:history="1">
+      <w:hyperlink w:anchor="_Toc169516473" w:history="1">
         <w:r>
           <w:rPr>
             <w:rStyle w:val="Hyperlink"/>
@@ -737,7 +739,7 @@
             <w:noProof/>
             <w:webHidden/>
           </w:rPr>
-          <w:instrText xml:space="preserve"> PAGEREF _Toc166826533 \h </w:instrText>
+          <w:instrText xml:space="preserve"> PAGEREF _Toc169516473 \h </w:instrText>
         </w:r>
         <w:r>
           <w:rPr>
@@ -782,7 +784,7 @@
           <w:szCs w:val="22"/>
         </w:rPr>
       </w:pPr>
-      <w:hyperlink w:anchor="_Toc166826534" w:history="1">
+      <w:hyperlink w:anchor="_Toc169516474" w:history="1">
         <w:r>
           <w:rPr>
             <w:rStyle w:val="Hyperlink"/>
@@ -827,7 +829,7 @@
             <w:noProof/>
             <w:webHidden/>
           </w:rPr>
-          <w:instrText xml:space="preserve"> PAGEREF _Toc166826534 \h </w:instrText>
+          <w:instrText xml:space="preserve"> PAGEREF _Toc169516474 \h </w:instrText>
         </w:r>
         <w:r>
           <w:rPr>
@@ -872,7 +874,7 @@
           <w:szCs w:val="22"/>
         </w:rPr>
       </w:pPr>
-      <w:hyperlink w:anchor="_Toc166826535" w:history="1">
+      <w:hyperlink w:anchor="_Toc169516475" w:history="1">
         <w:r>
           <w:rPr>
             <w:rStyle w:val="Hyperlink"/>
@@ -917,7 +919,7 @@
             <w:noProof/>
             <w:webHidden/>
           </w:rPr>
-          <w:instrText xml:space="preserve"> PAGEREF _Toc166826535 \h </w:instrText>
+          <w:instrText xml:space="preserve"> PAGEREF _Toc169516475 \h </w:instrText>
         </w:r>
         <w:r>
           <w:rPr>
@@ -962,7 +964,7 @@
           <w:szCs w:val="22"/>
         </w:rPr>
       </w:pPr>
-      <w:hyperlink w:anchor="_Toc166826536" w:history="1">
+      <w:hyperlink w:anchor="_Toc169516476" w:history="1">
         <w:r>
           <w:rPr>
             <w:rStyle w:val="Hyperlink"/>
@@ -1007,7 +1009,7 @@
             <w:noProof/>
             <w:webHidden/>
           </w:rPr>
-          <w:instrText xml:space="preserve"> PAGEREF _Toc166826536 \h </w:instrText>
+          <w:instrText xml:space="preserve"> PAGEREF _Toc169516476 \h </w:instrText>
         </w:r>
         <w:r>
           <w:rPr>
@@ -1053,7 +1055,7 @@
           <w:lang w:eastAsia="en-US"/>
         </w:rPr>
       </w:pPr>
-      <w:hyperlink w:anchor="_Toc166826537" w:history="1">
+      <w:hyperlink w:anchor="_Toc169516477" w:history="1">
         <w:r>
           <w:rPr>
             <w:rStyle w:val="Hyperlink"/>
@@ -1097,7 +1099,7 @@
             <w:noProof/>
             <w:webHidden/>
           </w:rPr>
-          <w:instrText xml:space="preserve"> PAGEREF _Toc166826537 \h </w:instrText>
+          <w:instrText xml:space="preserve"> PAGEREF _Toc169516477 \h </w:instrText>
         </w:r>
         <w:r>
           <w:rPr>
@@ -1143,7 +1145,7 @@
           <w:lang w:eastAsia="en-US"/>
         </w:rPr>
       </w:pPr>
-      <w:hyperlink w:anchor="_Toc166826538" w:history="1">
+      <w:hyperlink w:anchor="_Toc169516478" w:history="1">
         <w:r>
           <w:rPr>
             <w:rStyle w:val="Hyperlink"/>
@@ -1187,7 +1189,7 @@
             <w:noProof/>
             <w:webHidden/>
           </w:rPr>
-          <w:instrText xml:space="preserve"> PAGEREF _Toc166826538 \h </w:instrText>
+          <w:instrText xml:space="preserve"> PAGEREF _Toc169516478 \h </w:instrText>
         </w:r>
         <w:r>
           <w:rPr>
@@ -1233,7 +1235,7 @@
           <w:lang w:eastAsia="en-US"/>
         </w:rPr>
       </w:pPr>
-      <w:hyperlink w:anchor="_Toc166826539" w:history="1">
+      <w:hyperlink w:anchor="_Toc169516479" w:history="1">
         <w:r>
           <w:rPr>
             <w:rStyle w:val="Hyperlink"/>
@@ -1277,7 +1279,7 @@
             <w:noProof/>
             <w:webHidden/>
           </w:rPr>
-          <w:instrText xml:space="preserve"> PAGEREF _Toc166826539 \h </w:instrText>
+          <w:instrText xml:space="preserve"> PAGEREF _Toc169516479 \h </w:instrText>
         </w:r>
         <w:r>
           <w:rPr>
@@ -1323,7 +1325,7 @@
           <w:lang w:eastAsia="en-US"/>
         </w:rPr>
       </w:pPr>
-      <w:hyperlink w:anchor="_Toc166826540" w:history="1">
+      <w:hyperlink w:anchor="_Toc169516480" w:history="1">
         <w:r>
           <w:rPr>
             <w:rStyle w:val="Hyperlink"/>
@@ -1367,7 +1369,7 @@
             <w:noProof/>
             <w:webHidden/>
           </w:rPr>
-          <w:instrText xml:space="preserve"> PAGEREF _Toc166826540 \h </w:instrText>
+          <w:instrText xml:space="preserve"> PAGEREF _Toc169516480 \h </w:instrText>
         </w:r>
         <w:r>
           <w:rPr>
@@ -1413,7 +1415,7 @@
           <w:lang w:eastAsia="en-US"/>
         </w:rPr>
       </w:pPr>
-      <w:hyperlink w:anchor="_Toc166826541" w:history="1">
+      <w:hyperlink w:anchor="_Toc169516481" w:history="1">
         <w:r>
           <w:rPr>
             <w:rStyle w:val="Hyperlink"/>
@@ -1457,7 +1459,7 @@
             <w:noProof/>
             <w:webHidden/>
           </w:rPr>
-          <w:instrText xml:space="preserve"> PAGEREF _Toc166826541 \h </w:instrText>
+          <w:instrText xml:space="preserve"> PAGEREF _Toc169516481 \h </w:instrText>
         </w:r>
         <w:r>
           <w:rPr>
@@ -1503,7 +1505,7 @@
           <w:lang w:eastAsia="en-US"/>
         </w:rPr>
       </w:pPr>
-      <w:hyperlink w:anchor="_Toc166826542" w:history="1">
+      <w:hyperlink w:anchor="_Toc169516482" w:history="1">
         <w:r>
           <w:rPr>
             <w:rStyle w:val="Hyperlink"/>
@@ -1547,7 +1549,7 @@
             <w:noProof/>
             <w:webHidden/>
           </w:rPr>
-          <w:instrText xml:space="preserve"> PAGEREF _Toc166826542 \h </w:instrText>
+          <w:instrText xml:space="preserve"> PAGEREF _Toc169516482 \h </w:instrText>
         </w:r>
         <w:r>
           <w:rPr>
@@ -1593,7 +1595,7 @@
           <w:lang w:eastAsia="en-US"/>
         </w:rPr>
       </w:pPr>
-      <w:hyperlink w:anchor="_Toc166826543" w:history="1">
+      <w:hyperlink w:anchor="_Toc169516483" w:history="1">
         <w:r>
           <w:rPr>
             <w:rStyle w:val="Hyperlink"/>
@@ -1637,7 +1639,7 @@
             <w:noProof/>
             <w:webHidden/>
           </w:rPr>
-          <w:instrText xml:space="preserve"> PAGEREF _Toc166826543 \h </w:instrText>
+          <w:instrText xml:space="preserve"> PAGEREF _Toc169516483 \h </w:instrText>
         </w:r>
         <w:r>
           <w:rPr>
@@ -1678,7 +1680,7 @@
           <w:szCs w:val="22"/>
         </w:rPr>
       </w:pPr>
-      <w:hyperlink w:anchor="_Toc166826544" w:history="1">
+      <w:hyperlink w:anchor="_Toc169516484" w:history="1">
         <w:r>
           <w:rPr>
             <w:rStyle w:val="Hyperlink"/>
@@ -1723,7 +1725,7 @@
             <w:noProof/>
             <w:webHidden/>
           </w:rPr>
-          <w:instrText xml:space="preserve"> PAGEREF _Toc166826544 \h </w:instrText>
+          <w:instrText xml:space="preserve"> PAGEREF _Toc169516484 \h </w:instrText>
         </w:r>
         <w:r>
           <w:rPr>
@@ -1764,7 +1766,7 @@
           <w:szCs w:val="22"/>
         </w:rPr>
       </w:pPr>
-      <w:hyperlink w:anchor="_Toc166826545" w:history="1">
+      <w:hyperlink w:anchor="_Toc169516485" w:history="1">
         <w:r>
           <w:rPr>
             <w:rStyle w:val="Hyperlink"/>
@@ -1809,7 +1811,7 @@
             <w:noProof/>
             <w:webHidden/>
           </w:rPr>
-          <w:instrText xml:space="preserve"> PAGEREF _Toc166826545 \h </w:instrText>
+          <w:instrText xml:space="preserve"> PAGEREF _Toc169516485 \h </w:instrText>
         </w:r>
         <w:r>
           <w:rPr>
@@ -1850,7 +1852,7 @@
           <w:szCs w:val="22"/>
         </w:rPr>
       </w:pPr>
-      <w:hyperlink w:anchor="_Toc166826546" w:history="1">
+      <w:hyperlink w:anchor="_Toc169516486" w:history="1">
         <w:r>
           <w:rPr>
             <w:rStyle w:val="Hyperlink"/>
@@ -1895,7 +1897,7 @@
             <w:noProof/>
             <w:webHidden/>
           </w:rPr>
-          <w:instrText xml:space="preserve"> PAGEREF _Toc166826546 \h </w:instrText>
+          <w:instrText xml:space="preserve"> PAGEREF _Toc169516486 \h </w:instrText>
         </w:r>
         <w:r>
           <w:rPr>
@@ -1936,7 +1938,7 @@
           <w:szCs w:val="22"/>
         </w:rPr>
       </w:pPr>
-      <w:hyperlink w:anchor="_Toc166826547" w:history="1">
+      <w:hyperlink w:anchor="_Toc169516487" w:history="1">
         <w:r>
           <w:rPr>
             <w:rStyle w:val="Hyperlink"/>
@@ -1981,7 +1983,7 @@
             <w:noProof/>
             <w:webHidden/>
           </w:rPr>
-          <w:instrText xml:space="preserve"> PAGEREF _Toc166826547 \h </w:instrText>
+          <w:instrText xml:space="preserve"> PAGEREF _Toc169516487 \h </w:instrText>
         </w:r>
         <w:r>
           <w:rPr>
@@ -2022,7 +2024,7 @@
           <w:szCs w:val="22"/>
         </w:rPr>
       </w:pPr>
-      <w:hyperlink w:anchor="_Toc166826548" w:history="1">
+      <w:hyperlink w:anchor="_Toc169516488" w:history="1">
         <w:r>
           <w:rPr>
             <w:rStyle w:val="Hyperlink"/>
@@ -2067,7 +2069,7 @@
             <w:noProof/>
             <w:webHidden/>
           </w:rPr>
-          <w:instrText xml:space="preserve"> PAGEREF _Toc166826548 \h </w:instrText>
+          <w:instrText xml:space="preserve"> PAGEREF _Toc169516488 \h </w:instrText>
         </w:r>
         <w:r>
           <w:rPr>
@@ -2108,7 +2110,7 @@
           <w:szCs w:val="22"/>
         </w:rPr>
       </w:pPr>
-      <w:hyperlink w:anchor="_Toc166826549" w:history="1">
+      <w:hyperlink w:anchor="_Toc169516489" w:history="1">
         <w:r>
           <w:rPr>
             <w:rStyle w:val="Hyperlink"/>
@@ -2153,7 +2155,7 @@
             <w:noProof/>
             <w:webHidden/>
           </w:rPr>
-          <w:instrText xml:space="preserve"> PAGEREF _Toc166826549 \h </w:instrText>
+          <w:instrText xml:space="preserve"> PAGEREF _Toc169516489 \h </w:instrText>
         </w:r>
         <w:r>
           <w:rPr>
@@ -2194,7 +2196,7 @@
           <w:szCs w:val="22"/>
         </w:rPr>
       </w:pPr>
-      <w:hyperlink w:anchor="_Toc166826550" w:history="1">
+      <w:hyperlink w:anchor="_Toc169516490" w:history="1">
         <w:r>
           <w:rPr>
             <w:rStyle w:val="Hyperlink"/>
@@ -2239,7 +2241,7 @@
             <w:noProof/>
             <w:webHidden/>
           </w:rPr>
-          <w:instrText xml:space="preserve"> PAGEREF _Toc166826550 \h </w:instrText>
+          <w:instrText xml:space="preserve"> PAGEREF _Toc169516490 \h </w:instrText>
         </w:r>
         <w:r>
           <w:rPr>
@@ -2285,7 +2287,7 @@
           <w:lang w:eastAsia="en-US"/>
         </w:rPr>
       </w:pPr>
-      <w:hyperlink w:anchor="_Toc166826551" w:history="1">
+      <w:hyperlink w:anchor="_Toc169516491" w:history="1">
         <w:r>
           <w:rPr>
             <w:rStyle w:val="Hyperlink"/>
@@ -2329,7 +2331,7 @@
             <w:noProof/>
             <w:webHidden/>
           </w:rPr>
-          <w:instrText xml:space="preserve"> PAGEREF _Toc166826551 \h </w:instrText>
+          <w:instrText xml:space="preserve"> PAGEREF _Toc169516491 \h </w:instrText>
         </w:r>
         <w:r>
           <w:rPr>
@@ -2370,7 +2372,7 @@
           <w:szCs w:val="22"/>
         </w:rPr>
       </w:pPr>
-      <w:hyperlink w:anchor="_Toc166826552" w:history="1">
+      <w:hyperlink w:anchor="_Toc169516492" w:history="1">
         <w:r>
           <w:rPr>
             <w:rStyle w:val="Hyperlink"/>
@@ -2415,7 +2417,7 @@
             <w:noProof/>
             <w:webHidden/>
           </w:rPr>
-          <w:instrText xml:space="preserve"> PAGEREF _Toc166826552 \h </w:instrText>
+          <w:instrText xml:space="preserve"> PAGEREF _Toc169516492 \h </w:instrText>
         </w:r>
         <w:r>
           <w:rPr>
@@ -2456,7 +2458,7 @@
           <w:szCs w:val="22"/>
         </w:rPr>
       </w:pPr>
-      <w:hyperlink w:anchor="_Toc166826553" w:history="1">
+      <w:hyperlink w:anchor="_Toc169516493" w:history="1">
         <w:r>
           <w:rPr>
             <w:rStyle w:val="Hyperlink"/>
@@ -2501,7 +2503,7 @@
             <w:noProof/>
             <w:webHidden/>
           </w:rPr>
-          <w:instrText xml:space="preserve"> PAGEREF _Toc166826553 \h </w:instrText>
+          <w:instrText xml:space="preserve"> PAGEREF _Toc169516493 \h </w:instrText>
         </w:r>
         <w:r>
           <w:rPr>
@@ -2542,7 +2544,7 @@
           <w:szCs w:val="22"/>
         </w:rPr>
       </w:pPr>
-      <w:hyperlink w:anchor="_Toc166826554" w:history="1">
+      <w:hyperlink w:anchor="_Toc169516494" w:history="1">
         <w:r>
           <w:rPr>
             <w:rStyle w:val="Hyperlink"/>
@@ -2587,7 +2589,7 @@
             <w:noProof/>
             <w:webHidden/>
           </w:rPr>
-          <w:instrText xml:space="preserve"> PAGEREF _Toc166826554 \h </w:instrText>
+          <w:instrText xml:space="preserve"> PAGEREF _Toc169516494 \h </w:instrText>
         </w:r>
         <w:r>
           <w:rPr>
@@ -2633,7 +2635,7 @@
           <w:lang w:eastAsia="en-US"/>
         </w:rPr>
       </w:pPr>
-      <w:hyperlink w:anchor="_Toc166826555" w:history="1">
+      <w:hyperlink w:anchor="_Toc169516495" w:history="1">
         <w:r>
           <w:rPr>
             <w:rStyle w:val="Hyperlink"/>
@@ -2677,7 +2679,7 @@
             <w:noProof/>
             <w:webHidden/>
           </w:rPr>
-          <w:instrText xml:space="preserve"> PAGEREF _Toc166826555 \h </w:instrText>
+          <w:instrText xml:space="preserve"> PAGEREF _Toc169516495 \h </w:instrText>
         </w:r>
         <w:r>
           <w:rPr>
@@ -2723,7 +2725,7 @@
           <w:lang w:eastAsia="en-US"/>
         </w:rPr>
       </w:pPr>
-      <w:hyperlink w:anchor="_Toc166826556" w:history="1">
+      <w:hyperlink w:anchor="_Toc169516496" w:history="1">
         <w:r>
           <w:rPr>
             <w:rStyle w:val="Hyperlink"/>
@@ -2767,7 +2769,7 @@
             <w:noProof/>
             <w:webHidden/>
           </w:rPr>
-          <w:instrText xml:space="preserve"> PAGEREF _Toc166826556 \h </w:instrText>
+          <w:instrText xml:space="preserve"> PAGEREF _Toc169516496 \h </w:instrText>
         </w:r>
         <w:r>
           <w:rPr>
@@ -2808,7 +2810,7 @@
           <w:szCs w:val="22"/>
         </w:rPr>
       </w:pPr>
-      <w:hyperlink w:anchor="_Toc166826557" w:history="1">
+      <w:hyperlink w:anchor="_Toc169516497" w:history="1">
         <w:r>
           <w:rPr>
             <w:rStyle w:val="Hyperlink"/>
@@ -2853,7 +2855,7 @@
             <w:noProof/>
             <w:webHidden/>
           </w:rPr>
-          <w:instrText xml:space="preserve"> PAGEREF _Toc166826557 \h </w:instrText>
+          <w:instrText xml:space="preserve"> PAGEREF _Toc169516497 \h </w:instrText>
         </w:r>
         <w:r>
           <w:rPr>
@@ -2874,6 +2876,92 @@
             <w:webHidden/>
           </w:rPr>
           <w:t>35</w:t>
+        </w:r>
+        <w:r>
+          <w:rPr>
+            <w:noProof/>
+            <w:webHidden/>
+          </w:rPr>
+          <w:fldChar w:fldCharType="end"/>
+        </w:r>
+      </w:hyperlink>
+    </w:p>
+    <w:p>
+      <w:pPr>
+        <w:pStyle w:val="TOC2"/>
+        <w:rPr>
+          <w:rFonts w:asciiTheme="minorHAnsi" w:eastAsiaTheme="minorEastAsia" w:hAnsiTheme="minorHAnsi" w:cstheme="minorBidi"/>
+          <w:noProof/>
+          <w:sz w:val="22"/>
+          <w:szCs w:val="22"/>
+        </w:rPr>
+      </w:pPr>
+      <w:hyperlink w:anchor="_Toc169516498" w:history="1">
+        <w:r>
+          <w:rPr>
+            <w:rStyle w:val="Hyperlink"/>
+            <w:rFonts w:eastAsia="SimSun"/>
+            <w:noProof/>
+          </w:rPr>
+          <w:t>3.5</w:t>
+        </w:r>
+        <w:r>
+          <w:rPr>
+            <w:rFonts w:asciiTheme="minorHAnsi" w:eastAsiaTheme="minorEastAsia" w:hAnsiTheme="minorHAnsi" w:cstheme="minorBidi"/>
+            <w:noProof/>
+            <w:sz w:val="22"/>
+            <w:szCs w:val="22"/>
+          </w:rPr>
+          <w:tab/>
+        </w:r>
+        <w:r>
+          <w:rPr>
+            <w:rStyle w:val="Hyperlink"/>
+            <w:rFonts w:eastAsia="SimSun"/>
+            <w:noProof/>
+          </w:rPr>
+          <w:t>dnSpy debugger</w:t>
+        </w:r>
+        <w:r>
+          <w:rPr>
+            <w:noProof/>
+            <w:webHidden/>
+          </w:rPr>
+          <w:tab/>
+        </w:r>
+        <w:r>
+          <w:rPr>
+            <w:noProof/>
+            <w:webHidden/>
+          </w:rPr>
+          <w:fldChar w:fldCharType="begin"/>
+        </w:r>
+        <w:r>
+          <w:rPr>
+            <w:noProof/>
+            <w:webHidden/>
+          </w:rPr>
+          <w:instrText xml:space="preserve"> PAGEREF _Toc169516498 \h </w:instrText>
+        </w:r>
+        <w:r>
+          <w:rPr>
+            <w:noProof/>
+            <w:webHidden/>
+          </w:rPr>
+        </w:r>
+        <w:r>
+          <w:rPr>
+            <w:noProof/>
+            <w:webHidden/>
+          </w:rPr>
+          <w:fldChar w:fldCharType="separate"/>
+        </w:r>
+        <w:r>
+          <w:rPr>
+            <w:noProof/>
+            <w:webHidden/>
+          </w:rPr>
+          <w:t>36</w:t>
         </w:r>
         <w:r>
           <w:rPr>
@@ -2899,7 +2987,7 @@
           <w:lang w:eastAsia="en-US"/>
         </w:rPr>
       </w:pPr>
-      <w:hyperlink w:anchor="_Toc166826558" w:history="1">
+      <w:hyperlink w:anchor="_Toc169516499" w:history="1">
         <w:r>
           <w:rPr>
             <w:rStyle w:val="Hyperlink"/>
@@ -2943,7 +3031,7 @@
             <w:noProof/>
             <w:webHidden/>
           </w:rPr>
-          <w:instrText xml:space="preserve"> PAGEREF _Toc166826558 \h </w:instrText>
+          <w:instrText xml:space="preserve"> PAGEREF _Toc169516499 \h </w:instrText>
         </w:r>
         <w:r>
           <w:rPr>
@@ -2984,7 +3072,7 @@
           <w:szCs w:val="22"/>
         </w:rPr>
       </w:pPr>
-      <w:hyperlink w:anchor="_Toc166826559" w:history="1">
+      <w:hyperlink w:anchor="_Toc169516500" w:history="1">
         <w:r>
           <w:rPr>
             <w:rStyle w:val="Hyperlink"/>
@@ -3029,7 +3117,7 @@
             <w:noProof/>
             <w:webHidden/>
           </w:rPr>
-          <w:instrText xml:space="preserve"> PAGEREF _Toc166826559 \h </w:instrText>
+          <w:instrText xml:space="preserve"> PAGEREF _Toc169516500 \h </w:instrText>
         </w:r>
         <w:r>
           <w:rPr>
@@ -3075,7 +3163,7 @@
           <w:lang w:eastAsia="en-US"/>
         </w:rPr>
       </w:pPr>
-      <w:hyperlink w:anchor="_Toc166826560" w:history="1">
+      <w:hyperlink w:anchor="_Toc169516501" w:history="1">
         <w:r>
           <w:rPr>
             <w:rStyle w:val="Hyperlink"/>
@@ -3119,7 +3207,7 @@
             <w:noProof/>
             <w:webHidden/>
           </w:rPr>
-          <w:instrText xml:space="preserve"> PAGEREF _Toc166826560 \h </w:instrText>
+          <w:instrText xml:space="preserve"> PAGEREF _Toc169516501 \h </w:instrText>
         </w:r>
         <w:r>
           <w:rPr>
@@ -3165,7 +3253,7 @@
           <w:lang w:eastAsia="en-US"/>
         </w:rPr>
       </w:pPr>
-      <w:hyperlink w:anchor="_Toc166826561" w:history="1">
+      <w:hyperlink w:anchor="_Toc169516502" w:history="1">
         <w:r>
           <w:rPr>
             <w:rStyle w:val="Hyperlink"/>
@@ -3209,7 +3297,7 @@
             <w:noProof/>
             <w:webHidden/>
           </w:rPr>
-          <w:instrText xml:space="preserve"> PAGEREF _Toc166826561 \h </w:instrText>
+          <w:instrText xml:space="preserve"> PAGEREF _Toc169516502 \h </w:instrText>
         </w:r>
         <w:r>
           <w:rPr>
@@ -3255,7 +3343,7 @@
           <w:lang w:eastAsia="en-US"/>
         </w:rPr>
       </w:pPr>
-      <w:hyperlink w:anchor="_Toc166826562" w:history="1">
+      <w:hyperlink w:anchor="_Toc169516503" w:history="1">
         <w:r>
           <w:rPr>
             <w:rStyle w:val="Hyperlink"/>
@@ -3299,7 +3387,7 @@
             <w:noProof/>
             <w:webHidden/>
           </w:rPr>
-          <w:instrText xml:space="preserve"> PAGEREF _Toc166826562 \h </w:instrText>
+          <w:instrText xml:space="preserve"> PAGEREF _Toc169516503 \h </w:instrText>
         </w:r>
         <w:r>
           <w:rPr>
@@ -3345,7 +3433,7 @@
           <w:lang w:eastAsia="en-US"/>
         </w:rPr>
       </w:pPr>
-      <w:hyperlink w:anchor="_Toc166826563" w:history="1">
+      <w:hyperlink w:anchor="_Toc169516504" w:history="1">
         <w:r>
           <w:rPr>
             <w:rStyle w:val="Hyperlink"/>
@@ -3389,7 +3477,7 @@
             <w:noProof/>
             <w:webHidden/>
           </w:rPr>
-          <w:instrText xml:space="preserve"> PAGEREF _Toc166826563 \h </w:instrText>
+          <w:instrText xml:space="preserve"> PAGEREF _Toc169516504 \h </w:instrText>
         </w:r>
         <w:r>
           <w:rPr>
@@ -3435,7 +3523,7 @@
           <w:lang w:eastAsia="en-US"/>
         </w:rPr>
       </w:pPr>
-      <w:hyperlink w:anchor="_Toc166826564" w:history="1">
+      <w:hyperlink w:anchor="_Toc169516505" w:history="1">
         <w:r>
           <w:rPr>
             <w:rStyle w:val="Hyperlink"/>
@@ -3479,7 +3567,7 @@
             <w:noProof/>
             <w:webHidden/>
           </w:rPr>
-          <w:instrText xml:space="preserve"> PAGEREF _Toc166826564 \h </w:instrText>
+          <w:instrText xml:space="preserve"> PAGEREF _Toc169516505 \h </w:instrText>
         </w:r>
         <w:r>
           <w:rPr>
@@ -3525,7 +3613,7 @@
           <w:lang w:eastAsia="en-US"/>
         </w:rPr>
       </w:pPr>
-      <w:hyperlink w:anchor="_Toc166826565" w:history="1">
+      <w:hyperlink w:anchor="_Toc169516506" w:history="1">
         <w:r>
           <w:rPr>
             <w:rStyle w:val="Hyperlink"/>
@@ -3569,7 +3657,7 @@
             <w:noProof/>
             <w:webHidden/>
           </w:rPr>
-          <w:instrText xml:space="preserve"> PAGEREF _Toc166826565 \h </w:instrText>
+          <w:instrText xml:space="preserve"> PAGEREF _Toc169516506 \h </w:instrText>
         </w:r>
         <w:r>
           <w:rPr>
@@ -3610,7 +3698,7 @@
           <w:szCs w:val="22"/>
         </w:rPr>
       </w:pPr>
-      <w:hyperlink w:anchor="_Toc166826566" w:history="1">
+      <w:hyperlink w:anchor="_Toc169516507" w:history="1">
         <w:r>
           <w:rPr>
             <w:rStyle w:val="Hyperlink"/>
@@ -3655,7 +3743,7 @@
             <w:noProof/>
             <w:webHidden/>
           </w:rPr>
-          <w:instrText xml:space="preserve"> PAGEREF _Toc166826566 \h </w:instrText>
+          <w:instrText xml:space="preserve"> PAGEREF _Toc169516507 \h </w:instrText>
         </w:r>
         <w:r>
           <w:rPr>
@@ -3701,7 +3789,7 @@
           <w:lang w:eastAsia="en-US"/>
         </w:rPr>
       </w:pPr>
-      <w:hyperlink w:anchor="_Toc166826567" w:history="1">
+      <w:hyperlink w:anchor="_Toc169516508" w:history="1">
         <w:r>
           <w:rPr>
             <w:rStyle w:val="Hyperlink"/>
@@ -3745,7 +3833,7 @@
             <w:noProof/>
             <w:webHidden/>
           </w:rPr>
-          <w:instrText xml:space="preserve"> PAGEREF _Toc166826567 \h </w:instrText>
+          <w:instrText xml:space="preserve"> PAGEREF _Toc169516508 \h </w:instrText>
         </w:r>
         <w:r>
           <w:rPr>
@@ -3791,7 +3879,7 @@
           <w:lang w:eastAsia="en-US"/>
         </w:rPr>
       </w:pPr>
-      <w:hyperlink w:anchor="_Toc166826568" w:history="1">
+      <w:hyperlink w:anchor="_Toc169516509" w:history="1">
         <w:r>
           <w:rPr>
             <w:rStyle w:val="Hyperlink"/>
@@ -3835,7 +3923,7 @@
             <w:noProof/>
             <w:webHidden/>
           </w:rPr>
-          <w:instrText xml:space="preserve"> PAGEREF _Toc166826568 \h </w:instrText>
+          <w:instrText xml:space="preserve"> PAGEREF _Toc169516509 \h </w:instrText>
         </w:r>
         <w:r>
           <w:rPr>
@@ -3876,7 +3964,7 @@
           <w:szCs w:val="22"/>
         </w:rPr>
       </w:pPr>
-      <w:hyperlink w:anchor="_Toc166826569" w:history="1">
+      <w:hyperlink w:anchor="_Toc169516510" w:history="1">
         <w:r>
           <w:rPr>
             <w:rStyle w:val="Hyperlink"/>
@@ -3921,7 +4009,7 @@
             <w:noProof/>
             <w:webHidden/>
           </w:rPr>
-          <w:instrText xml:space="preserve"> PAGEREF _Toc166826569 \h </w:instrText>
+          <w:instrText xml:space="preserve"> PAGEREF _Toc169516510 \h </w:instrText>
         </w:r>
         <w:r>
           <w:rPr>
@@ -3967,7 +4055,7 @@
           <w:lang w:eastAsia="en-US"/>
         </w:rPr>
       </w:pPr>
-      <w:hyperlink w:anchor="_Toc166826570" w:history="1">
+      <w:hyperlink w:anchor="_Toc169516511" w:history="1">
         <w:r>
           <w:rPr>
             <w:rStyle w:val="Hyperlink"/>
@@ -4011,7 +4099,7 @@
             <w:noProof/>
             <w:webHidden/>
           </w:rPr>
-          <w:instrText xml:space="preserve"> PAGEREF _Toc166826570 \h </w:instrText>
+          <w:instrText xml:space="preserve"> PAGEREF _Toc169516511 \h </w:instrText>
         </w:r>
         <w:r>
           <w:rPr>
@@ -4057,7 +4145,7 @@
           <w:lang w:eastAsia="en-US"/>
         </w:rPr>
       </w:pPr>
-      <w:hyperlink w:anchor="_Toc166826571" w:history="1">
+      <w:hyperlink w:anchor="_Toc169516512" w:history="1">
         <w:r>
           <w:rPr>
             <w:rStyle w:val="Hyperlink"/>
@@ -4101,7 +4189,7 @@
             <w:noProof/>
             <w:webHidden/>
           </w:rPr>
-          <w:instrText xml:space="preserve"> PAGEREF _Toc166826571 \h </w:instrText>
+          <w:instrText xml:space="preserve"> PAGEREF _Toc169516512 \h </w:instrText>
         </w:r>
         <w:r>
           <w:rPr>
@@ -4147,7 +4235,7 @@
           <w:lang w:eastAsia="en-US"/>
         </w:rPr>
       </w:pPr>
-      <w:hyperlink w:anchor="_Toc166826572" w:history="1">
+      <w:hyperlink w:anchor="_Toc169516513" w:history="1">
         <w:r>
           <w:rPr>
             <w:rStyle w:val="Hyperlink"/>
@@ -4191,7 +4279,7 @@
             <w:noProof/>
             <w:webHidden/>
           </w:rPr>
-          <w:instrText xml:space="preserve"> PAGEREF _Toc166826572 \h </w:instrText>
+          <w:instrText xml:space="preserve"> PAGEREF _Toc169516513 \h </w:instrText>
         </w:r>
         <w:r>
           <w:rPr>
@@ -4236,7 +4324,7 @@
           <w:szCs w:val="22"/>
         </w:rPr>
       </w:pPr>
-      <w:hyperlink w:anchor="_Toc166826573" w:history="1">
+      <w:hyperlink w:anchor="_Toc169516514" w:history="1">
         <w:r>
           <w:rPr>
             <w:rStyle w:val="Hyperlink"/>
@@ -4281,7 +4369,7 @@
             <w:noProof/>
             <w:webHidden/>
           </w:rPr>
-          <w:instrText xml:space="preserve"> PAGEREF _Toc166826573 \h </w:instrText>
+          <w:instrText xml:space="preserve"> PAGEREF _Toc169516514 \h </w:instrText>
         </w:r>
         <w:r>
           <w:rPr>
@@ -4326,7 +4414,7 @@
           <w:szCs w:val="22"/>
         </w:rPr>
       </w:pPr>
-      <w:hyperlink w:anchor="_Toc166826574" w:history="1">
+      <w:hyperlink w:anchor="_Toc169516515" w:history="1">
         <w:r>
           <w:rPr>
             <w:rStyle w:val="Hyperlink"/>
@@ -4371,7 +4459,7 @@
             <w:noProof/>
             <w:webHidden/>
           </w:rPr>
-          <w:instrText xml:space="preserve"> PAGEREF _Toc166826574 \h </w:instrText>
+          <w:instrText xml:space="preserve"> PAGEREF _Toc169516515 \h </w:instrText>
         </w:r>
         <w:r>
           <w:rPr>
@@ -4416,7 +4504,7 @@
           <w:szCs w:val="22"/>
         </w:rPr>
       </w:pPr>
-      <w:hyperlink w:anchor="_Toc166826575" w:history="1">
+      <w:hyperlink w:anchor="_Toc169516516" w:history="1">
         <w:r>
           <w:rPr>
             <w:rStyle w:val="Hyperlink"/>
@@ -4461,7 +4549,7 @@
             <w:noProof/>
             <w:webHidden/>
           </w:rPr>
-          <w:instrText xml:space="preserve"> PAGEREF _Toc166826575 \h </w:instrText>
+          <w:instrText xml:space="preserve"> PAGEREF _Toc169516516 \h </w:instrText>
         </w:r>
         <w:r>
           <w:rPr>
@@ -4506,7 +4594,7 @@
           <w:szCs w:val="22"/>
         </w:rPr>
       </w:pPr>
-      <w:hyperlink w:anchor="_Toc166826576" w:history="1">
+      <w:hyperlink w:anchor="_Toc169516517" w:history="1">
         <w:r>
           <w:rPr>
             <w:rStyle w:val="Hyperlink"/>
@@ -4551,7 +4639,7 @@
             <w:noProof/>
             <w:webHidden/>
           </w:rPr>
-          <w:instrText xml:space="preserve"> PAGEREF _Toc166826576 \h </w:instrText>
+          <w:instrText xml:space="preserve"> PAGEREF _Toc169516517 \h </w:instrText>
         </w:r>
         <w:r>
           <w:rPr>
@@ -4596,7 +4684,7 @@
           <w:szCs w:val="22"/>
         </w:rPr>
       </w:pPr>
-      <w:hyperlink w:anchor="_Toc166826577" w:history="1">
+      <w:hyperlink w:anchor="_Toc169516518" w:history="1">
         <w:r>
           <w:rPr>
             <w:rStyle w:val="Hyperlink"/>
@@ -4641,7 +4729,7 @@
             <w:noProof/>
             <w:webHidden/>
           </w:rPr>
-          <w:instrText xml:space="preserve"> PAGEREF _Toc166826577 \h </w:instrText>
+          <w:instrText xml:space="preserve"> PAGEREF _Toc169516518 \h </w:instrText>
         </w:r>
         <w:r>
           <w:rPr>
@@ -4687,7 +4775,7 @@
           <w:lang w:eastAsia="en-US"/>
         </w:rPr>
       </w:pPr>
-      <w:hyperlink w:anchor="_Toc166826578" w:history="1">
+      <w:hyperlink w:anchor="_Toc169516519" w:history="1">
         <w:r>
           <w:rPr>
             <w:rStyle w:val="Hyperlink"/>
@@ -4731,7 +4819,7 @@
             <w:noProof/>
             <w:webHidden/>
           </w:rPr>
-          <w:instrText xml:space="preserve"> PAGEREF _Toc166826578 \h </w:instrText>
+          <w:instrText xml:space="preserve"> PAGEREF _Toc169516519 \h </w:instrText>
         </w:r>
         <w:r>
           <w:rPr>
@@ -4777,7 +4865,7 @@
           <w:lang w:eastAsia="en-US"/>
         </w:rPr>
       </w:pPr>
-      <w:hyperlink w:anchor="_Toc166826579" w:history="1">
+      <w:hyperlink w:anchor="_Toc169516520" w:history="1">
         <w:r>
           <w:rPr>
             <w:rStyle w:val="Hyperlink"/>
@@ -4821,7 +4909,7 @@
             <w:noProof/>
             <w:webHidden/>
           </w:rPr>
-          <w:instrText xml:space="preserve"> PAGEREF _Toc166826579 \h </w:instrText>
+          <w:instrText xml:space="preserve"> PAGEREF _Toc169516520 \h </w:instrText>
         </w:r>
         <w:r>
           <w:rPr>
@@ -4867,7 +4955,7 @@
           <w:lang w:eastAsia="en-US"/>
         </w:rPr>
       </w:pPr>
-      <w:hyperlink w:anchor="_Toc166826580" w:history="1">
+      <w:hyperlink w:anchor="_Toc169516521" w:history="1">
         <w:r>
           <w:rPr>
             <w:rStyle w:val="Hyperlink"/>
@@ -4911,7 +4999,7 @@
             <w:noProof/>
             <w:webHidden/>
           </w:rPr>
-          <w:instrText xml:space="preserve"> PAGEREF _Toc166826580 \h </w:instrText>
+          <w:instrText xml:space="preserve"> PAGEREF _Toc169516521 \h </w:instrText>
         </w:r>
         <w:r>
           <w:rPr>
@@ -4952,7 +5040,7 @@
           <w:szCs w:val="22"/>
         </w:rPr>
       </w:pPr>
-      <w:hyperlink w:anchor="_Toc166826581" w:history="1">
+      <w:hyperlink w:anchor="_Toc169516522" w:history="1">
         <w:r>
           <w:rPr>
             <w:rStyle w:val="Hyperlink"/>
@@ -4997,7 +5085,7 @@
             <w:noProof/>
             <w:webHidden/>
           </w:rPr>
-          <w:instrText xml:space="preserve"> PAGEREF _Toc166826581 \h </w:instrText>
+          <w:instrText xml:space="preserve"> PAGEREF _Toc169516522 \h </w:instrText>
         </w:r>
         <w:r>
           <w:rPr>
@@ -5038,7 +5126,7 @@
           <w:szCs w:val="22"/>
         </w:rPr>
       </w:pPr>
-      <w:hyperlink w:anchor="_Toc166826582" w:history="1">
+      <w:hyperlink w:anchor="_Toc169516523" w:history="1">
         <w:r>
           <w:rPr>
             <w:rStyle w:val="Hyperlink"/>
@@ -5083,7 +5171,7 @@
             <w:noProof/>
             <w:webHidden/>
           </w:rPr>
-          <w:instrText xml:space="preserve"> PAGEREF _Toc166826582 \h </w:instrText>
+          <w:instrText xml:space="preserve"> PAGEREF _Toc169516523 \h </w:instrText>
         </w:r>
         <w:r>
           <w:rPr>
@@ -5129,7 +5217,7 @@
           <w:lang w:eastAsia="en-US"/>
         </w:rPr>
       </w:pPr>
-      <w:hyperlink w:anchor="_Toc166826583" w:history="1">
+      <w:hyperlink w:anchor="_Toc169516524" w:history="1">
         <w:r>
           <w:rPr>
             <w:rStyle w:val="Hyperlink"/>
@@ -5173,7 +5261,7 @@
             <w:noProof/>
             <w:webHidden/>
           </w:rPr>
-          <w:instrText xml:space="preserve"> PAGEREF _Toc166826583 \h </w:instrText>
+          <w:instrText xml:space="preserve"> PAGEREF _Toc169516524 \h </w:instrText>
         </w:r>
         <w:r>
           <w:rPr>
@@ -5214,7 +5302,7 @@
           <w:szCs w:val="22"/>
         </w:rPr>
       </w:pPr>
-      <w:hyperlink w:anchor="_Toc166826584" w:history="1">
+      <w:hyperlink w:anchor="_Toc169516525" w:history="1">
         <w:r>
           <w:rPr>
             <w:rStyle w:val="Hyperlink"/>
@@ -5259,7 +5347,7 @@
             <w:noProof/>
             <w:webHidden/>
           </w:rPr>
-          <w:instrText xml:space="preserve"> PAGEREF _Toc166826584 \h </w:instrText>
+          <w:instrText xml:space="preserve"> PAGEREF _Toc169516525 \h </w:instrText>
         </w:r>
         <w:r>
           <w:rPr>
@@ -5300,7 +5388,7 @@
           <w:szCs w:val="22"/>
         </w:rPr>
       </w:pPr>
-      <w:hyperlink w:anchor="_Toc166826585" w:history="1">
+      <w:hyperlink w:anchor="_Toc169516526" w:history="1">
         <w:r>
           <w:rPr>
             <w:rStyle w:val="Hyperlink"/>
@@ -5345,7 +5433,7 @@
             <w:noProof/>
             <w:webHidden/>
           </w:rPr>
-          <w:instrText xml:space="preserve"> PAGEREF _Toc166826585 \h </w:instrText>
+          <w:instrText xml:space="preserve"> PAGEREF _Toc169516526 \h </w:instrText>
         </w:r>
         <w:r>
           <w:rPr>
@@ -5386,7 +5474,7 @@
           <w:szCs w:val="22"/>
         </w:rPr>
       </w:pPr>
-      <w:hyperlink w:anchor="_Toc166826586" w:history="1">
+      <w:hyperlink w:anchor="_Toc169516527" w:history="1">
         <w:r>
           <w:rPr>
             <w:rStyle w:val="Hyperlink"/>
@@ -5431,7 +5519,7 @@
             <w:noProof/>
             <w:webHidden/>
           </w:rPr>
-          <w:instrText xml:space="preserve"> PAGEREF _Toc166826586 \h </w:instrText>
+          <w:instrText xml:space="preserve"> PAGEREF _Toc169516527 \h </w:instrText>
         </w:r>
         <w:r>
           <w:rPr>
@@ -5477,7 +5565,7 @@
           <w:lang w:eastAsia="en-US"/>
         </w:rPr>
       </w:pPr>
-      <w:hyperlink w:anchor="_Toc166826587" w:history="1">
+      <w:hyperlink w:anchor="_Toc169516528" w:history="1">
         <w:r>
           <w:rPr>
             <w:rStyle w:val="Hyperlink"/>
@@ -5521,7 +5609,7 @@
             <w:noProof/>
             <w:webHidden/>
           </w:rPr>
-          <w:instrText xml:space="preserve"> PAGEREF _Toc166826587 \h </w:instrText>
+          <w:instrText xml:space="preserve"> PAGEREF _Toc169516528 \h </w:instrText>
         </w:r>
         <w:r>
           <w:rPr>
@@ -5562,7 +5650,7 @@
           <w:szCs w:val="22"/>
         </w:rPr>
       </w:pPr>
-      <w:hyperlink w:anchor="_Toc166826588" w:history="1">
+      <w:hyperlink w:anchor="_Toc169516529" w:history="1">
         <w:r>
           <w:rPr>
             <w:rStyle w:val="Hyperlink"/>
@@ -5607,7 +5695,7 @@
             <w:noProof/>
             <w:webHidden/>
           </w:rPr>
-          <w:instrText xml:space="preserve"> PAGEREF _Toc166826588 \h </w:instrText>
+          <w:instrText xml:space="preserve"> PAGEREF _Toc169516529 \h </w:instrText>
         </w:r>
         <w:r>
           <w:rPr>
@@ -5648,7 +5736,7 @@
           <w:szCs w:val="22"/>
         </w:rPr>
       </w:pPr>
-      <w:hyperlink w:anchor="_Toc166826589" w:history="1">
+      <w:hyperlink w:anchor="_Toc169516530" w:history="1">
         <w:r>
           <w:rPr>
             <w:rStyle w:val="Hyperlink"/>
@@ -5693,7 +5781,7 @@
             <w:noProof/>
             <w:webHidden/>
           </w:rPr>
-          <w:instrText xml:space="preserve"> PAGEREF _Toc166826589 \h </w:instrText>
+          <w:instrText xml:space="preserve"> PAGEREF _Toc169516530 \h </w:instrText>
         </w:r>
         <w:r>
           <w:rPr>
@@ -5734,7 +5822,7 @@
           <w:szCs w:val="22"/>
         </w:rPr>
       </w:pPr>
-      <w:hyperlink w:anchor="_Toc166826590" w:history="1">
+      <w:hyperlink w:anchor="_Toc169516531" w:history="1">
         <w:r>
           <w:rPr>
             <w:rStyle w:val="Hyperlink"/>
@@ -5779,7 +5867,7 @@
             <w:noProof/>
             <w:webHidden/>
           </w:rPr>
-          <w:instrText xml:space="preserve"> PAGEREF _Toc166826590 \h </w:instrText>
+          <w:instrText xml:space="preserve"> PAGEREF _Toc169516531 \h </w:instrText>
         </w:r>
         <w:r>
           <w:rPr>
@@ -5820,7 +5908,7 @@
           <w:szCs w:val="22"/>
         </w:rPr>
       </w:pPr>
-      <w:hyperlink w:anchor="_Toc166826591" w:history="1">
+      <w:hyperlink w:anchor="_Toc169516532" w:history="1">
         <w:r>
           <w:rPr>
             <w:rStyle w:val="Hyperlink"/>
@@ -5865,7 +5953,7 @@
             <w:noProof/>
             <w:webHidden/>
           </w:rPr>
-          <w:instrText xml:space="preserve"> PAGEREF _Toc166826591 \h </w:instrText>
+          <w:instrText xml:space="preserve"> PAGEREF _Toc169516532 \h </w:instrText>
         </w:r>
         <w:r>
           <w:rPr>
@@ -5906,7 +5994,7 @@
           <w:szCs w:val="22"/>
         </w:rPr>
       </w:pPr>
-      <w:hyperlink w:anchor="_Toc166826592" w:history="1">
+      <w:hyperlink w:anchor="_Toc169516533" w:history="1">
         <w:r>
           <w:rPr>
             <w:rStyle w:val="Hyperlink"/>
@@ -5951,7 +6039,7 @@
             <w:noProof/>
             <w:webHidden/>
           </w:rPr>
-          <w:instrText xml:space="preserve"> PAGEREF _Toc166826592 \h </w:instrText>
+          <w:instrText xml:space="preserve"> PAGEREF _Toc169516533 \h </w:instrText>
         </w:r>
         <w:r>
           <w:rPr>
@@ -5992,7 +6080,7 @@
           <w:szCs w:val="22"/>
         </w:rPr>
       </w:pPr>
-      <w:hyperlink w:anchor="_Toc166826593" w:history="1">
+      <w:hyperlink w:anchor="_Toc169516534" w:history="1">
         <w:r>
           <w:rPr>
             <w:rStyle w:val="Hyperlink"/>
@@ -6037,7 +6125,7 @@
             <w:noProof/>
             <w:webHidden/>
           </w:rPr>
-          <w:instrText xml:space="preserve"> PAGEREF _Toc166826593 \h </w:instrText>
+          <w:instrText xml:space="preserve"> PAGEREF _Toc169516534 \h </w:instrText>
         </w:r>
         <w:r>
           <w:rPr>
@@ -6078,7 +6166,7 @@
           <w:szCs w:val="22"/>
         </w:rPr>
       </w:pPr>
-      <w:hyperlink w:anchor="_Toc166826594" w:history="1">
+      <w:hyperlink w:anchor="_Toc169516535" w:history="1">
         <w:r>
           <w:rPr>
             <w:rStyle w:val="Hyperlink"/>
@@ -6123,7 +6211,7 @@
             <w:noProof/>
             <w:webHidden/>
           </w:rPr>
-          <w:instrText xml:space="preserve"> PAGEREF _Toc166826594 \h </w:instrText>
+          <w:instrText xml:space="preserve"> PAGEREF _Toc169516535 \h </w:instrText>
         </w:r>
         <w:r>
           <w:rPr>
@@ -6164,7 +6252,7 @@
           <w:szCs w:val="22"/>
         </w:rPr>
       </w:pPr>
-      <w:hyperlink w:anchor="_Toc166826595" w:history="1">
+      <w:hyperlink w:anchor="_Toc169516536" w:history="1">
         <w:r>
           <w:rPr>
             <w:rStyle w:val="Hyperlink"/>
@@ -6209,7 +6297,7 @@
             <w:noProof/>
             <w:webHidden/>
           </w:rPr>
-          <w:instrText xml:space="preserve"> PAGEREF _Toc166826595 \h </w:instrText>
+          <w:instrText xml:space="preserve"> PAGEREF _Toc169516536 \h </w:instrText>
         </w:r>
         <w:r>
           <w:rPr>
@@ -6255,7 +6343,7 @@
           <w:lang w:eastAsia="en-US"/>
         </w:rPr>
       </w:pPr>
-      <w:hyperlink w:anchor="_Toc166826596" w:history="1">
+      <w:hyperlink w:anchor="_Toc169516537" w:history="1">
         <w:r>
           <w:rPr>
             <w:rStyle w:val="Hyperlink"/>
@@ -6299,7 +6387,7 @@
             <w:noProof/>
             <w:webHidden/>
           </w:rPr>
-          <w:instrText xml:space="preserve"> PAGEREF _Toc166826596 \h </w:instrText>
+          <w:instrText xml:space="preserve"> PAGEREF _Toc169516537 \h </w:instrText>
         </w:r>
         <w:r>
           <w:rPr>
@@ -6337,14 +6425,14 @@
       <w:r>
         <w:fldChar w:fldCharType="end"/>
       </w:r>
-      <w:bookmarkStart w:id="1" w:name="_Toc166826527"/>
+      <w:bookmarkStart w:id="2" w:name="_Toc169516467"/>
       <w:r>
         <w:t>I</w:t>
       </w:r>
       <w:r>
         <w:t>ntroduction</w:t>
       </w:r>
-      <w:bookmarkEnd w:id="1"/>
+      <w:bookmarkEnd w:id="2"/>
     </w:p>
     <w:p>
       <w:pPr>
@@ -6435,21 +6523,7 @@
           <w:rPr>
             <w:rStyle w:val="Hyperlink"/>
           </w:rPr>
-          <w:t>https://github.com/sillsdev/FwDocumentation/tree/de</w:t>
-        </w:r>
-        <w:bookmarkStart w:id="2" w:name="_GoBack"/>
-        <w:bookmarkEnd w:id="2"/>
-        <w:r>
-          <w:rPr>
-            <w:rStyle w:val="Hyperlink"/>
-          </w:rPr>
-          <w:t>v</w:t>
-        </w:r>
-        <w:r>
-          <w:rPr>
-            <w:rStyle w:val="Hyperlink"/>
-          </w:rPr>
-          <w:t>elop/HelpResourcesSources/TechnicalNotes</w:t>
+          <w:t>https://github.com/sillsdev/FwDocumentation/tree/develop/HelpResourcesSources/TechnicalNotes</w:t>
         </w:r>
       </w:hyperlink>
       <w:r>
@@ -6592,7 +6666,7 @@
       <w:pPr>
         <w:pStyle w:val="Heading1"/>
       </w:pPr>
-      <w:bookmarkStart w:id="3" w:name="_Toc166826528"/>
+      <w:bookmarkStart w:id="3" w:name="_Toc169516468"/>
       <w:r>
         <w:t xml:space="preserve">Basic </w:t>
       </w:r>
@@ -6862,7 +6936,13 @@
         <w:t xml:space="preserve"> keyboard definitions using context</w:t>
       </w:r>
       <w:r>
-        <w:t>, and FLEx Tools</w:t>
+        <w:t>, and F</w:t>
+      </w:r>
+      <w:r>
+        <w:t>lex</w:t>
+      </w:r>
+      <w:r>
+        <w:t>Tools</w:t>
       </w:r>
       <w:r>
         <w:t xml:space="preserve"> must handle NFD data.</w:t>
@@ -6872,7 +6952,7 @@
       <w:pPr>
         <w:pStyle w:val="Heading2"/>
       </w:pPr>
-      <w:bookmarkStart w:id="4" w:name="_Toc166826529"/>
+      <w:bookmarkStart w:id="4" w:name="_Toc169516469"/>
       <w:r>
         <w:t>Classes and properties</w:t>
       </w:r>
@@ -7118,7 +7198,7 @@
       <w:pPr>
         <w:pStyle w:val="Heading2"/>
       </w:pPr>
-      <w:bookmarkStart w:id="5" w:name="_Toc166826530"/>
+      <w:bookmarkStart w:id="5" w:name="_Toc169516470"/>
       <w:r>
         <w:t>Writing systems</w:t>
       </w:r>
@@ -7763,7 +7843,7 @@
       <w:pPr>
         <w:pStyle w:val="Heading2"/>
       </w:pPr>
-      <w:bookmarkStart w:id="6" w:name="_Toc166826531"/>
+      <w:bookmarkStart w:id="6" w:name="_Toc169516471"/>
       <w:r>
         <w:t>Basic properties</w:t>
       </w:r>
@@ -7782,7 +7862,7 @@
         <w:pStyle w:val="Heading3"/>
       </w:pPr>
       <w:bookmarkStart w:id="7" w:name="_Toc318113549"/>
-      <w:bookmarkStart w:id="8" w:name="_Toc166826532"/>
+      <w:bookmarkStart w:id="8" w:name="_Toc169516472"/>
       <w:r>
         <w:lastRenderedPageBreak/>
         <w:t>Strings</w:t>
@@ -7923,7 +8003,7 @@
         <w:pStyle w:val="Heading4"/>
       </w:pPr>
       <w:bookmarkStart w:id="9" w:name="_Toc318113550"/>
-      <w:bookmarkStart w:id="10" w:name="_Toc166826533"/>
+      <w:bookmarkStart w:id="10" w:name="_Toc169516473"/>
       <w:r>
         <w:t>Unicode</w:t>
       </w:r>
@@ -8090,7 +8170,7 @@
         <w:pStyle w:val="Heading4"/>
       </w:pPr>
       <w:bookmarkStart w:id="12" w:name="_Ref162943041"/>
-      <w:bookmarkStart w:id="13" w:name="_Toc166826534"/>
+      <w:bookmarkStart w:id="13" w:name="_Toc169516474"/>
       <w:r>
         <w:t>String</w:t>
       </w:r>
@@ -8465,7 +8545,7 @@
         <w:pStyle w:val="Heading4"/>
       </w:pPr>
       <w:bookmarkStart w:id="14" w:name="_Toc318113552"/>
-      <w:bookmarkStart w:id="15" w:name="_Toc166826535"/>
+      <w:bookmarkStart w:id="15" w:name="_Toc169516475"/>
       <w:r>
         <w:t>MultiUnicode</w:t>
       </w:r>
@@ -8523,7 +8603,7 @@
         <w:pStyle w:val="Heading4"/>
       </w:pPr>
       <w:bookmarkStart w:id="16" w:name="_Toc318113553"/>
-      <w:bookmarkStart w:id="17" w:name="_Toc166826536"/>
+      <w:bookmarkStart w:id="17" w:name="_Toc169516476"/>
       <w:r>
         <w:t>MultiString</w:t>
       </w:r>
@@ -8636,7 +8716,7 @@
       <w:pPr>
         <w:pStyle w:val="Heading3"/>
       </w:pPr>
-      <w:bookmarkStart w:id="18" w:name="_Toc166826537"/>
+      <w:bookmarkStart w:id="18" w:name="_Toc169516477"/>
       <w:r>
         <w:t>Binary</w:t>
       </w:r>
@@ -8697,7 +8777,7 @@
       <w:pPr>
         <w:pStyle w:val="Heading3"/>
       </w:pPr>
-      <w:bookmarkStart w:id="19" w:name="_Toc166826538"/>
+      <w:bookmarkStart w:id="19" w:name="_Toc169516478"/>
       <w:r>
         <w:t>Boolean</w:t>
       </w:r>
@@ -8732,7 +8812,7 @@
         <w:pStyle w:val="Heading3"/>
       </w:pPr>
       <w:bookmarkStart w:id="20" w:name="_Ref163130885"/>
-      <w:bookmarkStart w:id="21" w:name="_Toc166826539"/>
+      <w:bookmarkStart w:id="21" w:name="_Toc169516479"/>
       <w:r>
         <w:t>GenDate</w:t>
       </w:r>
@@ -8833,7 +8913,7 @@
       <w:pPr>
         <w:pStyle w:val="Heading3"/>
       </w:pPr>
-      <w:bookmarkStart w:id="22" w:name="_Toc166826540"/>
+      <w:bookmarkStart w:id="22" w:name="_Toc169516480"/>
       <w:r>
         <w:lastRenderedPageBreak/>
         <w:t>Guid</w:t>
@@ -8885,7 +8965,7 @@
       <w:pPr>
         <w:pStyle w:val="Heading3"/>
       </w:pPr>
-      <w:bookmarkStart w:id="23" w:name="_Toc166826541"/>
+      <w:bookmarkStart w:id="23" w:name="_Toc169516481"/>
       <w:r>
         <w:t>Integer</w:t>
       </w:r>
@@ -8937,7 +9017,7 @@
       <w:pPr>
         <w:pStyle w:val="Heading3"/>
       </w:pPr>
-      <w:bookmarkStart w:id="24" w:name="_Toc166826542"/>
+      <w:bookmarkStart w:id="24" w:name="_Toc169516482"/>
       <w:r>
         <w:t>TextPropBinary</w:t>
       </w:r>
@@ -8976,7 +9056,13 @@
       </w:r>
       <w:r>
         <w:br/>
-        <w:t>&lt;Prop namedStyle="Normal"&gt;&lt;/Prop&gt;</w:t>
+        <w:t>&lt;Prop namedStyle="Normal"</w:t>
+      </w:r>
+      <w:r>
+        <w:t xml:space="preserve"> </w:t>
+      </w:r>
+      <w:r>
+        <w:t>/Prop&gt;</w:t>
       </w:r>
       <w:r>
         <w:br/>
@@ -9564,7 +9650,7 @@
       <w:pPr>
         <w:pStyle w:val="Heading3"/>
       </w:pPr>
-      <w:bookmarkStart w:id="25" w:name="_Toc166826543"/>
+      <w:bookmarkStart w:id="25" w:name="_Toc169516483"/>
       <w:r>
         <w:lastRenderedPageBreak/>
         <w:t>Time</w:t>
@@ -9634,7 +9720,7 @@
       <w:pPr>
         <w:pStyle w:val="Heading2"/>
       </w:pPr>
-      <w:bookmarkStart w:id="26" w:name="_Toc166826544"/>
+      <w:bookmarkStart w:id="26" w:name="_Toc169516484"/>
       <w:r>
         <w:t>Linking</w:t>
       </w:r>
@@ -9786,7 +9872,7 @@
       <w:pPr>
         <w:pStyle w:val="Heading2"/>
       </w:pPr>
-      <w:bookmarkStart w:id="27" w:name="_Toc166826545"/>
+      <w:bookmarkStart w:id="27" w:name="_Toc169516485"/>
       <w:r>
         <w:t>Owning relationships</w:t>
       </w:r>
@@ -10312,7 +10398,7 @@
       <w:pPr>
         <w:pStyle w:val="Heading2"/>
       </w:pPr>
-      <w:bookmarkStart w:id="28" w:name="_Toc166826546"/>
+      <w:bookmarkStart w:id="28" w:name="_Toc169516486"/>
       <w:r>
         <w:t>Reference relationships</w:t>
       </w:r>
@@ -10670,7 +10756,7 @@
       <w:pPr>
         <w:pStyle w:val="Heading2"/>
       </w:pPr>
-      <w:bookmarkStart w:id="29" w:name="_Toc166826547"/>
+      <w:bookmarkStart w:id="29" w:name="_Toc169516487"/>
       <w:r>
         <w:t>Styles</w:t>
       </w:r>
@@ -10876,7 +10962,7 @@
       <w:pPr>
         <w:pStyle w:val="Heading2"/>
       </w:pPr>
-      <w:bookmarkStart w:id="30" w:name="_Toc166826548"/>
+      <w:bookmarkStart w:id="30" w:name="_Toc169516488"/>
       <w:r>
         <w:t>Possibility lists</w:t>
       </w:r>
@@ -13119,7 +13205,7 @@
       <w:pPr>
         <w:pStyle w:val="Heading2"/>
       </w:pPr>
-      <w:bookmarkStart w:id="31" w:name="_Toc166826549"/>
+      <w:bookmarkStart w:id="31" w:name="_Toc169516489"/>
       <w:r>
         <w:lastRenderedPageBreak/>
         <w:t>Custom fields</w:t>
@@ -13873,7 +13959,7 @@
       <w:pPr>
         <w:pStyle w:val="Heading2"/>
       </w:pPr>
-      <w:bookmarkStart w:id="32" w:name="_Toc166826550"/>
+      <w:bookmarkStart w:id="32" w:name="_Toc169516490"/>
       <w:r>
         <w:t>Send/Receive Data</w:t>
       </w:r>
@@ -15072,7 +15158,7 @@
       <w:pPr>
         <w:pStyle w:val="Heading1"/>
       </w:pPr>
-      <w:bookmarkStart w:id="33" w:name="_Toc166826551"/>
+      <w:bookmarkStart w:id="33" w:name="_Toc169516491"/>
       <w:r>
         <w:t>Conceptual model resources</w:t>
       </w:r>
@@ -15210,7 +15296,7 @@
       <w:pPr>
         <w:pStyle w:val="Heading2"/>
       </w:pPr>
-      <w:bookmarkStart w:id="34" w:name="_Toc166826552"/>
+      <w:bookmarkStart w:id="34" w:name="_Toc169516492"/>
       <w:r>
         <w:t>M</w:t>
       </w:r>
@@ -15564,7 +15650,7 @@
       <w:pPr>
         <w:pStyle w:val="Heading2"/>
       </w:pPr>
-      <w:bookmarkStart w:id="35" w:name="_Toc166826553"/>
+      <w:bookmarkStart w:id="35" w:name="_Toc169516493"/>
       <w:r>
         <w:t>M</w:t>
       </w:r>
@@ -15581,7 +15667,16 @@
         <w:t xml:space="preserve">If you download the source code </w:t>
       </w:r>
       <w:r>
-        <w:t>LibLcm</w:t>
+        <w:t>l</w:t>
+      </w:r>
+      <w:r>
+        <w:t>ib</w:t>
+      </w:r>
+      <w:r>
+        <w:t>l</w:t>
+      </w:r>
+      <w:r>
+        <w:t>cm</w:t>
       </w:r>
       <w:r>
         <w:t xml:space="preserve"> (</w:t>
@@ -15767,10 +15862,15 @@
         <w:t xml:space="preserve"> </w:t>
       </w:r>
       <w:r>
-        <w:t>I</w:t>
-      </w:r>
-      <w:r>
-        <w:t>f you set generateBasicCreateMethod to false then it will not put a parameterless Create method in the generated code. That means that you will have to define your own Create method in the Overrides in both the factory and the class overrides</w:t>
+        <w:t xml:space="preserve">When false, this class cannot be created in code with a </w:t>
+      </w:r>
+      <w:proofErr w:type="gramStart"/>
+      <w:r>
+        <w:t>Create(</w:t>
+      </w:r>
+      <w:proofErr w:type="gramEnd"/>
+      <w:r>
+        <w:t>) method. Check for required parameters in overrides in both the factory and the class overrides</w:t>
       </w:r>
       <w:r>
         <w:t>.</w:t>
@@ -15836,16 +15936,11 @@
         <w:t>Type</w:t>
       </w:r>
       <w:r>
-        <w:t xml:space="preserve">: The type of </w:t>
-      </w:r>
-      <w:proofErr w:type="gramStart"/>
-      <w:r>
-        <w:t xml:space="preserve">field </w:t>
-      </w:r>
-      <w:r>
-        <w:t>.</w:t>
-      </w:r>
-      <w:proofErr w:type="gramEnd"/>
+        <w:t>: The type of field</w:t>
+      </w:r>
+      <w:r>
+        <w:t>:</w:t>
+      </w:r>
       <w:r>
         <w:t xml:space="preserve"> bas for basic, own for owning, rel for </w:t>
       </w:r>
@@ -16016,7 +16111,7 @@
         <w:pStyle w:val="Heading2"/>
       </w:pPr>
       <w:bookmarkStart w:id="36" w:name="_Ref162957186"/>
-      <w:bookmarkStart w:id="37" w:name="_Toc166826554"/>
+      <w:bookmarkStart w:id="37" w:name="_Toc169516494"/>
       <w:r>
         <w:t>LCMBrowser</w:t>
       </w:r>
@@ -16067,7 +16162,7 @@
       <w:pPr>
         <w:pStyle w:val="Heading3"/>
       </w:pPr>
-      <w:bookmarkStart w:id="38" w:name="_Toc166826555"/>
+      <w:bookmarkStart w:id="38" w:name="_Toc169516495"/>
       <w:r>
         <w:t xml:space="preserve">LCM </w:t>
       </w:r>
@@ -16208,7 +16303,7 @@
       <w:pPr>
         <w:pStyle w:val="Heading3"/>
       </w:pPr>
-      <w:bookmarkStart w:id="39" w:name="_Toc166826556"/>
+      <w:bookmarkStart w:id="39" w:name="_Toc169516496"/>
       <w:r>
         <w:t>LCM data</w:t>
       </w:r>
@@ -16527,7 +16622,7 @@
       <w:pPr>
         <w:pStyle w:val="Heading2"/>
       </w:pPr>
-      <w:bookmarkStart w:id="40" w:name="_Toc166826557"/>
+      <w:bookmarkStart w:id="40" w:name="_Toc169516497"/>
       <w:r>
         <w:t>Fieldworks source code</w:t>
       </w:r>
@@ -16767,38 +16862,158 @@
         <w:pStyle w:val="BodyText"/>
       </w:pPr>
       <w:r>
-        <w:t xml:space="preserve">Debugging can also be done without installing any program. Download </w:t>
-      </w:r>
-      <w:r>
-        <w:t>dnSpy-net-win64.zip</w:t>
-      </w:r>
-      <w:r>
-        <w:t xml:space="preserve"> from </w:t>
+        <w:t>Debugging can also be done without installing any program</w:t>
+      </w:r>
+      <w:r>
+        <w:t xml:space="preserve"> using dnSpy.</w:t>
+      </w:r>
+      <w:r>
+        <w:t xml:space="preserve"> </w:t>
+      </w:r>
+    </w:p>
+    <w:p>
+      <w:pPr>
+        <w:pStyle w:val="Heading2"/>
+      </w:pPr>
+      <w:bookmarkStart w:id="41" w:name="_Toc169516498"/>
+      <w:r>
+        <w:t>dnSpy debugger</w:t>
+      </w:r>
+      <w:bookmarkEnd w:id="41"/>
+    </w:p>
+    <w:p>
+      <w:r>
+        <w:t>If interested in exploring FLEx using a debugger, there is a free .NET debugger that can be used on any machine without installing any software. You just unzip a download into a directory and run the debugger from the directory.</w:t>
+      </w:r>
+    </w:p>
+    <w:p>
+      <w:r>
+        <w:t>To setup dnSpy</w:t>
+      </w:r>
+    </w:p>
+    <w:p>
+      <w:pPr>
+        <w:pStyle w:val="ListNumber"/>
+      </w:pPr>
+      <w:r>
+        <w:t>Download</w:t>
+      </w:r>
+      <w:r>
+        <w:t xml:space="preserve"> </w:t>
+      </w:r>
+      <w:r>
+        <w:t xml:space="preserve">dnSpy-net-win64.zip from </w:t>
       </w:r>
       <w:hyperlink r:id="rId40" w:history="1">
         <w:r>
           <w:rPr>
             <w:rStyle w:val="Hyperlink"/>
           </w:rPr>
-          <w:t>https://github.com/0xd4d/dnSpy/releases</w:t>
+          <w:t>https://github.com/dnSpy/dnSpy/releases</w:t>
         </w:r>
       </w:hyperlink>
       <w:r>
-        <w:t xml:space="preserve">. Unzip the file into a directory, and run dnSpy.exe from the directory. </w:t>
-      </w:r>
-      <w:r>
-        <w:t>To start Flex in the debugger, open FieldWorks.exe from the debugger, or drag it into the debugger. Right-click FieldWorks.exe in left pane and choose Go to Entry Point. Then click the green Start button in the toolbar to start debugging. Click OK to the Debug Program dialog.</w:t>
+        <w:t>.</w:t>
+      </w:r>
+    </w:p>
+    <w:p>
+      <w:pPr>
+        <w:pStyle w:val="ListNumber"/>
+      </w:pPr>
+      <w:r>
+        <w:t>Unzip the file into a directory.</w:t>
+      </w:r>
+    </w:p>
+    <w:p>
+      <w:pPr>
+        <w:pStyle w:val="ListNumber"/>
+      </w:pPr>
+      <w:r>
+        <w:t>Run dnSpy.exe from the unzipped directory.</w:t>
+      </w:r>
+    </w:p>
+    <w:p>
+      <w:pPr>
+        <w:pStyle w:val="ListNumber"/>
+      </w:pPr>
+      <w:r>
+        <w:t>Drag C:\Program Files\SIL\FieldWorks 9\FieldWorks.exe into the left Assembly Explorer pane in dnSpy.</w:t>
+      </w:r>
+    </w:p>
+    <w:p>
+      <w:r>
+        <w:t>To run the debugger.</w:t>
+      </w:r>
+    </w:p>
+    <w:p>
+      <w:pPr>
+        <w:pStyle w:val="ListNumber"/>
+        <w:numPr>
+          <w:ilvl w:val="0"/>
+          <w:numId w:val="39"/>
+        </w:numPr>
+      </w:pPr>
+      <w:r>
+        <w:t>Shut down Fieldworks if it is running.</w:t>
+      </w:r>
+    </w:p>
+    <w:p>
+      <w:pPr>
+        <w:pStyle w:val="ListNumber"/>
+      </w:pPr>
+      <w:r>
+        <w:t>Right-click FieldWorks in the Assembly Explorer.</w:t>
+      </w:r>
+    </w:p>
+    <w:p>
+      <w:pPr>
+        <w:pStyle w:val="ListNumber"/>
+      </w:pPr>
+      <w:r>
+        <w:t xml:space="preserve">Choose “Go to Entry Point”. </w:t>
+      </w:r>
+    </w:p>
+    <w:p>
+      <w:pPr>
+        <w:pStyle w:val="ListNumber"/>
+      </w:pPr>
+      <w:r>
+        <w:t xml:space="preserve">Click the Start button at the top, or press F5. </w:t>
+      </w:r>
+    </w:p>
+    <w:p>
+      <w:pPr>
+        <w:pStyle w:val="ListNumber"/>
+      </w:pPr>
+      <w:r>
+        <w:t>A dialog is opened for command line arguments. Typically, you can just click OK.</w:t>
+      </w:r>
+    </w:p>
+    <w:p>
+      <w:pPr>
+        <w:pStyle w:val="ListNumber"/>
+      </w:pPr>
+      <w:r>
+        <w:t xml:space="preserve">FieldWorks opens and you can start working. At any </w:t>
+      </w:r>
+      <w:proofErr w:type="gramStart"/>
+      <w:r>
+        <w:t>time</w:t>
+      </w:r>
+      <w:proofErr w:type="gramEnd"/>
+      <w:r>
+        <w:t xml:space="preserve"> you can break execution in the debugger to investigate where it is, look through the stack, set breakpoints, etc. </w:t>
       </w:r>
     </w:p>
     <w:p>
       <w:pPr>
         <w:pStyle w:val="Heading1"/>
       </w:pPr>
-      <w:bookmarkStart w:id="41" w:name="_Toc166826558"/>
+      <w:bookmarkStart w:id="42" w:name="_Toc169516499"/>
       <w:r>
         <w:t>Lexicon model</w:t>
       </w:r>
-      <w:bookmarkEnd w:id="41"/>
+      <w:bookmarkEnd w:id="42"/>
     </w:p>
     <w:p>
       <w:pPr>
@@ -16848,6 +17063,7 @@
                 <w:b/>
                 <w:bCs/>
               </w:rPr>
+              <w:lastRenderedPageBreak/>
               <w:t>LexDb Property Name</w:t>
             </w:r>
           </w:p>
@@ -17196,7 +17412,6 @@
         <w:pStyle w:val="BodyText"/>
       </w:pPr>
       <w:r>
-        <w:lastRenderedPageBreak/>
         <w:t xml:space="preserve">FLEx uses reference links between different objects, and when information is displayed, it pulls information from each object </w:t>
       </w:r>
       <w:r>
@@ -17219,11 +17434,11 @@
       <w:pPr>
         <w:pStyle w:val="Heading2"/>
       </w:pPr>
-      <w:bookmarkStart w:id="42" w:name="_Toc166826559"/>
+      <w:bookmarkStart w:id="43" w:name="_Toc169516500"/>
       <w:r>
         <w:t>Entries</w:t>
       </w:r>
-      <w:bookmarkEnd w:id="42"/>
+      <w:bookmarkEnd w:id="43"/>
     </w:p>
     <w:p>
       <w:pPr>
@@ -17716,6 +17931,7 @@
               <w:pStyle w:val="Tablecells"/>
             </w:pPr>
             <w:r>
+              <w:lastRenderedPageBreak/>
               <w:t>particle</w:t>
             </w:r>
           </w:p>
@@ -17884,11 +18100,7 @@
         <w:t>used</w:t>
       </w:r>
       <w:r>
-        <w:t xml:space="preserve">. For stem type morphemes, MoStemMsa is used. For affix types, MoDerivAffMsa, MoInfAffMsa, or </w:t>
-      </w:r>
-      <w:r>
-        <w:lastRenderedPageBreak/>
-        <w:t>MoUnclassifiedAffixMsa are used.</w:t>
+        <w:t>. For stem type morphemes, MoStemMsa is used. For affix types, MoDerivAffMsa, MoInfAffMsa, or MoUnclassifiedAffixMsa are used.</w:t>
       </w:r>
       <w:r>
         <w:t xml:space="preserve"> These classes deal with grammatical information. Senses need to reference these objects to show grammatical information.</w:t>
@@ -18029,6 +18241,7 @@
         <w:pStyle w:val="BodyText"/>
       </w:pPr>
       <w:r>
+        <w:lastRenderedPageBreak/>
         <w:t xml:space="preserve">The LexEntry </w:t>
       </w:r>
       <w:r>
@@ -18126,7 +18339,6 @@
         <w:rPr>
           <w:noProof/>
         </w:rPr>
-        <w:lastRenderedPageBreak/>
         <w:drawing>
           <wp:inline distT="0" distB="0" distL="0" distR="0" wp14:anchorId="3E0F3208" wp14:editId="67FF376B">
             <wp:extent cx="5849166" cy="2838846"/>
@@ -18233,7 +18445,19 @@
         <w:pStyle w:val="BodyText"/>
       </w:pPr>
       <w:r>
-        <w:t>All of the strings in the above examples are MultiUnicode, so they can have any number of vernacular writing systems.</w:t>
+        <w:t>All of the strings in the above examples are MultiUnicode, so they can have any number of vernacular</w:t>
+      </w:r>
+      <w:r>
+        <w:t xml:space="preserve"> </w:t>
+      </w:r>
+      <w:r>
+        <w:t>or</w:t>
+      </w:r>
+      <w:r>
+        <w:t xml:space="preserve"> analysis</w:t>
+      </w:r>
+      <w:r>
+        <w:t xml:space="preserve"> writing systems.</w:t>
       </w:r>
       <w:r>
         <w:t xml:space="preserve"> Most strings in LexEntry and LexSense are either MultiUnicode or MultiString.</w:t>
@@ -18243,11 +18467,11 @@
       <w:pPr>
         <w:pStyle w:val="Heading3"/>
       </w:pPr>
-      <w:bookmarkStart w:id="43" w:name="_Toc166826560"/>
+      <w:bookmarkStart w:id="44" w:name="_Toc169516501"/>
       <w:r>
         <w:t>Headwords</w:t>
       </w:r>
-      <w:bookmarkEnd w:id="43"/>
+      <w:bookmarkEnd w:id="44"/>
     </w:p>
     <w:p>
       <w:pPr>
@@ -18312,6 +18536,7 @@
         <w:pStyle w:val="ListBullet"/>
       </w:pPr>
       <w:r>
+        <w:lastRenderedPageBreak/>
         <w:t>Prefix Unicode on MoMorphType</w:t>
       </w:r>
       <w:r>
@@ -18372,11 +18597,7 @@
         <w:t>mang</w:t>
       </w:r>
       <w:r>
-        <w:t xml:space="preserve">’ lexeme form </w:t>
-      </w:r>
-      <w:r>
-        <w:lastRenderedPageBreak/>
-        <w:t xml:space="preserve">would </w:t>
+        <w:t xml:space="preserve">’ lexeme form would </w:t>
       </w:r>
       <w:r>
         <w:t xml:space="preserve">use </w:t>
@@ -18440,7 +18661,13 @@
         <w:pStyle w:val="BodyText"/>
       </w:pPr>
       <w:r>
-        <w:t xml:space="preserve">Some languages prefer to only use citation forms without a lexeme form in their FLEx project. It’s not possible to create an entry without a lexeme form. This is because the MoForm in the LexemeForm field is required for other purposes. After the entry is created, you can remove the form in </w:t>
+        <w:t xml:space="preserve">Some languages prefer to only use citation forms without a lexeme form in their FLEx project. It’s not possible to create an entry </w:t>
+      </w:r>
+      <w:r>
+        <w:t xml:space="preserve">in the FLEx UI </w:t>
+      </w:r>
+      <w:r>
+        <w:t xml:space="preserve">without a lexeme form. This is because the MoForm in the LexemeForm field is required for other purposes. After the entry is created, you can remove the form in </w:t>
       </w:r>
       <w:r>
         <w:t xml:space="preserve">the </w:t>
@@ -18587,13 +18814,13 @@
       <w:pPr>
         <w:pStyle w:val="Heading3"/>
       </w:pPr>
-      <w:bookmarkStart w:id="44" w:name="_Ref164431796"/>
-      <w:bookmarkStart w:id="45" w:name="_Toc166826561"/>
+      <w:bookmarkStart w:id="45" w:name="_Ref164431796"/>
+      <w:bookmarkStart w:id="46" w:name="_Toc169516502"/>
       <w:r>
         <w:t>Pronunciations</w:t>
       </w:r>
-      <w:bookmarkEnd w:id="44"/>
       <w:bookmarkEnd w:id="45"/>
+      <w:bookmarkEnd w:id="46"/>
     </w:p>
     <w:p>
       <w:pPr>
@@ -18628,6 +18855,7 @@
         <w:pStyle w:val="ListBullet"/>
       </w:pPr>
       <w:r>
+        <w:lastRenderedPageBreak/>
         <w:t>If you have multiple recordings per entry, and/or want to include other information along with the pronunciation, then you can add one or more LexPronunciation objects.</w:t>
       </w:r>
     </w:p>
@@ -18692,7 +18920,6 @@
         <w:rPr>
           <w:noProof/>
         </w:rPr>
-        <w:lastRenderedPageBreak/>
         <w:drawing>
           <wp:inline distT="0" distB="0" distL="0" distR="0" wp14:anchorId="6B2AE742" wp14:editId="5696244D">
             <wp:extent cx="5943600" cy="2555240"/>
@@ -18818,11 +19045,11 @@
       <w:pPr>
         <w:pStyle w:val="Heading3"/>
       </w:pPr>
-      <w:bookmarkStart w:id="46" w:name="_Toc166826562"/>
+      <w:bookmarkStart w:id="47" w:name="_Toc169516503"/>
       <w:r>
         <w:t>Etymology</w:t>
       </w:r>
-      <w:bookmarkEnd w:id="46"/>
+      <w:bookmarkEnd w:id="47"/>
     </w:p>
     <w:p>
       <w:pPr>
@@ -18931,6 +19158,7 @@
               <w:pStyle w:val="Tablecells"/>
             </w:pPr>
             <w:r>
+              <w:lastRenderedPageBreak/>
               <w:t>Preceding Annotation</w:t>
             </w:r>
           </w:p>
@@ -19071,7 +19299,6 @@
               <w:pStyle w:val="Tablecells"/>
             </w:pPr>
             <w:r>
-              <w:lastRenderedPageBreak/>
               <w:t>Following Comment</w:t>
             </w:r>
           </w:p>
@@ -19162,11 +19389,11 @@
       <w:pPr>
         <w:pStyle w:val="Heading3"/>
       </w:pPr>
-      <w:bookmarkStart w:id="47" w:name="_Toc166826563"/>
+      <w:bookmarkStart w:id="48" w:name="_Toc169516504"/>
       <w:r>
         <w:t>Allomorphs</w:t>
       </w:r>
-      <w:bookmarkEnd w:id="47"/>
+      <w:bookmarkEnd w:id="48"/>
     </w:p>
     <w:p>
       <w:pPr>
@@ -19766,14 +19993,14 @@
       <w:pPr>
         <w:pStyle w:val="Heading3"/>
       </w:pPr>
-      <w:bookmarkStart w:id="48" w:name="_Toc166826564"/>
+      <w:bookmarkStart w:id="49" w:name="_Toc169516505"/>
       <w:r>
         <w:t>Grammatical information</w:t>
       </w:r>
       <w:r>
         <w:t>.</w:t>
       </w:r>
-      <w:bookmarkEnd w:id="48"/>
+      <w:bookmarkEnd w:id="49"/>
     </w:p>
     <w:p>
       <w:pPr>
@@ -19817,11 +20044,11 @@
       <w:pPr>
         <w:pStyle w:val="Heading3"/>
       </w:pPr>
-      <w:bookmarkStart w:id="49" w:name="_Toc166826565"/>
+      <w:bookmarkStart w:id="50" w:name="_Toc169516506"/>
       <w:r>
         <w:t>Messages</w:t>
       </w:r>
-      <w:bookmarkEnd w:id="49"/>
+      <w:bookmarkEnd w:id="50"/>
     </w:p>
     <w:p>
       <w:pPr>
@@ -20227,14 +20454,14 @@
       <w:pPr>
         <w:pStyle w:val="Heading2"/>
       </w:pPr>
-      <w:bookmarkStart w:id="50" w:name="_Toc166826566"/>
+      <w:bookmarkStart w:id="51" w:name="_Toc169516507"/>
       <w:r>
         <w:t>Complex forms</w:t>
       </w:r>
       <w:r>
         <w:t xml:space="preserve"> and variants</w:t>
       </w:r>
-      <w:bookmarkEnd w:id="50"/>
+      <w:bookmarkEnd w:id="51"/>
     </w:p>
     <w:p>
       <w:pPr>
@@ -20251,11 +20478,11 @@
       <w:pPr>
         <w:pStyle w:val="Heading3"/>
       </w:pPr>
-      <w:bookmarkStart w:id="51" w:name="_Toc166826567"/>
+      <w:bookmarkStart w:id="52" w:name="_Toc169516508"/>
       <w:r>
         <w:t>Complex forms</w:t>
       </w:r>
-      <w:bookmarkEnd w:id="51"/>
+      <w:bookmarkEnd w:id="52"/>
     </w:p>
     <w:p>
       <w:pPr>
@@ -20609,11 +20836,11 @@
       <w:pPr>
         <w:pStyle w:val="Heading3"/>
       </w:pPr>
-      <w:bookmarkStart w:id="52" w:name="_Toc166826568"/>
+      <w:bookmarkStart w:id="53" w:name="_Toc169516509"/>
       <w:r>
         <w:t>Variants</w:t>
       </w:r>
-      <w:bookmarkEnd w:id="52"/>
+      <w:bookmarkEnd w:id="53"/>
     </w:p>
     <w:p>
       <w:pPr>
@@ -20900,11 +21127,11 @@
       <w:pPr>
         <w:pStyle w:val="Heading2"/>
       </w:pPr>
-      <w:bookmarkStart w:id="53" w:name="_Toc166826569"/>
+      <w:bookmarkStart w:id="54" w:name="_Toc169516510"/>
       <w:r>
         <w:t>Senses</w:t>
       </w:r>
-      <w:bookmarkEnd w:id="53"/>
+      <w:bookmarkEnd w:id="54"/>
     </w:p>
     <w:p>
       <w:pPr>
@@ -21581,13 +21808,13 @@
       <w:pPr>
         <w:pStyle w:val="Heading3"/>
       </w:pPr>
-      <w:bookmarkStart w:id="54" w:name="_Ref164277547"/>
-      <w:bookmarkStart w:id="55" w:name="_Toc166826570"/>
+      <w:bookmarkStart w:id="55" w:name="_Ref164277547"/>
+      <w:bookmarkStart w:id="56" w:name="_Toc169516511"/>
       <w:r>
         <w:t>Example sentences</w:t>
       </w:r>
-      <w:bookmarkEnd w:id="54"/>
       <w:bookmarkEnd w:id="55"/>
+      <w:bookmarkEnd w:id="56"/>
     </w:p>
     <w:p>
       <w:pPr>
@@ -21752,11 +21979,11 @@
       <w:pPr>
         <w:pStyle w:val="Heading3"/>
       </w:pPr>
-      <w:bookmarkStart w:id="56" w:name="_Toc166826571"/>
+      <w:bookmarkStart w:id="57" w:name="_Toc169516512"/>
       <w:r>
         <w:t>Extended notes</w:t>
       </w:r>
-      <w:bookmarkEnd w:id="56"/>
+      <w:bookmarkEnd w:id="57"/>
     </w:p>
     <w:p>
       <w:pPr>
@@ -21989,7 +22216,7 @@
       <w:pPr>
         <w:pStyle w:val="Heading3"/>
       </w:pPr>
-      <w:bookmarkStart w:id="57" w:name="_Toc166826572"/>
+      <w:bookmarkStart w:id="58" w:name="_Toc169516513"/>
       <w:r>
         <w:lastRenderedPageBreak/>
         <w:t xml:space="preserve">Lexical </w:t>
@@ -22000,7 +22227,7 @@
       <w:r>
         <w:t>elations</w:t>
       </w:r>
-      <w:bookmarkEnd w:id="57"/>
+      <w:bookmarkEnd w:id="58"/>
     </w:p>
     <w:p>
       <w:pPr>
@@ -23083,11 +23310,11 @@
       <w:pPr>
         <w:pStyle w:val="Heading4"/>
       </w:pPr>
-      <w:bookmarkStart w:id="58" w:name="_Toc166826573"/>
+      <w:bookmarkStart w:id="59" w:name="_Toc169516514"/>
       <w:r>
         <w:t>Collection</w:t>
       </w:r>
-      <w:bookmarkEnd w:id="58"/>
+      <w:bookmarkEnd w:id="59"/>
     </w:p>
     <w:p>
       <w:pPr>
@@ -23363,11 +23590,11 @@
       <w:pPr>
         <w:pStyle w:val="Heading4"/>
       </w:pPr>
-      <w:bookmarkStart w:id="59" w:name="_Toc166826574"/>
+      <w:bookmarkStart w:id="60" w:name="_Toc169516515"/>
       <w:r>
         <w:t>Pair with different names</w:t>
       </w:r>
-      <w:bookmarkEnd w:id="59"/>
+      <w:bookmarkEnd w:id="60"/>
     </w:p>
     <w:p>
       <w:pPr>
@@ -23635,11 +23862,11 @@
       <w:pPr>
         <w:pStyle w:val="Heading4"/>
       </w:pPr>
-      <w:bookmarkStart w:id="60" w:name="_Toc166826575"/>
+      <w:bookmarkStart w:id="61" w:name="_Toc169516516"/>
       <w:r>
         <w:t>Sequence</w:t>
       </w:r>
-      <w:bookmarkEnd w:id="60"/>
+      <w:bookmarkEnd w:id="61"/>
     </w:p>
     <w:p>
       <w:pPr>
@@ -23845,11 +24072,11 @@
       <w:pPr>
         <w:pStyle w:val="Heading4"/>
       </w:pPr>
-      <w:bookmarkStart w:id="61" w:name="_Toc166826576"/>
+      <w:bookmarkStart w:id="62" w:name="_Toc169516517"/>
       <w:r>
         <w:t>Tree</w:t>
       </w:r>
-      <w:bookmarkEnd w:id="61"/>
+      <w:bookmarkEnd w:id="62"/>
     </w:p>
     <w:p>
       <w:pPr>
@@ -24132,11 +24359,11 @@
       <w:pPr>
         <w:pStyle w:val="Heading4"/>
       </w:pPr>
-      <w:bookmarkStart w:id="62" w:name="_Toc166826577"/>
+      <w:bookmarkStart w:id="63" w:name="_Toc169516518"/>
       <w:r>
         <w:t>Unidirectional</w:t>
       </w:r>
-      <w:bookmarkEnd w:id="62"/>
+      <w:bookmarkEnd w:id="63"/>
     </w:p>
     <w:p>
       <w:pPr>
@@ -24232,12 +24459,12 @@
       <w:pPr>
         <w:pStyle w:val="Heading3"/>
       </w:pPr>
-      <w:bookmarkStart w:id="63" w:name="_Toc166826578"/>
+      <w:bookmarkStart w:id="64" w:name="_Toc169516519"/>
       <w:r>
         <w:lastRenderedPageBreak/>
         <w:t>Reversals</w:t>
       </w:r>
-      <w:bookmarkEnd w:id="63"/>
+      <w:bookmarkEnd w:id="64"/>
     </w:p>
     <w:p>
       <w:pPr>
@@ -24611,12 +24838,12 @@
       <w:pPr>
         <w:pStyle w:val="Heading3"/>
       </w:pPr>
-      <w:bookmarkStart w:id="64" w:name="_Toc166826579"/>
+      <w:bookmarkStart w:id="65" w:name="_Toc169516520"/>
       <w:r>
         <w:lastRenderedPageBreak/>
         <w:t>Pictures</w:t>
       </w:r>
-      <w:bookmarkEnd w:id="64"/>
+      <w:bookmarkEnd w:id="65"/>
     </w:p>
     <w:p>
       <w:pPr>
@@ -24793,11 +25020,11 @@
       <w:pPr>
         <w:pStyle w:val="Heading3"/>
       </w:pPr>
-      <w:bookmarkStart w:id="65" w:name="_Toc166826580"/>
+      <w:bookmarkStart w:id="66" w:name="_Toc169516521"/>
       <w:r>
         <w:t>Sound files</w:t>
       </w:r>
-      <w:bookmarkEnd w:id="65"/>
+      <w:bookmarkEnd w:id="66"/>
     </w:p>
     <w:p>
       <w:pPr>
@@ -24841,11 +25068,11 @@
       <w:pPr>
         <w:pStyle w:val="Heading2"/>
       </w:pPr>
-      <w:bookmarkStart w:id="66" w:name="_Toc166826581"/>
+      <w:bookmarkStart w:id="67" w:name="_Toc169516522"/>
       <w:r>
         <w:t>Virtual ordering</w:t>
       </w:r>
-      <w:bookmarkEnd w:id="66"/>
+      <w:bookmarkEnd w:id="67"/>
     </w:p>
     <w:p>
       <w:pPr>
@@ -25031,11 +25258,11 @@
       <w:pPr>
         <w:pStyle w:val="Heading2"/>
       </w:pPr>
-      <w:bookmarkStart w:id="67" w:name="_Toc166826582"/>
+      <w:bookmarkStart w:id="68" w:name="_Toc169516523"/>
       <w:r>
         <w:t>Publications</w:t>
       </w:r>
-      <w:bookmarkEnd w:id="67"/>
+      <w:bookmarkEnd w:id="68"/>
     </w:p>
     <w:p>
       <w:pPr>
@@ -25381,13 +25608,13 @@
       <w:pPr>
         <w:pStyle w:val="Heading1"/>
       </w:pPr>
-      <w:bookmarkStart w:id="68" w:name="_Ref165555065"/>
-      <w:bookmarkStart w:id="69" w:name="_Toc166826583"/>
+      <w:bookmarkStart w:id="69" w:name="_Ref165555065"/>
+      <w:bookmarkStart w:id="70" w:name="_Toc169516524"/>
       <w:r>
         <w:t>Grammar model</w:t>
       </w:r>
-      <w:bookmarkEnd w:id="68"/>
       <w:bookmarkEnd w:id="69"/>
+      <w:bookmarkEnd w:id="70"/>
     </w:p>
     <w:p>
       <w:pPr>
@@ -25542,11 +25769,11 @@
       <w:pPr>
         <w:pStyle w:val="Heading2"/>
       </w:pPr>
-      <w:bookmarkStart w:id="70" w:name="_Toc166826584"/>
+      <w:bookmarkStart w:id="71" w:name="_Toc169516525"/>
       <w:r>
         <w:t>Inflection featuers</w:t>
       </w:r>
-      <w:bookmarkEnd w:id="70"/>
+      <w:bookmarkEnd w:id="71"/>
     </w:p>
     <w:p>
       <w:pPr>
@@ -25720,11 +25947,11 @@
       <w:pPr>
         <w:pStyle w:val="Heading2"/>
       </w:pPr>
-      <w:bookmarkStart w:id="71" w:name="_Toc166826585"/>
+      <w:bookmarkStart w:id="72" w:name="_Toc169516526"/>
       <w:r>
         <w:t>Categories</w:t>
       </w:r>
-      <w:bookmarkEnd w:id="71"/>
+      <w:bookmarkEnd w:id="72"/>
     </w:p>
     <w:p>
       <w:pPr>
@@ -25863,11 +26090,11 @@
       <w:pPr>
         <w:pStyle w:val="Heading2"/>
       </w:pPr>
-      <w:bookmarkStart w:id="72" w:name="_Toc166826586"/>
+      <w:bookmarkStart w:id="73" w:name="_Toc169516527"/>
       <w:r>
         <w:t>Lexicon</w:t>
       </w:r>
-      <w:bookmarkEnd w:id="72"/>
+      <w:bookmarkEnd w:id="73"/>
     </w:p>
     <w:p>
       <w:pPr>
@@ -26414,14 +26641,14 @@
       <w:pPr>
         <w:pStyle w:val="Heading1"/>
       </w:pPr>
-      <w:bookmarkStart w:id="73" w:name="_Toc166826587"/>
+      <w:bookmarkStart w:id="74" w:name="_Toc169516528"/>
       <w:r>
         <w:t xml:space="preserve">Interlinear </w:t>
       </w:r>
       <w:r>
         <w:t>model</w:t>
       </w:r>
-      <w:bookmarkEnd w:id="73"/>
+      <w:bookmarkEnd w:id="74"/>
     </w:p>
     <w:p>
       <w:pPr>
@@ -26510,11 +26737,11 @@
       <w:pPr>
         <w:pStyle w:val="Heading2"/>
       </w:pPr>
-      <w:bookmarkStart w:id="74" w:name="_Toc166826588"/>
+      <w:bookmarkStart w:id="75" w:name="_Toc169516529"/>
       <w:r>
         <w:t>Structured Text</w:t>
       </w:r>
-      <w:bookmarkEnd w:id="74"/>
+      <w:bookmarkEnd w:id="75"/>
     </w:p>
     <w:p>
       <w:pPr>
@@ -26817,11 +27044,11 @@
       <w:pPr>
         <w:pStyle w:val="Heading2"/>
       </w:pPr>
-      <w:bookmarkStart w:id="75" w:name="_Toc166826589"/>
+      <w:bookmarkStart w:id="76" w:name="_Toc169516530"/>
       <w:r>
         <w:t>Segment</w:t>
       </w:r>
-      <w:bookmarkEnd w:id="75"/>
+      <w:bookmarkEnd w:id="76"/>
     </w:p>
     <w:p>
       <w:pPr>
@@ -27276,14 +27503,14 @@
       <w:pPr>
         <w:pStyle w:val="Heading2"/>
       </w:pPr>
-      <w:bookmarkStart w:id="76" w:name="_Toc166826590"/>
+      <w:bookmarkStart w:id="77" w:name="_Toc169516531"/>
       <w:r>
         <w:t>Wordform</w:t>
       </w:r>
       <w:r>
         <w:t>s</w:t>
       </w:r>
-      <w:bookmarkEnd w:id="76"/>
+      <w:bookmarkEnd w:id="77"/>
     </w:p>
     <w:p>
       <w:pPr>
@@ -27453,11 +27680,11 @@
       <w:pPr>
         <w:pStyle w:val="Heading2"/>
       </w:pPr>
-      <w:bookmarkStart w:id="77" w:name="_Toc166826591"/>
+      <w:bookmarkStart w:id="78" w:name="_Toc169516532"/>
       <w:r>
         <w:t>Analyses</w:t>
       </w:r>
-      <w:bookmarkEnd w:id="77"/>
+      <w:bookmarkEnd w:id="78"/>
     </w:p>
     <w:p>
       <w:pPr>
@@ -28187,11 +28414,11 @@
       <w:pPr>
         <w:pStyle w:val="Heading2"/>
       </w:pPr>
-      <w:bookmarkStart w:id="78" w:name="_Toc166826592"/>
+      <w:bookmarkStart w:id="79" w:name="_Toc169516533"/>
       <w:r>
         <w:t>Approving analyses</w:t>
       </w:r>
-      <w:bookmarkEnd w:id="78"/>
+      <w:bookmarkEnd w:id="79"/>
     </w:p>
     <w:p>
       <w:pPr>
@@ -28609,14 +28836,14 @@
       <w:pPr>
         <w:pStyle w:val="Heading2"/>
       </w:pPr>
-      <w:bookmarkStart w:id="79" w:name="_Toc166826593"/>
+      <w:bookmarkStart w:id="80" w:name="_Toc169516534"/>
       <w:r>
         <w:t xml:space="preserve">Text </w:t>
       </w:r>
       <w:r>
         <w:t>Tagging</w:t>
       </w:r>
-      <w:bookmarkEnd w:id="79"/>
+      <w:bookmarkEnd w:id="80"/>
     </w:p>
     <w:p>
       <w:pPr>
@@ -28895,14 +29122,14 @@
       <w:pPr>
         <w:pStyle w:val="Heading2"/>
       </w:pPr>
-      <w:bookmarkStart w:id="80" w:name="_Toc166826594"/>
+      <w:bookmarkStart w:id="81" w:name="_Toc169516535"/>
       <w:r>
         <w:t>Discourse</w:t>
       </w:r>
       <w:r>
         <w:t xml:space="preserve"> Charting</w:t>
       </w:r>
-      <w:bookmarkEnd w:id="80"/>
+      <w:bookmarkEnd w:id="81"/>
     </w:p>
     <w:p>
       <w:pPr>
@@ -29790,11 +30017,11 @@
       <w:pPr>
         <w:pStyle w:val="Heading2"/>
       </w:pPr>
-      <w:bookmarkStart w:id="81" w:name="_Toc166826595"/>
+      <w:bookmarkStart w:id="82" w:name="_Toc169516536"/>
       <w:r>
         <w:t>Scripture</w:t>
       </w:r>
-      <w:bookmarkEnd w:id="81"/>
+      <w:bookmarkEnd w:id="82"/>
     </w:p>
     <w:p>
       <w:pPr>
@@ -30603,14 +30830,14 @@
       <w:pPr>
         <w:pStyle w:val="Heading1"/>
       </w:pPr>
-      <w:bookmarkStart w:id="82" w:name="_Toc166826596"/>
+      <w:bookmarkStart w:id="83" w:name="_Toc169516537"/>
       <w:r>
         <w:t>N</w:t>
       </w:r>
       <w:r>
         <w:t>otebook model</w:t>
       </w:r>
-      <w:bookmarkEnd w:id="82"/>
+      <w:bookmarkEnd w:id="83"/>
     </w:p>
     <w:p>
       <w:pPr>
@@ -30896,7 +31123,7 @@
       <w:rPr>
         <w:noProof/>
       </w:rPr>
-      <w:t>5/17/2024</w:t>
+      <w:t>6/17/2024</w:t>
     </w:r>
     <w:r>
       <w:fldChar w:fldCharType="end"/>
@@ -30943,7 +31170,7 @@
         <w:rStyle w:val="PageNumber"/>
         <w:noProof/>
       </w:rPr>
-      <w:t>5/17/2024</w:t>
+      <w:t>6/17/2024</w:t>
     </w:r>
     <w:r>
       <w:rPr>
@@ -31064,29 +31291,15 @@
       </w:rPr>
       <w:tab/>
     </w:r>
-    <w:r>
-      <w:fldChar w:fldCharType="begin"/>
-    </w:r>
-    <w:r>
-      <w:instrText xml:space="preserve"> STYLEREF "Heading 1" \* MERGEFORMAT </w:instrText>
-    </w:r>
-    <w:r>
-      <w:fldChar w:fldCharType="separate"/>
-    </w:r>
-    <w:r>
-      <w:rPr>
-        <w:rStyle w:val="PageNumber"/>
-        <w:noProof/>
-      </w:rPr>
-      <w:t>Introduction</w:t>
-    </w:r>
-    <w:r>
-      <w:rPr>
-        <w:rStyle w:val="PageNumber"/>
-        <w:noProof/>
-      </w:rPr>
-      <w:fldChar w:fldCharType="end"/>
-    </w:r>
+    <w:fldSimple w:instr=" STYLEREF &quot;Heading 1&quot; \* MERGEFORMAT ">
+      <w:r>
+        <w:rPr>
+          <w:rStyle w:val="PageNumber"/>
+          <w:noProof/>
+        </w:rPr>
+        <w:t>Introduction</w:t>
+      </w:r>
+    </w:fldSimple>
   </w:p>
 </w:hdr>
 </file>
@@ -31294,7 +31507,7 @@
   <w:abstractNum w:abstractNumId="8" w15:restartNumberingAfterBreak="0">
     <w:nsid w:val="FFFFFF88"/>
     <w:multiLevelType w:val="singleLevel"/>
-    <w:tmpl w:val="B3ECFDC4"/>
+    <w:tmpl w:val="AF302F66"/>
     <w:lvl w:ilvl="0">
       <w:start w:val="1"/>
       <w:numFmt w:val="decimal"/>
@@ -33497,6 +33710,18 @@
   </w:num>
   <w:num w:numId="37">
     <w:abstractNumId w:val="18"/>
+  </w:num>
+  <w:num w:numId="38">
+    <w:abstractNumId w:val="8"/>
+    <w:lvlOverride w:ilvl="0">
+      <w:startOverride w:val="1"/>
+    </w:lvlOverride>
+  </w:num>
+  <w:num w:numId="39">
+    <w:abstractNumId w:val="8"/>
+    <w:lvlOverride w:ilvl="0">
+      <w:startOverride w:val="1"/>
+    </w:lvlOverride>
   </w:num>
 </w:numbering>
 </file>
@@ -34934,7 +35159,7 @@
 </file>
 
 <file path=customXml/itemProps1.xml><?xml version="1.0" encoding="utf-8"?>
-<ds:datastoreItem xmlns:ds="http://schemas.openxmlformats.org/officeDocument/2006/customXml" ds:itemID="{EB9981CF-B183-4256-BDCA-74F8E6205D79}">
+<ds:datastoreItem xmlns:ds="http://schemas.openxmlformats.org/officeDocument/2006/customXml" ds:itemID="{587C7725-9979-4E83-A1BB-BC1B676B26A0}">
   <ds:schemaRefs>
     <ds:schemaRef ds:uri="http://schemas.openxmlformats.org/officeDocument/2006/bibliography"/>
   </ds:schemaRefs>

</xml_diff>

<commit_message>
June 20 updates to technical docs
Update to docx and pptx files.

Change-Id: I3b64d233d4779afd7f2ccbdc7b86c56f79da488b
</commit_message>
<xml_diff>
--- a/HelpResourcesSources/TechnicalNotes/FLEx 9.1 Conceptual Model.docx
+++ b/HelpResourcesSources/TechnicalNotes/FLEx 9.1 Conceptual Model.docx
@@ -6,7 +6,7 @@
       <w:pPr>
         <w:pStyle w:val="Title"/>
       </w:pPr>
-      <w:bookmarkStart w:id="0" w:name="_Toc169516466"/>
+      <w:bookmarkStart w:id="0" w:name="_Toc169609285"/>
       <w:r>
         <w:t xml:space="preserve">FLEx </w:t>
       </w:r>
@@ -43,16 +43,8 @@
         <w:rPr>
           <w:szCs w:val="36"/>
         </w:rPr>
-        <w:t>1</w:t>
-      </w:r>
-      <w:r>
-        <w:rPr>
-          <w:szCs w:val="36"/>
-        </w:rPr>
-        <w:t>8</w:t>
-      </w:r>
-      <w:bookmarkStart w:id="1" w:name="_GoBack"/>
-      <w:bookmarkEnd w:id="1"/>
+        <w:t>20</w:t>
+      </w:r>
       <w:r>
         <w:rPr>
           <w:szCs w:val="36"/>
@@ -94,7 +86,7 @@
           <w:lang w:eastAsia="en-US"/>
         </w:rPr>
       </w:pPr>
-      <w:hyperlink w:anchor="_Toc169516466" w:history="1">
+      <w:hyperlink w:anchor="_Toc169609285" w:history="1">
         <w:r>
           <w:rPr>
             <w:rStyle w:val="Hyperlink"/>
@@ -121,7 +113,7 @@
             <w:noProof/>
             <w:webHidden/>
           </w:rPr>
-          <w:instrText xml:space="preserve"> PAGEREF _Toc169516466 \h </w:instrText>
+          <w:instrText xml:space="preserve"> PAGEREF _Toc169609285 \h </w:instrText>
         </w:r>
         <w:r>
           <w:rPr>
@@ -167,7 +159,7 @@
           <w:lang w:eastAsia="en-US"/>
         </w:rPr>
       </w:pPr>
-      <w:hyperlink w:anchor="_Toc169516467" w:history="1">
+      <w:hyperlink w:anchor="_Toc169609286" w:history="1">
         <w:r>
           <w:rPr>
             <w:rStyle w:val="Hyperlink"/>
@@ -211,7 +203,7 @@
             <w:noProof/>
             <w:webHidden/>
           </w:rPr>
-          <w:instrText xml:space="preserve"> PAGEREF _Toc169516467 \h </w:instrText>
+          <w:instrText xml:space="preserve"> PAGEREF _Toc169609286 \h </w:instrText>
         </w:r>
         <w:r>
           <w:rPr>
@@ -257,7 +249,7 @@
           <w:lang w:eastAsia="en-US"/>
         </w:rPr>
       </w:pPr>
-      <w:hyperlink w:anchor="_Toc169516468" w:history="1">
+      <w:hyperlink w:anchor="_Toc169609287" w:history="1">
         <w:r>
           <w:rPr>
             <w:rStyle w:val="Hyperlink"/>
@@ -301,7 +293,7 @@
             <w:noProof/>
             <w:webHidden/>
           </w:rPr>
-          <w:instrText xml:space="preserve"> PAGEREF _Toc169516468 \h </w:instrText>
+          <w:instrText xml:space="preserve"> PAGEREF _Toc169609287 \h </w:instrText>
         </w:r>
         <w:r>
           <w:rPr>
@@ -342,7 +334,7 @@
           <w:szCs w:val="22"/>
         </w:rPr>
       </w:pPr>
-      <w:hyperlink w:anchor="_Toc169516469" w:history="1">
+      <w:hyperlink w:anchor="_Toc169609288" w:history="1">
         <w:r>
           <w:rPr>
             <w:rStyle w:val="Hyperlink"/>
@@ -387,7 +379,7 @@
             <w:noProof/>
             <w:webHidden/>
           </w:rPr>
-          <w:instrText xml:space="preserve"> PAGEREF _Toc169516469 \h </w:instrText>
+          <w:instrText xml:space="preserve"> PAGEREF _Toc169609288 \h </w:instrText>
         </w:r>
         <w:r>
           <w:rPr>
@@ -428,7 +420,7 @@
           <w:szCs w:val="22"/>
         </w:rPr>
       </w:pPr>
-      <w:hyperlink w:anchor="_Toc169516470" w:history="1">
+      <w:hyperlink w:anchor="_Toc169609289" w:history="1">
         <w:r>
           <w:rPr>
             <w:rStyle w:val="Hyperlink"/>
@@ -473,7 +465,7 @@
             <w:noProof/>
             <w:webHidden/>
           </w:rPr>
-          <w:instrText xml:space="preserve"> PAGEREF _Toc169516470 \h </w:instrText>
+          <w:instrText xml:space="preserve"> PAGEREF _Toc169609289 \h </w:instrText>
         </w:r>
         <w:r>
           <w:rPr>
@@ -514,7 +506,7 @@
           <w:szCs w:val="22"/>
         </w:rPr>
       </w:pPr>
-      <w:hyperlink w:anchor="_Toc169516471" w:history="1">
+      <w:hyperlink w:anchor="_Toc169609290" w:history="1">
         <w:r>
           <w:rPr>
             <w:rStyle w:val="Hyperlink"/>
@@ -559,7 +551,7 @@
             <w:noProof/>
             <w:webHidden/>
           </w:rPr>
-          <w:instrText xml:space="preserve"> PAGEREF _Toc169516471 \h </w:instrText>
+          <w:instrText xml:space="preserve"> PAGEREF _Toc169609290 \h </w:instrText>
         </w:r>
         <w:r>
           <w:rPr>
@@ -605,7 +597,7 @@
           <w:lang w:eastAsia="en-US"/>
         </w:rPr>
       </w:pPr>
-      <w:hyperlink w:anchor="_Toc169516472" w:history="1">
+      <w:hyperlink w:anchor="_Toc169609291" w:history="1">
         <w:r>
           <w:rPr>
             <w:rStyle w:val="Hyperlink"/>
@@ -649,7 +641,7 @@
             <w:noProof/>
             <w:webHidden/>
           </w:rPr>
-          <w:instrText xml:space="preserve"> PAGEREF _Toc169516472 \h </w:instrText>
+          <w:instrText xml:space="preserve"> PAGEREF _Toc169609291 \h </w:instrText>
         </w:r>
         <w:r>
           <w:rPr>
@@ -694,7 +686,7 @@
           <w:szCs w:val="22"/>
         </w:rPr>
       </w:pPr>
-      <w:hyperlink w:anchor="_Toc169516473" w:history="1">
+      <w:hyperlink w:anchor="_Toc169609292" w:history="1">
         <w:r>
           <w:rPr>
             <w:rStyle w:val="Hyperlink"/>
@@ -739,7 +731,7 @@
             <w:noProof/>
             <w:webHidden/>
           </w:rPr>
-          <w:instrText xml:space="preserve"> PAGEREF _Toc169516473 \h </w:instrText>
+          <w:instrText xml:space="preserve"> PAGEREF _Toc169609292 \h </w:instrText>
         </w:r>
         <w:r>
           <w:rPr>
@@ -784,7 +776,7 @@
           <w:szCs w:val="22"/>
         </w:rPr>
       </w:pPr>
-      <w:hyperlink w:anchor="_Toc169516474" w:history="1">
+      <w:hyperlink w:anchor="_Toc169609293" w:history="1">
         <w:r>
           <w:rPr>
             <w:rStyle w:val="Hyperlink"/>
@@ -829,7 +821,7 @@
             <w:noProof/>
             <w:webHidden/>
           </w:rPr>
-          <w:instrText xml:space="preserve"> PAGEREF _Toc169516474 \h </w:instrText>
+          <w:instrText xml:space="preserve"> PAGEREF _Toc169609293 \h </w:instrText>
         </w:r>
         <w:r>
           <w:rPr>
@@ -874,7 +866,7 @@
           <w:szCs w:val="22"/>
         </w:rPr>
       </w:pPr>
-      <w:hyperlink w:anchor="_Toc169516475" w:history="1">
+      <w:hyperlink w:anchor="_Toc169609294" w:history="1">
         <w:r>
           <w:rPr>
             <w:rStyle w:val="Hyperlink"/>
@@ -919,7 +911,7 @@
             <w:noProof/>
             <w:webHidden/>
           </w:rPr>
-          <w:instrText xml:space="preserve"> PAGEREF _Toc169516475 \h </w:instrText>
+          <w:instrText xml:space="preserve"> PAGEREF _Toc169609294 \h </w:instrText>
         </w:r>
         <w:r>
           <w:rPr>
@@ -964,7 +956,7 @@
           <w:szCs w:val="22"/>
         </w:rPr>
       </w:pPr>
-      <w:hyperlink w:anchor="_Toc169516476" w:history="1">
+      <w:hyperlink w:anchor="_Toc169609295" w:history="1">
         <w:r>
           <w:rPr>
             <w:rStyle w:val="Hyperlink"/>
@@ -1009,7 +1001,7 @@
             <w:noProof/>
             <w:webHidden/>
           </w:rPr>
-          <w:instrText xml:space="preserve"> PAGEREF _Toc169516476 \h </w:instrText>
+          <w:instrText xml:space="preserve"> PAGEREF _Toc169609295 \h </w:instrText>
         </w:r>
         <w:r>
           <w:rPr>
@@ -1055,7 +1047,7 @@
           <w:lang w:eastAsia="en-US"/>
         </w:rPr>
       </w:pPr>
-      <w:hyperlink w:anchor="_Toc169516477" w:history="1">
+      <w:hyperlink w:anchor="_Toc169609296" w:history="1">
         <w:r>
           <w:rPr>
             <w:rStyle w:val="Hyperlink"/>
@@ -1099,7 +1091,7 @@
             <w:noProof/>
             <w:webHidden/>
           </w:rPr>
-          <w:instrText xml:space="preserve"> PAGEREF _Toc169516477 \h </w:instrText>
+          <w:instrText xml:space="preserve"> PAGEREF _Toc169609296 \h </w:instrText>
         </w:r>
         <w:r>
           <w:rPr>
@@ -1145,7 +1137,7 @@
           <w:lang w:eastAsia="en-US"/>
         </w:rPr>
       </w:pPr>
-      <w:hyperlink w:anchor="_Toc169516478" w:history="1">
+      <w:hyperlink w:anchor="_Toc169609297" w:history="1">
         <w:r>
           <w:rPr>
             <w:rStyle w:val="Hyperlink"/>
@@ -1189,7 +1181,7 @@
             <w:noProof/>
             <w:webHidden/>
           </w:rPr>
-          <w:instrText xml:space="preserve"> PAGEREF _Toc169516478 \h </w:instrText>
+          <w:instrText xml:space="preserve"> PAGEREF _Toc169609297 \h </w:instrText>
         </w:r>
         <w:r>
           <w:rPr>
@@ -1235,7 +1227,7 @@
           <w:lang w:eastAsia="en-US"/>
         </w:rPr>
       </w:pPr>
-      <w:hyperlink w:anchor="_Toc169516479" w:history="1">
+      <w:hyperlink w:anchor="_Toc169609298" w:history="1">
         <w:r>
           <w:rPr>
             <w:rStyle w:val="Hyperlink"/>
@@ -1279,7 +1271,7 @@
             <w:noProof/>
             <w:webHidden/>
           </w:rPr>
-          <w:instrText xml:space="preserve"> PAGEREF _Toc169516479 \h </w:instrText>
+          <w:instrText xml:space="preserve"> PAGEREF _Toc169609298 \h </w:instrText>
         </w:r>
         <w:r>
           <w:rPr>
@@ -1325,7 +1317,7 @@
           <w:lang w:eastAsia="en-US"/>
         </w:rPr>
       </w:pPr>
-      <w:hyperlink w:anchor="_Toc169516480" w:history="1">
+      <w:hyperlink w:anchor="_Toc169609299" w:history="1">
         <w:r>
           <w:rPr>
             <w:rStyle w:val="Hyperlink"/>
@@ -1369,7 +1361,7 @@
             <w:noProof/>
             <w:webHidden/>
           </w:rPr>
-          <w:instrText xml:space="preserve"> PAGEREF _Toc169516480 \h </w:instrText>
+          <w:instrText xml:space="preserve"> PAGEREF _Toc169609299 \h </w:instrText>
         </w:r>
         <w:r>
           <w:rPr>
@@ -1415,7 +1407,7 @@
           <w:lang w:eastAsia="en-US"/>
         </w:rPr>
       </w:pPr>
-      <w:hyperlink w:anchor="_Toc169516481" w:history="1">
+      <w:hyperlink w:anchor="_Toc169609300" w:history="1">
         <w:r>
           <w:rPr>
             <w:rStyle w:val="Hyperlink"/>
@@ -1459,7 +1451,7 @@
             <w:noProof/>
             <w:webHidden/>
           </w:rPr>
-          <w:instrText xml:space="preserve"> PAGEREF _Toc169516481 \h </w:instrText>
+          <w:instrText xml:space="preserve"> PAGEREF _Toc169609300 \h </w:instrText>
         </w:r>
         <w:r>
           <w:rPr>
@@ -1505,7 +1497,7 @@
           <w:lang w:eastAsia="en-US"/>
         </w:rPr>
       </w:pPr>
-      <w:hyperlink w:anchor="_Toc169516482" w:history="1">
+      <w:hyperlink w:anchor="_Toc169609301" w:history="1">
         <w:r>
           <w:rPr>
             <w:rStyle w:val="Hyperlink"/>
@@ -1549,7 +1541,7 @@
             <w:noProof/>
             <w:webHidden/>
           </w:rPr>
-          <w:instrText xml:space="preserve"> PAGEREF _Toc169516482 \h </w:instrText>
+          <w:instrText xml:space="preserve"> PAGEREF _Toc169609301 \h </w:instrText>
         </w:r>
         <w:r>
           <w:rPr>
@@ -1595,7 +1587,7 @@
           <w:lang w:eastAsia="en-US"/>
         </w:rPr>
       </w:pPr>
-      <w:hyperlink w:anchor="_Toc169516483" w:history="1">
+      <w:hyperlink w:anchor="_Toc169609302" w:history="1">
         <w:r>
           <w:rPr>
             <w:rStyle w:val="Hyperlink"/>
@@ -1639,7 +1631,7 @@
             <w:noProof/>
             <w:webHidden/>
           </w:rPr>
-          <w:instrText xml:space="preserve"> PAGEREF _Toc169516483 \h </w:instrText>
+          <w:instrText xml:space="preserve"> PAGEREF _Toc169609302 \h </w:instrText>
         </w:r>
         <w:r>
           <w:rPr>
@@ -1680,7 +1672,7 @@
           <w:szCs w:val="22"/>
         </w:rPr>
       </w:pPr>
-      <w:hyperlink w:anchor="_Toc169516484" w:history="1">
+      <w:hyperlink w:anchor="_Toc169609303" w:history="1">
         <w:r>
           <w:rPr>
             <w:rStyle w:val="Hyperlink"/>
@@ -1725,7 +1717,7 @@
             <w:noProof/>
             <w:webHidden/>
           </w:rPr>
-          <w:instrText xml:space="preserve"> PAGEREF _Toc169516484 \h </w:instrText>
+          <w:instrText xml:space="preserve"> PAGEREF _Toc169609303 \h </w:instrText>
         </w:r>
         <w:r>
           <w:rPr>
@@ -1766,7 +1758,7 @@
           <w:szCs w:val="22"/>
         </w:rPr>
       </w:pPr>
-      <w:hyperlink w:anchor="_Toc169516485" w:history="1">
+      <w:hyperlink w:anchor="_Toc169609304" w:history="1">
         <w:r>
           <w:rPr>
             <w:rStyle w:val="Hyperlink"/>
@@ -1811,7 +1803,7 @@
             <w:noProof/>
             <w:webHidden/>
           </w:rPr>
-          <w:instrText xml:space="preserve"> PAGEREF _Toc169516485 \h </w:instrText>
+          <w:instrText xml:space="preserve"> PAGEREF _Toc169609304 \h </w:instrText>
         </w:r>
         <w:r>
           <w:rPr>
@@ -1852,7 +1844,7 @@
           <w:szCs w:val="22"/>
         </w:rPr>
       </w:pPr>
-      <w:hyperlink w:anchor="_Toc169516486" w:history="1">
+      <w:hyperlink w:anchor="_Toc169609305" w:history="1">
         <w:r>
           <w:rPr>
             <w:rStyle w:val="Hyperlink"/>
@@ -1897,7 +1889,7 @@
             <w:noProof/>
             <w:webHidden/>
           </w:rPr>
-          <w:instrText xml:space="preserve"> PAGEREF _Toc169516486 \h </w:instrText>
+          <w:instrText xml:space="preserve"> PAGEREF _Toc169609305 \h </w:instrText>
         </w:r>
         <w:r>
           <w:rPr>
@@ -1938,7 +1930,7 @@
           <w:szCs w:val="22"/>
         </w:rPr>
       </w:pPr>
-      <w:hyperlink w:anchor="_Toc169516487" w:history="1">
+      <w:hyperlink w:anchor="_Toc169609306" w:history="1">
         <w:r>
           <w:rPr>
             <w:rStyle w:val="Hyperlink"/>
@@ -1983,7 +1975,7 @@
             <w:noProof/>
             <w:webHidden/>
           </w:rPr>
-          <w:instrText xml:space="preserve"> PAGEREF _Toc169516487 \h </w:instrText>
+          <w:instrText xml:space="preserve"> PAGEREF _Toc169609306 \h </w:instrText>
         </w:r>
         <w:r>
           <w:rPr>
@@ -2024,7 +2016,7 @@
           <w:szCs w:val="22"/>
         </w:rPr>
       </w:pPr>
-      <w:hyperlink w:anchor="_Toc169516488" w:history="1">
+      <w:hyperlink w:anchor="_Toc169609307" w:history="1">
         <w:r>
           <w:rPr>
             <w:rStyle w:val="Hyperlink"/>
@@ -2069,7 +2061,7 @@
             <w:noProof/>
             <w:webHidden/>
           </w:rPr>
-          <w:instrText xml:space="preserve"> PAGEREF _Toc169516488 \h </w:instrText>
+          <w:instrText xml:space="preserve"> PAGEREF _Toc169609307 \h </w:instrText>
         </w:r>
         <w:r>
           <w:rPr>
@@ -2110,7 +2102,7 @@
           <w:szCs w:val="22"/>
         </w:rPr>
       </w:pPr>
-      <w:hyperlink w:anchor="_Toc169516489" w:history="1">
+      <w:hyperlink w:anchor="_Toc169609308" w:history="1">
         <w:r>
           <w:rPr>
             <w:rStyle w:val="Hyperlink"/>
@@ -2155,7 +2147,7 @@
             <w:noProof/>
             <w:webHidden/>
           </w:rPr>
-          <w:instrText xml:space="preserve"> PAGEREF _Toc169516489 \h </w:instrText>
+          <w:instrText xml:space="preserve"> PAGEREF _Toc169609308 \h </w:instrText>
         </w:r>
         <w:r>
           <w:rPr>
@@ -2196,7 +2188,7 @@
           <w:szCs w:val="22"/>
         </w:rPr>
       </w:pPr>
-      <w:hyperlink w:anchor="_Toc169516490" w:history="1">
+      <w:hyperlink w:anchor="_Toc169609309" w:history="1">
         <w:r>
           <w:rPr>
             <w:rStyle w:val="Hyperlink"/>
@@ -2241,7 +2233,7 @@
             <w:noProof/>
             <w:webHidden/>
           </w:rPr>
-          <w:instrText xml:space="preserve"> PAGEREF _Toc169516490 \h </w:instrText>
+          <w:instrText xml:space="preserve"> PAGEREF _Toc169609309 \h </w:instrText>
         </w:r>
         <w:r>
           <w:rPr>
@@ -2287,7 +2279,7 @@
           <w:lang w:eastAsia="en-US"/>
         </w:rPr>
       </w:pPr>
-      <w:hyperlink w:anchor="_Toc169516491" w:history="1">
+      <w:hyperlink w:anchor="_Toc169609310" w:history="1">
         <w:r>
           <w:rPr>
             <w:rStyle w:val="Hyperlink"/>
@@ -2331,7 +2323,7 @@
             <w:noProof/>
             <w:webHidden/>
           </w:rPr>
-          <w:instrText xml:space="preserve"> PAGEREF _Toc169516491 \h </w:instrText>
+          <w:instrText xml:space="preserve"> PAGEREF _Toc169609310 \h </w:instrText>
         </w:r>
         <w:r>
           <w:rPr>
@@ -2372,7 +2364,7 @@
           <w:szCs w:val="22"/>
         </w:rPr>
       </w:pPr>
-      <w:hyperlink w:anchor="_Toc169516492" w:history="1">
+      <w:hyperlink w:anchor="_Toc169609311" w:history="1">
         <w:r>
           <w:rPr>
             <w:rStyle w:val="Hyperlink"/>
@@ -2417,7 +2409,7 @@
             <w:noProof/>
             <w:webHidden/>
           </w:rPr>
-          <w:instrText xml:space="preserve"> PAGEREF _Toc169516492 \h </w:instrText>
+          <w:instrText xml:space="preserve"> PAGEREF _Toc169609311 \h </w:instrText>
         </w:r>
         <w:r>
           <w:rPr>
@@ -2458,7 +2450,7 @@
           <w:szCs w:val="22"/>
         </w:rPr>
       </w:pPr>
-      <w:hyperlink w:anchor="_Toc169516493" w:history="1">
+      <w:hyperlink w:anchor="_Toc169609312" w:history="1">
         <w:r>
           <w:rPr>
             <w:rStyle w:val="Hyperlink"/>
@@ -2503,7 +2495,7 @@
             <w:noProof/>
             <w:webHidden/>
           </w:rPr>
-          <w:instrText xml:space="preserve"> PAGEREF _Toc169516493 \h </w:instrText>
+          <w:instrText xml:space="preserve"> PAGEREF _Toc169609312 \h </w:instrText>
         </w:r>
         <w:r>
           <w:rPr>
@@ -2544,7 +2536,7 @@
           <w:szCs w:val="22"/>
         </w:rPr>
       </w:pPr>
-      <w:hyperlink w:anchor="_Toc169516494" w:history="1">
+      <w:hyperlink w:anchor="_Toc169609313" w:history="1">
         <w:r>
           <w:rPr>
             <w:rStyle w:val="Hyperlink"/>
@@ -2589,7 +2581,7 @@
             <w:noProof/>
             <w:webHidden/>
           </w:rPr>
-          <w:instrText xml:space="preserve"> PAGEREF _Toc169516494 \h </w:instrText>
+          <w:instrText xml:space="preserve"> PAGEREF _Toc169609313 \h </w:instrText>
         </w:r>
         <w:r>
           <w:rPr>
@@ -2635,7 +2627,7 @@
           <w:lang w:eastAsia="en-US"/>
         </w:rPr>
       </w:pPr>
-      <w:hyperlink w:anchor="_Toc169516495" w:history="1">
+      <w:hyperlink w:anchor="_Toc169609314" w:history="1">
         <w:r>
           <w:rPr>
             <w:rStyle w:val="Hyperlink"/>
@@ -2679,7 +2671,7 @@
             <w:noProof/>
             <w:webHidden/>
           </w:rPr>
-          <w:instrText xml:space="preserve"> PAGEREF _Toc169516495 \h </w:instrText>
+          <w:instrText xml:space="preserve"> PAGEREF _Toc169609314 \h </w:instrText>
         </w:r>
         <w:r>
           <w:rPr>
@@ -2725,7 +2717,7 @@
           <w:lang w:eastAsia="en-US"/>
         </w:rPr>
       </w:pPr>
-      <w:hyperlink w:anchor="_Toc169516496" w:history="1">
+      <w:hyperlink w:anchor="_Toc169609315" w:history="1">
         <w:r>
           <w:rPr>
             <w:rStyle w:val="Hyperlink"/>
@@ -2769,7 +2761,7 @@
             <w:noProof/>
             <w:webHidden/>
           </w:rPr>
-          <w:instrText xml:space="preserve"> PAGEREF _Toc169516496 \h </w:instrText>
+          <w:instrText xml:space="preserve"> PAGEREF _Toc169609315 \h </w:instrText>
         </w:r>
         <w:r>
           <w:rPr>
@@ -2810,7 +2802,7 @@
           <w:szCs w:val="22"/>
         </w:rPr>
       </w:pPr>
-      <w:hyperlink w:anchor="_Toc169516497" w:history="1">
+      <w:hyperlink w:anchor="_Toc169609316" w:history="1">
         <w:r>
           <w:rPr>
             <w:rStyle w:val="Hyperlink"/>
@@ -2855,7 +2847,7 @@
             <w:noProof/>
             <w:webHidden/>
           </w:rPr>
-          <w:instrText xml:space="preserve"> PAGEREF _Toc169516497 \h </w:instrText>
+          <w:instrText xml:space="preserve"> PAGEREF _Toc169609316 \h </w:instrText>
         </w:r>
         <w:r>
           <w:rPr>
@@ -2896,7 +2888,7 @@
           <w:szCs w:val="22"/>
         </w:rPr>
       </w:pPr>
-      <w:hyperlink w:anchor="_Toc169516498" w:history="1">
+      <w:hyperlink w:anchor="_Toc169609317" w:history="1">
         <w:r>
           <w:rPr>
             <w:rStyle w:val="Hyperlink"/>
@@ -2941,7 +2933,7 @@
             <w:noProof/>
             <w:webHidden/>
           </w:rPr>
-          <w:instrText xml:space="preserve"> PAGEREF _Toc169516498 \h </w:instrText>
+          <w:instrText xml:space="preserve"> PAGEREF _Toc169609317 \h </w:instrText>
         </w:r>
         <w:r>
           <w:rPr>
@@ -2987,7 +2979,7 @@
           <w:lang w:eastAsia="en-US"/>
         </w:rPr>
       </w:pPr>
-      <w:hyperlink w:anchor="_Toc169516499" w:history="1">
+      <w:hyperlink w:anchor="_Toc169609318" w:history="1">
         <w:r>
           <w:rPr>
             <w:rStyle w:val="Hyperlink"/>
@@ -3031,7 +3023,7 @@
             <w:noProof/>
             <w:webHidden/>
           </w:rPr>
-          <w:instrText xml:space="preserve"> PAGEREF _Toc169516499 \h </w:instrText>
+          <w:instrText xml:space="preserve"> PAGEREF _Toc169609318 \h </w:instrText>
         </w:r>
         <w:r>
           <w:rPr>
@@ -3072,7 +3064,7 @@
           <w:szCs w:val="22"/>
         </w:rPr>
       </w:pPr>
-      <w:hyperlink w:anchor="_Toc169516500" w:history="1">
+      <w:hyperlink w:anchor="_Toc169609319" w:history="1">
         <w:r>
           <w:rPr>
             <w:rStyle w:val="Hyperlink"/>
@@ -3117,7 +3109,7 @@
             <w:noProof/>
             <w:webHidden/>
           </w:rPr>
-          <w:instrText xml:space="preserve"> PAGEREF _Toc169516500 \h </w:instrText>
+          <w:instrText xml:space="preserve"> PAGEREF _Toc169609319 \h </w:instrText>
         </w:r>
         <w:r>
           <w:rPr>
@@ -3163,7 +3155,7 @@
           <w:lang w:eastAsia="en-US"/>
         </w:rPr>
       </w:pPr>
-      <w:hyperlink w:anchor="_Toc169516501" w:history="1">
+      <w:hyperlink w:anchor="_Toc169609320" w:history="1">
         <w:r>
           <w:rPr>
             <w:rStyle w:val="Hyperlink"/>
@@ -3207,7 +3199,7 @@
             <w:noProof/>
             <w:webHidden/>
           </w:rPr>
-          <w:instrText xml:space="preserve"> PAGEREF _Toc169516501 \h </w:instrText>
+          <w:instrText xml:space="preserve"> PAGEREF _Toc169609320 \h </w:instrText>
         </w:r>
         <w:r>
           <w:rPr>
@@ -3253,7 +3245,7 @@
           <w:lang w:eastAsia="en-US"/>
         </w:rPr>
       </w:pPr>
-      <w:hyperlink w:anchor="_Toc169516502" w:history="1">
+      <w:hyperlink w:anchor="_Toc169609321" w:history="1">
         <w:r>
           <w:rPr>
             <w:rStyle w:val="Hyperlink"/>
@@ -3297,7 +3289,7 @@
             <w:noProof/>
             <w:webHidden/>
           </w:rPr>
-          <w:instrText xml:space="preserve"> PAGEREF _Toc169516502 \h </w:instrText>
+          <w:instrText xml:space="preserve"> PAGEREF _Toc169609321 \h </w:instrText>
         </w:r>
         <w:r>
           <w:rPr>
@@ -3343,7 +3335,7 @@
           <w:lang w:eastAsia="en-US"/>
         </w:rPr>
       </w:pPr>
-      <w:hyperlink w:anchor="_Toc169516503" w:history="1">
+      <w:hyperlink w:anchor="_Toc169609322" w:history="1">
         <w:r>
           <w:rPr>
             <w:rStyle w:val="Hyperlink"/>
@@ -3387,7 +3379,7 @@
             <w:noProof/>
             <w:webHidden/>
           </w:rPr>
-          <w:instrText xml:space="preserve"> PAGEREF _Toc169516503 \h </w:instrText>
+          <w:instrText xml:space="preserve"> PAGEREF _Toc169609322 \h </w:instrText>
         </w:r>
         <w:r>
           <w:rPr>
@@ -3433,7 +3425,7 @@
           <w:lang w:eastAsia="en-US"/>
         </w:rPr>
       </w:pPr>
-      <w:hyperlink w:anchor="_Toc169516504" w:history="1">
+      <w:hyperlink w:anchor="_Toc169609323" w:history="1">
         <w:r>
           <w:rPr>
             <w:rStyle w:val="Hyperlink"/>
@@ -3477,7 +3469,7 @@
             <w:noProof/>
             <w:webHidden/>
           </w:rPr>
-          <w:instrText xml:space="preserve"> PAGEREF _Toc169516504 \h </w:instrText>
+          <w:instrText xml:space="preserve"> PAGEREF _Toc169609323 \h </w:instrText>
         </w:r>
         <w:r>
           <w:rPr>
@@ -3523,7 +3515,7 @@
           <w:lang w:eastAsia="en-US"/>
         </w:rPr>
       </w:pPr>
-      <w:hyperlink w:anchor="_Toc169516505" w:history="1">
+      <w:hyperlink w:anchor="_Toc169609324" w:history="1">
         <w:r>
           <w:rPr>
             <w:rStyle w:val="Hyperlink"/>
@@ -3567,7 +3559,7 @@
             <w:noProof/>
             <w:webHidden/>
           </w:rPr>
-          <w:instrText xml:space="preserve"> PAGEREF _Toc169516505 \h </w:instrText>
+          <w:instrText xml:space="preserve"> PAGEREF _Toc169609324 \h </w:instrText>
         </w:r>
         <w:r>
           <w:rPr>
@@ -3613,7 +3605,7 @@
           <w:lang w:eastAsia="en-US"/>
         </w:rPr>
       </w:pPr>
-      <w:hyperlink w:anchor="_Toc169516506" w:history="1">
+      <w:hyperlink w:anchor="_Toc169609325" w:history="1">
         <w:r>
           <w:rPr>
             <w:rStyle w:val="Hyperlink"/>
@@ -3657,7 +3649,7 @@
             <w:noProof/>
             <w:webHidden/>
           </w:rPr>
-          <w:instrText xml:space="preserve"> PAGEREF _Toc169516506 \h </w:instrText>
+          <w:instrText xml:space="preserve"> PAGEREF _Toc169609325 \h </w:instrText>
         </w:r>
         <w:r>
           <w:rPr>
@@ -3698,7 +3690,7 @@
           <w:szCs w:val="22"/>
         </w:rPr>
       </w:pPr>
-      <w:hyperlink w:anchor="_Toc169516507" w:history="1">
+      <w:hyperlink w:anchor="_Toc169609326" w:history="1">
         <w:r>
           <w:rPr>
             <w:rStyle w:val="Hyperlink"/>
@@ -3743,7 +3735,7 @@
             <w:noProof/>
             <w:webHidden/>
           </w:rPr>
-          <w:instrText xml:space="preserve"> PAGEREF _Toc169516507 \h </w:instrText>
+          <w:instrText xml:space="preserve"> PAGEREF _Toc169609326 \h </w:instrText>
         </w:r>
         <w:r>
           <w:rPr>
@@ -3789,7 +3781,7 @@
           <w:lang w:eastAsia="en-US"/>
         </w:rPr>
       </w:pPr>
-      <w:hyperlink w:anchor="_Toc169516508" w:history="1">
+      <w:hyperlink w:anchor="_Toc169609327" w:history="1">
         <w:r>
           <w:rPr>
             <w:rStyle w:val="Hyperlink"/>
@@ -3833,7 +3825,7 @@
             <w:noProof/>
             <w:webHidden/>
           </w:rPr>
-          <w:instrText xml:space="preserve"> PAGEREF _Toc169516508 \h </w:instrText>
+          <w:instrText xml:space="preserve"> PAGEREF _Toc169609327 \h </w:instrText>
         </w:r>
         <w:r>
           <w:rPr>
@@ -3879,7 +3871,7 @@
           <w:lang w:eastAsia="en-US"/>
         </w:rPr>
       </w:pPr>
-      <w:hyperlink w:anchor="_Toc169516509" w:history="1">
+      <w:hyperlink w:anchor="_Toc169609328" w:history="1">
         <w:r>
           <w:rPr>
             <w:rStyle w:val="Hyperlink"/>
@@ -3923,7 +3915,7 @@
             <w:noProof/>
             <w:webHidden/>
           </w:rPr>
-          <w:instrText xml:space="preserve"> PAGEREF _Toc169516509 \h </w:instrText>
+          <w:instrText xml:space="preserve"> PAGEREF _Toc169609328 \h </w:instrText>
         </w:r>
         <w:r>
           <w:rPr>
@@ -3964,7 +3956,7 @@
           <w:szCs w:val="22"/>
         </w:rPr>
       </w:pPr>
-      <w:hyperlink w:anchor="_Toc169516510" w:history="1">
+      <w:hyperlink w:anchor="_Toc169609329" w:history="1">
         <w:r>
           <w:rPr>
             <w:rStyle w:val="Hyperlink"/>
@@ -4009,7 +4001,7 @@
             <w:noProof/>
             <w:webHidden/>
           </w:rPr>
-          <w:instrText xml:space="preserve"> PAGEREF _Toc169516510 \h </w:instrText>
+          <w:instrText xml:space="preserve"> PAGEREF _Toc169609329 \h </w:instrText>
         </w:r>
         <w:r>
           <w:rPr>
@@ -4055,7 +4047,7 @@
           <w:lang w:eastAsia="en-US"/>
         </w:rPr>
       </w:pPr>
-      <w:hyperlink w:anchor="_Toc169516511" w:history="1">
+      <w:hyperlink w:anchor="_Toc169609330" w:history="1">
         <w:r>
           <w:rPr>
             <w:rStyle w:val="Hyperlink"/>
@@ -4099,7 +4091,7 @@
             <w:noProof/>
             <w:webHidden/>
           </w:rPr>
-          <w:instrText xml:space="preserve"> PAGEREF _Toc169516511 \h </w:instrText>
+          <w:instrText xml:space="preserve"> PAGEREF _Toc169609330 \h </w:instrText>
         </w:r>
         <w:r>
           <w:rPr>
@@ -4145,7 +4137,7 @@
           <w:lang w:eastAsia="en-US"/>
         </w:rPr>
       </w:pPr>
-      <w:hyperlink w:anchor="_Toc169516512" w:history="1">
+      <w:hyperlink w:anchor="_Toc169609331" w:history="1">
         <w:r>
           <w:rPr>
             <w:rStyle w:val="Hyperlink"/>
@@ -4189,7 +4181,7 @@
             <w:noProof/>
             <w:webHidden/>
           </w:rPr>
-          <w:instrText xml:space="preserve"> PAGEREF _Toc169516512 \h </w:instrText>
+          <w:instrText xml:space="preserve"> PAGEREF _Toc169609331 \h </w:instrText>
         </w:r>
         <w:r>
           <w:rPr>
@@ -4235,7 +4227,7 @@
           <w:lang w:eastAsia="en-US"/>
         </w:rPr>
       </w:pPr>
-      <w:hyperlink w:anchor="_Toc169516513" w:history="1">
+      <w:hyperlink w:anchor="_Toc169609332" w:history="1">
         <w:r>
           <w:rPr>
             <w:rStyle w:val="Hyperlink"/>
@@ -4279,7 +4271,7 @@
             <w:noProof/>
             <w:webHidden/>
           </w:rPr>
-          <w:instrText xml:space="preserve"> PAGEREF _Toc169516513 \h </w:instrText>
+          <w:instrText xml:space="preserve"> PAGEREF _Toc169609332 \h </w:instrText>
         </w:r>
         <w:r>
           <w:rPr>
@@ -4324,7 +4316,7 @@
           <w:szCs w:val="22"/>
         </w:rPr>
       </w:pPr>
-      <w:hyperlink w:anchor="_Toc169516514" w:history="1">
+      <w:hyperlink w:anchor="_Toc169609333" w:history="1">
         <w:r>
           <w:rPr>
             <w:rStyle w:val="Hyperlink"/>
@@ -4369,7 +4361,7 @@
             <w:noProof/>
             <w:webHidden/>
           </w:rPr>
-          <w:instrText xml:space="preserve"> PAGEREF _Toc169516514 \h </w:instrText>
+          <w:instrText xml:space="preserve"> PAGEREF _Toc169609333 \h </w:instrText>
         </w:r>
         <w:r>
           <w:rPr>
@@ -4414,7 +4406,7 @@
           <w:szCs w:val="22"/>
         </w:rPr>
       </w:pPr>
-      <w:hyperlink w:anchor="_Toc169516515" w:history="1">
+      <w:hyperlink w:anchor="_Toc169609334" w:history="1">
         <w:r>
           <w:rPr>
             <w:rStyle w:val="Hyperlink"/>
@@ -4459,7 +4451,7 @@
             <w:noProof/>
             <w:webHidden/>
           </w:rPr>
-          <w:instrText xml:space="preserve"> PAGEREF _Toc169516515 \h </w:instrText>
+          <w:instrText xml:space="preserve"> PAGEREF _Toc169609334 \h </w:instrText>
         </w:r>
         <w:r>
           <w:rPr>
@@ -4504,7 +4496,7 @@
           <w:szCs w:val="22"/>
         </w:rPr>
       </w:pPr>
-      <w:hyperlink w:anchor="_Toc169516516" w:history="1">
+      <w:hyperlink w:anchor="_Toc169609335" w:history="1">
         <w:r>
           <w:rPr>
             <w:rStyle w:val="Hyperlink"/>
@@ -4549,7 +4541,7 @@
             <w:noProof/>
             <w:webHidden/>
           </w:rPr>
-          <w:instrText xml:space="preserve"> PAGEREF _Toc169516516 \h </w:instrText>
+          <w:instrText xml:space="preserve"> PAGEREF _Toc169609335 \h </w:instrText>
         </w:r>
         <w:r>
           <w:rPr>
@@ -4594,7 +4586,7 @@
           <w:szCs w:val="22"/>
         </w:rPr>
       </w:pPr>
-      <w:hyperlink w:anchor="_Toc169516517" w:history="1">
+      <w:hyperlink w:anchor="_Toc169609336" w:history="1">
         <w:r>
           <w:rPr>
             <w:rStyle w:val="Hyperlink"/>
@@ -4639,7 +4631,7 @@
             <w:noProof/>
             <w:webHidden/>
           </w:rPr>
-          <w:instrText xml:space="preserve"> PAGEREF _Toc169516517 \h </w:instrText>
+          <w:instrText xml:space="preserve"> PAGEREF _Toc169609336 \h </w:instrText>
         </w:r>
         <w:r>
           <w:rPr>
@@ -4684,7 +4676,7 @@
           <w:szCs w:val="22"/>
         </w:rPr>
       </w:pPr>
-      <w:hyperlink w:anchor="_Toc169516518" w:history="1">
+      <w:hyperlink w:anchor="_Toc169609337" w:history="1">
         <w:r>
           <w:rPr>
             <w:rStyle w:val="Hyperlink"/>
@@ -4729,7 +4721,7 @@
             <w:noProof/>
             <w:webHidden/>
           </w:rPr>
-          <w:instrText xml:space="preserve"> PAGEREF _Toc169516518 \h </w:instrText>
+          <w:instrText xml:space="preserve"> PAGEREF _Toc169609337 \h </w:instrText>
         </w:r>
         <w:r>
           <w:rPr>
@@ -4775,7 +4767,7 @@
           <w:lang w:eastAsia="en-US"/>
         </w:rPr>
       </w:pPr>
-      <w:hyperlink w:anchor="_Toc169516519" w:history="1">
+      <w:hyperlink w:anchor="_Toc169609338" w:history="1">
         <w:r>
           <w:rPr>
             <w:rStyle w:val="Hyperlink"/>
@@ -4819,7 +4811,7 @@
             <w:noProof/>
             <w:webHidden/>
           </w:rPr>
-          <w:instrText xml:space="preserve"> PAGEREF _Toc169516519 \h </w:instrText>
+          <w:instrText xml:space="preserve"> PAGEREF _Toc169609338 \h </w:instrText>
         </w:r>
         <w:r>
           <w:rPr>
@@ -4865,7 +4857,7 @@
           <w:lang w:eastAsia="en-US"/>
         </w:rPr>
       </w:pPr>
-      <w:hyperlink w:anchor="_Toc169516520" w:history="1">
+      <w:hyperlink w:anchor="_Toc169609339" w:history="1">
         <w:r>
           <w:rPr>
             <w:rStyle w:val="Hyperlink"/>
@@ -4909,7 +4901,7 @@
             <w:noProof/>
             <w:webHidden/>
           </w:rPr>
-          <w:instrText xml:space="preserve"> PAGEREF _Toc169516520 \h </w:instrText>
+          <w:instrText xml:space="preserve"> PAGEREF _Toc169609339 \h </w:instrText>
         </w:r>
         <w:r>
           <w:rPr>
@@ -4955,7 +4947,7 @@
           <w:lang w:eastAsia="en-US"/>
         </w:rPr>
       </w:pPr>
-      <w:hyperlink w:anchor="_Toc169516521" w:history="1">
+      <w:hyperlink w:anchor="_Toc169609340" w:history="1">
         <w:r>
           <w:rPr>
             <w:rStyle w:val="Hyperlink"/>
@@ -4999,7 +4991,7 @@
             <w:noProof/>
             <w:webHidden/>
           </w:rPr>
-          <w:instrText xml:space="preserve"> PAGEREF _Toc169516521 \h </w:instrText>
+          <w:instrText xml:space="preserve"> PAGEREF _Toc169609340 \h </w:instrText>
         </w:r>
         <w:r>
           <w:rPr>
@@ -5040,7 +5032,7 @@
           <w:szCs w:val="22"/>
         </w:rPr>
       </w:pPr>
-      <w:hyperlink w:anchor="_Toc169516522" w:history="1">
+      <w:hyperlink w:anchor="_Toc169609341" w:history="1">
         <w:r>
           <w:rPr>
             <w:rStyle w:val="Hyperlink"/>
@@ -5085,7 +5077,7 @@
             <w:noProof/>
             <w:webHidden/>
           </w:rPr>
-          <w:instrText xml:space="preserve"> PAGEREF _Toc169516522 \h </w:instrText>
+          <w:instrText xml:space="preserve"> PAGEREF _Toc169609341 \h </w:instrText>
         </w:r>
         <w:r>
           <w:rPr>
@@ -5126,7 +5118,7 @@
           <w:szCs w:val="22"/>
         </w:rPr>
       </w:pPr>
-      <w:hyperlink w:anchor="_Toc169516523" w:history="1">
+      <w:hyperlink w:anchor="_Toc169609342" w:history="1">
         <w:r>
           <w:rPr>
             <w:rStyle w:val="Hyperlink"/>
@@ -5171,7 +5163,7 @@
             <w:noProof/>
             <w:webHidden/>
           </w:rPr>
-          <w:instrText xml:space="preserve"> PAGEREF _Toc169516523 \h </w:instrText>
+          <w:instrText xml:space="preserve"> PAGEREF _Toc169609342 \h </w:instrText>
         </w:r>
         <w:r>
           <w:rPr>
@@ -5217,7 +5209,7 @@
           <w:lang w:eastAsia="en-US"/>
         </w:rPr>
       </w:pPr>
-      <w:hyperlink w:anchor="_Toc169516524" w:history="1">
+      <w:hyperlink w:anchor="_Toc169609343" w:history="1">
         <w:r>
           <w:rPr>
             <w:rStyle w:val="Hyperlink"/>
@@ -5261,7 +5253,7 @@
             <w:noProof/>
             <w:webHidden/>
           </w:rPr>
-          <w:instrText xml:space="preserve"> PAGEREF _Toc169516524 \h </w:instrText>
+          <w:instrText xml:space="preserve"> PAGEREF _Toc169609343 \h </w:instrText>
         </w:r>
         <w:r>
           <w:rPr>
@@ -5302,7 +5294,7 @@
           <w:szCs w:val="22"/>
         </w:rPr>
       </w:pPr>
-      <w:hyperlink w:anchor="_Toc169516525" w:history="1">
+      <w:hyperlink w:anchor="_Toc169609344" w:history="1">
         <w:r>
           <w:rPr>
             <w:rStyle w:val="Hyperlink"/>
@@ -5347,7 +5339,7 @@
             <w:noProof/>
             <w:webHidden/>
           </w:rPr>
-          <w:instrText xml:space="preserve"> PAGEREF _Toc169516525 \h </w:instrText>
+          <w:instrText xml:space="preserve"> PAGEREF _Toc169609344 \h </w:instrText>
         </w:r>
         <w:r>
           <w:rPr>
@@ -5388,7 +5380,7 @@
           <w:szCs w:val="22"/>
         </w:rPr>
       </w:pPr>
-      <w:hyperlink w:anchor="_Toc169516526" w:history="1">
+      <w:hyperlink w:anchor="_Toc169609345" w:history="1">
         <w:r>
           <w:rPr>
             <w:rStyle w:val="Hyperlink"/>
@@ -5433,7 +5425,7 @@
             <w:noProof/>
             <w:webHidden/>
           </w:rPr>
-          <w:instrText xml:space="preserve"> PAGEREF _Toc169516526 \h </w:instrText>
+          <w:instrText xml:space="preserve"> PAGEREF _Toc169609345 \h </w:instrText>
         </w:r>
         <w:r>
           <w:rPr>
@@ -5474,7 +5466,7 @@
           <w:szCs w:val="22"/>
         </w:rPr>
       </w:pPr>
-      <w:hyperlink w:anchor="_Toc169516527" w:history="1">
+      <w:hyperlink w:anchor="_Toc169609346" w:history="1">
         <w:r>
           <w:rPr>
             <w:rStyle w:val="Hyperlink"/>
@@ -5519,7 +5511,7 @@
             <w:noProof/>
             <w:webHidden/>
           </w:rPr>
-          <w:instrText xml:space="preserve"> PAGEREF _Toc169516527 \h </w:instrText>
+          <w:instrText xml:space="preserve"> PAGEREF _Toc169609346 \h </w:instrText>
         </w:r>
         <w:r>
           <w:rPr>
@@ -5565,7 +5557,7 @@
           <w:lang w:eastAsia="en-US"/>
         </w:rPr>
       </w:pPr>
-      <w:hyperlink w:anchor="_Toc169516528" w:history="1">
+      <w:hyperlink w:anchor="_Toc169609347" w:history="1">
         <w:r>
           <w:rPr>
             <w:rStyle w:val="Hyperlink"/>
@@ -5609,7 +5601,7 @@
             <w:noProof/>
             <w:webHidden/>
           </w:rPr>
-          <w:instrText xml:space="preserve"> PAGEREF _Toc169516528 \h </w:instrText>
+          <w:instrText xml:space="preserve"> PAGEREF _Toc169609347 \h </w:instrText>
         </w:r>
         <w:r>
           <w:rPr>
@@ -5650,7 +5642,7 @@
           <w:szCs w:val="22"/>
         </w:rPr>
       </w:pPr>
-      <w:hyperlink w:anchor="_Toc169516529" w:history="1">
+      <w:hyperlink w:anchor="_Toc169609348" w:history="1">
         <w:r>
           <w:rPr>
             <w:rStyle w:val="Hyperlink"/>
@@ -5695,7 +5687,7 @@
             <w:noProof/>
             <w:webHidden/>
           </w:rPr>
-          <w:instrText xml:space="preserve"> PAGEREF _Toc169516529 \h </w:instrText>
+          <w:instrText xml:space="preserve"> PAGEREF _Toc169609348 \h </w:instrText>
         </w:r>
         <w:r>
           <w:rPr>
@@ -5736,7 +5728,7 @@
           <w:szCs w:val="22"/>
         </w:rPr>
       </w:pPr>
-      <w:hyperlink w:anchor="_Toc169516530" w:history="1">
+      <w:hyperlink w:anchor="_Toc169609349" w:history="1">
         <w:r>
           <w:rPr>
             <w:rStyle w:val="Hyperlink"/>
@@ -5781,7 +5773,7 @@
             <w:noProof/>
             <w:webHidden/>
           </w:rPr>
-          <w:instrText xml:space="preserve"> PAGEREF _Toc169516530 \h </w:instrText>
+          <w:instrText xml:space="preserve"> PAGEREF _Toc169609349 \h </w:instrText>
         </w:r>
         <w:r>
           <w:rPr>
@@ -5822,7 +5814,7 @@
           <w:szCs w:val="22"/>
         </w:rPr>
       </w:pPr>
-      <w:hyperlink w:anchor="_Toc169516531" w:history="1">
+      <w:hyperlink w:anchor="_Toc169609350" w:history="1">
         <w:r>
           <w:rPr>
             <w:rStyle w:val="Hyperlink"/>
@@ -5867,7 +5859,7 @@
             <w:noProof/>
             <w:webHidden/>
           </w:rPr>
-          <w:instrText xml:space="preserve"> PAGEREF _Toc169516531 \h </w:instrText>
+          <w:instrText xml:space="preserve"> PAGEREF _Toc169609350 \h </w:instrText>
         </w:r>
         <w:r>
           <w:rPr>
@@ -5908,7 +5900,7 @@
           <w:szCs w:val="22"/>
         </w:rPr>
       </w:pPr>
-      <w:hyperlink w:anchor="_Toc169516532" w:history="1">
+      <w:hyperlink w:anchor="_Toc169609351" w:history="1">
         <w:r>
           <w:rPr>
             <w:rStyle w:val="Hyperlink"/>
@@ -5953,7 +5945,7 @@
             <w:noProof/>
             <w:webHidden/>
           </w:rPr>
-          <w:instrText xml:space="preserve"> PAGEREF _Toc169516532 \h </w:instrText>
+          <w:instrText xml:space="preserve"> PAGEREF _Toc169609351 \h </w:instrText>
         </w:r>
         <w:r>
           <w:rPr>
@@ -5994,7 +5986,7 @@
           <w:szCs w:val="22"/>
         </w:rPr>
       </w:pPr>
-      <w:hyperlink w:anchor="_Toc169516533" w:history="1">
+      <w:hyperlink w:anchor="_Toc169609352" w:history="1">
         <w:r>
           <w:rPr>
             <w:rStyle w:val="Hyperlink"/>
@@ -6039,7 +6031,7 @@
             <w:noProof/>
             <w:webHidden/>
           </w:rPr>
-          <w:instrText xml:space="preserve"> PAGEREF _Toc169516533 \h </w:instrText>
+          <w:instrText xml:space="preserve"> PAGEREF _Toc169609352 \h </w:instrText>
         </w:r>
         <w:r>
           <w:rPr>
@@ -6080,7 +6072,7 @@
           <w:szCs w:val="22"/>
         </w:rPr>
       </w:pPr>
-      <w:hyperlink w:anchor="_Toc169516534" w:history="1">
+      <w:hyperlink w:anchor="_Toc169609353" w:history="1">
         <w:r>
           <w:rPr>
             <w:rStyle w:val="Hyperlink"/>
@@ -6125,7 +6117,7 @@
             <w:noProof/>
             <w:webHidden/>
           </w:rPr>
-          <w:instrText xml:space="preserve"> PAGEREF _Toc169516534 \h </w:instrText>
+          <w:instrText xml:space="preserve"> PAGEREF _Toc169609353 \h </w:instrText>
         </w:r>
         <w:r>
           <w:rPr>
@@ -6166,7 +6158,7 @@
           <w:szCs w:val="22"/>
         </w:rPr>
       </w:pPr>
-      <w:hyperlink w:anchor="_Toc169516535" w:history="1">
+      <w:hyperlink w:anchor="_Toc169609354" w:history="1">
         <w:r>
           <w:rPr>
             <w:rStyle w:val="Hyperlink"/>
@@ -6211,7 +6203,7 @@
             <w:noProof/>
             <w:webHidden/>
           </w:rPr>
-          <w:instrText xml:space="preserve"> PAGEREF _Toc169516535 \h </w:instrText>
+          <w:instrText xml:space="preserve"> PAGEREF _Toc169609354 \h </w:instrText>
         </w:r>
         <w:r>
           <w:rPr>
@@ -6252,7 +6244,7 @@
           <w:szCs w:val="22"/>
         </w:rPr>
       </w:pPr>
-      <w:hyperlink w:anchor="_Toc169516536" w:history="1">
+      <w:hyperlink w:anchor="_Toc169609355" w:history="1">
         <w:r>
           <w:rPr>
             <w:rStyle w:val="Hyperlink"/>
@@ -6297,7 +6289,7 @@
             <w:noProof/>
             <w:webHidden/>
           </w:rPr>
-          <w:instrText xml:space="preserve"> PAGEREF _Toc169516536 \h </w:instrText>
+          <w:instrText xml:space="preserve"> PAGEREF _Toc169609355 \h </w:instrText>
         </w:r>
         <w:r>
           <w:rPr>
@@ -6343,7 +6335,7 @@
           <w:lang w:eastAsia="en-US"/>
         </w:rPr>
       </w:pPr>
-      <w:hyperlink w:anchor="_Toc169516537" w:history="1">
+      <w:hyperlink w:anchor="_Toc169609356" w:history="1">
         <w:r>
           <w:rPr>
             <w:rStyle w:val="Hyperlink"/>
@@ -6387,7 +6379,7 @@
             <w:noProof/>
             <w:webHidden/>
           </w:rPr>
-          <w:instrText xml:space="preserve"> PAGEREF _Toc169516537 \h </w:instrText>
+          <w:instrText xml:space="preserve"> PAGEREF _Toc169609356 \h </w:instrText>
         </w:r>
         <w:r>
           <w:rPr>
@@ -6425,14 +6417,14 @@
       <w:r>
         <w:fldChar w:fldCharType="end"/>
       </w:r>
-      <w:bookmarkStart w:id="2" w:name="_Toc169516467"/>
+      <w:bookmarkStart w:id="1" w:name="_Toc169609286"/>
       <w:r>
         <w:t>I</w:t>
       </w:r>
       <w:r>
         <w:t>ntroduction</w:t>
       </w:r>
-      <w:bookmarkEnd w:id="2"/>
+      <w:bookmarkEnd w:id="1"/>
     </w:p>
     <w:p>
       <w:pPr>
@@ -6666,7 +6658,7 @@
       <w:pPr>
         <w:pStyle w:val="Heading1"/>
       </w:pPr>
-      <w:bookmarkStart w:id="3" w:name="_Toc169516468"/>
+      <w:bookmarkStart w:id="2" w:name="_Toc169609287"/>
       <w:r>
         <w:t xml:space="preserve">Basic </w:t>
       </w:r>
@@ -6676,7 +6668,7 @@
       <w:r>
         <w:t>oncepts</w:t>
       </w:r>
-      <w:bookmarkEnd w:id="3"/>
+      <w:bookmarkEnd w:id="2"/>
     </w:p>
     <w:p>
       <w:pPr>
@@ -6952,11 +6944,11 @@
       <w:pPr>
         <w:pStyle w:val="Heading2"/>
       </w:pPr>
-      <w:bookmarkStart w:id="4" w:name="_Toc169516469"/>
+      <w:bookmarkStart w:id="3" w:name="_Toc169609288"/>
       <w:r>
         <w:t>Classes and properties</w:t>
       </w:r>
-      <w:bookmarkEnd w:id="4"/>
+      <w:bookmarkEnd w:id="3"/>
     </w:p>
     <w:p>
       <w:pPr>
@@ -7198,11 +7190,11 @@
       <w:pPr>
         <w:pStyle w:val="Heading2"/>
       </w:pPr>
-      <w:bookmarkStart w:id="5" w:name="_Toc169516470"/>
+      <w:bookmarkStart w:id="4" w:name="_Toc169609289"/>
       <w:r>
         <w:t>Writing systems</w:t>
       </w:r>
-      <w:bookmarkEnd w:id="5"/>
+      <w:bookmarkEnd w:id="4"/>
     </w:p>
     <w:p>
       <w:pPr>
@@ -7843,11 +7835,11 @@
       <w:pPr>
         <w:pStyle w:val="Heading2"/>
       </w:pPr>
-      <w:bookmarkStart w:id="6" w:name="_Toc169516471"/>
+      <w:bookmarkStart w:id="5" w:name="_Toc169609290"/>
       <w:r>
         <w:t>Basic properties</w:t>
       </w:r>
-      <w:bookmarkEnd w:id="6"/>
+      <w:bookmarkEnd w:id="5"/>
     </w:p>
     <w:p>
       <w:pPr>
@@ -7861,154 +7853,154 @@
       <w:pPr>
         <w:pStyle w:val="Heading3"/>
       </w:pPr>
-      <w:bookmarkStart w:id="7" w:name="_Toc318113549"/>
-      <w:bookmarkStart w:id="8" w:name="_Toc169516472"/>
+      <w:bookmarkStart w:id="6" w:name="_Toc318113549"/>
+      <w:bookmarkStart w:id="7" w:name="_Toc169609291"/>
       <w:r>
         <w:lastRenderedPageBreak/>
         <w:t>Strings</w:t>
       </w:r>
+      <w:bookmarkEnd w:id="6"/>
       <w:bookmarkEnd w:id="7"/>
+    </w:p>
+    <w:p>
+      <w:pPr>
+        <w:pStyle w:val="BodyText"/>
+      </w:pPr>
+      <w:r>
+        <w:t>All strings in FieldWorks store Unicode data. In the fwdata file it is stored in NFC normalization. There are two basic types of strings in Field</w:t>
+      </w:r>
+      <w:r>
+        <w:t>W</w:t>
+      </w:r>
+      <w:r>
+        <w:t>orks</w:t>
+      </w:r>
+      <w:r>
+        <w:t>, which are poorly named since all strings are in Unicode</w:t>
+      </w:r>
+      <w:r>
+        <w:t>.</w:t>
+      </w:r>
+      <w:r>
+        <w:t xml:space="preserve"> </w:t>
+      </w:r>
+    </w:p>
+    <w:p>
+      <w:pPr>
+        <w:pStyle w:val="ListBullet"/>
+      </w:pPr>
+      <w:r>
+        <w:t>Unicode: This type of string is a sequence of Unicode characters which does not allow any embedding including styles and writing systems.</w:t>
+      </w:r>
+      <w:r>
+        <w:t xml:space="preserve"> In the FLEx UI these strings can be recognized because the writing system and style combo boxes are disabled in the toolbar.</w:t>
+      </w:r>
+    </w:p>
+    <w:p>
+      <w:pPr>
+        <w:pStyle w:val="ListBullet"/>
+      </w:pPr>
+      <w:r>
+        <w:t xml:space="preserve">String: This type of string is a sequence of Unicode characters, but can also have substrings with styles and different writing systems, plus some other specialized attributes. In the FLEx UI these strings can be recognized because the </w:t>
+      </w:r>
+      <w:r>
+        <w:t>writing system and style combo boxes are enabled in the toolbar.</w:t>
+      </w:r>
+    </w:p>
+    <w:p>
+      <w:pPr>
+        <w:pStyle w:val="BodyText"/>
+      </w:pPr>
+      <w:r>
+        <w:t>If we started over, we would probably have a single kind of string, but when FLEx was first developed it was using SQL Server for storage, and it was much more efficient dealing with a simple type of string compared to added complexity storing strings with embeddings. There was originally a bigger variety of each string that could hold really long strings. When switching to XML storage</w:t>
+      </w:r>
+      <w:r>
+        <w:t xml:space="preserve"> in FW7</w:t>
+      </w:r>
+      <w:r>
+        <w:t>, we dropped the big variety because it was irrelevant, but we maintained the distinction between strings with or without embedding.</w:t>
+      </w:r>
+    </w:p>
+    <w:p>
+      <w:pPr>
+        <w:pStyle w:val="BodyText"/>
+      </w:pPr>
+      <w:r>
+        <w:t>Strings in Fieldworks should never have a CRLF or tab. FLEx tries to prevent this on import, typing, pasting, etc. Occasionally something slips through. In this case, when the field is displayed, all of the text following the CRLF or tab will not show. If you place your cursor at what appears to be the end of the string, and press Delete, it will delete the CRL</w:t>
+      </w:r>
+      <w:r>
+        <w:t>F</w:t>
+      </w:r>
+      <w:r>
+        <w:t xml:space="preserve"> or tab and you’ll see the rest of the string.</w:t>
+      </w:r>
+    </w:p>
+    <w:p>
+      <w:pPr>
+        <w:pStyle w:val="BodyText"/>
+      </w:pPr>
+      <w:r>
+        <w:t xml:space="preserve">FLEx can force a line break in either type of string. In the UI, this happens when you enter Shift+Enter. This inserts a U+2028 LNE SEPARATOR character in the string. This is somewhat </w:t>
+      </w:r>
+      <w:r>
+        <w:t>similar to having</w:t>
+      </w:r>
+      <w:r>
+        <w:t xml:space="preserve"> new paragraphs in a string, although there is no paragraph formatting applied in this case.</w:t>
+      </w:r>
+    </w:p>
+    <w:p>
+      <w:pPr>
+        <w:pStyle w:val="BodyText"/>
+      </w:pPr>
+      <w:r>
+        <w:t xml:space="preserve">Both types of strings can be used by itself in a property, or a property </w:t>
+      </w:r>
+      <w:r>
+        <w:t xml:space="preserve">can </w:t>
+      </w:r>
+      <w:r>
+        <w:t>hold multiple set</w:t>
+      </w:r>
+      <w:r>
+        <w:t>s</w:t>
+      </w:r>
+      <w:r>
+        <w:t xml:space="preserve"> of equivalent string</w:t>
+      </w:r>
+      <w:r>
+        <w:t>s in different languages or writing systems. These multiple versions are called MultiUnicode and MultString. The multi</w:t>
+      </w:r>
+      <w:r>
+        <w:t>ple</w:t>
+      </w:r>
+      <w:r>
+        <w:t xml:space="preserve"> </w:t>
+      </w:r>
+      <w:r>
+        <w:t>property always has a writing system associated with each alternative string. In a multiple property, every string in the property must have a unique writing system, which means you can’t have two en alternatives. The strings in a multiple property are normally the same string written in a different language (e.g., English, French, German) or writing system (</w:t>
+      </w:r>
+      <w:r>
+        <w:t xml:space="preserve">e.g., </w:t>
+      </w:r>
+      <w:r>
+        <w:t>normal or IPA orthography), or any combination of these.</w:t>
+      </w:r>
+      <w:r>
+        <w:t xml:space="preserve"> The writing system attributes in strings should always have a matching ldml file in the WritingSystemStore directory.</w:t>
+      </w:r>
+    </w:p>
+    <w:p>
+      <w:pPr>
+        <w:pStyle w:val="Heading4"/>
+      </w:pPr>
+      <w:bookmarkStart w:id="8" w:name="_Toc318113550"/>
+      <w:bookmarkStart w:id="9" w:name="_Toc169609292"/>
+      <w:r>
+        <w:t>Unicode</w:t>
+      </w:r>
       <w:bookmarkEnd w:id="8"/>
-    </w:p>
-    <w:p>
-      <w:pPr>
-        <w:pStyle w:val="BodyText"/>
-      </w:pPr>
-      <w:r>
-        <w:t>All strings in FieldWorks store Unicode data. In the fwdata file it is stored in NFC normalization. There are two basic types of strings in Field</w:t>
-      </w:r>
-      <w:r>
-        <w:t>W</w:t>
-      </w:r>
-      <w:r>
-        <w:t>orks</w:t>
-      </w:r>
-      <w:r>
-        <w:t>, which are poorly named since all strings are in Unicode</w:t>
-      </w:r>
-      <w:r>
-        <w:t>.</w:t>
-      </w:r>
-      <w:r>
-        <w:t xml:space="preserve"> </w:t>
-      </w:r>
-    </w:p>
-    <w:p>
-      <w:pPr>
-        <w:pStyle w:val="ListBullet"/>
-      </w:pPr>
-      <w:r>
-        <w:t>Unicode: This type of string is a sequence of Unicode characters which does not allow any embedding including styles and writing systems.</w:t>
-      </w:r>
-      <w:r>
-        <w:t xml:space="preserve"> In the FLEx UI these strings can be recognized because the writing system and style combo boxes are disabled in the toolbar.</w:t>
-      </w:r>
-    </w:p>
-    <w:p>
-      <w:pPr>
-        <w:pStyle w:val="ListBullet"/>
-      </w:pPr>
-      <w:r>
-        <w:t xml:space="preserve">String: This type of string is a sequence of Unicode characters, but can also have substrings with styles and different writing systems, plus some other specialized attributes. In the FLEx UI these strings can be recognized because the </w:t>
-      </w:r>
-      <w:r>
-        <w:t>writing system and style combo boxes are enabled in the toolbar.</w:t>
-      </w:r>
-    </w:p>
-    <w:p>
-      <w:pPr>
-        <w:pStyle w:val="BodyText"/>
-      </w:pPr>
-      <w:r>
-        <w:t>If we started over, we would probably have a single kind of string, but when FLEx was first developed it was using SQL Server for storage, and it was much more efficient dealing with a simple type of string compared to added complexity storing strings with embeddings. There was originally a bigger variety of each string that could hold really long strings. When switching to XML storage</w:t>
-      </w:r>
-      <w:r>
-        <w:t xml:space="preserve"> in FW7</w:t>
-      </w:r>
-      <w:r>
-        <w:t>, we dropped the big variety because it was irrelevant, but we maintained the distinction between strings with or without embedding.</w:t>
-      </w:r>
-    </w:p>
-    <w:p>
-      <w:pPr>
-        <w:pStyle w:val="BodyText"/>
-      </w:pPr>
-      <w:r>
-        <w:t>Strings in Fieldworks should never have a CRLF or tab. FLEx tries to prevent this on import, typing, pasting, etc. Occasionally something slips through. In this case, when the field is displayed, all of the text following the CRLF or tab will not show. If you place your cursor at what appears to be the end of the string, and press Delete, it will delete the CRL</w:t>
-      </w:r>
-      <w:r>
-        <w:t>F</w:t>
-      </w:r>
-      <w:r>
-        <w:t xml:space="preserve"> or tab and you’ll see the rest of the string.</w:t>
-      </w:r>
-    </w:p>
-    <w:p>
-      <w:pPr>
-        <w:pStyle w:val="BodyText"/>
-      </w:pPr>
-      <w:r>
-        <w:t xml:space="preserve">FLEx can force a line break in either type of string. In the UI, this happens when you enter Shift+Enter. This inserts a U+2028 LNE SEPARATOR character in the string. This is somewhat </w:t>
-      </w:r>
-      <w:r>
-        <w:t>similar to having</w:t>
-      </w:r>
-      <w:r>
-        <w:t xml:space="preserve"> new paragraphs in a string, although there is no paragraph formatting applied in this case.</w:t>
-      </w:r>
-    </w:p>
-    <w:p>
-      <w:pPr>
-        <w:pStyle w:val="BodyText"/>
-      </w:pPr>
-      <w:r>
-        <w:t xml:space="preserve">Both types of strings can be used by itself in a property, or a property </w:t>
-      </w:r>
-      <w:r>
-        <w:t xml:space="preserve">can </w:t>
-      </w:r>
-      <w:r>
-        <w:t>hold multiple set</w:t>
-      </w:r>
-      <w:r>
-        <w:t>s</w:t>
-      </w:r>
-      <w:r>
-        <w:t xml:space="preserve"> of equivalent string</w:t>
-      </w:r>
-      <w:r>
-        <w:t>s in different languages or writing systems. These multiple versions are called MultiUnicode and MultString. The multi</w:t>
-      </w:r>
-      <w:r>
-        <w:t>ple</w:t>
-      </w:r>
-      <w:r>
-        <w:t xml:space="preserve"> </w:t>
-      </w:r>
-      <w:r>
-        <w:t>property always has a writing system associated with each alternative string. In a multiple property, every string in the property must have a unique writing system, which means you can’t have two en alternatives. The strings in a multiple property are normally the same string written in a different language (e.g., English, French, German) or writing system (</w:t>
-      </w:r>
-      <w:r>
-        <w:t xml:space="preserve">e.g., </w:t>
-      </w:r>
-      <w:r>
-        <w:t>normal or IPA orthography), or any combination of these.</w:t>
-      </w:r>
-      <w:r>
-        <w:t xml:space="preserve"> The writing system attributes in strings should always have a matching ldml file in the WritingSystemStore directory.</w:t>
-      </w:r>
-    </w:p>
-    <w:p>
-      <w:pPr>
-        <w:pStyle w:val="Heading4"/>
-      </w:pPr>
-      <w:bookmarkStart w:id="9" w:name="_Toc318113550"/>
-      <w:bookmarkStart w:id="10" w:name="_Toc169516473"/>
-      <w:r>
-        <w:t>Unicode</w:t>
-      </w:r>
       <w:bookmarkEnd w:id="9"/>
-      <w:bookmarkEnd w:id="10"/>
     </w:p>
     <w:p>
       <w:pPr>
@@ -8109,7 +8101,7 @@
       <w:r>
         <w:t>he FieldWorks display mechanism shows boxes for characters that are not in the current font rather than substituting other fonts as needed. FieldWorks generally chooses a writing system representing the system language on your computer, if the writing system exists, otherwise it defaults to English when displaying these strings.</w:t>
       </w:r>
-      <w:bookmarkStart w:id="11" w:name="_Toc318113551"/>
+      <w:bookmarkStart w:id="10" w:name="_Toc318113551"/>
     </w:p>
     <w:p>
       <w:pPr>
@@ -8169,14 +8161,14 @@
       <w:pPr>
         <w:pStyle w:val="Heading4"/>
       </w:pPr>
-      <w:bookmarkStart w:id="12" w:name="_Ref162943041"/>
-      <w:bookmarkStart w:id="13" w:name="_Toc169516474"/>
+      <w:bookmarkStart w:id="11" w:name="_Ref162943041"/>
+      <w:bookmarkStart w:id="12" w:name="_Toc169609293"/>
       <w:r>
         <w:t>String</w:t>
       </w:r>
+      <w:bookmarkEnd w:id="10"/>
       <w:bookmarkEnd w:id="11"/>
       <w:bookmarkEnd w:id="12"/>
-      <w:bookmarkEnd w:id="13"/>
     </w:p>
     <w:p>
       <w:pPr>
@@ -8544,71 +8536,71 @@
       <w:pPr>
         <w:pStyle w:val="Heading4"/>
       </w:pPr>
-      <w:bookmarkStart w:id="14" w:name="_Toc318113552"/>
-      <w:bookmarkStart w:id="15" w:name="_Toc169516475"/>
+      <w:bookmarkStart w:id="13" w:name="_Toc318113552"/>
+      <w:bookmarkStart w:id="14" w:name="_Toc169609294"/>
       <w:r>
         <w:t>MultiUnicode</w:t>
       </w:r>
+      <w:bookmarkEnd w:id="13"/>
       <w:bookmarkEnd w:id="14"/>
+    </w:p>
+    <w:p>
+      <w:pPr>
+        <w:pStyle w:val="BodyText"/>
+      </w:pPr>
+      <w:r>
+        <w:t xml:space="preserve">Many properties (fields) in FieldWorks are designed to hold strings that will never have embedding, but may have translations in different languages or writing systems (e.g., lexeme form, gloss, and names and abbreviations for list items). Here is how these MultiUnicode properties are </w:t>
+      </w:r>
+      <w:r>
+        <w:t>stored in fwdata</w:t>
+      </w:r>
+      <w:r>
+        <w:t>.</w:t>
+      </w:r>
+    </w:p>
+    <w:p>
+      <w:pPr>
+        <w:pStyle w:val="Example"/>
+      </w:pPr>
+      <w:r>
+        <w:t>&lt;Name&gt;</w:t>
+      </w:r>
+      <w:r>
+        <w:br/>
+        <w:t>&lt;AUni ws="en"&gt;adjunct&lt;/AUni&gt;</w:t>
+      </w:r>
+      <w:r>
+        <w:br/>
+        <w:t>&lt;AUni ws="fr"&gt;accessoire&lt;/AUni&gt;</w:t>
+      </w:r>
+      <w:r>
+        <w:br/>
+        <w:t>&lt;AUni ws="es"&gt;adjunto&lt;/AUni&gt;</w:t>
+      </w:r>
+      <w:r>
+        <w:br/>
+        <w:t>&lt;/Name&gt;</w:t>
+      </w:r>
+    </w:p>
+    <w:p>
+      <w:pPr>
+        <w:pStyle w:val="BodyText"/>
+      </w:pPr>
+      <w:r>
+        <w:t>This field is the Name for a CmPossibility object. In this case, there are three FieldWorks Unicode strings; English, French, and Spanish. Each FieldWorks Unicode string is stored in an AUni element. Even though the FieldWorks Unicode string itself does not have a writing system, FieldWorks knows the intended writing system by the “ws” attribute of the AUni element. It is an error to have more than one AUni element in a single property with the same writing system.</w:t>
+      </w:r>
+    </w:p>
+    <w:p>
+      <w:pPr>
+        <w:pStyle w:val="Heading4"/>
+      </w:pPr>
+      <w:bookmarkStart w:id="15" w:name="_Toc318113553"/>
+      <w:bookmarkStart w:id="16" w:name="_Toc169609295"/>
+      <w:r>
+        <w:t>MultiString</w:t>
+      </w:r>
       <w:bookmarkEnd w:id="15"/>
-    </w:p>
-    <w:p>
-      <w:pPr>
-        <w:pStyle w:val="BodyText"/>
-      </w:pPr>
-      <w:r>
-        <w:t xml:space="preserve">Many properties (fields) in FieldWorks are designed to hold strings that will never have embedding, but may have translations in different languages or writing systems (e.g., lexeme form, gloss, and names and abbreviations for list items). Here is how these MultiUnicode properties are </w:t>
-      </w:r>
-      <w:r>
-        <w:t>stored in fwdata</w:t>
-      </w:r>
-      <w:r>
-        <w:t>.</w:t>
-      </w:r>
-    </w:p>
-    <w:p>
-      <w:pPr>
-        <w:pStyle w:val="Example"/>
-      </w:pPr>
-      <w:r>
-        <w:t>&lt;Name&gt;</w:t>
-      </w:r>
-      <w:r>
-        <w:br/>
-        <w:t>&lt;AUni ws="en"&gt;adjunct&lt;/AUni&gt;</w:t>
-      </w:r>
-      <w:r>
-        <w:br/>
-        <w:t>&lt;AUni ws="fr"&gt;accessoire&lt;/AUni&gt;</w:t>
-      </w:r>
-      <w:r>
-        <w:br/>
-        <w:t>&lt;AUni ws="es"&gt;adjunto&lt;/AUni&gt;</w:t>
-      </w:r>
-      <w:r>
-        <w:br/>
-        <w:t>&lt;/Name&gt;</w:t>
-      </w:r>
-    </w:p>
-    <w:p>
-      <w:pPr>
-        <w:pStyle w:val="BodyText"/>
-      </w:pPr>
-      <w:r>
-        <w:t>This field is the Name for a CmPossibility object. In this case, there are three FieldWorks Unicode strings; English, French, and Spanish. Each FieldWorks Unicode string is stored in an AUni element. Even though the FieldWorks Unicode string itself does not have a writing system, FieldWorks knows the intended writing system by the “ws” attribute of the AUni element. It is an error to have more than one AUni element in a single property with the same writing system.</w:t>
-      </w:r>
-    </w:p>
-    <w:p>
-      <w:pPr>
-        <w:pStyle w:val="Heading4"/>
-      </w:pPr>
-      <w:bookmarkStart w:id="16" w:name="_Toc318113553"/>
-      <w:bookmarkStart w:id="17" w:name="_Toc169516476"/>
-      <w:r>
-        <w:t>MultiString</w:t>
-      </w:r>
       <w:bookmarkEnd w:id="16"/>
-      <w:bookmarkEnd w:id="17"/>
     </w:p>
     <w:p>
       <w:pPr>
@@ -8716,10 +8708,71 @@
       <w:pPr>
         <w:pStyle w:val="Heading3"/>
       </w:pPr>
-      <w:bookmarkStart w:id="18" w:name="_Toc169516477"/>
+      <w:bookmarkStart w:id="17" w:name="_Toc169609296"/>
       <w:r>
         <w:t>Binary</w:t>
       </w:r>
+      <w:bookmarkEnd w:id="17"/>
+    </w:p>
+    <w:p>
+      <w:pPr>
+        <w:pStyle w:val="BodyText"/>
+      </w:pPr>
+      <w:r>
+        <w:t>Binary properties are represented as follows:</w:t>
+      </w:r>
+    </w:p>
+    <w:p>
+      <w:pPr>
+        <w:pStyle w:val="Example"/>
+      </w:pPr>
+      <w:r>
+        <w:t>&lt;</w:t>
+      </w:r>
+      <w:r>
+        <w:t>Sid</w:t>
+      </w:r>
+      <w:r>
+        <w:t>&gt;</w:t>
+      </w:r>
+      <w:r>
+        <w:br/>
+      </w:r>
+      <w:r>
+        <w:t>&lt;Binary&gt;6400000001000000&lt;/Binary&gt;</w:t>
+      </w:r>
+      <w:r>
+        <w:br/>
+      </w:r>
+      <w:r>
+        <w:t>&lt;/</w:t>
+      </w:r>
+      <w:r>
+        <w:t>Sid</w:t>
+      </w:r>
+      <w:r>
+        <w:t>&gt;</w:t>
+      </w:r>
+    </w:p>
+    <w:p>
+      <w:pPr>
+        <w:pStyle w:val="BodyText"/>
+      </w:pPr>
+      <w:r>
+        <w:t>Binary data is stored as a sequence of hexadecimal bytes.</w:t>
+      </w:r>
+      <w:r>
+        <w:t xml:space="preserve"> Our current model only has one Binary property: Sid on UserConfigAcct. But I don’t think it is used anywhere.</w:t>
+      </w:r>
+    </w:p>
+    <w:p>
+      <w:pPr>
+        <w:pStyle w:val="Heading3"/>
+      </w:pPr>
+      <w:bookmarkStart w:id="18" w:name="_Toc169609297"/>
+      <w:r>
+        <w:t>Boolean</w:t>
+      </w:r>
       <w:bookmarkEnd w:id="18"/>
     </w:p>
     <w:p>
@@ -8727,7 +8780,7 @@
         <w:pStyle w:val="BodyText"/>
       </w:pPr>
       <w:r>
-        <w:t>Binary properties are represented as follows:</w:t>
+        <w:t>Boolean properties are represented as follows:</w:t>
       </w:r>
     </w:p>
     <w:p>
@@ -8735,60 +8788,35 @@
         <w:pStyle w:val="Example"/>
       </w:pPr>
       <w:r>
-        <w:t>&lt;</w:t>
-      </w:r>
-      <w:r>
-        <w:t>Sid</w:t>
-      </w:r>
-      <w:r>
-        <w:t>&gt;</w:t>
-      </w:r>
-      <w:r>
-        <w:br/>
-      </w:r>
-      <w:r>
-        <w:t>&lt;Binary&gt;6400000001000000&lt;/Binary&gt;</w:t>
-      </w:r>
-      <w:r>
-        <w:br/>
-      </w:r>
-      <w:r>
-        <w:t>&lt;/</w:t>
-      </w:r>
-      <w:r>
-        <w:t>Sid</w:t>
-      </w:r>
-      <w:r>
-        <w:t>&gt;</w:t>
-      </w:r>
-    </w:p>
-    <w:p>
-      <w:pPr>
-        <w:pStyle w:val="BodyText"/>
-      </w:pPr>
-      <w:r>
-        <w:t>Binary data is stored as a sequence of hexadecimal bytes.</w:t>
-      </w:r>
-      <w:r>
-        <w:t xml:space="preserve"> Our current model only has one Binary property: Sid on UserConfigAcct. But I don’t think it is used anywhere.</w:t>
+        <w:t>&lt;IsSorted val="true"/&gt;</w:t>
+      </w:r>
+    </w:p>
+    <w:p>
+      <w:pPr>
+        <w:pStyle w:val="BodyText"/>
+      </w:pPr>
+      <w:r>
+        <w:t>This is the IsSorted property on CmPossibilityList. The value is stored in the “val” attribute as “true” or “false”. The default value for missing properties is false.</w:t>
       </w:r>
     </w:p>
     <w:p>
       <w:pPr>
         <w:pStyle w:val="Heading3"/>
       </w:pPr>
-      <w:bookmarkStart w:id="19" w:name="_Toc169516478"/>
-      <w:r>
-        <w:t>Boolean</w:t>
+      <w:bookmarkStart w:id="19" w:name="_Ref163130885"/>
+      <w:bookmarkStart w:id="20" w:name="_Toc169609298"/>
+      <w:r>
+        <w:t>GenDate</w:t>
       </w:r>
       <w:bookmarkEnd w:id="19"/>
-    </w:p>
-    <w:p>
-      <w:pPr>
-        <w:pStyle w:val="BodyText"/>
-      </w:pPr>
-      <w:r>
-        <w:t>Boolean properties are represented as follows:</w:t>
+      <w:bookmarkEnd w:id="20"/>
+    </w:p>
+    <w:p>
+      <w:pPr>
+        <w:pStyle w:val="BodyText"/>
+      </w:pPr>
+      <w:r>
+        <w:t>GenDate provides a way to store an approximate date without a time (e.g., before March 1200 AD). They are stored as an int (4 bytes). This is a decimal representation of a generic date without a time. It's up to the software to make sure the int is a valid date. The range is 21474 BC through 21474 AD. The format is:</w:t>
       </w:r>
     </w:p>
     <w:p>
@@ -8796,128 +8824,143 @@
         <w:pStyle w:val="Example"/>
       </w:pPr>
       <w:r>
-        <w:t>&lt;IsSorted val="true"/&gt;</w:t>
-      </w:r>
-    </w:p>
-    <w:p>
-      <w:pPr>
-        <w:pStyle w:val="BodyText"/>
-      </w:pPr>
-      <w:r>
-        <w:t>This is the IsSorted property on CmPossibilityList. The value is stored in the “val” attribute as “true” or “false”. The default value for missing properties is false.</w:t>
+        <w:t>[-]YYYYMMDDP</w:t>
+      </w:r>
+      <w:r>
+        <w:br/>
+        <w:t>YYYY is the 1-5 digit year (negative is BC) 0000 is unknown.</w:t>
+      </w:r>
+      <w:r>
+        <w:br/>
+        <w:t>MM is the 2 digit month (for BC months it is 13 - M) 00 is unknown</w:t>
+      </w:r>
+      <w:r>
+        <w:br/>
+        <w:t>DD is the 2 digit day (for BC days it is 32 - D) 00 is unknown</w:t>
+      </w:r>
+      <w:r>
+        <w:br/>
+        <w:t>P is one of the following:</w:t>
+      </w:r>
+      <w:r>
+        <w:br/>
+        <w:t xml:space="preserve">  0 = Before (If GenDate = 0, it means nothing is entered)</w:t>
+      </w:r>
+      <w:r>
+        <w:br/>
+        <w:t xml:space="preserve">  1 = Exact</w:t>
+      </w:r>
+      <w:r>
+        <w:br/>
+        <w:t xml:space="preserve">  2 = Approximate</w:t>
+      </w:r>
+      <w:r>
+        <w:br/>
+        <w:t xml:space="preserve">  3 = After</w:t>
+      </w:r>
+    </w:p>
+    <w:p>
+      <w:pPr>
+        <w:pStyle w:val="BodyText"/>
+      </w:pPr>
+      <w:r>
+        <w:t>GenDate properties are represented as follows:</w:t>
+      </w:r>
+    </w:p>
+    <w:p>
+      <w:pPr>
+        <w:pStyle w:val="Example"/>
+      </w:pPr>
+      <w:r>
+        <w:t>&lt;DateOfEvent val="202404020" /&gt;</w:t>
+      </w:r>
+    </w:p>
+    <w:p>
+      <w:pPr>
+        <w:pStyle w:val="BodyText"/>
+      </w:pPr>
+      <w:r>
+        <w:t>This is the DateOfEvent property on Rn</w:t>
+      </w:r>
+      <w:r>
+        <w:t>GenericRec</w:t>
+      </w:r>
+      <w:r>
+        <w:t xml:space="preserve"> representing Before April 2, 2024</w:t>
+      </w:r>
+      <w:r>
+        <w:t>. The generic date is stored as a decimal number in the “val” attribute.</w:t>
+      </w:r>
+      <w:r>
+        <w:t xml:space="preserve"> In Notebook, GenDate is available on Date of Event and uses a dialog to specify the parts of the date. GenDate is also available on CmPerson</w:t>
+      </w:r>
+      <w:r>
+        <w:t xml:space="preserve"> for DateOfBirth and DateOfDeath</w:t>
+      </w:r>
+      <w:r>
+        <w:t>, but it is not implemented in the current FLEx UI.</w:t>
       </w:r>
     </w:p>
     <w:p>
       <w:pPr>
         <w:pStyle w:val="Heading3"/>
       </w:pPr>
-      <w:bookmarkStart w:id="20" w:name="_Ref163130885"/>
-      <w:bookmarkStart w:id="21" w:name="_Toc169516479"/>
-      <w:r>
-        <w:t>GenDate</w:t>
-      </w:r>
-      <w:bookmarkEnd w:id="20"/>
-      <w:bookmarkEnd w:id="21"/>
-    </w:p>
-    <w:p>
-      <w:pPr>
-        <w:pStyle w:val="BodyText"/>
-      </w:pPr>
-      <w:r>
-        <w:t>GenDate provides a way to store an approximate date without a time (e.g., before March 1200 AD). They are stored as an int (4 bytes). This is a decimal representation of a generic date without a time. It's up to the software to make sure the int is a valid date. The range is 21474 BC through 21474 AD. The format is:</w:t>
-      </w:r>
-    </w:p>
-    <w:p>
-      <w:pPr>
-        <w:pStyle w:val="Example"/>
-      </w:pPr>
-      <w:r>
-        <w:t>[-]YYYYMMDDP</w:t>
-      </w:r>
-      <w:r>
-        <w:br/>
-        <w:t>YYYY is the 1-5 digit year (negative is BC) 0000 is unknown.</w:t>
-      </w:r>
-      <w:r>
-        <w:br/>
-        <w:t>MM is the 2 digit month (for BC months it is 13 - M) 00 is unknown</w:t>
-      </w:r>
-      <w:r>
-        <w:br/>
-        <w:t>DD is the 2 digit day (for BC days it is 32 - D) 00 is unknown</w:t>
-      </w:r>
-      <w:r>
-        <w:br/>
-        <w:t>P is one of the following:</w:t>
-      </w:r>
-      <w:r>
-        <w:br/>
-        <w:t xml:space="preserve">  0 = Before (If GenDate = 0, it means nothing is entered)</w:t>
-      </w:r>
-      <w:r>
-        <w:br/>
-        <w:t xml:space="preserve">  1 = Exact</w:t>
-      </w:r>
-      <w:r>
-        <w:br/>
-        <w:t xml:space="preserve">  2 = Approximate</w:t>
-      </w:r>
-      <w:r>
-        <w:br/>
-        <w:t xml:space="preserve">  3 = After</w:t>
-      </w:r>
-    </w:p>
-    <w:p>
-      <w:pPr>
-        <w:pStyle w:val="BodyText"/>
-      </w:pPr>
-      <w:r>
-        <w:t>GenDate properties are represented as follows:</w:t>
-      </w:r>
-    </w:p>
-    <w:p>
-      <w:pPr>
-        <w:pStyle w:val="Example"/>
-      </w:pPr>
-      <w:r>
-        <w:t>&lt;DateOfEvent val="202404020" /&gt;</w:t>
-      </w:r>
-    </w:p>
-    <w:p>
-      <w:pPr>
-        <w:pStyle w:val="BodyText"/>
-      </w:pPr>
-      <w:r>
-        <w:t>This is the DateOfEvent property on Rn</w:t>
-      </w:r>
-      <w:r>
-        <w:t>GenericRec</w:t>
-      </w:r>
-      <w:r>
-        <w:t xml:space="preserve"> representing Before April 2, 2024</w:t>
-      </w:r>
-      <w:r>
-        <w:t>. The generic date is stored as a decimal number in the “val” attribute.</w:t>
-      </w:r>
-      <w:r>
-        <w:t xml:space="preserve"> In Notebook, GenDate is available on Date of Event and uses a dialog to specify the parts of the date. GenDate is also available on CmPerson</w:t>
-      </w:r>
-      <w:r>
-        <w:t xml:space="preserve"> for DateOfBirth and DateOfDeath</w:t>
-      </w:r>
-      <w:r>
-        <w:t>, but it is not implemented in the current FLEx UI.</w:t>
-      </w:r>
-    </w:p>
-    <w:p>
-      <w:pPr>
-        <w:pStyle w:val="Heading3"/>
-      </w:pPr>
-      <w:bookmarkStart w:id="22" w:name="_Toc169516480"/>
+      <w:bookmarkStart w:id="21" w:name="_Toc169609299"/>
       <w:r>
         <w:lastRenderedPageBreak/>
         <w:t>Guid</w:t>
       </w:r>
+      <w:bookmarkEnd w:id="21"/>
+    </w:p>
+    <w:p>
+      <w:pPr>
+        <w:pStyle w:val="BodyText"/>
+      </w:pPr>
+      <w:r>
+        <w:t>GUID (Globally Unique Identifier) properties are represented as follows:</w:t>
+      </w:r>
+    </w:p>
+    <w:p>
+      <w:pPr>
+        <w:pStyle w:val="Example"/>
+      </w:pPr>
+      <w:r>
+        <w:t>&lt;ListVersion val="b41ff27f-5caf-4eac-92de-0f92acb0caa3"/&gt;</w:t>
+      </w:r>
+    </w:p>
+    <w:p>
+      <w:pPr>
+        <w:pStyle w:val="BodyText"/>
+      </w:pPr>
+      <w:r>
+        <w:t xml:space="preserve">This is the ListVersion property on CmPossibilityList. The GUID value is stored in the “val” attribute in this string format using </w:t>
+      </w:r>
+      <w:r>
+        <w:t>this</w:t>
+      </w:r>
+      <w:r>
+        <w:t xml:space="preserve"> hex format.</w:t>
+      </w:r>
+    </w:p>
+    <w:p>
+      <w:pPr>
+        <w:pStyle w:val="BodyText"/>
+      </w:pPr>
+      <w:r>
+        <w:t xml:space="preserve">Internal </w:t>
+      </w:r>
+      <w:r>
+        <w:t>FLEx code often refers to an object using an hvo (handle to a viewable object). This is a single integer that is assigned to each object when it is loaded. While in memory, it is a reliable and quick way to find and reference objects. However, the next time the project is loaded, especially if objects were added or deleted, it can affect some or all of the hvos the next time it is loaded. In debugging it’s often challenging to find a guid for an object when all you have is the hvo, and fwdata only has guids.</w:t>
+      </w:r>
+    </w:p>
+    <w:p>
+      <w:pPr>
+        <w:pStyle w:val="Heading3"/>
+      </w:pPr>
+      <w:bookmarkStart w:id="22" w:name="_Toc169609300"/>
+      <w:r>
+        <w:t>Integer</w:t>
+      </w:r>
       <w:bookmarkEnd w:id="22"/>
     </w:p>
     <w:p>
@@ -8925,7 +8968,13 @@
         <w:pStyle w:val="BodyText"/>
       </w:pPr>
       <w:r>
-        <w:t>GUID (Globally Unique Identifier) properties are represented as follows:</w:t>
+        <w:t xml:space="preserve">Integer properties </w:t>
+      </w:r>
+      <w:r>
+        <w:t xml:space="preserve">hold positive or negative 64-bit integers and </w:t>
+      </w:r>
+      <w:r>
+        <w:t>are represented as follows:</w:t>
       </w:r>
     </w:p>
     <w:p>
@@ -8933,95 +8982,38 @@
         <w:pStyle w:val="Example"/>
       </w:pPr>
       <w:r>
-        <w:t>&lt;ListVersion val="b41ff27f-5caf-4eac-92de-0f92acb0caa3"/&gt;</w:t>
-      </w:r>
-    </w:p>
-    <w:p>
-      <w:pPr>
-        <w:pStyle w:val="BodyText"/>
-      </w:pPr>
-      <w:r>
-        <w:t xml:space="preserve">This is the ListVersion property on CmPossibilityList. The GUID value is stored in the “val” attribute in this string format using </w:t>
-      </w:r>
-      <w:r>
-        <w:t>this</w:t>
-      </w:r>
-      <w:r>
-        <w:t xml:space="preserve"> hex format.</w:t>
-      </w:r>
-    </w:p>
-    <w:p>
-      <w:pPr>
-        <w:pStyle w:val="BodyText"/>
-      </w:pPr>
-      <w:r>
-        <w:t xml:space="preserve">Internal </w:t>
-      </w:r>
-      <w:r>
-        <w:t>FLEx code often refers to an object using an hvo (handle to a viewable object). This is a single integer that is assigned to each object when it is loaded. While in memory, it is a reliable and quick way to find and reference objects. However, the next time the project is loaded, especially if objects were added or deleted, it can affect some or all of the hvos the next time it is loaded. In debugging it’s often challenging to find a guid for an object when all you have is the hvo, and fwdata only has guids.</w:t>
+        <w:t>&lt;HomographNumber val="1</w:t>
+      </w:r>
+      <w:r>
+        <w:t>2</w:t>
+      </w:r>
+      <w:r>
+        <w:t>"/&gt;</w:t>
+      </w:r>
+    </w:p>
+    <w:p>
+      <w:pPr>
+        <w:pStyle w:val="BodyText"/>
+      </w:pPr>
+      <w:r>
+        <w:t xml:space="preserve">This is the HomographNumber property on LexEntry. The value of the integer is stored as a decimal “val” attribute. The default value for missing properties is </w:t>
+      </w:r>
+      <w:r>
+        <w:t>0</w:t>
+      </w:r>
+      <w:r>
+        <w:t>.</w:t>
       </w:r>
     </w:p>
     <w:p>
       <w:pPr>
         <w:pStyle w:val="Heading3"/>
       </w:pPr>
-      <w:bookmarkStart w:id="23" w:name="_Toc169516481"/>
-      <w:r>
-        <w:t>Integer</w:t>
+      <w:bookmarkStart w:id="23" w:name="_Toc169609301"/>
+      <w:r>
+        <w:t>TextPropBinary</w:t>
       </w:r>
       <w:bookmarkEnd w:id="23"/>
-    </w:p>
-    <w:p>
-      <w:pPr>
-        <w:pStyle w:val="BodyText"/>
-      </w:pPr>
-      <w:r>
-        <w:t xml:space="preserve">Integer properties </w:t>
-      </w:r>
-      <w:r>
-        <w:t xml:space="preserve">hold positive or negative 64-bit integers and </w:t>
-      </w:r>
-      <w:r>
-        <w:t>are represented as follows:</w:t>
-      </w:r>
-    </w:p>
-    <w:p>
-      <w:pPr>
-        <w:pStyle w:val="Example"/>
-      </w:pPr>
-      <w:r>
-        <w:t>&lt;HomographNumber val="1</w:t>
-      </w:r>
-      <w:r>
-        <w:t>2</w:t>
-      </w:r>
-      <w:r>
-        <w:t>"/&gt;</w:t>
-      </w:r>
-    </w:p>
-    <w:p>
-      <w:pPr>
-        <w:pStyle w:val="BodyText"/>
-      </w:pPr>
-      <w:r>
-        <w:t xml:space="preserve">This is the HomographNumber property on LexEntry. The value of the integer is stored as a decimal “val” attribute. The default value for missing properties is </w:t>
-      </w:r>
-      <w:r>
-        <w:t>0</w:t>
-      </w:r>
-      <w:r>
-        <w:t>.</w:t>
-      </w:r>
-    </w:p>
-    <w:p>
-      <w:pPr>
-        <w:pStyle w:val="Heading3"/>
-      </w:pPr>
-      <w:bookmarkStart w:id="24" w:name="_Toc169516482"/>
-      <w:r>
-        <w:t>TextPropBinary</w:t>
-      </w:r>
-      <w:bookmarkEnd w:id="24"/>
     </w:p>
     <w:p>
       <w:pPr>
@@ -9650,84 +9642,84 @@
       <w:pPr>
         <w:pStyle w:val="Heading3"/>
       </w:pPr>
-      <w:bookmarkStart w:id="25" w:name="_Toc169516483"/>
+      <w:bookmarkStart w:id="24" w:name="_Toc169609302"/>
       <w:r>
         <w:lastRenderedPageBreak/>
         <w:t>Time</w:t>
       </w:r>
+      <w:bookmarkEnd w:id="24"/>
+    </w:p>
+    <w:p>
+      <w:pPr>
+        <w:pStyle w:val="BodyText"/>
+      </w:pPr>
+      <w:r>
+        <w:t>Time properties</w:t>
+      </w:r>
+      <w:r>
+        <w:t xml:space="preserve"> store a date and time and</w:t>
+      </w:r>
+      <w:r>
+        <w:t xml:space="preserve"> are represented as follows:</w:t>
+      </w:r>
+    </w:p>
+    <w:p>
+      <w:pPr>
+        <w:pStyle w:val="Example"/>
+      </w:pPr>
+      <w:r>
+        <w:t>&lt;DateModifi</w:t>
+      </w:r>
+      <w:r>
+        <w:t>ed val="2009-9-23 20:53:23.390"</w:t>
+      </w:r>
+      <w:r>
+        <w:t>/&gt;</w:t>
+      </w:r>
+    </w:p>
+    <w:p>
+      <w:pPr>
+        <w:pStyle w:val="BodyText"/>
+      </w:pPr>
+      <w:r>
+        <w:t>This is the DateModified property on CmMajorObject. The time is stored in the “val” attribute in the format YYYY-MM-DD HH:</w:t>
+      </w:r>
+      <w:proofErr w:type="gramStart"/>
+      <w:r>
+        <w:t>MM:SS.TTT</w:t>
+      </w:r>
+      <w:proofErr w:type="gramEnd"/>
+      <w:r>
+        <w:t xml:space="preserve"> </w:t>
+      </w:r>
+      <w:r>
+        <w:t>(TTT is thousandths of a second)</w:t>
+      </w:r>
+      <w:r>
+        <w:t>.</w:t>
+      </w:r>
+      <w:r>
+        <w:t xml:space="preserve"> This format should be used regardless of the locale of the computer.</w:t>
+      </w:r>
+      <w:r>
+        <w:t xml:space="preserve"> </w:t>
+      </w:r>
+      <w:r>
+        <w:t>If the format is incorrect, usually Tools &gt; Utilities &gt; Write Everything will fix them.</w:t>
+      </w:r>
+    </w:p>
+    <w:p>
+      <w:pPr>
+        <w:pStyle w:val="Heading2"/>
+      </w:pPr>
+      <w:bookmarkStart w:id="25" w:name="_Toc169609303"/>
+      <w:r>
+        <w:t>Linking</w:t>
+      </w:r>
+      <w:r>
+        <w:t xml:space="preserve"> properties</w:t>
+      </w:r>
       <w:bookmarkEnd w:id="25"/>
-    </w:p>
-    <w:p>
-      <w:pPr>
-        <w:pStyle w:val="BodyText"/>
-      </w:pPr>
-      <w:r>
-        <w:t>Time properties</w:t>
-      </w:r>
-      <w:r>
-        <w:t xml:space="preserve"> store a date and time and</w:t>
-      </w:r>
-      <w:r>
-        <w:t xml:space="preserve"> are represented as follows:</w:t>
-      </w:r>
-    </w:p>
-    <w:p>
-      <w:pPr>
-        <w:pStyle w:val="Example"/>
-      </w:pPr>
-      <w:r>
-        <w:t>&lt;DateModifi</w:t>
-      </w:r>
-      <w:r>
-        <w:t>ed val="2009-9-23 20:53:23.390"</w:t>
-      </w:r>
-      <w:r>
-        <w:t>/&gt;</w:t>
-      </w:r>
-    </w:p>
-    <w:p>
-      <w:pPr>
-        <w:pStyle w:val="BodyText"/>
-      </w:pPr>
-      <w:r>
-        <w:t>This is the DateModified property on CmMajorObject. The time is stored in the “val” attribute in the format YYYY-MM-DD HH:</w:t>
-      </w:r>
-      <w:proofErr w:type="gramStart"/>
-      <w:r>
-        <w:t>MM:SS.TTT</w:t>
-      </w:r>
-      <w:proofErr w:type="gramEnd"/>
-      <w:r>
-        <w:t xml:space="preserve"> </w:t>
-      </w:r>
-      <w:r>
-        <w:t>(TTT is thousandths of a second)</w:t>
-      </w:r>
-      <w:r>
-        <w:t>.</w:t>
-      </w:r>
-      <w:r>
-        <w:t xml:space="preserve"> This format should be used regardless of the locale of the computer.</w:t>
-      </w:r>
-      <w:r>
-        <w:t xml:space="preserve"> </w:t>
-      </w:r>
-      <w:r>
-        <w:t>If the format is incorrect, usually Tools &gt; Utilities &gt; Write Everything will fix them.</w:t>
-      </w:r>
-    </w:p>
-    <w:p>
-      <w:pPr>
-        <w:pStyle w:val="Heading2"/>
-      </w:pPr>
-      <w:bookmarkStart w:id="26" w:name="_Toc169516484"/>
-      <w:r>
-        <w:t>Linking</w:t>
-      </w:r>
-      <w:r>
-        <w:t xml:space="preserve"> properties</w:t>
-      </w:r>
-      <w:bookmarkEnd w:id="26"/>
     </w:p>
     <w:p>
       <w:pPr>
@@ -9872,11 +9864,11 @@
       <w:pPr>
         <w:pStyle w:val="Heading2"/>
       </w:pPr>
-      <w:bookmarkStart w:id="27" w:name="_Toc169516485"/>
+      <w:bookmarkStart w:id="26" w:name="_Toc169609304"/>
       <w:r>
         <w:t>Owning relationships</w:t>
       </w:r>
-      <w:bookmarkEnd w:id="27"/>
+      <w:bookmarkEnd w:id="26"/>
     </w:p>
     <w:p>
       <w:pPr>
@@ -10398,11 +10390,11 @@
       <w:pPr>
         <w:pStyle w:val="Heading2"/>
       </w:pPr>
-      <w:bookmarkStart w:id="28" w:name="_Toc169516486"/>
+      <w:bookmarkStart w:id="27" w:name="_Toc169609305"/>
       <w:r>
         <w:t>Reference relationships</w:t>
       </w:r>
-      <w:bookmarkEnd w:id="28"/>
+      <w:bookmarkEnd w:id="27"/>
     </w:p>
     <w:p>
       <w:pPr>
@@ -10756,11 +10748,11 @@
       <w:pPr>
         <w:pStyle w:val="Heading2"/>
       </w:pPr>
-      <w:bookmarkStart w:id="29" w:name="_Toc169516487"/>
+      <w:bookmarkStart w:id="28" w:name="_Toc169609306"/>
       <w:r>
         <w:t>Styles</w:t>
       </w:r>
-      <w:bookmarkEnd w:id="29"/>
+      <w:bookmarkEnd w:id="28"/>
     </w:p>
     <w:p>
       <w:pPr>
@@ -10962,11 +10954,11 @@
       <w:pPr>
         <w:pStyle w:val="Heading2"/>
       </w:pPr>
-      <w:bookmarkStart w:id="30" w:name="_Toc169516488"/>
+      <w:bookmarkStart w:id="29" w:name="_Toc169609307"/>
       <w:r>
         <w:t>Possibility lists</w:t>
       </w:r>
-      <w:bookmarkEnd w:id="30"/>
+      <w:bookmarkEnd w:id="29"/>
     </w:p>
     <w:p>
       <w:pPr>
@@ -13205,12 +13197,12 @@
       <w:pPr>
         <w:pStyle w:val="Heading2"/>
       </w:pPr>
-      <w:bookmarkStart w:id="31" w:name="_Toc169516489"/>
+      <w:bookmarkStart w:id="30" w:name="_Toc169609308"/>
       <w:r>
         <w:lastRenderedPageBreak/>
         <w:t>Custom fields</w:t>
       </w:r>
-      <w:bookmarkEnd w:id="31"/>
+      <w:bookmarkEnd w:id="30"/>
     </w:p>
     <w:p>
       <w:pPr>
@@ -13959,11 +13951,11 @@
       <w:pPr>
         <w:pStyle w:val="Heading2"/>
       </w:pPr>
-      <w:bookmarkStart w:id="32" w:name="_Toc169516490"/>
+      <w:bookmarkStart w:id="31" w:name="_Toc169609309"/>
       <w:r>
         <w:t>Send/Receive Data</w:t>
       </w:r>
-      <w:bookmarkEnd w:id="32"/>
+      <w:bookmarkEnd w:id="31"/>
     </w:p>
     <w:p>
       <w:pPr>
@@ -15158,152 +15150,152 @@
       <w:pPr>
         <w:pStyle w:val="Heading1"/>
       </w:pPr>
-      <w:bookmarkStart w:id="33" w:name="_Toc169516491"/>
+      <w:bookmarkStart w:id="32" w:name="_Toc169609310"/>
       <w:r>
         <w:t>Conceptual model resources</w:t>
       </w:r>
+      <w:bookmarkEnd w:id="32"/>
+    </w:p>
+    <w:p>
+      <w:pPr>
+        <w:pStyle w:val="BodyText"/>
+      </w:pPr>
+      <w:r>
+        <w:t xml:space="preserve">There are various tools and resources that can help with understanding the FLEx model and data. </w:t>
+      </w:r>
+      <w:r>
+        <w:t xml:space="preserve">One way to see how something is modeled in FLEx is to search the fwdata file to see what is in the file for a particular object. You could type some unique string in the area you are interested in, and then search for that in fwdata. For an entry, you can Ctrl+right-click the entry in the dictionary or dictionary preview, and choose Inspect Entry. This opens a </w:t>
+      </w:r>
+      <w:r>
+        <w:t>window</w:t>
+      </w:r>
+      <w:r>
+        <w:t xml:space="preserve"> with the entry guid at the top, and the xhtml data at the bottom.</w:t>
+      </w:r>
+    </w:p>
+    <w:p>
+      <w:pPr>
+        <w:pStyle w:val="BodyText"/>
+      </w:pPr>
+      <w:r>
+        <w:t>In FLEx, Tools &gt; Utilities &gt; “Find and fix errors in a FieldWorks Data (XML)” will remove an</w:t>
+      </w:r>
+      <w:r>
+        <w:t>y</w:t>
+      </w:r>
+      <w:r>
+        <w:t xml:space="preserve"> links to non-existent objects. It will also delete </w:t>
+      </w:r>
+      <w:r>
+        <w:t>o</w:t>
+      </w:r>
+      <w:r>
+        <w:t>bjects that are missing owners. This can correct occasional problems that occur within the program, but is also useful for manual editing the fwdata file. If you delete a LexEntry rt object and then Run this utility, it will remove all of the ownership link</w:t>
+      </w:r>
+      <w:r>
+        <w:t>s</w:t>
+      </w:r>
+      <w:r>
+        <w:t xml:space="preserve">, delete all </w:t>
+      </w:r>
+      <w:r>
+        <w:t>objects</w:t>
+      </w:r>
+      <w:r>
+        <w:t xml:space="preserve"> that were owned by the entry, and remove all references to any of the deleted objects. </w:t>
+      </w:r>
+      <w:r>
+        <w:t xml:space="preserve">To run the </w:t>
+      </w:r>
+      <w:r>
+        <w:t xml:space="preserve">Find and Fix </w:t>
+      </w:r>
+      <w:r>
+        <w:t>Utilit</w:t>
+      </w:r>
+      <w:r>
+        <w:t>y</w:t>
+      </w:r>
+      <w:r>
+        <w:t>, you need to close the target project, then open another project and run the utilities from that project specifying the target file for the utility.</w:t>
+      </w:r>
+    </w:p>
+    <w:p>
+      <w:pPr>
+        <w:pStyle w:val="BodyText"/>
+      </w:pPr>
+      <w:r>
+        <w:t>T</w:t>
+      </w:r>
+      <w:r>
+        <w:t xml:space="preserve">he Write Everything utility will rewrite </w:t>
+      </w:r>
+      <w:r>
+        <w:t xml:space="preserve">the current project </w:t>
+      </w:r>
+      <w:r>
+        <w:t xml:space="preserve">fwdata in the standard way which will clean up manual changes that may be missing some null properties, </w:t>
+      </w:r>
+      <w:r>
+        <w:t>improperly forma</w:t>
+      </w:r>
+      <w:r>
+        <w:t>t</w:t>
+      </w:r>
+      <w:r>
+        <w:t xml:space="preserve">ted dates, </w:t>
+      </w:r>
+      <w:r>
+        <w:t>etc.</w:t>
+      </w:r>
+    </w:p>
+    <w:p>
+      <w:pPr>
+        <w:pStyle w:val="BodyText"/>
+      </w:pPr>
+      <w:r>
+        <w:t xml:space="preserve">ZEdit.exe is a simple editor that is installed with FieldWorks and is available </w:t>
+      </w:r>
+      <w:r>
+        <w:t xml:space="preserve">by typing Zedit into Windows Start or find it </w:t>
+      </w:r>
+      <w:r>
+        <w:t xml:space="preserve">in c:\Program Files\SIL\FieldWorks 9. </w:t>
+      </w:r>
+      <w:proofErr w:type="gramStart"/>
+      <w:r>
+        <w:t>It</w:t>
+      </w:r>
+      <w:proofErr w:type="gramEnd"/>
+      <w:r>
+        <w:t xml:space="preserve"> </w:t>
+      </w:r>
+      <w:r>
+        <w:t>memory-maps the data when a file is opened, so it can open large fwdata files very quickly and can be used to make changes. Just be sure to close the fwdata file before trying to do anything in FLEx that tries to update fwdata, or FLEx will be blocked. Notepad++ takes a lot longer to open a file, but it can remain open while FLEx is being used. One of its advantages is supporting regex for search and replace. In any text editor you can find the desired class by searching for</w:t>
+      </w:r>
+      <w:r>
+        <w:br/>
+        <w:t xml:space="preserve">   </w:t>
+      </w:r>
+      <w:r>
+        <w:t>" guid="</w:t>
+      </w:r>
+      <w:r>
+        <w:t xml:space="preserve"> followed by the guid.</w:t>
+      </w:r>
+    </w:p>
+    <w:p>
+      <w:pPr>
+        <w:pStyle w:val="Heading2"/>
+      </w:pPr>
+      <w:bookmarkStart w:id="33" w:name="_Toc169609311"/>
+      <w:r>
+        <w:t>M</w:t>
+      </w:r>
+      <w:r>
+        <w:t>odel diagram chm</w:t>
+      </w:r>
       <w:bookmarkEnd w:id="33"/>
-    </w:p>
-    <w:p>
-      <w:pPr>
-        <w:pStyle w:val="BodyText"/>
-      </w:pPr>
-      <w:r>
-        <w:t xml:space="preserve">There are various tools and resources that can help with understanding the FLEx model and data. </w:t>
-      </w:r>
-      <w:r>
-        <w:t xml:space="preserve">One way to see how something is modeled in FLEx is to search the fwdata file to see what is in the file for a particular object. You could type some unique string in the area you are interested in, and then search for that in fwdata. For an entry, you can Ctrl+right-click the entry in the dictionary or dictionary preview, and choose Inspect Entry. This opens a </w:t>
-      </w:r>
-      <w:r>
-        <w:t>window</w:t>
-      </w:r>
-      <w:r>
-        <w:t xml:space="preserve"> with the entry guid at the top, and the xhtml data at the bottom.</w:t>
-      </w:r>
-    </w:p>
-    <w:p>
-      <w:pPr>
-        <w:pStyle w:val="BodyText"/>
-      </w:pPr>
-      <w:r>
-        <w:t>In FLEx, Tools &gt; Utilities &gt; “Find and fix errors in a FieldWorks Data (XML)” will remove an</w:t>
-      </w:r>
-      <w:r>
-        <w:t>y</w:t>
-      </w:r>
-      <w:r>
-        <w:t xml:space="preserve"> links to non-existent objects. It will also delete </w:t>
-      </w:r>
-      <w:r>
-        <w:t>o</w:t>
-      </w:r>
-      <w:r>
-        <w:t>bjects that are missing owners. This can correct occasional problems that occur within the program, but is also useful for manual editing the fwdata file. If you delete a LexEntry rt object and then Run this utility, it will remove all of the ownership link</w:t>
-      </w:r>
-      <w:r>
-        <w:t>s</w:t>
-      </w:r>
-      <w:r>
-        <w:t xml:space="preserve">, delete all </w:t>
-      </w:r>
-      <w:r>
-        <w:t>objects</w:t>
-      </w:r>
-      <w:r>
-        <w:t xml:space="preserve"> that were owned by the entry, and remove all references to any of the deleted objects. </w:t>
-      </w:r>
-      <w:r>
-        <w:t xml:space="preserve">To run the </w:t>
-      </w:r>
-      <w:r>
-        <w:t xml:space="preserve">Find and Fix </w:t>
-      </w:r>
-      <w:r>
-        <w:t>Utilit</w:t>
-      </w:r>
-      <w:r>
-        <w:t>y</w:t>
-      </w:r>
-      <w:r>
-        <w:t>, you need to close the target project, then open another project and run the utilities from that project specifying the target file for the utility.</w:t>
-      </w:r>
-    </w:p>
-    <w:p>
-      <w:pPr>
-        <w:pStyle w:val="BodyText"/>
-      </w:pPr>
-      <w:r>
-        <w:t>T</w:t>
-      </w:r>
-      <w:r>
-        <w:t xml:space="preserve">he Write Everything utility will rewrite </w:t>
-      </w:r>
-      <w:r>
-        <w:t xml:space="preserve">the current project </w:t>
-      </w:r>
-      <w:r>
-        <w:t xml:space="preserve">fwdata in the standard way which will clean up manual changes that may be missing some null properties, </w:t>
-      </w:r>
-      <w:r>
-        <w:t>improperly forma</w:t>
-      </w:r>
-      <w:r>
-        <w:t>t</w:t>
-      </w:r>
-      <w:r>
-        <w:t xml:space="preserve">ted dates, </w:t>
-      </w:r>
-      <w:r>
-        <w:t>etc.</w:t>
-      </w:r>
-    </w:p>
-    <w:p>
-      <w:pPr>
-        <w:pStyle w:val="BodyText"/>
-      </w:pPr>
-      <w:r>
-        <w:t xml:space="preserve">ZEdit.exe is a simple editor that is installed with FieldWorks and is available </w:t>
-      </w:r>
-      <w:r>
-        <w:t xml:space="preserve">by typing Zedit into Windows Start or find it </w:t>
-      </w:r>
-      <w:r>
-        <w:t xml:space="preserve">in c:\Program Files\SIL\FieldWorks 9. </w:t>
-      </w:r>
-      <w:proofErr w:type="gramStart"/>
-      <w:r>
-        <w:t>It</w:t>
-      </w:r>
-      <w:proofErr w:type="gramEnd"/>
-      <w:r>
-        <w:t xml:space="preserve"> </w:t>
-      </w:r>
-      <w:r>
-        <w:t>memory-maps the data when a file is opened, so it can open large fwdata files very quickly and can be used to make changes. Just be sure to close the fwdata file before trying to do anything in FLEx that tries to update fwdata, or FLEx will be blocked. Notepad++ takes a lot longer to open a file, but it can remain open while FLEx is being used. One of its advantages is supporting regex for search and replace. In any text editor you can find the desired class by searching for</w:t>
-      </w:r>
-      <w:r>
-        <w:br/>
-        <w:t xml:space="preserve">   </w:t>
-      </w:r>
-      <w:r>
-        <w:t>" guid="</w:t>
-      </w:r>
-      <w:r>
-        <w:t xml:space="preserve"> followed by the guid.</w:t>
-      </w:r>
-    </w:p>
-    <w:p>
-      <w:pPr>
-        <w:pStyle w:val="Heading2"/>
-      </w:pPr>
-      <w:bookmarkStart w:id="34" w:name="_Toc169516492"/>
-      <w:r>
-        <w:t>M</w:t>
-      </w:r>
-      <w:r>
-        <w:t>odel diagram chm</w:t>
-      </w:r>
-      <w:bookmarkEnd w:id="34"/>
     </w:p>
     <w:p>
       <w:pPr>
@@ -15650,14 +15642,14 @@
       <w:pPr>
         <w:pStyle w:val="Heading2"/>
       </w:pPr>
-      <w:bookmarkStart w:id="35" w:name="_Toc169516493"/>
+      <w:bookmarkStart w:id="34" w:name="_Toc169609312"/>
       <w:r>
         <w:t>M</w:t>
       </w:r>
       <w:r>
         <w:t>odel class/property spreadsheet</w:t>
       </w:r>
-      <w:bookmarkEnd w:id="35"/>
+      <w:bookmarkEnd w:id="34"/>
     </w:p>
     <w:p>
       <w:pPr>
@@ -16110,69 +16102,69 @@
       <w:pPr>
         <w:pStyle w:val="Heading2"/>
       </w:pPr>
-      <w:bookmarkStart w:id="36" w:name="_Ref162957186"/>
-      <w:bookmarkStart w:id="37" w:name="_Toc169516494"/>
+      <w:bookmarkStart w:id="35" w:name="_Ref162957186"/>
+      <w:bookmarkStart w:id="36" w:name="_Toc169609313"/>
       <w:r>
         <w:t>LCMBrowser</w:t>
       </w:r>
+      <w:bookmarkEnd w:id="35"/>
       <w:bookmarkEnd w:id="36"/>
+    </w:p>
+    <w:p>
+      <w:pPr>
+        <w:pStyle w:val="BodyText"/>
+      </w:pPr>
+      <w:r>
+        <w:t xml:space="preserve">LCM is an abbreviation for </w:t>
+      </w:r>
+      <w:r>
+        <w:t>SIL Language &amp; Culture Model</w:t>
+      </w:r>
+      <w:r>
+        <w:t xml:space="preserve">. </w:t>
+      </w:r>
+      <w:proofErr w:type="gramStart"/>
+      <w:r>
+        <w:t xml:space="preserve">LCMBrowser.exe </w:t>
+      </w:r>
+      <w:r>
+        <w:t xml:space="preserve"> </w:t>
+      </w:r>
+      <w:r>
+        <w:t>is</w:t>
+      </w:r>
+      <w:proofErr w:type="gramEnd"/>
+      <w:r>
+        <w:t xml:space="preserve"> a program that comes with FieldWorks and can be started by </w:t>
+      </w:r>
+      <w:r>
+        <w:t>typing into the Windows start menu or finding it in c:\Program Files\SIL\FieldWorks 9. The program has a tab for showing the current conceptual model.</w:t>
+      </w:r>
+      <w:r>
+        <w:t xml:space="preserve"> You can open a fwdata file and it lets you browse the data, and make </w:t>
+      </w:r>
+      <w:r>
+        <w:t>limited</w:t>
+      </w:r>
+      <w:r>
+        <w:t xml:space="preserve"> modifications, such as deleting an object.</w:t>
+      </w:r>
+    </w:p>
+    <w:p>
+      <w:pPr>
+        <w:pStyle w:val="Heading3"/>
+      </w:pPr>
+      <w:bookmarkStart w:id="37" w:name="_Toc169609314"/>
+      <w:r>
+        <w:t xml:space="preserve">LCM </w:t>
+      </w:r>
+      <w:r>
+        <w:t>m</w:t>
+      </w:r>
+      <w:r>
+        <w:t>odel</w:t>
+      </w:r>
       <w:bookmarkEnd w:id="37"/>
-    </w:p>
-    <w:p>
-      <w:pPr>
-        <w:pStyle w:val="BodyText"/>
-      </w:pPr>
-      <w:r>
-        <w:t xml:space="preserve">LCM is an abbreviation for </w:t>
-      </w:r>
-      <w:r>
-        <w:t>SIL Language &amp; Culture Model</w:t>
-      </w:r>
-      <w:r>
-        <w:t xml:space="preserve">. </w:t>
-      </w:r>
-      <w:proofErr w:type="gramStart"/>
-      <w:r>
-        <w:t xml:space="preserve">LCMBrowser.exe </w:t>
-      </w:r>
-      <w:r>
-        <w:t xml:space="preserve"> </w:t>
-      </w:r>
-      <w:r>
-        <w:t>is</w:t>
-      </w:r>
-      <w:proofErr w:type="gramEnd"/>
-      <w:r>
-        <w:t xml:space="preserve"> a program that comes with FieldWorks and can be started by </w:t>
-      </w:r>
-      <w:r>
-        <w:t>typing into the Windows start menu or finding it in c:\Program Files\SIL\FieldWorks 9. The program has a tab for showing the current conceptual model.</w:t>
-      </w:r>
-      <w:r>
-        <w:t xml:space="preserve"> You can open a fwdata file and it lets you browse the data, and make </w:t>
-      </w:r>
-      <w:r>
-        <w:t>limited</w:t>
-      </w:r>
-      <w:r>
-        <w:t xml:space="preserve"> modifications, such as deleting an object.</w:t>
-      </w:r>
-    </w:p>
-    <w:p>
-      <w:pPr>
-        <w:pStyle w:val="Heading3"/>
-      </w:pPr>
-      <w:bookmarkStart w:id="38" w:name="_Toc169516495"/>
-      <w:r>
-        <w:t xml:space="preserve">LCM </w:t>
-      </w:r>
-      <w:r>
-        <w:t>m</w:t>
-      </w:r>
-      <w:r>
-        <w:t>odel</w:t>
-      </w:r>
-      <w:bookmarkEnd w:id="38"/>
     </w:p>
     <w:p>
       <w:pPr>
@@ -16303,11 +16295,11 @@
       <w:pPr>
         <w:pStyle w:val="Heading3"/>
       </w:pPr>
-      <w:bookmarkStart w:id="39" w:name="_Toc169516496"/>
+      <w:bookmarkStart w:id="38" w:name="_Toc169609315"/>
       <w:r>
         <w:t>LCM data</w:t>
       </w:r>
-      <w:bookmarkEnd w:id="39"/>
+      <w:bookmarkEnd w:id="38"/>
     </w:p>
     <w:p>
       <w:pPr>
@@ -16622,11 +16614,11 @@
       <w:pPr>
         <w:pStyle w:val="Heading2"/>
       </w:pPr>
-      <w:bookmarkStart w:id="40" w:name="_Toc169516497"/>
+      <w:bookmarkStart w:id="39" w:name="_Toc169609316"/>
       <w:r>
         <w:t>Fieldworks source code</w:t>
       </w:r>
-      <w:bookmarkEnd w:id="40"/>
+      <w:bookmarkEnd w:id="39"/>
     </w:p>
     <w:p>
       <w:pPr>
@@ -16875,11 +16867,11 @@
       <w:pPr>
         <w:pStyle w:val="Heading2"/>
       </w:pPr>
-      <w:bookmarkStart w:id="41" w:name="_Toc169516498"/>
+      <w:bookmarkStart w:id="40" w:name="_Toc169609317"/>
       <w:r>
         <w:t>dnSpy debugger</w:t>
       </w:r>
-      <w:bookmarkEnd w:id="41"/>
+      <w:bookmarkEnd w:id="40"/>
     </w:p>
     <w:p>
       <w:r>
@@ -17009,11 +17001,11 @@
       <w:pPr>
         <w:pStyle w:val="Heading1"/>
       </w:pPr>
-      <w:bookmarkStart w:id="42" w:name="_Toc169516499"/>
+      <w:bookmarkStart w:id="41" w:name="_Toc169609318"/>
       <w:r>
         <w:t>Lexicon model</w:t>
       </w:r>
-      <w:bookmarkEnd w:id="42"/>
+      <w:bookmarkEnd w:id="41"/>
     </w:p>
     <w:p>
       <w:pPr>
@@ -17404,8 +17396,25 @@
         <w:pStyle w:val="BodyText"/>
       </w:pPr>
       <w:r>
-        <w:t>Entries do not have owners, but can be accessed from LexDb via a virtual Entries method.</w:t>
-      </w:r>
+        <w:t>Entries do not have owners, but can be accessed from LexDb via a virtual Entries method</w:t>
+      </w:r>
+      <w:r>
+        <w:t xml:space="preserve"> or the </w:t>
+      </w:r>
+      <w:r>
+        <w:t>I</w:t>
+      </w:r>
+      <w:r>
+        <w:t xml:space="preserve">LexEntry </w:t>
+      </w:r>
+      <w:proofErr w:type="gramStart"/>
+      <w:r>
+        <w:t>repository.</w:t>
+      </w:r>
+      <w:r>
+        <w:t>.</w:t>
+      </w:r>
+      <w:proofErr w:type="gramEnd"/>
     </w:p>
     <w:p>
       <w:pPr>
@@ -17434,11 +17443,11 @@
       <w:pPr>
         <w:pStyle w:val="Heading2"/>
       </w:pPr>
-      <w:bookmarkStart w:id="43" w:name="_Toc169516500"/>
+      <w:bookmarkStart w:id="42" w:name="_Toc169609319"/>
       <w:r>
         <w:t>Entries</w:t>
       </w:r>
-      <w:bookmarkEnd w:id="43"/>
+      <w:bookmarkEnd w:id="42"/>
     </w:p>
     <w:p>
       <w:pPr>
@@ -17903,6 +17912,7 @@
               <w:pStyle w:val="Tablecells"/>
             </w:pPr>
             <w:r>
+              <w:lastRenderedPageBreak/>
               <w:t>enclitic</w:t>
             </w:r>
           </w:p>
@@ -17931,7 +17941,6 @@
               <w:pStyle w:val="Tablecells"/>
             </w:pPr>
             <w:r>
-              <w:lastRenderedPageBreak/>
               <w:t>particle</w:t>
             </w:r>
           </w:p>
@@ -18116,6 +18125,9 @@
       </w:r>
       <w:r>
         <w:t>.</w:t>
+      </w:r>
+      <w:r>
+        <w:t xml:space="preserve"> These items are removed when senses that use them are deleted.</w:t>
       </w:r>
     </w:p>
     <w:p>
@@ -18199,6 +18211,7 @@
         <w:rPr>
           <w:noProof/>
         </w:rPr>
+        <w:lastRenderedPageBreak/>
         <w:drawing>
           <wp:inline distT="0" distB="0" distL="0" distR="0" wp14:anchorId="744A613D" wp14:editId="648160E9">
             <wp:extent cx="5506218" cy="2791215"/>
@@ -18241,7 +18254,6 @@
         <w:pStyle w:val="BodyText"/>
       </w:pPr>
       <w:r>
-        <w:lastRenderedPageBreak/>
         <w:t xml:space="preserve">The LexEntry </w:t>
       </w:r>
       <w:r>
@@ -18422,7 +18434,11 @@
         <w:t>InflAff</w:t>
       </w:r>
       <w:r>
-        <w:t>Msa that references a PartOfSpeech with Abbreviation: “n”. LexEntry also owns a LexSense with a Gloss: “</w:t>
+        <w:t xml:space="preserve">Msa that references a PartOfSpeech with Abbreviation: “n”. LexEntry also owns a </w:t>
+      </w:r>
+      <w:r>
+        <w:lastRenderedPageBreak/>
+        <w:t>LexSense with a Gloss: “</w:t>
       </w:r>
       <w:r>
         <w:t>PL</w:t>
@@ -18467,11 +18483,11 @@
       <w:pPr>
         <w:pStyle w:val="Heading3"/>
       </w:pPr>
-      <w:bookmarkStart w:id="44" w:name="_Toc169516501"/>
+      <w:bookmarkStart w:id="43" w:name="_Toc169609320"/>
       <w:r>
         <w:t>Headwords</w:t>
       </w:r>
-      <w:bookmarkEnd w:id="44"/>
+      <w:bookmarkEnd w:id="43"/>
     </w:p>
     <w:p>
       <w:pPr>
@@ -18536,7 +18552,6 @@
         <w:pStyle w:val="ListBullet"/>
       </w:pPr>
       <w:r>
-        <w:lastRenderedPageBreak/>
         <w:t>Prefix Unicode on MoMorphType</w:t>
       </w:r>
       <w:r>
@@ -18769,6 +18784,7 @@
         <w:pStyle w:val="BodyText"/>
       </w:pPr>
       <w:r>
+        <w:lastRenderedPageBreak/>
         <w:t xml:space="preserve">When sorting headwords, </w:t>
       </w:r>
       <w:r>
@@ -18786,6 +18802,15 @@
       <w:r>
         <w:t>, followed by the HomographNumber.</w:t>
       </w:r>
+      <w:r>
+        <w:t xml:space="preserve"> </w:t>
+      </w:r>
+      <w:r>
+        <w:t>SecondaryOrder allows you to order affixes by type, and uses a different homograph number</w:t>
+      </w:r>
+      <w:r>
+        <w:t>.</w:t>
+      </w:r>
     </w:p>
     <w:p>
       <w:pPr>
@@ -18814,13 +18839,13 @@
       <w:pPr>
         <w:pStyle w:val="Heading3"/>
       </w:pPr>
-      <w:bookmarkStart w:id="45" w:name="_Ref164431796"/>
-      <w:bookmarkStart w:id="46" w:name="_Toc169516502"/>
+      <w:bookmarkStart w:id="44" w:name="_Ref164431796"/>
+      <w:bookmarkStart w:id="45" w:name="_Toc169609321"/>
       <w:r>
         <w:t>Pronunciations</w:t>
       </w:r>
+      <w:bookmarkEnd w:id="44"/>
       <w:bookmarkEnd w:id="45"/>
-      <w:bookmarkEnd w:id="46"/>
     </w:p>
     <w:p>
       <w:pPr>
@@ -18855,7 +18880,6 @@
         <w:pStyle w:val="ListBullet"/>
       </w:pPr>
       <w:r>
-        <w:lastRenderedPageBreak/>
         <w:t>If you have multiple recordings per entry, and/or want to include other information along with the pronunciation, then you can add one or more LexPronunciation objects.</w:t>
       </w:r>
     </w:p>
@@ -18990,6 +19014,7 @@
         <w:pStyle w:val="ListBullet"/>
       </w:pPr>
       <w:r>
+        <w:lastRenderedPageBreak/>
         <w:t xml:space="preserve">You can add one or more LexPronunciation objects to the Pronunciations field of LexEntry. The LexPronunciation Form </w:t>
       </w:r>
       <w:r>
@@ -19045,11 +19070,11 @@
       <w:pPr>
         <w:pStyle w:val="Heading3"/>
       </w:pPr>
-      <w:bookmarkStart w:id="47" w:name="_Toc169516503"/>
+      <w:bookmarkStart w:id="46" w:name="_Toc169609322"/>
       <w:r>
         <w:t>Etymology</w:t>
       </w:r>
-      <w:bookmarkEnd w:id="47"/>
+      <w:bookmarkEnd w:id="46"/>
     </w:p>
     <w:p>
       <w:pPr>
@@ -19158,7 +19183,6 @@
               <w:pStyle w:val="Tablecells"/>
             </w:pPr>
             <w:r>
-              <w:lastRenderedPageBreak/>
               <w:t>Preceding Annotation</w:t>
             </w:r>
           </w:p>
@@ -19389,11 +19413,11 @@
       <w:pPr>
         <w:pStyle w:val="Heading3"/>
       </w:pPr>
-      <w:bookmarkStart w:id="48" w:name="_Toc169516504"/>
+      <w:bookmarkStart w:id="47" w:name="_Toc169609323"/>
       <w:r>
         <w:t>Allomorphs</w:t>
       </w:r>
-      <w:bookmarkEnd w:id="48"/>
+      <w:bookmarkEnd w:id="47"/>
     </w:p>
     <w:p>
       <w:pPr>
@@ -19499,6 +19523,7 @@
         <w:rPr>
           <w:noProof/>
         </w:rPr>
+        <w:lastRenderedPageBreak/>
         <w:drawing>
           <wp:inline distT="0" distB="0" distL="0" distR="0" wp14:anchorId="4951E1C6" wp14:editId="654F3940">
             <wp:extent cx="5168416" cy="1682496"/>
@@ -19625,7 +19650,6 @@
         <w:rPr>
           <w:noProof/>
         </w:rPr>
-        <w:lastRenderedPageBreak/>
         <w:drawing>
           <wp:inline distT="0" distB="0" distL="0" distR="0" wp14:anchorId="0CF3E271" wp14:editId="36FB66D3">
             <wp:extent cx="5186477" cy="938663"/>
@@ -19791,7 +19815,11 @@
         <w:pStyle w:val="BodyText"/>
       </w:pPr>
       <w:r>
-        <w:t>This is stored in a PhEnvironment class with a name (Preceding voiced), and a StringRepresentation that gives a linguistic representation of the environment (/ _ [VD]) This string is parsed by FLEx to make sure it is valid. In this case, the VD matches the abbreviation in the PhNCSegments object.</w:t>
+        <w:t xml:space="preserve">This is stored in a PhEnvironment class with a name (Preceding voiced), and a StringRepresentation that gives a linguistic representation of the environment (/ _ [VD]) This </w:t>
+      </w:r>
+      <w:r>
+        <w:lastRenderedPageBreak/>
+        <w:t>string is parsed by FLEx to make sure it is valid. In this case, the VD matches the abbreviation in the PhNCSegments object.</w:t>
       </w:r>
     </w:p>
     <w:p>
@@ -19951,7 +19979,6 @@
         <w:rPr>
           <w:noProof/>
         </w:rPr>
-        <w:lastRenderedPageBreak/>
         <w:drawing>
           <wp:inline distT="0" distB="0" distL="0" distR="0" wp14:anchorId="74A39FD9" wp14:editId="076A74DC">
             <wp:extent cx="5353050" cy="4071978"/>
@@ -19993,14 +20020,15 @@
       <w:pPr>
         <w:pStyle w:val="Heading3"/>
       </w:pPr>
-      <w:bookmarkStart w:id="49" w:name="_Toc169516505"/>
-      <w:r>
+      <w:bookmarkStart w:id="48" w:name="_Toc169609324"/>
+      <w:r>
+        <w:lastRenderedPageBreak/>
         <w:t>Grammatical information</w:t>
       </w:r>
       <w:r>
         <w:t>.</w:t>
       </w:r>
-      <w:bookmarkEnd w:id="49"/>
+      <w:bookmarkEnd w:id="48"/>
     </w:p>
     <w:p>
       <w:pPr>
@@ -20044,11 +20072,11 @@
       <w:pPr>
         <w:pStyle w:val="Heading3"/>
       </w:pPr>
-      <w:bookmarkStart w:id="50" w:name="_Toc169516506"/>
+      <w:bookmarkStart w:id="49" w:name="_Toc169609325"/>
       <w:r>
         <w:t>Messages</w:t>
       </w:r>
-      <w:bookmarkEnd w:id="50"/>
+      <w:bookmarkEnd w:id="49"/>
     </w:p>
     <w:p>
       <w:pPr>
@@ -20146,7 +20174,6 @@
         <w:rPr>
           <w:noProof/>
         </w:rPr>
-        <w:lastRenderedPageBreak/>
         <w:drawing>
           <wp:inline distT="0" distB="0" distL="0" distR="0" wp14:anchorId="3DC94CEB" wp14:editId="63F49445">
             <wp:extent cx="2800350" cy="1916817"/>
@@ -20265,6 +20292,7 @@
         <w:rPr>
           <w:noProof/>
         </w:rPr>
+        <w:lastRenderedPageBreak/>
         <w:drawing>
           <wp:inline distT="0" distB="0" distL="0" distR="0" wp14:anchorId="1DF7AE4A" wp14:editId="23BF0393">
             <wp:extent cx="2847975" cy="3064082"/>
@@ -20366,9 +20394,6 @@
       </w:r>
       <w:r>
         <w:br/>
-      </w:r>
-      <w:r>
-        <w:lastRenderedPageBreak/>
         <w:t xml:space="preserve">      guid="8303724a-01b4-4f66-ab4a-0275d9020000"&gt;</w:t>
       </w:r>
       <w:r>
@@ -20447,14 +20472,23 @@
         <w:pStyle w:val="BodyText"/>
       </w:pPr>
       <w:r>
-        <w:t>There is no capability built into FLEx for removing information from this ChorusNotes file. Data can be removed manually in the file, or the file can be deleted at any time to remove all Message.</w:t>
+        <w:lastRenderedPageBreak/>
+        <w:t>There is no capability built into FLEx for removing information from this ChorusNotes file. Data can be removed manually in the file, or the file can be deleted at any time to remove all Message</w:t>
+      </w:r>
+      <w:r>
+        <w:t>s</w:t>
+      </w:r>
+      <w:bookmarkStart w:id="50" w:name="_GoBack"/>
+      <w:bookmarkEnd w:id="50"/>
+      <w:r>
+        <w:t>.</w:t>
       </w:r>
     </w:p>
     <w:p>
       <w:pPr>
         <w:pStyle w:val="Heading2"/>
       </w:pPr>
-      <w:bookmarkStart w:id="51" w:name="_Toc169516507"/>
+      <w:bookmarkStart w:id="51" w:name="_Toc169609326"/>
       <w:r>
         <w:t>Complex forms</w:t>
       </w:r>
@@ -20478,7 +20512,7 @@
       <w:pPr>
         <w:pStyle w:val="Heading3"/>
       </w:pPr>
-      <w:bookmarkStart w:id="52" w:name="_Toc169516508"/>
+      <w:bookmarkStart w:id="52" w:name="_Toc169609327"/>
       <w:r>
         <w:t>Complex forms</w:t>
       </w:r>
@@ -20836,7 +20870,7 @@
       <w:pPr>
         <w:pStyle w:val="Heading3"/>
       </w:pPr>
-      <w:bookmarkStart w:id="53" w:name="_Toc169516509"/>
+      <w:bookmarkStart w:id="53" w:name="_Toc169609328"/>
       <w:r>
         <w:t>Variants</w:t>
       </w:r>
@@ -21127,7 +21161,7 @@
       <w:pPr>
         <w:pStyle w:val="Heading2"/>
       </w:pPr>
-      <w:bookmarkStart w:id="54" w:name="_Toc169516510"/>
+      <w:bookmarkStart w:id="54" w:name="_Toc169609329"/>
       <w:r>
         <w:t>Senses</w:t>
       </w:r>
@@ -21809,7 +21843,7 @@
         <w:pStyle w:val="Heading3"/>
       </w:pPr>
       <w:bookmarkStart w:id="55" w:name="_Ref164277547"/>
-      <w:bookmarkStart w:id="56" w:name="_Toc169516511"/>
+      <w:bookmarkStart w:id="56" w:name="_Toc169609330"/>
       <w:r>
         <w:t>Example sentences</w:t>
       </w:r>
@@ -21979,7 +22013,7 @@
       <w:pPr>
         <w:pStyle w:val="Heading3"/>
       </w:pPr>
-      <w:bookmarkStart w:id="57" w:name="_Toc169516512"/>
+      <w:bookmarkStart w:id="57" w:name="_Toc169609331"/>
       <w:r>
         <w:t>Extended notes</w:t>
       </w:r>
@@ -22216,7 +22250,7 @@
       <w:pPr>
         <w:pStyle w:val="Heading3"/>
       </w:pPr>
-      <w:bookmarkStart w:id="58" w:name="_Toc169516513"/>
+      <w:bookmarkStart w:id="58" w:name="_Toc169609332"/>
       <w:r>
         <w:lastRenderedPageBreak/>
         <w:t xml:space="preserve">Lexical </w:t>
@@ -23310,7 +23344,7 @@
       <w:pPr>
         <w:pStyle w:val="Heading4"/>
       </w:pPr>
-      <w:bookmarkStart w:id="59" w:name="_Toc169516514"/>
+      <w:bookmarkStart w:id="59" w:name="_Toc169609333"/>
       <w:r>
         <w:t>Collection</w:t>
       </w:r>
@@ -23590,7 +23624,7 @@
       <w:pPr>
         <w:pStyle w:val="Heading4"/>
       </w:pPr>
-      <w:bookmarkStart w:id="60" w:name="_Toc169516515"/>
+      <w:bookmarkStart w:id="60" w:name="_Toc169609334"/>
       <w:r>
         <w:t>Pair with different names</w:t>
       </w:r>
@@ -23862,7 +23896,7 @@
       <w:pPr>
         <w:pStyle w:val="Heading4"/>
       </w:pPr>
-      <w:bookmarkStart w:id="61" w:name="_Toc169516516"/>
+      <w:bookmarkStart w:id="61" w:name="_Toc169609335"/>
       <w:r>
         <w:t>Sequence</w:t>
       </w:r>
@@ -24072,7 +24106,7 @@
       <w:pPr>
         <w:pStyle w:val="Heading4"/>
       </w:pPr>
-      <w:bookmarkStart w:id="62" w:name="_Toc169516517"/>
+      <w:bookmarkStart w:id="62" w:name="_Toc169609336"/>
       <w:r>
         <w:t>Tree</w:t>
       </w:r>
@@ -24359,7 +24393,7 @@
       <w:pPr>
         <w:pStyle w:val="Heading4"/>
       </w:pPr>
-      <w:bookmarkStart w:id="63" w:name="_Toc169516518"/>
+      <w:bookmarkStart w:id="63" w:name="_Toc169609337"/>
       <w:r>
         <w:t>Unidirectional</w:t>
       </w:r>
@@ -24459,7 +24493,7 @@
       <w:pPr>
         <w:pStyle w:val="Heading3"/>
       </w:pPr>
-      <w:bookmarkStart w:id="64" w:name="_Toc169516519"/>
+      <w:bookmarkStart w:id="64" w:name="_Toc169609338"/>
       <w:r>
         <w:lastRenderedPageBreak/>
         <w:t>Reversals</w:t>
@@ -24838,7 +24872,7 @@
       <w:pPr>
         <w:pStyle w:val="Heading3"/>
       </w:pPr>
-      <w:bookmarkStart w:id="65" w:name="_Toc169516520"/>
+      <w:bookmarkStart w:id="65" w:name="_Toc169609339"/>
       <w:r>
         <w:lastRenderedPageBreak/>
         <w:t>Pictures</w:t>
@@ -25020,7 +25054,7 @@
       <w:pPr>
         <w:pStyle w:val="Heading3"/>
       </w:pPr>
-      <w:bookmarkStart w:id="66" w:name="_Toc169516521"/>
+      <w:bookmarkStart w:id="66" w:name="_Toc169609340"/>
       <w:r>
         <w:t>Sound files</w:t>
       </w:r>
@@ -25068,7 +25102,7 @@
       <w:pPr>
         <w:pStyle w:val="Heading2"/>
       </w:pPr>
-      <w:bookmarkStart w:id="67" w:name="_Toc169516522"/>
+      <w:bookmarkStart w:id="67" w:name="_Toc169609341"/>
       <w:r>
         <w:t>Virtual ordering</w:t>
       </w:r>
@@ -25258,7 +25292,7 @@
       <w:pPr>
         <w:pStyle w:val="Heading2"/>
       </w:pPr>
-      <w:bookmarkStart w:id="68" w:name="_Toc169516523"/>
+      <w:bookmarkStart w:id="68" w:name="_Toc169609342"/>
       <w:r>
         <w:t>Publications</w:t>
       </w:r>
@@ -25609,7 +25643,7 @@
         <w:pStyle w:val="Heading1"/>
       </w:pPr>
       <w:bookmarkStart w:id="69" w:name="_Ref165555065"/>
-      <w:bookmarkStart w:id="70" w:name="_Toc169516524"/>
+      <w:bookmarkStart w:id="70" w:name="_Toc169609343"/>
       <w:r>
         <w:t>Grammar model</w:t>
       </w:r>
@@ -25769,7 +25803,7 @@
       <w:pPr>
         <w:pStyle w:val="Heading2"/>
       </w:pPr>
-      <w:bookmarkStart w:id="71" w:name="_Toc169516525"/>
+      <w:bookmarkStart w:id="71" w:name="_Toc169609344"/>
       <w:r>
         <w:t>Inflection featuers</w:t>
       </w:r>
@@ -25947,7 +25981,7 @@
       <w:pPr>
         <w:pStyle w:val="Heading2"/>
       </w:pPr>
-      <w:bookmarkStart w:id="72" w:name="_Toc169516526"/>
+      <w:bookmarkStart w:id="72" w:name="_Toc169609345"/>
       <w:r>
         <w:t>Categories</w:t>
       </w:r>
@@ -26090,7 +26124,7 @@
       <w:pPr>
         <w:pStyle w:val="Heading2"/>
       </w:pPr>
-      <w:bookmarkStart w:id="73" w:name="_Toc169516527"/>
+      <w:bookmarkStart w:id="73" w:name="_Toc169609346"/>
       <w:r>
         <w:t>Lexicon</w:t>
       </w:r>
@@ -26641,7 +26675,7 @@
       <w:pPr>
         <w:pStyle w:val="Heading1"/>
       </w:pPr>
-      <w:bookmarkStart w:id="74" w:name="_Toc169516528"/>
+      <w:bookmarkStart w:id="74" w:name="_Toc169609347"/>
       <w:r>
         <w:t xml:space="preserve">Interlinear </w:t>
       </w:r>
@@ -26737,7 +26771,7 @@
       <w:pPr>
         <w:pStyle w:val="Heading2"/>
       </w:pPr>
-      <w:bookmarkStart w:id="75" w:name="_Toc169516529"/>
+      <w:bookmarkStart w:id="75" w:name="_Toc169609348"/>
       <w:r>
         <w:t>Structured Text</w:t>
       </w:r>
@@ -27044,7 +27078,7 @@
       <w:pPr>
         <w:pStyle w:val="Heading2"/>
       </w:pPr>
-      <w:bookmarkStart w:id="76" w:name="_Toc169516530"/>
+      <w:bookmarkStart w:id="76" w:name="_Toc169609349"/>
       <w:r>
         <w:t>Segment</w:t>
       </w:r>
@@ -27503,7 +27537,7 @@
       <w:pPr>
         <w:pStyle w:val="Heading2"/>
       </w:pPr>
-      <w:bookmarkStart w:id="77" w:name="_Toc169516531"/>
+      <w:bookmarkStart w:id="77" w:name="_Toc169609350"/>
       <w:r>
         <w:t>Wordform</w:t>
       </w:r>
@@ -27678,9 +27712,36 @@
     </w:p>
     <w:p>
       <w:pPr>
+        <w:pStyle w:val="BodyText"/>
+      </w:pPr>
+      <w:r>
+        <w:t>Wordforms should be unique. If duplicates somehow occur, you can run Tools &gt; Utilities &gt; Merge Duplicate Wordforms to merge them together. This will copy the analyses from the duplicate ones into a single wordform. After running this, you should run Tools &gt; Utilities &gt; Merge Duplicate Analyses. This will merge any duplicate analyses in the wordforms.</w:t>
+      </w:r>
+    </w:p>
+    <w:p>
+      <w:pPr>
+        <w:pStyle w:val="BodyText"/>
+      </w:pPr>
+      <w:r>
+        <w:t xml:space="preserve">FLEx can interlinearize texts in different vernacular writing systems. There are various issues involved in doing this. See section 13, Interlinearizing with multiple scripts in </w:t>
+      </w:r>
+      <w:hyperlink r:id="rId110" w:history="1">
+        <w:r>
+          <w:rPr>
+            <w:rStyle w:val="Hyperlink"/>
+          </w:rPr>
+          <w:t>https://downloads.languagetechnology.org/fieldworks/Documentation/Flex_tips.pdf</w:t>
+        </w:r>
+      </w:hyperlink>
+      <w:r>
+        <w:t xml:space="preserve"> before attempting to do this.</w:t>
+      </w:r>
+    </w:p>
+    <w:p>
+      <w:pPr>
         <w:pStyle w:val="Heading2"/>
       </w:pPr>
-      <w:bookmarkStart w:id="78" w:name="_Toc169516532"/>
+      <w:bookmarkStart w:id="78" w:name="_Toc169609351"/>
       <w:r>
         <w:t>Analyses</w:t>
       </w:r>
@@ -27745,7 +27806,7 @@
                     <pic:cNvPicPr/>
                   </pic:nvPicPr>
                   <pic:blipFill>
-                    <a:blip r:embed="rId110"/>
+                    <a:blip r:embed="rId111"/>
                     <a:stretch>
                       <a:fillRect/>
                     </a:stretch>
@@ -27794,6 +27855,7 @@
         <w:rPr>
           <w:noProof/>
         </w:rPr>
+        <w:lastRenderedPageBreak/>
         <w:drawing>
           <wp:inline distT="0" distB="0" distL="0" distR="0" wp14:anchorId="476B371B" wp14:editId="772DE0B8">
             <wp:extent cx="3305636" cy="2514951"/>
@@ -27810,7 +27872,7 @@
                     <pic:cNvPicPr/>
                   </pic:nvPicPr>
                   <pic:blipFill>
-                    <a:blip r:embed="rId111"/>
+                    <a:blip r:embed="rId112"/>
                     <a:stretch>
                       <a:fillRect/>
                     </a:stretch>
@@ -27887,7 +27949,7 @@
                     <pic:cNvPicPr/>
                   </pic:nvPicPr>
                   <pic:blipFill>
-                    <a:blip r:embed="rId112"/>
+                    <a:blip r:embed="rId113"/>
                     <a:stretch>
                       <a:fillRect/>
                     </a:stretch>
@@ -28414,7 +28476,7 @@
       <w:pPr>
         <w:pStyle w:val="Heading2"/>
       </w:pPr>
-      <w:bookmarkStart w:id="79" w:name="_Toc169516533"/>
+      <w:bookmarkStart w:id="79" w:name="_Toc169609352"/>
       <w:r>
         <w:t>Approving analyses</w:t>
       </w:r>
@@ -28470,7 +28532,7 @@
                     <pic:cNvPicPr/>
                   </pic:nvPicPr>
                   <pic:blipFill>
-                    <a:blip r:embed="rId113"/>
+                    <a:blip r:embed="rId114"/>
                     <a:stretch>
                       <a:fillRect/>
                     </a:stretch>
@@ -28524,7 +28586,7 @@
                     <pic:cNvPicPr/>
                   </pic:nvPicPr>
                   <pic:blipFill>
-                    <a:blip r:embed="rId114"/>
+                    <a:blip r:embed="rId115"/>
                     <a:stretch>
                       <a:fillRect/>
                     </a:stretch>
@@ -28785,7 +28847,7 @@
                     <pic:cNvPicPr/>
                   </pic:nvPicPr>
                   <pic:blipFill>
-                    <a:blip r:embed="rId115"/>
+                    <a:blip r:embed="rId116"/>
                     <a:stretch>
                       <a:fillRect/>
                     </a:stretch>
@@ -28836,7 +28898,7 @@
       <w:pPr>
         <w:pStyle w:val="Heading2"/>
       </w:pPr>
-      <w:bookmarkStart w:id="80" w:name="_Toc169516534"/>
+      <w:bookmarkStart w:id="80" w:name="_Toc169609353"/>
       <w:r>
         <w:t xml:space="preserve">Text </w:t>
       </w:r>
@@ -28923,7 +28985,7 @@
                     <pic:cNvPicPr/>
                   </pic:nvPicPr>
                   <pic:blipFill>
-                    <a:blip r:embed="rId116"/>
+                    <a:blip r:embed="rId117"/>
                     <a:stretch>
                       <a:fillRect/>
                     </a:stretch>
@@ -28977,7 +29039,7 @@
                     <pic:cNvPicPr/>
                   </pic:nvPicPr>
                   <pic:blipFill>
-                    <a:blip r:embed="rId117"/>
+                    <a:blip r:embed="rId118"/>
                     <a:stretch>
                       <a:fillRect/>
                     </a:stretch>
@@ -29122,7 +29184,7 @@
       <w:pPr>
         <w:pStyle w:val="Heading2"/>
       </w:pPr>
-      <w:bookmarkStart w:id="81" w:name="_Toc169516535"/>
+      <w:bookmarkStart w:id="81" w:name="_Toc169609354"/>
       <w:r>
         <w:t>Discourse</w:t>
       </w:r>
@@ -29191,7 +29253,7 @@
                     <pic:cNvPicPr/>
                   </pic:nvPicPr>
                   <pic:blipFill>
-                    <a:blip r:embed="rId118"/>
+                    <a:blip r:embed="rId119"/>
                     <a:stretch>
                       <a:fillRect/>
                     </a:stretch>
@@ -29244,7 +29306,7 @@
                     <pic:cNvPicPr/>
                   </pic:nvPicPr>
                   <pic:blipFill>
-                    <a:blip r:embed="rId119"/>
+                    <a:blip r:embed="rId120"/>
                     <a:stretch>
                       <a:fillRect/>
                     </a:stretch>
@@ -29684,7 +29746,7 @@
                     <pic:cNvPicPr/>
                   </pic:nvPicPr>
                   <pic:blipFill>
-                    <a:blip r:embed="rId120"/>
+                    <a:blip r:embed="rId121"/>
                     <a:stretch>
                       <a:fillRect/>
                     </a:stretch>
@@ -29785,7 +29847,7 @@
                     <pic:cNvPicPr/>
                   </pic:nvPicPr>
                   <pic:blipFill>
-                    <a:blip r:embed="rId121"/>
+                    <a:blip r:embed="rId122"/>
                     <a:stretch>
                       <a:fillRect/>
                     </a:stretch>
@@ -30017,7 +30079,7 @@
       <w:pPr>
         <w:pStyle w:val="Heading2"/>
       </w:pPr>
-      <w:bookmarkStart w:id="82" w:name="_Toc169516536"/>
+      <w:bookmarkStart w:id="82" w:name="_Toc169609355"/>
       <w:r>
         <w:t>Scripture</w:t>
       </w:r>
@@ -30123,7 +30185,7 @@
                     <pic:cNvPicPr/>
                   </pic:nvPicPr>
                   <pic:blipFill>
-                    <a:blip r:embed="rId122"/>
+                    <a:blip r:embed="rId123"/>
                     <a:stretch>
                       <a:fillRect/>
                     </a:stretch>
@@ -30177,7 +30239,7 @@
                     <pic:cNvPicPr/>
                   </pic:nvPicPr>
                   <pic:blipFill>
-                    <a:blip r:embed="rId123"/>
+                    <a:blip r:embed="rId124"/>
                     <a:stretch>
                       <a:fillRect/>
                     </a:stretch>
@@ -30222,7 +30284,7 @@
                     <pic:cNvPicPr/>
                   </pic:nvPicPr>
                   <pic:blipFill>
-                    <a:blip r:embed="rId124"/>
+                    <a:blip r:embed="rId125"/>
                     <a:stretch>
                       <a:fillRect/>
                     </a:stretch>
@@ -30267,7 +30329,7 @@
                     <pic:cNvPicPr/>
                   </pic:nvPicPr>
                   <pic:blipFill>
-                    <a:blip r:embed="rId125"/>
+                    <a:blip r:embed="rId126"/>
                     <a:stretch>
                       <a:fillRect/>
                     </a:stretch>
@@ -30313,7 +30375,7 @@
                     <pic:cNvPicPr/>
                   </pic:nvPicPr>
                   <pic:blipFill>
-                    <a:blip r:embed="rId126"/>
+                    <a:blip r:embed="rId127"/>
                     <a:stretch>
                       <a:fillRect/>
                     </a:stretch>
@@ -30370,7 +30432,7 @@
                     <pic:cNvPicPr/>
                   </pic:nvPicPr>
                   <pic:blipFill>
-                    <a:blip r:embed="rId127"/>
+                    <a:blip r:embed="rId128"/>
                     <a:stretch>
                       <a:fillRect/>
                     </a:stretch>
@@ -30593,7 +30655,7 @@
                     <pic:cNvPicPr/>
                   </pic:nvPicPr>
                   <pic:blipFill>
-                    <a:blip r:embed="rId128"/>
+                    <a:blip r:embed="rId129"/>
                     <a:stretch>
                       <a:fillRect/>
                     </a:stretch>
@@ -30708,7 +30770,7 @@
                     <pic:cNvPicPr/>
                   </pic:nvPicPr>
                   <pic:blipFill>
-                    <a:blip r:embed="rId129"/>
+                    <a:blip r:embed="rId130"/>
                     <a:stretch>
                       <a:fillRect/>
                     </a:stretch>
@@ -30805,7 +30867,7 @@
                     <pic:cNvPicPr/>
                   </pic:nvPicPr>
                   <pic:blipFill>
-                    <a:blip r:embed="rId130"/>
+                    <a:blip r:embed="rId131"/>
                     <a:stretch>
                       <a:fillRect/>
                     </a:stretch>
@@ -30830,7 +30892,7 @@
       <w:pPr>
         <w:pStyle w:val="Heading1"/>
       </w:pPr>
-      <w:bookmarkStart w:id="83" w:name="_Toc169516537"/>
+      <w:bookmarkStart w:id="83" w:name="_Toc169609356"/>
       <w:r>
         <w:t>N</w:t>
       </w:r>
@@ -30886,7 +30948,7 @@
                     <pic:cNvPicPr/>
                   </pic:nvPicPr>
                   <pic:blipFill>
-                    <a:blip r:embed="rId131"/>
+                    <a:blip r:embed="rId132"/>
                     <a:stretch>
                       <a:fillRect/>
                     </a:stretch>
@@ -30939,7 +31001,7 @@
                     <pic:cNvPicPr/>
                   </pic:nvPicPr>
                   <pic:blipFill>
-                    <a:blip r:embed="rId132"/>
+                    <a:blip r:embed="rId133"/>
                     <a:stretch>
                       <a:fillRect/>
                     </a:stretch>
@@ -30993,7 +31055,7 @@
                     <pic:cNvPicPr/>
                   </pic:nvPicPr>
                   <pic:blipFill>
-                    <a:blip r:embed="rId133"/>
+                    <a:blip r:embed="rId134"/>
                     <a:stretch>
                       <a:fillRect/>
                     </a:stretch>
@@ -31058,11 +31120,11 @@
       </w:r>
     </w:p>
     <w:sectPr>
-      <w:headerReference w:type="even" r:id="rId134"/>
-      <w:headerReference w:type="default" r:id="rId135"/>
-      <w:footerReference w:type="even" r:id="rId136"/>
-      <w:footerReference w:type="default" r:id="rId137"/>
-      <w:footerReference w:type="first" r:id="rId138"/>
+      <w:headerReference w:type="even" r:id="rId135"/>
+      <w:headerReference w:type="default" r:id="rId136"/>
+      <w:footerReference w:type="even" r:id="rId137"/>
+      <w:footerReference w:type="default" r:id="rId138"/>
+      <w:footerReference w:type="first" r:id="rId139"/>
       <w:pgSz w:w="12240" w:h="15840" w:code="1"/>
       <w:pgMar w:top="1440" w:right="1440" w:bottom="1440" w:left="1440" w:header="720" w:footer="720" w:gutter="0"/>
       <w:pgNumType w:start="1"/>
@@ -31123,7 +31185,7 @@
       <w:rPr>
         <w:noProof/>
       </w:rPr>
-      <w:t>6/17/2024</w:t>
+      <w:t>6/20/2024</w:t>
     </w:r>
     <w:r>
       <w:fldChar w:fldCharType="end"/>
@@ -31170,7 +31232,7 @@
         <w:rStyle w:val="PageNumber"/>
         <w:noProof/>
       </w:rPr>
-      <w:t>6/17/2024</w:t>
+      <w:t>6/20/2024</w:t>
     </w:r>
     <w:r>
       <w:rPr>
@@ -34317,7 +34379,6 @@
   <w:style w:type="character" w:default="1" w:styleId="DefaultParagraphFont">
     <w:name w:val="Default Paragraph Font"/>
     <w:uiPriority w:val="1"/>
-    <w:semiHidden/>
     <w:unhideWhenUsed/>
   </w:style>
   <w:style w:type="table" w:default="1" w:styleId="TableNormal">
@@ -35159,7 +35220,7 @@
 </file>
 
 <file path=customXml/itemProps1.xml><?xml version="1.0" encoding="utf-8"?>
-<ds:datastoreItem xmlns:ds="http://schemas.openxmlformats.org/officeDocument/2006/customXml" ds:itemID="{587C7725-9979-4E83-A1BB-BC1B676B26A0}">
+<ds:datastoreItem xmlns:ds="http://schemas.openxmlformats.org/officeDocument/2006/customXml" ds:itemID="{EB9F04AA-FB4B-4ADB-BFB0-4A6AE077C1BA}">
   <ds:schemaRefs>
     <ds:schemaRef ds:uri="http://schemas.openxmlformats.org/officeDocument/2006/bibliography"/>
   </ds:schemaRefs>

</xml_diff>

<commit_message>
Conceptual model updates for June 24
.pptx, .docx, .odg updates.

Change-Id: I39e7bc0ab3e8339c7cc4ab3ad1ae0eeb784af22c
</commit_message>
<xml_diff>
--- a/HelpResourcesSources/TechnicalNotes/FLEx 9.1 Conceptual Model.docx
+++ b/HelpResourcesSources/TechnicalNotes/FLEx 9.1 Conceptual Model.docx
@@ -6,7 +6,7 @@
       <w:pPr>
         <w:pStyle w:val="Title"/>
       </w:pPr>
-      <w:bookmarkStart w:id="0" w:name="_Toc169609285"/>
+      <w:bookmarkStart w:id="0" w:name="_Toc170138108"/>
       <w:r>
         <w:t xml:space="preserve">FLEx </w:t>
       </w:r>
@@ -43,8 +43,16 @@
         <w:rPr>
           <w:szCs w:val="36"/>
         </w:rPr>
-        <w:t>20</w:t>
-      </w:r>
+        <w:t>2</w:t>
+      </w:r>
+      <w:r>
+        <w:rPr>
+          <w:szCs w:val="36"/>
+        </w:rPr>
+        <w:t>4</w:t>
+      </w:r>
+      <w:bookmarkStart w:id="1" w:name="_GoBack"/>
+      <w:bookmarkEnd w:id="1"/>
       <w:r>
         <w:rPr>
           <w:szCs w:val="36"/>
@@ -86,7 +94,7 @@
           <w:lang w:eastAsia="en-US"/>
         </w:rPr>
       </w:pPr>
-      <w:hyperlink w:anchor="_Toc169609285" w:history="1">
+      <w:hyperlink w:anchor="_Toc170138108" w:history="1">
         <w:r>
           <w:rPr>
             <w:rStyle w:val="Hyperlink"/>
@@ -113,7 +121,7 @@
             <w:noProof/>
             <w:webHidden/>
           </w:rPr>
-          <w:instrText xml:space="preserve"> PAGEREF _Toc169609285 \h </w:instrText>
+          <w:instrText xml:space="preserve"> PAGEREF _Toc170138108 \h </w:instrText>
         </w:r>
         <w:r>
           <w:rPr>
@@ -159,7 +167,7 @@
           <w:lang w:eastAsia="en-US"/>
         </w:rPr>
       </w:pPr>
-      <w:hyperlink w:anchor="_Toc169609286" w:history="1">
+      <w:hyperlink w:anchor="_Toc170138109" w:history="1">
         <w:r>
           <w:rPr>
             <w:rStyle w:val="Hyperlink"/>
@@ -203,7 +211,7 @@
             <w:noProof/>
             <w:webHidden/>
           </w:rPr>
-          <w:instrText xml:space="preserve"> PAGEREF _Toc169609286 \h </w:instrText>
+          <w:instrText xml:space="preserve"> PAGEREF _Toc170138109 \h </w:instrText>
         </w:r>
         <w:r>
           <w:rPr>
@@ -249,7 +257,7 @@
           <w:lang w:eastAsia="en-US"/>
         </w:rPr>
       </w:pPr>
-      <w:hyperlink w:anchor="_Toc169609287" w:history="1">
+      <w:hyperlink w:anchor="_Toc170138110" w:history="1">
         <w:r>
           <w:rPr>
             <w:rStyle w:val="Hyperlink"/>
@@ -293,7 +301,7 @@
             <w:noProof/>
             <w:webHidden/>
           </w:rPr>
-          <w:instrText xml:space="preserve"> PAGEREF _Toc169609287 \h </w:instrText>
+          <w:instrText xml:space="preserve"> PAGEREF _Toc170138110 \h </w:instrText>
         </w:r>
         <w:r>
           <w:rPr>
@@ -334,7 +342,7 @@
           <w:szCs w:val="22"/>
         </w:rPr>
       </w:pPr>
-      <w:hyperlink w:anchor="_Toc169609288" w:history="1">
+      <w:hyperlink w:anchor="_Toc170138111" w:history="1">
         <w:r>
           <w:rPr>
             <w:rStyle w:val="Hyperlink"/>
@@ -379,7 +387,7 @@
             <w:noProof/>
             <w:webHidden/>
           </w:rPr>
-          <w:instrText xml:space="preserve"> PAGEREF _Toc169609288 \h </w:instrText>
+          <w:instrText xml:space="preserve"> PAGEREF _Toc170138111 \h </w:instrText>
         </w:r>
         <w:r>
           <w:rPr>
@@ -420,7 +428,7 @@
           <w:szCs w:val="22"/>
         </w:rPr>
       </w:pPr>
-      <w:hyperlink w:anchor="_Toc169609289" w:history="1">
+      <w:hyperlink w:anchor="_Toc170138112" w:history="1">
         <w:r>
           <w:rPr>
             <w:rStyle w:val="Hyperlink"/>
@@ -465,7 +473,7 @@
             <w:noProof/>
             <w:webHidden/>
           </w:rPr>
-          <w:instrText xml:space="preserve"> PAGEREF _Toc169609289 \h </w:instrText>
+          <w:instrText xml:space="preserve"> PAGEREF _Toc170138112 \h </w:instrText>
         </w:r>
         <w:r>
           <w:rPr>
@@ -506,7 +514,7 @@
           <w:szCs w:val="22"/>
         </w:rPr>
       </w:pPr>
-      <w:hyperlink w:anchor="_Toc169609290" w:history="1">
+      <w:hyperlink w:anchor="_Toc170138113" w:history="1">
         <w:r>
           <w:rPr>
             <w:rStyle w:val="Hyperlink"/>
@@ -551,7 +559,7 @@
             <w:noProof/>
             <w:webHidden/>
           </w:rPr>
-          <w:instrText xml:space="preserve"> PAGEREF _Toc169609290 \h </w:instrText>
+          <w:instrText xml:space="preserve"> PAGEREF _Toc170138113 \h </w:instrText>
         </w:r>
         <w:r>
           <w:rPr>
@@ -597,7 +605,7 @@
           <w:lang w:eastAsia="en-US"/>
         </w:rPr>
       </w:pPr>
-      <w:hyperlink w:anchor="_Toc169609291" w:history="1">
+      <w:hyperlink w:anchor="_Toc170138114" w:history="1">
         <w:r>
           <w:rPr>
             <w:rStyle w:val="Hyperlink"/>
@@ -641,7 +649,7 @@
             <w:noProof/>
             <w:webHidden/>
           </w:rPr>
-          <w:instrText xml:space="preserve"> PAGEREF _Toc169609291 \h </w:instrText>
+          <w:instrText xml:space="preserve"> PAGEREF _Toc170138114 \h </w:instrText>
         </w:r>
         <w:r>
           <w:rPr>
@@ -686,7 +694,7 @@
           <w:szCs w:val="22"/>
         </w:rPr>
       </w:pPr>
-      <w:hyperlink w:anchor="_Toc169609292" w:history="1">
+      <w:hyperlink w:anchor="_Toc170138115" w:history="1">
         <w:r>
           <w:rPr>
             <w:rStyle w:val="Hyperlink"/>
@@ -731,7 +739,7 @@
             <w:noProof/>
             <w:webHidden/>
           </w:rPr>
-          <w:instrText xml:space="preserve"> PAGEREF _Toc169609292 \h </w:instrText>
+          <w:instrText xml:space="preserve"> PAGEREF _Toc170138115 \h </w:instrText>
         </w:r>
         <w:r>
           <w:rPr>
@@ -776,7 +784,7 @@
           <w:szCs w:val="22"/>
         </w:rPr>
       </w:pPr>
-      <w:hyperlink w:anchor="_Toc169609293" w:history="1">
+      <w:hyperlink w:anchor="_Toc170138116" w:history="1">
         <w:r>
           <w:rPr>
             <w:rStyle w:val="Hyperlink"/>
@@ -821,7 +829,7 @@
             <w:noProof/>
             <w:webHidden/>
           </w:rPr>
-          <w:instrText xml:space="preserve"> PAGEREF _Toc169609293 \h </w:instrText>
+          <w:instrText xml:space="preserve"> PAGEREF _Toc170138116 \h </w:instrText>
         </w:r>
         <w:r>
           <w:rPr>
@@ -866,7 +874,7 @@
           <w:szCs w:val="22"/>
         </w:rPr>
       </w:pPr>
-      <w:hyperlink w:anchor="_Toc169609294" w:history="1">
+      <w:hyperlink w:anchor="_Toc170138117" w:history="1">
         <w:r>
           <w:rPr>
             <w:rStyle w:val="Hyperlink"/>
@@ -911,7 +919,7 @@
             <w:noProof/>
             <w:webHidden/>
           </w:rPr>
-          <w:instrText xml:space="preserve"> PAGEREF _Toc169609294 \h </w:instrText>
+          <w:instrText xml:space="preserve"> PAGEREF _Toc170138117 \h </w:instrText>
         </w:r>
         <w:r>
           <w:rPr>
@@ -956,7 +964,7 @@
           <w:szCs w:val="22"/>
         </w:rPr>
       </w:pPr>
-      <w:hyperlink w:anchor="_Toc169609295" w:history="1">
+      <w:hyperlink w:anchor="_Toc170138118" w:history="1">
         <w:r>
           <w:rPr>
             <w:rStyle w:val="Hyperlink"/>
@@ -1001,7 +1009,7 @@
             <w:noProof/>
             <w:webHidden/>
           </w:rPr>
-          <w:instrText xml:space="preserve"> PAGEREF _Toc169609295 \h </w:instrText>
+          <w:instrText xml:space="preserve"> PAGEREF _Toc170138118 \h </w:instrText>
         </w:r>
         <w:r>
           <w:rPr>
@@ -1047,7 +1055,7 @@
           <w:lang w:eastAsia="en-US"/>
         </w:rPr>
       </w:pPr>
-      <w:hyperlink w:anchor="_Toc169609296" w:history="1">
+      <w:hyperlink w:anchor="_Toc170138119" w:history="1">
         <w:r>
           <w:rPr>
             <w:rStyle w:val="Hyperlink"/>
@@ -1091,7 +1099,7 @@
             <w:noProof/>
             <w:webHidden/>
           </w:rPr>
-          <w:instrText xml:space="preserve"> PAGEREF _Toc169609296 \h </w:instrText>
+          <w:instrText xml:space="preserve"> PAGEREF _Toc170138119 \h </w:instrText>
         </w:r>
         <w:r>
           <w:rPr>
@@ -1137,7 +1145,7 @@
           <w:lang w:eastAsia="en-US"/>
         </w:rPr>
       </w:pPr>
-      <w:hyperlink w:anchor="_Toc169609297" w:history="1">
+      <w:hyperlink w:anchor="_Toc170138120" w:history="1">
         <w:r>
           <w:rPr>
             <w:rStyle w:val="Hyperlink"/>
@@ -1181,7 +1189,7 @@
             <w:noProof/>
             <w:webHidden/>
           </w:rPr>
-          <w:instrText xml:space="preserve"> PAGEREF _Toc169609297 \h </w:instrText>
+          <w:instrText xml:space="preserve"> PAGEREF _Toc170138120 \h </w:instrText>
         </w:r>
         <w:r>
           <w:rPr>
@@ -1227,7 +1235,7 @@
           <w:lang w:eastAsia="en-US"/>
         </w:rPr>
       </w:pPr>
-      <w:hyperlink w:anchor="_Toc169609298" w:history="1">
+      <w:hyperlink w:anchor="_Toc170138121" w:history="1">
         <w:r>
           <w:rPr>
             <w:rStyle w:val="Hyperlink"/>
@@ -1271,7 +1279,7 @@
             <w:noProof/>
             <w:webHidden/>
           </w:rPr>
-          <w:instrText xml:space="preserve"> PAGEREF _Toc169609298 \h </w:instrText>
+          <w:instrText xml:space="preserve"> PAGEREF _Toc170138121 \h </w:instrText>
         </w:r>
         <w:r>
           <w:rPr>
@@ -1317,7 +1325,7 @@
           <w:lang w:eastAsia="en-US"/>
         </w:rPr>
       </w:pPr>
-      <w:hyperlink w:anchor="_Toc169609299" w:history="1">
+      <w:hyperlink w:anchor="_Toc170138122" w:history="1">
         <w:r>
           <w:rPr>
             <w:rStyle w:val="Hyperlink"/>
@@ -1361,7 +1369,7 @@
             <w:noProof/>
             <w:webHidden/>
           </w:rPr>
-          <w:instrText xml:space="preserve"> PAGEREF _Toc169609299 \h </w:instrText>
+          <w:instrText xml:space="preserve"> PAGEREF _Toc170138122 \h </w:instrText>
         </w:r>
         <w:r>
           <w:rPr>
@@ -1407,7 +1415,7 @@
           <w:lang w:eastAsia="en-US"/>
         </w:rPr>
       </w:pPr>
-      <w:hyperlink w:anchor="_Toc169609300" w:history="1">
+      <w:hyperlink w:anchor="_Toc170138123" w:history="1">
         <w:r>
           <w:rPr>
             <w:rStyle w:val="Hyperlink"/>
@@ -1451,7 +1459,7 @@
             <w:noProof/>
             <w:webHidden/>
           </w:rPr>
-          <w:instrText xml:space="preserve"> PAGEREF _Toc169609300 \h </w:instrText>
+          <w:instrText xml:space="preserve"> PAGEREF _Toc170138123 \h </w:instrText>
         </w:r>
         <w:r>
           <w:rPr>
@@ -1497,7 +1505,7 @@
           <w:lang w:eastAsia="en-US"/>
         </w:rPr>
       </w:pPr>
-      <w:hyperlink w:anchor="_Toc169609301" w:history="1">
+      <w:hyperlink w:anchor="_Toc170138124" w:history="1">
         <w:r>
           <w:rPr>
             <w:rStyle w:val="Hyperlink"/>
@@ -1541,7 +1549,7 @@
             <w:noProof/>
             <w:webHidden/>
           </w:rPr>
-          <w:instrText xml:space="preserve"> PAGEREF _Toc169609301 \h </w:instrText>
+          <w:instrText xml:space="preserve"> PAGEREF _Toc170138124 \h </w:instrText>
         </w:r>
         <w:r>
           <w:rPr>
@@ -1587,7 +1595,7 @@
           <w:lang w:eastAsia="en-US"/>
         </w:rPr>
       </w:pPr>
-      <w:hyperlink w:anchor="_Toc169609302" w:history="1">
+      <w:hyperlink w:anchor="_Toc170138125" w:history="1">
         <w:r>
           <w:rPr>
             <w:rStyle w:val="Hyperlink"/>
@@ -1631,7 +1639,7 @@
             <w:noProof/>
             <w:webHidden/>
           </w:rPr>
-          <w:instrText xml:space="preserve"> PAGEREF _Toc169609302 \h </w:instrText>
+          <w:instrText xml:space="preserve"> PAGEREF _Toc170138125 \h </w:instrText>
         </w:r>
         <w:r>
           <w:rPr>
@@ -1672,7 +1680,7 @@
           <w:szCs w:val="22"/>
         </w:rPr>
       </w:pPr>
-      <w:hyperlink w:anchor="_Toc169609303" w:history="1">
+      <w:hyperlink w:anchor="_Toc170138126" w:history="1">
         <w:r>
           <w:rPr>
             <w:rStyle w:val="Hyperlink"/>
@@ -1717,7 +1725,7 @@
             <w:noProof/>
             <w:webHidden/>
           </w:rPr>
-          <w:instrText xml:space="preserve"> PAGEREF _Toc169609303 \h </w:instrText>
+          <w:instrText xml:space="preserve"> PAGEREF _Toc170138126 \h </w:instrText>
         </w:r>
         <w:r>
           <w:rPr>
@@ -1758,7 +1766,7 @@
           <w:szCs w:val="22"/>
         </w:rPr>
       </w:pPr>
-      <w:hyperlink w:anchor="_Toc169609304" w:history="1">
+      <w:hyperlink w:anchor="_Toc170138127" w:history="1">
         <w:r>
           <w:rPr>
             <w:rStyle w:val="Hyperlink"/>
@@ -1803,7 +1811,7 @@
             <w:noProof/>
             <w:webHidden/>
           </w:rPr>
-          <w:instrText xml:space="preserve"> PAGEREF _Toc169609304 \h </w:instrText>
+          <w:instrText xml:space="preserve"> PAGEREF _Toc170138127 \h </w:instrText>
         </w:r>
         <w:r>
           <w:rPr>
@@ -1844,7 +1852,7 @@
           <w:szCs w:val="22"/>
         </w:rPr>
       </w:pPr>
-      <w:hyperlink w:anchor="_Toc169609305" w:history="1">
+      <w:hyperlink w:anchor="_Toc170138128" w:history="1">
         <w:r>
           <w:rPr>
             <w:rStyle w:val="Hyperlink"/>
@@ -1889,7 +1897,7 @@
             <w:noProof/>
             <w:webHidden/>
           </w:rPr>
-          <w:instrText xml:space="preserve"> PAGEREF _Toc169609305 \h </w:instrText>
+          <w:instrText xml:space="preserve"> PAGEREF _Toc170138128 \h </w:instrText>
         </w:r>
         <w:r>
           <w:rPr>
@@ -1930,7 +1938,7 @@
           <w:szCs w:val="22"/>
         </w:rPr>
       </w:pPr>
-      <w:hyperlink w:anchor="_Toc169609306" w:history="1">
+      <w:hyperlink w:anchor="_Toc170138129" w:history="1">
         <w:r>
           <w:rPr>
             <w:rStyle w:val="Hyperlink"/>
@@ -1975,7 +1983,7 @@
             <w:noProof/>
             <w:webHidden/>
           </w:rPr>
-          <w:instrText xml:space="preserve"> PAGEREF _Toc169609306 \h </w:instrText>
+          <w:instrText xml:space="preserve"> PAGEREF _Toc170138129 \h </w:instrText>
         </w:r>
         <w:r>
           <w:rPr>
@@ -2016,7 +2024,7 @@
           <w:szCs w:val="22"/>
         </w:rPr>
       </w:pPr>
-      <w:hyperlink w:anchor="_Toc169609307" w:history="1">
+      <w:hyperlink w:anchor="_Toc170138130" w:history="1">
         <w:r>
           <w:rPr>
             <w:rStyle w:val="Hyperlink"/>
@@ -2061,7 +2069,7 @@
             <w:noProof/>
             <w:webHidden/>
           </w:rPr>
-          <w:instrText xml:space="preserve"> PAGEREF _Toc169609307 \h </w:instrText>
+          <w:instrText xml:space="preserve"> PAGEREF _Toc170138130 \h </w:instrText>
         </w:r>
         <w:r>
           <w:rPr>
@@ -2102,7 +2110,7 @@
           <w:szCs w:val="22"/>
         </w:rPr>
       </w:pPr>
-      <w:hyperlink w:anchor="_Toc169609308" w:history="1">
+      <w:hyperlink w:anchor="_Toc170138131" w:history="1">
         <w:r>
           <w:rPr>
             <w:rStyle w:val="Hyperlink"/>
@@ -2147,7 +2155,7 @@
             <w:noProof/>
             <w:webHidden/>
           </w:rPr>
-          <w:instrText xml:space="preserve"> PAGEREF _Toc169609308 \h </w:instrText>
+          <w:instrText xml:space="preserve"> PAGEREF _Toc170138131 \h </w:instrText>
         </w:r>
         <w:r>
           <w:rPr>
@@ -2188,7 +2196,7 @@
           <w:szCs w:val="22"/>
         </w:rPr>
       </w:pPr>
-      <w:hyperlink w:anchor="_Toc169609309" w:history="1">
+      <w:hyperlink w:anchor="_Toc170138132" w:history="1">
         <w:r>
           <w:rPr>
             <w:rStyle w:val="Hyperlink"/>
@@ -2233,7 +2241,7 @@
             <w:noProof/>
             <w:webHidden/>
           </w:rPr>
-          <w:instrText xml:space="preserve"> PAGEREF _Toc169609309 \h </w:instrText>
+          <w:instrText xml:space="preserve"> PAGEREF _Toc170138132 \h </w:instrText>
         </w:r>
         <w:r>
           <w:rPr>
@@ -2279,7 +2287,7 @@
           <w:lang w:eastAsia="en-US"/>
         </w:rPr>
       </w:pPr>
-      <w:hyperlink w:anchor="_Toc169609310" w:history="1">
+      <w:hyperlink w:anchor="_Toc170138133" w:history="1">
         <w:r>
           <w:rPr>
             <w:rStyle w:val="Hyperlink"/>
@@ -2323,7 +2331,7 @@
             <w:noProof/>
             <w:webHidden/>
           </w:rPr>
-          <w:instrText xml:space="preserve"> PAGEREF _Toc169609310 \h </w:instrText>
+          <w:instrText xml:space="preserve"> PAGEREF _Toc170138133 \h </w:instrText>
         </w:r>
         <w:r>
           <w:rPr>
@@ -2364,7 +2372,7 @@
           <w:szCs w:val="22"/>
         </w:rPr>
       </w:pPr>
-      <w:hyperlink w:anchor="_Toc169609311" w:history="1">
+      <w:hyperlink w:anchor="_Toc170138134" w:history="1">
         <w:r>
           <w:rPr>
             <w:rStyle w:val="Hyperlink"/>
@@ -2409,7 +2417,7 @@
             <w:noProof/>
             <w:webHidden/>
           </w:rPr>
-          <w:instrText xml:space="preserve"> PAGEREF _Toc169609311 \h </w:instrText>
+          <w:instrText xml:space="preserve"> PAGEREF _Toc170138134 \h </w:instrText>
         </w:r>
         <w:r>
           <w:rPr>
@@ -2450,7 +2458,7 @@
           <w:szCs w:val="22"/>
         </w:rPr>
       </w:pPr>
-      <w:hyperlink w:anchor="_Toc169609312" w:history="1">
+      <w:hyperlink w:anchor="_Toc170138135" w:history="1">
         <w:r>
           <w:rPr>
             <w:rStyle w:val="Hyperlink"/>
@@ -2495,7 +2503,7 @@
             <w:noProof/>
             <w:webHidden/>
           </w:rPr>
-          <w:instrText xml:space="preserve"> PAGEREF _Toc169609312 \h </w:instrText>
+          <w:instrText xml:space="preserve"> PAGEREF _Toc170138135 \h </w:instrText>
         </w:r>
         <w:r>
           <w:rPr>
@@ -2536,7 +2544,7 @@
           <w:szCs w:val="22"/>
         </w:rPr>
       </w:pPr>
-      <w:hyperlink w:anchor="_Toc169609313" w:history="1">
+      <w:hyperlink w:anchor="_Toc170138136" w:history="1">
         <w:r>
           <w:rPr>
             <w:rStyle w:val="Hyperlink"/>
@@ -2581,7 +2589,7 @@
             <w:noProof/>
             <w:webHidden/>
           </w:rPr>
-          <w:instrText xml:space="preserve"> PAGEREF _Toc169609313 \h </w:instrText>
+          <w:instrText xml:space="preserve"> PAGEREF _Toc170138136 \h </w:instrText>
         </w:r>
         <w:r>
           <w:rPr>
@@ -2627,7 +2635,7 @@
           <w:lang w:eastAsia="en-US"/>
         </w:rPr>
       </w:pPr>
-      <w:hyperlink w:anchor="_Toc169609314" w:history="1">
+      <w:hyperlink w:anchor="_Toc170138137" w:history="1">
         <w:r>
           <w:rPr>
             <w:rStyle w:val="Hyperlink"/>
@@ -2671,7 +2679,7 @@
             <w:noProof/>
             <w:webHidden/>
           </w:rPr>
-          <w:instrText xml:space="preserve"> PAGEREF _Toc169609314 \h </w:instrText>
+          <w:instrText xml:space="preserve"> PAGEREF _Toc170138137 \h </w:instrText>
         </w:r>
         <w:r>
           <w:rPr>
@@ -2717,7 +2725,7 @@
           <w:lang w:eastAsia="en-US"/>
         </w:rPr>
       </w:pPr>
-      <w:hyperlink w:anchor="_Toc169609315" w:history="1">
+      <w:hyperlink w:anchor="_Toc170138138" w:history="1">
         <w:r>
           <w:rPr>
             <w:rStyle w:val="Hyperlink"/>
@@ -2761,7 +2769,7 @@
             <w:noProof/>
             <w:webHidden/>
           </w:rPr>
-          <w:instrText xml:space="preserve"> PAGEREF _Toc169609315 \h </w:instrText>
+          <w:instrText xml:space="preserve"> PAGEREF _Toc170138138 \h </w:instrText>
         </w:r>
         <w:r>
           <w:rPr>
@@ -2802,7 +2810,7 @@
           <w:szCs w:val="22"/>
         </w:rPr>
       </w:pPr>
-      <w:hyperlink w:anchor="_Toc169609316" w:history="1">
+      <w:hyperlink w:anchor="_Toc170138139" w:history="1">
         <w:r>
           <w:rPr>
             <w:rStyle w:val="Hyperlink"/>
@@ -2847,7 +2855,7 @@
             <w:noProof/>
             <w:webHidden/>
           </w:rPr>
-          <w:instrText xml:space="preserve"> PAGEREF _Toc169609316 \h </w:instrText>
+          <w:instrText xml:space="preserve"> PAGEREF _Toc170138139 \h </w:instrText>
         </w:r>
         <w:r>
           <w:rPr>
@@ -2888,7 +2896,7 @@
           <w:szCs w:val="22"/>
         </w:rPr>
       </w:pPr>
-      <w:hyperlink w:anchor="_Toc169609317" w:history="1">
+      <w:hyperlink w:anchor="_Toc170138140" w:history="1">
         <w:r>
           <w:rPr>
             <w:rStyle w:val="Hyperlink"/>
@@ -2933,7 +2941,7 @@
             <w:noProof/>
             <w:webHidden/>
           </w:rPr>
-          <w:instrText xml:space="preserve"> PAGEREF _Toc169609317 \h </w:instrText>
+          <w:instrText xml:space="preserve"> PAGEREF _Toc170138140 \h </w:instrText>
         </w:r>
         <w:r>
           <w:rPr>
@@ -2979,7 +2987,7 @@
           <w:lang w:eastAsia="en-US"/>
         </w:rPr>
       </w:pPr>
-      <w:hyperlink w:anchor="_Toc169609318" w:history="1">
+      <w:hyperlink w:anchor="_Toc170138141" w:history="1">
         <w:r>
           <w:rPr>
             <w:rStyle w:val="Hyperlink"/>
@@ -3023,7 +3031,7 @@
             <w:noProof/>
             <w:webHidden/>
           </w:rPr>
-          <w:instrText xml:space="preserve"> PAGEREF _Toc169609318 \h </w:instrText>
+          <w:instrText xml:space="preserve"> PAGEREF _Toc170138141 \h </w:instrText>
         </w:r>
         <w:r>
           <w:rPr>
@@ -3064,7 +3072,7 @@
           <w:szCs w:val="22"/>
         </w:rPr>
       </w:pPr>
-      <w:hyperlink w:anchor="_Toc169609319" w:history="1">
+      <w:hyperlink w:anchor="_Toc170138142" w:history="1">
         <w:r>
           <w:rPr>
             <w:rStyle w:val="Hyperlink"/>
@@ -3109,7 +3117,7 @@
             <w:noProof/>
             <w:webHidden/>
           </w:rPr>
-          <w:instrText xml:space="preserve"> PAGEREF _Toc169609319 \h </w:instrText>
+          <w:instrText xml:space="preserve"> PAGEREF _Toc170138142 \h </w:instrText>
         </w:r>
         <w:r>
           <w:rPr>
@@ -3155,7 +3163,7 @@
           <w:lang w:eastAsia="en-US"/>
         </w:rPr>
       </w:pPr>
-      <w:hyperlink w:anchor="_Toc169609320" w:history="1">
+      <w:hyperlink w:anchor="_Toc170138143" w:history="1">
         <w:r>
           <w:rPr>
             <w:rStyle w:val="Hyperlink"/>
@@ -3199,7 +3207,7 @@
             <w:noProof/>
             <w:webHidden/>
           </w:rPr>
-          <w:instrText xml:space="preserve"> PAGEREF _Toc169609320 \h </w:instrText>
+          <w:instrText xml:space="preserve"> PAGEREF _Toc170138143 \h </w:instrText>
         </w:r>
         <w:r>
           <w:rPr>
@@ -3219,7 +3227,7 @@
             <w:noProof/>
             <w:webHidden/>
           </w:rPr>
-          <w:t>39</w:t>
+          <w:t>40</w:t>
         </w:r>
         <w:r>
           <w:rPr>
@@ -3245,7 +3253,7 @@
           <w:lang w:eastAsia="en-US"/>
         </w:rPr>
       </w:pPr>
-      <w:hyperlink w:anchor="_Toc169609321" w:history="1">
+      <w:hyperlink w:anchor="_Toc170138144" w:history="1">
         <w:r>
           <w:rPr>
             <w:rStyle w:val="Hyperlink"/>
@@ -3289,7 +3297,7 @@
             <w:noProof/>
             <w:webHidden/>
           </w:rPr>
-          <w:instrText xml:space="preserve"> PAGEREF _Toc169609321 \h </w:instrText>
+          <w:instrText xml:space="preserve"> PAGEREF _Toc170138144 \h </w:instrText>
         </w:r>
         <w:r>
           <w:rPr>
@@ -3309,7 +3317,7 @@
             <w:noProof/>
             <w:webHidden/>
           </w:rPr>
-          <w:t>40</w:t>
+          <w:t>41</w:t>
         </w:r>
         <w:r>
           <w:rPr>
@@ -3335,7 +3343,7 @@
           <w:lang w:eastAsia="en-US"/>
         </w:rPr>
       </w:pPr>
-      <w:hyperlink w:anchor="_Toc169609322" w:history="1">
+      <w:hyperlink w:anchor="_Toc170138145" w:history="1">
         <w:r>
           <w:rPr>
             <w:rStyle w:val="Hyperlink"/>
@@ -3379,7 +3387,7 @@
             <w:noProof/>
             <w:webHidden/>
           </w:rPr>
-          <w:instrText xml:space="preserve"> PAGEREF _Toc169609322 \h </w:instrText>
+          <w:instrText xml:space="preserve"> PAGEREF _Toc170138145 \h </w:instrText>
         </w:r>
         <w:r>
           <w:rPr>
@@ -3399,7 +3407,7 @@
             <w:noProof/>
             <w:webHidden/>
           </w:rPr>
-          <w:t>41</w:t>
+          <w:t>42</w:t>
         </w:r>
         <w:r>
           <w:rPr>
@@ -3425,7 +3433,7 @@
           <w:lang w:eastAsia="en-US"/>
         </w:rPr>
       </w:pPr>
-      <w:hyperlink w:anchor="_Toc169609323" w:history="1">
+      <w:hyperlink w:anchor="_Toc170138146" w:history="1">
         <w:r>
           <w:rPr>
             <w:rStyle w:val="Hyperlink"/>
@@ -3469,7 +3477,7 @@
             <w:noProof/>
             <w:webHidden/>
           </w:rPr>
-          <w:instrText xml:space="preserve"> PAGEREF _Toc169609323 \h </w:instrText>
+          <w:instrText xml:space="preserve"> PAGEREF _Toc170138146 \h </w:instrText>
         </w:r>
         <w:r>
           <w:rPr>
@@ -3515,7 +3523,7 @@
           <w:lang w:eastAsia="en-US"/>
         </w:rPr>
       </w:pPr>
-      <w:hyperlink w:anchor="_Toc169609324" w:history="1">
+      <w:hyperlink w:anchor="_Toc170138147" w:history="1">
         <w:r>
           <w:rPr>
             <w:rStyle w:val="Hyperlink"/>
@@ -3559,7 +3567,7 @@
             <w:noProof/>
             <w:webHidden/>
           </w:rPr>
-          <w:instrText xml:space="preserve"> PAGEREF _Toc169609324 \h </w:instrText>
+          <w:instrText xml:space="preserve"> PAGEREF _Toc170138147 \h </w:instrText>
         </w:r>
         <w:r>
           <w:rPr>
@@ -3579,7 +3587,7 @@
             <w:noProof/>
             <w:webHidden/>
           </w:rPr>
-          <w:t>44</w:t>
+          <w:t>45</w:t>
         </w:r>
         <w:r>
           <w:rPr>
@@ -3605,7 +3613,7 @@
           <w:lang w:eastAsia="en-US"/>
         </w:rPr>
       </w:pPr>
-      <w:hyperlink w:anchor="_Toc169609325" w:history="1">
+      <w:hyperlink w:anchor="_Toc170138148" w:history="1">
         <w:r>
           <w:rPr>
             <w:rStyle w:val="Hyperlink"/>
@@ -3649,7 +3657,7 @@
             <w:noProof/>
             <w:webHidden/>
           </w:rPr>
-          <w:instrText xml:space="preserve"> PAGEREF _Toc169609325 \h </w:instrText>
+          <w:instrText xml:space="preserve"> PAGEREF _Toc170138148 \h </w:instrText>
         </w:r>
         <w:r>
           <w:rPr>
@@ -3669,7 +3677,7 @@
             <w:noProof/>
             <w:webHidden/>
           </w:rPr>
-          <w:t>44</w:t>
+          <w:t>45</w:t>
         </w:r>
         <w:r>
           <w:rPr>
@@ -3690,7 +3698,7 @@
           <w:szCs w:val="22"/>
         </w:rPr>
       </w:pPr>
-      <w:hyperlink w:anchor="_Toc169609326" w:history="1">
+      <w:hyperlink w:anchor="_Toc170138149" w:history="1">
         <w:r>
           <w:rPr>
             <w:rStyle w:val="Hyperlink"/>
@@ -3735,7 +3743,7 @@
             <w:noProof/>
             <w:webHidden/>
           </w:rPr>
-          <w:instrText xml:space="preserve"> PAGEREF _Toc169609326 \h </w:instrText>
+          <w:instrText xml:space="preserve"> PAGEREF _Toc170138149 \h </w:instrText>
         </w:r>
         <w:r>
           <w:rPr>
@@ -3755,7 +3763,7 @@
             <w:noProof/>
             <w:webHidden/>
           </w:rPr>
-          <w:t>46</w:t>
+          <w:t>47</w:t>
         </w:r>
         <w:r>
           <w:rPr>
@@ -3781,7 +3789,7 @@
           <w:lang w:eastAsia="en-US"/>
         </w:rPr>
       </w:pPr>
-      <w:hyperlink w:anchor="_Toc169609327" w:history="1">
+      <w:hyperlink w:anchor="_Toc170138150" w:history="1">
         <w:r>
           <w:rPr>
             <w:rStyle w:val="Hyperlink"/>
@@ -3825,7 +3833,7 @@
             <w:noProof/>
             <w:webHidden/>
           </w:rPr>
-          <w:instrText xml:space="preserve"> PAGEREF _Toc169609327 \h </w:instrText>
+          <w:instrText xml:space="preserve"> PAGEREF _Toc170138150 \h </w:instrText>
         </w:r>
         <w:r>
           <w:rPr>
@@ -3845,7 +3853,7 @@
             <w:noProof/>
             <w:webHidden/>
           </w:rPr>
-          <w:t>46</w:t>
+          <w:t>47</w:t>
         </w:r>
         <w:r>
           <w:rPr>
@@ -3871,7 +3879,7 @@
           <w:lang w:eastAsia="en-US"/>
         </w:rPr>
       </w:pPr>
-      <w:hyperlink w:anchor="_Toc169609328" w:history="1">
+      <w:hyperlink w:anchor="_Toc170138151" w:history="1">
         <w:r>
           <w:rPr>
             <w:rStyle w:val="Hyperlink"/>
@@ -3915,7 +3923,7 @@
             <w:noProof/>
             <w:webHidden/>
           </w:rPr>
-          <w:instrText xml:space="preserve"> PAGEREF _Toc169609328 \h </w:instrText>
+          <w:instrText xml:space="preserve"> PAGEREF _Toc170138151 \h </w:instrText>
         </w:r>
         <w:r>
           <w:rPr>
@@ -3935,7 +3943,7 @@
             <w:noProof/>
             <w:webHidden/>
           </w:rPr>
-          <w:t>48</w:t>
+          <w:t>49</w:t>
         </w:r>
         <w:r>
           <w:rPr>
@@ -3956,7 +3964,7 @@
           <w:szCs w:val="22"/>
         </w:rPr>
       </w:pPr>
-      <w:hyperlink w:anchor="_Toc169609329" w:history="1">
+      <w:hyperlink w:anchor="_Toc170138152" w:history="1">
         <w:r>
           <w:rPr>
             <w:rStyle w:val="Hyperlink"/>
@@ -4001,7 +4009,7 @@
             <w:noProof/>
             <w:webHidden/>
           </w:rPr>
-          <w:instrText xml:space="preserve"> PAGEREF _Toc169609329 \h </w:instrText>
+          <w:instrText xml:space="preserve"> PAGEREF _Toc170138152 \h </w:instrText>
         </w:r>
         <w:r>
           <w:rPr>
@@ -4021,7 +4029,7 @@
             <w:noProof/>
             <w:webHidden/>
           </w:rPr>
-          <w:t>49</w:t>
+          <w:t>50</w:t>
         </w:r>
         <w:r>
           <w:rPr>
@@ -4047,7 +4055,7 @@
           <w:lang w:eastAsia="en-US"/>
         </w:rPr>
       </w:pPr>
-      <w:hyperlink w:anchor="_Toc169609330" w:history="1">
+      <w:hyperlink w:anchor="_Toc170138153" w:history="1">
         <w:r>
           <w:rPr>
             <w:rStyle w:val="Hyperlink"/>
@@ -4091,7 +4099,7 @@
             <w:noProof/>
             <w:webHidden/>
           </w:rPr>
-          <w:instrText xml:space="preserve"> PAGEREF _Toc169609330 \h </w:instrText>
+          <w:instrText xml:space="preserve"> PAGEREF _Toc170138153 \h </w:instrText>
         </w:r>
         <w:r>
           <w:rPr>
@@ -4111,7 +4119,7 @@
             <w:noProof/>
             <w:webHidden/>
           </w:rPr>
-          <w:t>50</w:t>
+          <w:t>51</w:t>
         </w:r>
         <w:r>
           <w:rPr>
@@ -4137,7 +4145,7 @@
           <w:lang w:eastAsia="en-US"/>
         </w:rPr>
       </w:pPr>
-      <w:hyperlink w:anchor="_Toc169609331" w:history="1">
+      <w:hyperlink w:anchor="_Toc170138154" w:history="1">
         <w:r>
           <w:rPr>
             <w:rStyle w:val="Hyperlink"/>
@@ -4181,7 +4189,7 @@
             <w:noProof/>
             <w:webHidden/>
           </w:rPr>
-          <w:instrText xml:space="preserve"> PAGEREF _Toc169609331 \h </w:instrText>
+          <w:instrText xml:space="preserve"> PAGEREF _Toc170138154 \h </w:instrText>
         </w:r>
         <w:r>
           <w:rPr>
@@ -4201,7 +4209,7 @@
             <w:noProof/>
             <w:webHidden/>
           </w:rPr>
-          <w:t>51</w:t>
+          <w:t>52</w:t>
         </w:r>
         <w:r>
           <w:rPr>
@@ -4227,7 +4235,7 @@
           <w:lang w:eastAsia="en-US"/>
         </w:rPr>
       </w:pPr>
-      <w:hyperlink w:anchor="_Toc169609332" w:history="1">
+      <w:hyperlink w:anchor="_Toc170138155" w:history="1">
         <w:r>
           <w:rPr>
             <w:rStyle w:val="Hyperlink"/>
@@ -4271,7 +4279,7 @@
             <w:noProof/>
             <w:webHidden/>
           </w:rPr>
-          <w:instrText xml:space="preserve"> PAGEREF _Toc169609332 \h </w:instrText>
+          <w:instrText xml:space="preserve"> PAGEREF _Toc170138155 \h </w:instrText>
         </w:r>
         <w:r>
           <w:rPr>
@@ -4291,7 +4299,7 @@
             <w:noProof/>
             <w:webHidden/>
           </w:rPr>
-          <w:t>52</w:t>
+          <w:t>53</w:t>
         </w:r>
         <w:r>
           <w:rPr>
@@ -4316,7 +4324,7 @@
           <w:szCs w:val="22"/>
         </w:rPr>
       </w:pPr>
-      <w:hyperlink w:anchor="_Toc169609333" w:history="1">
+      <w:hyperlink w:anchor="_Toc170138156" w:history="1">
         <w:r>
           <w:rPr>
             <w:rStyle w:val="Hyperlink"/>
@@ -4361,7 +4369,7 @@
             <w:noProof/>
             <w:webHidden/>
           </w:rPr>
-          <w:instrText xml:space="preserve"> PAGEREF _Toc169609333 \h </w:instrText>
+          <w:instrText xml:space="preserve"> PAGEREF _Toc170138156 \h </w:instrText>
         </w:r>
         <w:r>
           <w:rPr>
@@ -4381,7 +4389,7 @@
             <w:noProof/>
             <w:webHidden/>
           </w:rPr>
-          <w:t>53</w:t>
+          <w:t>54</w:t>
         </w:r>
         <w:r>
           <w:rPr>
@@ -4406,7 +4414,7 @@
           <w:szCs w:val="22"/>
         </w:rPr>
       </w:pPr>
-      <w:hyperlink w:anchor="_Toc169609334" w:history="1">
+      <w:hyperlink w:anchor="_Toc170138157" w:history="1">
         <w:r>
           <w:rPr>
             <w:rStyle w:val="Hyperlink"/>
@@ -4451,7 +4459,7 @@
             <w:noProof/>
             <w:webHidden/>
           </w:rPr>
-          <w:instrText xml:space="preserve"> PAGEREF _Toc169609334 \h </w:instrText>
+          <w:instrText xml:space="preserve"> PAGEREF _Toc170138157 \h </w:instrText>
         </w:r>
         <w:r>
           <w:rPr>
@@ -4471,7 +4479,7 @@
             <w:noProof/>
             <w:webHidden/>
           </w:rPr>
-          <w:t>53</w:t>
+          <w:t>54</w:t>
         </w:r>
         <w:r>
           <w:rPr>
@@ -4496,7 +4504,7 @@
           <w:szCs w:val="22"/>
         </w:rPr>
       </w:pPr>
-      <w:hyperlink w:anchor="_Toc169609335" w:history="1">
+      <w:hyperlink w:anchor="_Toc170138158" w:history="1">
         <w:r>
           <w:rPr>
             <w:rStyle w:val="Hyperlink"/>
@@ -4541,7 +4549,7 @@
             <w:noProof/>
             <w:webHidden/>
           </w:rPr>
-          <w:instrText xml:space="preserve"> PAGEREF _Toc169609335 \h </w:instrText>
+          <w:instrText xml:space="preserve"> PAGEREF _Toc170138158 \h </w:instrText>
         </w:r>
         <w:r>
           <w:rPr>
@@ -4561,7 +4569,7 @@
             <w:noProof/>
             <w:webHidden/>
           </w:rPr>
-          <w:t>54</w:t>
+          <w:t>55</w:t>
         </w:r>
         <w:r>
           <w:rPr>
@@ -4586,7 +4594,7 @@
           <w:szCs w:val="22"/>
         </w:rPr>
       </w:pPr>
-      <w:hyperlink w:anchor="_Toc169609336" w:history="1">
+      <w:hyperlink w:anchor="_Toc170138159" w:history="1">
         <w:r>
           <w:rPr>
             <w:rStyle w:val="Hyperlink"/>
@@ -4631,7 +4639,7 @@
             <w:noProof/>
             <w:webHidden/>
           </w:rPr>
-          <w:instrText xml:space="preserve"> PAGEREF _Toc169609336 \h </w:instrText>
+          <w:instrText xml:space="preserve"> PAGEREF _Toc170138159 \h </w:instrText>
         </w:r>
         <w:r>
           <w:rPr>
@@ -4651,7 +4659,7 @@
             <w:noProof/>
             <w:webHidden/>
           </w:rPr>
-          <w:t>54</w:t>
+          <w:t>55</w:t>
         </w:r>
         <w:r>
           <w:rPr>
@@ -4676,7 +4684,7 @@
           <w:szCs w:val="22"/>
         </w:rPr>
       </w:pPr>
-      <w:hyperlink w:anchor="_Toc169609337" w:history="1">
+      <w:hyperlink w:anchor="_Toc170138160" w:history="1">
         <w:r>
           <w:rPr>
             <w:rStyle w:val="Hyperlink"/>
@@ -4721,7 +4729,7 @@
             <w:noProof/>
             <w:webHidden/>
           </w:rPr>
-          <w:instrText xml:space="preserve"> PAGEREF _Toc169609337 \h </w:instrText>
+          <w:instrText xml:space="preserve"> PAGEREF _Toc170138160 \h </w:instrText>
         </w:r>
         <w:r>
           <w:rPr>
@@ -4741,7 +4749,7 @@
             <w:noProof/>
             <w:webHidden/>
           </w:rPr>
-          <w:t>55</w:t>
+          <w:t>56</w:t>
         </w:r>
         <w:r>
           <w:rPr>
@@ -4767,7 +4775,7 @@
           <w:lang w:eastAsia="en-US"/>
         </w:rPr>
       </w:pPr>
-      <w:hyperlink w:anchor="_Toc169609338" w:history="1">
+      <w:hyperlink w:anchor="_Toc170138161" w:history="1">
         <w:r>
           <w:rPr>
             <w:rStyle w:val="Hyperlink"/>
@@ -4811,7 +4819,7 @@
             <w:noProof/>
             <w:webHidden/>
           </w:rPr>
-          <w:instrText xml:space="preserve"> PAGEREF _Toc169609338 \h </w:instrText>
+          <w:instrText xml:space="preserve"> PAGEREF _Toc170138161 \h </w:instrText>
         </w:r>
         <w:r>
           <w:rPr>
@@ -4831,7 +4839,7 @@
             <w:noProof/>
             <w:webHidden/>
           </w:rPr>
-          <w:t>56</w:t>
+          <w:t>57</w:t>
         </w:r>
         <w:r>
           <w:rPr>
@@ -4857,7 +4865,7 @@
           <w:lang w:eastAsia="en-US"/>
         </w:rPr>
       </w:pPr>
-      <w:hyperlink w:anchor="_Toc169609339" w:history="1">
+      <w:hyperlink w:anchor="_Toc170138162" w:history="1">
         <w:r>
           <w:rPr>
             <w:rStyle w:val="Hyperlink"/>
@@ -4901,7 +4909,7 @@
             <w:noProof/>
             <w:webHidden/>
           </w:rPr>
-          <w:instrText xml:space="preserve"> PAGEREF _Toc169609339 \h </w:instrText>
+          <w:instrText xml:space="preserve"> PAGEREF _Toc170138162 \h </w:instrText>
         </w:r>
         <w:r>
           <w:rPr>
@@ -4921,7 +4929,7 @@
             <w:noProof/>
             <w:webHidden/>
           </w:rPr>
-          <w:t>58</w:t>
+          <w:t>59</w:t>
         </w:r>
         <w:r>
           <w:rPr>
@@ -4947,7 +4955,7 @@
           <w:lang w:eastAsia="en-US"/>
         </w:rPr>
       </w:pPr>
-      <w:hyperlink w:anchor="_Toc169609340" w:history="1">
+      <w:hyperlink w:anchor="_Toc170138163" w:history="1">
         <w:r>
           <w:rPr>
             <w:rStyle w:val="Hyperlink"/>
@@ -4991,7 +4999,7 @@
             <w:noProof/>
             <w:webHidden/>
           </w:rPr>
-          <w:instrText xml:space="preserve"> PAGEREF _Toc169609340 \h </w:instrText>
+          <w:instrText xml:space="preserve"> PAGEREF _Toc170138163 \h </w:instrText>
         </w:r>
         <w:r>
           <w:rPr>
@@ -5011,7 +5019,7 @@
             <w:noProof/>
             <w:webHidden/>
           </w:rPr>
-          <w:t>58</w:t>
+          <w:t>59</w:t>
         </w:r>
         <w:r>
           <w:rPr>
@@ -5032,7 +5040,7 @@
           <w:szCs w:val="22"/>
         </w:rPr>
       </w:pPr>
-      <w:hyperlink w:anchor="_Toc169609341" w:history="1">
+      <w:hyperlink w:anchor="_Toc170138164" w:history="1">
         <w:r>
           <w:rPr>
             <w:rStyle w:val="Hyperlink"/>
@@ -5077,7 +5085,7 @@
             <w:noProof/>
             <w:webHidden/>
           </w:rPr>
-          <w:instrText xml:space="preserve"> PAGEREF _Toc169609341 \h </w:instrText>
+          <w:instrText xml:space="preserve"> PAGEREF _Toc170138164 \h </w:instrText>
         </w:r>
         <w:r>
           <w:rPr>
@@ -5097,7 +5105,7 @@
             <w:noProof/>
             <w:webHidden/>
           </w:rPr>
-          <w:t>58</w:t>
+          <w:t>59</w:t>
         </w:r>
         <w:r>
           <w:rPr>
@@ -5118,7 +5126,7 @@
           <w:szCs w:val="22"/>
         </w:rPr>
       </w:pPr>
-      <w:hyperlink w:anchor="_Toc169609342" w:history="1">
+      <w:hyperlink w:anchor="_Toc170138165" w:history="1">
         <w:r>
           <w:rPr>
             <w:rStyle w:val="Hyperlink"/>
@@ -5163,7 +5171,7 @@
             <w:noProof/>
             <w:webHidden/>
           </w:rPr>
-          <w:instrText xml:space="preserve"> PAGEREF _Toc169609342 \h </w:instrText>
+          <w:instrText xml:space="preserve"> PAGEREF _Toc170138165 \h </w:instrText>
         </w:r>
         <w:r>
           <w:rPr>
@@ -5183,7 +5191,7 @@
             <w:noProof/>
             <w:webHidden/>
           </w:rPr>
-          <w:t>59</w:t>
+          <w:t>60</w:t>
         </w:r>
         <w:r>
           <w:rPr>
@@ -5209,7 +5217,7 @@
           <w:lang w:eastAsia="en-US"/>
         </w:rPr>
       </w:pPr>
-      <w:hyperlink w:anchor="_Toc169609343" w:history="1">
+      <w:hyperlink w:anchor="_Toc170138166" w:history="1">
         <w:r>
           <w:rPr>
             <w:rStyle w:val="Hyperlink"/>
@@ -5253,7 +5261,7 @@
             <w:noProof/>
             <w:webHidden/>
           </w:rPr>
-          <w:instrText xml:space="preserve"> PAGEREF _Toc169609343 \h </w:instrText>
+          <w:instrText xml:space="preserve"> PAGEREF _Toc170138166 \h </w:instrText>
         </w:r>
         <w:r>
           <w:rPr>
@@ -5273,7 +5281,7 @@
             <w:noProof/>
             <w:webHidden/>
           </w:rPr>
-          <w:t>60</w:t>
+          <w:t>61</w:t>
         </w:r>
         <w:r>
           <w:rPr>
@@ -5294,7 +5302,7 @@
           <w:szCs w:val="22"/>
         </w:rPr>
       </w:pPr>
-      <w:hyperlink w:anchor="_Toc169609344" w:history="1">
+      <w:hyperlink w:anchor="_Toc170138167" w:history="1">
         <w:r>
           <w:rPr>
             <w:rStyle w:val="Hyperlink"/>
@@ -5339,7 +5347,7 @@
             <w:noProof/>
             <w:webHidden/>
           </w:rPr>
-          <w:instrText xml:space="preserve"> PAGEREF _Toc169609344 \h </w:instrText>
+          <w:instrText xml:space="preserve"> PAGEREF _Toc170138167 \h </w:instrText>
         </w:r>
         <w:r>
           <w:rPr>
@@ -5359,7 +5367,7 @@
             <w:noProof/>
             <w:webHidden/>
           </w:rPr>
-          <w:t>61</w:t>
+          <w:t>62</w:t>
         </w:r>
         <w:r>
           <w:rPr>
@@ -5380,7 +5388,7 @@
           <w:szCs w:val="22"/>
         </w:rPr>
       </w:pPr>
-      <w:hyperlink w:anchor="_Toc169609345" w:history="1">
+      <w:hyperlink w:anchor="_Toc170138168" w:history="1">
         <w:r>
           <w:rPr>
             <w:rStyle w:val="Hyperlink"/>
@@ -5425,7 +5433,7 @@
             <w:noProof/>
             <w:webHidden/>
           </w:rPr>
-          <w:instrText xml:space="preserve"> PAGEREF _Toc169609345 \h </w:instrText>
+          <w:instrText xml:space="preserve"> PAGEREF _Toc170138168 \h </w:instrText>
         </w:r>
         <w:r>
           <w:rPr>
@@ -5445,7 +5453,7 @@
             <w:noProof/>
             <w:webHidden/>
           </w:rPr>
-          <w:t>62</w:t>
+          <w:t>63</w:t>
         </w:r>
         <w:r>
           <w:rPr>
@@ -5466,7 +5474,7 @@
           <w:szCs w:val="22"/>
         </w:rPr>
       </w:pPr>
-      <w:hyperlink w:anchor="_Toc169609346" w:history="1">
+      <w:hyperlink w:anchor="_Toc170138169" w:history="1">
         <w:r>
           <w:rPr>
             <w:rStyle w:val="Hyperlink"/>
@@ -5511,7 +5519,7 @@
             <w:noProof/>
             <w:webHidden/>
           </w:rPr>
-          <w:instrText xml:space="preserve"> PAGEREF _Toc169609346 \h </w:instrText>
+          <w:instrText xml:space="preserve"> PAGEREF _Toc170138169 \h </w:instrText>
         </w:r>
         <w:r>
           <w:rPr>
@@ -5531,7 +5539,7 @@
             <w:noProof/>
             <w:webHidden/>
           </w:rPr>
-          <w:t>64</w:t>
+          <w:t>65</w:t>
         </w:r>
         <w:r>
           <w:rPr>
@@ -5557,7 +5565,7 @@
           <w:lang w:eastAsia="en-US"/>
         </w:rPr>
       </w:pPr>
-      <w:hyperlink w:anchor="_Toc169609347" w:history="1">
+      <w:hyperlink w:anchor="_Toc170138170" w:history="1">
         <w:r>
           <w:rPr>
             <w:rStyle w:val="Hyperlink"/>
@@ -5601,7 +5609,7 @@
             <w:noProof/>
             <w:webHidden/>
           </w:rPr>
-          <w:instrText xml:space="preserve"> PAGEREF _Toc169609347 \h </w:instrText>
+          <w:instrText xml:space="preserve"> PAGEREF _Toc170138170 \h </w:instrText>
         </w:r>
         <w:r>
           <w:rPr>
@@ -5621,7 +5629,7 @@
             <w:noProof/>
             <w:webHidden/>
           </w:rPr>
-          <w:t>66</w:t>
+          <w:t>67</w:t>
         </w:r>
         <w:r>
           <w:rPr>
@@ -5642,7 +5650,7 @@
           <w:szCs w:val="22"/>
         </w:rPr>
       </w:pPr>
-      <w:hyperlink w:anchor="_Toc169609348" w:history="1">
+      <w:hyperlink w:anchor="_Toc170138171" w:history="1">
         <w:r>
           <w:rPr>
             <w:rStyle w:val="Hyperlink"/>
@@ -5687,7 +5695,7 @@
             <w:noProof/>
             <w:webHidden/>
           </w:rPr>
-          <w:instrText xml:space="preserve"> PAGEREF _Toc169609348 \h </w:instrText>
+          <w:instrText xml:space="preserve"> PAGEREF _Toc170138171 \h </w:instrText>
         </w:r>
         <w:r>
           <w:rPr>
@@ -5707,7 +5715,7 @@
             <w:noProof/>
             <w:webHidden/>
           </w:rPr>
-          <w:t>66</w:t>
+          <w:t>67</w:t>
         </w:r>
         <w:r>
           <w:rPr>
@@ -5728,7 +5736,7 @@
           <w:szCs w:val="22"/>
         </w:rPr>
       </w:pPr>
-      <w:hyperlink w:anchor="_Toc169609349" w:history="1">
+      <w:hyperlink w:anchor="_Toc170138172" w:history="1">
         <w:r>
           <w:rPr>
             <w:rStyle w:val="Hyperlink"/>
@@ -5773,7 +5781,7 @@
             <w:noProof/>
             <w:webHidden/>
           </w:rPr>
-          <w:instrText xml:space="preserve"> PAGEREF _Toc169609349 \h </w:instrText>
+          <w:instrText xml:space="preserve"> PAGEREF _Toc170138172 \h </w:instrText>
         </w:r>
         <w:r>
           <w:rPr>
@@ -5793,7 +5801,7 @@
             <w:noProof/>
             <w:webHidden/>
           </w:rPr>
-          <w:t>67</w:t>
+          <w:t>68</w:t>
         </w:r>
         <w:r>
           <w:rPr>
@@ -5814,7 +5822,7 @@
           <w:szCs w:val="22"/>
         </w:rPr>
       </w:pPr>
-      <w:hyperlink w:anchor="_Toc169609350" w:history="1">
+      <w:hyperlink w:anchor="_Toc170138173" w:history="1">
         <w:r>
           <w:rPr>
             <w:rStyle w:val="Hyperlink"/>
@@ -5859,7 +5867,7 @@
             <w:noProof/>
             <w:webHidden/>
           </w:rPr>
-          <w:instrText xml:space="preserve"> PAGEREF _Toc169609350 \h </w:instrText>
+          <w:instrText xml:space="preserve"> PAGEREF _Toc170138173 \h </w:instrText>
         </w:r>
         <w:r>
           <w:rPr>
@@ -5879,7 +5887,7 @@
             <w:noProof/>
             <w:webHidden/>
           </w:rPr>
-          <w:t>69</w:t>
+          <w:t>70</w:t>
         </w:r>
         <w:r>
           <w:rPr>
@@ -5900,7 +5908,7 @@
           <w:szCs w:val="22"/>
         </w:rPr>
       </w:pPr>
-      <w:hyperlink w:anchor="_Toc169609351" w:history="1">
+      <w:hyperlink w:anchor="_Toc170138174" w:history="1">
         <w:r>
           <w:rPr>
             <w:rStyle w:val="Hyperlink"/>
@@ -5945,7 +5953,7 @@
             <w:noProof/>
             <w:webHidden/>
           </w:rPr>
-          <w:instrText xml:space="preserve"> PAGEREF _Toc169609351 \h </w:instrText>
+          <w:instrText xml:space="preserve"> PAGEREF _Toc170138174 \h </w:instrText>
         </w:r>
         <w:r>
           <w:rPr>
@@ -5965,7 +5973,7 @@
             <w:noProof/>
             <w:webHidden/>
           </w:rPr>
-          <w:t>70</w:t>
+          <w:t>71</w:t>
         </w:r>
         <w:r>
           <w:rPr>
@@ -5986,7 +5994,7 @@
           <w:szCs w:val="22"/>
         </w:rPr>
       </w:pPr>
-      <w:hyperlink w:anchor="_Toc169609352" w:history="1">
+      <w:hyperlink w:anchor="_Toc170138175" w:history="1">
         <w:r>
           <w:rPr>
             <w:rStyle w:val="Hyperlink"/>
@@ -6031,7 +6039,7 @@
             <w:noProof/>
             <w:webHidden/>
           </w:rPr>
-          <w:instrText xml:space="preserve"> PAGEREF _Toc169609352 \h </w:instrText>
+          <w:instrText xml:space="preserve"> PAGEREF _Toc170138175 \h </w:instrText>
         </w:r>
         <w:r>
           <w:rPr>
@@ -6051,7 +6059,7 @@
             <w:noProof/>
             <w:webHidden/>
           </w:rPr>
-          <w:t>72</w:t>
+          <w:t>74</w:t>
         </w:r>
         <w:r>
           <w:rPr>
@@ -6072,7 +6080,7 @@
           <w:szCs w:val="22"/>
         </w:rPr>
       </w:pPr>
-      <w:hyperlink w:anchor="_Toc169609353" w:history="1">
+      <w:hyperlink w:anchor="_Toc170138176" w:history="1">
         <w:r>
           <w:rPr>
             <w:rStyle w:val="Hyperlink"/>
@@ -6117,7 +6125,7 @@
             <w:noProof/>
             <w:webHidden/>
           </w:rPr>
-          <w:instrText xml:space="preserve"> PAGEREF _Toc169609353 \h </w:instrText>
+          <w:instrText xml:space="preserve"> PAGEREF _Toc170138176 \h </w:instrText>
         </w:r>
         <w:r>
           <w:rPr>
@@ -6137,7 +6145,7 @@
             <w:noProof/>
             <w:webHidden/>
           </w:rPr>
-          <w:t>74</w:t>
+          <w:t>76</w:t>
         </w:r>
         <w:r>
           <w:rPr>
@@ -6158,7 +6166,7 @@
           <w:szCs w:val="22"/>
         </w:rPr>
       </w:pPr>
-      <w:hyperlink w:anchor="_Toc169609354" w:history="1">
+      <w:hyperlink w:anchor="_Toc170138177" w:history="1">
         <w:r>
           <w:rPr>
             <w:rStyle w:val="Hyperlink"/>
@@ -6203,7 +6211,7 @@
             <w:noProof/>
             <w:webHidden/>
           </w:rPr>
-          <w:instrText xml:space="preserve"> PAGEREF _Toc169609354 \h </w:instrText>
+          <w:instrText xml:space="preserve"> PAGEREF _Toc170138177 \h </w:instrText>
         </w:r>
         <w:r>
           <w:rPr>
@@ -6223,7 +6231,7 @@
             <w:noProof/>
             <w:webHidden/>
           </w:rPr>
-          <w:t>75</w:t>
+          <w:t>77</w:t>
         </w:r>
         <w:r>
           <w:rPr>
@@ -6244,7 +6252,7 @@
           <w:szCs w:val="22"/>
         </w:rPr>
       </w:pPr>
-      <w:hyperlink w:anchor="_Toc169609355" w:history="1">
+      <w:hyperlink w:anchor="_Toc170138178" w:history="1">
         <w:r>
           <w:rPr>
             <w:rStyle w:val="Hyperlink"/>
@@ -6289,7 +6297,7 @@
             <w:noProof/>
             <w:webHidden/>
           </w:rPr>
-          <w:instrText xml:space="preserve"> PAGEREF _Toc169609355 \h </w:instrText>
+          <w:instrText xml:space="preserve"> PAGEREF _Toc170138178 \h </w:instrText>
         </w:r>
         <w:r>
           <w:rPr>
@@ -6309,7 +6317,7 @@
             <w:noProof/>
             <w:webHidden/>
           </w:rPr>
-          <w:t>80</w:t>
+          <w:t>82</w:t>
         </w:r>
         <w:r>
           <w:rPr>
@@ -6335,7 +6343,7 @@
           <w:lang w:eastAsia="en-US"/>
         </w:rPr>
       </w:pPr>
-      <w:hyperlink w:anchor="_Toc169609356" w:history="1">
+      <w:hyperlink w:anchor="_Toc170138179" w:history="1">
         <w:r>
           <w:rPr>
             <w:rStyle w:val="Hyperlink"/>
@@ -6379,7 +6387,7 @@
             <w:noProof/>
             <w:webHidden/>
           </w:rPr>
-          <w:instrText xml:space="preserve"> PAGEREF _Toc169609356 \h </w:instrText>
+          <w:instrText xml:space="preserve"> PAGEREF _Toc170138179 \h </w:instrText>
         </w:r>
         <w:r>
           <w:rPr>
@@ -6399,7 +6407,7 @@
             <w:noProof/>
             <w:webHidden/>
           </w:rPr>
-          <w:t>85</w:t>
+          <w:t>87</w:t>
         </w:r>
         <w:r>
           <w:rPr>
@@ -6417,14 +6425,14 @@
       <w:r>
         <w:fldChar w:fldCharType="end"/>
       </w:r>
-      <w:bookmarkStart w:id="1" w:name="_Toc169609286"/>
+      <w:bookmarkStart w:id="2" w:name="_Toc170138109"/>
       <w:r>
         <w:t>I</w:t>
       </w:r>
       <w:r>
         <w:t>ntroduction</w:t>
       </w:r>
-      <w:bookmarkEnd w:id="1"/>
+      <w:bookmarkEnd w:id="2"/>
     </w:p>
     <w:p>
       <w:pPr>
@@ -6463,15 +6471,7 @@
         <w:t xml:space="preserve"> in FieldWorks version 9.1.25</w:t>
       </w:r>
       <w:r>
-        <w:t xml:space="preserve">, mainly stored in an </w:t>
-      </w:r>
-      <w:proofErr w:type="gramStart"/>
-      <w:r>
-        <w:t>XML .fwdata</w:t>
-      </w:r>
-      <w:proofErr w:type="gramEnd"/>
-      <w:r>
-        <w:t xml:space="preserve"> file in the project directory. It covers the basic conceptual model for processing different types of data.</w:t>
+        <w:t>, mainly stored in an XML .fwdata file in the project directory. It covers the basic conceptual model for processing different types of data.</w:t>
       </w:r>
       <w:r>
         <w:t xml:space="preserve"> A corresponding FLEx project, “FLEx Conceptual Model sample project” demonstrates all of the items discussed in this document</w:t>
@@ -6532,15 +6532,7 @@
         <w:pStyle w:val="BodyText"/>
       </w:pPr>
       <w:r>
-        <w:t xml:space="preserve">Data for a language project is stored in a folder, normally under c:\ProgramData\SIL\FieldWorks\Projects. The data is stored in a single XML file with </w:t>
-      </w:r>
-      <w:proofErr w:type="gramStart"/>
-      <w:r>
-        <w:t>a .fwdata</w:t>
-      </w:r>
-      <w:proofErr w:type="gramEnd"/>
-      <w:r>
-        <w:t xml:space="preserve"> </w:t>
+        <w:t xml:space="preserve">Data for a language project is stored in a folder, normally under c:\ProgramData\SIL\FieldWorks\Projects. The data is stored in a single XML file with a .fwdata </w:t>
       </w:r>
       <w:r>
         <w:t xml:space="preserve">file </w:t>
@@ -6658,7 +6650,7 @@
       <w:pPr>
         <w:pStyle w:val="Heading1"/>
       </w:pPr>
-      <w:bookmarkStart w:id="2" w:name="_Toc169609287"/>
+      <w:bookmarkStart w:id="3" w:name="_Toc170138110"/>
       <w:r>
         <w:t xml:space="preserve">Basic </w:t>
       </w:r>
@@ -6668,7 +6660,7 @@
       <w:r>
         <w:t>oncepts</w:t>
       </w:r>
-      <w:bookmarkEnd w:id="2"/>
+      <w:bookmarkEnd w:id="3"/>
     </w:p>
     <w:p>
       <w:pPr>
@@ -6944,11 +6936,11 @@
       <w:pPr>
         <w:pStyle w:val="Heading2"/>
       </w:pPr>
-      <w:bookmarkStart w:id="3" w:name="_Toc169609288"/>
+      <w:bookmarkStart w:id="4" w:name="_Toc170138111"/>
       <w:r>
         <w:t>Classes and properties</w:t>
       </w:r>
-      <w:bookmarkEnd w:id="3"/>
+      <w:bookmarkEnd w:id="4"/>
     </w:p>
     <w:p>
       <w:pPr>
@@ -7089,15 +7081,7 @@
         <w:t>if editing</w:t>
       </w:r>
       <w:r>
-        <w:t xml:space="preserve"> fwdata. Each object is </w:t>
-      </w:r>
-      <w:proofErr w:type="gramStart"/>
-      <w:r>
-        <w:t>an</w:t>
-      </w:r>
-      <w:proofErr w:type="gramEnd"/>
-      <w:r>
-        <w:t xml:space="preserve"> rt element</w:t>
+        <w:t xml:space="preserve"> fwdata. Each object is an rt element</w:t>
       </w:r>
       <w:r>
         <w:t xml:space="preserve"> in scattered locations in the file</w:t>
@@ -7129,15 +7113,7 @@
         <w:t xml:space="preserve">IDs, often abbreviated as flid for field ID in code. </w:t>
       </w:r>
       <w:r>
-        <w:t xml:space="preserve">The flid includes the 4-digit class id followed by a </w:t>
-      </w:r>
-      <w:proofErr w:type="gramStart"/>
-      <w:r>
-        <w:t>3 digit</w:t>
-      </w:r>
-      <w:proofErr w:type="gramEnd"/>
-      <w:r>
-        <w:t xml:space="preserve"> field number. For example, a Definition on LexSense has a flid of 5016005</w:t>
+        <w:t>The flid includes the 4-digit class id followed by a 3 digit field number. For example, a Definition on LexSense has a flid of 5016005</w:t>
       </w:r>
     </w:p>
     <w:p>
@@ -7190,11 +7166,11 @@
       <w:pPr>
         <w:pStyle w:val="Heading2"/>
       </w:pPr>
-      <w:bookmarkStart w:id="4" w:name="_Toc169609289"/>
+      <w:bookmarkStart w:id="5" w:name="_Toc170138112"/>
       <w:r>
         <w:t>Writing systems</w:t>
       </w:r>
-      <w:bookmarkEnd w:id="4"/>
+      <w:bookmarkEnd w:id="5"/>
     </w:p>
     <w:p>
       <w:pPr>
@@ -7294,15 +7270,7 @@
         <w:t xml:space="preserve">specification </w:t>
       </w:r>
       <w:r>
-        <w:t xml:space="preserve">in files </w:t>
-      </w:r>
-      <w:proofErr w:type="gramStart"/>
-      <w:r>
-        <w:t>with .ldml</w:t>
-      </w:r>
-      <w:proofErr w:type="gramEnd"/>
-      <w:r>
-        <w:t xml:space="preserve"> as the extension. Unicode Technical Standard #35 describes this </w:t>
+        <w:t xml:space="preserve">in files with .ldml as the extension. Unicode Technical Standard #35 describes this </w:t>
       </w:r>
       <w:r>
         <w:lastRenderedPageBreak/>
@@ -7464,18 +7432,10 @@
         <w:t xml:space="preserve"> writing system file is en-Latn-US</w:t>
       </w:r>
       <w:r>
-        <w:t>-x-</w:t>
-      </w:r>
-      <w:proofErr w:type="gramStart"/>
-      <w:r>
-        <w:t>sci</w:t>
-      </w:r>
-      <w:r>
-        <w:t>.ldml</w:t>
-      </w:r>
-      <w:proofErr w:type="gramEnd"/>
-      <w:r>
-        <w:t>.</w:t>
+        <w:t>-x-sci</w:t>
+      </w:r>
+      <w:r>
+        <w:t>.ldml.</w:t>
       </w:r>
     </w:p>
     <w:p>
@@ -7516,15 +7476,7 @@
         <w:t xml:space="preserve">, </w:t>
       </w:r>
       <w:r>
-        <w:t xml:space="preserve">FLEx will leave the en-Latn data in fwdata, and </w:t>
-      </w:r>
-      <w:proofErr w:type="gramStart"/>
-      <w:r>
-        <w:t>en.ldml</w:t>
-      </w:r>
-      <w:proofErr w:type="gramEnd"/>
-      <w:r>
-        <w:t xml:space="preserve"> and en-Latn.ldml, but the latter only has </w:t>
+        <w:t xml:space="preserve">FLEx will leave the en-Latn data in fwdata, and en.ldml and en-Latn.ldml, but the latter only has </w:t>
       </w:r>
       <w:r>
         <w:t>language type="en" /&gt;</w:t>
@@ -7788,15 +7740,7 @@
         <w:br/>
       </w:r>
       <w:r>
-        <w:t xml:space="preserve">      &lt;LanguageName&gt;Tonga (Nyasa) (tog-Latn-018-x-</w:t>
-      </w:r>
-      <w:proofErr w:type="gramStart"/>
-      <w:r>
-        <w:t>leya)&lt;</w:t>
-      </w:r>
-      <w:proofErr w:type="gramEnd"/>
-      <w:r>
-        <w:t>/LanguageName&gt;</w:t>
+        <w:t xml:space="preserve">      &lt;LanguageName&gt;Tonga (Nyasa) (tog-Latn-018-x-leya)&lt;/LanguageName&gt;</w:t>
       </w:r>
       <w:r>
         <w:br/>
@@ -7835,11 +7779,11 @@
       <w:pPr>
         <w:pStyle w:val="Heading2"/>
       </w:pPr>
-      <w:bookmarkStart w:id="5" w:name="_Toc169609290"/>
+      <w:bookmarkStart w:id="6" w:name="_Toc170138113"/>
       <w:r>
         <w:t>Basic properties</w:t>
       </w:r>
-      <w:bookmarkEnd w:id="5"/>
+      <w:bookmarkEnd w:id="6"/>
     </w:p>
     <w:p>
       <w:pPr>
@@ -7853,14 +7797,14 @@
       <w:pPr>
         <w:pStyle w:val="Heading3"/>
       </w:pPr>
-      <w:bookmarkStart w:id="6" w:name="_Toc318113549"/>
-      <w:bookmarkStart w:id="7" w:name="_Toc169609291"/>
+      <w:bookmarkStart w:id="7" w:name="_Toc318113549"/>
+      <w:bookmarkStart w:id="8" w:name="_Toc170138114"/>
       <w:r>
         <w:lastRenderedPageBreak/>
         <w:t>Strings</w:t>
       </w:r>
-      <w:bookmarkEnd w:id="6"/>
       <w:bookmarkEnd w:id="7"/>
+      <w:bookmarkEnd w:id="8"/>
     </w:p>
     <w:p>
       <w:pPr>
@@ -7994,13 +7938,13 @@
       <w:pPr>
         <w:pStyle w:val="Heading4"/>
       </w:pPr>
-      <w:bookmarkStart w:id="8" w:name="_Toc318113550"/>
-      <w:bookmarkStart w:id="9" w:name="_Toc169609292"/>
+      <w:bookmarkStart w:id="9" w:name="_Toc318113550"/>
+      <w:bookmarkStart w:id="10" w:name="_Toc170138115"/>
       <w:r>
         <w:t>Unicode</w:t>
       </w:r>
-      <w:bookmarkEnd w:id="8"/>
       <w:bookmarkEnd w:id="9"/>
+      <w:bookmarkEnd w:id="10"/>
     </w:p>
     <w:p>
       <w:pPr>
@@ -8101,7 +8045,7 @@
       <w:r>
         <w:t>he FieldWorks display mechanism shows boxes for characters that are not in the current font rather than substituting other fonts as needed. FieldWorks generally chooses a writing system representing the system language on your computer, if the writing system exists, otherwise it defaults to English when displaying these strings.</w:t>
       </w:r>
-      <w:bookmarkStart w:id="10" w:name="_Toc318113551"/>
+      <w:bookmarkStart w:id="11" w:name="_Toc318113551"/>
     </w:p>
     <w:p>
       <w:pPr>
@@ -8161,14 +8105,14 @@
       <w:pPr>
         <w:pStyle w:val="Heading4"/>
       </w:pPr>
-      <w:bookmarkStart w:id="11" w:name="_Ref162943041"/>
-      <w:bookmarkStart w:id="12" w:name="_Toc169609293"/>
+      <w:bookmarkStart w:id="12" w:name="_Ref162943041"/>
+      <w:bookmarkStart w:id="13" w:name="_Toc170138116"/>
       <w:r>
         <w:t>String</w:t>
       </w:r>
-      <w:bookmarkEnd w:id="10"/>
       <w:bookmarkEnd w:id="11"/>
       <w:bookmarkEnd w:id="12"/>
+      <w:bookmarkEnd w:id="13"/>
     </w:p>
     <w:p>
       <w:pPr>
@@ -8215,15 +8159,7 @@
       </w:r>
       <w:r>
         <w:br/>
-        <w:t xml:space="preserve">&lt;Run ws="en"&gt;A contraction is a combination of two lexemes, each of which maintains its own </w:t>
-      </w:r>
-      <w:proofErr w:type="gramStart"/>
-      <w:r>
-        <w:t>meaning.&lt;</w:t>
-      </w:r>
-      <w:proofErr w:type="gramEnd"/>
-      <w:r>
-        <w:t>/Run&gt;</w:t>
+        <w:t>&lt;Run ws="en"&gt;A contraction is a combination of two lexemes, each of which maintains its own meaning.&lt;/Run&gt;</w:t>
       </w:r>
       <w:r>
         <w:br/>
@@ -8397,11 +8333,7 @@
         <w:br/>
       </w:r>
       <w:r>
-        <w:t>&lt;Run ws="en"</w:t>
-      </w:r>
-      <w:proofErr w:type="gramStart"/>
-      <w:r>
-        <w:t>&gt;</w:t>
+        <w:t>&lt;Run ws="en"&gt;</w:t>
       </w:r>
       <w:r>
         <w:rPr>
@@ -8410,11 +8342,7 @@
         <w:t>]</w:t>
       </w:r>
       <w:r>
-        <w:t>&lt;</w:t>
-      </w:r>
-      <w:proofErr w:type="gramEnd"/>
-      <w:r>
-        <w:t>/Run&gt;</w:t>
+        <w:t>&lt;/Run&gt;</w:t>
       </w:r>
       <w:r>
         <w:br/>
@@ -8513,15 +8441,7 @@
       </w:r>
       <w:r>
         <w:br/>
-        <w:t>&lt;Run ws="en"</w:t>
-      </w:r>
-      <w:proofErr w:type="gramStart"/>
-      <w:r>
-        <w:t>&gt;.&lt;</w:t>
-      </w:r>
-      <w:proofErr w:type="gramEnd"/>
-      <w:r>
-        <w:t>/Run&gt;</w:t>
+        <w:t>&lt;Run ws="en"&gt;.&lt;/Run&gt;</w:t>
       </w:r>
       <w:r>
         <w:br/>
@@ -8536,13 +8456,13 @@
       <w:pPr>
         <w:pStyle w:val="Heading4"/>
       </w:pPr>
-      <w:bookmarkStart w:id="13" w:name="_Toc318113552"/>
-      <w:bookmarkStart w:id="14" w:name="_Toc169609294"/>
+      <w:bookmarkStart w:id="14" w:name="_Toc318113552"/>
+      <w:bookmarkStart w:id="15" w:name="_Toc170138117"/>
       <w:r>
         <w:t>MultiUnicode</w:t>
       </w:r>
-      <w:bookmarkEnd w:id="13"/>
       <w:bookmarkEnd w:id="14"/>
+      <w:bookmarkEnd w:id="15"/>
     </w:p>
     <w:p>
       <w:pPr>
@@ -8594,13 +8514,13 @@
       <w:pPr>
         <w:pStyle w:val="Heading4"/>
       </w:pPr>
-      <w:bookmarkStart w:id="15" w:name="_Toc318113553"/>
-      <w:bookmarkStart w:id="16" w:name="_Toc169609295"/>
+      <w:bookmarkStart w:id="16" w:name="_Toc318113553"/>
+      <w:bookmarkStart w:id="17" w:name="_Toc170138118"/>
       <w:r>
         <w:t>MultiString</w:t>
       </w:r>
-      <w:bookmarkEnd w:id="15"/>
       <w:bookmarkEnd w:id="16"/>
+      <w:bookmarkEnd w:id="17"/>
     </w:p>
     <w:p>
       <w:pPr>
@@ -8613,15 +8533,7 @@
         <w:t xml:space="preserve"> (e.g., definition, example sentence, example translations, all note fields)</w:t>
       </w:r>
       <w:r>
-        <w:t xml:space="preserve">. Here </w:t>
-      </w:r>
-      <w:proofErr w:type="gramStart"/>
-      <w:r>
-        <w:t>is</w:t>
-      </w:r>
-      <w:proofErr w:type="gramEnd"/>
-      <w:r>
-        <w:t xml:space="preserve"> how these MultiString properties are encoded.</w:t>
+        <w:t>. Here is how these MultiString properties are encoded.</w:t>
       </w:r>
     </w:p>
     <w:p>
@@ -8637,15 +8549,7 @@
       </w:r>
       <w:r>
         <w:br/>
-        <w:t xml:space="preserve">&lt;Run ws="en"&gt;You may damage the </w:t>
-      </w:r>
-      <w:proofErr w:type="gramStart"/>
-      <w:r>
-        <w:t>computer.&lt;</w:t>
-      </w:r>
-      <w:proofErr w:type="gramEnd"/>
-      <w:r>
-        <w:t>/Run&gt;</w:t>
+        <w:t>&lt;Run ws="en"&gt;You may damage the computer.&lt;/Run&gt;</w:t>
       </w:r>
       <w:r>
         <w:br/>
@@ -8708,11 +8612,11 @@
       <w:pPr>
         <w:pStyle w:val="Heading3"/>
       </w:pPr>
-      <w:bookmarkStart w:id="17" w:name="_Toc169609296"/>
+      <w:bookmarkStart w:id="18" w:name="_Toc170138119"/>
       <w:r>
         <w:t>Binary</w:t>
       </w:r>
-      <w:bookmarkEnd w:id="17"/>
+      <w:bookmarkEnd w:id="18"/>
     </w:p>
     <w:p>
       <w:pPr>
@@ -8769,11 +8673,11 @@
       <w:pPr>
         <w:pStyle w:val="Heading3"/>
       </w:pPr>
-      <w:bookmarkStart w:id="18" w:name="_Toc169609297"/>
+      <w:bookmarkStart w:id="19" w:name="_Toc170138120"/>
       <w:r>
         <w:t>Boolean</w:t>
       </w:r>
-      <w:bookmarkEnd w:id="18"/>
+      <w:bookmarkEnd w:id="19"/>
     </w:p>
     <w:p>
       <w:pPr>
@@ -8803,13 +8707,13 @@
       <w:pPr>
         <w:pStyle w:val="Heading3"/>
       </w:pPr>
-      <w:bookmarkStart w:id="19" w:name="_Ref163130885"/>
-      <w:bookmarkStart w:id="20" w:name="_Toc169609298"/>
+      <w:bookmarkStart w:id="20" w:name="_Ref163130885"/>
+      <w:bookmarkStart w:id="21" w:name="_Toc170138121"/>
       <w:r>
         <w:t>GenDate</w:t>
       </w:r>
-      <w:bookmarkEnd w:id="19"/>
       <w:bookmarkEnd w:id="20"/>
+      <w:bookmarkEnd w:id="21"/>
     </w:p>
     <w:p>
       <w:pPr>
@@ -8905,12 +8809,12 @@
       <w:pPr>
         <w:pStyle w:val="Heading3"/>
       </w:pPr>
-      <w:bookmarkStart w:id="21" w:name="_Toc169609299"/>
+      <w:bookmarkStart w:id="22" w:name="_Toc170138122"/>
       <w:r>
         <w:lastRenderedPageBreak/>
         <w:t>Guid</w:t>
       </w:r>
-      <w:bookmarkEnd w:id="21"/>
+      <w:bookmarkEnd w:id="22"/>
     </w:p>
     <w:p>
       <w:pPr>
@@ -8957,11 +8861,11 @@
       <w:pPr>
         <w:pStyle w:val="Heading3"/>
       </w:pPr>
-      <w:bookmarkStart w:id="22" w:name="_Toc169609300"/>
+      <w:bookmarkStart w:id="23" w:name="_Toc170138123"/>
       <w:r>
         <w:t>Integer</w:t>
       </w:r>
-      <w:bookmarkEnd w:id="22"/>
+      <w:bookmarkEnd w:id="23"/>
     </w:p>
     <w:p>
       <w:pPr>
@@ -9009,11 +8913,11 @@
       <w:pPr>
         <w:pStyle w:val="Heading3"/>
       </w:pPr>
-      <w:bookmarkStart w:id="23" w:name="_Toc169609301"/>
+      <w:bookmarkStart w:id="24" w:name="_Toc170138124"/>
       <w:r>
         <w:t>TextPropBinary</w:t>
       </w:r>
-      <w:bookmarkEnd w:id="23"/>
+      <w:bookmarkEnd w:id="24"/>
     </w:p>
     <w:p>
       <w:pPr>
@@ -9642,12 +9546,12 @@
       <w:pPr>
         <w:pStyle w:val="Heading3"/>
       </w:pPr>
-      <w:bookmarkStart w:id="24" w:name="_Toc169609302"/>
+      <w:bookmarkStart w:id="25" w:name="_Toc170138125"/>
       <w:r>
         <w:lastRenderedPageBreak/>
         <w:t>Time</w:t>
       </w:r>
-      <w:bookmarkEnd w:id="24"/>
+      <w:bookmarkEnd w:id="25"/>
     </w:p>
     <w:p>
       <w:pPr>
@@ -9682,13 +9586,8 @@
         <w:pStyle w:val="BodyText"/>
       </w:pPr>
       <w:r>
-        <w:t>This is the DateModified property on CmMajorObject. The time is stored in the “val” attribute in the format YYYY-MM-DD HH:</w:t>
-      </w:r>
-      <w:proofErr w:type="gramStart"/>
-      <w:r>
-        <w:t>MM:SS.TTT</w:t>
-      </w:r>
-      <w:proofErr w:type="gramEnd"/>
+        <w:t>This is the DateModified property on CmMajorObject. The time is stored in the “val” attribute in the format YYYY-MM-DD HH:MM:SS.TTT</w:t>
+      </w:r>
       <w:r>
         <w:t xml:space="preserve"> </w:t>
       </w:r>
@@ -9712,14 +9611,14 @@
       <w:pPr>
         <w:pStyle w:val="Heading2"/>
       </w:pPr>
-      <w:bookmarkStart w:id="25" w:name="_Toc169609303"/>
+      <w:bookmarkStart w:id="26" w:name="_Toc170138126"/>
       <w:r>
         <w:t>Linking</w:t>
       </w:r>
       <w:r>
         <w:t xml:space="preserve"> properties</w:t>
       </w:r>
-      <w:bookmarkEnd w:id="25"/>
+      <w:bookmarkEnd w:id="26"/>
     </w:p>
     <w:p>
       <w:pPr>
@@ -9864,11 +9763,11 @@
       <w:pPr>
         <w:pStyle w:val="Heading2"/>
       </w:pPr>
-      <w:bookmarkStart w:id="26" w:name="_Toc169609304"/>
+      <w:bookmarkStart w:id="27" w:name="_Toc170138127"/>
       <w:r>
         <w:t>Owning relationships</w:t>
       </w:r>
-      <w:bookmarkEnd w:id="26"/>
+      <w:bookmarkEnd w:id="27"/>
     </w:p>
     <w:p>
       <w:pPr>
@@ -10390,11 +10289,11 @@
       <w:pPr>
         <w:pStyle w:val="Heading2"/>
       </w:pPr>
-      <w:bookmarkStart w:id="27" w:name="_Toc169609305"/>
+      <w:bookmarkStart w:id="28" w:name="_Toc170138128"/>
       <w:r>
         <w:t>Reference relationships</w:t>
       </w:r>
-      <w:bookmarkEnd w:id="27"/>
+      <w:bookmarkEnd w:id="28"/>
     </w:p>
     <w:p>
       <w:pPr>
@@ -10724,15 +10623,7 @@
         <w:t>the deleted</w:t>
       </w:r>
       <w:r>
-        <w:t xml:space="preserve"> object are removed from the referring objects. If something goes wrong and a reference property points to a non-existent object, FLEx will likely crash at some point. The problem can be fixed easily by closing the project, opening another project and running Tools &gt; Utilities &gt; Find and </w:t>
-      </w:r>
-      <w:proofErr w:type="gramStart"/>
-      <w:r>
-        <w:t>fix..</w:t>
-      </w:r>
-      <w:proofErr w:type="gramEnd"/>
-      <w:r>
-        <w:t xml:space="preserve"> and specify the desired project. This will remove any orphaned owning and reference links.</w:t>
+        <w:t xml:space="preserve"> object are removed from the referring objects. If something goes wrong and a reference property points to a non-existent object, FLEx will likely crash at some point. The problem can be fixed easily by closing the project, opening another project and running Tools &gt; Utilities &gt; Find and fix.. and specify the desired project. This will remove any orphaned owning and reference links.</w:t>
       </w:r>
       <w:r>
         <w:t xml:space="preserve"> In the fwdata file, you would remove any orphaned objsur links. If it’s the only link, remove the reference </w:t>
@@ -10748,11 +10639,11 @@
       <w:pPr>
         <w:pStyle w:val="Heading2"/>
       </w:pPr>
-      <w:bookmarkStart w:id="28" w:name="_Toc169609306"/>
+      <w:bookmarkStart w:id="29" w:name="_Toc170138129"/>
       <w:r>
         <w:t>Styles</w:t>
       </w:r>
-      <w:bookmarkEnd w:id="28"/>
+      <w:bookmarkEnd w:id="29"/>
     </w:p>
     <w:p>
       <w:pPr>
@@ -10954,26 +10845,18 @@
       <w:pPr>
         <w:pStyle w:val="Heading2"/>
       </w:pPr>
-      <w:bookmarkStart w:id="29" w:name="_Toc169609307"/>
+      <w:bookmarkStart w:id="30" w:name="_Toc170138130"/>
       <w:r>
         <w:t>Possibility lists</w:t>
       </w:r>
-      <w:bookmarkEnd w:id="29"/>
-    </w:p>
-    <w:p>
-      <w:pPr>
-        <w:pStyle w:val="BodyText"/>
-      </w:pPr>
-      <w:r>
-        <w:t xml:space="preserve">Rather than letting </w:t>
-      </w:r>
-      <w:proofErr w:type="gramStart"/>
-      <w:r>
-        <w:t>users</w:t>
-      </w:r>
-      <w:proofErr w:type="gramEnd"/>
-      <w:r>
-        <w:t xml:space="preserve"> type (and mistype) fixed lists</w:t>
+      <w:bookmarkEnd w:id="30"/>
+    </w:p>
+    <w:p>
+      <w:pPr>
+        <w:pStyle w:val="BodyText"/>
+      </w:pPr>
+      <w:r>
+        <w:t>Rather than letting users type (and mistype) fixed lists</w:t>
       </w:r>
       <w:r>
         <w:t xml:space="preserve">, </w:t>
@@ -11999,15 +11882,7 @@
               <w:pStyle w:val="Tablecells"/>
             </w:pPr>
             <w:r>
-              <w:t xml:space="preserve">Category (Parts </w:t>
-            </w:r>
-            <w:proofErr w:type="gramStart"/>
-            <w:r>
-              <w:t>Of</w:t>
-            </w:r>
-            <w:proofErr w:type="gramEnd"/>
-            <w:r>
-              <w:t xml:space="preserve"> Speech)</w:t>
+              <w:t>Category (Parts Of Speech)</w:t>
             </w:r>
           </w:p>
         </w:tc>
@@ -13197,12 +13072,12 @@
       <w:pPr>
         <w:pStyle w:val="Heading2"/>
       </w:pPr>
-      <w:bookmarkStart w:id="30" w:name="_Toc169609308"/>
+      <w:bookmarkStart w:id="31" w:name="_Toc170138131"/>
       <w:r>
         <w:lastRenderedPageBreak/>
         <w:t>Custom fields</w:t>
       </w:r>
-      <w:bookmarkEnd w:id="30"/>
+      <w:bookmarkEnd w:id="31"/>
     </w:p>
     <w:p>
       <w:pPr>
@@ -13809,15 +13684,7 @@
       </w:r>
       <w:r>
         <w:br/>
-        <w:t xml:space="preserve">&lt;Run ws="en"&gt;This is the field </w:t>
-      </w:r>
-      <w:proofErr w:type="gramStart"/>
-      <w:r>
-        <w:t>content.&lt;</w:t>
-      </w:r>
-      <w:proofErr w:type="gramEnd"/>
-      <w:r>
-        <w:t>/Run&gt;</w:t>
+        <w:t>&lt;Run ws="en"&gt;This is the field content.&lt;/Run&gt;</w:t>
       </w:r>
       <w:r>
         <w:br/>
@@ -13951,11 +13818,11 @@
       <w:pPr>
         <w:pStyle w:val="Heading2"/>
       </w:pPr>
-      <w:bookmarkStart w:id="31" w:name="_Toc169609309"/>
+      <w:bookmarkStart w:id="32" w:name="_Toc170138132"/>
       <w:r>
         <w:t>Send/Receive Data</w:t>
       </w:r>
-      <w:bookmarkEnd w:id="31"/>
+      <w:bookmarkEnd w:id="32"/>
     </w:p>
     <w:p>
       <w:pPr>
@@ -14199,16 +14066,11 @@
         <w:t xml:space="preserve">Heres </w:t>
       </w:r>
       <w:r>
-        <w:t xml:space="preserve">how this entry would be stored </w:t>
-      </w:r>
-      <w:proofErr w:type="gramStart"/>
-      <w:r>
-        <w:t>in</w:t>
+        <w:t>how this entry would be stored in</w:t>
       </w:r>
       <w:r>
         <w:t xml:space="preserve"> .fwdata</w:t>
       </w:r>
-      <w:proofErr w:type="gramEnd"/>
       <w:r>
         <w:t xml:space="preserve"> with some extra fields removed</w:t>
       </w:r>
@@ -14578,15 +14440,7 @@
         <w:pStyle w:val="BodyText"/>
       </w:pPr>
       <w:r>
-        <w:t xml:space="preserve">Here’s the same sample in </w:t>
-      </w:r>
-      <w:proofErr w:type="gramStart"/>
-      <w:r>
-        <w:t>a .lexdb</w:t>
-      </w:r>
-      <w:proofErr w:type="gramEnd"/>
-      <w:r>
-        <w:t xml:space="preserve"> file</w:t>
+        <w:t>Here’s the same sample in a .lexdb file</w:t>
       </w:r>
       <w:r>
         <w:t xml:space="preserve"> used in Send/Receive</w:t>
@@ -15150,11 +15004,11 @@
       <w:pPr>
         <w:pStyle w:val="Heading1"/>
       </w:pPr>
-      <w:bookmarkStart w:id="32" w:name="_Toc169609310"/>
+      <w:bookmarkStart w:id="33" w:name="_Toc170138133"/>
       <w:r>
         <w:t>Conceptual model resources</w:t>
       </w:r>
-      <w:bookmarkEnd w:id="32"/>
+      <w:bookmarkEnd w:id="33"/>
     </w:p>
     <w:p>
       <w:pPr>
@@ -15260,15 +15114,7 @@
         <w:t xml:space="preserve">by typing Zedit into Windows Start or find it </w:t>
       </w:r>
       <w:r>
-        <w:t xml:space="preserve">in c:\Program Files\SIL\FieldWorks 9. </w:t>
-      </w:r>
-      <w:proofErr w:type="gramStart"/>
-      <w:r>
-        <w:t>It</w:t>
-      </w:r>
-      <w:proofErr w:type="gramEnd"/>
-      <w:r>
-        <w:t xml:space="preserve"> </w:t>
+        <w:t xml:space="preserve">in c:\Program Files\SIL\FieldWorks 9. It </w:t>
       </w:r>
       <w:r>
         <w:t>memory-maps the data when a file is opened, so it can open large fwdata files very quickly and can be used to make changes. Just be sure to close the fwdata file before trying to do anything in FLEx that tries to update fwdata, or FLEx will be blocked. Notepad++ takes a lot longer to open a file, but it can remain open while FLEx is being used. One of its advantages is supporting regex for search and replace. In any text editor you can find the desired class by searching for</w:t>
@@ -15288,14 +15134,14 @@
       <w:pPr>
         <w:pStyle w:val="Heading2"/>
       </w:pPr>
-      <w:bookmarkStart w:id="33" w:name="_Toc169609311"/>
+      <w:bookmarkStart w:id="34" w:name="_Toc170138134"/>
       <w:r>
         <w:t>M</w:t>
       </w:r>
       <w:r>
         <w:t>odel diagram chm</w:t>
       </w:r>
-      <w:bookmarkEnd w:id="33"/>
+      <w:bookmarkEnd w:id="34"/>
     </w:p>
     <w:p>
       <w:pPr>
@@ -15434,15 +15280,7 @@
         <w:t>, usually at the destination,</w:t>
       </w:r>
       <w:r>
-        <w:t xml:space="preserve"> there is a number indicating how many objects can be linked with this property. 1 means it’s atomic and </w:t>
-      </w:r>
-      <w:proofErr w:type="gramStart"/>
-      <w:r>
-        <w:t>0..</w:t>
-      </w:r>
-      <w:proofErr w:type="gramEnd"/>
-      <w:r>
-        <w:t>* means it’s a sequence or a collection. A sequence property has (ordered) along the line.</w:t>
+        <w:t xml:space="preserve"> there is a number indicating how many objects can be linked with this property. 1 means it’s atomic and 0..* means it’s a sequence or a collection. A sequence property has (ordered) along the line.</w:t>
       </w:r>
       <w:r>
         <w:t xml:space="preserve"> The property name is given above the line, usually at the source. Class hierarchy is shown sometimes, but not always.</w:t>
@@ -15642,14 +15480,14 @@
       <w:pPr>
         <w:pStyle w:val="Heading2"/>
       </w:pPr>
-      <w:bookmarkStart w:id="34" w:name="_Toc169609312"/>
+      <w:bookmarkStart w:id="35" w:name="_Toc170138135"/>
       <w:r>
         <w:t>M</w:t>
       </w:r>
       <w:r>
         <w:t>odel class/property spreadsheet</w:t>
       </w:r>
-      <w:bookmarkEnd w:id="34"/>
+      <w:bookmarkEnd w:id="35"/>
     </w:p>
     <w:p>
       <w:pPr>
@@ -15854,15 +15692,7 @@
         <w:t xml:space="preserve"> </w:t>
       </w:r>
       <w:r>
-        <w:t xml:space="preserve">When false, this class cannot be created in code with a </w:t>
-      </w:r>
-      <w:proofErr w:type="gramStart"/>
-      <w:r>
-        <w:t>Create(</w:t>
-      </w:r>
-      <w:proofErr w:type="gramEnd"/>
-      <w:r>
-        <w:t>) method. Check for required parameters in overrides in both the factory and the class overrides</w:t>
+        <w:t>When false, this class cannot be created in code with a Create() method. Check for required parameters in overrides in both the factory and the class overrides</w:t>
       </w:r>
       <w:r>
         <w:t>.</w:t>
@@ -16056,15 +15886,7 @@
         <w:t xml:space="preserve">What are all of the properties for a given class? </w:t>
       </w:r>
       <w:r>
-        <w:t xml:space="preserve">In the Fields tab </w:t>
-      </w:r>
-      <w:proofErr w:type="gramStart"/>
-      <w:r>
-        <w:t>sort</w:t>
-      </w:r>
-      <w:proofErr w:type="gramEnd"/>
-      <w:r>
-        <w:t xml:space="preserve"> the class names and find the class(</w:t>
+        <w:t>In the Fields tab sort the class names and find the class(</w:t>
       </w:r>
       <w:r>
         <w:t>e</w:t>
@@ -16102,13 +15924,13 @@
       <w:pPr>
         <w:pStyle w:val="Heading2"/>
       </w:pPr>
-      <w:bookmarkStart w:id="35" w:name="_Ref162957186"/>
-      <w:bookmarkStart w:id="36" w:name="_Toc169609313"/>
+      <w:bookmarkStart w:id="36" w:name="_Ref162957186"/>
+      <w:bookmarkStart w:id="37" w:name="_Toc170138136"/>
       <w:r>
         <w:t>LCMBrowser</w:t>
       </w:r>
-      <w:bookmarkEnd w:id="35"/>
       <w:bookmarkEnd w:id="36"/>
+      <w:bookmarkEnd w:id="37"/>
     </w:p>
     <w:p>
       <w:pPr>
@@ -16123,7 +15945,6 @@
       <w:r>
         <w:t xml:space="preserve">. </w:t>
       </w:r>
-      <w:proofErr w:type="gramStart"/>
       <w:r>
         <w:t xml:space="preserve">LCMBrowser.exe </w:t>
       </w:r>
@@ -16131,11 +15952,7 @@
         <w:t xml:space="preserve"> </w:t>
       </w:r>
       <w:r>
-        <w:t>is</w:t>
-      </w:r>
-      <w:proofErr w:type="gramEnd"/>
-      <w:r>
-        <w:t xml:space="preserve"> a program that comes with FieldWorks and can be started by </w:t>
+        <w:t xml:space="preserve">is a program that comes with FieldWorks and can be started by </w:t>
       </w:r>
       <w:r>
         <w:t>typing into the Windows start menu or finding it in c:\Program Files\SIL\FieldWorks 9. The program has a tab for showing the current conceptual model.</w:t>
@@ -16154,7 +15971,7 @@
       <w:pPr>
         <w:pStyle w:val="Heading3"/>
       </w:pPr>
-      <w:bookmarkStart w:id="37" w:name="_Toc169609314"/>
+      <w:bookmarkStart w:id="38" w:name="_Toc170138137"/>
       <w:r>
         <w:t xml:space="preserve">LCM </w:t>
       </w:r>
@@ -16164,7 +15981,7 @@
       <w:r>
         <w:t>odel</w:t>
       </w:r>
-      <w:bookmarkEnd w:id="37"/>
+      <w:bookmarkEnd w:id="38"/>
     </w:p>
     <w:p>
       <w:pPr>
@@ -16295,34 +16112,18 @@
       <w:pPr>
         <w:pStyle w:val="Heading3"/>
       </w:pPr>
-      <w:bookmarkStart w:id="38" w:name="_Toc169609315"/>
+      <w:bookmarkStart w:id="39" w:name="_Toc170138138"/>
       <w:r>
         <w:t>LCM data</w:t>
       </w:r>
-      <w:bookmarkEnd w:id="38"/>
-    </w:p>
-    <w:p>
-      <w:pPr>
-        <w:pStyle w:val="BodyText"/>
-      </w:pPr>
-      <w:r>
-        <w:t xml:space="preserve">To see the data in an actual project, choose File &gt; Open Language Project, and navigate to </w:t>
-      </w:r>
-      <w:proofErr w:type="gramStart"/>
-      <w:r>
-        <w:t>an .fwdata</w:t>
-      </w:r>
-      <w:proofErr w:type="gramEnd"/>
-      <w:r>
-        <w:t xml:space="preserve"> file to open. Note, you cannot open a project that is open in FLEx, or one that has </w:t>
-      </w:r>
-      <w:proofErr w:type="gramStart"/>
-      <w:r>
-        <w:t>an .fwdata</w:t>
-      </w:r>
-      <w:proofErr w:type="gramEnd"/>
-      <w:r>
-        <w:t xml:space="preserve">.lock file in the directory. The program will </w:t>
+      <w:bookmarkEnd w:id="39"/>
+    </w:p>
+    <w:p>
+      <w:pPr>
+        <w:pStyle w:val="BodyText"/>
+      </w:pPr>
+      <w:r>
+        <w:t xml:space="preserve">To see the data in an actual project, choose File &gt; Open Language Project, and navigate to an .fwdata file to open. Note, you cannot open a project that is open in FLEx, or one that has an .fwdata.lock file in the directory. The program will </w:t>
       </w:r>
       <w:r>
         <w:t xml:space="preserve">bring up </w:t>
@@ -16614,11 +16415,11 @@
       <w:pPr>
         <w:pStyle w:val="Heading2"/>
       </w:pPr>
-      <w:bookmarkStart w:id="39" w:name="_Toc169609316"/>
+      <w:bookmarkStart w:id="40" w:name="_Toc170138139"/>
       <w:r>
         <w:t>Fieldworks source code</w:t>
       </w:r>
-      <w:bookmarkEnd w:id="39"/>
+      <w:bookmarkEnd w:id="40"/>
     </w:p>
     <w:p>
       <w:pPr>
@@ -16867,11 +16668,11 @@
       <w:pPr>
         <w:pStyle w:val="Heading2"/>
       </w:pPr>
-      <w:bookmarkStart w:id="40" w:name="_Toc169609317"/>
+      <w:bookmarkStart w:id="41" w:name="_Toc170138140"/>
       <w:r>
         <w:t>dnSpy debugger</w:t>
       </w:r>
-      <w:bookmarkEnd w:id="40"/>
+      <w:bookmarkEnd w:id="41"/>
     </w:p>
     <w:p>
       <w:r>
@@ -16986,26 +16787,18 @@
         <w:pStyle w:val="ListNumber"/>
       </w:pPr>
       <w:r>
-        <w:t xml:space="preserve">FieldWorks opens and you can start working. At any </w:t>
-      </w:r>
-      <w:proofErr w:type="gramStart"/>
-      <w:r>
-        <w:t>time</w:t>
-      </w:r>
-      <w:proofErr w:type="gramEnd"/>
-      <w:r>
-        <w:t xml:space="preserve"> you can break execution in the debugger to investigate where it is, look through the stack, set breakpoints, etc. </w:t>
+        <w:t xml:space="preserve">FieldWorks opens and you can start working. At any time you can break execution in the debugger to investigate where it is, look through the stack, set breakpoints, etc. </w:t>
       </w:r>
     </w:p>
     <w:p>
       <w:pPr>
         <w:pStyle w:val="Heading1"/>
       </w:pPr>
-      <w:bookmarkStart w:id="41" w:name="_Toc169609318"/>
+      <w:bookmarkStart w:id="42" w:name="_Toc170138141"/>
       <w:r>
         <w:t>Lexicon model</w:t>
       </w:r>
-      <w:bookmarkEnd w:id="41"/>
+      <w:bookmarkEnd w:id="42"/>
     </w:p>
     <w:p>
       <w:pPr>
@@ -17405,16 +17198,11 @@
         <w:t>I</w:t>
       </w:r>
       <w:r>
-        <w:t xml:space="preserve">LexEntry </w:t>
-      </w:r>
-      <w:proofErr w:type="gramStart"/>
-      <w:r>
-        <w:t>repository.</w:t>
+        <w:t>LexEntry repository.</w:t>
       </w:r>
       <w:r>
         <w:t>.</w:t>
       </w:r>
-      <w:proofErr w:type="gramEnd"/>
     </w:p>
     <w:p>
       <w:pPr>
@@ -17443,11 +17231,11 @@
       <w:pPr>
         <w:pStyle w:val="Heading2"/>
       </w:pPr>
-      <w:bookmarkStart w:id="42" w:name="_Toc169609319"/>
+      <w:bookmarkStart w:id="43" w:name="_Toc170138142"/>
       <w:r>
         <w:t>Entries</w:t>
       </w:r>
-      <w:bookmarkEnd w:id="42"/>
+      <w:bookmarkEnd w:id="43"/>
     </w:p>
     <w:p>
       <w:pPr>
@@ -18414,13 +18202,8 @@
         <w:t>”</w:t>
       </w:r>
       <w:r>
-        <w:t xml:space="preserve"> and Prefix: “</w:t>
-      </w:r>
-      <w:proofErr w:type="gramStart"/>
-      <w:r>
-        <w:t>-“</w:t>
-      </w:r>
-      <w:proofErr w:type="gramEnd"/>
+        <w:t xml:space="preserve"> and Prefix: “-“</w:t>
+      </w:r>
       <w:r>
         <w:t xml:space="preserve">.  </w:t>
       </w:r>
@@ -18483,11 +18266,11 @@
       <w:pPr>
         <w:pStyle w:val="Heading3"/>
       </w:pPr>
-      <w:bookmarkStart w:id="43" w:name="_Toc169609320"/>
+      <w:bookmarkStart w:id="44" w:name="_Toc170138143"/>
       <w:r>
         <w:t>Headwords</w:t>
       </w:r>
-      <w:bookmarkEnd w:id="43"/>
+      <w:bookmarkEnd w:id="44"/>
     </w:p>
     <w:p>
       <w:pPr>
@@ -18651,18 +18434,10 @@
         <w:t xml:space="preserve"> In FLEx, the citation form </w:t>
       </w:r>
       <w:r>
-        <w:t xml:space="preserve">is used for this, but </w:t>
-      </w:r>
-      <w:proofErr w:type="gramStart"/>
-      <w:r>
-        <w:t xml:space="preserve">it </w:t>
-      </w:r>
-      <w:r>
-        <w:t xml:space="preserve"> should</w:t>
-      </w:r>
-      <w:proofErr w:type="gramEnd"/>
-      <w:r>
-        <w:t xml:space="preserve"> only be </w:t>
+        <w:t xml:space="preserve">is used for this, but it </w:t>
+      </w:r>
+      <w:r>
+        <w:t xml:space="preserve"> should only be </w:t>
       </w:r>
       <w:r>
         <w:t>used</w:t>
@@ -18839,13 +18614,13 @@
       <w:pPr>
         <w:pStyle w:val="Heading3"/>
       </w:pPr>
-      <w:bookmarkStart w:id="44" w:name="_Ref164431796"/>
-      <w:bookmarkStart w:id="45" w:name="_Toc169609321"/>
+      <w:bookmarkStart w:id="45" w:name="_Ref164431796"/>
+      <w:bookmarkStart w:id="46" w:name="_Toc170138144"/>
       <w:r>
         <w:t>Pronunciations</w:t>
       </w:r>
-      <w:bookmarkEnd w:id="44"/>
       <w:bookmarkEnd w:id="45"/>
+      <w:bookmarkEnd w:id="46"/>
     </w:p>
     <w:p>
       <w:pPr>
@@ -18938,15 +18713,15 @@
     </w:p>
     <w:p>
       <w:pPr>
-        <w:pStyle w:val="BodyText"/>
+        <w:pStyle w:val="Example"/>
       </w:pPr>
       <w:r>
         <w:rPr>
           <w:noProof/>
         </w:rPr>
         <w:drawing>
-          <wp:inline distT="0" distB="0" distL="0" distR="0" wp14:anchorId="6B2AE742" wp14:editId="5696244D">
-            <wp:extent cx="5943600" cy="2555240"/>
+          <wp:inline distT="0" distB="0" distL="0" distR="0" wp14:anchorId="01EB9DA1" wp14:editId="4765B7B3">
+            <wp:extent cx="5623732" cy="2400300"/>
             <wp:effectExtent l="0" t="0" r="0" b="0"/>
             <wp:docPr id="15" name="Picture 15"/>
             <wp:cNvGraphicFramePr>
@@ -18968,7 +18743,7 @@
                   <pic:spPr>
                     <a:xfrm>
                       <a:off x="0" y="0"/>
-                      <a:ext cx="5943600" cy="2555240"/>
+                      <a:ext cx="5643375" cy="2408684"/>
                     </a:xfrm>
                     <a:prstGeom prst="rect">
                       <a:avLst/>
@@ -19070,11 +18845,11 @@
       <w:pPr>
         <w:pStyle w:val="Heading3"/>
       </w:pPr>
-      <w:bookmarkStart w:id="46" w:name="_Toc169609322"/>
+      <w:bookmarkStart w:id="47" w:name="_Toc170138145"/>
       <w:r>
         <w:t>Etymology</w:t>
       </w:r>
-      <w:bookmarkEnd w:id="46"/>
+      <w:bookmarkEnd w:id="47"/>
     </w:p>
     <w:p>
       <w:pPr>
@@ -19413,11 +19188,11 @@
       <w:pPr>
         <w:pStyle w:val="Heading3"/>
       </w:pPr>
-      <w:bookmarkStart w:id="47" w:name="_Toc169609323"/>
+      <w:bookmarkStart w:id="48" w:name="_Toc170138146"/>
       <w:r>
         <w:t>Allomorphs</w:t>
       </w:r>
-      <w:bookmarkEnd w:id="47"/>
+      <w:bookmarkEnd w:id="48"/>
     </w:p>
     <w:p>
       <w:pPr>
@@ -20020,7 +19795,7 @@
       <w:pPr>
         <w:pStyle w:val="Heading3"/>
       </w:pPr>
-      <w:bookmarkStart w:id="48" w:name="_Toc169609324"/>
+      <w:bookmarkStart w:id="49" w:name="_Toc170138147"/>
       <w:r>
         <w:lastRenderedPageBreak/>
         <w:t>Grammatical information</w:t>
@@ -20028,7 +19803,7 @@
       <w:r>
         <w:t>.</w:t>
       </w:r>
-      <w:bookmarkEnd w:id="48"/>
+      <w:bookmarkEnd w:id="49"/>
     </w:p>
     <w:p>
       <w:pPr>
@@ -20072,11 +19847,11 @@
       <w:pPr>
         <w:pStyle w:val="Heading3"/>
       </w:pPr>
-      <w:bookmarkStart w:id="49" w:name="_Toc169609325"/>
+      <w:bookmarkStart w:id="50" w:name="_Toc170138148"/>
       <w:r>
         <w:t>Messages</w:t>
       </w:r>
-      <w:bookmarkEnd w:id="49"/>
+      <w:bookmarkEnd w:id="50"/>
     </w:p>
     <w:p>
       <w:pPr>
@@ -20337,24 +20112,14 @@
       <w:r>
         <w:t xml:space="preserve">The data for questions is stored in </w:t>
       </w:r>
-      <w:proofErr w:type="gramStart"/>
       <w:r>
         <w:t>Lexicon.fwstub.ChorusNotes</w:t>
       </w:r>
-      <w:proofErr w:type="gramEnd"/>
       <w:r>
         <w:t xml:space="preserve"> in the project folder. The information is stored in annotation elements</w:t>
       </w:r>
       <w:r>
-        <w:t xml:space="preserve">. Responses and closing information </w:t>
-      </w:r>
-      <w:proofErr w:type="gramStart"/>
-      <w:r>
-        <w:t>is</w:t>
-      </w:r>
-      <w:proofErr w:type="gramEnd"/>
-      <w:r>
-        <w:t xml:space="preserve"> included as additional message elements.</w:t>
+        <w:t>. Responses and closing information is included as additional message elements.</w:t>
       </w:r>
     </w:p>
     <w:p>
@@ -20478,8 +20243,6 @@
       <w:r>
         <w:t>s</w:t>
       </w:r>
-      <w:bookmarkStart w:id="50" w:name="_GoBack"/>
-      <w:bookmarkEnd w:id="50"/>
       <w:r>
         <w:t>.</w:t>
       </w:r>
@@ -20488,7 +20251,7 @@
       <w:pPr>
         <w:pStyle w:val="Heading2"/>
       </w:pPr>
-      <w:bookmarkStart w:id="51" w:name="_Toc169609326"/>
+      <w:bookmarkStart w:id="51" w:name="_Toc170138149"/>
       <w:r>
         <w:t>Complex forms</w:t>
       </w:r>
@@ -20512,7 +20275,7 @@
       <w:pPr>
         <w:pStyle w:val="Heading3"/>
       </w:pPr>
-      <w:bookmarkStart w:id="52" w:name="_Toc169609327"/>
+      <w:bookmarkStart w:id="52" w:name="_Toc170138150"/>
       <w:r>
         <w:t>Complex forms</w:t>
       </w:r>
@@ -20870,7 +20633,7 @@
       <w:pPr>
         <w:pStyle w:val="Heading3"/>
       </w:pPr>
-      <w:bookmarkStart w:id="53" w:name="_Toc169609328"/>
+      <w:bookmarkStart w:id="53" w:name="_Toc170138151"/>
       <w:r>
         <w:t>Variants</w:t>
       </w:r>
@@ -21161,7 +20924,7 @@
       <w:pPr>
         <w:pStyle w:val="Heading2"/>
       </w:pPr>
-      <w:bookmarkStart w:id="54" w:name="_Toc169609329"/>
+      <w:bookmarkStart w:id="54" w:name="_Toc170138152"/>
       <w:r>
         <w:t>Senses</w:t>
       </w:r>
@@ -21843,7 +21606,7 @@
         <w:pStyle w:val="Heading3"/>
       </w:pPr>
       <w:bookmarkStart w:id="55" w:name="_Ref164277547"/>
-      <w:bookmarkStart w:id="56" w:name="_Toc169609330"/>
+      <w:bookmarkStart w:id="56" w:name="_Toc170138153"/>
       <w:r>
         <w:t>Example sentences</w:t>
       </w:r>
@@ -22013,7 +21776,7 @@
       <w:pPr>
         <w:pStyle w:val="Heading3"/>
       </w:pPr>
-      <w:bookmarkStart w:id="57" w:name="_Toc169609331"/>
+      <w:bookmarkStart w:id="57" w:name="_Toc170138154"/>
       <w:r>
         <w:t>Extended notes</w:t>
       </w:r>
@@ -22250,7 +22013,7 @@
       <w:pPr>
         <w:pStyle w:val="Heading3"/>
       </w:pPr>
-      <w:bookmarkStart w:id="58" w:name="_Toc169609332"/>
+      <w:bookmarkStart w:id="58" w:name="_Toc170138155"/>
       <w:r>
         <w:lastRenderedPageBreak/>
         <w:t xml:space="preserve">Lexical </w:t>
@@ -23344,7 +23107,7 @@
       <w:pPr>
         <w:pStyle w:val="Heading4"/>
       </w:pPr>
-      <w:bookmarkStart w:id="59" w:name="_Toc169609333"/>
+      <w:bookmarkStart w:id="59" w:name="_Toc170138156"/>
       <w:r>
         <w:t>Collection</w:t>
       </w:r>
@@ -23550,15 +23313,7 @@
         <w:pStyle w:val="BodyText"/>
       </w:pPr>
       <w:r>
-        <w:t xml:space="preserve">LexRefType is a subclass of CmPossibility owned in the Lexical Relations </w:t>
-      </w:r>
-      <w:proofErr w:type="gramStart"/>
-      <w:r>
-        <w:t>CmPossibilityList  owned</w:t>
-      </w:r>
-      <w:proofErr w:type="gramEnd"/>
-      <w:r>
-        <w:t xml:space="preserve"> in the References owning property of LexDb, owned in the LexDb atomic owning property of LangProject. The Abbreviation for this object is </w:t>
+        <w:t xml:space="preserve">LexRefType is a subclass of CmPossibility owned in the Lexical Relations CmPossibilityList  owned in the References owning property of LexDb, owned in the LexDb atomic owning property of LangProject. The Abbreviation for this object is </w:t>
       </w:r>
       <w:r>
         <w:t>‘</w:t>
@@ -23624,7 +23379,7 @@
       <w:pPr>
         <w:pStyle w:val="Heading4"/>
       </w:pPr>
-      <w:bookmarkStart w:id="60" w:name="_Toc169609334"/>
+      <w:bookmarkStart w:id="60" w:name="_Toc170138157"/>
       <w:r>
         <w:t>Pair with different names</w:t>
       </w:r>
@@ -23896,7 +23651,7 @@
       <w:pPr>
         <w:pStyle w:val="Heading4"/>
       </w:pPr>
-      <w:bookmarkStart w:id="61" w:name="_Toc169609335"/>
+      <w:bookmarkStart w:id="61" w:name="_Toc170138158"/>
       <w:r>
         <w:t>Sequence</w:t>
       </w:r>
@@ -24106,7 +23861,7 @@
       <w:pPr>
         <w:pStyle w:val="Heading4"/>
       </w:pPr>
-      <w:bookmarkStart w:id="62" w:name="_Toc169609336"/>
+      <w:bookmarkStart w:id="62" w:name="_Toc170138159"/>
       <w:r>
         <w:t>Tree</w:t>
       </w:r>
@@ -24393,7 +24148,7 @@
       <w:pPr>
         <w:pStyle w:val="Heading4"/>
       </w:pPr>
-      <w:bookmarkStart w:id="63" w:name="_Toc169609337"/>
+      <w:bookmarkStart w:id="63" w:name="_Toc170138160"/>
       <w:r>
         <w:t>Unidirectional</w:t>
       </w:r>
@@ -24442,15 +24197,7 @@
         <w:pStyle w:val="BodyText"/>
       </w:pPr>
       <w:r>
-        <w:t xml:space="preserve">When one of the Entry types are used, everything works the same except the links are to entries instead of senses, and the relations would show up under Cross References instead of Lexical Relations in Lexicon Edit and Dictionary views. An ‘Entry </w:t>
-      </w:r>
-      <w:proofErr w:type="gramStart"/>
-      <w:r>
-        <w:t>Or</w:t>
-      </w:r>
-      <w:proofErr w:type="gramEnd"/>
-      <w:r>
-        <w:t xml:space="preserve"> Sense’ type would allow either Entries or Senses in the set.</w:t>
+        <w:t>When one of the Entry types are used, everything works the same except the links are to entries instead of senses, and the relations would show up under Cross References instead of Lexical Relations in Lexicon Edit and Dictionary views. An ‘Entry Or Sense’ type would allow either Entries or Senses in the set.</w:t>
       </w:r>
     </w:p>
     <w:p>
@@ -24464,23 +24211,7 @@
         <w:t>Caution</w:t>
       </w:r>
       <w:r>
-        <w:t xml:space="preserve">: Items in the Lexical Relations list are not simply </w:t>
-      </w:r>
-      <w:proofErr w:type="gramStart"/>
-      <w:r>
-        <w:t>objects</w:t>
-      </w:r>
-      <w:proofErr w:type="gramEnd"/>
-      <w:r>
-        <w:t xml:space="preserve"> that are referenced by other objects. Each item in this list also owns a collection of all of the lexical relation sets that are specified for this type of relation. </w:t>
-      </w:r>
-      <w:proofErr w:type="gramStart"/>
-      <w:r>
-        <w:t>So</w:t>
-      </w:r>
-      <w:proofErr w:type="gramEnd"/>
-      <w:r>
-        <w:t xml:space="preserve"> deleting an item in this list removes every instance of that type of relation. When a user tries to delete these, FLEx gives a warning message indicating how many relations will be delete</w:t>
+        <w:t>: Items in the Lexical Relations list are not simply objects that are referenced by other objects. Each item in this list also owns a collection of all of the lexical relation sets that are specified for this type of relation. So deleting an item in this list removes every instance of that type of relation. When a user tries to delete these, FLEx gives a warning message indicating how many relations will be delete</w:t>
       </w:r>
       <w:r>
         <w:t>d</w:t>
@@ -24493,7 +24224,7 @@
       <w:pPr>
         <w:pStyle w:val="Heading3"/>
       </w:pPr>
-      <w:bookmarkStart w:id="64" w:name="_Toc169609338"/>
+      <w:bookmarkStart w:id="64" w:name="_Toc170138161"/>
       <w:r>
         <w:lastRenderedPageBreak/>
         <w:t>Reversals</w:t>
@@ -24848,15 +24579,7 @@
         <w:pStyle w:val="BodyText"/>
       </w:pPr>
       <w:r>
-        <w:t xml:space="preserve">Reversal indexes are sorted and filtered using the Bulk Edit Reversal Entries tool in Lexicon Edit. The collation comes from the writing system of the reversal index. Sorting in this area only affects the main reversal entries. To sort the reversal </w:t>
-      </w:r>
-      <w:proofErr w:type="gramStart"/>
-      <w:r>
-        <w:t>subentries</w:t>
-      </w:r>
-      <w:proofErr w:type="gramEnd"/>
-      <w:r>
-        <w:t xml:space="preserve"> you have to use Tools &gt; Utilities &gt; “Sort Reversal Subentries</w:t>
+        <w:t>Reversal indexes are sorted and filtered using the Bulk Edit Reversal Entries tool in Lexicon Edit. The collation comes from the writing system of the reversal index. Sorting in this area only affects the main reversal entries. To sort the reversal subentries you have to use Tools &gt; Utilities &gt; “Sort Reversal Subentries</w:t>
       </w:r>
       <w:r>
         <w:t>”</w:t>
@@ -24872,7 +24595,7 @@
       <w:pPr>
         <w:pStyle w:val="Heading3"/>
       </w:pPr>
-      <w:bookmarkStart w:id="65" w:name="_Toc169609339"/>
+      <w:bookmarkStart w:id="65" w:name="_Toc170138162"/>
       <w:r>
         <w:lastRenderedPageBreak/>
         <w:t>Pictures</w:t>
@@ -25005,15 +24728,7 @@
         <w:t xml:space="preserve"> Pictures are normally stored in a CmFolder in this property with a name “Local Pictures”. </w:t>
       </w:r>
       <w:r>
-        <w:t xml:space="preserve">CmFolder has an owning collection Files property that owns CmFile objects. CmFile has a Unicode InternalPath property to record the location of a picture file. This path is normally a relative path starting at the project LinkedFiles directory, so it would include the Pictures folder as part of the path. Files can be located outside the project folder, and in that </w:t>
-      </w:r>
-      <w:proofErr w:type="gramStart"/>
-      <w:r>
-        <w:t>case</w:t>
-      </w:r>
-      <w:proofErr w:type="gramEnd"/>
-      <w:r>
-        <w:t xml:space="preserve"> it would be a full path to the file on the hard drive. CmFile has other properties</w:t>
+        <w:t>CmFolder has an owning collection Files property that owns CmFile objects. CmFile has a Unicode InternalPath property to record the location of a picture file. This path is normally a relative path starting at the project LinkedFiles directory, so it would include the Pictures folder as part of the path. Files can be located outside the project folder, and in that case it would be a full path to the file on the hard drive. CmFile has other properties</w:t>
       </w:r>
       <w:r>
         <w:t xml:space="preserve"> that are not used in FLEx.</w:t>
@@ -25054,7 +24769,7 @@
       <w:pPr>
         <w:pStyle w:val="Heading3"/>
       </w:pPr>
-      <w:bookmarkStart w:id="66" w:name="_Toc169609340"/>
+      <w:bookmarkStart w:id="66" w:name="_Toc170138163"/>
       <w:r>
         <w:t>Sound files</w:t>
       </w:r>
@@ -25102,7 +24817,7 @@
       <w:pPr>
         <w:pStyle w:val="Heading2"/>
       </w:pPr>
-      <w:bookmarkStart w:id="67" w:name="_Toc169609341"/>
+      <w:bookmarkStart w:id="67" w:name="_Toc170138164"/>
       <w:r>
         <w:t>Virtual ordering</w:t>
       </w:r>
@@ -25292,7 +25007,7 @@
       <w:pPr>
         <w:pStyle w:val="Heading2"/>
       </w:pPr>
-      <w:bookmarkStart w:id="68" w:name="_Toc169609342"/>
+      <w:bookmarkStart w:id="68" w:name="_Toc170138165"/>
       <w:r>
         <w:t>Publications</w:t>
       </w:r>
@@ -25643,7 +25358,7 @@
         <w:pStyle w:val="Heading1"/>
       </w:pPr>
       <w:bookmarkStart w:id="69" w:name="_Ref165555065"/>
-      <w:bookmarkStart w:id="70" w:name="_Toc169609343"/>
+      <w:bookmarkStart w:id="70" w:name="_Toc170138166"/>
       <w:r>
         <w:t>Grammar model</w:t>
       </w:r>
@@ -25667,15 +25382,7 @@
         <w:t>s</w:t>
       </w:r>
       <w:r>
-        <w:t xml:space="preserve"> from these lists to provide the features they want. The core part of the grammar is the Parts </w:t>
-      </w:r>
-      <w:proofErr w:type="gramStart"/>
-      <w:r>
-        <w:t>Of</w:t>
-      </w:r>
-      <w:proofErr w:type="gramEnd"/>
-      <w:r>
-        <w:t xml:space="preserve"> Speech list seen in the Category Edit </w:t>
+        <w:t xml:space="preserve"> from these lists to provide the features they want. The core part of the grammar is the Parts Of Speech list seen in the Category Edit </w:t>
       </w:r>
       <w:r>
         <w:t>tool in the Grammar area</w:t>
@@ -25733,15 +25440,7 @@
         <w:t>paradigm</w:t>
       </w:r>
       <w:r>
-        <w:t xml:space="preserve">. Only the </w:t>
-      </w:r>
-      <w:proofErr w:type="gramStart"/>
-      <w:r>
-        <w:t>first and third person</w:t>
-      </w:r>
-      <w:proofErr w:type="gramEnd"/>
-      <w:r>
-        <w:t xml:space="preserve"> suffixes are currently defined. This can parse the verb ‘manger’ into ‘mange’ for first person singular (I eat), and ‘mangeons’ for third person singular (we eat).</w:t>
+        <w:t>. Only the first and third person suffixes are currently defined. This can parse the verb ‘manger’ into ‘mange’ for first person singular (I eat), and ‘mangeons’ for third person singular (we eat).</w:t>
       </w:r>
       <w:r>
         <w:t xml:space="preserve"> </w:t>
@@ -25803,7 +25502,7 @@
       <w:pPr>
         <w:pStyle w:val="Heading2"/>
       </w:pPr>
-      <w:bookmarkStart w:id="71" w:name="_Toc169609344"/>
+      <w:bookmarkStart w:id="71" w:name="_Toc170138167"/>
       <w:r>
         <w:t>Inflection featuers</w:t>
       </w:r>
@@ -25981,7 +25680,7 @@
       <w:pPr>
         <w:pStyle w:val="Heading2"/>
       </w:pPr>
-      <w:bookmarkStart w:id="72" w:name="_Toc169609345"/>
+      <w:bookmarkStart w:id="72" w:name="_Toc170138168"/>
       <w:r>
         <w:t>Categories</w:t>
       </w:r>
@@ -26124,7 +25823,7 @@
       <w:pPr>
         <w:pStyle w:val="Heading2"/>
       </w:pPr>
-      <w:bookmarkStart w:id="73" w:name="_Toc169609346"/>
+      <w:bookmarkStart w:id="73" w:name="_Toc170138169"/>
       <w:r>
         <w:t>Lexicon</w:t>
       </w:r>
@@ -26138,15 +25837,7 @@
         <w:t xml:space="preserve">In the </w:t>
       </w:r>
       <w:r>
-        <w:t xml:space="preserve">entry for ‘manger’, we specify the lexeme form as ‘mang’ and the citation form as ‘manger’. In the Grammatical Info Details </w:t>
-      </w:r>
-      <w:proofErr w:type="gramStart"/>
-      <w:r>
-        <w:t>section</w:t>
-      </w:r>
-      <w:proofErr w:type="gramEnd"/>
-      <w:r>
-        <w:t xml:space="preserve"> the entry is classified as a verb, and the Inflection Class is set to ER Verbs.</w:t>
+        <w:t>entry for ‘manger’, we specify the lexeme form as ‘mang’ and the citation form as ‘manger’. In the Grammatical Info Details section the entry is classified as a verb, and the Inflection Class is set to ER Verbs.</w:t>
       </w:r>
     </w:p>
     <w:p>
@@ -26675,7 +26366,7 @@
       <w:pPr>
         <w:pStyle w:val="Heading1"/>
       </w:pPr>
-      <w:bookmarkStart w:id="74" w:name="_Toc169609347"/>
+      <w:bookmarkStart w:id="74" w:name="_Toc170138170"/>
       <w:r>
         <w:t xml:space="preserve">Interlinear </w:t>
       </w:r>
@@ -26771,7 +26462,7 @@
       <w:pPr>
         <w:pStyle w:val="Heading2"/>
       </w:pPr>
-      <w:bookmarkStart w:id="75" w:name="_Toc169609348"/>
+      <w:bookmarkStart w:id="75" w:name="_Toc170138171"/>
       <w:r>
         <w:t>Structured Text</w:t>
       </w:r>
@@ -26916,7 +26607,13 @@
         <w:t>Genres – reference collection to CmPossibility in the Genres list.</w:t>
       </w:r>
       <w:r>
-        <w:t xml:space="preserve"> This allows texts to be hierarchically arranged in the Choose Tools dialog making it </w:t>
+        <w:t xml:space="preserve"> This allows texts to be hierarchically arranged in the Choose </w:t>
+      </w:r>
+      <w:r>
+        <w:t>Texts</w:t>
+      </w:r>
+      <w:r>
+        <w:t xml:space="preserve"> dialog making it </w:t>
       </w:r>
       <w:r>
         <w:t>easier</w:t>
@@ -27078,7 +26775,7 @@
       <w:pPr>
         <w:pStyle w:val="Heading2"/>
       </w:pPr>
-      <w:bookmarkStart w:id="76" w:name="_Toc169609349"/>
+      <w:bookmarkStart w:id="76" w:name="_Toc170138172"/>
       <w:r>
         <w:t>Segment</w:t>
       </w:r>
@@ -27537,7 +27234,7 @@
       <w:pPr>
         <w:pStyle w:val="Heading2"/>
       </w:pPr>
-      <w:bookmarkStart w:id="77" w:name="_Toc169609350"/>
+      <w:bookmarkStart w:id="77" w:name="_Toc170138173"/>
       <w:r>
         <w:t>Wordform</w:t>
       </w:r>
@@ -27581,7 +27278,13 @@
         <w:t>reference</w:t>
       </w:r>
       <w:r>
-        <w:t xml:space="preserve"> for each</w:t>
+        <w:t xml:space="preserve"> </w:t>
+      </w:r>
+      <w:r>
+        <w:t>to</w:t>
+      </w:r>
+      <w:r>
+        <w:t xml:space="preserve"> each</w:t>
       </w:r>
       <w:r>
         <w:t xml:space="preserve"> </w:t>
@@ -27669,15 +27372,7 @@
         <w:t xml:space="preserve">Search </w:t>
       </w:r>
       <w:r>
-        <w:t>&lt;rt class="PunctuationForm</w:t>
-      </w:r>
-      <w:proofErr w:type="gramStart"/>
-      <w:r>
-        <w:t>".*</w:t>
-      </w:r>
-      <w:proofErr w:type="gramEnd"/>
-      <w:r>
-        <w:t>\r\n&lt;Form&gt;\r\n&lt;Str&gt;\r\n&lt;Run.*\r\n&lt;/Str&gt;\r\n&lt;/Form&gt;\r\n&lt;/rt&gt;\r\n</w:t>
+        <w:t>&lt;rt class="PunctuationForm".*\r\n&lt;Form&gt;\r\n&lt;Str&gt;\r\n&lt;Run.*\r\n&lt;/Str&gt;\r\n&lt;/Form&gt;\r\n&lt;/rt&gt;\r\n</w:t>
       </w:r>
       <w:r>
         <w:br/>
@@ -27741,7 +27436,7 @@
       <w:pPr>
         <w:pStyle w:val="Heading2"/>
       </w:pPr>
-      <w:bookmarkStart w:id="78" w:name="_Toc169609351"/>
+      <w:bookmarkStart w:id="78" w:name="_Toc170138174"/>
       <w:r>
         <w:t>Analyses</w:t>
       </w:r>
@@ -28476,7 +28171,7 @@
       <w:pPr>
         <w:pStyle w:val="Heading2"/>
       </w:pPr>
-      <w:bookmarkStart w:id="79" w:name="_Toc169609352"/>
+      <w:bookmarkStart w:id="79" w:name="_Toc170138175"/>
       <w:r>
         <w:t>Approving analyses</w:t>
       </w:r>
@@ -28695,16 +28390,11 @@
       </w:r>
       <w:r>
         <w:br/>
-        <w:t>&lt;objsur guid="b0460a42-7e19-460e-9ec8-4779c4a5f3ff" t="r" /</w:t>
-      </w:r>
-      <w:proofErr w:type="gramStart"/>
-      <w:r>
-        <w:t>&gt;</w:t>
+        <w:t>&lt;objsur guid="b0460a42-7e19-460e-9ec8-4779c4a5f3ff" t="r" /&gt;</w:t>
       </w:r>
       <w:r>
         <w:t xml:space="preserve">  Le</w:t>
       </w:r>
-      <w:proofErr w:type="gramEnd"/>
       <w:r>
         <w:br/>
         <w:t xml:space="preserve">&lt;objsur guid="7dec7244-62f4-441f-bfc9-c9564093c2f0" t="r" /&gt; </w:t>
@@ -28740,15 +28430,7 @@
       </w:r>
       <w:r>
         <w:br/>
-        <w:t>&lt;objsur guid="41581e3a-7ed3-41ac-94c7-6e91dbcc108b" t="r" /</w:t>
-      </w:r>
-      <w:proofErr w:type="gramStart"/>
-      <w:r>
-        <w:t>&gt;  &lt;</w:t>
-      </w:r>
-      <w:proofErr w:type="gramEnd"/>
-      <w:r>
-        <w:t>-  Computer approves</w:t>
+        <w:t>&lt;objsur guid="41581e3a-7ed3-41ac-94c7-6e91dbcc108b" t="r" /&gt;  &lt;-  Computer approves</w:t>
       </w:r>
       <w:r>
         <w:br/>
@@ -28809,6 +28491,12 @@
       </w:r>
       <w:r>
         <w:t>not in the vernacular writing system of the text.</w:t>
+      </w:r>
+      <w:r>
+        <w:t xml:space="preserve"> They cannot be analyzed</w:t>
+      </w:r>
+      <w:r>
+        <w:t>.</w:t>
       </w:r>
     </w:p>
     <w:p>
@@ -28898,7 +28586,7 @@
       <w:pPr>
         <w:pStyle w:val="Heading2"/>
       </w:pPr>
-      <w:bookmarkStart w:id="80" w:name="_Toc169609353"/>
+      <w:bookmarkStart w:id="80" w:name="_Toc170138176"/>
       <w:r>
         <w:t xml:space="preserve">Text </w:t>
       </w:r>
@@ -28944,15 +28632,7 @@
         <w:pStyle w:val="BodyText"/>
       </w:pPr>
       <w:r>
-        <w:t xml:space="preserve">In the Interlinear Text Tagging </w:t>
-      </w:r>
-      <w:proofErr w:type="gramStart"/>
-      <w:r>
-        <w:t>tab</w:t>
-      </w:r>
-      <w:proofErr w:type="gramEnd"/>
-      <w:r>
-        <w:t xml:space="preserve"> you can highlight a string of wordforms and right-click to choose a tag to assign to these wordforms.</w:t>
+        <w:t>In the Interlinear Text Tagging tab you can highlight a string of wordforms and right-click to choose a tag to assign to these wordforms.</w:t>
       </w:r>
       <w:r>
         <w:t xml:space="preserve"> You can choose from more than one level.</w:t>
@@ -29163,15 +28843,7 @@
         <w:t>S</w:t>
       </w:r>
       <w:r>
-        <w:t xml:space="preserve">egment. The Segment here is showing the wordforms following the index into the Analyses list. The top and bottom TextTag </w:t>
-      </w:r>
-      <w:proofErr w:type="gramStart"/>
-      <w:r>
-        <w:t>objects  reference</w:t>
-      </w:r>
-      <w:proofErr w:type="gramEnd"/>
-      <w:r>
-        <w:t xml:space="preserve"> two </w:t>
+        <w:t xml:space="preserve">egment. The Segment here is showing the wordforms following the index into the Analyses list. The top and bottom TextTag objects  reference two </w:t>
       </w:r>
       <w:r>
         <w:t>subitems</w:t>
@@ -29184,7 +28856,7 @@
       <w:pPr>
         <w:pStyle w:val="Heading2"/>
       </w:pPr>
-      <w:bookmarkStart w:id="81" w:name="_Toc169609354"/>
+      <w:bookmarkStart w:id="81" w:name="_Toc170138177"/>
       <w:r>
         <w:t>Discourse</w:t>
       </w:r>
@@ -30079,7 +29751,7 @@
       <w:pPr>
         <w:pStyle w:val="Heading2"/>
       </w:pPr>
-      <w:bookmarkStart w:id="82" w:name="_Toc169609355"/>
+      <w:bookmarkStart w:id="82" w:name="_Toc170138178"/>
       <w:r>
         <w:t>Scripture</w:t>
       </w:r>
@@ -30512,15 +30184,7 @@
         <w:pStyle w:val="ListBullet"/>
       </w:pPr>
       <w:r>
-        <w:t>it appends Footnote(</w:t>
-      </w:r>
-      <w:proofErr w:type="gramStart"/>
-      <w:r>
-        <w:t>c:v</w:t>
-      </w:r>
-      <w:proofErr w:type="gramEnd"/>
-      <w:r>
-        <w:t>) for ScrFootnote with the chapter and verse number in parentheses.</w:t>
+        <w:t>it appends Footnote(c:v) for ScrFootnote with the chapter and verse number in parentheses.</w:t>
       </w:r>
     </w:p>
     <w:p>
@@ -30892,7 +30556,7 @@
       <w:pPr>
         <w:pStyle w:val="Heading1"/>
       </w:pPr>
-      <w:bookmarkStart w:id="83" w:name="_Toc169609356"/>
+      <w:bookmarkStart w:id="83" w:name="_Toc170138179"/>
       <w:r>
         <w:t>N</w:t>
       </w:r>
@@ -31185,7 +30849,7 @@
       <w:rPr>
         <w:noProof/>
       </w:rPr>
-      <w:t>6/20/2024</w:t>
+      <w:t>6/24/2024</w:t>
     </w:r>
     <w:r>
       <w:fldChar w:fldCharType="end"/>
@@ -31232,7 +30896,7 @@
         <w:rStyle w:val="PageNumber"/>
         <w:noProof/>
       </w:rPr>
-      <w:t>6/20/2024</w:t>
+      <w:t>6/24/2024</w:t>
     </w:r>
     <w:r>
       <w:rPr>
@@ -31353,15 +31017,29 @@
       </w:rPr>
       <w:tab/>
     </w:r>
-    <w:fldSimple w:instr=" STYLEREF &quot;Heading 1&quot; \* MERGEFORMAT ">
-      <w:r>
-        <w:rPr>
-          <w:rStyle w:val="PageNumber"/>
-          <w:noProof/>
-        </w:rPr>
-        <w:t>Introduction</w:t>
-      </w:r>
-    </w:fldSimple>
+    <w:r>
+      <w:fldChar w:fldCharType="begin"/>
+    </w:r>
+    <w:r>
+      <w:instrText xml:space="preserve"> STYLEREF "Heading 1" \* MERGEFORMAT </w:instrText>
+    </w:r>
+    <w:r>
+      <w:fldChar w:fldCharType="separate"/>
+    </w:r>
+    <w:r>
+      <w:rPr>
+        <w:rStyle w:val="PageNumber"/>
+        <w:noProof/>
+      </w:rPr>
+      <w:t>Introduction</w:t>
+    </w:r>
+    <w:r>
+      <w:rPr>
+        <w:rStyle w:val="PageNumber"/>
+        <w:noProof/>
+      </w:rPr>
+      <w:fldChar w:fldCharType="end"/>
+    </w:r>
   </w:p>
 </w:hdr>
 </file>
@@ -34379,6 +34057,7 @@
   <w:style w:type="character" w:default="1" w:styleId="DefaultParagraphFont">
     <w:name w:val="Default Paragraph Font"/>
     <w:uiPriority w:val="1"/>
+    <w:semiHidden/>
     <w:unhideWhenUsed/>
   </w:style>
   <w:style w:type="table" w:default="1" w:styleId="TableNormal">
@@ -35220,7 +34899,7 @@
 </file>
 
 <file path=customXml/itemProps1.xml><?xml version="1.0" encoding="utf-8"?>
-<ds:datastoreItem xmlns:ds="http://schemas.openxmlformats.org/officeDocument/2006/customXml" ds:itemID="{EB9F04AA-FB4B-4ADB-BFB0-4A6AE077C1BA}">
+<ds:datastoreItem xmlns:ds="http://schemas.openxmlformats.org/officeDocument/2006/customXml" ds:itemID="{401559EB-8B0D-4B87-943A-1D5DDABFD323}">
   <ds:schemaRefs>
     <ds:schemaRef ds:uri="http://schemas.openxmlformats.org/officeDocument/2006/bibliography"/>
   </ds:schemaRefs>

</xml_diff>

<commit_message>
Updates to conceptual model docs
Fixed powerpoints, diagrams, and word doc.

Change-Id: I77832d850b49eaa6d74b1e1df8465be2fdf8a36e
</commit_message>
<xml_diff>
--- a/HelpResourcesSources/TechnicalNotes/FLEx 9.1 Conceptual Model.docx
+++ b/HelpResourcesSources/TechnicalNotes/FLEx 9.1 Conceptual Model.docx
@@ -6,7 +6,7 @@
       <w:pPr>
         <w:pStyle w:val="Title"/>
       </w:pPr>
-      <w:bookmarkStart w:id="0" w:name="_Toc170138108"/>
+      <w:bookmarkStart w:id="0" w:name="_Toc170205503"/>
       <w:r>
         <w:t xml:space="preserve">FLEx </w:t>
       </w:r>
@@ -49,10 +49,8 @@
         <w:rPr>
           <w:szCs w:val="36"/>
         </w:rPr>
-        <w:t>4</w:t>
-      </w:r>
-      <w:bookmarkStart w:id="1" w:name="_GoBack"/>
-      <w:bookmarkEnd w:id="1"/>
+        <w:t>5</w:t>
+      </w:r>
       <w:r>
         <w:rPr>
           <w:szCs w:val="36"/>
@@ -80,6 +78,8 @@
         <w:fldChar w:fldCharType="separate"/>
       </w:r>
     </w:p>
+    <w:bookmarkStart w:id="1" w:name="_GoBack"/>
+    <w:bookmarkEnd w:id="1"/>
     <w:p>
       <w:pPr>
         <w:pStyle w:val="TOC1"/>
@@ -94,63 +94,108 @@
           <w:lang w:eastAsia="en-US"/>
         </w:rPr>
       </w:pPr>
-      <w:hyperlink w:anchor="_Toc170138108" w:history="1">
-        <w:r>
-          <w:rPr>
-            <w:rStyle w:val="Hyperlink"/>
-            <w:noProof/>
-          </w:rPr>
-          <w:t>FLEx 9.1 Conceptual Model</w:t>
-        </w:r>
-        <w:r>
-          <w:rPr>
-            <w:noProof/>
-            <w:webHidden/>
-          </w:rPr>
-          <w:tab/>
-        </w:r>
-        <w:r>
-          <w:rPr>
-            <w:noProof/>
-            <w:webHidden/>
-          </w:rPr>
-          <w:fldChar w:fldCharType="begin"/>
-        </w:r>
-        <w:r>
-          <w:rPr>
-            <w:noProof/>
-            <w:webHidden/>
-          </w:rPr>
-          <w:instrText xml:space="preserve"> PAGEREF _Toc170138108 \h </w:instrText>
-        </w:r>
-        <w:r>
-          <w:rPr>
-            <w:noProof/>
-            <w:webHidden/>
-          </w:rPr>
-        </w:r>
-        <w:r>
-          <w:rPr>
-            <w:noProof/>
-            <w:webHidden/>
-          </w:rPr>
-          <w:fldChar w:fldCharType="separate"/>
-        </w:r>
-        <w:r>
-          <w:rPr>
-            <w:noProof/>
-            <w:webHidden/>
-          </w:rPr>
-          <w:t>1</w:t>
-        </w:r>
-        <w:r>
-          <w:rPr>
-            <w:noProof/>
-            <w:webHidden/>
-          </w:rPr>
-          <w:fldChar w:fldCharType="end"/>
-        </w:r>
-      </w:hyperlink>
+      <w:r>
+        <w:rPr>
+          <w:rStyle w:val="Hyperlink"/>
+          <w:noProof/>
+        </w:rPr>
+        <w:fldChar w:fldCharType="begin"/>
+      </w:r>
+      <w:r>
+        <w:rPr>
+          <w:rStyle w:val="Hyperlink"/>
+          <w:noProof/>
+        </w:rPr>
+        <w:instrText xml:space="preserve"> </w:instrText>
+      </w:r>
+      <w:r>
+        <w:rPr>
+          <w:noProof/>
+        </w:rPr>
+        <w:instrText>HYPERLINK \l "_Toc170205503"</w:instrText>
+      </w:r>
+      <w:r>
+        <w:rPr>
+          <w:rStyle w:val="Hyperlink"/>
+          <w:noProof/>
+        </w:rPr>
+        <w:instrText xml:space="preserve"> </w:instrText>
+      </w:r>
+      <w:r>
+        <w:rPr>
+          <w:rStyle w:val="Hyperlink"/>
+          <w:noProof/>
+        </w:rPr>
+      </w:r>
+      <w:r>
+        <w:rPr>
+          <w:rStyle w:val="Hyperlink"/>
+          <w:noProof/>
+        </w:rPr>
+        <w:fldChar w:fldCharType="separate"/>
+      </w:r>
+      <w:r>
+        <w:rPr>
+          <w:rStyle w:val="Hyperlink"/>
+          <w:noProof/>
+        </w:rPr>
+        <w:t>FLEx 9.1 Conceptual Model</w:t>
+      </w:r>
+      <w:r>
+        <w:rPr>
+          <w:noProof/>
+          <w:webHidden/>
+        </w:rPr>
+        <w:tab/>
+      </w:r>
+      <w:r>
+        <w:rPr>
+          <w:noProof/>
+          <w:webHidden/>
+        </w:rPr>
+        <w:fldChar w:fldCharType="begin"/>
+      </w:r>
+      <w:r>
+        <w:rPr>
+          <w:noProof/>
+          <w:webHidden/>
+        </w:rPr>
+        <w:instrText xml:space="preserve"> PAGEREF _Toc170205503 \h </w:instrText>
+      </w:r>
+      <w:r>
+        <w:rPr>
+          <w:noProof/>
+          <w:webHidden/>
+        </w:rPr>
+      </w:r>
+      <w:r>
+        <w:rPr>
+          <w:noProof/>
+          <w:webHidden/>
+        </w:rPr>
+        <w:fldChar w:fldCharType="separate"/>
+      </w:r>
+      <w:r>
+        <w:rPr>
+          <w:noProof/>
+          <w:webHidden/>
+        </w:rPr>
+        <w:t>1</w:t>
+      </w:r>
+      <w:r>
+        <w:rPr>
+          <w:noProof/>
+          <w:webHidden/>
+        </w:rPr>
+        <w:fldChar w:fldCharType="end"/>
+      </w:r>
+      <w:r>
+        <w:rPr>
+          <w:rStyle w:val="Hyperlink"/>
+          <w:noProof/>
+        </w:rPr>
+        <w:fldChar w:fldCharType="end"/>
+      </w:r>
     </w:p>
     <w:p>
       <w:pPr>
@@ -167,7 +212,7 @@
           <w:lang w:eastAsia="en-US"/>
         </w:rPr>
       </w:pPr>
-      <w:hyperlink w:anchor="_Toc170138109" w:history="1">
+      <w:hyperlink w:anchor="_Toc170205504" w:history="1">
         <w:r>
           <w:rPr>
             <w:rStyle w:val="Hyperlink"/>
@@ -211,7 +256,7 @@
             <w:noProof/>
             <w:webHidden/>
           </w:rPr>
-          <w:instrText xml:space="preserve"> PAGEREF _Toc170138109 \h </w:instrText>
+          <w:instrText xml:space="preserve"> PAGEREF _Toc170205504 \h </w:instrText>
         </w:r>
         <w:r>
           <w:rPr>
@@ -257,7 +302,7 @@
           <w:lang w:eastAsia="en-US"/>
         </w:rPr>
       </w:pPr>
-      <w:hyperlink w:anchor="_Toc170138110" w:history="1">
+      <w:hyperlink w:anchor="_Toc170205505" w:history="1">
         <w:r>
           <w:rPr>
             <w:rStyle w:val="Hyperlink"/>
@@ -301,7 +346,7 @@
             <w:noProof/>
             <w:webHidden/>
           </w:rPr>
-          <w:instrText xml:space="preserve"> PAGEREF _Toc170138110 \h </w:instrText>
+          <w:instrText xml:space="preserve"> PAGEREF _Toc170205505 \h </w:instrText>
         </w:r>
         <w:r>
           <w:rPr>
@@ -342,7 +387,7 @@
           <w:szCs w:val="22"/>
         </w:rPr>
       </w:pPr>
-      <w:hyperlink w:anchor="_Toc170138111" w:history="1">
+      <w:hyperlink w:anchor="_Toc170205506" w:history="1">
         <w:r>
           <w:rPr>
             <w:rStyle w:val="Hyperlink"/>
@@ -387,7 +432,7 @@
             <w:noProof/>
             <w:webHidden/>
           </w:rPr>
-          <w:instrText xml:space="preserve"> PAGEREF _Toc170138111 \h </w:instrText>
+          <w:instrText xml:space="preserve"> PAGEREF _Toc170205506 \h </w:instrText>
         </w:r>
         <w:r>
           <w:rPr>
@@ -428,7 +473,7 @@
           <w:szCs w:val="22"/>
         </w:rPr>
       </w:pPr>
-      <w:hyperlink w:anchor="_Toc170138112" w:history="1">
+      <w:hyperlink w:anchor="_Toc170205507" w:history="1">
         <w:r>
           <w:rPr>
             <w:rStyle w:val="Hyperlink"/>
@@ -473,7 +518,7 @@
             <w:noProof/>
             <w:webHidden/>
           </w:rPr>
-          <w:instrText xml:space="preserve"> PAGEREF _Toc170138112 \h </w:instrText>
+          <w:instrText xml:space="preserve"> PAGEREF _Toc170205507 \h </w:instrText>
         </w:r>
         <w:r>
           <w:rPr>
@@ -514,7 +559,7 @@
           <w:szCs w:val="22"/>
         </w:rPr>
       </w:pPr>
-      <w:hyperlink w:anchor="_Toc170138113" w:history="1">
+      <w:hyperlink w:anchor="_Toc170205508" w:history="1">
         <w:r>
           <w:rPr>
             <w:rStyle w:val="Hyperlink"/>
@@ -559,7 +604,7 @@
             <w:noProof/>
             <w:webHidden/>
           </w:rPr>
-          <w:instrText xml:space="preserve"> PAGEREF _Toc170138113 \h </w:instrText>
+          <w:instrText xml:space="preserve"> PAGEREF _Toc170205508 \h </w:instrText>
         </w:r>
         <w:r>
           <w:rPr>
@@ -605,7 +650,7 @@
           <w:lang w:eastAsia="en-US"/>
         </w:rPr>
       </w:pPr>
-      <w:hyperlink w:anchor="_Toc170138114" w:history="1">
+      <w:hyperlink w:anchor="_Toc170205509" w:history="1">
         <w:r>
           <w:rPr>
             <w:rStyle w:val="Hyperlink"/>
@@ -649,7 +694,7 @@
             <w:noProof/>
             <w:webHidden/>
           </w:rPr>
-          <w:instrText xml:space="preserve"> PAGEREF _Toc170138114 \h </w:instrText>
+          <w:instrText xml:space="preserve"> PAGEREF _Toc170205509 \h </w:instrText>
         </w:r>
         <w:r>
           <w:rPr>
@@ -694,7 +739,7 @@
           <w:szCs w:val="22"/>
         </w:rPr>
       </w:pPr>
-      <w:hyperlink w:anchor="_Toc170138115" w:history="1">
+      <w:hyperlink w:anchor="_Toc170205510" w:history="1">
         <w:r>
           <w:rPr>
             <w:rStyle w:val="Hyperlink"/>
@@ -739,7 +784,7 @@
             <w:noProof/>
             <w:webHidden/>
           </w:rPr>
-          <w:instrText xml:space="preserve"> PAGEREF _Toc170138115 \h </w:instrText>
+          <w:instrText xml:space="preserve"> PAGEREF _Toc170205510 \h </w:instrText>
         </w:r>
         <w:r>
           <w:rPr>
@@ -784,7 +829,7 @@
           <w:szCs w:val="22"/>
         </w:rPr>
       </w:pPr>
-      <w:hyperlink w:anchor="_Toc170138116" w:history="1">
+      <w:hyperlink w:anchor="_Toc170205511" w:history="1">
         <w:r>
           <w:rPr>
             <w:rStyle w:val="Hyperlink"/>
@@ -829,7 +874,7 @@
             <w:noProof/>
             <w:webHidden/>
           </w:rPr>
-          <w:instrText xml:space="preserve"> PAGEREF _Toc170138116 \h </w:instrText>
+          <w:instrText xml:space="preserve"> PAGEREF _Toc170205511 \h </w:instrText>
         </w:r>
         <w:r>
           <w:rPr>
@@ -874,7 +919,7 @@
           <w:szCs w:val="22"/>
         </w:rPr>
       </w:pPr>
-      <w:hyperlink w:anchor="_Toc170138117" w:history="1">
+      <w:hyperlink w:anchor="_Toc170205512" w:history="1">
         <w:r>
           <w:rPr>
             <w:rStyle w:val="Hyperlink"/>
@@ -919,7 +964,7 @@
             <w:noProof/>
             <w:webHidden/>
           </w:rPr>
-          <w:instrText xml:space="preserve"> PAGEREF _Toc170138117 \h </w:instrText>
+          <w:instrText xml:space="preserve"> PAGEREF _Toc170205512 \h </w:instrText>
         </w:r>
         <w:r>
           <w:rPr>
@@ -964,7 +1009,7 @@
           <w:szCs w:val="22"/>
         </w:rPr>
       </w:pPr>
-      <w:hyperlink w:anchor="_Toc170138118" w:history="1">
+      <w:hyperlink w:anchor="_Toc170205513" w:history="1">
         <w:r>
           <w:rPr>
             <w:rStyle w:val="Hyperlink"/>
@@ -1009,7 +1054,7 @@
             <w:noProof/>
             <w:webHidden/>
           </w:rPr>
-          <w:instrText xml:space="preserve"> PAGEREF _Toc170138118 \h </w:instrText>
+          <w:instrText xml:space="preserve"> PAGEREF _Toc170205513 \h </w:instrText>
         </w:r>
         <w:r>
           <w:rPr>
@@ -1055,7 +1100,7 @@
           <w:lang w:eastAsia="en-US"/>
         </w:rPr>
       </w:pPr>
-      <w:hyperlink w:anchor="_Toc170138119" w:history="1">
+      <w:hyperlink w:anchor="_Toc170205514" w:history="1">
         <w:r>
           <w:rPr>
             <w:rStyle w:val="Hyperlink"/>
@@ -1099,7 +1144,7 @@
             <w:noProof/>
             <w:webHidden/>
           </w:rPr>
-          <w:instrText xml:space="preserve"> PAGEREF _Toc170138119 \h </w:instrText>
+          <w:instrText xml:space="preserve"> PAGEREF _Toc170205514 \h </w:instrText>
         </w:r>
         <w:r>
           <w:rPr>
@@ -1145,7 +1190,7 @@
           <w:lang w:eastAsia="en-US"/>
         </w:rPr>
       </w:pPr>
-      <w:hyperlink w:anchor="_Toc170138120" w:history="1">
+      <w:hyperlink w:anchor="_Toc170205515" w:history="1">
         <w:r>
           <w:rPr>
             <w:rStyle w:val="Hyperlink"/>
@@ -1189,7 +1234,7 @@
             <w:noProof/>
             <w:webHidden/>
           </w:rPr>
-          <w:instrText xml:space="preserve"> PAGEREF _Toc170138120 \h </w:instrText>
+          <w:instrText xml:space="preserve"> PAGEREF _Toc170205515 \h </w:instrText>
         </w:r>
         <w:r>
           <w:rPr>
@@ -1235,7 +1280,7 @@
           <w:lang w:eastAsia="en-US"/>
         </w:rPr>
       </w:pPr>
-      <w:hyperlink w:anchor="_Toc170138121" w:history="1">
+      <w:hyperlink w:anchor="_Toc170205516" w:history="1">
         <w:r>
           <w:rPr>
             <w:rStyle w:val="Hyperlink"/>
@@ -1279,7 +1324,7 @@
             <w:noProof/>
             <w:webHidden/>
           </w:rPr>
-          <w:instrText xml:space="preserve"> PAGEREF _Toc170138121 \h </w:instrText>
+          <w:instrText xml:space="preserve"> PAGEREF _Toc170205516 \h </w:instrText>
         </w:r>
         <w:r>
           <w:rPr>
@@ -1325,7 +1370,7 @@
           <w:lang w:eastAsia="en-US"/>
         </w:rPr>
       </w:pPr>
-      <w:hyperlink w:anchor="_Toc170138122" w:history="1">
+      <w:hyperlink w:anchor="_Toc170205517" w:history="1">
         <w:r>
           <w:rPr>
             <w:rStyle w:val="Hyperlink"/>
@@ -1369,7 +1414,7 @@
             <w:noProof/>
             <w:webHidden/>
           </w:rPr>
-          <w:instrText xml:space="preserve"> PAGEREF _Toc170138122 \h </w:instrText>
+          <w:instrText xml:space="preserve"> PAGEREF _Toc170205517 \h </w:instrText>
         </w:r>
         <w:r>
           <w:rPr>
@@ -1415,7 +1460,7 @@
           <w:lang w:eastAsia="en-US"/>
         </w:rPr>
       </w:pPr>
-      <w:hyperlink w:anchor="_Toc170138123" w:history="1">
+      <w:hyperlink w:anchor="_Toc170205518" w:history="1">
         <w:r>
           <w:rPr>
             <w:rStyle w:val="Hyperlink"/>
@@ -1459,7 +1504,7 @@
             <w:noProof/>
             <w:webHidden/>
           </w:rPr>
-          <w:instrText xml:space="preserve"> PAGEREF _Toc170138123 \h </w:instrText>
+          <w:instrText xml:space="preserve"> PAGEREF _Toc170205518 \h </w:instrText>
         </w:r>
         <w:r>
           <w:rPr>
@@ -1505,7 +1550,7 @@
           <w:lang w:eastAsia="en-US"/>
         </w:rPr>
       </w:pPr>
-      <w:hyperlink w:anchor="_Toc170138124" w:history="1">
+      <w:hyperlink w:anchor="_Toc170205519" w:history="1">
         <w:r>
           <w:rPr>
             <w:rStyle w:val="Hyperlink"/>
@@ -1549,7 +1594,7 @@
             <w:noProof/>
             <w:webHidden/>
           </w:rPr>
-          <w:instrText xml:space="preserve"> PAGEREF _Toc170138124 \h </w:instrText>
+          <w:instrText xml:space="preserve"> PAGEREF _Toc170205519 \h </w:instrText>
         </w:r>
         <w:r>
           <w:rPr>
@@ -1595,7 +1640,7 @@
           <w:lang w:eastAsia="en-US"/>
         </w:rPr>
       </w:pPr>
-      <w:hyperlink w:anchor="_Toc170138125" w:history="1">
+      <w:hyperlink w:anchor="_Toc170205520" w:history="1">
         <w:r>
           <w:rPr>
             <w:rStyle w:val="Hyperlink"/>
@@ -1639,7 +1684,7 @@
             <w:noProof/>
             <w:webHidden/>
           </w:rPr>
-          <w:instrText xml:space="preserve"> PAGEREF _Toc170138125 \h </w:instrText>
+          <w:instrText xml:space="preserve"> PAGEREF _Toc170205520 \h </w:instrText>
         </w:r>
         <w:r>
           <w:rPr>
@@ -1680,7 +1725,7 @@
           <w:szCs w:val="22"/>
         </w:rPr>
       </w:pPr>
-      <w:hyperlink w:anchor="_Toc170138126" w:history="1">
+      <w:hyperlink w:anchor="_Toc170205521" w:history="1">
         <w:r>
           <w:rPr>
             <w:rStyle w:val="Hyperlink"/>
@@ -1725,7 +1770,7 @@
             <w:noProof/>
             <w:webHidden/>
           </w:rPr>
-          <w:instrText xml:space="preserve"> PAGEREF _Toc170138126 \h </w:instrText>
+          <w:instrText xml:space="preserve"> PAGEREF _Toc170205521 \h </w:instrText>
         </w:r>
         <w:r>
           <w:rPr>
@@ -1766,7 +1811,7 @@
           <w:szCs w:val="22"/>
         </w:rPr>
       </w:pPr>
-      <w:hyperlink w:anchor="_Toc170138127" w:history="1">
+      <w:hyperlink w:anchor="_Toc170205522" w:history="1">
         <w:r>
           <w:rPr>
             <w:rStyle w:val="Hyperlink"/>
@@ -1811,7 +1856,7 @@
             <w:noProof/>
             <w:webHidden/>
           </w:rPr>
-          <w:instrText xml:space="preserve"> PAGEREF _Toc170138127 \h </w:instrText>
+          <w:instrText xml:space="preserve"> PAGEREF _Toc170205522 \h </w:instrText>
         </w:r>
         <w:r>
           <w:rPr>
@@ -1852,7 +1897,7 @@
           <w:szCs w:val="22"/>
         </w:rPr>
       </w:pPr>
-      <w:hyperlink w:anchor="_Toc170138128" w:history="1">
+      <w:hyperlink w:anchor="_Toc170205523" w:history="1">
         <w:r>
           <w:rPr>
             <w:rStyle w:val="Hyperlink"/>
@@ -1897,7 +1942,7 @@
             <w:noProof/>
             <w:webHidden/>
           </w:rPr>
-          <w:instrText xml:space="preserve"> PAGEREF _Toc170138128 \h </w:instrText>
+          <w:instrText xml:space="preserve"> PAGEREF _Toc170205523 \h </w:instrText>
         </w:r>
         <w:r>
           <w:rPr>
@@ -1938,7 +1983,7 @@
           <w:szCs w:val="22"/>
         </w:rPr>
       </w:pPr>
-      <w:hyperlink w:anchor="_Toc170138129" w:history="1">
+      <w:hyperlink w:anchor="_Toc170205524" w:history="1">
         <w:r>
           <w:rPr>
             <w:rStyle w:val="Hyperlink"/>
@@ -1983,7 +2028,7 @@
             <w:noProof/>
             <w:webHidden/>
           </w:rPr>
-          <w:instrText xml:space="preserve"> PAGEREF _Toc170138129 \h </w:instrText>
+          <w:instrText xml:space="preserve"> PAGEREF _Toc170205524 \h </w:instrText>
         </w:r>
         <w:r>
           <w:rPr>
@@ -2024,7 +2069,7 @@
           <w:szCs w:val="22"/>
         </w:rPr>
       </w:pPr>
-      <w:hyperlink w:anchor="_Toc170138130" w:history="1">
+      <w:hyperlink w:anchor="_Toc170205525" w:history="1">
         <w:r>
           <w:rPr>
             <w:rStyle w:val="Hyperlink"/>
@@ -2069,7 +2114,7 @@
             <w:noProof/>
             <w:webHidden/>
           </w:rPr>
-          <w:instrText xml:space="preserve"> PAGEREF _Toc170138130 \h </w:instrText>
+          <w:instrText xml:space="preserve"> PAGEREF _Toc170205525 \h </w:instrText>
         </w:r>
         <w:r>
           <w:rPr>
@@ -2110,7 +2155,7 @@
           <w:szCs w:val="22"/>
         </w:rPr>
       </w:pPr>
-      <w:hyperlink w:anchor="_Toc170138131" w:history="1">
+      <w:hyperlink w:anchor="_Toc170205526" w:history="1">
         <w:r>
           <w:rPr>
             <w:rStyle w:val="Hyperlink"/>
@@ -2155,7 +2200,7 @@
             <w:noProof/>
             <w:webHidden/>
           </w:rPr>
-          <w:instrText xml:space="preserve"> PAGEREF _Toc170138131 \h </w:instrText>
+          <w:instrText xml:space="preserve"> PAGEREF _Toc170205526 \h </w:instrText>
         </w:r>
         <w:r>
           <w:rPr>
@@ -2196,7 +2241,7 @@
           <w:szCs w:val="22"/>
         </w:rPr>
       </w:pPr>
-      <w:hyperlink w:anchor="_Toc170138132" w:history="1">
+      <w:hyperlink w:anchor="_Toc170205527" w:history="1">
         <w:r>
           <w:rPr>
             <w:rStyle w:val="Hyperlink"/>
@@ -2241,7 +2286,7 @@
             <w:noProof/>
             <w:webHidden/>
           </w:rPr>
-          <w:instrText xml:space="preserve"> PAGEREF _Toc170138132 \h </w:instrText>
+          <w:instrText xml:space="preserve"> PAGEREF _Toc170205527 \h </w:instrText>
         </w:r>
         <w:r>
           <w:rPr>
@@ -2287,7 +2332,7 @@
           <w:lang w:eastAsia="en-US"/>
         </w:rPr>
       </w:pPr>
-      <w:hyperlink w:anchor="_Toc170138133" w:history="1">
+      <w:hyperlink w:anchor="_Toc170205528" w:history="1">
         <w:r>
           <w:rPr>
             <w:rStyle w:val="Hyperlink"/>
@@ -2331,7 +2376,7 @@
             <w:noProof/>
             <w:webHidden/>
           </w:rPr>
-          <w:instrText xml:space="preserve"> PAGEREF _Toc170138133 \h </w:instrText>
+          <w:instrText xml:space="preserve"> PAGEREF _Toc170205528 \h </w:instrText>
         </w:r>
         <w:r>
           <w:rPr>
@@ -2372,7 +2417,7 @@
           <w:szCs w:val="22"/>
         </w:rPr>
       </w:pPr>
-      <w:hyperlink w:anchor="_Toc170138134" w:history="1">
+      <w:hyperlink w:anchor="_Toc170205529" w:history="1">
         <w:r>
           <w:rPr>
             <w:rStyle w:val="Hyperlink"/>
@@ -2417,7 +2462,7 @@
             <w:noProof/>
             <w:webHidden/>
           </w:rPr>
-          <w:instrText xml:space="preserve"> PAGEREF _Toc170138134 \h </w:instrText>
+          <w:instrText xml:space="preserve"> PAGEREF _Toc170205529 \h </w:instrText>
         </w:r>
         <w:r>
           <w:rPr>
@@ -2458,7 +2503,7 @@
           <w:szCs w:val="22"/>
         </w:rPr>
       </w:pPr>
-      <w:hyperlink w:anchor="_Toc170138135" w:history="1">
+      <w:hyperlink w:anchor="_Toc170205530" w:history="1">
         <w:r>
           <w:rPr>
             <w:rStyle w:val="Hyperlink"/>
@@ -2503,7 +2548,7 @@
             <w:noProof/>
             <w:webHidden/>
           </w:rPr>
-          <w:instrText xml:space="preserve"> PAGEREF _Toc170138135 \h </w:instrText>
+          <w:instrText xml:space="preserve"> PAGEREF _Toc170205530 \h </w:instrText>
         </w:r>
         <w:r>
           <w:rPr>
@@ -2544,7 +2589,7 @@
           <w:szCs w:val="22"/>
         </w:rPr>
       </w:pPr>
-      <w:hyperlink w:anchor="_Toc170138136" w:history="1">
+      <w:hyperlink w:anchor="_Toc170205531" w:history="1">
         <w:r>
           <w:rPr>
             <w:rStyle w:val="Hyperlink"/>
@@ -2589,7 +2634,7 @@
             <w:noProof/>
             <w:webHidden/>
           </w:rPr>
-          <w:instrText xml:space="preserve"> PAGEREF _Toc170138136 \h </w:instrText>
+          <w:instrText xml:space="preserve"> PAGEREF _Toc170205531 \h </w:instrText>
         </w:r>
         <w:r>
           <w:rPr>
@@ -2635,7 +2680,7 @@
           <w:lang w:eastAsia="en-US"/>
         </w:rPr>
       </w:pPr>
-      <w:hyperlink w:anchor="_Toc170138137" w:history="1">
+      <w:hyperlink w:anchor="_Toc170205532" w:history="1">
         <w:r>
           <w:rPr>
             <w:rStyle w:val="Hyperlink"/>
@@ -2679,7 +2724,7 @@
             <w:noProof/>
             <w:webHidden/>
           </w:rPr>
-          <w:instrText xml:space="preserve"> PAGEREF _Toc170138137 \h </w:instrText>
+          <w:instrText xml:space="preserve"> PAGEREF _Toc170205532 \h </w:instrText>
         </w:r>
         <w:r>
           <w:rPr>
@@ -2725,7 +2770,7 @@
           <w:lang w:eastAsia="en-US"/>
         </w:rPr>
       </w:pPr>
-      <w:hyperlink w:anchor="_Toc170138138" w:history="1">
+      <w:hyperlink w:anchor="_Toc170205533" w:history="1">
         <w:r>
           <w:rPr>
             <w:rStyle w:val="Hyperlink"/>
@@ -2769,7 +2814,7 @@
             <w:noProof/>
             <w:webHidden/>
           </w:rPr>
-          <w:instrText xml:space="preserve"> PAGEREF _Toc170138138 \h </w:instrText>
+          <w:instrText xml:space="preserve"> PAGEREF _Toc170205533 \h </w:instrText>
         </w:r>
         <w:r>
           <w:rPr>
@@ -2810,7 +2855,7 @@
           <w:szCs w:val="22"/>
         </w:rPr>
       </w:pPr>
-      <w:hyperlink w:anchor="_Toc170138139" w:history="1">
+      <w:hyperlink w:anchor="_Toc170205534" w:history="1">
         <w:r>
           <w:rPr>
             <w:rStyle w:val="Hyperlink"/>
@@ -2855,7 +2900,7 @@
             <w:noProof/>
             <w:webHidden/>
           </w:rPr>
-          <w:instrText xml:space="preserve"> PAGEREF _Toc170138139 \h </w:instrText>
+          <w:instrText xml:space="preserve"> PAGEREF _Toc170205534 \h </w:instrText>
         </w:r>
         <w:r>
           <w:rPr>
@@ -2896,7 +2941,7 @@
           <w:szCs w:val="22"/>
         </w:rPr>
       </w:pPr>
-      <w:hyperlink w:anchor="_Toc170138140" w:history="1">
+      <w:hyperlink w:anchor="_Toc170205535" w:history="1">
         <w:r>
           <w:rPr>
             <w:rStyle w:val="Hyperlink"/>
@@ -2941,7 +2986,7 @@
             <w:noProof/>
             <w:webHidden/>
           </w:rPr>
-          <w:instrText xml:space="preserve"> PAGEREF _Toc170138140 \h </w:instrText>
+          <w:instrText xml:space="preserve"> PAGEREF _Toc170205535 \h </w:instrText>
         </w:r>
         <w:r>
           <w:rPr>
@@ -2987,7 +3032,7 @@
           <w:lang w:eastAsia="en-US"/>
         </w:rPr>
       </w:pPr>
-      <w:hyperlink w:anchor="_Toc170138141" w:history="1">
+      <w:hyperlink w:anchor="_Toc170205536" w:history="1">
         <w:r>
           <w:rPr>
             <w:rStyle w:val="Hyperlink"/>
@@ -3031,7 +3076,7 @@
             <w:noProof/>
             <w:webHidden/>
           </w:rPr>
-          <w:instrText xml:space="preserve"> PAGEREF _Toc170138141 \h </w:instrText>
+          <w:instrText xml:space="preserve"> PAGEREF _Toc170205536 \h </w:instrText>
         </w:r>
         <w:r>
           <w:rPr>
@@ -3072,7 +3117,7 @@
           <w:szCs w:val="22"/>
         </w:rPr>
       </w:pPr>
-      <w:hyperlink w:anchor="_Toc170138142" w:history="1">
+      <w:hyperlink w:anchor="_Toc170205537" w:history="1">
         <w:r>
           <w:rPr>
             <w:rStyle w:val="Hyperlink"/>
@@ -3117,7 +3162,7 @@
             <w:noProof/>
             <w:webHidden/>
           </w:rPr>
-          <w:instrText xml:space="preserve"> PAGEREF _Toc170138142 \h </w:instrText>
+          <w:instrText xml:space="preserve"> PAGEREF _Toc170205537 \h </w:instrText>
         </w:r>
         <w:r>
           <w:rPr>
@@ -3163,7 +3208,7 @@
           <w:lang w:eastAsia="en-US"/>
         </w:rPr>
       </w:pPr>
-      <w:hyperlink w:anchor="_Toc170138143" w:history="1">
+      <w:hyperlink w:anchor="_Toc170205538" w:history="1">
         <w:r>
           <w:rPr>
             <w:rStyle w:val="Hyperlink"/>
@@ -3207,7 +3252,7 @@
             <w:noProof/>
             <w:webHidden/>
           </w:rPr>
-          <w:instrText xml:space="preserve"> PAGEREF _Toc170138143 \h </w:instrText>
+          <w:instrText xml:space="preserve"> PAGEREF _Toc170205538 \h </w:instrText>
         </w:r>
         <w:r>
           <w:rPr>
@@ -3253,7 +3298,7 @@
           <w:lang w:eastAsia="en-US"/>
         </w:rPr>
       </w:pPr>
-      <w:hyperlink w:anchor="_Toc170138144" w:history="1">
+      <w:hyperlink w:anchor="_Toc170205539" w:history="1">
         <w:r>
           <w:rPr>
             <w:rStyle w:val="Hyperlink"/>
@@ -3297,7 +3342,7 @@
             <w:noProof/>
             <w:webHidden/>
           </w:rPr>
-          <w:instrText xml:space="preserve"> PAGEREF _Toc170138144 \h </w:instrText>
+          <w:instrText xml:space="preserve"> PAGEREF _Toc170205539 \h </w:instrText>
         </w:r>
         <w:r>
           <w:rPr>
@@ -3343,7 +3388,7 @@
           <w:lang w:eastAsia="en-US"/>
         </w:rPr>
       </w:pPr>
-      <w:hyperlink w:anchor="_Toc170138145" w:history="1">
+      <w:hyperlink w:anchor="_Toc170205540" w:history="1">
         <w:r>
           <w:rPr>
             <w:rStyle w:val="Hyperlink"/>
@@ -3387,7 +3432,7 @@
             <w:noProof/>
             <w:webHidden/>
           </w:rPr>
-          <w:instrText xml:space="preserve"> PAGEREF _Toc170138145 \h </w:instrText>
+          <w:instrText xml:space="preserve"> PAGEREF _Toc170205540 \h </w:instrText>
         </w:r>
         <w:r>
           <w:rPr>
@@ -3433,7 +3478,7 @@
           <w:lang w:eastAsia="en-US"/>
         </w:rPr>
       </w:pPr>
-      <w:hyperlink w:anchor="_Toc170138146" w:history="1">
+      <w:hyperlink w:anchor="_Toc170205541" w:history="1">
         <w:r>
           <w:rPr>
             <w:rStyle w:val="Hyperlink"/>
@@ -3477,7 +3522,7 @@
             <w:noProof/>
             <w:webHidden/>
           </w:rPr>
-          <w:instrText xml:space="preserve"> PAGEREF _Toc170138146 \h </w:instrText>
+          <w:instrText xml:space="preserve"> PAGEREF _Toc170205541 \h </w:instrText>
         </w:r>
         <w:r>
           <w:rPr>
@@ -3523,7 +3568,7 @@
           <w:lang w:eastAsia="en-US"/>
         </w:rPr>
       </w:pPr>
-      <w:hyperlink w:anchor="_Toc170138147" w:history="1">
+      <w:hyperlink w:anchor="_Toc170205542" w:history="1">
         <w:r>
           <w:rPr>
             <w:rStyle w:val="Hyperlink"/>
@@ -3567,7 +3612,7 @@
             <w:noProof/>
             <w:webHidden/>
           </w:rPr>
-          <w:instrText xml:space="preserve"> PAGEREF _Toc170138147 \h </w:instrText>
+          <w:instrText xml:space="preserve"> PAGEREF _Toc170205542 \h </w:instrText>
         </w:r>
         <w:r>
           <w:rPr>
@@ -3613,7 +3658,7 @@
           <w:lang w:eastAsia="en-US"/>
         </w:rPr>
       </w:pPr>
-      <w:hyperlink w:anchor="_Toc170138148" w:history="1">
+      <w:hyperlink w:anchor="_Toc170205543" w:history="1">
         <w:r>
           <w:rPr>
             <w:rStyle w:val="Hyperlink"/>
@@ -3657,7 +3702,7 @@
             <w:noProof/>
             <w:webHidden/>
           </w:rPr>
-          <w:instrText xml:space="preserve"> PAGEREF _Toc170138148 \h </w:instrText>
+          <w:instrText xml:space="preserve"> PAGEREF _Toc170205543 \h </w:instrText>
         </w:r>
         <w:r>
           <w:rPr>
@@ -3698,7 +3743,7 @@
           <w:szCs w:val="22"/>
         </w:rPr>
       </w:pPr>
-      <w:hyperlink w:anchor="_Toc170138149" w:history="1">
+      <w:hyperlink w:anchor="_Toc170205544" w:history="1">
         <w:r>
           <w:rPr>
             <w:rStyle w:val="Hyperlink"/>
@@ -3743,7 +3788,7 @@
             <w:noProof/>
             <w:webHidden/>
           </w:rPr>
-          <w:instrText xml:space="preserve"> PAGEREF _Toc170138149 \h </w:instrText>
+          <w:instrText xml:space="preserve"> PAGEREF _Toc170205544 \h </w:instrText>
         </w:r>
         <w:r>
           <w:rPr>
@@ -3789,7 +3834,7 @@
           <w:lang w:eastAsia="en-US"/>
         </w:rPr>
       </w:pPr>
-      <w:hyperlink w:anchor="_Toc170138150" w:history="1">
+      <w:hyperlink w:anchor="_Toc170205545" w:history="1">
         <w:r>
           <w:rPr>
             <w:rStyle w:val="Hyperlink"/>
@@ -3833,7 +3878,7 @@
             <w:noProof/>
             <w:webHidden/>
           </w:rPr>
-          <w:instrText xml:space="preserve"> PAGEREF _Toc170138150 \h </w:instrText>
+          <w:instrText xml:space="preserve"> PAGEREF _Toc170205545 \h </w:instrText>
         </w:r>
         <w:r>
           <w:rPr>
@@ -3879,7 +3924,7 @@
           <w:lang w:eastAsia="en-US"/>
         </w:rPr>
       </w:pPr>
-      <w:hyperlink w:anchor="_Toc170138151" w:history="1">
+      <w:hyperlink w:anchor="_Toc170205546" w:history="1">
         <w:r>
           <w:rPr>
             <w:rStyle w:val="Hyperlink"/>
@@ -3923,7 +3968,7 @@
             <w:noProof/>
             <w:webHidden/>
           </w:rPr>
-          <w:instrText xml:space="preserve"> PAGEREF _Toc170138151 \h </w:instrText>
+          <w:instrText xml:space="preserve"> PAGEREF _Toc170205546 \h </w:instrText>
         </w:r>
         <w:r>
           <w:rPr>
@@ -3964,7 +4009,7 @@
           <w:szCs w:val="22"/>
         </w:rPr>
       </w:pPr>
-      <w:hyperlink w:anchor="_Toc170138152" w:history="1">
+      <w:hyperlink w:anchor="_Toc170205547" w:history="1">
         <w:r>
           <w:rPr>
             <w:rStyle w:val="Hyperlink"/>
@@ -4009,7 +4054,7 @@
             <w:noProof/>
             <w:webHidden/>
           </w:rPr>
-          <w:instrText xml:space="preserve"> PAGEREF _Toc170138152 \h </w:instrText>
+          <w:instrText xml:space="preserve"> PAGEREF _Toc170205547 \h </w:instrText>
         </w:r>
         <w:r>
           <w:rPr>
@@ -4055,7 +4100,7 @@
           <w:lang w:eastAsia="en-US"/>
         </w:rPr>
       </w:pPr>
-      <w:hyperlink w:anchor="_Toc170138153" w:history="1">
+      <w:hyperlink w:anchor="_Toc170205548" w:history="1">
         <w:r>
           <w:rPr>
             <w:rStyle w:val="Hyperlink"/>
@@ -4099,7 +4144,7 @@
             <w:noProof/>
             <w:webHidden/>
           </w:rPr>
-          <w:instrText xml:space="preserve"> PAGEREF _Toc170138153 \h </w:instrText>
+          <w:instrText xml:space="preserve"> PAGEREF _Toc170205548 \h </w:instrText>
         </w:r>
         <w:r>
           <w:rPr>
@@ -4145,7 +4190,7 @@
           <w:lang w:eastAsia="en-US"/>
         </w:rPr>
       </w:pPr>
-      <w:hyperlink w:anchor="_Toc170138154" w:history="1">
+      <w:hyperlink w:anchor="_Toc170205549" w:history="1">
         <w:r>
           <w:rPr>
             <w:rStyle w:val="Hyperlink"/>
@@ -4189,7 +4234,7 @@
             <w:noProof/>
             <w:webHidden/>
           </w:rPr>
-          <w:instrText xml:space="preserve"> PAGEREF _Toc170138154 \h </w:instrText>
+          <w:instrText xml:space="preserve"> PAGEREF _Toc170205549 \h </w:instrText>
         </w:r>
         <w:r>
           <w:rPr>
@@ -4235,7 +4280,7 @@
           <w:lang w:eastAsia="en-US"/>
         </w:rPr>
       </w:pPr>
-      <w:hyperlink w:anchor="_Toc170138155" w:history="1">
+      <w:hyperlink w:anchor="_Toc170205550" w:history="1">
         <w:r>
           <w:rPr>
             <w:rStyle w:val="Hyperlink"/>
@@ -4279,7 +4324,7 @@
             <w:noProof/>
             <w:webHidden/>
           </w:rPr>
-          <w:instrText xml:space="preserve"> PAGEREF _Toc170138155 \h </w:instrText>
+          <w:instrText xml:space="preserve"> PAGEREF _Toc170205550 \h </w:instrText>
         </w:r>
         <w:r>
           <w:rPr>
@@ -4324,7 +4369,7 @@
           <w:szCs w:val="22"/>
         </w:rPr>
       </w:pPr>
-      <w:hyperlink w:anchor="_Toc170138156" w:history="1">
+      <w:hyperlink w:anchor="_Toc170205551" w:history="1">
         <w:r>
           <w:rPr>
             <w:rStyle w:val="Hyperlink"/>
@@ -4369,7 +4414,7 @@
             <w:noProof/>
             <w:webHidden/>
           </w:rPr>
-          <w:instrText xml:space="preserve"> PAGEREF _Toc170138156 \h </w:instrText>
+          <w:instrText xml:space="preserve"> PAGEREF _Toc170205551 \h </w:instrText>
         </w:r>
         <w:r>
           <w:rPr>
@@ -4414,7 +4459,7 @@
           <w:szCs w:val="22"/>
         </w:rPr>
       </w:pPr>
-      <w:hyperlink w:anchor="_Toc170138157" w:history="1">
+      <w:hyperlink w:anchor="_Toc170205552" w:history="1">
         <w:r>
           <w:rPr>
             <w:rStyle w:val="Hyperlink"/>
@@ -4459,7 +4504,7 @@
             <w:noProof/>
             <w:webHidden/>
           </w:rPr>
-          <w:instrText xml:space="preserve"> PAGEREF _Toc170138157 \h </w:instrText>
+          <w:instrText xml:space="preserve"> PAGEREF _Toc170205552 \h </w:instrText>
         </w:r>
         <w:r>
           <w:rPr>
@@ -4504,7 +4549,7 @@
           <w:szCs w:val="22"/>
         </w:rPr>
       </w:pPr>
-      <w:hyperlink w:anchor="_Toc170138158" w:history="1">
+      <w:hyperlink w:anchor="_Toc170205553" w:history="1">
         <w:r>
           <w:rPr>
             <w:rStyle w:val="Hyperlink"/>
@@ -4549,7 +4594,7 @@
             <w:noProof/>
             <w:webHidden/>
           </w:rPr>
-          <w:instrText xml:space="preserve"> PAGEREF _Toc170138158 \h </w:instrText>
+          <w:instrText xml:space="preserve"> PAGEREF _Toc170205553 \h </w:instrText>
         </w:r>
         <w:r>
           <w:rPr>
@@ -4594,7 +4639,7 @@
           <w:szCs w:val="22"/>
         </w:rPr>
       </w:pPr>
-      <w:hyperlink w:anchor="_Toc170138159" w:history="1">
+      <w:hyperlink w:anchor="_Toc170205554" w:history="1">
         <w:r>
           <w:rPr>
             <w:rStyle w:val="Hyperlink"/>
@@ -4639,7 +4684,7 @@
             <w:noProof/>
             <w:webHidden/>
           </w:rPr>
-          <w:instrText xml:space="preserve"> PAGEREF _Toc170138159 \h </w:instrText>
+          <w:instrText xml:space="preserve"> PAGEREF _Toc170205554 \h </w:instrText>
         </w:r>
         <w:r>
           <w:rPr>
@@ -4684,7 +4729,7 @@
           <w:szCs w:val="22"/>
         </w:rPr>
       </w:pPr>
-      <w:hyperlink w:anchor="_Toc170138160" w:history="1">
+      <w:hyperlink w:anchor="_Toc170205555" w:history="1">
         <w:r>
           <w:rPr>
             <w:rStyle w:val="Hyperlink"/>
@@ -4729,7 +4774,7 @@
             <w:noProof/>
             <w:webHidden/>
           </w:rPr>
-          <w:instrText xml:space="preserve"> PAGEREF _Toc170138160 \h </w:instrText>
+          <w:instrText xml:space="preserve"> PAGEREF _Toc170205555 \h </w:instrText>
         </w:r>
         <w:r>
           <w:rPr>
@@ -4775,7 +4820,7 @@
           <w:lang w:eastAsia="en-US"/>
         </w:rPr>
       </w:pPr>
-      <w:hyperlink w:anchor="_Toc170138161" w:history="1">
+      <w:hyperlink w:anchor="_Toc170205556" w:history="1">
         <w:r>
           <w:rPr>
             <w:rStyle w:val="Hyperlink"/>
@@ -4819,7 +4864,7 @@
             <w:noProof/>
             <w:webHidden/>
           </w:rPr>
-          <w:instrText xml:space="preserve"> PAGEREF _Toc170138161 \h </w:instrText>
+          <w:instrText xml:space="preserve"> PAGEREF _Toc170205556 \h </w:instrText>
         </w:r>
         <w:r>
           <w:rPr>
@@ -4865,7 +4910,7 @@
           <w:lang w:eastAsia="en-US"/>
         </w:rPr>
       </w:pPr>
-      <w:hyperlink w:anchor="_Toc170138162" w:history="1">
+      <w:hyperlink w:anchor="_Toc170205557" w:history="1">
         <w:r>
           <w:rPr>
             <w:rStyle w:val="Hyperlink"/>
@@ -4909,7 +4954,7 @@
             <w:noProof/>
             <w:webHidden/>
           </w:rPr>
-          <w:instrText xml:space="preserve"> PAGEREF _Toc170138162 \h </w:instrText>
+          <w:instrText xml:space="preserve"> PAGEREF _Toc170205557 \h </w:instrText>
         </w:r>
         <w:r>
           <w:rPr>
@@ -4955,7 +5000,7 @@
           <w:lang w:eastAsia="en-US"/>
         </w:rPr>
       </w:pPr>
-      <w:hyperlink w:anchor="_Toc170138163" w:history="1">
+      <w:hyperlink w:anchor="_Toc170205558" w:history="1">
         <w:r>
           <w:rPr>
             <w:rStyle w:val="Hyperlink"/>
@@ -4999,7 +5044,7 @@
             <w:noProof/>
             <w:webHidden/>
           </w:rPr>
-          <w:instrText xml:space="preserve"> PAGEREF _Toc170138163 \h </w:instrText>
+          <w:instrText xml:space="preserve"> PAGEREF _Toc170205558 \h </w:instrText>
         </w:r>
         <w:r>
           <w:rPr>
@@ -5040,7 +5085,7 @@
           <w:szCs w:val="22"/>
         </w:rPr>
       </w:pPr>
-      <w:hyperlink w:anchor="_Toc170138164" w:history="1">
+      <w:hyperlink w:anchor="_Toc170205559" w:history="1">
         <w:r>
           <w:rPr>
             <w:rStyle w:val="Hyperlink"/>
@@ -5085,7 +5130,7 @@
             <w:noProof/>
             <w:webHidden/>
           </w:rPr>
-          <w:instrText xml:space="preserve"> PAGEREF _Toc170138164 \h </w:instrText>
+          <w:instrText xml:space="preserve"> PAGEREF _Toc170205559 \h </w:instrText>
         </w:r>
         <w:r>
           <w:rPr>
@@ -5126,7 +5171,7 @@
           <w:szCs w:val="22"/>
         </w:rPr>
       </w:pPr>
-      <w:hyperlink w:anchor="_Toc170138165" w:history="1">
+      <w:hyperlink w:anchor="_Toc170205560" w:history="1">
         <w:r>
           <w:rPr>
             <w:rStyle w:val="Hyperlink"/>
@@ -5171,7 +5216,7 @@
             <w:noProof/>
             <w:webHidden/>
           </w:rPr>
-          <w:instrText xml:space="preserve"> PAGEREF _Toc170138165 \h </w:instrText>
+          <w:instrText xml:space="preserve"> PAGEREF _Toc170205560 \h </w:instrText>
         </w:r>
         <w:r>
           <w:rPr>
@@ -5217,7 +5262,7 @@
           <w:lang w:eastAsia="en-US"/>
         </w:rPr>
       </w:pPr>
-      <w:hyperlink w:anchor="_Toc170138166" w:history="1">
+      <w:hyperlink w:anchor="_Toc170205561" w:history="1">
         <w:r>
           <w:rPr>
             <w:rStyle w:val="Hyperlink"/>
@@ -5261,7 +5306,7 @@
             <w:noProof/>
             <w:webHidden/>
           </w:rPr>
-          <w:instrText xml:space="preserve"> PAGEREF _Toc170138166 \h </w:instrText>
+          <w:instrText xml:space="preserve"> PAGEREF _Toc170205561 \h </w:instrText>
         </w:r>
         <w:r>
           <w:rPr>
@@ -5302,7 +5347,7 @@
           <w:szCs w:val="22"/>
         </w:rPr>
       </w:pPr>
-      <w:hyperlink w:anchor="_Toc170138167" w:history="1">
+      <w:hyperlink w:anchor="_Toc170205562" w:history="1">
         <w:r>
           <w:rPr>
             <w:rStyle w:val="Hyperlink"/>
@@ -5326,7 +5371,7 @@
             <w:rFonts w:eastAsia="SimSun"/>
             <w:noProof/>
           </w:rPr>
-          <w:t>Inflection featuers</w:t>
+          <w:t>Inflection features</w:t>
         </w:r>
         <w:r>
           <w:rPr>
@@ -5347,7 +5392,7 @@
             <w:noProof/>
             <w:webHidden/>
           </w:rPr>
-          <w:instrText xml:space="preserve"> PAGEREF _Toc170138167 \h </w:instrText>
+          <w:instrText xml:space="preserve"> PAGEREF _Toc170205562 \h </w:instrText>
         </w:r>
         <w:r>
           <w:rPr>
@@ -5388,7 +5433,7 @@
           <w:szCs w:val="22"/>
         </w:rPr>
       </w:pPr>
-      <w:hyperlink w:anchor="_Toc170138168" w:history="1">
+      <w:hyperlink w:anchor="_Toc170205563" w:history="1">
         <w:r>
           <w:rPr>
             <w:rStyle w:val="Hyperlink"/>
@@ -5433,7 +5478,7 @@
             <w:noProof/>
             <w:webHidden/>
           </w:rPr>
-          <w:instrText xml:space="preserve"> PAGEREF _Toc170138168 \h </w:instrText>
+          <w:instrText xml:space="preserve"> PAGEREF _Toc170205563 \h </w:instrText>
         </w:r>
         <w:r>
           <w:rPr>
@@ -5474,7 +5519,7 @@
           <w:szCs w:val="22"/>
         </w:rPr>
       </w:pPr>
-      <w:hyperlink w:anchor="_Toc170138169" w:history="1">
+      <w:hyperlink w:anchor="_Toc170205564" w:history="1">
         <w:r>
           <w:rPr>
             <w:rStyle w:val="Hyperlink"/>
@@ -5519,7 +5564,7 @@
             <w:noProof/>
             <w:webHidden/>
           </w:rPr>
-          <w:instrText xml:space="preserve"> PAGEREF _Toc170138169 \h </w:instrText>
+          <w:instrText xml:space="preserve"> PAGEREF _Toc170205564 \h </w:instrText>
         </w:r>
         <w:r>
           <w:rPr>
@@ -5565,7 +5610,7 @@
           <w:lang w:eastAsia="en-US"/>
         </w:rPr>
       </w:pPr>
-      <w:hyperlink w:anchor="_Toc170138170" w:history="1">
+      <w:hyperlink w:anchor="_Toc170205565" w:history="1">
         <w:r>
           <w:rPr>
             <w:rStyle w:val="Hyperlink"/>
@@ -5609,7 +5654,7 @@
             <w:noProof/>
             <w:webHidden/>
           </w:rPr>
-          <w:instrText xml:space="preserve"> PAGEREF _Toc170138170 \h </w:instrText>
+          <w:instrText xml:space="preserve"> PAGEREF _Toc170205565 \h </w:instrText>
         </w:r>
         <w:r>
           <w:rPr>
@@ -5650,7 +5695,7 @@
           <w:szCs w:val="22"/>
         </w:rPr>
       </w:pPr>
-      <w:hyperlink w:anchor="_Toc170138171" w:history="1">
+      <w:hyperlink w:anchor="_Toc170205566" w:history="1">
         <w:r>
           <w:rPr>
             <w:rStyle w:val="Hyperlink"/>
@@ -5695,7 +5740,7 @@
             <w:noProof/>
             <w:webHidden/>
           </w:rPr>
-          <w:instrText xml:space="preserve"> PAGEREF _Toc170138171 \h </w:instrText>
+          <w:instrText xml:space="preserve"> PAGEREF _Toc170205566 \h </w:instrText>
         </w:r>
         <w:r>
           <w:rPr>
@@ -5736,7 +5781,7 @@
           <w:szCs w:val="22"/>
         </w:rPr>
       </w:pPr>
-      <w:hyperlink w:anchor="_Toc170138172" w:history="1">
+      <w:hyperlink w:anchor="_Toc170205567" w:history="1">
         <w:r>
           <w:rPr>
             <w:rStyle w:val="Hyperlink"/>
@@ -5781,7 +5826,7 @@
             <w:noProof/>
             <w:webHidden/>
           </w:rPr>
-          <w:instrText xml:space="preserve"> PAGEREF _Toc170138172 \h </w:instrText>
+          <w:instrText xml:space="preserve"> PAGEREF _Toc170205567 \h </w:instrText>
         </w:r>
         <w:r>
           <w:rPr>
@@ -5822,7 +5867,7 @@
           <w:szCs w:val="22"/>
         </w:rPr>
       </w:pPr>
-      <w:hyperlink w:anchor="_Toc170138173" w:history="1">
+      <w:hyperlink w:anchor="_Toc170205568" w:history="1">
         <w:r>
           <w:rPr>
             <w:rStyle w:val="Hyperlink"/>
@@ -5867,7 +5912,7 @@
             <w:noProof/>
             <w:webHidden/>
           </w:rPr>
-          <w:instrText xml:space="preserve"> PAGEREF _Toc170138173 \h </w:instrText>
+          <w:instrText xml:space="preserve"> PAGEREF _Toc170205568 \h </w:instrText>
         </w:r>
         <w:r>
           <w:rPr>
@@ -5908,7 +5953,7 @@
           <w:szCs w:val="22"/>
         </w:rPr>
       </w:pPr>
-      <w:hyperlink w:anchor="_Toc170138174" w:history="1">
+      <w:hyperlink w:anchor="_Toc170205569" w:history="1">
         <w:r>
           <w:rPr>
             <w:rStyle w:val="Hyperlink"/>
@@ -5953,7 +5998,7 @@
             <w:noProof/>
             <w:webHidden/>
           </w:rPr>
-          <w:instrText xml:space="preserve"> PAGEREF _Toc170138174 \h </w:instrText>
+          <w:instrText xml:space="preserve"> PAGEREF _Toc170205569 \h </w:instrText>
         </w:r>
         <w:r>
           <w:rPr>
@@ -5994,7 +6039,7 @@
           <w:szCs w:val="22"/>
         </w:rPr>
       </w:pPr>
-      <w:hyperlink w:anchor="_Toc170138175" w:history="1">
+      <w:hyperlink w:anchor="_Toc170205570" w:history="1">
         <w:r>
           <w:rPr>
             <w:rStyle w:val="Hyperlink"/>
@@ -6039,7 +6084,7 @@
             <w:noProof/>
             <w:webHidden/>
           </w:rPr>
-          <w:instrText xml:space="preserve"> PAGEREF _Toc170138175 \h </w:instrText>
+          <w:instrText xml:space="preserve"> PAGEREF _Toc170205570 \h </w:instrText>
         </w:r>
         <w:r>
           <w:rPr>
@@ -6080,7 +6125,7 @@
           <w:szCs w:val="22"/>
         </w:rPr>
       </w:pPr>
-      <w:hyperlink w:anchor="_Toc170138176" w:history="1">
+      <w:hyperlink w:anchor="_Toc170205571" w:history="1">
         <w:r>
           <w:rPr>
             <w:rStyle w:val="Hyperlink"/>
@@ -6125,7 +6170,7 @@
             <w:noProof/>
             <w:webHidden/>
           </w:rPr>
-          <w:instrText xml:space="preserve"> PAGEREF _Toc170138176 \h </w:instrText>
+          <w:instrText xml:space="preserve"> PAGEREF _Toc170205571 \h </w:instrText>
         </w:r>
         <w:r>
           <w:rPr>
@@ -6166,7 +6211,7 @@
           <w:szCs w:val="22"/>
         </w:rPr>
       </w:pPr>
-      <w:hyperlink w:anchor="_Toc170138177" w:history="1">
+      <w:hyperlink w:anchor="_Toc170205572" w:history="1">
         <w:r>
           <w:rPr>
             <w:rStyle w:val="Hyperlink"/>
@@ -6211,7 +6256,7 @@
             <w:noProof/>
             <w:webHidden/>
           </w:rPr>
-          <w:instrText xml:space="preserve"> PAGEREF _Toc170138177 \h </w:instrText>
+          <w:instrText xml:space="preserve"> PAGEREF _Toc170205572 \h </w:instrText>
         </w:r>
         <w:r>
           <w:rPr>
@@ -6252,7 +6297,7 @@
           <w:szCs w:val="22"/>
         </w:rPr>
       </w:pPr>
-      <w:hyperlink w:anchor="_Toc170138178" w:history="1">
+      <w:hyperlink w:anchor="_Toc170205573" w:history="1">
         <w:r>
           <w:rPr>
             <w:rStyle w:val="Hyperlink"/>
@@ -6297,7 +6342,7 @@
             <w:noProof/>
             <w:webHidden/>
           </w:rPr>
-          <w:instrText xml:space="preserve"> PAGEREF _Toc170138178 \h </w:instrText>
+          <w:instrText xml:space="preserve"> PAGEREF _Toc170205573 \h </w:instrText>
         </w:r>
         <w:r>
           <w:rPr>
@@ -6343,7 +6388,7 @@
           <w:lang w:eastAsia="en-US"/>
         </w:rPr>
       </w:pPr>
-      <w:hyperlink w:anchor="_Toc170138179" w:history="1">
+      <w:hyperlink w:anchor="_Toc170205574" w:history="1">
         <w:r>
           <w:rPr>
             <w:rStyle w:val="Hyperlink"/>
@@ -6387,7 +6432,7 @@
             <w:noProof/>
             <w:webHidden/>
           </w:rPr>
-          <w:instrText xml:space="preserve"> PAGEREF _Toc170138179 \h </w:instrText>
+          <w:instrText xml:space="preserve"> PAGEREF _Toc170205574 \h </w:instrText>
         </w:r>
         <w:r>
           <w:rPr>
@@ -6425,7 +6470,7 @@
       <w:r>
         <w:fldChar w:fldCharType="end"/>
       </w:r>
-      <w:bookmarkStart w:id="2" w:name="_Toc170138109"/>
+      <w:bookmarkStart w:id="2" w:name="_Toc170205504"/>
       <w:r>
         <w:t>I</w:t>
       </w:r>
@@ -6650,7 +6695,7 @@
       <w:pPr>
         <w:pStyle w:val="Heading1"/>
       </w:pPr>
-      <w:bookmarkStart w:id="3" w:name="_Toc170138110"/>
+      <w:bookmarkStart w:id="3" w:name="_Toc170205505"/>
       <w:r>
         <w:t xml:space="preserve">Basic </w:t>
       </w:r>
@@ -6936,7 +6981,7 @@
       <w:pPr>
         <w:pStyle w:val="Heading2"/>
       </w:pPr>
-      <w:bookmarkStart w:id="4" w:name="_Toc170138111"/>
+      <w:bookmarkStart w:id="4" w:name="_Toc170205506"/>
       <w:r>
         <w:t>Classes and properties</w:t>
       </w:r>
@@ -7166,7 +7211,7 @@
       <w:pPr>
         <w:pStyle w:val="Heading2"/>
       </w:pPr>
-      <w:bookmarkStart w:id="5" w:name="_Toc170138112"/>
+      <w:bookmarkStart w:id="5" w:name="_Toc170205507"/>
       <w:r>
         <w:t>Writing systems</w:t>
       </w:r>
@@ -7779,7 +7824,7 @@
       <w:pPr>
         <w:pStyle w:val="Heading2"/>
       </w:pPr>
-      <w:bookmarkStart w:id="6" w:name="_Toc170138113"/>
+      <w:bookmarkStart w:id="6" w:name="_Toc170205508"/>
       <w:r>
         <w:t>Basic properties</w:t>
       </w:r>
@@ -7798,7 +7843,7 @@
         <w:pStyle w:val="Heading3"/>
       </w:pPr>
       <w:bookmarkStart w:id="7" w:name="_Toc318113549"/>
-      <w:bookmarkStart w:id="8" w:name="_Toc170138114"/>
+      <w:bookmarkStart w:id="8" w:name="_Toc170205509"/>
       <w:r>
         <w:lastRenderedPageBreak/>
         <w:t>Strings</w:t>
@@ -7939,7 +7984,7 @@
         <w:pStyle w:val="Heading4"/>
       </w:pPr>
       <w:bookmarkStart w:id="9" w:name="_Toc318113550"/>
-      <w:bookmarkStart w:id="10" w:name="_Toc170138115"/>
+      <w:bookmarkStart w:id="10" w:name="_Toc170205510"/>
       <w:r>
         <w:t>Unicode</w:t>
       </w:r>
@@ -8106,7 +8151,7 @@
         <w:pStyle w:val="Heading4"/>
       </w:pPr>
       <w:bookmarkStart w:id="12" w:name="_Ref162943041"/>
-      <w:bookmarkStart w:id="13" w:name="_Toc170138116"/>
+      <w:bookmarkStart w:id="13" w:name="_Toc170205511"/>
       <w:r>
         <w:t>String</w:t>
       </w:r>
@@ -8457,7 +8502,7 @@
         <w:pStyle w:val="Heading4"/>
       </w:pPr>
       <w:bookmarkStart w:id="14" w:name="_Toc318113552"/>
-      <w:bookmarkStart w:id="15" w:name="_Toc170138117"/>
+      <w:bookmarkStart w:id="15" w:name="_Toc170205512"/>
       <w:r>
         <w:t>MultiUnicode</w:t>
       </w:r>
@@ -8515,7 +8560,7 @@
         <w:pStyle w:val="Heading4"/>
       </w:pPr>
       <w:bookmarkStart w:id="16" w:name="_Toc318113553"/>
-      <w:bookmarkStart w:id="17" w:name="_Toc170138118"/>
+      <w:bookmarkStart w:id="17" w:name="_Toc170205513"/>
       <w:r>
         <w:t>MultiString</w:t>
       </w:r>
@@ -8612,7 +8657,7 @@
       <w:pPr>
         <w:pStyle w:val="Heading3"/>
       </w:pPr>
-      <w:bookmarkStart w:id="18" w:name="_Toc170138119"/>
+      <w:bookmarkStart w:id="18" w:name="_Toc170205514"/>
       <w:r>
         <w:t>Binary</w:t>
       </w:r>
@@ -8673,7 +8718,7 @@
       <w:pPr>
         <w:pStyle w:val="Heading3"/>
       </w:pPr>
-      <w:bookmarkStart w:id="19" w:name="_Toc170138120"/>
+      <w:bookmarkStart w:id="19" w:name="_Toc170205515"/>
       <w:r>
         <w:t>Boolean</w:t>
       </w:r>
@@ -8708,7 +8753,7 @@
         <w:pStyle w:val="Heading3"/>
       </w:pPr>
       <w:bookmarkStart w:id="20" w:name="_Ref163130885"/>
-      <w:bookmarkStart w:id="21" w:name="_Toc170138121"/>
+      <w:bookmarkStart w:id="21" w:name="_Toc170205516"/>
       <w:r>
         <w:t>GenDate</w:t>
       </w:r>
@@ -8809,7 +8854,7 @@
       <w:pPr>
         <w:pStyle w:val="Heading3"/>
       </w:pPr>
-      <w:bookmarkStart w:id="22" w:name="_Toc170138122"/>
+      <w:bookmarkStart w:id="22" w:name="_Toc170205517"/>
       <w:r>
         <w:lastRenderedPageBreak/>
         <w:t>Guid</w:t>
@@ -8861,7 +8906,7 @@
       <w:pPr>
         <w:pStyle w:val="Heading3"/>
       </w:pPr>
-      <w:bookmarkStart w:id="23" w:name="_Toc170138123"/>
+      <w:bookmarkStart w:id="23" w:name="_Toc170205518"/>
       <w:r>
         <w:t>Integer</w:t>
       </w:r>
@@ -8913,7 +8958,7 @@
       <w:pPr>
         <w:pStyle w:val="Heading3"/>
       </w:pPr>
-      <w:bookmarkStart w:id="24" w:name="_Toc170138124"/>
+      <w:bookmarkStart w:id="24" w:name="_Toc170205519"/>
       <w:r>
         <w:t>TextPropBinary</w:t>
       </w:r>
@@ -9546,7 +9591,7 @@
       <w:pPr>
         <w:pStyle w:val="Heading3"/>
       </w:pPr>
-      <w:bookmarkStart w:id="25" w:name="_Toc170138125"/>
+      <w:bookmarkStart w:id="25" w:name="_Toc170205520"/>
       <w:r>
         <w:lastRenderedPageBreak/>
         <w:t>Time</w:t>
@@ -9611,7 +9656,7 @@
       <w:pPr>
         <w:pStyle w:val="Heading2"/>
       </w:pPr>
-      <w:bookmarkStart w:id="26" w:name="_Toc170138126"/>
+      <w:bookmarkStart w:id="26" w:name="_Toc170205521"/>
       <w:r>
         <w:t>Linking</w:t>
       </w:r>
@@ -9763,7 +9808,7 @@
       <w:pPr>
         <w:pStyle w:val="Heading2"/>
       </w:pPr>
-      <w:bookmarkStart w:id="27" w:name="_Toc170138127"/>
+      <w:bookmarkStart w:id="27" w:name="_Toc170205522"/>
       <w:r>
         <w:t>Owning relationships</w:t>
       </w:r>
@@ -10289,7 +10334,7 @@
       <w:pPr>
         <w:pStyle w:val="Heading2"/>
       </w:pPr>
-      <w:bookmarkStart w:id="28" w:name="_Toc170138128"/>
+      <w:bookmarkStart w:id="28" w:name="_Toc170205523"/>
       <w:r>
         <w:t>Reference relationships</w:t>
       </w:r>
@@ -10639,7 +10684,7 @@
       <w:pPr>
         <w:pStyle w:val="Heading2"/>
       </w:pPr>
-      <w:bookmarkStart w:id="29" w:name="_Toc170138129"/>
+      <w:bookmarkStart w:id="29" w:name="_Toc170205524"/>
       <w:r>
         <w:t>Styles</w:t>
       </w:r>
@@ -10845,7 +10890,7 @@
       <w:pPr>
         <w:pStyle w:val="Heading2"/>
       </w:pPr>
-      <w:bookmarkStart w:id="30" w:name="_Toc170138130"/>
+      <w:bookmarkStart w:id="30" w:name="_Toc170205525"/>
       <w:r>
         <w:t>Possibility lists</w:t>
       </w:r>
@@ -13072,7 +13117,7 @@
       <w:pPr>
         <w:pStyle w:val="Heading2"/>
       </w:pPr>
-      <w:bookmarkStart w:id="31" w:name="_Toc170138131"/>
+      <w:bookmarkStart w:id="31" w:name="_Toc170205526"/>
       <w:r>
         <w:lastRenderedPageBreak/>
         <w:t>Custom fields</w:t>
@@ -13818,7 +13863,7 @@
       <w:pPr>
         <w:pStyle w:val="Heading2"/>
       </w:pPr>
-      <w:bookmarkStart w:id="32" w:name="_Toc170138132"/>
+      <w:bookmarkStart w:id="32" w:name="_Toc170205527"/>
       <w:r>
         <w:t>Send/Receive Data</w:t>
       </w:r>
@@ -15004,7 +15049,7 @@
       <w:pPr>
         <w:pStyle w:val="Heading1"/>
       </w:pPr>
-      <w:bookmarkStart w:id="33" w:name="_Toc170138133"/>
+      <w:bookmarkStart w:id="33" w:name="_Toc170205528"/>
       <w:r>
         <w:t>Conceptual model resources</w:t>
       </w:r>
@@ -15134,7 +15179,7 @@
       <w:pPr>
         <w:pStyle w:val="Heading2"/>
       </w:pPr>
-      <w:bookmarkStart w:id="34" w:name="_Toc170138134"/>
+      <w:bookmarkStart w:id="34" w:name="_Toc170205529"/>
       <w:r>
         <w:t>M</w:t>
       </w:r>
@@ -15480,7 +15525,7 @@
       <w:pPr>
         <w:pStyle w:val="Heading2"/>
       </w:pPr>
-      <w:bookmarkStart w:id="35" w:name="_Toc170138135"/>
+      <w:bookmarkStart w:id="35" w:name="_Toc170205530"/>
       <w:r>
         <w:t>M</w:t>
       </w:r>
@@ -15925,7 +15970,7 @@
         <w:pStyle w:val="Heading2"/>
       </w:pPr>
       <w:bookmarkStart w:id="36" w:name="_Ref162957186"/>
-      <w:bookmarkStart w:id="37" w:name="_Toc170138136"/>
+      <w:bookmarkStart w:id="37" w:name="_Toc170205531"/>
       <w:r>
         <w:t>LCMBrowser</w:t>
       </w:r>
@@ -15971,7 +16016,7 @@
       <w:pPr>
         <w:pStyle w:val="Heading3"/>
       </w:pPr>
-      <w:bookmarkStart w:id="38" w:name="_Toc170138137"/>
+      <w:bookmarkStart w:id="38" w:name="_Toc170205532"/>
       <w:r>
         <w:t xml:space="preserve">LCM </w:t>
       </w:r>
@@ -16112,7 +16157,7 @@
       <w:pPr>
         <w:pStyle w:val="Heading3"/>
       </w:pPr>
-      <w:bookmarkStart w:id="39" w:name="_Toc170138138"/>
+      <w:bookmarkStart w:id="39" w:name="_Toc170205533"/>
       <w:r>
         <w:t>LCM data</w:t>
       </w:r>
@@ -16415,7 +16460,7 @@
       <w:pPr>
         <w:pStyle w:val="Heading2"/>
       </w:pPr>
-      <w:bookmarkStart w:id="40" w:name="_Toc170138139"/>
+      <w:bookmarkStart w:id="40" w:name="_Toc170205534"/>
       <w:r>
         <w:t>Fieldworks source code</w:t>
       </w:r>
@@ -16668,7 +16713,7 @@
       <w:pPr>
         <w:pStyle w:val="Heading2"/>
       </w:pPr>
-      <w:bookmarkStart w:id="41" w:name="_Toc170138140"/>
+      <w:bookmarkStart w:id="41" w:name="_Toc170205535"/>
       <w:r>
         <w:t>dnSpy debugger</w:t>
       </w:r>
@@ -16794,7 +16839,7 @@
       <w:pPr>
         <w:pStyle w:val="Heading1"/>
       </w:pPr>
-      <w:bookmarkStart w:id="42" w:name="_Toc170138141"/>
+      <w:bookmarkStart w:id="42" w:name="_Toc170205536"/>
       <w:r>
         <w:t>Lexicon model</w:t>
       </w:r>
@@ -17231,7 +17276,7 @@
       <w:pPr>
         <w:pStyle w:val="Heading2"/>
       </w:pPr>
-      <w:bookmarkStart w:id="43" w:name="_Toc170138142"/>
+      <w:bookmarkStart w:id="43" w:name="_Toc170205537"/>
       <w:r>
         <w:t>Entries</w:t>
       </w:r>
@@ -18266,7 +18311,7 @@
       <w:pPr>
         <w:pStyle w:val="Heading3"/>
       </w:pPr>
-      <w:bookmarkStart w:id="44" w:name="_Toc170138143"/>
+      <w:bookmarkStart w:id="44" w:name="_Toc170205538"/>
       <w:r>
         <w:t>Headwords</w:t>
       </w:r>
@@ -18615,7 +18660,7 @@
         <w:pStyle w:val="Heading3"/>
       </w:pPr>
       <w:bookmarkStart w:id="45" w:name="_Ref164431796"/>
-      <w:bookmarkStart w:id="46" w:name="_Toc170138144"/>
+      <w:bookmarkStart w:id="46" w:name="_Toc170205539"/>
       <w:r>
         <w:t>Pronunciations</w:t>
       </w:r>
@@ -18845,7 +18890,7 @@
       <w:pPr>
         <w:pStyle w:val="Heading3"/>
       </w:pPr>
-      <w:bookmarkStart w:id="47" w:name="_Toc170138145"/>
+      <w:bookmarkStart w:id="47" w:name="_Toc170205540"/>
       <w:r>
         <w:t>Etymology</w:t>
       </w:r>
@@ -19188,7 +19233,7 @@
       <w:pPr>
         <w:pStyle w:val="Heading3"/>
       </w:pPr>
-      <w:bookmarkStart w:id="48" w:name="_Toc170138146"/>
+      <w:bookmarkStart w:id="48" w:name="_Toc170205541"/>
       <w:r>
         <w:t>Allomorphs</w:t>
       </w:r>
@@ -19795,7 +19840,7 @@
       <w:pPr>
         <w:pStyle w:val="Heading3"/>
       </w:pPr>
-      <w:bookmarkStart w:id="49" w:name="_Toc170138147"/>
+      <w:bookmarkStart w:id="49" w:name="_Toc170205542"/>
       <w:r>
         <w:lastRenderedPageBreak/>
         <w:t>Grammatical information</w:t>
@@ -19847,7 +19892,7 @@
       <w:pPr>
         <w:pStyle w:val="Heading3"/>
       </w:pPr>
-      <w:bookmarkStart w:id="50" w:name="_Toc170138148"/>
+      <w:bookmarkStart w:id="50" w:name="_Toc170205543"/>
       <w:r>
         <w:t>Messages</w:t>
       </w:r>
@@ -20251,7 +20296,7 @@
       <w:pPr>
         <w:pStyle w:val="Heading2"/>
       </w:pPr>
-      <w:bookmarkStart w:id="51" w:name="_Toc170138149"/>
+      <w:bookmarkStart w:id="51" w:name="_Toc170205544"/>
       <w:r>
         <w:t>Complex forms</w:t>
       </w:r>
@@ -20275,7 +20320,7 @@
       <w:pPr>
         <w:pStyle w:val="Heading3"/>
       </w:pPr>
-      <w:bookmarkStart w:id="52" w:name="_Toc170138150"/>
+      <w:bookmarkStart w:id="52" w:name="_Toc170205545"/>
       <w:r>
         <w:t>Complex forms</w:t>
       </w:r>
@@ -20633,7 +20678,7 @@
       <w:pPr>
         <w:pStyle w:val="Heading3"/>
       </w:pPr>
-      <w:bookmarkStart w:id="53" w:name="_Toc170138151"/>
+      <w:bookmarkStart w:id="53" w:name="_Toc170205546"/>
       <w:r>
         <w:t>Variants</w:t>
       </w:r>
@@ -20924,7 +20969,7 @@
       <w:pPr>
         <w:pStyle w:val="Heading2"/>
       </w:pPr>
-      <w:bookmarkStart w:id="54" w:name="_Toc170138152"/>
+      <w:bookmarkStart w:id="54" w:name="_Toc170205547"/>
       <w:r>
         <w:t>Senses</w:t>
       </w:r>
@@ -21606,7 +21651,7 @@
         <w:pStyle w:val="Heading3"/>
       </w:pPr>
       <w:bookmarkStart w:id="55" w:name="_Ref164277547"/>
-      <w:bookmarkStart w:id="56" w:name="_Toc170138153"/>
+      <w:bookmarkStart w:id="56" w:name="_Toc170205548"/>
       <w:r>
         <w:t>Example sentences</w:t>
       </w:r>
@@ -21776,7 +21821,7 @@
       <w:pPr>
         <w:pStyle w:val="Heading3"/>
       </w:pPr>
-      <w:bookmarkStart w:id="57" w:name="_Toc170138154"/>
+      <w:bookmarkStart w:id="57" w:name="_Toc170205549"/>
       <w:r>
         <w:t>Extended notes</w:t>
       </w:r>
@@ -22013,7 +22058,7 @@
       <w:pPr>
         <w:pStyle w:val="Heading3"/>
       </w:pPr>
-      <w:bookmarkStart w:id="58" w:name="_Toc170138155"/>
+      <w:bookmarkStart w:id="58" w:name="_Toc170205550"/>
       <w:r>
         <w:lastRenderedPageBreak/>
         <w:t xml:space="preserve">Lexical </w:t>
@@ -23107,7 +23152,7 @@
       <w:pPr>
         <w:pStyle w:val="Heading4"/>
       </w:pPr>
-      <w:bookmarkStart w:id="59" w:name="_Toc170138156"/>
+      <w:bookmarkStart w:id="59" w:name="_Toc170205551"/>
       <w:r>
         <w:t>Collection</w:t>
       </w:r>
@@ -23379,7 +23424,7 @@
       <w:pPr>
         <w:pStyle w:val="Heading4"/>
       </w:pPr>
-      <w:bookmarkStart w:id="60" w:name="_Toc170138157"/>
+      <w:bookmarkStart w:id="60" w:name="_Toc170205552"/>
       <w:r>
         <w:t>Pair with different names</w:t>
       </w:r>
@@ -23651,7 +23696,7 @@
       <w:pPr>
         <w:pStyle w:val="Heading4"/>
       </w:pPr>
-      <w:bookmarkStart w:id="61" w:name="_Toc170138158"/>
+      <w:bookmarkStart w:id="61" w:name="_Toc170205553"/>
       <w:r>
         <w:t>Sequence</w:t>
       </w:r>
@@ -23861,7 +23906,7 @@
       <w:pPr>
         <w:pStyle w:val="Heading4"/>
       </w:pPr>
-      <w:bookmarkStart w:id="62" w:name="_Toc170138159"/>
+      <w:bookmarkStart w:id="62" w:name="_Toc170205554"/>
       <w:r>
         <w:t>Tree</w:t>
       </w:r>
@@ -24148,7 +24193,7 @@
       <w:pPr>
         <w:pStyle w:val="Heading4"/>
       </w:pPr>
-      <w:bookmarkStart w:id="63" w:name="_Toc170138160"/>
+      <w:bookmarkStart w:id="63" w:name="_Toc170205555"/>
       <w:r>
         <w:t>Unidirectional</w:t>
       </w:r>
@@ -24224,7 +24269,7 @@
       <w:pPr>
         <w:pStyle w:val="Heading3"/>
       </w:pPr>
-      <w:bookmarkStart w:id="64" w:name="_Toc170138161"/>
+      <w:bookmarkStart w:id="64" w:name="_Toc170205556"/>
       <w:r>
         <w:lastRenderedPageBreak/>
         <w:t>Reversals</w:t>
@@ -24595,7 +24640,7 @@
       <w:pPr>
         <w:pStyle w:val="Heading3"/>
       </w:pPr>
-      <w:bookmarkStart w:id="65" w:name="_Toc170138162"/>
+      <w:bookmarkStart w:id="65" w:name="_Toc170205557"/>
       <w:r>
         <w:lastRenderedPageBreak/>
         <w:t>Pictures</w:t>
@@ -24769,7 +24814,7 @@
       <w:pPr>
         <w:pStyle w:val="Heading3"/>
       </w:pPr>
-      <w:bookmarkStart w:id="66" w:name="_Toc170138163"/>
+      <w:bookmarkStart w:id="66" w:name="_Toc170205558"/>
       <w:r>
         <w:t>Sound files</w:t>
       </w:r>
@@ -24817,7 +24862,7 @@
       <w:pPr>
         <w:pStyle w:val="Heading2"/>
       </w:pPr>
-      <w:bookmarkStart w:id="67" w:name="_Toc170138164"/>
+      <w:bookmarkStart w:id="67" w:name="_Toc170205559"/>
       <w:r>
         <w:t>Virtual ordering</w:t>
       </w:r>
@@ -25007,7 +25052,7 @@
       <w:pPr>
         <w:pStyle w:val="Heading2"/>
       </w:pPr>
-      <w:bookmarkStart w:id="68" w:name="_Toc170138165"/>
+      <w:bookmarkStart w:id="68" w:name="_Toc170205560"/>
       <w:r>
         <w:t>Publications</w:t>
       </w:r>
@@ -25358,7 +25403,7 @@
         <w:pStyle w:val="Heading1"/>
       </w:pPr>
       <w:bookmarkStart w:id="69" w:name="_Ref165555065"/>
-      <w:bookmarkStart w:id="70" w:name="_Toc170138166"/>
+      <w:bookmarkStart w:id="70" w:name="_Toc170205561"/>
       <w:r>
         <w:t>Grammar model</w:t>
       </w:r>
@@ -25502,9 +25547,12 @@
       <w:pPr>
         <w:pStyle w:val="Heading2"/>
       </w:pPr>
-      <w:bookmarkStart w:id="71" w:name="_Toc170138167"/>
-      <w:r>
-        <w:t>Inflection featuers</w:t>
+      <w:bookmarkStart w:id="71" w:name="_Toc170205562"/>
+      <w:r>
+        <w:t xml:space="preserve">Inflection </w:t>
+      </w:r>
+      <w:r>
+        <w:t>features</w:t>
       </w:r>
       <w:bookmarkEnd w:id="71"/>
     </w:p>
@@ -25680,7 +25728,7 @@
       <w:pPr>
         <w:pStyle w:val="Heading2"/>
       </w:pPr>
-      <w:bookmarkStart w:id="72" w:name="_Toc170138168"/>
+      <w:bookmarkStart w:id="72" w:name="_Toc170205563"/>
       <w:r>
         <w:t>Categories</w:t>
       </w:r>
@@ -25823,7 +25871,7 @@
       <w:pPr>
         <w:pStyle w:val="Heading2"/>
       </w:pPr>
-      <w:bookmarkStart w:id="73" w:name="_Toc170138169"/>
+      <w:bookmarkStart w:id="73" w:name="_Toc170205564"/>
       <w:r>
         <w:t>Lexicon</w:t>
       </w:r>
@@ -26366,7 +26414,7 @@
       <w:pPr>
         <w:pStyle w:val="Heading1"/>
       </w:pPr>
-      <w:bookmarkStart w:id="74" w:name="_Toc170138170"/>
+      <w:bookmarkStart w:id="74" w:name="_Toc170205565"/>
       <w:r>
         <w:t xml:space="preserve">Interlinear </w:t>
       </w:r>
@@ -26410,7 +26458,13 @@
         <w:t xml:space="preserve"> </w:t>
       </w:r>
       <w:r>
-        <w:t>This will show all of the texts in the project. Ones with checkmarks are in the current filter that affects what you see in Word Analyses.</w:t>
+        <w:t>This will show all of the texts in the project. Ones with checkmarks are in the current filter that affects what you see in Word Analyses</w:t>
+      </w:r>
+      <w:r>
+        <w:t xml:space="preserve"> and Interlinear Texts</w:t>
+      </w:r>
+      <w:r>
+        <w:t>.</w:t>
       </w:r>
     </w:p>
     <w:p>
@@ -26462,7 +26516,7 @@
       <w:pPr>
         <w:pStyle w:val="Heading2"/>
       </w:pPr>
-      <w:bookmarkStart w:id="75" w:name="_Toc170138171"/>
+      <w:bookmarkStart w:id="75" w:name="_Toc170205566"/>
       <w:r>
         <w:t>Structured Text</w:t>
       </w:r>
@@ -26775,7 +26829,7 @@
       <w:pPr>
         <w:pStyle w:val="Heading2"/>
       </w:pPr>
-      <w:bookmarkStart w:id="76" w:name="_Toc170138172"/>
+      <w:bookmarkStart w:id="76" w:name="_Toc170205567"/>
       <w:r>
         <w:t>Segment</w:t>
       </w:r>
@@ -27234,7 +27288,7 @@
       <w:pPr>
         <w:pStyle w:val="Heading2"/>
       </w:pPr>
-      <w:bookmarkStart w:id="77" w:name="_Toc170138173"/>
+      <w:bookmarkStart w:id="77" w:name="_Toc170205568"/>
       <w:r>
         <w:t>Wordform</w:t>
       </w:r>
@@ -27436,7 +27490,7 @@
       <w:pPr>
         <w:pStyle w:val="Heading2"/>
       </w:pPr>
-      <w:bookmarkStart w:id="78" w:name="_Toc170138174"/>
+      <w:bookmarkStart w:id="78" w:name="_Toc170205569"/>
       <w:r>
         <w:t>Analyses</w:t>
       </w:r>
@@ -28171,7 +28225,7 @@
       <w:pPr>
         <w:pStyle w:val="Heading2"/>
       </w:pPr>
-      <w:bookmarkStart w:id="79" w:name="_Toc170138175"/>
+      <w:bookmarkStart w:id="79" w:name="_Toc170205570"/>
       <w:r>
         <w:t>Approving analyses</w:t>
       </w:r>
@@ -28586,7 +28640,7 @@
       <w:pPr>
         <w:pStyle w:val="Heading2"/>
       </w:pPr>
-      <w:bookmarkStart w:id="80" w:name="_Toc170138176"/>
+      <w:bookmarkStart w:id="80" w:name="_Toc170205571"/>
       <w:r>
         <w:t xml:space="preserve">Text </w:t>
       </w:r>
@@ -28856,7 +28910,7 @@
       <w:pPr>
         <w:pStyle w:val="Heading2"/>
       </w:pPr>
-      <w:bookmarkStart w:id="81" w:name="_Toc170138177"/>
+      <w:bookmarkStart w:id="81" w:name="_Toc170205572"/>
       <w:r>
         <w:t>Discourse</w:t>
       </w:r>
@@ -29751,7 +29805,7 @@
       <w:pPr>
         <w:pStyle w:val="Heading2"/>
       </w:pPr>
-      <w:bookmarkStart w:id="82" w:name="_Toc170138178"/>
+      <w:bookmarkStart w:id="82" w:name="_Toc170205573"/>
       <w:r>
         <w:t>Scripture</w:t>
       </w:r>
@@ -30516,10 +30570,10 @@
           <w:noProof/>
         </w:rPr>
         <w:drawing>
-          <wp:inline distT="0" distB="0" distL="0" distR="0" wp14:anchorId="2CE1FA3A" wp14:editId="60448618">
-            <wp:extent cx="4264762" cy="1596435"/>
-            <wp:effectExtent l="0" t="0" r="2540" b="3810"/>
-            <wp:docPr id="103" name="Picture 103"/>
+          <wp:inline distT="0" distB="0" distL="0" distR="0" wp14:anchorId="6AD9902C" wp14:editId="1B82FBAF">
+            <wp:extent cx="4933950" cy="1790665"/>
+            <wp:effectExtent l="0" t="0" r="0" b="635"/>
+            <wp:docPr id="105" name="Picture 105"/>
             <wp:cNvGraphicFramePr>
               <a:graphicFrameLocks xmlns:a="http://schemas.openxmlformats.org/drawingml/2006/main" noChangeAspect="1"/>
             </wp:cNvGraphicFramePr>
@@ -30539,7 +30593,7 @@
                   <pic:spPr>
                     <a:xfrm>
                       <a:off x="0" y="0"/>
-                      <a:ext cx="4350191" cy="1628414"/>
+                      <a:ext cx="5000054" cy="1814656"/>
                     </a:xfrm>
                     <a:prstGeom prst="rect">
                       <a:avLst/>
@@ -30556,7 +30610,7 @@
       <w:pPr>
         <w:pStyle w:val="Heading1"/>
       </w:pPr>
-      <w:bookmarkStart w:id="83" w:name="_Toc170138179"/>
+      <w:bookmarkStart w:id="83" w:name="_Toc170205574"/>
       <w:r>
         <w:t>N</w:t>
       </w:r>
@@ -30584,6 +30638,7 @@
         <w:pStyle w:val="BodyText"/>
       </w:pPr>
       <w:r>
+        <w:lastRenderedPageBreak/>
         <w:t>Here’s a sample record with a few fields filled in.</w:t>
       </w:r>
     </w:p>
@@ -30595,7 +30650,6 @@
         <w:rPr>
           <w:noProof/>
         </w:rPr>
-        <w:lastRenderedPageBreak/>
         <w:drawing>
           <wp:inline distT="0" distB="0" distL="0" distR="0" wp14:anchorId="4BA3D641" wp14:editId="3FE7F928">
             <wp:extent cx="3521412" cy="3393027"/>
@@ -30704,10 +30758,10 @@
         </w:rPr>
         <w:lastRenderedPageBreak/>
         <w:drawing>
-          <wp:inline distT="0" distB="0" distL="0" distR="0" wp14:anchorId="3487D55F" wp14:editId="4C6935F9">
-            <wp:extent cx="5251068" cy="2628900"/>
-            <wp:effectExtent l="0" t="0" r="6985" b="0"/>
-            <wp:docPr id="74" name="Picture 74"/>
+          <wp:inline distT="0" distB="0" distL="0" distR="0" wp14:anchorId="710D163D" wp14:editId="6AF4550E">
+            <wp:extent cx="5616453" cy="2790825"/>
+            <wp:effectExtent l="0" t="0" r="3810" b="0"/>
+            <wp:docPr id="106" name="Picture 106"/>
             <wp:cNvGraphicFramePr>
               <a:graphicFrameLocks xmlns:a="http://schemas.openxmlformats.org/drawingml/2006/main" noChangeAspect="1"/>
             </wp:cNvGraphicFramePr>
@@ -30727,7 +30781,7 @@
                   <pic:spPr>
                     <a:xfrm>
                       <a:off x="0" y="0"/>
-                      <a:ext cx="5262308" cy="2634527"/>
+                      <a:ext cx="5672189" cy="2818520"/>
                     </a:xfrm>
                     <a:prstGeom prst="rect">
                       <a:avLst/>
@@ -30849,7 +30903,7 @@
       <w:rPr>
         <w:noProof/>
       </w:rPr>
-      <w:t>6/24/2024</w:t>
+      <w:t>6/25/2024</w:t>
     </w:r>
     <w:r>
       <w:fldChar w:fldCharType="end"/>
@@ -30896,7 +30950,7 @@
         <w:rStyle w:val="PageNumber"/>
         <w:noProof/>
       </w:rPr>
-      <w:t>6/24/2024</w:t>
+      <w:t>6/25/2024</w:t>
     </w:r>
     <w:r>
       <w:rPr>
@@ -34899,7 +34953,7 @@
 </file>
 
 <file path=customXml/itemProps1.xml><?xml version="1.0" encoding="utf-8"?>
-<ds:datastoreItem xmlns:ds="http://schemas.openxmlformats.org/officeDocument/2006/customXml" ds:itemID="{401559EB-8B0D-4B87-943A-1D5DDABFD323}">
+<ds:datastoreItem xmlns:ds="http://schemas.openxmlformats.org/officeDocument/2006/customXml" ds:itemID="{27120A15-AC76-4F64-9684-52DD9E4996DD}">
   <ds:schemaRefs>
     <ds:schemaRef ds:uri="http://schemas.openxmlformats.org/officeDocument/2006/bibliography"/>
   </ds:schemaRefs>

</xml_diff>

<commit_message>
Conceptual model file update
Fixed some typos in files.

Change-Id: Id78e1dd489b3aca0a9574e341a1665c2bcaf837e
</commit_message>
<xml_diff>
--- a/HelpResourcesSources/TechnicalNotes/FLEx 9.1 Conceptual Model.docx
+++ b/HelpResourcesSources/TechnicalNotes/FLEx 9.1 Conceptual Model.docx
@@ -37,19 +37,7 @@
         <w:rPr>
           <w:szCs w:val="36"/>
         </w:rPr>
-        <w:t xml:space="preserve">June </w:t>
-      </w:r>
-      <w:r>
-        <w:rPr>
-          <w:szCs w:val="36"/>
-        </w:rPr>
-        <w:t>2</w:t>
-      </w:r>
-      <w:r>
-        <w:rPr>
-          <w:szCs w:val="36"/>
-        </w:rPr>
-        <w:t>5</w:t>
+        <w:t>July 9</w:t>
       </w:r>
       <w:r>
         <w:rPr>
@@ -78,8 +66,6 @@
         <w:fldChar w:fldCharType="separate"/>
       </w:r>
     </w:p>
-    <w:bookmarkStart w:id="1" w:name="_GoBack"/>
-    <w:bookmarkEnd w:id="1"/>
     <w:p>
       <w:pPr>
         <w:pStyle w:val="TOC1"/>
@@ -94,108 +80,63 @@
           <w:lang w:eastAsia="en-US"/>
         </w:rPr>
       </w:pPr>
-      <w:r>
-        <w:rPr>
-          <w:rStyle w:val="Hyperlink"/>
-          <w:noProof/>
-        </w:rPr>
-        <w:fldChar w:fldCharType="begin"/>
-      </w:r>
-      <w:r>
-        <w:rPr>
-          <w:rStyle w:val="Hyperlink"/>
-          <w:noProof/>
-        </w:rPr>
-        <w:instrText xml:space="preserve"> </w:instrText>
-      </w:r>
-      <w:r>
-        <w:rPr>
-          <w:noProof/>
-        </w:rPr>
-        <w:instrText>HYPERLINK \l "_Toc170205503"</w:instrText>
-      </w:r>
-      <w:r>
-        <w:rPr>
-          <w:rStyle w:val="Hyperlink"/>
-          <w:noProof/>
-        </w:rPr>
-        <w:instrText xml:space="preserve"> </w:instrText>
-      </w:r>
-      <w:r>
-        <w:rPr>
-          <w:rStyle w:val="Hyperlink"/>
-          <w:noProof/>
-        </w:rPr>
-      </w:r>
-      <w:r>
-        <w:rPr>
-          <w:rStyle w:val="Hyperlink"/>
-          <w:noProof/>
-        </w:rPr>
-        <w:fldChar w:fldCharType="separate"/>
-      </w:r>
-      <w:r>
-        <w:rPr>
-          <w:rStyle w:val="Hyperlink"/>
-          <w:noProof/>
-        </w:rPr>
-        <w:t>FLEx 9.1 Conceptual Model</w:t>
-      </w:r>
-      <w:r>
-        <w:rPr>
-          <w:noProof/>
-          <w:webHidden/>
-        </w:rPr>
-        <w:tab/>
-      </w:r>
-      <w:r>
-        <w:rPr>
-          <w:noProof/>
-          <w:webHidden/>
-        </w:rPr>
-        <w:fldChar w:fldCharType="begin"/>
-      </w:r>
-      <w:r>
-        <w:rPr>
-          <w:noProof/>
-          <w:webHidden/>
-        </w:rPr>
-        <w:instrText xml:space="preserve"> PAGEREF _Toc170205503 \h </w:instrText>
-      </w:r>
-      <w:r>
-        <w:rPr>
-          <w:noProof/>
-          <w:webHidden/>
-        </w:rPr>
-      </w:r>
-      <w:r>
-        <w:rPr>
-          <w:noProof/>
-          <w:webHidden/>
-        </w:rPr>
-        <w:fldChar w:fldCharType="separate"/>
-      </w:r>
-      <w:r>
-        <w:rPr>
-          <w:noProof/>
-          <w:webHidden/>
-        </w:rPr>
-        <w:t>1</w:t>
-      </w:r>
-      <w:r>
-        <w:rPr>
-          <w:noProof/>
-          <w:webHidden/>
-        </w:rPr>
-        <w:fldChar w:fldCharType="end"/>
-      </w:r>
-      <w:r>
-        <w:rPr>
-          <w:rStyle w:val="Hyperlink"/>
-          <w:noProof/>
-        </w:rPr>
-        <w:fldChar w:fldCharType="end"/>
-      </w:r>
+      <w:hyperlink w:anchor="_Toc170205503" w:history="1">
+        <w:r>
+          <w:rPr>
+            <w:rStyle w:val="Hyperlink"/>
+            <w:noProof/>
+          </w:rPr>
+          <w:t>FLEx 9.1 Conceptual Model</w:t>
+        </w:r>
+        <w:r>
+          <w:rPr>
+            <w:noProof/>
+            <w:webHidden/>
+          </w:rPr>
+          <w:tab/>
+        </w:r>
+        <w:r>
+          <w:rPr>
+            <w:noProof/>
+            <w:webHidden/>
+          </w:rPr>
+          <w:fldChar w:fldCharType="begin"/>
+        </w:r>
+        <w:r>
+          <w:rPr>
+            <w:noProof/>
+            <w:webHidden/>
+          </w:rPr>
+          <w:instrText xml:space="preserve"> PAGEREF _Toc170205503 \h </w:instrText>
+        </w:r>
+        <w:r>
+          <w:rPr>
+            <w:noProof/>
+            <w:webHidden/>
+          </w:rPr>
+        </w:r>
+        <w:r>
+          <w:rPr>
+            <w:noProof/>
+            <w:webHidden/>
+          </w:rPr>
+          <w:fldChar w:fldCharType="separate"/>
+        </w:r>
+        <w:r>
+          <w:rPr>
+            <w:noProof/>
+            <w:webHidden/>
+          </w:rPr>
+          <w:t>1</w:t>
+        </w:r>
+        <w:r>
+          <w:rPr>
+            <w:noProof/>
+            <w:webHidden/>
+          </w:rPr>
+          <w:fldChar w:fldCharType="end"/>
+        </w:r>
+      </w:hyperlink>
     </w:p>
     <w:p>
       <w:pPr>
@@ -6218,7 +6159,23 @@
             <w:rFonts w:eastAsia="SimSun"/>
             <w:noProof/>
           </w:rPr>
-          <w:t>6.7</w:t>
+          <w:t>6</w:t>
+        </w:r>
+        <w:r>
+          <w:rPr>
+            <w:rStyle w:val="Hyperlink"/>
+            <w:rFonts w:eastAsia="SimSun"/>
+            <w:noProof/>
+          </w:rPr>
+          <w:t>.</w:t>
+        </w:r>
+        <w:r>
+          <w:rPr>
+            <w:rStyle w:val="Hyperlink"/>
+            <w:rFonts w:eastAsia="SimSun"/>
+            <w:noProof/>
+          </w:rPr>
+          <w:t>7</w:t>
         </w:r>
         <w:r>
           <w:rPr>
@@ -6470,14 +6427,14 @@
       <w:r>
         <w:fldChar w:fldCharType="end"/>
       </w:r>
-      <w:bookmarkStart w:id="2" w:name="_Toc170205504"/>
+      <w:bookmarkStart w:id="1" w:name="_Toc170205504"/>
       <w:r>
         <w:t>I</w:t>
       </w:r>
       <w:r>
         <w:t>ntroduction</w:t>
       </w:r>
-      <w:bookmarkEnd w:id="2"/>
+      <w:bookmarkEnd w:id="1"/>
     </w:p>
     <w:p>
       <w:pPr>
@@ -6516,7 +6473,15 @@
         <w:t xml:space="preserve"> in FieldWorks version 9.1.25</w:t>
       </w:r>
       <w:r>
-        <w:t>, mainly stored in an XML .fwdata file in the project directory. It covers the basic conceptual model for processing different types of data.</w:t>
+        <w:t xml:space="preserve">, mainly stored in an </w:t>
+      </w:r>
+      <w:proofErr w:type="gramStart"/>
+      <w:r>
+        <w:t>XML .fwdata</w:t>
+      </w:r>
+      <w:proofErr w:type="gramEnd"/>
+      <w:r>
+        <w:t xml:space="preserve"> file in the project directory. It covers the basic conceptual model for processing different types of data.</w:t>
       </w:r>
       <w:r>
         <w:t xml:space="preserve"> A corresponding FLEx project, “FLEx Conceptual Model sample project” demonstrates all of the items discussed in this document</w:t>
@@ -6577,7 +6542,15 @@
         <w:pStyle w:val="BodyText"/>
       </w:pPr>
       <w:r>
-        <w:t xml:space="preserve">Data for a language project is stored in a folder, normally under c:\ProgramData\SIL\FieldWorks\Projects. The data is stored in a single XML file with a .fwdata </w:t>
+        <w:t xml:space="preserve">Data for a language project is stored in a folder, normally under c:\ProgramData\SIL\FieldWorks\Projects. The data is stored in a single XML file with </w:t>
+      </w:r>
+      <w:proofErr w:type="gramStart"/>
+      <w:r>
+        <w:t>a .fwdata</w:t>
+      </w:r>
+      <w:proofErr w:type="gramEnd"/>
+      <w:r>
+        <w:t xml:space="preserve"> </w:t>
       </w:r>
       <w:r>
         <w:t xml:space="preserve">file </w:t>
@@ -6695,7 +6668,7 @@
       <w:pPr>
         <w:pStyle w:val="Heading1"/>
       </w:pPr>
-      <w:bookmarkStart w:id="3" w:name="_Toc170205505"/>
+      <w:bookmarkStart w:id="2" w:name="_Toc170205505"/>
       <w:r>
         <w:t xml:space="preserve">Basic </w:t>
       </w:r>
@@ -6705,7 +6678,7 @@
       <w:r>
         <w:t>oncepts</w:t>
       </w:r>
-      <w:bookmarkEnd w:id="3"/>
+      <w:bookmarkEnd w:id="2"/>
     </w:p>
     <w:p>
       <w:pPr>
@@ -6981,11 +6954,11 @@
       <w:pPr>
         <w:pStyle w:val="Heading2"/>
       </w:pPr>
-      <w:bookmarkStart w:id="4" w:name="_Toc170205506"/>
+      <w:bookmarkStart w:id="3" w:name="_Toc170205506"/>
       <w:r>
         <w:t>Classes and properties</w:t>
       </w:r>
-      <w:bookmarkEnd w:id="4"/>
+      <w:bookmarkEnd w:id="3"/>
     </w:p>
     <w:p>
       <w:pPr>
@@ -7126,7 +7099,15 @@
         <w:t>if editing</w:t>
       </w:r>
       <w:r>
-        <w:t xml:space="preserve"> fwdata. Each object is an rt element</w:t>
+        <w:t xml:space="preserve"> fwdata. Each object is </w:t>
+      </w:r>
+      <w:proofErr w:type="gramStart"/>
+      <w:r>
+        <w:t>an</w:t>
+      </w:r>
+      <w:proofErr w:type="gramEnd"/>
+      <w:r>
+        <w:t xml:space="preserve"> rt element</w:t>
       </w:r>
       <w:r>
         <w:t xml:space="preserve"> in scattered locations in the file</w:t>
@@ -7158,7 +7139,15 @@
         <w:t xml:space="preserve">IDs, often abbreviated as flid for field ID in code. </w:t>
       </w:r>
       <w:r>
-        <w:t>The flid includes the 4-digit class id followed by a 3 digit field number. For example, a Definition on LexSense has a flid of 5016005</w:t>
+        <w:t xml:space="preserve">The flid includes the 4-digit class id followed by a </w:t>
+      </w:r>
+      <w:proofErr w:type="gramStart"/>
+      <w:r>
+        <w:t>3 digit</w:t>
+      </w:r>
+      <w:proofErr w:type="gramEnd"/>
+      <w:r>
+        <w:t xml:space="preserve"> field number. For example, a Definition on LexSense has a flid of 5016005</w:t>
       </w:r>
     </w:p>
     <w:p>
@@ -7211,11 +7200,11 @@
       <w:pPr>
         <w:pStyle w:val="Heading2"/>
       </w:pPr>
-      <w:bookmarkStart w:id="5" w:name="_Toc170205507"/>
+      <w:bookmarkStart w:id="4" w:name="_Toc170205507"/>
       <w:r>
         <w:t>Writing systems</w:t>
       </w:r>
-      <w:bookmarkEnd w:id="5"/>
+      <w:bookmarkEnd w:id="4"/>
     </w:p>
     <w:p>
       <w:pPr>
@@ -7315,7 +7304,15 @@
         <w:t xml:space="preserve">specification </w:t>
       </w:r>
       <w:r>
-        <w:t xml:space="preserve">in files with .ldml as the extension. Unicode Technical Standard #35 describes this </w:t>
+        <w:t xml:space="preserve">in files </w:t>
+      </w:r>
+      <w:proofErr w:type="gramStart"/>
+      <w:r>
+        <w:t>with .ldml</w:t>
+      </w:r>
+      <w:proofErr w:type="gramEnd"/>
+      <w:r>
+        <w:t xml:space="preserve"> as the extension. Unicode Technical Standard #35 describes this </w:t>
       </w:r>
       <w:r>
         <w:lastRenderedPageBreak/>
@@ -7477,10 +7474,18 @@
         <w:t xml:space="preserve"> writing system file is en-Latn-US</w:t>
       </w:r>
       <w:r>
-        <w:t>-x-sci</w:t>
-      </w:r>
-      <w:r>
-        <w:t>.ldml.</w:t>
+        <w:t>-x-</w:t>
+      </w:r>
+      <w:proofErr w:type="gramStart"/>
+      <w:r>
+        <w:t>sci</w:t>
+      </w:r>
+      <w:r>
+        <w:t>.ldml</w:t>
+      </w:r>
+      <w:proofErr w:type="gramEnd"/>
+      <w:r>
+        <w:t>.</w:t>
       </w:r>
     </w:p>
     <w:p>
@@ -7521,7 +7526,15 @@
         <w:t xml:space="preserve">, </w:t>
       </w:r>
       <w:r>
-        <w:t xml:space="preserve">FLEx will leave the en-Latn data in fwdata, and en.ldml and en-Latn.ldml, but the latter only has </w:t>
+        <w:t xml:space="preserve">FLEx will leave the en-Latn data in fwdata, and </w:t>
+      </w:r>
+      <w:proofErr w:type="gramStart"/>
+      <w:r>
+        <w:t>en.ldml</w:t>
+      </w:r>
+      <w:proofErr w:type="gramEnd"/>
+      <w:r>
+        <w:t xml:space="preserve"> and en-Latn.ldml, but the latter only has </w:t>
       </w:r>
       <w:r>
         <w:t>language type="en" /&gt;</w:t>
@@ -7785,7 +7798,15 @@
         <w:br/>
       </w:r>
       <w:r>
-        <w:t xml:space="preserve">      &lt;LanguageName&gt;Tonga (Nyasa) (tog-Latn-018-x-leya)&lt;/LanguageName&gt;</w:t>
+        <w:t xml:space="preserve">      &lt;LanguageName&gt;Tonga (Nyasa) (tog-Latn-018-x-</w:t>
+      </w:r>
+      <w:proofErr w:type="gramStart"/>
+      <w:r>
+        <w:t>leya)&lt;</w:t>
+      </w:r>
+      <w:proofErr w:type="gramEnd"/>
+      <w:r>
+        <w:t>/LanguageName&gt;</w:t>
       </w:r>
       <w:r>
         <w:br/>
@@ -7824,11 +7845,11 @@
       <w:pPr>
         <w:pStyle w:val="Heading2"/>
       </w:pPr>
-      <w:bookmarkStart w:id="6" w:name="_Toc170205508"/>
+      <w:bookmarkStart w:id="5" w:name="_Toc170205508"/>
       <w:r>
         <w:t>Basic properties</w:t>
       </w:r>
-      <w:bookmarkEnd w:id="6"/>
+      <w:bookmarkEnd w:id="5"/>
     </w:p>
     <w:p>
       <w:pPr>
@@ -7842,154 +7863,154 @@
       <w:pPr>
         <w:pStyle w:val="Heading3"/>
       </w:pPr>
-      <w:bookmarkStart w:id="7" w:name="_Toc318113549"/>
-      <w:bookmarkStart w:id="8" w:name="_Toc170205509"/>
+      <w:bookmarkStart w:id="6" w:name="_Toc318113549"/>
+      <w:bookmarkStart w:id="7" w:name="_Toc170205509"/>
       <w:r>
         <w:lastRenderedPageBreak/>
         <w:t>Strings</w:t>
       </w:r>
+      <w:bookmarkEnd w:id="6"/>
       <w:bookmarkEnd w:id="7"/>
+    </w:p>
+    <w:p>
+      <w:pPr>
+        <w:pStyle w:val="BodyText"/>
+      </w:pPr>
+      <w:r>
+        <w:t>All strings in FieldWorks store Unicode data. In the fwdata file it is stored in NFC normalization. There are two basic types of strings in Field</w:t>
+      </w:r>
+      <w:r>
+        <w:t>W</w:t>
+      </w:r>
+      <w:r>
+        <w:t>orks</w:t>
+      </w:r>
+      <w:r>
+        <w:t>, which are poorly named since all strings are in Unicode</w:t>
+      </w:r>
+      <w:r>
+        <w:t>.</w:t>
+      </w:r>
+      <w:r>
+        <w:t xml:space="preserve"> </w:t>
+      </w:r>
+    </w:p>
+    <w:p>
+      <w:pPr>
+        <w:pStyle w:val="ListBullet"/>
+      </w:pPr>
+      <w:r>
+        <w:t>Unicode: This type of string is a sequence of Unicode characters which does not allow any embedding including styles and writing systems.</w:t>
+      </w:r>
+      <w:r>
+        <w:t xml:space="preserve"> In the FLEx UI these strings can be recognized because the writing system and style combo boxes are disabled in the toolbar.</w:t>
+      </w:r>
+    </w:p>
+    <w:p>
+      <w:pPr>
+        <w:pStyle w:val="ListBullet"/>
+      </w:pPr>
+      <w:r>
+        <w:t xml:space="preserve">String: This type of string is a sequence of Unicode characters, but can also have substrings with styles and different writing systems, plus some other specialized attributes. In the FLEx UI these strings can be recognized because the </w:t>
+      </w:r>
+      <w:r>
+        <w:t>writing system and style combo boxes are enabled in the toolbar.</w:t>
+      </w:r>
+    </w:p>
+    <w:p>
+      <w:pPr>
+        <w:pStyle w:val="BodyText"/>
+      </w:pPr>
+      <w:r>
+        <w:t>If we started over, we would probably have a single kind of string, but when FLEx was first developed it was using SQL Server for storage, and it was much more efficient dealing with a simple type of string compared to added complexity storing strings with embeddings. There was originally a bigger variety of each string that could hold really long strings. When switching to XML storage</w:t>
+      </w:r>
+      <w:r>
+        <w:t xml:space="preserve"> in FW7</w:t>
+      </w:r>
+      <w:r>
+        <w:t>, we dropped the big variety because it was irrelevant, but we maintained the distinction between strings with or without embedding.</w:t>
+      </w:r>
+    </w:p>
+    <w:p>
+      <w:pPr>
+        <w:pStyle w:val="BodyText"/>
+      </w:pPr>
+      <w:r>
+        <w:t>Strings in Fieldworks should never have a CRLF or tab. FLEx tries to prevent this on import, typing, pasting, etc. Occasionally something slips through. In this case, when the field is displayed, all of the text following the CRLF or tab will not show. If you place your cursor at what appears to be the end of the string, and press Delete, it will delete the CRL</w:t>
+      </w:r>
+      <w:r>
+        <w:t>F</w:t>
+      </w:r>
+      <w:r>
+        <w:t xml:space="preserve"> or tab and you’ll see the rest of the string.</w:t>
+      </w:r>
+    </w:p>
+    <w:p>
+      <w:pPr>
+        <w:pStyle w:val="BodyText"/>
+      </w:pPr>
+      <w:r>
+        <w:t xml:space="preserve">FLEx can force a line break in either type of string. In the UI, this happens when you enter Shift+Enter. This inserts a U+2028 LNE SEPARATOR character in the string. This is somewhat </w:t>
+      </w:r>
+      <w:r>
+        <w:t>similar to having</w:t>
+      </w:r>
+      <w:r>
+        <w:t xml:space="preserve"> new paragraphs in a string, although there is no paragraph formatting applied in this case.</w:t>
+      </w:r>
+    </w:p>
+    <w:p>
+      <w:pPr>
+        <w:pStyle w:val="BodyText"/>
+      </w:pPr>
+      <w:r>
+        <w:t xml:space="preserve">Both types of strings can be used by itself in a property, or a property </w:t>
+      </w:r>
+      <w:r>
+        <w:t xml:space="preserve">can </w:t>
+      </w:r>
+      <w:r>
+        <w:t>hold multiple set</w:t>
+      </w:r>
+      <w:r>
+        <w:t>s</w:t>
+      </w:r>
+      <w:r>
+        <w:t xml:space="preserve"> of equivalent string</w:t>
+      </w:r>
+      <w:r>
+        <w:t>s in different languages or writing systems. These multiple versions are called MultiUnicode and MultString. The multi</w:t>
+      </w:r>
+      <w:r>
+        <w:t>ple</w:t>
+      </w:r>
+      <w:r>
+        <w:t xml:space="preserve"> </w:t>
+      </w:r>
+      <w:r>
+        <w:t>property always has a writing system associated with each alternative string. In a multiple property, every string in the property must have a unique writing system, which means you can’t have two en alternatives. The strings in a multiple property are normally the same string written in a different language (e.g., English, French, German) or writing system (</w:t>
+      </w:r>
+      <w:r>
+        <w:t xml:space="preserve">e.g., </w:t>
+      </w:r>
+      <w:r>
+        <w:t>normal or IPA orthography), or any combination of these.</w:t>
+      </w:r>
+      <w:r>
+        <w:t xml:space="preserve"> The writing system attributes in strings should always have a matching ldml file in the WritingSystemStore directory.</w:t>
+      </w:r>
+    </w:p>
+    <w:p>
+      <w:pPr>
+        <w:pStyle w:val="Heading4"/>
+      </w:pPr>
+      <w:bookmarkStart w:id="8" w:name="_Toc318113550"/>
+      <w:bookmarkStart w:id="9" w:name="_Toc170205510"/>
+      <w:r>
+        <w:t>Unicode</w:t>
+      </w:r>
       <w:bookmarkEnd w:id="8"/>
-    </w:p>
-    <w:p>
-      <w:pPr>
-        <w:pStyle w:val="BodyText"/>
-      </w:pPr>
-      <w:r>
-        <w:t>All strings in FieldWorks store Unicode data. In the fwdata file it is stored in NFC normalization. There are two basic types of strings in Field</w:t>
-      </w:r>
-      <w:r>
-        <w:t>W</w:t>
-      </w:r>
-      <w:r>
-        <w:t>orks</w:t>
-      </w:r>
-      <w:r>
-        <w:t>, which are poorly named since all strings are in Unicode</w:t>
-      </w:r>
-      <w:r>
-        <w:t>.</w:t>
-      </w:r>
-      <w:r>
-        <w:t xml:space="preserve"> </w:t>
-      </w:r>
-    </w:p>
-    <w:p>
-      <w:pPr>
-        <w:pStyle w:val="ListBullet"/>
-      </w:pPr>
-      <w:r>
-        <w:t>Unicode: This type of string is a sequence of Unicode characters which does not allow any embedding including styles and writing systems.</w:t>
-      </w:r>
-      <w:r>
-        <w:t xml:space="preserve"> In the FLEx UI these strings can be recognized because the writing system and style combo boxes are disabled in the toolbar.</w:t>
-      </w:r>
-    </w:p>
-    <w:p>
-      <w:pPr>
-        <w:pStyle w:val="ListBullet"/>
-      </w:pPr>
-      <w:r>
-        <w:t xml:space="preserve">String: This type of string is a sequence of Unicode characters, but can also have substrings with styles and different writing systems, plus some other specialized attributes. In the FLEx UI these strings can be recognized because the </w:t>
-      </w:r>
-      <w:r>
-        <w:t>writing system and style combo boxes are enabled in the toolbar.</w:t>
-      </w:r>
-    </w:p>
-    <w:p>
-      <w:pPr>
-        <w:pStyle w:val="BodyText"/>
-      </w:pPr>
-      <w:r>
-        <w:t>If we started over, we would probably have a single kind of string, but when FLEx was first developed it was using SQL Server for storage, and it was much more efficient dealing with a simple type of string compared to added complexity storing strings with embeddings. There was originally a bigger variety of each string that could hold really long strings. When switching to XML storage</w:t>
-      </w:r>
-      <w:r>
-        <w:t xml:space="preserve"> in FW7</w:t>
-      </w:r>
-      <w:r>
-        <w:t>, we dropped the big variety because it was irrelevant, but we maintained the distinction between strings with or without embedding.</w:t>
-      </w:r>
-    </w:p>
-    <w:p>
-      <w:pPr>
-        <w:pStyle w:val="BodyText"/>
-      </w:pPr>
-      <w:r>
-        <w:t>Strings in Fieldworks should never have a CRLF or tab. FLEx tries to prevent this on import, typing, pasting, etc. Occasionally something slips through. In this case, when the field is displayed, all of the text following the CRLF or tab will not show. If you place your cursor at what appears to be the end of the string, and press Delete, it will delete the CRL</w:t>
-      </w:r>
-      <w:r>
-        <w:t>F</w:t>
-      </w:r>
-      <w:r>
-        <w:t xml:space="preserve"> or tab and you’ll see the rest of the string.</w:t>
-      </w:r>
-    </w:p>
-    <w:p>
-      <w:pPr>
-        <w:pStyle w:val="BodyText"/>
-      </w:pPr>
-      <w:r>
-        <w:t xml:space="preserve">FLEx can force a line break in either type of string. In the UI, this happens when you enter Shift+Enter. This inserts a U+2028 LNE SEPARATOR character in the string. This is somewhat </w:t>
-      </w:r>
-      <w:r>
-        <w:t>similar to having</w:t>
-      </w:r>
-      <w:r>
-        <w:t xml:space="preserve"> new paragraphs in a string, although there is no paragraph formatting applied in this case.</w:t>
-      </w:r>
-    </w:p>
-    <w:p>
-      <w:pPr>
-        <w:pStyle w:val="BodyText"/>
-      </w:pPr>
-      <w:r>
-        <w:t xml:space="preserve">Both types of strings can be used by itself in a property, or a property </w:t>
-      </w:r>
-      <w:r>
-        <w:t xml:space="preserve">can </w:t>
-      </w:r>
-      <w:r>
-        <w:t>hold multiple set</w:t>
-      </w:r>
-      <w:r>
-        <w:t>s</w:t>
-      </w:r>
-      <w:r>
-        <w:t xml:space="preserve"> of equivalent string</w:t>
-      </w:r>
-      <w:r>
-        <w:t>s in different languages or writing systems. These multiple versions are called MultiUnicode and MultString. The multi</w:t>
-      </w:r>
-      <w:r>
-        <w:t>ple</w:t>
-      </w:r>
-      <w:r>
-        <w:t xml:space="preserve"> </w:t>
-      </w:r>
-      <w:r>
-        <w:t>property always has a writing system associated with each alternative string. In a multiple property, every string in the property must have a unique writing system, which means you can’t have two en alternatives. The strings in a multiple property are normally the same string written in a different language (e.g., English, French, German) or writing system (</w:t>
-      </w:r>
-      <w:r>
-        <w:t xml:space="preserve">e.g., </w:t>
-      </w:r>
-      <w:r>
-        <w:t>normal or IPA orthography), or any combination of these.</w:t>
-      </w:r>
-      <w:r>
-        <w:t xml:space="preserve"> The writing system attributes in strings should always have a matching ldml file in the WritingSystemStore directory.</w:t>
-      </w:r>
-    </w:p>
-    <w:p>
-      <w:pPr>
-        <w:pStyle w:val="Heading4"/>
-      </w:pPr>
-      <w:bookmarkStart w:id="9" w:name="_Toc318113550"/>
-      <w:bookmarkStart w:id="10" w:name="_Toc170205510"/>
-      <w:r>
-        <w:t>Unicode</w:t>
-      </w:r>
       <w:bookmarkEnd w:id="9"/>
-      <w:bookmarkEnd w:id="10"/>
     </w:p>
     <w:p>
       <w:pPr>
@@ -8090,7 +8111,7 @@
       <w:r>
         <w:t>he FieldWorks display mechanism shows boxes for characters that are not in the current font rather than substituting other fonts as needed. FieldWorks generally chooses a writing system representing the system language on your computer, if the writing system exists, otherwise it defaults to English when displaying these strings.</w:t>
       </w:r>
-      <w:bookmarkStart w:id="11" w:name="_Toc318113551"/>
+      <w:bookmarkStart w:id="10" w:name="_Toc318113551"/>
     </w:p>
     <w:p>
       <w:pPr>
@@ -8150,14 +8171,14 @@
       <w:pPr>
         <w:pStyle w:val="Heading4"/>
       </w:pPr>
-      <w:bookmarkStart w:id="12" w:name="_Ref162943041"/>
-      <w:bookmarkStart w:id="13" w:name="_Toc170205511"/>
+      <w:bookmarkStart w:id="11" w:name="_Ref162943041"/>
+      <w:bookmarkStart w:id="12" w:name="_Toc170205511"/>
       <w:r>
         <w:t>String</w:t>
       </w:r>
+      <w:bookmarkEnd w:id="10"/>
       <w:bookmarkEnd w:id="11"/>
       <w:bookmarkEnd w:id="12"/>
-      <w:bookmarkEnd w:id="13"/>
     </w:p>
     <w:p>
       <w:pPr>
@@ -8204,7 +8225,15 @@
       </w:r>
       <w:r>
         <w:br/>
-        <w:t>&lt;Run ws="en"&gt;A contraction is a combination of two lexemes, each of which maintains its own meaning.&lt;/Run&gt;</w:t>
+        <w:t xml:space="preserve">&lt;Run ws="en"&gt;A contraction is a combination of two lexemes, each of which maintains its own </w:t>
+      </w:r>
+      <w:proofErr w:type="gramStart"/>
+      <w:r>
+        <w:t>meaning.&lt;</w:t>
+      </w:r>
+      <w:proofErr w:type="gramEnd"/>
+      <w:r>
+        <w:t>/Run&gt;</w:t>
       </w:r>
       <w:r>
         <w:br/>
@@ -8378,7 +8407,11 @@
         <w:br/>
       </w:r>
       <w:r>
-        <w:t>&lt;Run ws="en"&gt;</w:t>
+        <w:t>&lt;Run ws="en"</w:t>
+      </w:r>
+      <w:proofErr w:type="gramStart"/>
+      <w:r>
+        <w:t>&gt;</w:t>
       </w:r>
       <w:r>
         <w:rPr>
@@ -8387,7 +8420,11 @@
         <w:t>]</w:t>
       </w:r>
       <w:r>
-        <w:t>&lt;/Run&gt;</w:t>
+        <w:t>&lt;</w:t>
+      </w:r>
+      <w:proofErr w:type="gramEnd"/>
+      <w:r>
+        <w:t>/Run&gt;</w:t>
       </w:r>
       <w:r>
         <w:br/>
@@ -8486,7 +8523,15 @@
       </w:r>
       <w:r>
         <w:br/>
-        <w:t>&lt;Run ws="en"&gt;.&lt;/Run&gt;</w:t>
+        <w:t>&lt;Run ws="en"</w:t>
+      </w:r>
+      <w:proofErr w:type="gramStart"/>
+      <w:r>
+        <w:t>&gt;.&lt;</w:t>
+      </w:r>
+      <w:proofErr w:type="gramEnd"/>
+      <w:r>
+        <w:t>/Run&gt;</w:t>
       </w:r>
       <w:r>
         <w:br/>
@@ -8501,26 +8546,92 @@
       <w:pPr>
         <w:pStyle w:val="Heading4"/>
       </w:pPr>
-      <w:bookmarkStart w:id="14" w:name="_Toc318113552"/>
-      <w:bookmarkStart w:id="15" w:name="_Toc170205512"/>
+      <w:bookmarkStart w:id="13" w:name="_Toc318113552"/>
+      <w:bookmarkStart w:id="14" w:name="_Toc170205512"/>
       <w:r>
         <w:t>MultiUnicode</w:t>
       </w:r>
+      <w:bookmarkEnd w:id="13"/>
       <w:bookmarkEnd w:id="14"/>
+    </w:p>
+    <w:p>
+      <w:pPr>
+        <w:pStyle w:val="BodyText"/>
+      </w:pPr>
+      <w:r>
+        <w:t xml:space="preserve">Many properties (fields) in FieldWorks are designed to hold strings that will never have embedding, but may have translations in different languages or writing systems (e.g., lexeme form, gloss, and names and abbreviations for list items). Here is how these MultiUnicode properties are </w:t>
+      </w:r>
+      <w:r>
+        <w:t>stored in fwdata</w:t>
+      </w:r>
+      <w:r>
+        <w:t>.</w:t>
+      </w:r>
+    </w:p>
+    <w:p>
+      <w:pPr>
+        <w:pStyle w:val="Example"/>
+      </w:pPr>
+      <w:r>
+        <w:t>&lt;Name&gt;</w:t>
+      </w:r>
+      <w:r>
+        <w:br/>
+        <w:t>&lt;AUni ws="en"&gt;adjunct&lt;/AUni&gt;</w:t>
+      </w:r>
+      <w:r>
+        <w:br/>
+        <w:t>&lt;AUni ws="fr"&gt;accessoire&lt;/AUni&gt;</w:t>
+      </w:r>
+      <w:r>
+        <w:br/>
+        <w:t>&lt;AUni ws="es"&gt;adjunto&lt;/AUni&gt;</w:t>
+      </w:r>
+      <w:r>
+        <w:br/>
+        <w:t>&lt;/Name&gt;</w:t>
+      </w:r>
+    </w:p>
+    <w:p>
+      <w:pPr>
+        <w:pStyle w:val="BodyText"/>
+      </w:pPr>
+      <w:r>
+        <w:t>This field is the Name for a CmPossibility object. In this case, there are three FieldWorks Unicode strings; English, French, and Spanish. Each FieldWorks Unicode string is stored in an AUni element. Even though the FieldWorks Unicode string itself does not have a writing system, FieldWorks knows the intended writing system by the “ws” attribute of the AUni element. It is an error to have more than one AUni element in a single property with the same writing system.</w:t>
+      </w:r>
+    </w:p>
+    <w:p>
+      <w:pPr>
+        <w:pStyle w:val="Heading4"/>
+      </w:pPr>
+      <w:bookmarkStart w:id="15" w:name="_Toc318113553"/>
+      <w:bookmarkStart w:id="16" w:name="_Toc170205513"/>
+      <w:r>
+        <w:t>MultiString</w:t>
+      </w:r>
       <w:bookmarkEnd w:id="15"/>
-    </w:p>
-    <w:p>
-      <w:pPr>
-        <w:pStyle w:val="BodyText"/>
-      </w:pPr>
-      <w:r>
-        <w:t xml:space="preserve">Many properties (fields) in FieldWorks are designed to hold strings that will never have embedding, but may have translations in different languages or writing systems (e.g., lexeme form, gloss, and names and abbreviations for list items). Here is how these MultiUnicode properties are </w:t>
-      </w:r>
-      <w:r>
-        <w:t>stored in fwdata</w:t>
-      </w:r>
-      <w:r>
-        <w:t>.</w:t>
+      <w:bookmarkEnd w:id="16"/>
+    </w:p>
+    <w:p>
+      <w:pPr>
+        <w:pStyle w:val="BodyText"/>
+      </w:pPr>
+      <w:r>
+        <w:t>Other properties (fields) need the ability to store equivalent translations, but also need to allow embedded writing systems and formatting</w:t>
+      </w:r>
+      <w:r>
+        <w:t xml:space="preserve"> (e.g., definition, example sentence, example translations, all note fields)</w:t>
+      </w:r>
+      <w:r>
+        <w:t xml:space="preserve">. Here </w:t>
+      </w:r>
+      <w:proofErr w:type="gramStart"/>
+      <w:r>
+        <w:t>is</w:t>
+      </w:r>
+      <w:proofErr w:type="gramEnd"/>
+      <w:r>
+        <w:t xml:space="preserve"> how these MultiString properties are encoded.</w:t>
       </w:r>
     </w:p>
     <w:p>
@@ -8528,64 +8639,6 @@
         <w:pStyle w:val="Example"/>
       </w:pPr>
       <w:r>
-        <w:t>&lt;Name&gt;</w:t>
-      </w:r>
-      <w:r>
-        <w:br/>
-        <w:t>&lt;AUni ws="en"&gt;adjunct&lt;/AUni&gt;</w:t>
-      </w:r>
-      <w:r>
-        <w:br/>
-        <w:t>&lt;AUni ws="fr"&gt;accessoire&lt;/AUni&gt;</w:t>
-      </w:r>
-      <w:r>
-        <w:br/>
-        <w:t>&lt;AUni ws="es"&gt;adjunto&lt;/AUni&gt;</w:t>
-      </w:r>
-      <w:r>
-        <w:br/>
-        <w:t>&lt;/Name&gt;</w:t>
-      </w:r>
-    </w:p>
-    <w:p>
-      <w:pPr>
-        <w:pStyle w:val="BodyText"/>
-      </w:pPr>
-      <w:r>
-        <w:t>This field is the Name for a CmPossibility object. In this case, there are three FieldWorks Unicode strings; English, French, and Spanish. Each FieldWorks Unicode string is stored in an AUni element. Even though the FieldWorks Unicode string itself does not have a writing system, FieldWorks knows the intended writing system by the “ws” attribute of the AUni element. It is an error to have more than one AUni element in a single property with the same writing system.</w:t>
-      </w:r>
-    </w:p>
-    <w:p>
-      <w:pPr>
-        <w:pStyle w:val="Heading4"/>
-      </w:pPr>
-      <w:bookmarkStart w:id="16" w:name="_Toc318113553"/>
-      <w:bookmarkStart w:id="17" w:name="_Toc170205513"/>
-      <w:r>
-        <w:t>MultiString</w:t>
-      </w:r>
-      <w:bookmarkEnd w:id="16"/>
-      <w:bookmarkEnd w:id="17"/>
-    </w:p>
-    <w:p>
-      <w:pPr>
-        <w:pStyle w:val="BodyText"/>
-      </w:pPr>
-      <w:r>
-        <w:t>Other properties (fields) need the ability to store equivalent translations, but also need to allow embedded writing systems and formatting</w:t>
-      </w:r>
-      <w:r>
-        <w:t xml:space="preserve"> (e.g., definition, example sentence, example translations, all note fields)</w:t>
-      </w:r>
-      <w:r>
-        <w:t>. Here is how these MultiString properties are encoded.</w:t>
-      </w:r>
-    </w:p>
-    <w:p>
-      <w:pPr>
-        <w:pStyle w:val="Example"/>
-      </w:pPr>
-      <w:r>
         <w:t>&lt;Translation&gt;</w:t>
       </w:r>
       <w:r>
@@ -8594,7 +8647,15 @@
       </w:r>
       <w:r>
         <w:br/>
-        <w:t>&lt;Run ws="en"&gt;You may damage the computer.&lt;/Run&gt;</w:t>
+        <w:t xml:space="preserve">&lt;Run ws="en"&gt;You may damage the </w:t>
+      </w:r>
+      <w:proofErr w:type="gramStart"/>
+      <w:r>
+        <w:t>computer.&lt;</w:t>
+      </w:r>
+      <w:proofErr w:type="gramEnd"/>
+      <w:r>
+        <w:t>/Run&gt;</w:t>
       </w:r>
       <w:r>
         <w:br/>
@@ -8657,10 +8718,71 @@
       <w:pPr>
         <w:pStyle w:val="Heading3"/>
       </w:pPr>
-      <w:bookmarkStart w:id="18" w:name="_Toc170205514"/>
+      <w:bookmarkStart w:id="17" w:name="_Toc170205514"/>
       <w:r>
         <w:t>Binary</w:t>
       </w:r>
+      <w:bookmarkEnd w:id="17"/>
+    </w:p>
+    <w:p>
+      <w:pPr>
+        <w:pStyle w:val="BodyText"/>
+      </w:pPr>
+      <w:r>
+        <w:t>Binary properties are represented as follows:</w:t>
+      </w:r>
+    </w:p>
+    <w:p>
+      <w:pPr>
+        <w:pStyle w:val="Example"/>
+      </w:pPr>
+      <w:r>
+        <w:t>&lt;</w:t>
+      </w:r>
+      <w:r>
+        <w:t>Sid</w:t>
+      </w:r>
+      <w:r>
+        <w:t>&gt;</w:t>
+      </w:r>
+      <w:r>
+        <w:br/>
+      </w:r>
+      <w:r>
+        <w:t>&lt;Binary&gt;6400000001000000&lt;/Binary&gt;</w:t>
+      </w:r>
+      <w:r>
+        <w:br/>
+      </w:r>
+      <w:r>
+        <w:t>&lt;/</w:t>
+      </w:r>
+      <w:r>
+        <w:t>Sid</w:t>
+      </w:r>
+      <w:r>
+        <w:t>&gt;</w:t>
+      </w:r>
+    </w:p>
+    <w:p>
+      <w:pPr>
+        <w:pStyle w:val="BodyText"/>
+      </w:pPr>
+      <w:r>
+        <w:t>Binary data is stored as a sequence of hexadecimal bytes.</w:t>
+      </w:r>
+      <w:r>
+        <w:t xml:space="preserve"> Our current model only has one Binary property: Sid on UserConfigAcct. But I don’t think it is used anywhere.</w:t>
+      </w:r>
+    </w:p>
+    <w:p>
+      <w:pPr>
+        <w:pStyle w:val="Heading3"/>
+      </w:pPr>
+      <w:bookmarkStart w:id="18" w:name="_Toc170205515"/>
+      <w:r>
+        <w:t>Boolean</w:t>
+      </w:r>
       <w:bookmarkEnd w:id="18"/>
     </w:p>
     <w:p>
@@ -8668,7 +8790,7 @@
         <w:pStyle w:val="BodyText"/>
       </w:pPr>
       <w:r>
-        <w:t>Binary properties are represented as follows:</w:t>
+        <w:t>Boolean properties are represented as follows:</w:t>
       </w:r>
     </w:p>
     <w:p>
@@ -8676,60 +8798,35 @@
         <w:pStyle w:val="Example"/>
       </w:pPr>
       <w:r>
-        <w:t>&lt;</w:t>
-      </w:r>
-      <w:r>
-        <w:t>Sid</w:t>
-      </w:r>
-      <w:r>
-        <w:t>&gt;</w:t>
-      </w:r>
-      <w:r>
-        <w:br/>
-      </w:r>
-      <w:r>
-        <w:t>&lt;Binary&gt;6400000001000000&lt;/Binary&gt;</w:t>
-      </w:r>
-      <w:r>
-        <w:br/>
-      </w:r>
-      <w:r>
-        <w:t>&lt;/</w:t>
-      </w:r>
-      <w:r>
-        <w:t>Sid</w:t>
-      </w:r>
-      <w:r>
-        <w:t>&gt;</w:t>
-      </w:r>
-    </w:p>
-    <w:p>
-      <w:pPr>
-        <w:pStyle w:val="BodyText"/>
-      </w:pPr>
-      <w:r>
-        <w:t>Binary data is stored as a sequence of hexadecimal bytes.</w:t>
-      </w:r>
-      <w:r>
-        <w:t xml:space="preserve"> Our current model only has one Binary property: Sid on UserConfigAcct. But I don’t think it is used anywhere.</w:t>
+        <w:t>&lt;IsSorted val="true"/&gt;</w:t>
+      </w:r>
+    </w:p>
+    <w:p>
+      <w:pPr>
+        <w:pStyle w:val="BodyText"/>
+      </w:pPr>
+      <w:r>
+        <w:t>This is the IsSorted property on CmPossibilityList. The value is stored in the “val” attribute as “true” or “false”. The default value for missing properties is false.</w:t>
       </w:r>
     </w:p>
     <w:p>
       <w:pPr>
         <w:pStyle w:val="Heading3"/>
       </w:pPr>
-      <w:bookmarkStart w:id="19" w:name="_Toc170205515"/>
-      <w:r>
-        <w:t>Boolean</w:t>
+      <w:bookmarkStart w:id="19" w:name="_Ref163130885"/>
+      <w:bookmarkStart w:id="20" w:name="_Toc170205516"/>
+      <w:r>
+        <w:t>GenDate</w:t>
       </w:r>
       <w:bookmarkEnd w:id="19"/>
-    </w:p>
-    <w:p>
-      <w:pPr>
-        <w:pStyle w:val="BodyText"/>
-      </w:pPr>
-      <w:r>
-        <w:t>Boolean properties are represented as follows:</w:t>
+      <w:bookmarkEnd w:id="20"/>
+    </w:p>
+    <w:p>
+      <w:pPr>
+        <w:pStyle w:val="BodyText"/>
+      </w:pPr>
+      <w:r>
+        <w:t>GenDate provides a way to store an approximate date without a time (e.g., before March 1200 AD). They are stored as an int (4 bytes). This is a decimal representation of a generic date without a time. It's up to the software to make sure the int is a valid date. The range is 21474 BC through 21474 AD. The format is:</w:t>
       </w:r>
     </w:p>
     <w:p>
@@ -8737,128 +8834,143 @@
         <w:pStyle w:val="Example"/>
       </w:pPr>
       <w:r>
-        <w:t>&lt;IsSorted val="true"/&gt;</w:t>
-      </w:r>
-    </w:p>
-    <w:p>
-      <w:pPr>
-        <w:pStyle w:val="BodyText"/>
-      </w:pPr>
-      <w:r>
-        <w:t>This is the IsSorted property on CmPossibilityList. The value is stored in the “val” attribute as “true” or “false”. The default value for missing properties is false.</w:t>
+        <w:t>[-]YYYYMMDDP</w:t>
+      </w:r>
+      <w:r>
+        <w:br/>
+        <w:t>YYYY is the 1-5 digit year (negative is BC) 0000 is unknown.</w:t>
+      </w:r>
+      <w:r>
+        <w:br/>
+        <w:t>MM is the 2 digit month (for BC months it is 13 - M) 00 is unknown</w:t>
+      </w:r>
+      <w:r>
+        <w:br/>
+        <w:t>DD is the 2 digit day (for BC days it is 32 - D) 00 is unknown</w:t>
+      </w:r>
+      <w:r>
+        <w:br/>
+        <w:t>P is one of the following:</w:t>
+      </w:r>
+      <w:r>
+        <w:br/>
+        <w:t xml:space="preserve">  0 = Before (If GenDate = 0, it means nothing is entered)</w:t>
+      </w:r>
+      <w:r>
+        <w:br/>
+        <w:t xml:space="preserve">  1 = Exact</w:t>
+      </w:r>
+      <w:r>
+        <w:br/>
+        <w:t xml:space="preserve">  2 = Approximate</w:t>
+      </w:r>
+      <w:r>
+        <w:br/>
+        <w:t xml:space="preserve">  3 = After</w:t>
+      </w:r>
+    </w:p>
+    <w:p>
+      <w:pPr>
+        <w:pStyle w:val="BodyText"/>
+      </w:pPr>
+      <w:r>
+        <w:t>GenDate properties are represented as follows:</w:t>
+      </w:r>
+    </w:p>
+    <w:p>
+      <w:pPr>
+        <w:pStyle w:val="Example"/>
+      </w:pPr>
+      <w:r>
+        <w:t>&lt;DateOfEvent val="202404020" /&gt;</w:t>
+      </w:r>
+    </w:p>
+    <w:p>
+      <w:pPr>
+        <w:pStyle w:val="BodyText"/>
+      </w:pPr>
+      <w:r>
+        <w:t>This is the DateOfEvent property on Rn</w:t>
+      </w:r>
+      <w:r>
+        <w:t>GenericRec</w:t>
+      </w:r>
+      <w:r>
+        <w:t xml:space="preserve"> representing Before April 2, 2024</w:t>
+      </w:r>
+      <w:r>
+        <w:t>. The generic date is stored as a decimal number in the “val” attribute.</w:t>
+      </w:r>
+      <w:r>
+        <w:t xml:space="preserve"> In Notebook, GenDate is available on Date of Event and uses a dialog to specify the parts of the date. GenDate is also available on CmPerson</w:t>
+      </w:r>
+      <w:r>
+        <w:t xml:space="preserve"> for DateOfBirth and DateOfDeath</w:t>
+      </w:r>
+      <w:r>
+        <w:t>, but it is not implemented in the current FLEx UI.</w:t>
       </w:r>
     </w:p>
     <w:p>
       <w:pPr>
         <w:pStyle w:val="Heading3"/>
       </w:pPr>
-      <w:bookmarkStart w:id="20" w:name="_Ref163130885"/>
-      <w:bookmarkStart w:id="21" w:name="_Toc170205516"/>
-      <w:r>
-        <w:t>GenDate</w:t>
-      </w:r>
-      <w:bookmarkEnd w:id="20"/>
-      <w:bookmarkEnd w:id="21"/>
-    </w:p>
-    <w:p>
-      <w:pPr>
-        <w:pStyle w:val="BodyText"/>
-      </w:pPr>
-      <w:r>
-        <w:t>GenDate provides a way to store an approximate date without a time (e.g., before March 1200 AD). They are stored as an int (4 bytes). This is a decimal representation of a generic date without a time. It's up to the software to make sure the int is a valid date. The range is 21474 BC through 21474 AD. The format is:</w:t>
-      </w:r>
-    </w:p>
-    <w:p>
-      <w:pPr>
-        <w:pStyle w:val="Example"/>
-      </w:pPr>
-      <w:r>
-        <w:t>[-]YYYYMMDDP</w:t>
-      </w:r>
-      <w:r>
-        <w:br/>
-        <w:t>YYYY is the 1-5 digit year (negative is BC) 0000 is unknown.</w:t>
-      </w:r>
-      <w:r>
-        <w:br/>
-        <w:t>MM is the 2 digit month (for BC months it is 13 - M) 00 is unknown</w:t>
-      </w:r>
-      <w:r>
-        <w:br/>
-        <w:t>DD is the 2 digit day (for BC days it is 32 - D) 00 is unknown</w:t>
-      </w:r>
-      <w:r>
-        <w:br/>
-        <w:t>P is one of the following:</w:t>
-      </w:r>
-      <w:r>
-        <w:br/>
-        <w:t xml:space="preserve">  0 = Before (If GenDate = 0, it means nothing is entered)</w:t>
-      </w:r>
-      <w:r>
-        <w:br/>
-        <w:t xml:space="preserve">  1 = Exact</w:t>
-      </w:r>
-      <w:r>
-        <w:br/>
-        <w:t xml:space="preserve">  2 = Approximate</w:t>
-      </w:r>
-      <w:r>
-        <w:br/>
-        <w:t xml:space="preserve">  3 = After</w:t>
-      </w:r>
-    </w:p>
-    <w:p>
-      <w:pPr>
-        <w:pStyle w:val="BodyText"/>
-      </w:pPr>
-      <w:r>
-        <w:t>GenDate properties are represented as follows:</w:t>
-      </w:r>
-    </w:p>
-    <w:p>
-      <w:pPr>
-        <w:pStyle w:val="Example"/>
-      </w:pPr>
-      <w:r>
-        <w:t>&lt;DateOfEvent val="202404020" /&gt;</w:t>
-      </w:r>
-    </w:p>
-    <w:p>
-      <w:pPr>
-        <w:pStyle w:val="BodyText"/>
-      </w:pPr>
-      <w:r>
-        <w:t>This is the DateOfEvent property on Rn</w:t>
-      </w:r>
-      <w:r>
-        <w:t>GenericRec</w:t>
-      </w:r>
-      <w:r>
-        <w:t xml:space="preserve"> representing Before April 2, 2024</w:t>
-      </w:r>
-      <w:r>
-        <w:t>. The generic date is stored as a decimal number in the “val” attribute.</w:t>
-      </w:r>
-      <w:r>
-        <w:t xml:space="preserve"> In Notebook, GenDate is available on Date of Event and uses a dialog to specify the parts of the date. GenDate is also available on CmPerson</w:t>
-      </w:r>
-      <w:r>
-        <w:t xml:space="preserve"> for DateOfBirth and DateOfDeath</w:t>
-      </w:r>
-      <w:r>
-        <w:t>, but it is not implemented in the current FLEx UI.</w:t>
-      </w:r>
-    </w:p>
-    <w:p>
-      <w:pPr>
-        <w:pStyle w:val="Heading3"/>
-      </w:pPr>
-      <w:bookmarkStart w:id="22" w:name="_Toc170205517"/>
+      <w:bookmarkStart w:id="21" w:name="_Toc170205517"/>
       <w:r>
         <w:lastRenderedPageBreak/>
         <w:t>Guid</w:t>
       </w:r>
+      <w:bookmarkEnd w:id="21"/>
+    </w:p>
+    <w:p>
+      <w:pPr>
+        <w:pStyle w:val="BodyText"/>
+      </w:pPr>
+      <w:r>
+        <w:t>GUID (Globally Unique Identifier) properties are represented as follows:</w:t>
+      </w:r>
+    </w:p>
+    <w:p>
+      <w:pPr>
+        <w:pStyle w:val="Example"/>
+      </w:pPr>
+      <w:r>
+        <w:t>&lt;ListVersion val="b41ff27f-5caf-4eac-92de-0f92acb0caa3"/&gt;</w:t>
+      </w:r>
+    </w:p>
+    <w:p>
+      <w:pPr>
+        <w:pStyle w:val="BodyText"/>
+      </w:pPr>
+      <w:r>
+        <w:t xml:space="preserve">This is the ListVersion property on CmPossibilityList. The GUID value is stored in the “val” attribute in this string format using </w:t>
+      </w:r>
+      <w:r>
+        <w:t>this</w:t>
+      </w:r>
+      <w:r>
+        <w:t xml:space="preserve"> hex format.</w:t>
+      </w:r>
+    </w:p>
+    <w:p>
+      <w:pPr>
+        <w:pStyle w:val="BodyText"/>
+      </w:pPr>
+      <w:r>
+        <w:t xml:space="preserve">Internal </w:t>
+      </w:r>
+      <w:r>
+        <w:t>FLEx code often refers to an object using an hvo (handle to a viewable object). This is a single integer that is assigned to each object when it is loaded. While in memory, it is a reliable and quick way to find and reference objects. However, the next time the project is loaded, especially if objects were added or deleted, it can affect some or all of the hvos the next time it is loaded. In debugging it’s often challenging to find a guid for an object when all you have is the hvo, and fwdata only has guids.</w:t>
+      </w:r>
+    </w:p>
+    <w:p>
+      <w:pPr>
+        <w:pStyle w:val="Heading3"/>
+      </w:pPr>
+      <w:bookmarkStart w:id="22" w:name="_Toc170205518"/>
+      <w:r>
+        <w:t>Integer</w:t>
+      </w:r>
       <w:bookmarkEnd w:id="22"/>
     </w:p>
     <w:p>
@@ -8866,7 +8978,13 @@
         <w:pStyle w:val="BodyText"/>
       </w:pPr>
       <w:r>
-        <w:t>GUID (Globally Unique Identifier) properties are represented as follows:</w:t>
+        <w:t xml:space="preserve">Integer properties </w:t>
+      </w:r>
+      <w:r>
+        <w:t xml:space="preserve">hold positive or negative 64-bit integers and </w:t>
+      </w:r>
+      <w:r>
+        <w:t>are represented as follows:</w:t>
       </w:r>
     </w:p>
     <w:p>
@@ -8874,95 +8992,38 @@
         <w:pStyle w:val="Example"/>
       </w:pPr>
       <w:r>
-        <w:t>&lt;ListVersion val="b41ff27f-5caf-4eac-92de-0f92acb0caa3"/&gt;</w:t>
-      </w:r>
-    </w:p>
-    <w:p>
-      <w:pPr>
-        <w:pStyle w:val="BodyText"/>
-      </w:pPr>
-      <w:r>
-        <w:t xml:space="preserve">This is the ListVersion property on CmPossibilityList. The GUID value is stored in the “val” attribute in this string format using </w:t>
-      </w:r>
-      <w:r>
-        <w:t>this</w:t>
-      </w:r>
-      <w:r>
-        <w:t xml:space="preserve"> hex format.</w:t>
-      </w:r>
-    </w:p>
-    <w:p>
-      <w:pPr>
-        <w:pStyle w:val="BodyText"/>
-      </w:pPr>
-      <w:r>
-        <w:t xml:space="preserve">Internal </w:t>
-      </w:r>
-      <w:r>
-        <w:t>FLEx code often refers to an object using an hvo (handle to a viewable object). This is a single integer that is assigned to each object when it is loaded. While in memory, it is a reliable and quick way to find and reference objects. However, the next time the project is loaded, especially if objects were added or deleted, it can affect some or all of the hvos the next time it is loaded. In debugging it’s often challenging to find a guid for an object when all you have is the hvo, and fwdata only has guids.</w:t>
+        <w:t>&lt;HomographNumber val="1</w:t>
+      </w:r>
+      <w:r>
+        <w:t>2</w:t>
+      </w:r>
+      <w:r>
+        <w:t>"/&gt;</w:t>
+      </w:r>
+    </w:p>
+    <w:p>
+      <w:pPr>
+        <w:pStyle w:val="BodyText"/>
+      </w:pPr>
+      <w:r>
+        <w:t xml:space="preserve">This is the HomographNumber property on LexEntry. The value of the integer is stored as a decimal “val” attribute. The default value for missing properties is </w:t>
+      </w:r>
+      <w:r>
+        <w:t>0</w:t>
+      </w:r>
+      <w:r>
+        <w:t>.</w:t>
       </w:r>
     </w:p>
     <w:p>
       <w:pPr>
         <w:pStyle w:val="Heading3"/>
       </w:pPr>
-      <w:bookmarkStart w:id="23" w:name="_Toc170205518"/>
-      <w:r>
-        <w:t>Integer</w:t>
+      <w:bookmarkStart w:id="23" w:name="_Toc170205519"/>
+      <w:r>
+        <w:t>TextPropBinary</w:t>
       </w:r>
       <w:bookmarkEnd w:id="23"/>
-    </w:p>
-    <w:p>
-      <w:pPr>
-        <w:pStyle w:val="BodyText"/>
-      </w:pPr>
-      <w:r>
-        <w:t xml:space="preserve">Integer properties </w:t>
-      </w:r>
-      <w:r>
-        <w:t xml:space="preserve">hold positive or negative 64-bit integers and </w:t>
-      </w:r>
-      <w:r>
-        <w:t>are represented as follows:</w:t>
-      </w:r>
-    </w:p>
-    <w:p>
-      <w:pPr>
-        <w:pStyle w:val="Example"/>
-      </w:pPr>
-      <w:r>
-        <w:t>&lt;HomographNumber val="1</w:t>
-      </w:r>
-      <w:r>
-        <w:t>2</w:t>
-      </w:r>
-      <w:r>
-        <w:t>"/&gt;</w:t>
-      </w:r>
-    </w:p>
-    <w:p>
-      <w:pPr>
-        <w:pStyle w:val="BodyText"/>
-      </w:pPr>
-      <w:r>
-        <w:t xml:space="preserve">This is the HomographNumber property on LexEntry. The value of the integer is stored as a decimal “val” attribute. The default value for missing properties is </w:t>
-      </w:r>
-      <w:r>
-        <w:t>0</w:t>
-      </w:r>
-      <w:r>
-        <w:t>.</w:t>
-      </w:r>
-    </w:p>
-    <w:p>
-      <w:pPr>
-        <w:pStyle w:val="Heading3"/>
-      </w:pPr>
-      <w:bookmarkStart w:id="24" w:name="_Toc170205519"/>
-      <w:r>
-        <w:t>TextPropBinary</w:t>
-      </w:r>
-      <w:bookmarkEnd w:id="24"/>
     </w:p>
     <w:p>
       <w:pPr>
@@ -9591,79 +9652,84 @@
       <w:pPr>
         <w:pStyle w:val="Heading3"/>
       </w:pPr>
-      <w:bookmarkStart w:id="25" w:name="_Toc170205520"/>
+      <w:bookmarkStart w:id="24" w:name="_Toc170205520"/>
       <w:r>
         <w:lastRenderedPageBreak/>
         <w:t>Time</w:t>
       </w:r>
+      <w:bookmarkEnd w:id="24"/>
+    </w:p>
+    <w:p>
+      <w:pPr>
+        <w:pStyle w:val="BodyText"/>
+      </w:pPr>
+      <w:r>
+        <w:t>Time properties</w:t>
+      </w:r>
+      <w:r>
+        <w:t xml:space="preserve"> store a date and time and</w:t>
+      </w:r>
+      <w:r>
+        <w:t xml:space="preserve"> are represented as follows:</w:t>
+      </w:r>
+    </w:p>
+    <w:p>
+      <w:pPr>
+        <w:pStyle w:val="Example"/>
+      </w:pPr>
+      <w:r>
+        <w:t>&lt;DateModifi</w:t>
+      </w:r>
+      <w:r>
+        <w:t>ed val="2009-9-23 20:53:23.390"</w:t>
+      </w:r>
+      <w:r>
+        <w:t>/&gt;</w:t>
+      </w:r>
+    </w:p>
+    <w:p>
+      <w:pPr>
+        <w:pStyle w:val="BodyText"/>
+      </w:pPr>
+      <w:r>
+        <w:t>This is the DateModified property on CmMajorObject. The time is stored in the “val” attribute in the format YYYY-MM-DD HH:</w:t>
+      </w:r>
+      <w:proofErr w:type="gramStart"/>
+      <w:r>
+        <w:t>MM:SS.TTT</w:t>
+      </w:r>
+      <w:proofErr w:type="gramEnd"/>
+      <w:r>
+        <w:t xml:space="preserve"> </w:t>
+      </w:r>
+      <w:r>
+        <w:t>(TTT is thousandths of a second)</w:t>
+      </w:r>
+      <w:r>
+        <w:t>.</w:t>
+      </w:r>
+      <w:r>
+        <w:t xml:space="preserve"> This format should be used regardless of the locale of the computer.</w:t>
+      </w:r>
+      <w:r>
+        <w:t xml:space="preserve"> </w:t>
+      </w:r>
+      <w:r>
+        <w:t>If the format is incorrect, usually Tools &gt; Utilities &gt; Write Everything will fix them.</w:t>
+      </w:r>
+    </w:p>
+    <w:p>
+      <w:pPr>
+        <w:pStyle w:val="Heading2"/>
+      </w:pPr>
+      <w:bookmarkStart w:id="25" w:name="_Toc170205521"/>
+      <w:r>
+        <w:t>Linking</w:t>
+      </w:r>
+      <w:r>
+        <w:t xml:space="preserve"> properties</w:t>
+      </w:r>
       <w:bookmarkEnd w:id="25"/>
-    </w:p>
-    <w:p>
-      <w:pPr>
-        <w:pStyle w:val="BodyText"/>
-      </w:pPr>
-      <w:r>
-        <w:t>Time properties</w:t>
-      </w:r>
-      <w:r>
-        <w:t xml:space="preserve"> store a date and time and</w:t>
-      </w:r>
-      <w:r>
-        <w:t xml:space="preserve"> are represented as follows:</w:t>
-      </w:r>
-    </w:p>
-    <w:p>
-      <w:pPr>
-        <w:pStyle w:val="Example"/>
-      </w:pPr>
-      <w:r>
-        <w:t>&lt;DateModifi</w:t>
-      </w:r>
-      <w:r>
-        <w:t>ed val="2009-9-23 20:53:23.390"</w:t>
-      </w:r>
-      <w:r>
-        <w:t>/&gt;</w:t>
-      </w:r>
-    </w:p>
-    <w:p>
-      <w:pPr>
-        <w:pStyle w:val="BodyText"/>
-      </w:pPr>
-      <w:r>
-        <w:t>This is the DateModified property on CmMajorObject. The time is stored in the “val” attribute in the format YYYY-MM-DD HH:MM:SS.TTT</w:t>
-      </w:r>
-      <w:r>
-        <w:t xml:space="preserve"> </w:t>
-      </w:r>
-      <w:r>
-        <w:t>(TTT is thousandths of a second)</w:t>
-      </w:r>
-      <w:r>
-        <w:t>.</w:t>
-      </w:r>
-      <w:r>
-        <w:t xml:space="preserve"> This format should be used regardless of the locale of the computer.</w:t>
-      </w:r>
-      <w:r>
-        <w:t xml:space="preserve"> </w:t>
-      </w:r>
-      <w:r>
-        <w:t>If the format is incorrect, usually Tools &gt; Utilities &gt; Write Everything will fix them.</w:t>
-      </w:r>
-    </w:p>
-    <w:p>
-      <w:pPr>
-        <w:pStyle w:val="Heading2"/>
-      </w:pPr>
-      <w:bookmarkStart w:id="26" w:name="_Toc170205521"/>
-      <w:r>
-        <w:t>Linking</w:t>
-      </w:r>
-      <w:r>
-        <w:t xml:space="preserve"> properties</w:t>
-      </w:r>
-      <w:bookmarkEnd w:id="26"/>
     </w:p>
     <w:p>
       <w:pPr>
@@ -9808,11 +9874,11 @@
       <w:pPr>
         <w:pStyle w:val="Heading2"/>
       </w:pPr>
-      <w:bookmarkStart w:id="27" w:name="_Toc170205522"/>
+      <w:bookmarkStart w:id="26" w:name="_Toc170205522"/>
       <w:r>
         <w:t>Owning relationships</w:t>
       </w:r>
-      <w:bookmarkEnd w:id="27"/>
+      <w:bookmarkEnd w:id="26"/>
     </w:p>
     <w:p>
       <w:pPr>
@@ -10334,11 +10400,11 @@
       <w:pPr>
         <w:pStyle w:val="Heading2"/>
       </w:pPr>
-      <w:bookmarkStart w:id="28" w:name="_Toc170205523"/>
+      <w:bookmarkStart w:id="27" w:name="_Toc170205523"/>
       <w:r>
         <w:t>Reference relationships</w:t>
       </w:r>
-      <w:bookmarkEnd w:id="28"/>
+      <w:bookmarkEnd w:id="27"/>
     </w:p>
     <w:p>
       <w:pPr>
@@ -10668,7 +10734,15 @@
         <w:t>the deleted</w:t>
       </w:r>
       <w:r>
-        <w:t xml:space="preserve"> object are removed from the referring objects. If something goes wrong and a reference property points to a non-existent object, FLEx will likely crash at some point. The problem can be fixed easily by closing the project, opening another project and running Tools &gt; Utilities &gt; Find and fix.. and specify the desired project. This will remove any orphaned owning and reference links.</w:t>
+        <w:t xml:space="preserve"> object are removed from the referring objects. If something goes wrong and a reference property points to a non-existent object, FLEx will likely crash at some point. The problem can be fixed easily by closing the project, opening another project and running Tools &gt; Utilities &gt; Find and </w:t>
+      </w:r>
+      <w:proofErr w:type="gramStart"/>
+      <w:r>
+        <w:t>fix..</w:t>
+      </w:r>
+      <w:proofErr w:type="gramEnd"/>
+      <w:r>
+        <w:t xml:space="preserve"> and specify the desired project. This will remove any orphaned owning and reference links.</w:t>
       </w:r>
       <w:r>
         <w:t xml:space="preserve"> In the fwdata file, you would remove any orphaned objsur links. If it’s the only link, remove the reference </w:t>
@@ -10684,11 +10758,11 @@
       <w:pPr>
         <w:pStyle w:val="Heading2"/>
       </w:pPr>
-      <w:bookmarkStart w:id="29" w:name="_Toc170205524"/>
+      <w:bookmarkStart w:id="28" w:name="_Toc170205524"/>
       <w:r>
         <w:t>Styles</w:t>
       </w:r>
-      <w:bookmarkEnd w:id="29"/>
+      <w:bookmarkEnd w:id="28"/>
     </w:p>
     <w:p>
       <w:pPr>
@@ -10890,18 +10964,26 @@
       <w:pPr>
         <w:pStyle w:val="Heading2"/>
       </w:pPr>
-      <w:bookmarkStart w:id="30" w:name="_Toc170205525"/>
+      <w:bookmarkStart w:id="29" w:name="_Toc170205525"/>
       <w:r>
         <w:t>Possibility lists</w:t>
       </w:r>
-      <w:bookmarkEnd w:id="30"/>
-    </w:p>
-    <w:p>
-      <w:pPr>
-        <w:pStyle w:val="BodyText"/>
-      </w:pPr>
-      <w:r>
-        <w:t>Rather than letting users type (and mistype) fixed lists</w:t>
+      <w:bookmarkEnd w:id="29"/>
+    </w:p>
+    <w:p>
+      <w:pPr>
+        <w:pStyle w:val="BodyText"/>
+      </w:pPr>
+      <w:r>
+        <w:t xml:space="preserve">Rather than letting </w:t>
+      </w:r>
+      <w:proofErr w:type="gramStart"/>
+      <w:r>
+        <w:t>users</w:t>
+      </w:r>
+      <w:proofErr w:type="gramEnd"/>
+      <w:r>
+        <w:t xml:space="preserve"> type (and mistype) fixed lists</w:t>
       </w:r>
       <w:r>
         <w:t xml:space="preserve">, </w:t>
@@ -11927,7 +12009,15 @@
               <w:pStyle w:val="Tablecells"/>
             </w:pPr>
             <w:r>
-              <w:t>Category (Parts Of Speech)</w:t>
+              <w:t xml:space="preserve">Category (Parts </w:t>
+            </w:r>
+            <w:proofErr w:type="gramStart"/>
+            <w:r>
+              <w:t>Of</w:t>
+            </w:r>
+            <w:proofErr w:type="gramEnd"/>
+            <w:r>
+              <w:t xml:space="preserve"> Speech)</w:t>
             </w:r>
           </w:p>
         </w:tc>
@@ -13117,12 +13207,12 @@
       <w:pPr>
         <w:pStyle w:val="Heading2"/>
       </w:pPr>
-      <w:bookmarkStart w:id="31" w:name="_Toc170205526"/>
+      <w:bookmarkStart w:id="30" w:name="_Toc170205526"/>
       <w:r>
         <w:lastRenderedPageBreak/>
         <w:t>Custom fields</w:t>
       </w:r>
-      <w:bookmarkEnd w:id="31"/>
+      <w:bookmarkEnd w:id="30"/>
     </w:p>
     <w:p>
       <w:pPr>
@@ -13729,7 +13819,15 @@
       </w:r>
       <w:r>
         <w:br/>
-        <w:t>&lt;Run ws="en"&gt;This is the field content.&lt;/Run&gt;</w:t>
+        <w:t xml:space="preserve">&lt;Run ws="en"&gt;This is the field </w:t>
+      </w:r>
+      <w:proofErr w:type="gramStart"/>
+      <w:r>
+        <w:t>content.&lt;</w:t>
+      </w:r>
+      <w:proofErr w:type="gramEnd"/>
+      <w:r>
+        <w:t>/Run&gt;</w:t>
       </w:r>
       <w:r>
         <w:br/>
@@ -13863,11 +13961,11 @@
       <w:pPr>
         <w:pStyle w:val="Heading2"/>
       </w:pPr>
-      <w:bookmarkStart w:id="32" w:name="_Toc170205527"/>
+      <w:bookmarkStart w:id="31" w:name="_Toc170205527"/>
       <w:r>
         <w:t>Send/Receive Data</w:t>
       </w:r>
-      <w:bookmarkEnd w:id="32"/>
+      <w:bookmarkEnd w:id="31"/>
     </w:p>
     <w:p>
       <w:pPr>
@@ -14111,11 +14209,16 @@
         <w:t xml:space="preserve">Heres </w:t>
       </w:r>
       <w:r>
-        <w:t>how this entry would be stored in</w:t>
+        <w:t xml:space="preserve">how this entry would be stored </w:t>
+      </w:r>
+      <w:proofErr w:type="gramStart"/>
+      <w:r>
+        <w:t>in</w:t>
       </w:r>
       <w:r>
         <w:t xml:space="preserve"> .fwdata</w:t>
       </w:r>
+      <w:proofErr w:type="gramEnd"/>
       <w:r>
         <w:t xml:space="preserve"> with some extra fields removed</w:t>
       </w:r>
@@ -14485,7 +14588,15 @@
         <w:pStyle w:val="BodyText"/>
       </w:pPr>
       <w:r>
-        <w:t>Here’s the same sample in a .lexdb file</w:t>
+        <w:t xml:space="preserve">Here’s the same sample in </w:t>
+      </w:r>
+      <w:proofErr w:type="gramStart"/>
+      <w:r>
+        <w:t>a .lexdb</w:t>
+      </w:r>
+      <w:proofErr w:type="gramEnd"/>
+      <w:r>
+        <w:t xml:space="preserve"> file</w:t>
       </w:r>
       <w:r>
         <w:t xml:space="preserve"> used in Send/Receive</w:t>
@@ -15049,144 +15160,152 @@
       <w:pPr>
         <w:pStyle w:val="Heading1"/>
       </w:pPr>
-      <w:bookmarkStart w:id="33" w:name="_Toc170205528"/>
+      <w:bookmarkStart w:id="32" w:name="_Toc170205528"/>
       <w:r>
         <w:t>Conceptual model resources</w:t>
       </w:r>
+      <w:bookmarkEnd w:id="32"/>
+    </w:p>
+    <w:p>
+      <w:pPr>
+        <w:pStyle w:val="BodyText"/>
+      </w:pPr>
+      <w:r>
+        <w:t xml:space="preserve">There are various tools and resources that can help with understanding the FLEx model and data. </w:t>
+      </w:r>
+      <w:r>
+        <w:t xml:space="preserve">One way to see how something is modeled in FLEx is to search the fwdata file to see what is in the file for a particular object. You could type some unique string in the area you are interested in, and then search for that in fwdata. For an entry, you can Ctrl+right-click the entry in the dictionary or dictionary preview, and choose Inspect Entry. This opens a </w:t>
+      </w:r>
+      <w:r>
+        <w:t>window</w:t>
+      </w:r>
+      <w:r>
+        <w:t xml:space="preserve"> with the entry guid at the top, and the xhtml data at the bottom.</w:t>
+      </w:r>
+    </w:p>
+    <w:p>
+      <w:pPr>
+        <w:pStyle w:val="BodyText"/>
+      </w:pPr>
+      <w:r>
+        <w:t>In FLEx, Tools &gt; Utilities &gt; “Find and fix errors in a FieldWorks Data (XML)” will remove an</w:t>
+      </w:r>
+      <w:r>
+        <w:t>y</w:t>
+      </w:r>
+      <w:r>
+        <w:t xml:space="preserve"> links to non-existent objects. It will also delete </w:t>
+      </w:r>
+      <w:r>
+        <w:t>o</w:t>
+      </w:r>
+      <w:r>
+        <w:t>bjects that are missing owners. This can correct occasional problems that occur within the program, but is also useful for manual editing the fwdata file. If you delete a LexEntry rt object and then Run this utility, it will remove all of the ownership link</w:t>
+      </w:r>
+      <w:r>
+        <w:t>s</w:t>
+      </w:r>
+      <w:r>
+        <w:t xml:space="preserve">, delete all </w:t>
+      </w:r>
+      <w:r>
+        <w:t>objects</w:t>
+      </w:r>
+      <w:r>
+        <w:t xml:space="preserve"> that were owned by the entry, and remove all references to any of the deleted objects. </w:t>
+      </w:r>
+      <w:r>
+        <w:t xml:space="preserve">To run the </w:t>
+      </w:r>
+      <w:r>
+        <w:t xml:space="preserve">Find and Fix </w:t>
+      </w:r>
+      <w:r>
+        <w:t>Utilit</w:t>
+      </w:r>
+      <w:r>
+        <w:t>y</w:t>
+      </w:r>
+      <w:r>
+        <w:t>, you need to close the target project, then open another project and run the utilities from that project specifying the target file for the utility.</w:t>
+      </w:r>
+    </w:p>
+    <w:p>
+      <w:pPr>
+        <w:pStyle w:val="BodyText"/>
+      </w:pPr>
+      <w:r>
+        <w:t>T</w:t>
+      </w:r>
+      <w:r>
+        <w:t xml:space="preserve">he Write Everything utility will rewrite </w:t>
+      </w:r>
+      <w:r>
+        <w:t xml:space="preserve">the current project </w:t>
+      </w:r>
+      <w:r>
+        <w:t xml:space="preserve">fwdata in the standard way which will clean up manual changes that may be missing some null properties, </w:t>
+      </w:r>
+      <w:r>
+        <w:t>improperly forma</w:t>
+      </w:r>
+      <w:r>
+        <w:t>t</w:t>
+      </w:r>
+      <w:r>
+        <w:t xml:space="preserve">ted dates, </w:t>
+      </w:r>
+      <w:r>
+        <w:t>etc.</w:t>
+      </w:r>
+    </w:p>
+    <w:p>
+      <w:pPr>
+        <w:pStyle w:val="BodyText"/>
+      </w:pPr>
+      <w:r>
+        <w:t xml:space="preserve">ZEdit.exe is a simple editor that is installed with FieldWorks and is available </w:t>
+      </w:r>
+      <w:r>
+        <w:t xml:space="preserve">by typing Zedit into Windows Start or find it </w:t>
+      </w:r>
+      <w:r>
+        <w:t xml:space="preserve">in c:\Program Files\SIL\FieldWorks 9. </w:t>
+      </w:r>
+      <w:proofErr w:type="gramStart"/>
+      <w:r>
+        <w:t>It</w:t>
+      </w:r>
+      <w:proofErr w:type="gramEnd"/>
+      <w:r>
+        <w:t xml:space="preserve"> </w:t>
+      </w:r>
+      <w:r>
+        <w:t>memory-maps the data when a file is opened, so it can open large fwdata files very quickly and can be used to make changes. Just be sure to close the fwdata file before trying to do anything in FLEx that tries to update fwdata, or FLEx will be blocked. Notepad++ takes a lot longer to open a file, but it can remain open while FLEx is being used. One of its advantages is supporting regex for search and replace. In any text editor you can find the desired class by searching for</w:t>
+      </w:r>
+      <w:r>
+        <w:br/>
+        <w:t xml:space="preserve">   </w:t>
+      </w:r>
+      <w:r>
+        <w:t>" guid="</w:t>
+      </w:r>
+      <w:r>
+        <w:t xml:space="preserve"> followed by the guid.</w:t>
+      </w:r>
+    </w:p>
+    <w:p>
+      <w:pPr>
+        <w:pStyle w:val="Heading2"/>
+      </w:pPr>
+      <w:bookmarkStart w:id="33" w:name="_Toc170205529"/>
+      <w:r>
+        <w:t>M</w:t>
+      </w:r>
+      <w:r>
+        <w:t>odel diagram chm</w:t>
+      </w:r>
       <w:bookmarkEnd w:id="33"/>
-    </w:p>
-    <w:p>
-      <w:pPr>
-        <w:pStyle w:val="BodyText"/>
-      </w:pPr>
-      <w:r>
-        <w:t xml:space="preserve">There are various tools and resources that can help with understanding the FLEx model and data. </w:t>
-      </w:r>
-      <w:r>
-        <w:t xml:space="preserve">One way to see how something is modeled in FLEx is to search the fwdata file to see what is in the file for a particular object. You could type some unique string in the area you are interested in, and then search for that in fwdata. For an entry, you can Ctrl+right-click the entry in the dictionary or dictionary preview, and choose Inspect Entry. This opens a </w:t>
-      </w:r>
-      <w:r>
-        <w:t>window</w:t>
-      </w:r>
-      <w:r>
-        <w:t xml:space="preserve"> with the entry guid at the top, and the xhtml data at the bottom.</w:t>
-      </w:r>
-    </w:p>
-    <w:p>
-      <w:pPr>
-        <w:pStyle w:val="BodyText"/>
-      </w:pPr>
-      <w:r>
-        <w:t>In FLEx, Tools &gt; Utilities &gt; “Find and fix errors in a FieldWorks Data (XML)” will remove an</w:t>
-      </w:r>
-      <w:r>
-        <w:t>y</w:t>
-      </w:r>
-      <w:r>
-        <w:t xml:space="preserve"> links to non-existent objects. It will also delete </w:t>
-      </w:r>
-      <w:r>
-        <w:t>o</w:t>
-      </w:r>
-      <w:r>
-        <w:t>bjects that are missing owners. This can correct occasional problems that occur within the program, but is also useful for manual editing the fwdata file. If you delete a LexEntry rt object and then Run this utility, it will remove all of the ownership link</w:t>
-      </w:r>
-      <w:r>
-        <w:t>s</w:t>
-      </w:r>
-      <w:r>
-        <w:t xml:space="preserve">, delete all </w:t>
-      </w:r>
-      <w:r>
-        <w:t>objects</w:t>
-      </w:r>
-      <w:r>
-        <w:t xml:space="preserve"> that were owned by the entry, and remove all references to any of the deleted objects. </w:t>
-      </w:r>
-      <w:r>
-        <w:t xml:space="preserve">To run the </w:t>
-      </w:r>
-      <w:r>
-        <w:t xml:space="preserve">Find and Fix </w:t>
-      </w:r>
-      <w:r>
-        <w:t>Utilit</w:t>
-      </w:r>
-      <w:r>
-        <w:t>y</w:t>
-      </w:r>
-      <w:r>
-        <w:t>, you need to close the target project, then open another project and run the utilities from that project specifying the target file for the utility.</w:t>
-      </w:r>
-    </w:p>
-    <w:p>
-      <w:pPr>
-        <w:pStyle w:val="BodyText"/>
-      </w:pPr>
-      <w:r>
-        <w:t>T</w:t>
-      </w:r>
-      <w:r>
-        <w:t xml:space="preserve">he Write Everything utility will rewrite </w:t>
-      </w:r>
-      <w:r>
-        <w:t xml:space="preserve">the current project </w:t>
-      </w:r>
-      <w:r>
-        <w:t xml:space="preserve">fwdata in the standard way which will clean up manual changes that may be missing some null properties, </w:t>
-      </w:r>
-      <w:r>
-        <w:t>improperly forma</w:t>
-      </w:r>
-      <w:r>
-        <w:t>t</w:t>
-      </w:r>
-      <w:r>
-        <w:t xml:space="preserve">ted dates, </w:t>
-      </w:r>
-      <w:r>
-        <w:t>etc.</w:t>
-      </w:r>
-    </w:p>
-    <w:p>
-      <w:pPr>
-        <w:pStyle w:val="BodyText"/>
-      </w:pPr>
-      <w:r>
-        <w:t xml:space="preserve">ZEdit.exe is a simple editor that is installed with FieldWorks and is available </w:t>
-      </w:r>
-      <w:r>
-        <w:t xml:space="preserve">by typing Zedit into Windows Start or find it </w:t>
-      </w:r>
-      <w:r>
-        <w:t xml:space="preserve">in c:\Program Files\SIL\FieldWorks 9. It </w:t>
-      </w:r>
-      <w:r>
-        <w:t>memory-maps the data when a file is opened, so it can open large fwdata files very quickly and can be used to make changes. Just be sure to close the fwdata file before trying to do anything in FLEx that tries to update fwdata, or FLEx will be blocked. Notepad++ takes a lot longer to open a file, but it can remain open while FLEx is being used. One of its advantages is supporting regex for search and replace. In any text editor you can find the desired class by searching for</w:t>
-      </w:r>
-      <w:r>
-        <w:br/>
-        <w:t xml:space="preserve">   </w:t>
-      </w:r>
-      <w:r>
-        <w:t>" guid="</w:t>
-      </w:r>
-      <w:r>
-        <w:t xml:space="preserve"> followed by the guid.</w:t>
-      </w:r>
-    </w:p>
-    <w:p>
-      <w:pPr>
-        <w:pStyle w:val="Heading2"/>
-      </w:pPr>
-      <w:bookmarkStart w:id="34" w:name="_Toc170205529"/>
-      <w:r>
-        <w:t>M</w:t>
-      </w:r>
-      <w:r>
-        <w:t>odel diagram chm</w:t>
-      </w:r>
-      <w:bookmarkEnd w:id="34"/>
     </w:p>
     <w:p>
       <w:pPr>
@@ -15325,7 +15444,15 @@
         <w:t>, usually at the destination,</w:t>
       </w:r>
       <w:r>
-        <w:t xml:space="preserve"> there is a number indicating how many objects can be linked with this property. 1 means it’s atomic and 0..* means it’s a sequence or a collection. A sequence property has (ordered) along the line.</w:t>
+        <w:t xml:space="preserve"> there is a number indicating how many objects can be linked with this property. 1 means it’s atomic and </w:t>
+      </w:r>
+      <w:proofErr w:type="gramStart"/>
+      <w:r>
+        <w:t>0..</w:t>
+      </w:r>
+      <w:proofErr w:type="gramEnd"/>
+      <w:r>
+        <w:t>* means it’s a sequence or a collection. A sequence property has (ordered) along the line.</w:t>
       </w:r>
       <w:r>
         <w:t xml:space="preserve"> The property name is given above the line, usually at the source. Class hierarchy is shown sometimes, but not always.</w:t>
@@ -15525,14 +15652,14 @@
       <w:pPr>
         <w:pStyle w:val="Heading2"/>
       </w:pPr>
-      <w:bookmarkStart w:id="35" w:name="_Toc170205530"/>
+      <w:bookmarkStart w:id="34" w:name="_Toc170205530"/>
       <w:r>
         <w:t>M</w:t>
       </w:r>
       <w:r>
         <w:t>odel class/property spreadsheet</w:t>
       </w:r>
-      <w:bookmarkEnd w:id="35"/>
+      <w:bookmarkEnd w:id="34"/>
     </w:p>
     <w:p>
       <w:pPr>
@@ -15737,7 +15864,15 @@
         <w:t xml:space="preserve"> </w:t>
       </w:r>
       <w:r>
-        <w:t>When false, this class cannot be created in code with a Create() method. Check for required parameters in overrides in both the factory and the class overrides</w:t>
+        <w:t xml:space="preserve">When false, this class cannot be created in code with a </w:t>
+      </w:r>
+      <w:proofErr w:type="gramStart"/>
+      <w:r>
+        <w:t>Create(</w:t>
+      </w:r>
+      <w:proofErr w:type="gramEnd"/>
+      <w:r>
+        <w:t>) method. Check for required parameters in overrides in both the factory and the class overrides</w:t>
       </w:r>
       <w:r>
         <w:t>.</w:t>
@@ -15931,7 +16066,15 @@
         <w:t xml:space="preserve">What are all of the properties for a given class? </w:t>
       </w:r>
       <w:r>
-        <w:t>In the Fields tab sort the class names and find the class(</w:t>
+        <w:t xml:space="preserve">In the Fields tab </w:t>
+      </w:r>
+      <w:proofErr w:type="gramStart"/>
+      <w:r>
+        <w:t>sort</w:t>
+      </w:r>
+      <w:proofErr w:type="gramEnd"/>
+      <w:r>
+        <w:t xml:space="preserve"> the class names and find the class(</w:t>
       </w:r>
       <w:r>
         <w:t>e</w:t>
@@ -15969,64 +16112,69 @@
       <w:pPr>
         <w:pStyle w:val="Heading2"/>
       </w:pPr>
-      <w:bookmarkStart w:id="36" w:name="_Ref162957186"/>
-      <w:bookmarkStart w:id="37" w:name="_Toc170205531"/>
+      <w:bookmarkStart w:id="35" w:name="_Ref162957186"/>
+      <w:bookmarkStart w:id="36" w:name="_Toc170205531"/>
       <w:r>
         <w:t>LCMBrowser</w:t>
       </w:r>
+      <w:bookmarkEnd w:id="35"/>
       <w:bookmarkEnd w:id="36"/>
+    </w:p>
+    <w:p>
+      <w:pPr>
+        <w:pStyle w:val="BodyText"/>
+      </w:pPr>
+      <w:r>
+        <w:t xml:space="preserve">LCM is an abbreviation for </w:t>
+      </w:r>
+      <w:r>
+        <w:t>SIL Language &amp; Culture Model</w:t>
+      </w:r>
+      <w:r>
+        <w:t xml:space="preserve">. </w:t>
+      </w:r>
+      <w:proofErr w:type="gramStart"/>
+      <w:r>
+        <w:t xml:space="preserve">LCMBrowser.exe </w:t>
+      </w:r>
+      <w:r>
+        <w:t xml:space="preserve"> </w:t>
+      </w:r>
+      <w:r>
+        <w:t>is</w:t>
+      </w:r>
+      <w:proofErr w:type="gramEnd"/>
+      <w:r>
+        <w:t xml:space="preserve"> a program that comes with FieldWorks and can be started by </w:t>
+      </w:r>
+      <w:r>
+        <w:t>typing into the Windows start menu or finding it in c:\Program Files\SIL\FieldWorks 9. The program has a tab for showing the current conceptual model.</w:t>
+      </w:r>
+      <w:r>
+        <w:t xml:space="preserve"> You can open a fwdata file and it lets you browse the data, and make </w:t>
+      </w:r>
+      <w:r>
+        <w:t>limited</w:t>
+      </w:r>
+      <w:r>
+        <w:t xml:space="preserve"> modifications, such as deleting an object.</w:t>
+      </w:r>
+    </w:p>
+    <w:p>
+      <w:pPr>
+        <w:pStyle w:val="Heading3"/>
+      </w:pPr>
+      <w:bookmarkStart w:id="37" w:name="_Toc170205532"/>
+      <w:r>
+        <w:t xml:space="preserve">LCM </w:t>
+      </w:r>
+      <w:r>
+        <w:t>m</w:t>
+      </w:r>
+      <w:r>
+        <w:t>odel</w:t>
+      </w:r>
       <w:bookmarkEnd w:id="37"/>
-    </w:p>
-    <w:p>
-      <w:pPr>
-        <w:pStyle w:val="BodyText"/>
-      </w:pPr>
-      <w:r>
-        <w:t xml:space="preserve">LCM is an abbreviation for </w:t>
-      </w:r>
-      <w:r>
-        <w:t>SIL Language &amp; Culture Model</w:t>
-      </w:r>
-      <w:r>
-        <w:t xml:space="preserve">. </w:t>
-      </w:r>
-      <w:r>
-        <w:t xml:space="preserve">LCMBrowser.exe </w:t>
-      </w:r>
-      <w:r>
-        <w:t xml:space="preserve"> </w:t>
-      </w:r>
-      <w:r>
-        <w:t xml:space="preserve">is a program that comes with FieldWorks and can be started by </w:t>
-      </w:r>
-      <w:r>
-        <w:t>typing into the Windows start menu or finding it in c:\Program Files\SIL\FieldWorks 9. The program has a tab for showing the current conceptual model.</w:t>
-      </w:r>
-      <w:r>
-        <w:t xml:space="preserve"> You can open a fwdata file and it lets you browse the data, and make </w:t>
-      </w:r>
-      <w:r>
-        <w:t>limited</w:t>
-      </w:r>
-      <w:r>
-        <w:t xml:space="preserve"> modifications, such as deleting an object.</w:t>
-      </w:r>
-    </w:p>
-    <w:p>
-      <w:pPr>
-        <w:pStyle w:val="Heading3"/>
-      </w:pPr>
-      <w:bookmarkStart w:id="38" w:name="_Toc170205532"/>
-      <w:r>
-        <w:t xml:space="preserve">LCM </w:t>
-      </w:r>
-      <w:r>
-        <w:t>m</w:t>
-      </w:r>
-      <w:r>
-        <w:t>odel</w:t>
-      </w:r>
-      <w:bookmarkEnd w:id="38"/>
     </w:p>
     <w:p>
       <w:pPr>
@@ -16157,18 +16305,34 @@
       <w:pPr>
         <w:pStyle w:val="Heading3"/>
       </w:pPr>
-      <w:bookmarkStart w:id="39" w:name="_Toc170205533"/>
+      <w:bookmarkStart w:id="38" w:name="_Toc170205533"/>
       <w:r>
         <w:t>LCM data</w:t>
       </w:r>
-      <w:bookmarkEnd w:id="39"/>
-    </w:p>
-    <w:p>
-      <w:pPr>
-        <w:pStyle w:val="BodyText"/>
-      </w:pPr>
-      <w:r>
-        <w:t xml:space="preserve">To see the data in an actual project, choose File &gt; Open Language Project, and navigate to an .fwdata file to open. Note, you cannot open a project that is open in FLEx, or one that has an .fwdata.lock file in the directory. The program will </w:t>
+      <w:bookmarkEnd w:id="38"/>
+    </w:p>
+    <w:p>
+      <w:pPr>
+        <w:pStyle w:val="BodyText"/>
+      </w:pPr>
+      <w:r>
+        <w:t xml:space="preserve">To see the data in an actual project, choose File &gt; Open Language Project, and navigate to </w:t>
+      </w:r>
+      <w:proofErr w:type="gramStart"/>
+      <w:r>
+        <w:t>an .fwdata</w:t>
+      </w:r>
+      <w:proofErr w:type="gramEnd"/>
+      <w:r>
+        <w:t xml:space="preserve"> file to open. Note, you cannot open a project that is open in FLEx, or one that has </w:t>
+      </w:r>
+      <w:proofErr w:type="gramStart"/>
+      <w:r>
+        <w:t>an .fwdata</w:t>
+      </w:r>
+      <w:proofErr w:type="gramEnd"/>
+      <w:r>
+        <w:t xml:space="preserve">.lock file in the directory. The program will </w:t>
       </w:r>
       <w:r>
         <w:t xml:space="preserve">bring up </w:t>
@@ -16460,11 +16624,11 @@
       <w:pPr>
         <w:pStyle w:val="Heading2"/>
       </w:pPr>
-      <w:bookmarkStart w:id="40" w:name="_Toc170205534"/>
+      <w:bookmarkStart w:id="39" w:name="_Toc170205534"/>
       <w:r>
         <w:t>Fieldworks source code</w:t>
       </w:r>
-      <w:bookmarkEnd w:id="40"/>
+      <w:bookmarkEnd w:id="39"/>
     </w:p>
     <w:p>
       <w:pPr>
@@ -16713,11 +16877,11 @@
       <w:pPr>
         <w:pStyle w:val="Heading2"/>
       </w:pPr>
-      <w:bookmarkStart w:id="41" w:name="_Toc170205535"/>
+      <w:bookmarkStart w:id="40" w:name="_Toc170205535"/>
       <w:r>
         <w:t>dnSpy debugger</w:t>
       </w:r>
-      <w:bookmarkEnd w:id="41"/>
+      <w:bookmarkEnd w:id="40"/>
     </w:p>
     <w:p>
       <w:r>
@@ -16832,18 +16996,26 @@
         <w:pStyle w:val="ListNumber"/>
       </w:pPr>
       <w:r>
-        <w:t xml:space="preserve">FieldWorks opens and you can start working. At any time you can break execution in the debugger to investigate where it is, look through the stack, set breakpoints, etc. </w:t>
+        <w:t xml:space="preserve">FieldWorks opens and you can start working. At any </w:t>
+      </w:r>
+      <w:proofErr w:type="gramStart"/>
+      <w:r>
+        <w:t>time</w:t>
+      </w:r>
+      <w:proofErr w:type="gramEnd"/>
+      <w:r>
+        <w:t xml:space="preserve"> you can break execution in the debugger to investigate where it is, look through the stack, set breakpoints, etc. </w:t>
       </w:r>
     </w:p>
     <w:p>
       <w:pPr>
         <w:pStyle w:val="Heading1"/>
       </w:pPr>
-      <w:bookmarkStart w:id="42" w:name="_Toc170205536"/>
+      <w:bookmarkStart w:id="41" w:name="_Toc170205536"/>
       <w:r>
         <w:t>Lexicon model</w:t>
       </w:r>
-      <w:bookmarkEnd w:id="42"/>
+      <w:bookmarkEnd w:id="41"/>
     </w:p>
     <w:p>
       <w:pPr>
@@ -17243,11 +17415,16 @@
         <w:t>I</w:t>
       </w:r>
       <w:r>
-        <w:t>LexEntry repository.</w:t>
+        <w:t xml:space="preserve">LexEntry </w:t>
+      </w:r>
+      <w:proofErr w:type="gramStart"/>
+      <w:r>
+        <w:t>repository.</w:t>
       </w:r>
       <w:r>
         <w:t>.</w:t>
       </w:r>
+      <w:proofErr w:type="gramEnd"/>
     </w:p>
     <w:p>
       <w:pPr>
@@ -17276,11 +17453,11 @@
       <w:pPr>
         <w:pStyle w:val="Heading2"/>
       </w:pPr>
-      <w:bookmarkStart w:id="43" w:name="_Toc170205537"/>
+      <w:bookmarkStart w:id="42" w:name="_Toc170205537"/>
       <w:r>
         <w:t>Entries</w:t>
       </w:r>
-      <w:bookmarkEnd w:id="43"/>
+      <w:bookmarkEnd w:id="42"/>
     </w:p>
     <w:p>
       <w:pPr>
@@ -18247,8 +18424,13 @@
         <w:t>”</w:t>
       </w:r>
       <w:r>
-        <w:t xml:space="preserve"> and Prefix: “-“</w:t>
-      </w:r>
+        <w:t xml:space="preserve"> and Prefix: “</w:t>
+      </w:r>
+      <w:proofErr w:type="gramStart"/>
+      <w:r>
+        <w:t>-“</w:t>
+      </w:r>
+      <w:proofErr w:type="gramEnd"/>
       <w:r>
         <w:t xml:space="preserve">.  </w:t>
       </w:r>
@@ -18311,11 +18493,11 @@
       <w:pPr>
         <w:pStyle w:val="Heading3"/>
       </w:pPr>
-      <w:bookmarkStart w:id="44" w:name="_Toc170205538"/>
+      <w:bookmarkStart w:id="43" w:name="_Toc170205538"/>
       <w:r>
         <w:t>Headwords</w:t>
       </w:r>
-      <w:bookmarkEnd w:id="44"/>
+      <w:bookmarkEnd w:id="43"/>
     </w:p>
     <w:p>
       <w:pPr>
@@ -18479,10 +18661,18 @@
         <w:t xml:space="preserve"> In FLEx, the citation form </w:t>
       </w:r>
       <w:r>
-        <w:t xml:space="preserve">is used for this, but it </w:t>
-      </w:r>
-      <w:r>
-        <w:t xml:space="preserve"> should only be </w:t>
+        <w:t xml:space="preserve">is used for this, but </w:t>
+      </w:r>
+      <w:proofErr w:type="gramStart"/>
+      <w:r>
+        <w:t xml:space="preserve">it </w:t>
+      </w:r>
+      <w:r>
+        <w:t xml:space="preserve"> should</w:t>
+      </w:r>
+      <w:proofErr w:type="gramEnd"/>
+      <w:r>
+        <w:t xml:space="preserve"> only be </w:t>
       </w:r>
       <w:r>
         <w:t>used</w:t>
@@ -18659,13 +18849,13 @@
       <w:pPr>
         <w:pStyle w:val="Heading3"/>
       </w:pPr>
-      <w:bookmarkStart w:id="45" w:name="_Ref164431796"/>
-      <w:bookmarkStart w:id="46" w:name="_Toc170205539"/>
+      <w:bookmarkStart w:id="44" w:name="_Ref164431796"/>
+      <w:bookmarkStart w:id="45" w:name="_Toc170205539"/>
       <w:r>
         <w:t>Pronunciations</w:t>
       </w:r>
+      <w:bookmarkEnd w:id="44"/>
       <w:bookmarkEnd w:id="45"/>
-      <w:bookmarkEnd w:id="46"/>
     </w:p>
     <w:p>
       <w:pPr>
@@ -18890,11 +19080,11 @@
       <w:pPr>
         <w:pStyle w:val="Heading3"/>
       </w:pPr>
-      <w:bookmarkStart w:id="47" w:name="_Toc170205540"/>
+      <w:bookmarkStart w:id="46" w:name="_Toc170205540"/>
       <w:r>
         <w:t>Etymology</w:t>
       </w:r>
-      <w:bookmarkEnd w:id="47"/>
+      <w:bookmarkEnd w:id="46"/>
     </w:p>
     <w:p>
       <w:pPr>
@@ -19233,11 +19423,11 @@
       <w:pPr>
         <w:pStyle w:val="Heading3"/>
       </w:pPr>
-      <w:bookmarkStart w:id="48" w:name="_Toc170205541"/>
+      <w:bookmarkStart w:id="47" w:name="_Toc170205541"/>
       <w:r>
         <w:t>Allomorphs</w:t>
       </w:r>
-      <w:bookmarkEnd w:id="48"/>
+      <w:bookmarkEnd w:id="47"/>
     </w:p>
     <w:p>
       <w:pPr>
@@ -19840,7 +20030,7 @@
       <w:pPr>
         <w:pStyle w:val="Heading3"/>
       </w:pPr>
-      <w:bookmarkStart w:id="49" w:name="_Toc170205542"/>
+      <w:bookmarkStart w:id="48" w:name="_Toc170205542"/>
       <w:r>
         <w:lastRenderedPageBreak/>
         <w:t>Grammatical information</w:t>
@@ -19848,7 +20038,7 @@
       <w:r>
         <w:t>.</w:t>
       </w:r>
-      <w:bookmarkEnd w:id="49"/>
+      <w:bookmarkEnd w:id="48"/>
     </w:p>
     <w:p>
       <w:pPr>
@@ -19892,11 +20082,11 @@
       <w:pPr>
         <w:pStyle w:val="Heading3"/>
       </w:pPr>
-      <w:bookmarkStart w:id="50" w:name="_Toc170205543"/>
+      <w:bookmarkStart w:id="49" w:name="_Toc170205543"/>
       <w:r>
         <w:t>Messages</w:t>
       </w:r>
-      <w:bookmarkEnd w:id="50"/>
+      <w:bookmarkEnd w:id="49"/>
     </w:p>
     <w:p>
       <w:pPr>
@@ -20157,14 +20347,24 @@
       <w:r>
         <w:t xml:space="preserve">The data for questions is stored in </w:t>
       </w:r>
+      <w:proofErr w:type="gramStart"/>
       <w:r>
         <w:t>Lexicon.fwstub.ChorusNotes</w:t>
       </w:r>
+      <w:proofErr w:type="gramEnd"/>
       <w:r>
         <w:t xml:space="preserve"> in the project folder. The information is stored in annotation elements</w:t>
       </w:r>
       <w:r>
-        <w:t>. Responses and closing information is included as additional message elements.</w:t>
+        <w:t xml:space="preserve">. Responses and closing information </w:t>
+      </w:r>
+      <w:proofErr w:type="gramStart"/>
+      <w:r>
+        <w:t>is</w:t>
+      </w:r>
+      <w:proofErr w:type="gramEnd"/>
+      <w:r>
+        <w:t xml:space="preserve"> included as additional message elements.</w:t>
       </w:r>
     </w:p>
     <w:p>
@@ -20296,35 +20496,35 @@
       <w:pPr>
         <w:pStyle w:val="Heading2"/>
       </w:pPr>
-      <w:bookmarkStart w:id="51" w:name="_Toc170205544"/>
+      <w:bookmarkStart w:id="50" w:name="_Toc170205544"/>
       <w:r>
         <w:t>Complex forms</w:t>
       </w:r>
       <w:r>
         <w:t xml:space="preserve"> and variants</w:t>
       </w:r>
+      <w:bookmarkEnd w:id="50"/>
+    </w:p>
+    <w:p>
+      <w:pPr>
+        <w:pStyle w:val="BodyText"/>
+      </w:pPr>
+      <w:r>
+        <w:t xml:space="preserve">Variants and complex forms (typically subentries) are stored as separate entries in FLEx that are linked to one or more main entries. </w:t>
+      </w:r>
+      <w:r>
+        <w:t>There are numerous options for displaying complex forms and variants.</w:t>
+      </w:r>
+    </w:p>
+    <w:p>
+      <w:pPr>
+        <w:pStyle w:val="Heading3"/>
+      </w:pPr>
+      <w:bookmarkStart w:id="51" w:name="_Toc170205545"/>
+      <w:r>
+        <w:t>Complex forms</w:t>
+      </w:r>
       <w:bookmarkEnd w:id="51"/>
-    </w:p>
-    <w:p>
-      <w:pPr>
-        <w:pStyle w:val="BodyText"/>
-      </w:pPr>
-      <w:r>
-        <w:t xml:space="preserve">Variants and complex forms (typically subentries) are stored as separate entries in FLEx that are linked to one or more main entries. </w:t>
-      </w:r>
-      <w:r>
-        <w:t>There are numerous options for displaying complex forms and variants.</w:t>
-      </w:r>
-    </w:p>
-    <w:p>
-      <w:pPr>
-        <w:pStyle w:val="Heading3"/>
-      </w:pPr>
-      <w:bookmarkStart w:id="52" w:name="_Toc170205545"/>
-      <w:r>
-        <w:t>Complex forms</w:t>
-      </w:r>
-      <w:bookmarkEnd w:id="52"/>
     </w:p>
     <w:p>
       <w:pPr>
@@ -20678,11 +20878,11 @@
       <w:pPr>
         <w:pStyle w:val="Heading3"/>
       </w:pPr>
-      <w:bookmarkStart w:id="53" w:name="_Toc170205546"/>
+      <w:bookmarkStart w:id="52" w:name="_Toc170205546"/>
       <w:r>
         <w:t>Variants</w:t>
       </w:r>
-      <w:bookmarkEnd w:id="53"/>
+      <w:bookmarkEnd w:id="52"/>
     </w:p>
     <w:p>
       <w:pPr>
@@ -20969,11 +21169,11 @@
       <w:pPr>
         <w:pStyle w:val="Heading2"/>
       </w:pPr>
-      <w:bookmarkStart w:id="54" w:name="_Toc170205547"/>
+      <w:bookmarkStart w:id="53" w:name="_Toc170205547"/>
       <w:r>
         <w:t>Senses</w:t>
       </w:r>
-      <w:bookmarkEnd w:id="54"/>
+      <w:bookmarkEnd w:id="53"/>
     </w:p>
     <w:p>
       <w:pPr>
@@ -21650,13 +21850,13 @@
       <w:pPr>
         <w:pStyle w:val="Heading3"/>
       </w:pPr>
-      <w:bookmarkStart w:id="55" w:name="_Ref164277547"/>
-      <w:bookmarkStart w:id="56" w:name="_Toc170205548"/>
+      <w:bookmarkStart w:id="54" w:name="_Ref164277547"/>
+      <w:bookmarkStart w:id="55" w:name="_Toc170205548"/>
       <w:r>
         <w:t>Example sentences</w:t>
       </w:r>
+      <w:bookmarkEnd w:id="54"/>
       <w:bookmarkEnd w:id="55"/>
-      <w:bookmarkEnd w:id="56"/>
     </w:p>
     <w:p>
       <w:pPr>
@@ -21821,11 +22021,11 @@
       <w:pPr>
         <w:pStyle w:val="Heading3"/>
       </w:pPr>
-      <w:bookmarkStart w:id="57" w:name="_Toc170205549"/>
+      <w:bookmarkStart w:id="56" w:name="_Toc170205549"/>
       <w:r>
         <w:t>Extended notes</w:t>
       </w:r>
-      <w:bookmarkEnd w:id="57"/>
+      <w:bookmarkEnd w:id="56"/>
     </w:p>
     <w:p>
       <w:pPr>
@@ -22058,7 +22258,7 @@
       <w:pPr>
         <w:pStyle w:val="Heading3"/>
       </w:pPr>
-      <w:bookmarkStart w:id="58" w:name="_Toc170205550"/>
+      <w:bookmarkStart w:id="57" w:name="_Toc170205550"/>
       <w:r>
         <w:lastRenderedPageBreak/>
         <w:t xml:space="preserve">Lexical </w:t>
@@ -22069,7 +22269,7 @@
       <w:r>
         <w:t>elations</w:t>
       </w:r>
-      <w:bookmarkEnd w:id="58"/>
+      <w:bookmarkEnd w:id="57"/>
     </w:p>
     <w:p>
       <w:pPr>
@@ -23152,11 +23352,11 @@
       <w:pPr>
         <w:pStyle w:val="Heading4"/>
       </w:pPr>
-      <w:bookmarkStart w:id="59" w:name="_Toc170205551"/>
+      <w:bookmarkStart w:id="58" w:name="_Toc170205551"/>
       <w:r>
         <w:t>Collection</w:t>
       </w:r>
-      <w:bookmarkEnd w:id="59"/>
+      <w:bookmarkEnd w:id="58"/>
     </w:p>
     <w:p>
       <w:pPr>
@@ -23358,7 +23558,15 @@
         <w:pStyle w:val="BodyText"/>
       </w:pPr>
       <w:r>
-        <w:t xml:space="preserve">LexRefType is a subclass of CmPossibility owned in the Lexical Relations CmPossibilityList  owned in the References owning property of LexDb, owned in the LexDb atomic owning property of LangProject. The Abbreviation for this object is </w:t>
+        <w:t xml:space="preserve">LexRefType is a subclass of CmPossibility owned in the Lexical Relations </w:t>
+      </w:r>
+      <w:proofErr w:type="gramStart"/>
+      <w:r>
+        <w:t>CmPossibilityList  owned</w:t>
+      </w:r>
+      <w:proofErr w:type="gramEnd"/>
+      <w:r>
+        <w:t xml:space="preserve"> in the References owning property of LexDb, owned in the LexDb atomic owning property of LangProject. The Abbreviation for this object is </w:t>
       </w:r>
       <w:r>
         <w:t>‘</w:t>
@@ -23424,11 +23632,11 @@
       <w:pPr>
         <w:pStyle w:val="Heading4"/>
       </w:pPr>
-      <w:bookmarkStart w:id="60" w:name="_Toc170205552"/>
+      <w:bookmarkStart w:id="59" w:name="_Toc170205552"/>
       <w:r>
         <w:t>Pair with different names</w:t>
       </w:r>
-      <w:bookmarkEnd w:id="60"/>
+      <w:bookmarkEnd w:id="59"/>
     </w:p>
     <w:p>
       <w:pPr>
@@ -23696,11 +23904,11 @@
       <w:pPr>
         <w:pStyle w:val="Heading4"/>
       </w:pPr>
-      <w:bookmarkStart w:id="61" w:name="_Toc170205553"/>
+      <w:bookmarkStart w:id="60" w:name="_Toc170205553"/>
       <w:r>
         <w:t>Sequence</w:t>
       </w:r>
-      <w:bookmarkEnd w:id="61"/>
+      <w:bookmarkEnd w:id="60"/>
     </w:p>
     <w:p>
       <w:pPr>
@@ -23906,11 +24114,11 @@
       <w:pPr>
         <w:pStyle w:val="Heading4"/>
       </w:pPr>
-      <w:bookmarkStart w:id="62" w:name="_Toc170205554"/>
+      <w:bookmarkStart w:id="61" w:name="_Toc170205554"/>
       <w:r>
         <w:t>Tree</w:t>
       </w:r>
-      <w:bookmarkEnd w:id="62"/>
+      <w:bookmarkEnd w:id="61"/>
     </w:p>
     <w:p>
       <w:pPr>
@@ -24193,11 +24401,11 @@
       <w:pPr>
         <w:pStyle w:val="Heading4"/>
       </w:pPr>
-      <w:bookmarkStart w:id="63" w:name="_Toc170205555"/>
+      <w:bookmarkStart w:id="62" w:name="_Toc170205555"/>
       <w:r>
         <w:t>Unidirectional</w:t>
       </w:r>
-      <w:bookmarkEnd w:id="63"/>
+      <w:bookmarkEnd w:id="62"/>
     </w:p>
     <w:p>
       <w:pPr>
@@ -24242,7 +24450,15 @@
         <w:pStyle w:val="BodyText"/>
       </w:pPr>
       <w:r>
-        <w:t>When one of the Entry types are used, everything works the same except the links are to entries instead of senses, and the relations would show up under Cross References instead of Lexical Relations in Lexicon Edit and Dictionary views. An ‘Entry Or Sense’ type would allow either Entries or Senses in the set.</w:t>
+        <w:t xml:space="preserve">When one of the Entry types are used, everything works the same except the links are to entries instead of senses, and the relations would show up under Cross References instead of Lexical Relations in Lexicon Edit and Dictionary views. An ‘Entry </w:t>
+      </w:r>
+      <w:proofErr w:type="gramStart"/>
+      <w:r>
+        <w:t>Or</w:t>
+      </w:r>
+      <w:proofErr w:type="gramEnd"/>
+      <w:r>
+        <w:t xml:space="preserve"> Sense’ type would allow either Entries or Senses in the set.</w:t>
       </w:r>
     </w:p>
     <w:p>
@@ -24256,7 +24472,23 @@
         <w:t>Caution</w:t>
       </w:r>
       <w:r>
-        <w:t>: Items in the Lexical Relations list are not simply objects that are referenced by other objects. Each item in this list also owns a collection of all of the lexical relation sets that are specified for this type of relation. So deleting an item in this list removes every instance of that type of relation. When a user tries to delete these, FLEx gives a warning message indicating how many relations will be delete</w:t>
+        <w:t xml:space="preserve">: Items in the Lexical Relations list are not simply </w:t>
+      </w:r>
+      <w:proofErr w:type="gramStart"/>
+      <w:r>
+        <w:t>objects</w:t>
+      </w:r>
+      <w:proofErr w:type="gramEnd"/>
+      <w:r>
+        <w:t xml:space="preserve"> that are referenced by other objects. Each item in this list also owns a collection of all of the lexical relation sets that are specified for this type of relation. </w:t>
+      </w:r>
+      <w:proofErr w:type="gramStart"/>
+      <w:r>
+        <w:t>So</w:t>
+      </w:r>
+      <w:proofErr w:type="gramEnd"/>
+      <w:r>
+        <w:t xml:space="preserve"> deleting an item in this list removes every instance of that type of relation. When a user tries to delete these, FLEx gives a warning message indicating how many relations will be delete</w:t>
       </w:r>
       <w:r>
         <w:t>d</w:t>
@@ -24269,12 +24501,12 @@
       <w:pPr>
         <w:pStyle w:val="Heading3"/>
       </w:pPr>
-      <w:bookmarkStart w:id="64" w:name="_Toc170205556"/>
+      <w:bookmarkStart w:id="63" w:name="_Toc170205556"/>
       <w:r>
         <w:lastRenderedPageBreak/>
         <w:t>Reversals</w:t>
       </w:r>
-      <w:bookmarkEnd w:id="64"/>
+      <w:bookmarkEnd w:id="63"/>
     </w:p>
     <w:p>
       <w:pPr>
@@ -24624,7 +24856,15 @@
         <w:pStyle w:val="BodyText"/>
       </w:pPr>
       <w:r>
-        <w:t>Reversal indexes are sorted and filtered using the Bulk Edit Reversal Entries tool in Lexicon Edit. The collation comes from the writing system of the reversal index. Sorting in this area only affects the main reversal entries. To sort the reversal subentries you have to use Tools &gt; Utilities &gt; “Sort Reversal Subentries</w:t>
+        <w:t xml:space="preserve">Reversal indexes are sorted and filtered using the Bulk Edit Reversal Entries tool in Lexicon Edit. The collation comes from the writing system of the reversal index. Sorting in this area only affects the main reversal entries. To sort the reversal </w:t>
+      </w:r>
+      <w:proofErr w:type="gramStart"/>
+      <w:r>
+        <w:t>subentries</w:t>
+      </w:r>
+      <w:proofErr w:type="gramEnd"/>
+      <w:r>
+        <w:t xml:space="preserve"> you have to use Tools &gt; Utilities &gt; “Sort Reversal Subentries</w:t>
       </w:r>
       <w:r>
         <w:t>”</w:t>
@@ -24640,12 +24880,12 @@
       <w:pPr>
         <w:pStyle w:val="Heading3"/>
       </w:pPr>
-      <w:bookmarkStart w:id="65" w:name="_Toc170205557"/>
+      <w:bookmarkStart w:id="64" w:name="_Toc170205557"/>
       <w:r>
         <w:lastRenderedPageBreak/>
         <w:t>Pictures</w:t>
       </w:r>
-      <w:bookmarkEnd w:id="65"/>
+      <w:bookmarkEnd w:id="64"/>
     </w:p>
     <w:p>
       <w:pPr>
@@ -24773,7 +25013,15 @@
         <w:t xml:space="preserve"> Pictures are normally stored in a CmFolder in this property with a name “Local Pictures”. </w:t>
       </w:r>
       <w:r>
-        <w:t>CmFolder has an owning collection Files property that owns CmFile objects. CmFile has a Unicode InternalPath property to record the location of a picture file. This path is normally a relative path starting at the project LinkedFiles directory, so it would include the Pictures folder as part of the path. Files can be located outside the project folder, and in that case it would be a full path to the file on the hard drive. CmFile has other properties</w:t>
+        <w:t xml:space="preserve">CmFolder has an owning collection Files property that owns CmFile objects. CmFile has a Unicode InternalPath property to record the location of a picture file. This path is normally a relative path starting at the project LinkedFiles directory, so it would include the Pictures folder as part of the path. Files can be located outside the project folder, and in that </w:t>
+      </w:r>
+      <w:proofErr w:type="gramStart"/>
+      <w:r>
+        <w:t>case</w:t>
+      </w:r>
+      <w:proofErr w:type="gramEnd"/>
+      <w:r>
+        <w:t xml:space="preserve"> it would be a full path to the file on the hard drive. CmFile has other properties</w:t>
       </w:r>
       <w:r>
         <w:t xml:space="preserve"> that are not used in FLEx.</w:t>
@@ -24814,11 +25062,11 @@
       <w:pPr>
         <w:pStyle w:val="Heading3"/>
       </w:pPr>
-      <w:bookmarkStart w:id="66" w:name="_Toc170205558"/>
+      <w:bookmarkStart w:id="65" w:name="_Toc170205558"/>
       <w:r>
         <w:t>Sound files</w:t>
       </w:r>
-      <w:bookmarkEnd w:id="66"/>
+      <w:bookmarkEnd w:id="65"/>
     </w:p>
     <w:p>
       <w:pPr>
@@ -24862,11 +25110,11 @@
       <w:pPr>
         <w:pStyle w:val="Heading2"/>
       </w:pPr>
-      <w:bookmarkStart w:id="67" w:name="_Toc170205559"/>
+      <w:bookmarkStart w:id="66" w:name="_Toc170205559"/>
       <w:r>
         <w:t>Virtual ordering</w:t>
       </w:r>
-      <w:bookmarkEnd w:id="67"/>
+      <w:bookmarkEnd w:id="66"/>
     </w:p>
     <w:p>
       <w:pPr>
@@ -25052,11 +25300,11 @@
       <w:pPr>
         <w:pStyle w:val="Heading2"/>
       </w:pPr>
-      <w:bookmarkStart w:id="68" w:name="_Toc170205560"/>
+      <w:bookmarkStart w:id="67" w:name="_Toc170205560"/>
       <w:r>
         <w:t>Publications</w:t>
       </w:r>
-      <w:bookmarkEnd w:id="68"/>
+      <w:bookmarkEnd w:id="67"/>
     </w:p>
     <w:p>
       <w:pPr>
@@ -25402,13 +25650,13 @@
       <w:pPr>
         <w:pStyle w:val="Heading1"/>
       </w:pPr>
-      <w:bookmarkStart w:id="69" w:name="_Ref165555065"/>
-      <w:bookmarkStart w:id="70" w:name="_Toc170205561"/>
+      <w:bookmarkStart w:id="68" w:name="_Ref165555065"/>
+      <w:bookmarkStart w:id="69" w:name="_Toc170205561"/>
       <w:r>
         <w:t>Grammar model</w:t>
       </w:r>
+      <w:bookmarkEnd w:id="68"/>
       <w:bookmarkEnd w:id="69"/>
-      <w:bookmarkEnd w:id="70"/>
     </w:p>
     <w:p>
       <w:pPr>
@@ -25427,7 +25675,15 @@
         <w:t>s</w:t>
       </w:r>
       <w:r>
-        <w:t xml:space="preserve"> from these lists to provide the features they want. The core part of the grammar is the Parts Of Speech list seen in the Category Edit </w:t>
+        <w:t xml:space="preserve"> from these lists to provide the features they want. The core part of the grammar is the Parts </w:t>
+      </w:r>
+      <w:proofErr w:type="gramStart"/>
+      <w:r>
+        <w:t>Of</w:t>
+      </w:r>
+      <w:proofErr w:type="gramEnd"/>
+      <w:r>
+        <w:t xml:space="preserve"> Speech list seen in the Category Edit </w:t>
       </w:r>
       <w:r>
         <w:t>tool in the Grammar area</w:t>
@@ -25485,7 +25741,15 @@
         <w:t>paradigm</w:t>
       </w:r>
       <w:r>
-        <w:t>. Only the first and third person suffixes are currently defined. This can parse the verb ‘manger’ into ‘mange’ for first person singular (I eat), and ‘mangeons’ for third person singular (we eat).</w:t>
+        <w:t xml:space="preserve">. Only the </w:t>
+      </w:r>
+      <w:proofErr w:type="gramStart"/>
+      <w:r>
+        <w:t>first and third person</w:t>
+      </w:r>
+      <w:proofErr w:type="gramEnd"/>
+      <w:r>
+        <w:t xml:space="preserve"> suffixes are currently defined. This can parse the verb ‘manger’ into ‘mange’ for first person singular (I eat), and ‘mangeons’ for third person singular (we eat).</w:t>
       </w:r>
       <w:r>
         <w:t xml:space="preserve"> </w:t>
@@ -25547,14 +25811,14 @@
       <w:pPr>
         <w:pStyle w:val="Heading2"/>
       </w:pPr>
-      <w:bookmarkStart w:id="71" w:name="_Toc170205562"/>
+      <w:bookmarkStart w:id="70" w:name="_Toc170205562"/>
       <w:r>
         <w:t xml:space="preserve">Inflection </w:t>
       </w:r>
       <w:r>
         <w:t>features</w:t>
       </w:r>
-      <w:bookmarkEnd w:id="71"/>
+      <w:bookmarkEnd w:id="70"/>
     </w:p>
     <w:p>
       <w:pPr>
@@ -25728,11 +25992,11 @@
       <w:pPr>
         <w:pStyle w:val="Heading2"/>
       </w:pPr>
-      <w:bookmarkStart w:id="72" w:name="_Toc170205563"/>
+      <w:bookmarkStart w:id="71" w:name="_Toc170205563"/>
       <w:r>
         <w:t>Categories</w:t>
       </w:r>
-      <w:bookmarkEnd w:id="72"/>
+      <w:bookmarkEnd w:id="71"/>
     </w:p>
     <w:p>
       <w:pPr>
@@ -25871,11 +26135,11 @@
       <w:pPr>
         <w:pStyle w:val="Heading2"/>
       </w:pPr>
-      <w:bookmarkStart w:id="73" w:name="_Toc170205564"/>
+      <w:bookmarkStart w:id="72" w:name="_Toc170205564"/>
       <w:r>
         <w:t>Lexicon</w:t>
       </w:r>
-      <w:bookmarkEnd w:id="73"/>
+      <w:bookmarkEnd w:id="72"/>
     </w:p>
     <w:p>
       <w:pPr>
@@ -25885,7 +26149,15 @@
         <w:t xml:space="preserve">In the </w:t>
       </w:r>
       <w:r>
-        <w:t>entry for ‘manger’, we specify the lexeme form as ‘mang’ and the citation form as ‘manger’. In the Grammatical Info Details section the entry is classified as a verb, and the Inflection Class is set to ER Verbs.</w:t>
+        <w:t xml:space="preserve">entry for ‘manger’, we specify the lexeme form as ‘mang’ and the citation form as ‘manger’. In the Grammatical Info Details </w:t>
+      </w:r>
+      <w:proofErr w:type="gramStart"/>
+      <w:r>
+        <w:t>section</w:t>
+      </w:r>
+      <w:proofErr w:type="gramEnd"/>
+      <w:r>
+        <w:t xml:space="preserve"> the entry is classified as a verb, and the Inflection Class is set to ER Verbs.</w:t>
       </w:r>
     </w:p>
     <w:p>
@@ -26414,14 +26686,14 @@
       <w:pPr>
         <w:pStyle w:val="Heading1"/>
       </w:pPr>
-      <w:bookmarkStart w:id="74" w:name="_Toc170205565"/>
+      <w:bookmarkStart w:id="73" w:name="_Toc170205565"/>
       <w:r>
         <w:t xml:space="preserve">Interlinear </w:t>
       </w:r>
       <w:r>
         <w:t>model</w:t>
       </w:r>
-      <w:bookmarkEnd w:id="74"/>
+      <w:bookmarkEnd w:id="73"/>
     </w:p>
     <w:p>
       <w:pPr>
@@ -26516,11 +26788,11 @@
       <w:pPr>
         <w:pStyle w:val="Heading2"/>
       </w:pPr>
-      <w:bookmarkStart w:id="75" w:name="_Toc170205566"/>
+      <w:bookmarkStart w:id="74" w:name="_Toc170205566"/>
       <w:r>
         <w:t>Structured Text</w:t>
       </w:r>
-      <w:bookmarkEnd w:id="75"/>
+      <w:bookmarkEnd w:id="74"/>
     </w:p>
     <w:p>
       <w:pPr>
@@ -26829,11 +27101,11 @@
       <w:pPr>
         <w:pStyle w:val="Heading2"/>
       </w:pPr>
-      <w:bookmarkStart w:id="76" w:name="_Toc170205567"/>
+      <w:bookmarkStart w:id="75" w:name="_Toc170205567"/>
       <w:r>
         <w:t>Segment</w:t>
       </w:r>
-      <w:bookmarkEnd w:id="76"/>
+      <w:bookmarkEnd w:id="75"/>
     </w:p>
     <w:p>
       <w:pPr>
@@ -27288,14 +27560,14 @@
       <w:pPr>
         <w:pStyle w:val="Heading2"/>
       </w:pPr>
-      <w:bookmarkStart w:id="77" w:name="_Toc170205568"/>
+      <w:bookmarkStart w:id="76" w:name="_Toc170205568"/>
       <w:r>
         <w:t>Wordform</w:t>
       </w:r>
       <w:r>
         <w:t>s</w:t>
       </w:r>
-      <w:bookmarkEnd w:id="77"/>
+      <w:bookmarkEnd w:id="76"/>
     </w:p>
     <w:p>
       <w:pPr>
@@ -27426,7 +27698,15 @@
         <w:t xml:space="preserve">Search </w:t>
       </w:r>
       <w:r>
-        <w:t>&lt;rt class="PunctuationForm".*\r\n&lt;Form&gt;\r\n&lt;Str&gt;\r\n&lt;Run.*\r\n&lt;/Str&gt;\r\n&lt;/Form&gt;\r\n&lt;/rt&gt;\r\n</w:t>
+        <w:t>&lt;rt class="PunctuationForm</w:t>
+      </w:r>
+      <w:proofErr w:type="gramStart"/>
+      <w:r>
+        <w:t>".*</w:t>
+      </w:r>
+      <w:proofErr w:type="gramEnd"/>
+      <w:r>
+        <w:t>\r\n&lt;Form&gt;\r\n&lt;Str&gt;\r\n&lt;Run.*\r\n&lt;/Str&gt;\r\n&lt;/Form&gt;\r\n&lt;/rt&gt;\r\n</w:t>
       </w:r>
       <w:r>
         <w:br/>
@@ -27490,11 +27770,11 @@
       <w:pPr>
         <w:pStyle w:val="Heading2"/>
       </w:pPr>
-      <w:bookmarkStart w:id="78" w:name="_Toc170205569"/>
+      <w:bookmarkStart w:id="77" w:name="_Toc170205569"/>
       <w:r>
         <w:t>Analyses</w:t>
       </w:r>
-      <w:bookmarkEnd w:id="78"/>
+      <w:bookmarkEnd w:id="77"/>
     </w:p>
     <w:p>
       <w:pPr>
@@ -28225,11 +28505,11 @@
       <w:pPr>
         <w:pStyle w:val="Heading2"/>
       </w:pPr>
-      <w:bookmarkStart w:id="79" w:name="_Toc170205570"/>
+      <w:bookmarkStart w:id="78" w:name="_Toc170205570"/>
       <w:r>
         <w:t>Approving analyses</w:t>
       </w:r>
-      <w:bookmarkEnd w:id="79"/>
+      <w:bookmarkEnd w:id="78"/>
     </w:p>
     <w:p>
       <w:pPr>
@@ -28444,11 +28724,16 @@
       </w:r>
       <w:r>
         <w:br/>
-        <w:t>&lt;objsur guid="b0460a42-7e19-460e-9ec8-4779c4a5f3ff" t="r" /&gt;</w:t>
+        <w:t>&lt;objsur guid="b0460a42-7e19-460e-9ec8-4779c4a5f3ff" t="r" /</w:t>
+      </w:r>
+      <w:proofErr w:type="gramStart"/>
+      <w:r>
+        <w:t>&gt;</w:t>
       </w:r>
       <w:r>
         <w:t xml:space="preserve">  Le</w:t>
       </w:r>
+      <w:proofErr w:type="gramEnd"/>
       <w:r>
         <w:br/>
         <w:t xml:space="preserve">&lt;objsur guid="7dec7244-62f4-441f-bfc9-c9564093c2f0" t="r" /&gt; </w:t>
@@ -28484,7 +28769,15 @@
       </w:r>
       <w:r>
         <w:br/>
-        <w:t>&lt;objsur guid="41581e3a-7ed3-41ac-94c7-6e91dbcc108b" t="r" /&gt;  &lt;-  Computer approves</w:t>
+        <w:t>&lt;objsur guid="41581e3a-7ed3-41ac-94c7-6e91dbcc108b" t="r" /</w:t>
+      </w:r>
+      <w:proofErr w:type="gramStart"/>
+      <w:r>
+        <w:t>&gt;  &lt;</w:t>
+      </w:r>
+      <w:proofErr w:type="gramEnd"/>
+      <w:r>
+        <w:t>-  Computer approves</w:t>
       </w:r>
       <w:r>
         <w:br/>
@@ -28640,14 +28933,14 @@
       <w:pPr>
         <w:pStyle w:val="Heading2"/>
       </w:pPr>
-      <w:bookmarkStart w:id="80" w:name="_Toc170205571"/>
+      <w:bookmarkStart w:id="79" w:name="_Toc170205571"/>
       <w:r>
         <w:t xml:space="preserve">Text </w:t>
       </w:r>
       <w:r>
         <w:t>Tagging</w:t>
       </w:r>
-      <w:bookmarkEnd w:id="80"/>
+      <w:bookmarkEnd w:id="79"/>
     </w:p>
     <w:p>
       <w:pPr>
@@ -28686,7 +28979,15 @@
         <w:pStyle w:val="BodyText"/>
       </w:pPr>
       <w:r>
-        <w:t>In the Interlinear Text Tagging tab you can highlight a string of wordforms and right-click to choose a tag to assign to these wordforms.</w:t>
+        <w:t xml:space="preserve">In the Interlinear Text Tagging </w:t>
+      </w:r>
+      <w:proofErr w:type="gramStart"/>
+      <w:r>
+        <w:t>tab</w:t>
+      </w:r>
+      <w:proofErr w:type="gramEnd"/>
+      <w:r>
+        <w:t xml:space="preserve"> you can highlight a string of wordforms and right-click to choose a tag to assign to these wordforms.</w:t>
       </w:r>
       <w:r>
         <w:t xml:space="preserve"> You can choose from more than one level.</w:t>
@@ -28897,7 +29198,15 @@
         <w:t>S</w:t>
       </w:r>
       <w:r>
-        <w:t xml:space="preserve">egment. The Segment here is showing the wordforms following the index into the Analyses list. The top and bottom TextTag objects  reference two </w:t>
+        <w:t xml:space="preserve">egment. The Segment here is showing the wordforms following the index into the Analyses list. The top and bottom TextTag </w:t>
+      </w:r>
+      <w:proofErr w:type="gramStart"/>
+      <w:r>
+        <w:t>objects  reference</w:t>
+      </w:r>
+      <w:proofErr w:type="gramEnd"/>
+      <w:r>
+        <w:t xml:space="preserve"> two </w:t>
       </w:r>
       <w:r>
         <w:t>subitems</w:t>
@@ -28910,14 +29219,14 @@
       <w:pPr>
         <w:pStyle w:val="Heading2"/>
       </w:pPr>
-      <w:bookmarkStart w:id="81" w:name="_Toc170205572"/>
+      <w:bookmarkStart w:id="80" w:name="_Toc170205572"/>
       <w:r>
         <w:t>Discourse</w:t>
       </w:r>
       <w:r>
         <w:t xml:space="preserve"> Charting</w:t>
       </w:r>
-      <w:bookmarkEnd w:id="81"/>
+      <w:bookmarkEnd w:id="80"/>
     </w:p>
     <w:p>
       <w:pPr>
@@ -29140,7 +29449,13 @@
         <w:pStyle w:val="ListBullet"/>
       </w:pPr>
       <w:r>
-        <w:t xml:space="preserve">The “Text Markup Tags” list is owned in the ChartMarkers atomic owning property and defines submenus for the right-click menu within cells to mark special features. This list is </w:t>
+        <w:t xml:space="preserve">The “Text </w:t>
+      </w:r>
+      <w:r>
+        <w:t>Chart Markers</w:t>
+      </w:r>
+      <w:r>
+        <w:t xml:space="preserve">” list is owned in the ChartMarkers atomic owning property and defines submenus for the right-click menu within cells to mark special features. This list is </w:t>
       </w:r>
       <w:r>
         <w:lastRenderedPageBreak/>
@@ -29720,7 +30035,7 @@
         <w:t xml:space="preserve">menu </w:t>
       </w:r>
       <w:r>
-        <w:t xml:space="preserve">items (Mark TesnseAspectMood, Mark Pronouns, </w:t>
+        <w:t xml:space="preserve">items (Mark TenseAspectMood, Mark Pronouns, </w:t>
       </w:r>
       <w:r>
         <w:t xml:space="preserve">or </w:t>
@@ -29805,11 +30120,11 @@
       <w:pPr>
         <w:pStyle w:val="Heading2"/>
       </w:pPr>
-      <w:bookmarkStart w:id="82" w:name="_Toc170205573"/>
+      <w:bookmarkStart w:id="81" w:name="_Toc170205573"/>
       <w:r>
         <w:t>Scripture</w:t>
       </w:r>
-      <w:bookmarkEnd w:id="82"/>
+      <w:bookmarkEnd w:id="81"/>
     </w:p>
     <w:p>
       <w:pPr>
@@ -30238,7 +30553,15 @@
         <w:pStyle w:val="ListBullet"/>
       </w:pPr>
       <w:r>
-        <w:t>it appends Footnote(c:v) for ScrFootnote with the chapter and verse number in parentheses.</w:t>
+        <w:t>it appends Footnote(</w:t>
+      </w:r>
+      <w:proofErr w:type="gramStart"/>
+      <w:r>
+        <w:t>c:v</w:t>
+      </w:r>
+      <w:proofErr w:type="gramEnd"/>
+      <w:r>
+        <w:t>) for ScrFootnote with the chapter and verse number in parentheses.</w:t>
       </w:r>
     </w:p>
     <w:p>
@@ -30425,7 +30748,7 @@
       </w:pPr>
       <w:r>
         <w:lastRenderedPageBreak/>
-        <w:t>VerseRefStart – an Integer representing the book, chapter, and verse that starts this section in the form BBCCCCVVVV.</w:t>
+        <w:t>VerseRefStart – an Integer representing the book, chapter, and verse that starts this section in the form BBCCCVVV.</w:t>
       </w:r>
     </w:p>
     <w:p>
@@ -30439,7 +30762,7 @@
         <w:t>I</w:t>
       </w:r>
       <w:r>
-        <w:t>nteger representing the book, chapter, and verse that ends this section in the form BBCCCCVVVV.</w:t>
+        <w:t>nteger representing the book, chapter, and verse that ends this section in the form BBCCCVVV.</w:t>
       </w:r>
     </w:p>
     <w:p>
@@ -30610,14 +30933,14 @@
       <w:pPr>
         <w:pStyle w:val="Heading1"/>
       </w:pPr>
-      <w:bookmarkStart w:id="83" w:name="_Toc170205574"/>
+      <w:bookmarkStart w:id="82" w:name="_Toc170205574"/>
       <w:r>
         <w:t>N</w:t>
       </w:r>
       <w:r>
         <w:t>otebook model</w:t>
       </w:r>
-      <w:bookmarkEnd w:id="83"/>
+      <w:bookmarkEnd w:id="82"/>
     </w:p>
     <w:p>
       <w:pPr>
@@ -30753,15 +31076,12 @@
         <w:pStyle w:val="Example"/>
       </w:pPr>
       <w:r>
-        <w:rPr>
-          <w:noProof/>
-        </w:rPr>
         <w:lastRenderedPageBreak/>
         <w:drawing>
-          <wp:inline distT="0" distB="0" distL="0" distR="0" wp14:anchorId="710D163D" wp14:editId="6AF4550E">
-            <wp:extent cx="5616453" cy="2790825"/>
-            <wp:effectExtent l="0" t="0" r="3810" b="0"/>
-            <wp:docPr id="106" name="Picture 106"/>
+          <wp:inline distT="0" distB="0" distL="0" distR="0" wp14:anchorId="64DF1BF8" wp14:editId="3754ADF7">
+            <wp:extent cx="5598543" cy="2788505"/>
+            <wp:effectExtent l="0" t="0" r="2540" b="0"/>
+            <wp:docPr id="74" name="Picture 74"/>
             <wp:cNvGraphicFramePr>
               <a:graphicFrameLocks xmlns:a="http://schemas.openxmlformats.org/drawingml/2006/main" noChangeAspect="1"/>
             </wp:cNvGraphicFramePr>
@@ -30781,7 +31101,7 @@
                   <pic:spPr>
                     <a:xfrm>
                       <a:off x="0" y="0"/>
-                      <a:ext cx="5672189" cy="2818520"/>
+                      <a:ext cx="5617138" cy="2797767"/>
                     </a:xfrm>
                     <a:prstGeom prst="rect">
                       <a:avLst/>
@@ -30834,7 +31154,12 @@
         <w:t>. RnRoledPartic has reference collection Participants property referencing CmPerson objects from the People list. It also has a Role atomic reference to CmPossibility from the Roles list.</w:t>
       </w:r>
       <w:r>
-        <w:t xml:space="preserve"> RnGenericRec has an AnthroCodes reference collection to CmAnthroItem. The display typically shows the abbreviation and name of the anthro items. RnGenericRec has a Locations reference collection to CmLocation objects in the Locations list. It also has an atomic reference Type property referencing one of the CmPossibility items in the Notebook Record Types list.</w:t>
+        <w:t xml:space="preserve"> RnGenericRec has an AnthroCodes reference collection to CmAnthroItem. The display typically shows the abbreviation and name of the anthro items. </w:t>
+      </w:r>
+      <w:bookmarkStart w:id="83" w:name="_GoBack"/>
+      <w:bookmarkEnd w:id="83"/>
+      <w:r>
+        <w:t>RnGenericRec has a Locations reference collection to CmLocation objects in the Locations list. It also has an atomic reference Type property referencing one of the CmPossibility items in the Notebook Record Types list.</w:t>
       </w:r>
     </w:p>
     <w:sectPr>
@@ -30903,7 +31228,7 @@
       <w:rPr>
         <w:noProof/>
       </w:rPr>
-      <w:t>6/25/2024</w:t>
+      <w:t>7/9/2024</w:t>
     </w:r>
     <w:r>
       <w:fldChar w:fldCharType="end"/>
@@ -30950,7 +31275,7 @@
         <w:rStyle w:val="PageNumber"/>
         <w:noProof/>
       </w:rPr>
-      <w:t>6/25/2024</w:t>
+      <w:t>7/9/2024</w:t>
     </w:r>
     <w:r>
       <w:rPr>
@@ -31071,29 +31396,15 @@
       </w:rPr>
       <w:tab/>
     </w:r>
-    <w:r>
-      <w:fldChar w:fldCharType="begin"/>
-    </w:r>
-    <w:r>
-      <w:instrText xml:space="preserve"> STYLEREF "Heading 1" \* MERGEFORMAT </w:instrText>
-    </w:r>
-    <w:r>
-      <w:fldChar w:fldCharType="separate"/>
-    </w:r>
-    <w:r>
-      <w:rPr>
-        <w:rStyle w:val="PageNumber"/>
-        <w:noProof/>
-      </w:rPr>
-      <w:t>Introduction</w:t>
-    </w:r>
-    <w:r>
-      <w:rPr>
-        <w:rStyle w:val="PageNumber"/>
-        <w:noProof/>
-      </w:rPr>
-      <w:fldChar w:fldCharType="end"/>
-    </w:r>
+    <w:fldSimple w:instr=" STYLEREF &quot;Heading 1&quot; \* MERGEFORMAT ">
+      <w:r>
+        <w:rPr>
+          <w:rStyle w:val="PageNumber"/>
+          <w:noProof/>
+        </w:rPr>
+        <w:t>Introduction</w:t>
+      </w:r>
+    </w:fldSimple>
   </w:p>
 </w:hdr>
 </file>
@@ -34953,7 +35264,7 @@
 </file>
 
 <file path=customXml/itemProps1.xml><?xml version="1.0" encoding="utf-8"?>
-<ds:datastoreItem xmlns:ds="http://schemas.openxmlformats.org/officeDocument/2006/customXml" ds:itemID="{27120A15-AC76-4F64-9684-52DD9E4996DD}">
+<ds:datastoreItem xmlns:ds="http://schemas.openxmlformats.org/officeDocument/2006/customXml" ds:itemID="{CFFA4ACD-7A99-4EDC-A073-3B2262421DBB}">
   <ds:schemaRefs>
     <ds:schemaRef ds:uri="http://schemas.openxmlformats.org/officeDocument/2006/bibliography"/>
   </ds:schemaRefs>

</xml_diff>

<commit_message>
Update to Flex9.1 documents
Made corrections two two diagrams and some associated text in docx,
odg, and pptx files

Change-Id: Ie55b456becd15b01f92032a985b912681859d03e
</commit_message>
<xml_diff>
--- a/HelpResourcesSources/TechnicalNotes/FLEx 9.1 Conceptual Model.docx
+++ b/HelpResourcesSources/TechnicalNotes/FLEx 9.1 Conceptual Model.docx
@@ -6,7 +6,7 @@
       <w:pPr>
         <w:pStyle w:val="Title"/>
       </w:pPr>
-      <w:bookmarkStart w:id="0" w:name="_Toc170205503"/>
+      <w:bookmarkStart w:id="0" w:name="_Toc172275486"/>
       <w:r>
         <w:t xml:space="preserve">FLEx </w:t>
       </w:r>
@@ -37,7 +37,19 @@
         <w:rPr>
           <w:szCs w:val="36"/>
         </w:rPr>
-        <w:t>July 9</w:t>
+        <w:t xml:space="preserve">July </w:t>
+      </w:r>
+      <w:r>
+        <w:rPr>
+          <w:szCs w:val="36"/>
+        </w:rPr>
+        <w:t>1</w:t>
+      </w:r>
+      <w:r>
+        <w:rPr>
+          <w:szCs w:val="36"/>
+        </w:rPr>
+        <w:t>9</w:t>
       </w:r>
       <w:r>
         <w:rPr>
@@ -80,7 +92,7 @@
           <w:lang w:eastAsia="en-US"/>
         </w:rPr>
       </w:pPr>
-      <w:hyperlink w:anchor="_Toc170205503" w:history="1">
+      <w:hyperlink w:anchor="_Toc172275486" w:history="1">
         <w:r>
           <w:rPr>
             <w:rStyle w:val="Hyperlink"/>
@@ -107,7 +119,7 @@
             <w:noProof/>
             <w:webHidden/>
           </w:rPr>
-          <w:instrText xml:space="preserve"> PAGEREF _Toc170205503 \h </w:instrText>
+          <w:instrText xml:space="preserve"> PAGEREF _Toc172275486 \h </w:instrText>
         </w:r>
         <w:r>
           <w:rPr>
@@ -153,7 +165,7 @@
           <w:lang w:eastAsia="en-US"/>
         </w:rPr>
       </w:pPr>
-      <w:hyperlink w:anchor="_Toc170205504" w:history="1">
+      <w:hyperlink w:anchor="_Toc172275487" w:history="1">
         <w:r>
           <w:rPr>
             <w:rStyle w:val="Hyperlink"/>
@@ -197,7 +209,7 @@
             <w:noProof/>
             <w:webHidden/>
           </w:rPr>
-          <w:instrText xml:space="preserve"> PAGEREF _Toc170205504 \h </w:instrText>
+          <w:instrText xml:space="preserve"> PAGEREF _Toc172275487 \h </w:instrText>
         </w:r>
         <w:r>
           <w:rPr>
@@ -243,7 +255,7 @@
           <w:lang w:eastAsia="en-US"/>
         </w:rPr>
       </w:pPr>
-      <w:hyperlink w:anchor="_Toc170205505" w:history="1">
+      <w:hyperlink w:anchor="_Toc172275488" w:history="1">
         <w:r>
           <w:rPr>
             <w:rStyle w:val="Hyperlink"/>
@@ -287,7 +299,7 @@
             <w:noProof/>
             <w:webHidden/>
           </w:rPr>
-          <w:instrText xml:space="preserve"> PAGEREF _Toc170205505 \h </w:instrText>
+          <w:instrText xml:space="preserve"> PAGEREF _Toc172275488 \h </w:instrText>
         </w:r>
         <w:r>
           <w:rPr>
@@ -328,7 +340,7 @@
           <w:szCs w:val="22"/>
         </w:rPr>
       </w:pPr>
-      <w:hyperlink w:anchor="_Toc170205506" w:history="1">
+      <w:hyperlink w:anchor="_Toc172275489" w:history="1">
         <w:r>
           <w:rPr>
             <w:rStyle w:val="Hyperlink"/>
@@ -373,7 +385,7 @@
             <w:noProof/>
             <w:webHidden/>
           </w:rPr>
-          <w:instrText xml:space="preserve"> PAGEREF _Toc170205506 \h </w:instrText>
+          <w:instrText xml:space="preserve"> PAGEREF _Toc172275489 \h </w:instrText>
         </w:r>
         <w:r>
           <w:rPr>
@@ -414,7 +426,7 @@
           <w:szCs w:val="22"/>
         </w:rPr>
       </w:pPr>
-      <w:hyperlink w:anchor="_Toc170205507" w:history="1">
+      <w:hyperlink w:anchor="_Toc172275490" w:history="1">
         <w:r>
           <w:rPr>
             <w:rStyle w:val="Hyperlink"/>
@@ -459,7 +471,7 @@
             <w:noProof/>
             <w:webHidden/>
           </w:rPr>
-          <w:instrText xml:space="preserve"> PAGEREF _Toc170205507 \h </w:instrText>
+          <w:instrText xml:space="preserve"> PAGEREF _Toc172275490 \h </w:instrText>
         </w:r>
         <w:r>
           <w:rPr>
@@ -500,7 +512,7 @@
           <w:szCs w:val="22"/>
         </w:rPr>
       </w:pPr>
-      <w:hyperlink w:anchor="_Toc170205508" w:history="1">
+      <w:hyperlink w:anchor="_Toc172275491" w:history="1">
         <w:r>
           <w:rPr>
             <w:rStyle w:val="Hyperlink"/>
@@ -545,7 +557,7 @@
             <w:noProof/>
             <w:webHidden/>
           </w:rPr>
-          <w:instrText xml:space="preserve"> PAGEREF _Toc170205508 \h </w:instrText>
+          <w:instrText xml:space="preserve"> PAGEREF _Toc172275491 \h </w:instrText>
         </w:r>
         <w:r>
           <w:rPr>
@@ -591,7 +603,7 @@
           <w:lang w:eastAsia="en-US"/>
         </w:rPr>
       </w:pPr>
-      <w:hyperlink w:anchor="_Toc170205509" w:history="1">
+      <w:hyperlink w:anchor="_Toc172275492" w:history="1">
         <w:r>
           <w:rPr>
             <w:rStyle w:val="Hyperlink"/>
@@ -635,7 +647,7 @@
             <w:noProof/>
             <w:webHidden/>
           </w:rPr>
-          <w:instrText xml:space="preserve"> PAGEREF _Toc170205509 \h </w:instrText>
+          <w:instrText xml:space="preserve"> PAGEREF _Toc172275492 \h </w:instrText>
         </w:r>
         <w:r>
           <w:rPr>
@@ -680,7 +692,7 @@
           <w:szCs w:val="22"/>
         </w:rPr>
       </w:pPr>
-      <w:hyperlink w:anchor="_Toc170205510" w:history="1">
+      <w:hyperlink w:anchor="_Toc172275493" w:history="1">
         <w:r>
           <w:rPr>
             <w:rStyle w:val="Hyperlink"/>
@@ -725,7 +737,7 @@
             <w:noProof/>
             <w:webHidden/>
           </w:rPr>
-          <w:instrText xml:space="preserve"> PAGEREF _Toc170205510 \h </w:instrText>
+          <w:instrText xml:space="preserve"> PAGEREF _Toc172275493 \h </w:instrText>
         </w:r>
         <w:r>
           <w:rPr>
@@ -770,7 +782,7 @@
           <w:szCs w:val="22"/>
         </w:rPr>
       </w:pPr>
-      <w:hyperlink w:anchor="_Toc170205511" w:history="1">
+      <w:hyperlink w:anchor="_Toc172275494" w:history="1">
         <w:r>
           <w:rPr>
             <w:rStyle w:val="Hyperlink"/>
@@ -815,7 +827,7 @@
             <w:noProof/>
             <w:webHidden/>
           </w:rPr>
-          <w:instrText xml:space="preserve"> PAGEREF _Toc170205511 \h </w:instrText>
+          <w:instrText xml:space="preserve"> PAGEREF _Toc172275494 \h </w:instrText>
         </w:r>
         <w:r>
           <w:rPr>
@@ -860,7 +872,7 @@
           <w:szCs w:val="22"/>
         </w:rPr>
       </w:pPr>
-      <w:hyperlink w:anchor="_Toc170205512" w:history="1">
+      <w:hyperlink w:anchor="_Toc172275495" w:history="1">
         <w:r>
           <w:rPr>
             <w:rStyle w:val="Hyperlink"/>
@@ -905,7 +917,7 @@
             <w:noProof/>
             <w:webHidden/>
           </w:rPr>
-          <w:instrText xml:space="preserve"> PAGEREF _Toc170205512 \h </w:instrText>
+          <w:instrText xml:space="preserve"> PAGEREF _Toc172275495 \h </w:instrText>
         </w:r>
         <w:r>
           <w:rPr>
@@ -950,7 +962,7 @@
           <w:szCs w:val="22"/>
         </w:rPr>
       </w:pPr>
-      <w:hyperlink w:anchor="_Toc170205513" w:history="1">
+      <w:hyperlink w:anchor="_Toc172275496" w:history="1">
         <w:r>
           <w:rPr>
             <w:rStyle w:val="Hyperlink"/>
@@ -995,7 +1007,7 @@
             <w:noProof/>
             <w:webHidden/>
           </w:rPr>
-          <w:instrText xml:space="preserve"> PAGEREF _Toc170205513 \h </w:instrText>
+          <w:instrText xml:space="preserve"> PAGEREF _Toc172275496 \h </w:instrText>
         </w:r>
         <w:r>
           <w:rPr>
@@ -1041,7 +1053,7 @@
           <w:lang w:eastAsia="en-US"/>
         </w:rPr>
       </w:pPr>
-      <w:hyperlink w:anchor="_Toc170205514" w:history="1">
+      <w:hyperlink w:anchor="_Toc172275497" w:history="1">
         <w:r>
           <w:rPr>
             <w:rStyle w:val="Hyperlink"/>
@@ -1085,7 +1097,7 @@
             <w:noProof/>
             <w:webHidden/>
           </w:rPr>
-          <w:instrText xml:space="preserve"> PAGEREF _Toc170205514 \h </w:instrText>
+          <w:instrText xml:space="preserve"> PAGEREF _Toc172275497 \h </w:instrText>
         </w:r>
         <w:r>
           <w:rPr>
@@ -1131,7 +1143,7 @@
           <w:lang w:eastAsia="en-US"/>
         </w:rPr>
       </w:pPr>
-      <w:hyperlink w:anchor="_Toc170205515" w:history="1">
+      <w:hyperlink w:anchor="_Toc172275498" w:history="1">
         <w:r>
           <w:rPr>
             <w:rStyle w:val="Hyperlink"/>
@@ -1175,7 +1187,7 @@
             <w:noProof/>
             <w:webHidden/>
           </w:rPr>
-          <w:instrText xml:space="preserve"> PAGEREF _Toc170205515 \h </w:instrText>
+          <w:instrText xml:space="preserve"> PAGEREF _Toc172275498 \h </w:instrText>
         </w:r>
         <w:r>
           <w:rPr>
@@ -1221,7 +1233,7 @@
           <w:lang w:eastAsia="en-US"/>
         </w:rPr>
       </w:pPr>
-      <w:hyperlink w:anchor="_Toc170205516" w:history="1">
+      <w:hyperlink w:anchor="_Toc172275499" w:history="1">
         <w:r>
           <w:rPr>
             <w:rStyle w:val="Hyperlink"/>
@@ -1265,7 +1277,7 @@
             <w:noProof/>
             <w:webHidden/>
           </w:rPr>
-          <w:instrText xml:space="preserve"> PAGEREF _Toc170205516 \h </w:instrText>
+          <w:instrText xml:space="preserve"> PAGEREF _Toc172275499 \h </w:instrText>
         </w:r>
         <w:r>
           <w:rPr>
@@ -1311,7 +1323,7 @@
           <w:lang w:eastAsia="en-US"/>
         </w:rPr>
       </w:pPr>
-      <w:hyperlink w:anchor="_Toc170205517" w:history="1">
+      <w:hyperlink w:anchor="_Toc172275500" w:history="1">
         <w:r>
           <w:rPr>
             <w:rStyle w:val="Hyperlink"/>
@@ -1355,7 +1367,7 @@
             <w:noProof/>
             <w:webHidden/>
           </w:rPr>
-          <w:instrText xml:space="preserve"> PAGEREF _Toc170205517 \h </w:instrText>
+          <w:instrText xml:space="preserve"> PAGEREF _Toc172275500 \h </w:instrText>
         </w:r>
         <w:r>
           <w:rPr>
@@ -1401,7 +1413,7 @@
           <w:lang w:eastAsia="en-US"/>
         </w:rPr>
       </w:pPr>
-      <w:hyperlink w:anchor="_Toc170205518" w:history="1">
+      <w:hyperlink w:anchor="_Toc172275501" w:history="1">
         <w:r>
           <w:rPr>
             <w:rStyle w:val="Hyperlink"/>
@@ -1445,7 +1457,7 @@
             <w:noProof/>
             <w:webHidden/>
           </w:rPr>
-          <w:instrText xml:space="preserve"> PAGEREF _Toc170205518 \h </w:instrText>
+          <w:instrText xml:space="preserve"> PAGEREF _Toc172275501 \h </w:instrText>
         </w:r>
         <w:r>
           <w:rPr>
@@ -1491,7 +1503,7 @@
           <w:lang w:eastAsia="en-US"/>
         </w:rPr>
       </w:pPr>
-      <w:hyperlink w:anchor="_Toc170205519" w:history="1">
+      <w:hyperlink w:anchor="_Toc172275502" w:history="1">
         <w:r>
           <w:rPr>
             <w:rStyle w:val="Hyperlink"/>
@@ -1535,7 +1547,7 @@
             <w:noProof/>
             <w:webHidden/>
           </w:rPr>
-          <w:instrText xml:space="preserve"> PAGEREF _Toc170205519 \h </w:instrText>
+          <w:instrText xml:space="preserve"> PAGEREF _Toc172275502 \h </w:instrText>
         </w:r>
         <w:r>
           <w:rPr>
@@ -1581,7 +1593,7 @@
           <w:lang w:eastAsia="en-US"/>
         </w:rPr>
       </w:pPr>
-      <w:hyperlink w:anchor="_Toc170205520" w:history="1">
+      <w:hyperlink w:anchor="_Toc172275503" w:history="1">
         <w:r>
           <w:rPr>
             <w:rStyle w:val="Hyperlink"/>
@@ -1625,7 +1637,7 @@
             <w:noProof/>
             <w:webHidden/>
           </w:rPr>
-          <w:instrText xml:space="preserve"> PAGEREF _Toc170205520 \h </w:instrText>
+          <w:instrText xml:space="preserve"> PAGEREF _Toc172275503 \h </w:instrText>
         </w:r>
         <w:r>
           <w:rPr>
@@ -1666,7 +1678,7 @@
           <w:szCs w:val="22"/>
         </w:rPr>
       </w:pPr>
-      <w:hyperlink w:anchor="_Toc170205521" w:history="1">
+      <w:hyperlink w:anchor="_Toc172275504" w:history="1">
         <w:r>
           <w:rPr>
             <w:rStyle w:val="Hyperlink"/>
@@ -1711,7 +1723,7 @@
             <w:noProof/>
             <w:webHidden/>
           </w:rPr>
-          <w:instrText xml:space="preserve"> PAGEREF _Toc170205521 \h </w:instrText>
+          <w:instrText xml:space="preserve"> PAGEREF _Toc172275504 \h </w:instrText>
         </w:r>
         <w:r>
           <w:rPr>
@@ -1752,7 +1764,7 @@
           <w:szCs w:val="22"/>
         </w:rPr>
       </w:pPr>
-      <w:hyperlink w:anchor="_Toc170205522" w:history="1">
+      <w:hyperlink w:anchor="_Toc172275505" w:history="1">
         <w:r>
           <w:rPr>
             <w:rStyle w:val="Hyperlink"/>
@@ -1797,7 +1809,7 @@
             <w:noProof/>
             <w:webHidden/>
           </w:rPr>
-          <w:instrText xml:space="preserve"> PAGEREF _Toc170205522 \h </w:instrText>
+          <w:instrText xml:space="preserve"> PAGEREF _Toc172275505 \h </w:instrText>
         </w:r>
         <w:r>
           <w:rPr>
@@ -1838,7 +1850,7 @@
           <w:szCs w:val="22"/>
         </w:rPr>
       </w:pPr>
-      <w:hyperlink w:anchor="_Toc170205523" w:history="1">
+      <w:hyperlink w:anchor="_Toc172275506" w:history="1">
         <w:r>
           <w:rPr>
             <w:rStyle w:val="Hyperlink"/>
@@ -1883,7 +1895,7 @@
             <w:noProof/>
             <w:webHidden/>
           </w:rPr>
-          <w:instrText xml:space="preserve"> PAGEREF _Toc170205523 \h </w:instrText>
+          <w:instrText xml:space="preserve"> PAGEREF _Toc172275506 \h </w:instrText>
         </w:r>
         <w:r>
           <w:rPr>
@@ -1924,7 +1936,7 @@
           <w:szCs w:val="22"/>
         </w:rPr>
       </w:pPr>
-      <w:hyperlink w:anchor="_Toc170205524" w:history="1">
+      <w:hyperlink w:anchor="_Toc172275507" w:history="1">
         <w:r>
           <w:rPr>
             <w:rStyle w:val="Hyperlink"/>
@@ -1969,7 +1981,7 @@
             <w:noProof/>
             <w:webHidden/>
           </w:rPr>
-          <w:instrText xml:space="preserve"> PAGEREF _Toc170205524 \h </w:instrText>
+          <w:instrText xml:space="preserve"> PAGEREF _Toc172275507 \h </w:instrText>
         </w:r>
         <w:r>
           <w:rPr>
@@ -2010,7 +2022,7 @@
           <w:szCs w:val="22"/>
         </w:rPr>
       </w:pPr>
-      <w:hyperlink w:anchor="_Toc170205525" w:history="1">
+      <w:hyperlink w:anchor="_Toc172275508" w:history="1">
         <w:r>
           <w:rPr>
             <w:rStyle w:val="Hyperlink"/>
@@ -2055,7 +2067,7 @@
             <w:noProof/>
             <w:webHidden/>
           </w:rPr>
-          <w:instrText xml:space="preserve"> PAGEREF _Toc170205525 \h </w:instrText>
+          <w:instrText xml:space="preserve"> PAGEREF _Toc172275508 \h </w:instrText>
         </w:r>
         <w:r>
           <w:rPr>
@@ -2096,7 +2108,7 @@
           <w:szCs w:val="22"/>
         </w:rPr>
       </w:pPr>
-      <w:hyperlink w:anchor="_Toc170205526" w:history="1">
+      <w:hyperlink w:anchor="_Toc172275509" w:history="1">
         <w:r>
           <w:rPr>
             <w:rStyle w:val="Hyperlink"/>
@@ -2141,7 +2153,7 @@
             <w:noProof/>
             <w:webHidden/>
           </w:rPr>
-          <w:instrText xml:space="preserve"> PAGEREF _Toc170205526 \h </w:instrText>
+          <w:instrText xml:space="preserve"> PAGEREF _Toc172275509 \h </w:instrText>
         </w:r>
         <w:r>
           <w:rPr>
@@ -2182,7 +2194,7 @@
           <w:szCs w:val="22"/>
         </w:rPr>
       </w:pPr>
-      <w:hyperlink w:anchor="_Toc170205527" w:history="1">
+      <w:hyperlink w:anchor="_Toc172275510" w:history="1">
         <w:r>
           <w:rPr>
             <w:rStyle w:val="Hyperlink"/>
@@ -2227,7 +2239,7 @@
             <w:noProof/>
             <w:webHidden/>
           </w:rPr>
-          <w:instrText xml:space="preserve"> PAGEREF _Toc170205527 \h </w:instrText>
+          <w:instrText xml:space="preserve"> PAGEREF _Toc172275510 \h </w:instrText>
         </w:r>
         <w:r>
           <w:rPr>
@@ -2273,7 +2285,7 @@
           <w:lang w:eastAsia="en-US"/>
         </w:rPr>
       </w:pPr>
-      <w:hyperlink w:anchor="_Toc170205528" w:history="1">
+      <w:hyperlink w:anchor="_Toc172275511" w:history="1">
         <w:r>
           <w:rPr>
             <w:rStyle w:val="Hyperlink"/>
@@ -2317,7 +2329,7 @@
             <w:noProof/>
             <w:webHidden/>
           </w:rPr>
-          <w:instrText xml:space="preserve"> PAGEREF _Toc170205528 \h </w:instrText>
+          <w:instrText xml:space="preserve"> PAGEREF _Toc172275511 \h </w:instrText>
         </w:r>
         <w:r>
           <w:rPr>
@@ -2358,7 +2370,7 @@
           <w:szCs w:val="22"/>
         </w:rPr>
       </w:pPr>
-      <w:hyperlink w:anchor="_Toc170205529" w:history="1">
+      <w:hyperlink w:anchor="_Toc172275512" w:history="1">
         <w:r>
           <w:rPr>
             <w:rStyle w:val="Hyperlink"/>
@@ -2403,7 +2415,7 @@
             <w:noProof/>
             <w:webHidden/>
           </w:rPr>
-          <w:instrText xml:space="preserve"> PAGEREF _Toc170205529 \h </w:instrText>
+          <w:instrText xml:space="preserve"> PAGEREF _Toc172275512 \h </w:instrText>
         </w:r>
         <w:r>
           <w:rPr>
@@ -2444,7 +2456,7 @@
           <w:szCs w:val="22"/>
         </w:rPr>
       </w:pPr>
-      <w:hyperlink w:anchor="_Toc170205530" w:history="1">
+      <w:hyperlink w:anchor="_Toc172275513" w:history="1">
         <w:r>
           <w:rPr>
             <w:rStyle w:val="Hyperlink"/>
@@ -2489,7 +2501,7 @@
             <w:noProof/>
             <w:webHidden/>
           </w:rPr>
-          <w:instrText xml:space="preserve"> PAGEREF _Toc170205530 \h </w:instrText>
+          <w:instrText xml:space="preserve"> PAGEREF _Toc172275513 \h </w:instrText>
         </w:r>
         <w:r>
           <w:rPr>
@@ -2530,7 +2542,7 @@
           <w:szCs w:val="22"/>
         </w:rPr>
       </w:pPr>
-      <w:hyperlink w:anchor="_Toc170205531" w:history="1">
+      <w:hyperlink w:anchor="_Toc172275514" w:history="1">
         <w:r>
           <w:rPr>
             <w:rStyle w:val="Hyperlink"/>
@@ -2575,7 +2587,7 @@
             <w:noProof/>
             <w:webHidden/>
           </w:rPr>
-          <w:instrText xml:space="preserve"> PAGEREF _Toc170205531 \h </w:instrText>
+          <w:instrText xml:space="preserve"> PAGEREF _Toc172275514 \h </w:instrText>
         </w:r>
         <w:r>
           <w:rPr>
@@ -2621,7 +2633,7 @@
           <w:lang w:eastAsia="en-US"/>
         </w:rPr>
       </w:pPr>
-      <w:hyperlink w:anchor="_Toc170205532" w:history="1">
+      <w:hyperlink w:anchor="_Toc172275515" w:history="1">
         <w:r>
           <w:rPr>
             <w:rStyle w:val="Hyperlink"/>
@@ -2665,7 +2677,7 @@
             <w:noProof/>
             <w:webHidden/>
           </w:rPr>
-          <w:instrText xml:space="preserve"> PAGEREF _Toc170205532 \h </w:instrText>
+          <w:instrText xml:space="preserve"> PAGEREF _Toc172275515 \h </w:instrText>
         </w:r>
         <w:r>
           <w:rPr>
@@ -2711,7 +2723,7 @@
           <w:lang w:eastAsia="en-US"/>
         </w:rPr>
       </w:pPr>
-      <w:hyperlink w:anchor="_Toc170205533" w:history="1">
+      <w:hyperlink w:anchor="_Toc172275516" w:history="1">
         <w:r>
           <w:rPr>
             <w:rStyle w:val="Hyperlink"/>
@@ -2755,7 +2767,7 @@
             <w:noProof/>
             <w:webHidden/>
           </w:rPr>
-          <w:instrText xml:space="preserve"> PAGEREF _Toc170205533 \h </w:instrText>
+          <w:instrText xml:space="preserve"> PAGEREF _Toc172275516 \h </w:instrText>
         </w:r>
         <w:r>
           <w:rPr>
@@ -2796,7 +2808,7 @@
           <w:szCs w:val="22"/>
         </w:rPr>
       </w:pPr>
-      <w:hyperlink w:anchor="_Toc170205534" w:history="1">
+      <w:hyperlink w:anchor="_Toc172275517" w:history="1">
         <w:r>
           <w:rPr>
             <w:rStyle w:val="Hyperlink"/>
@@ -2841,7 +2853,7 @@
             <w:noProof/>
             <w:webHidden/>
           </w:rPr>
-          <w:instrText xml:space="preserve"> PAGEREF _Toc170205534 \h </w:instrText>
+          <w:instrText xml:space="preserve"> PAGEREF _Toc172275517 \h </w:instrText>
         </w:r>
         <w:r>
           <w:rPr>
@@ -2882,7 +2894,7 @@
           <w:szCs w:val="22"/>
         </w:rPr>
       </w:pPr>
-      <w:hyperlink w:anchor="_Toc170205535" w:history="1">
+      <w:hyperlink w:anchor="_Toc172275518" w:history="1">
         <w:r>
           <w:rPr>
             <w:rStyle w:val="Hyperlink"/>
@@ -2927,7 +2939,7 @@
             <w:noProof/>
             <w:webHidden/>
           </w:rPr>
-          <w:instrText xml:space="preserve"> PAGEREF _Toc170205535 \h </w:instrText>
+          <w:instrText xml:space="preserve"> PAGEREF _Toc172275518 \h </w:instrText>
         </w:r>
         <w:r>
           <w:rPr>
@@ -2973,7 +2985,7 @@
           <w:lang w:eastAsia="en-US"/>
         </w:rPr>
       </w:pPr>
-      <w:hyperlink w:anchor="_Toc170205536" w:history="1">
+      <w:hyperlink w:anchor="_Toc172275519" w:history="1">
         <w:r>
           <w:rPr>
             <w:rStyle w:val="Hyperlink"/>
@@ -3017,7 +3029,7 @@
             <w:noProof/>
             <w:webHidden/>
           </w:rPr>
-          <w:instrText xml:space="preserve"> PAGEREF _Toc170205536 \h </w:instrText>
+          <w:instrText xml:space="preserve"> PAGEREF _Toc172275519 \h </w:instrText>
         </w:r>
         <w:r>
           <w:rPr>
@@ -3058,7 +3070,7 @@
           <w:szCs w:val="22"/>
         </w:rPr>
       </w:pPr>
-      <w:hyperlink w:anchor="_Toc170205537" w:history="1">
+      <w:hyperlink w:anchor="_Toc172275520" w:history="1">
         <w:r>
           <w:rPr>
             <w:rStyle w:val="Hyperlink"/>
@@ -3103,7 +3115,7 @@
             <w:noProof/>
             <w:webHidden/>
           </w:rPr>
-          <w:instrText xml:space="preserve"> PAGEREF _Toc170205537 \h </w:instrText>
+          <w:instrText xml:space="preserve"> PAGEREF _Toc172275520 \h </w:instrText>
         </w:r>
         <w:r>
           <w:rPr>
@@ -3149,7 +3161,7 @@
           <w:lang w:eastAsia="en-US"/>
         </w:rPr>
       </w:pPr>
-      <w:hyperlink w:anchor="_Toc170205538" w:history="1">
+      <w:hyperlink w:anchor="_Toc172275521" w:history="1">
         <w:r>
           <w:rPr>
             <w:rStyle w:val="Hyperlink"/>
@@ -3193,7 +3205,7 @@
             <w:noProof/>
             <w:webHidden/>
           </w:rPr>
-          <w:instrText xml:space="preserve"> PAGEREF _Toc170205538 \h </w:instrText>
+          <w:instrText xml:space="preserve"> PAGEREF _Toc172275521 \h </w:instrText>
         </w:r>
         <w:r>
           <w:rPr>
@@ -3239,7 +3251,7 @@
           <w:lang w:eastAsia="en-US"/>
         </w:rPr>
       </w:pPr>
-      <w:hyperlink w:anchor="_Toc170205539" w:history="1">
+      <w:hyperlink w:anchor="_Toc172275522" w:history="1">
         <w:r>
           <w:rPr>
             <w:rStyle w:val="Hyperlink"/>
@@ -3283,7 +3295,7 @@
             <w:noProof/>
             <w:webHidden/>
           </w:rPr>
-          <w:instrText xml:space="preserve"> PAGEREF _Toc170205539 \h </w:instrText>
+          <w:instrText xml:space="preserve"> PAGEREF _Toc172275522 \h </w:instrText>
         </w:r>
         <w:r>
           <w:rPr>
@@ -3329,7 +3341,7 @@
           <w:lang w:eastAsia="en-US"/>
         </w:rPr>
       </w:pPr>
-      <w:hyperlink w:anchor="_Toc170205540" w:history="1">
+      <w:hyperlink w:anchor="_Toc172275523" w:history="1">
         <w:r>
           <w:rPr>
             <w:rStyle w:val="Hyperlink"/>
@@ -3373,7 +3385,7 @@
             <w:noProof/>
             <w:webHidden/>
           </w:rPr>
-          <w:instrText xml:space="preserve"> PAGEREF _Toc170205540 \h </w:instrText>
+          <w:instrText xml:space="preserve"> PAGEREF _Toc172275523 \h </w:instrText>
         </w:r>
         <w:r>
           <w:rPr>
@@ -3419,7 +3431,7 @@
           <w:lang w:eastAsia="en-US"/>
         </w:rPr>
       </w:pPr>
-      <w:hyperlink w:anchor="_Toc170205541" w:history="1">
+      <w:hyperlink w:anchor="_Toc172275524" w:history="1">
         <w:r>
           <w:rPr>
             <w:rStyle w:val="Hyperlink"/>
@@ -3463,7 +3475,7 @@
             <w:noProof/>
             <w:webHidden/>
           </w:rPr>
-          <w:instrText xml:space="preserve"> PAGEREF _Toc170205541 \h </w:instrText>
+          <w:instrText xml:space="preserve"> PAGEREF _Toc172275524 \h </w:instrText>
         </w:r>
         <w:r>
           <w:rPr>
@@ -3509,7 +3521,7 @@
           <w:lang w:eastAsia="en-US"/>
         </w:rPr>
       </w:pPr>
-      <w:hyperlink w:anchor="_Toc170205542" w:history="1">
+      <w:hyperlink w:anchor="_Toc172275525" w:history="1">
         <w:r>
           <w:rPr>
             <w:rStyle w:val="Hyperlink"/>
@@ -3553,7 +3565,7 @@
             <w:noProof/>
             <w:webHidden/>
           </w:rPr>
-          <w:instrText xml:space="preserve"> PAGEREF _Toc170205542 \h </w:instrText>
+          <w:instrText xml:space="preserve"> PAGEREF _Toc172275525 \h </w:instrText>
         </w:r>
         <w:r>
           <w:rPr>
@@ -3599,7 +3611,7 @@
           <w:lang w:eastAsia="en-US"/>
         </w:rPr>
       </w:pPr>
-      <w:hyperlink w:anchor="_Toc170205543" w:history="1">
+      <w:hyperlink w:anchor="_Toc172275526" w:history="1">
         <w:r>
           <w:rPr>
             <w:rStyle w:val="Hyperlink"/>
@@ -3643,7 +3655,7 @@
             <w:noProof/>
             <w:webHidden/>
           </w:rPr>
-          <w:instrText xml:space="preserve"> PAGEREF _Toc170205543 \h </w:instrText>
+          <w:instrText xml:space="preserve"> PAGEREF _Toc172275526 \h </w:instrText>
         </w:r>
         <w:r>
           <w:rPr>
@@ -3684,7 +3696,7 @@
           <w:szCs w:val="22"/>
         </w:rPr>
       </w:pPr>
-      <w:hyperlink w:anchor="_Toc170205544" w:history="1">
+      <w:hyperlink w:anchor="_Toc172275527" w:history="1">
         <w:r>
           <w:rPr>
             <w:rStyle w:val="Hyperlink"/>
@@ -3729,7 +3741,7 @@
             <w:noProof/>
             <w:webHidden/>
           </w:rPr>
-          <w:instrText xml:space="preserve"> PAGEREF _Toc170205544 \h </w:instrText>
+          <w:instrText xml:space="preserve"> PAGEREF _Toc172275527 \h </w:instrText>
         </w:r>
         <w:r>
           <w:rPr>
@@ -3775,7 +3787,7 @@
           <w:lang w:eastAsia="en-US"/>
         </w:rPr>
       </w:pPr>
-      <w:hyperlink w:anchor="_Toc170205545" w:history="1">
+      <w:hyperlink w:anchor="_Toc172275528" w:history="1">
         <w:r>
           <w:rPr>
             <w:rStyle w:val="Hyperlink"/>
@@ -3819,7 +3831,7 @@
             <w:noProof/>
             <w:webHidden/>
           </w:rPr>
-          <w:instrText xml:space="preserve"> PAGEREF _Toc170205545 \h </w:instrText>
+          <w:instrText xml:space="preserve"> PAGEREF _Toc172275528 \h </w:instrText>
         </w:r>
         <w:r>
           <w:rPr>
@@ -3865,7 +3877,7 @@
           <w:lang w:eastAsia="en-US"/>
         </w:rPr>
       </w:pPr>
-      <w:hyperlink w:anchor="_Toc170205546" w:history="1">
+      <w:hyperlink w:anchor="_Toc172275529" w:history="1">
         <w:r>
           <w:rPr>
             <w:rStyle w:val="Hyperlink"/>
@@ -3909,7 +3921,7 @@
             <w:noProof/>
             <w:webHidden/>
           </w:rPr>
-          <w:instrText xml:space="preserve"> PAGEREF _Toc170205546 \h </w:instrText>
+          <w:instrText xml:space="preserve"> PAGEREF _Toc172275529 \h </w:instrText>
         </w:r>
         <w:r>
           <w:rPr>
@@ -3950,7 +3962,7 @@
           <w:szCs w:val="22"/>
         </w:rPr>
       </w:pPr>
-      <w:hyperlink w:anchor="_Toc170205547" w:history="1">
+      <w:hyperlink w:anchor="_Toc172275530" w:history="1">
         <w:r>
           <w:rPr>
             <w:rStyle w:val="Hyperlink"/>
@@ -3995,7 +4007,7 @@
             <w:noProof/>
             <w:webHidden/>
           </w:rPr>
-          <w:instrText xml:space="preserve"> PAGEREF _Toc170205547 \h </w:instrText>
+          <w:instrText xml:space="preserve"> PAGEREF _Toc172275530 \h </w:instrText>
         </w:r>
         <w:r>
           <w:rPr>
@@ -4041,7 +4053,7 @@
           <w:lang w:eastAsia="en-US"/>
         </w:rPr>
       </w:pPr>
-      <w:hyperlink w:anchor="_Toc170205548" w:history="1">
+      <w:hyperlink w:anchor="_Toc172275531" w:history="1">
         <w:r>
           <w:rPr>
             <w:rStyle w:val="Hyperlink"/>
@@ -4085,7 +4097,7 @@
             <w:noProof/>
             <w:webHidden/>
           </w:rPr>
-          <w:instrText xml:space="preserve"> PAGEREF _Toc170205548 \h </w:instrText>
+          <w:instrText xml:space="preserve"> PAGEREF _Toc172275531 \h </w:instrText>
         </w:r>
         <w:r>
           <w:rPr>
@@ -4131,7 +4143,7 @@
           <w:lang w:eastAsia="en-US"/>
         </w:rPr>
       </w:pPr>
-      <w:hyperlink w:anchor="_Toc170205549" w:history="1">
+      <w:hyperlink w:anchor="_Toc172275532" w:history="1">
         <w:r>
           <w:rPr>
             <w:rStyle w:val="Hyperlink"/>
@@ -4175,7 +4187,7 @@
             <w:noProof/>
             <w:webHidden/>
           </w:rPr>
-          <w:instrText xml:space="preserve"> PAGEREF _Toc170205549 \h </w:instrText>
+          <w:instrText xml:space="preserve"> PAGEREF _Toc172275532 \h </w:instrText>
         </w:r>
         <w:r>
           <w:rPr>
@@ -4221,7 +4233,7 @@
           <w:lang w:eastAsia="en-US"/>
         </w:rPr>
       </w:pPr>
-      <w:hyperlink w:anchor="_Toc170205550" w:history="1">
+      <w:hyperlink w:anchor="_Toc172275533" w:history="1">
         <w:r>
           <w:rPr>
             <w:rStyle w:val="Hyperlink"/>
@@ -4265,7 +4277,7 @@
             <w:noProof/>
             <w:webHidden/>
           </w:rPr>
-          <w:instrText xml:space="preserve"> PAGEREF _Toc170205550 \h </w:instrText>
+          <w:instrText xml:space="preserve"> PAGEREF _Toc172275533 \h </w:instrText>
         </w:r>
         <w:r>
           <w:rPr>
@@ -4310,7 +4322,7 @@
           <w:szCs w:val="22"/>
         </w:rPr>
       </w:pPr>
-      <w:hyperlink w:anchor="_Toc170205551" w:history="1">
+      <w:hyperlink w:anchor="_Toc172275534" w:history="1">
         <w:r>
           <w:rPr>
             <w:rStyle w:val="Hyperlink"/>
@@ -4355,7 +4367,7 @@
             <w:noProof/>
             <w:webHidden/>
           </w:rPr>
-          <w:instrText xml:space="preserve"> PAGEREF _Toc170205551 \h </w:instrText>
+          <w:instrText xml:space="preserve"> PAGEREF _Toc172275534 \h </w:instrText>
         </w:r>
         <w:r>
           <w:rPr>
@@ -4400,7 +4412,7 @@
           <w:szCs w:val="22"/>
         </w:rPr>
       </w:pPr>
-      <w:hyperlink w:anchor="_Toc170205552" w:history="1">
+      <w:hyperlink w:anchor="_Toc172275535" w:history="1">
         <w:r>
           <w:rPr>
             <w:rStyle w:val="Hyperlink"/>
@@ -4445,7 +4457,7 @@
             <w:noProof/>
             <w:webHidden/>
           </w:rPr>
-          <w:instrText xml:space="preserve"> PAGEREF _Toc170205552 \h </w:instrText>
+          <w:instrText xml:space="preserve"> PAGEREF _Toc172275535 \h </w:instrText>
         </w:r>
         <w:r>
           <w:rPr>
@@ -4490,7 +4502,7 @@
           <w:szCs w:val="22"/>
         </w:rPr>
       </w:pPr>
-      <w:hyperlink w:anchor="_Toc170205553" w:history="1">
+      <w:hyperlink w:anchor="_Toc172275536" w:history="1">
         <w:r>
           <w:rPr>
             <w:rStyle w:val="Hyperlink"/>
@@ -4535,7 +4547,7 @@
             <w:noProof/>
             <w:webHidden/>
           </w:rPr>
-          <w:instrText xml:space="preserve"> PAGEREF _Toc170205553 \h </w:instrText>
+          <w:instrText xml:space="preserve"> PAGEREF _Toc172275536 \h </w:instrText>
         </w:r>
         <w:r>
           <w:rPr>
@@ -4580,7 +4592,7 @@
           <w:szCs w:val="22"/>
         </w:rPr>
       </w:pPr>
-      <w:hyperlink w:anchor="_Toc170205554" w:history="1">
+      <w:hyperlink w:anchor="_Toc172275537" w:history="1">
         <w:r>
           <w:rPr>
             <w:rStyle w:val="Hyperlink"/>
@@ -4625,7 +4637,7 @@
             <w:noProof/>
             <w:webHidden/>
           </w:rPr>
-          <w:instrText xml:space="preserve"> PAGEREF _Toc170205554 \h </w:instrText>
+          <w:instrText xml:space="preserve"> PAGEREF _Toc172275537 \h </w:instrText>
         </w:r>
         <w:r>
           <w:rPr>
@@ -4670,7 +4682,7 @@
           <w:szCs w:val="22"/>
         </w:rPr>
       </w:pPr>
-      <w:hyperlink w:anchor="_Toc170205555" w:history="1">
+      <w:hyperlink w:anchor="_Toc172275538" w:history="1">
         <w:r>
           <w:rPr>
             <w:rStyle w:val="Hyperlink"/>
@@ -4715,7 +4727,7 @@
             <w:noProof/>
             <w:webHidden/>
           </w:rPr>
-          <w:instrText xml:space="preserve"> PAGEREF _Toc170205555 \h </w:instrText>
+          <w:instrText xml:space="preserve"> PAGEREF _Toc172275538 \h </w:instrText>
         </w:r>
         <w:r>
           <w:rPr>
@@ -4761,7 +4773,7 @@
           <w:lang w:eastAsia="en-US"/>
         </w:rPr>
       </w:pPr>
-      <w:hyperlink w:anchor="_Toc170205556" w:history="1">
+      <w:hyperlink w:anchor="_Toc172275539" w:history="1">
         <w:r>
           <w:rPr>
             <w:rStyle w:val="Hyperlink"/>
@@ -4805,7 +4817,7 @@
             <w:noProof/>
             <w:webHidden/>
           </w:rPr>
-          <w:instrText xml:space="preserve"> PAGEREF _Toc170205556 \h </w:instrText>
+          <w:instrText xml:space="preserve"> PAGEREF _Toc172275539 \h </w:instrText>
         </w:r>
         <w:r>
           <w:rPr>
@@ -4851,7 +4863,7 @@
           <w:lang w:eastAsia="en-US"/>
         </w:rPr>
       </w:pPr>
-      <w:hyperlink w:anchor="_Toc170205557" w:history="1">
+      <w:hyperlink w:anchor="_Toc172275540" w:history="1">
         <w:r>
           <w:rPr>
             <w:rStyle w:val="Hyperlink"/>
@@ -4895,7 +4907,7 @@
             <w:noProof/>
             <w:webHidden/>
           </w:rPr>
-          <w:instrText xml:space="preserve"> PAGEREF _Toc170205557 \h </w:instrText>
+          <w:instrText xml:space="preserve"> PAGEREF _Toc172275540 \h </w:instrText>
         </w:r>
         <w:r>
           <w:rPr>
@@ -4941,7 +4953,7 @@
           <w:lang w:eastAsia="en-US"/>
         </w:rPr>
       </w:pPr>
-      <w:hyperlink w:anchor="_Toc170205558" w:history="1">
+      <w:hyperlink w:anchor="_Toc172275541" w:history="1">
         <w:r>
           <w:rPr>
             <w:rStyle w:val="Hyperlink"/>
@@ -4985,7 +4997,7 @@
             <w:noProof/>
             <w:webHidden/>
           </w:rPr>
-          <w:instrText xml:space="preserve"> PAGEREF _Toc170205558 \h </w:instrText>
+          <w:instrText xml:space="preserve"> PAGEREF _Toc172275541 \h </w:instrText>
         </w:r>
         <w:r>
           <w:rPr>
@@ -5026,7 +5038,7 @@
           <w:szCs w:val="22"/>
         </w:rPr>
       </w:pPr>
-      <w:hyperlink w:anchor="_Toc170205559" w:history="1">
+      <w:hyperlink w:anchor="_Toc172275542" w:history="1">
         <w:r>
           <w:rPr>
             <w:rStyle w:val="Hyperlink"/>
@@ -5071,7 +5083,7 @@
             <w:noProof/>
             <w:webHidden/>
           </w:rPr>
-          <w:instrText xml:space="preserve"> PAGEREF _Toc170205559 \h </w:instrText>
+          <w:instrText xml:space="preserve"> PAGEREF _Toc172275542 \h </w:instrText>
         </w:r>
         <w:r>
           <w:rPr>
@@ -5112,7 +5124,7 @@
           <w:szCs w:val="22"/>
         </w:rPr>
       </w:pPr>
-      <w:hyperlink w:anchor="_Toc170205560" w:history="1">
+      <w:hyperlink w:anchor="_Toc172275543" w:history="1">
         <w:r>
           <w:rPr>
             <w:rStyle w:val="Hyperlink"/>
@@ -5157,7 +5169,7 @@
             <w:noProof/>
             <w:webHidden/>
           </w:rPr>
-          <w:instrText xml:space="preserve"> PAGEREF _Toc170205560 \h </w:instrText>
+          <w:instrText xml:space="preserve"> PAGEREF _Toc172275543 \h </w:instrText>
         </w:r>
         <w:r>
           <w:rPr>
@@ -5203,7 +5215,7 @@
           <w:lang w:eastAsia="en-US"/>
         </w:rPr>
       </w:pPr>
-      <w:hyperlink w:anchor="_Toc170205561" w:history="1">
+      <w:hyperlink w:anchor="_Toc172275544" w:history="1">
         <w:r>
           <w:rPr>
             <w:rStyle w:val="Hyperlink"/>
@@ -5247,7 +5259,7 @@
             <w:noProof/>
             <w:webHidden/>
           </w:rPr>
-          <w:instrText xml:space="preserve"> PAGEREF _Toc170205561 \h </w:instrText>
+          <w:instrText xml:space="preserve"> PAGEREF _Toc172275544 \h </w:instrText>
         </w:r>
         <w:r>
           <w:rPr>
@@ -5288,7 +5300,7 @@
           <w:szCs w:val="22"/>
         </w:rPr>
       </w:pPr>
-      <w:hyperlink w:anchor="_Toc170205562" w:history="1">
+      <w:hyperlink w:anchor="_Toc172275545" w:history="1">
         <w:r>
           <w:rPr>
             <w:rStyle w:val="Hyperlink"/>
@@ -5333,7 +5345,7 @@
             <w:noProof/>
             <w:webHidden/>
           </w:rPr>
-          <w:instrText xml:space="preserve"> PAGEREF _Toc170205562 \h </w:instrText>
+          <w:instrText xml:space="preserve"> PAGEREF _Toc172275545 \h </w:instrText>
         </w:r>
         <w:r>
           <w:rPr>
@@ -5374,7 +5386,7 @@
           <w:szCs w:val="22"/>
         </w:rPr>
       </w:pPr>
-      <w:hyperlink w:anchor="_Toc170205563" w:history="1">
+      <w:hyperlink w:anchor="_Toc172275546" w:history="1">
         <w:r>
           <w:rPr>
             <w:rStyle w:val="Hyperlink"/>
@@ -5419,7 +5431,7 @@
             <w:noProof/>
             <w:webHidden/>
           </w:rPr>
-          <w:instrText xml:space="preserve"> PAGEREF _Toc170205563 \h </w:instrText>
+          <w:instrText xml:space="preserve"> PAGEREF _Toc172275546 \h </w:instrText>
         </w:r>
         <w:r>
           <w:rPr>
@@ -5460,7 +5472,7 @@
           <w:szCs w:val="22"/>
         </w:rPr>
       </w:pPr>
-      <w:hyperlink w:anchor="_Toc170205564" w:history="1">
+      <w:hyperlink w:anchor="_Toc172275547" w:history="1">
         <w:r>
           <w:rPr>
             <w:rStyle w:val="Hyperlink"/>
@@ -5505,7 +5517,7 @@
             <w:noProof/>
             <w:webHidden/>
           </w:rPr>
-          <w:instrText xml:space="preserve"> PAGEREF _Toc170205564 \h </w:instrText>
+          <w:instrText xml:space="preserve"> PAGEREF _Toc172275547 \h </w:instrText>
         </w:r>
         <w:r>
           <w:rPr>
@@ -5551,7 +5563,7 @@
           <w:lang w:eastAsia="en-US"/>
         </w:rPr>
       </w:pPr>
-      <w:hyperlink w:anchor="_Toc170205565" w:history="1">
+      <w:hyperlink w:anchor="_Toc172275548" w:history="1">
         <w:r>
           <w:rPr>
             <w:rStyle w:val="Hyperlink"/>
@@ -5595,7 +5607,7 @@
             <w:noProof/>
             <w:webHidden/>
           </w:rPr>
-          <w:instrText xml:space="preserve"> PAGEREF _Toc170205565 \h </w:instrText>
+          <w:instrText xml:space="preserve"> PAGEREF _Toc172275548 \h </w:instrText>
         </w:r>
         <w:r>
           <w:rPr>
@@ -5636,7 +5648,7 @@
           <w:szCs w:val="22"/>
         </w:rPr>
       </w:pPr>
-      <w:hyperlink w:anchor="_Toc170205566" w:history="1">
+      <w:hyperlink w:anchor="_Toc172275549" w:history="1">
         <w:r>
           <w:rPr>
             <w:rStyle w:val="Hyperlink"/>
@@ -5681,7 +5693,7 @@
             <w:noProof/>
             <w:webHidden/>
           </w:rPr>
-          <w:instrText xml:space="preserve"> PAGEREF _Toc170205566 \h </w:instrText>
+          <w:instrText xml:space="preserve"> PAGEREF _Toc172275549 \h </w:instrText>
         </w:r>
         <w:r>
           <w:rPr>
@@ -5722,7 +5734,7 @@
           <w:szCs w:val="22"/>
         </w:rPr>
       </w:pPr>
-      <w:hyperlink w:anchor="_Toc170205567" w:history="1">
+      <w:hyperlink w:anchor="_Toc172275550" w:history="1">
         <w:r>
           <w:rPr>
             <w:rStyle w:val="Hyperlink"/>
@@ -5767,7 +5779,7 @@
             <w:noProof/>
             <w:webHidden/>
           </w:rPr>
-          <w:instrText xml:space="preserve"> PAGEREF _Toc170205567 \h </w:instrText>
+          <w:instrText xml:space="preserve"> PAGEREF _Toc172275550 \h </w:instrText>
         </w:r>
         <w:r>
           <w:rPr>
@@ -5808,7 +5820,7 @@
           <w:szCs w:val="22"/>
         </w:rPr>
       </w:pPr>
-      <w:hyperlink w:anchor="_Toc170205568" w:history="1">
+      <w:hyperlink w:anchor="_Toc172275551" w:history="1">
         <w:r>
           <w:rPr>
             <w:rStyle w:val="Hyperlink"/>
@@ -5853,7 +5865,7 @@
             <w:noProof/>
             <w:webHidden/>
           </w:rPr>
-          <w:instrText xml:space="preserve"> PAGEREF _Toc170205568 \h </w:instrText>
+          <w:instrText xml:space="preserve"> PAGEREF _Toc172275551 \h </w:instrText>
         </w:r>
         <w:r>
           <w:rPr>
@@ -5894,7 +5906,7 @@
           <w:szCs w:val="22"/>
         </w:rPr>
       </w:pPr>
-      <w:hyperlink w:anchor="_Toc170205569" w:history="1">
+      <w:hyperlink w:anchor="_Toc172275552" w:history="1">
         <w:r>
           <w:rPr>
             <w:rStyle w:val="Hyperlink"/>
@@ -5939,7 +5951,7 @@
             <w:noProof/>
             <w:webHidden/>
           </w:rPr>
-          <w:instrText xml:space="preserve"> PAGEREF _Toc170205569 \h </w:instrText>
+          <w:instrText xml:space="preserve"> PAGEREF _Toc172275552 \h </w:instrText>
         </w:r>
         <w:r>
           <w:rPr>
@@ -5980,7 +5992,7 @@
           <w:szCs w:val="22"/>
         </w:rPr>
       </w:pPr>
-      <w:hyperlink w:anchor="_Toc170205570" w:history="1">
+      <w:hyperlink w:anchor="_Toc172275553" w:history="1">
         <w:r>
           <w:rPr>
             <w:rStyle w:val="Hyperlink"/>
@@ -6025,7 +6037,7 @@
             <w:noProof/>
             <w:webHidden/>
           </w:rPr>
-          <w:instrText xml:space="preserve"> PAGEREF _Toc170205570 \h </w:instrText>
+          <w:instrText xml:space="preserve"> PAGEREF _Toc172275553 \h </w:instrText>
         </w:r>
         <w:r>
           <w:rPr>
@@ -6066,7 +6078,7 @@
           <w:szCs w:val="22"/>
         </w:rPr>
       </w:pPr>
-      <w:hyperlink w:anchor="_Toc170205571" w:history="1">
+      <w:hyperlink w:anchor="_Toc172275554" w:history="1">
         <w:r>
           <w:rPr>
             <w:rStyle w:val="Hyperlink"/>
@@ -6111,7 +6123,7 @@
             <w:noProof/>
             <w:webHidden/>
           </w:rPr>
-          <w:instrText xml:space="preserve"> PAGEREF _Toc170205571 \h </w:instrText>
+          <w:instrText xml:space="preserve"> PAGEREF _Toc172275554 \h </w:instrText>
         </w:r>
         <w:r>
           <w:rPr>
@@ -6152,14 +6164,23 @@
           <w:szCs w:val="22"/>
         </w:rPr>
       </w:pPr>
-      <w:hyperlink w:anchor="_Toc170205572" w:history="1">
+      <w:hyperlink w:anchor="_Toc172275555" w:history="1">
         <w:r>
           <w:rPr>
             <w:rStyle w:val="Hyperlink"/>
             <w:rFonts w:eastAsia="SimSun"/>
             <w:noProof/>
           </w:rPr>
-          <w:t>6</w:t>
+          <w:t>6.7</w:t>
+        </w:r>
+        <w:r>
+          <w:rPr>
+            <w:rFonts w:asciiTheme="minorHAnsi" w:eastAsiaTheme="minorEastAsia" w:hAnsiTheme="minorHAnsi" w:cstheme="minorBidi"/>
+            <w:noProof/>
+            <w:sz w:val="22"/>
+            <w:szCs w:val="22"/>
+          </w:rPr>
+          <w:tab/>
         </w:r>
         <w:r>
           <w:rPr>
@@ -6167,42 +6188,17 @@
             <w:rFonts w:eastAsia="SimSun"/>
             <w:noProof/>
           </w:rPr>
-          <w:t>.</w:t>
-        </w:r>
-        <w:r>
-          <w:rPr>
-            <w:rStyle w:val="Hyperlink"/>
-            <w:rFonts w:eastAsia="SimSun"/>
-            <w:noProof/>
-          </w:rPr>
-          <w:t>7</w:t>
-        </w:r>
-        <w:r>
-          <w:rPr>
-            <w:rFonts w:asciiTheme="minorHAnsi" w:eastAsiaTheme="minorEastAsia" w:hAnsiTheme="minorHAnsi" w:cstheme="minorBidi"/>
-            <w:noProof/>
-            <w:sz w:val="22"/>
-            <w:szCs w:val="22"/>
+          <w:t>Discourse Charting</w:t>
+        </w:r>
+        <w:r>
+          <w:rPr>
+            <w:noProof/>
+            <w:webHidden/>
           </w:rPr>
           <w:tab/>
         </w:r>
         <w:r>
           <w:rPr>
-            <w:rStyle w:val="Hyperlink"/>
-            <w:rFonts w:eastAsia="SimSun"/>
-            <w:noProof/>
-          </w:rPr>
-          <w:t>Discourse Charting</w:t>
-        </w:r>
-        <w:r>
-          <w:rPr>
-            <w:noProof/>
-            <w:webHidden/>
-          </w:rPr>
-          <w:tab/>
-        </w:r>
-        <w:r>
-          <w:rPr>
             <w:noProof/>
             <w:webHidden/>
           </w:rPr>
@@ -6213,7 +6209,7 @@
             <w:noProof/>
             <w:webHidden/>
           </w:rPr>
-          <w:instrText xml:space="preserve"> PAGEREF _Toc170205572 \h </w:instrText>
+          <w:instrText xml:space="preserve"> PAGEREF _Toc172275555 \h </w:instrText>
         </w:r>
         <w:r>
           <w:rPr>
@@ -6254,7 +6250,7 @@
           <w:szCs w:val="22"/>
         </w:rPr>
       </w:pPr>
-      <w:hyperlink w:anchor="_Toc170205573" w:history="1">
+      <w:hyperlink w:anchor="_Toc172275556" w:history="1">
         <w:r>
           <w:rPr>
             <w:rStyle w:val="Hyperlink"/>
@@ -6299,7 +6295,7 @@
             <w:noProof/>
             <w:webHidden/>
           </w:rPr>
-          <w:instrText xml:space="preserve"> PAGEREF _Toc170205573 \h </w:instrText>
+          <w:instrText xml:space="preserve"> PAGEREF _Toc172275556 \h </w:instrText>
         </w:r>
         <w:r>
           <w:rPr>
@@ -6345,7 +6341,7 @@
           <w:lang w:eastAsia="en-US"/>
         </w:rPr>
       </w:pPr>
-      <w:hyperlink w:anchor="_Toc170205574" w:history="1">
+      <w:hyperlink w:anchor="_Toc172275557" w:history="1">
         <w:r>
           <w:rPr>
             <w:rStyle w:val="Hyperlink"/>
@@ -6389,7 +6385,7 @@
             <w:noProof/>
             <w:webHidden/>
           </w:rPr>
-          <w:instrText xml:space="preserve"> PAGEREF _Toc170205574 \h </w:instrText>
+          <w:instrText xml:space="preserve"> PAGEREF _Toc172275557 \h </w:instrText>
         </w:r>
         <w:r>
           <w:rPr>
@@ -6427,7 +6423,7 @@
       <w:r>
         <w:fldChar w:fldCharType="end"/>
       </w:r>
-      <w:bookmarkStart w:id="1" w:name="_Toc170205504"/>
+      <w:bookmarkStart w:id="1" w:name="_Toc172275487"/>
       <w:r>
         <w:t>I</w:t>
       </w:r>
@@ -6668,7 +6664,7 @@
       <w:pPr>
         <w:pStyle w:val="Heading1"/>
       </w:pPr>
-      <w:bookmarkStart w:id="2" w:name="_Toc170205505"/>
+      <w:bookmarkStart w:id="2" w:name="_Toc172275488"/>
       <w:r>
         <w:t xml:space="preserve">Basic </w:t>
       </w:r>
@@ -6954,7 +6950,7 @@
       <w:pPr>
         <w:pStyle w:val="Heading2"/>
       </w:pPr>
-      <w:bookmarkStart w:id="3" w:name="_Toc170205506"/>
+      <w:bookmarkStart w:id="3" w:name="_Toc172275489"/>
       <w:r>
         <w:t>Classes and properties</w:t>
       </w:r>
@@ -7200,7 +7196,7 @@
       <w:pPr>
         <w:pStyle w:val="Heading2"/>
       </w:pPr>
-      <w:bookmarkStart w:id="4" w:name="_Toc170205507"/>
+      <w:bookmarkStart w:id="4" w:name="_Toc172275490"/>
       <w:r>
         <w:t>Writing systems</w:t>
       </w:r>
@@ -7845,7 +7841,7 @@
       <w:pPr>
         <w:pStyle w:val="Heading2"/>
       </w:pPr>
-      <w:bookmarkStart w:id="5" w:name="_Toc170205508"/>
+      <w:bookmarkStart w:id="5" w:name="_Toc172275491"/>
       <w:r>
         <w:t>Basic properties</w:t>
       </w:r>
@@ -7864,7 +7860,7 @@
         <w:pStyle w:val="Heading3"/>
       </w:pPr>
       <w:bookmarkStart w:id="6" w:name="_Toc318113549"/>
-      <w:bookmarkStart w:id="7" w:name="_Toc170205509"/>
+      <w:bookmarkStart w:id="7" w:name="_Toc172275492"/>
       <w:r>
         <w:lastRenderedPageBreak/>
         <w:t>Strings</w:t>
@@ -8005,7 +8001,7 @@
         <w:pStyle w:val="Heading4"/>
       </w:pPr>
       <w:bookmarkStart w:id="8" w:name="_Toc318113550"/>
-      <w:bookmarkStart w:id="9" w:name="_Toc170205510"/>
+      <w:bookmarkStart w:id="9" w:name="_Toc172275493"/>
       <w:r>
         <w:t>Unicode</w:t>
       </w:r>
@@ -8172,7 +8168,7 @@
         <w:pStyle w:val="Heading4"/>
       </w:pPr>
       <w:bookmarkStart w:id="11" w:name="_Ref162943041"/>
-      <w:bookmarkStart w:id="12" w:name="_Toc170205511"/>
+      <w:bookmarkStart w:id="12" w:name="_Toc172275494"/>
       <w:r>
         <w:t>String</w:t>
       </w:r>
@@ -8547,7 +8543,7 @@
         <w:pStyle w:val="Heading4"/>
       </w:pPr>
       <w:bookmarkStart w:id="13" w:name="_Toc318113552"/>
-      <w:bookmarkStart w:id="14" w:name="_Toc170205512"/>
+      <w:bookmarkStart w:id="14" w:name="_Toc172275495"/>
       <w:r>
         <w:t>MultiUnicode</w:t>
       </w:r>
@@ -8605,7 +8601,7 @@
         <w:pStyle w:val="Heading4"/>
       </w:pPr>
       <w:bookmarkStart w:id="15" w:name="_Toc318113553"/>
-      <w:bookmarkStart w:id="16" w:name="_Toc170205513"/>
+      <w:bookmarkStart w:id="16" w:name="_Toc172275496"/>
       <w:r>
         <w:t>MultiString</w:t>
       </w:r>
@@ -8718,7 +8714,7 @@
       <w:pPr>
         <w:pStyle w:val="Heading3"/>
       </w:pPr>
-      <w:bookmarkStart w:id="17" w:name="_Toc170205514"/>
+      <w:bookmarkStart w:id="17" w:name="_Toc172275497"/>
       <w:r>
         <w:t>Binary</w:t>
       </w:r>
@@ -8779,7 +8775,7 @@
       <w:pPr>
         <w:pStyle w:val="Heading3"/>
       </w:pPr>
-      <w:bookmarkStart w:id="18" w:name="_Toc170205515"/>
+      <w:bookmarkStart w:id="18" w:name="_Toc172275498"/>
       <w:r>
         <w:t>Boolean</w:t>
       </w:r>
@@ -8814,7 +8810,7 @@
         <w:pStyle w:val="Heading3"/>
       </w:pPr>
       <w:bookmarkStart w:id="19" w:name="_Ref163130885"/>
-      <w:bookmarkStart w:id="20" w:name="_Toc170205516"/>
+      <w:bookmarkStart w:id="20" w:name="_Toc172275499"/>
       <w:r>
         <w:t>GenDate</w:t>
       </w:r>
@@ -8915,7 +8911,7 @@
       <w:pPr>
         <w:pStyle w:val="Heading3"/>
       </w:pPr>
-      <w:bookmarkStart w:id="21" w:name="_Toc170205517"/>
+      <w:bookmarkStart w:id="21" w:name="_Toc172275500"/>
       <w:r>
         <w:lastRenderedPageBreak/>
         <w:t>Guid</w:t>
@@ -8967,7 +8963,7 @@
       <w:pPr>
         <w:pStyle w:val="Heading3"/>
       </w:pPr>
-      <w:bookmarkStart w:id="22" w:name="_Toc170205518"/>
+      <w:bookmarkStart w:id="22" w:name="_Toc172275501"/>
       <w:r>
         <w:t>Integer</w:t>
       </w:r>
@@ -9019,7 +9015,7 @@
       <w:pPr>
         <w:pStyle w:val="Heading3"/>
       </w:pPr>
-      <w:bookmarkStart w:id="23" w:name="_Toc170205519"/>
+      <w:bookmarkStart w:id="23" w:name="_Toc172275502"/>
       <w:r>
         <w:t>TextPropBinary</w:t>
       </w:r>
@@ -9652,7 +9648,7 @@
       <w:pPr>
         <w:pStyle w:val="Heading3"/>
       </w:pPr>
-      <w:bookmarkStart w:id="24" w:name="_Toc170205520"/>
+      <w:bookmarkStart w:id="24" w:name="_Toc172275503"/>
       <w:r>
         <w:lastRenderedPageBreak/>
         <w:t>Time</w:t>
@@ -9722,7 +9718,7 @@
       <w:pPr>
         <w:pStyle w:val="Heading2"/>
       </w:pPr>
-      <w:bookmarkStart w:id="25" w:name="_Toc170205521"/>
+      <w:bookmarkStart w:id="25" w:name="_Toc172275504"/>
       <w:r>
         <w:t>Linking</w:t>
       </w:r>
@@ -9874,7 +9870,7 @@
       <w:pPr>
         <w:pStyle w:val="Heading2"/>
       </w:pPr>
-      <w:bookmarkStart w:id="26" w:name="_Toc170205522"/>
+      <w:bookmarkStart w:id="26" w:name="_Toc172275505"/>
       <w:r>
         <w:t>Owning relationships</w:t>
       </w:r>
@@ -10400,7 +10396,7 @@
       <w:pPr>
         <w:pStyle w:val="Heading2"/>
       </w:pPr>
-      <w:bookmarkStart w:id="27" w:name="_Toc170205523"/>
+      <w:bookmarkStart w:id="27" w:name="_Toc172275506"/>
       <w:r>
         <w:t>Reference relationships</w:t>
       </w:r>
@@ -10758,7 +10754,7 @@
       <w:pPr>
         <w:pStyle w:val="Heading2"/>
       </w:pPr>
-      <w:bookmarkStart w:id="28" w:name="_Toc170205524"/>
+      <w:bookmarkStart w:id="28" w:name="_Toc172275507"/>
       <w:r>
         <w:t>Styles</w:t>
       </w:r>
@@ -10964,7 +10960,7 @@
       <w:pPr>
         <w:pStyle w:val="Heading2"/>
       </w:pPr>
-      <w:bookmarkStart w:id="29" w:name="_Toc170205525"/>
+      <w:bookmarkStart w:id="29" w:name="_Toc172275508"/>
       <w:r>
         <w:t>Possibility lists</w:t>
       </w:r>
@@ -13207,7 +13203,7 @@
       <w:pPr>
         <w:pStyle w:val="Heading2"/>
       </w:pPr>
-      <w:bookmarkStart w:id="30" w:name="_Toc170205526"/>
+      <w:bookmarkStart w:id="30" w:name="_Toc172275509"/>
       <w:r>
         <w:lastRenderedPageBreak/>
         <w:t>Custom fields</w:t>
@@ -13961,7 +13957,7 @@
       <w:pPr>
         <w:pStyle w:val="Heading2"/>
       </w:pPr>
-      <w:bookmarkStart w:id="31" w:name="_Toc170205527"/>
+      <w:bookmarkStart w:id="31" w:name="_Toc172275510"/>
       <w:r>
         <w:t>Send/Receive Data</w:t>
       </w:r>
@@ -15160,7 +15156,7 @@
       <w:pPr>
         <w:pStyle w:val="Heading1"/>
       </w:pPr>
-      <w:bookmarkStart w:id="32" w:name="_Toc170205528"/>
+      <w:bookmarkStart w:id="32" w:name="_Toc172275511"/>
       <w:r>
         <w:t>Conceptual model resources</w:t>
       </w:r>
@@ -15298,7 +15294,7 @@
       <w:pPr>
         <w:pStyle w:val="Heading2"/>
       </w:pPr>
-      <w:bookmarkStart w:id="33" w:name="_Toc170205529"/>
+      <w:bookmarkStart w:id="33" w:name="_Toc172275512"/>
       <w:r>
         <w:t>M</w:t>
       </w:r>
@@ -15652,7 +15648,7 @@
       <w:pPr>
         <w:pStyle w:val="Heading2"/>
       </w:pPr>
-      <w:bookmarkStart w:id="34" w:name="_Toc170205530"/>
+      <w:bookmarkStart w:id="34" w:name="_Toc172275513"/>
       <w:r>
         <w:t>M</w:t>
       </w:r>
@@ -16113,7 +16109,7 @@
         <w:pStyle w:val="Heading2"/>
       </w:pPr>
       <w:bookmarkStart w:id="35" w:name="_Ref162957186"/>
-      <w:bookmarkStart w:id="36" w:name="_Toc170205531"/>
+      <w:bookmarkStart w:id="36" w:name="_Toc172275514"/>
       <w:r>
         <w:t>LCMBrowser</w:t>
       </w:r>
@@ -16164,7 +16160,7 @@
       <w:pPr>
         <w:pStyle w:val="Heading3"/>
       </w:pPr>
-      <w:bookmarkStart w:id="37" w:name="_Toc170205532"/>
+      <w:bookmarkStart w:id="37" w:name="_Toc172275515"/>
       <w:r>
         <w:t xml:space="preserve">LCM </w:t>
       </w:r>
@@ -16305,7 +16301,7 @@
       <w:pPr>
         <w:pStyle w:val="Heading3"/>
       </w:pPr>
-      <w:bookmarkStart w:id="38" w:name="_Toc170205533"/>
+      <w:bookmarkStart w:id="38" w:name="_Toc172275516"/>
       <w:r>
         <w:t>LCM data</w:t>
       </w:r>
@@ -16624,7 +16620,7 @@
       <w:pPr>
         <w:pStyle w:val="Heading2"/>
       </w:pPr>
-      <w:bookmarkStart w:id="39" w:name="_Toc170205534"/>
+      <w:bookmarkStart w:id="39" w:name="_Toc172275517"/>
       <w:r>
         <w:t>Fieldworks source code</w:t>
       </w:r>
@@ -16877,7 +16873,7 @@
       <w:pPr>
         <w:pStyle w:val="Heading2"/>
       </w:pPr>
-      <w:bookmarkStart w:id="40" w:name="_Toc170205535"/>
+      <w:bookmarkStart w:id="40" w:name="_Toc172275518"/>
       <w:r>
         <w:t>dnSpy debugger</w:t>
       </w:r>
@@ -17011,7 +17007,7 @@
       <w:pPr>
         <w:pStyle w:val="Heading1"/>
       </w:pPr>
-      <w:bookmarkStart w:id="41" w:name="_Toc170205536"/>
+      <w:bookmarkStart w:id="41" w:name="_Toc172275519"/>
       <w:r>
         <w:t>Lexicon model</w:t>
       </w:r>
@@ -17453,7 +17449,7 @@
       <w:pPr>
         <w:pStyle w:val="Heading2"/>
       </w:pPr>
-      <w:bookmarkStart w:id="42" w:name="_Toc170205537"/>
+      <w:bookmarkStart w:id="42" w:name="_Toc172275520"/>
       <w:r>
         <w:t>Entries</w:t>
       </w:r>
@@ -18493,7 +18489,7 @@
       <w:pPr>
         <w:pStyle w:val="Heading3"/>
       </w:pPr>
-      <w:bookmarkStart w:id="43" w:name="_Toc170205538"/>
+      <w:bookmarkStart w:id="43" w:name="_Toc172275521"/>
       <w:r>
         <w:t>Headwords</w:t>
       </w:r>
@@ -18850,7 +18846,7 @@
         <w:pStyle w:val="Heading3"/>
       </w:pPr>
       <w:bookmarkStart w:id="44" w:name="_Ref164431796"/>
-      <w:bookmarkStart w:id="45" w:name="_Toc170205539"/>
+      <w:bookmarkStart w:id="45" w:name="_Toc172275522"/>
       <w:r>
         <w:t>Pronunciations</w:t>
       </w:r>
@@ -19080,7 +19076,7 @@
       <w:pPr>
         <w:pStyle w:val="Heading3"/>
       </w:pPr>
-      <w:bookmarkStart w:id="46" w:name="_Toc170205540"/>
+      <w:bookmarkStart w:id="46" w:name="_Toc172275523"/>
       <w:r>
         <w:t>Etymology</w:t>
       </w:r>
@@ -19423,7 +19419,9 @@
       <w:pPr>
         <w:pStyle w:val="Heading3"/>
       </w:pPr>
-      <w:bookmarkStart w:id="47" w:name="_Toc170205541"/>
+      <w:bookmarkStart w:id="47" w:name="_Toc172275524"/>
+      <w:bookmarkStart w:id="48" w:name="_GoBack"/>
+      <w:bookmarkEnd w:id="48"/>
       <w:r>
         <w:t>Allomorphs</w:t>
       </w:r>
@@ -19576,7 +19574,19 @@
         <w:pStyle w:val="BodyText"/>
       </w:pPr>
       <w:r>
-        <w:t>These phonemes are represented by PhPhoneme objects owned in the PhonemeSets property of PhPhonData, which is owned in the PhonologicalData property of LangProj</w:t>
+        <w:t>These phonemes are represented by PhPhoneme objects</w:t>
+      </w:r>
+      <w:r>
+        <w:t>,</w:t>
+      </w:r>
+      <w:r>
+        <w:t xml:space="preserve"> owned in the </w:t>
+      </w:r>
+      <w:r>
+        <w:t xml:space="preserve">Phonemes property of PhPhonemeSet, owned in the </w:t>
+      </w:r>
+      <w:r>
+        <w:t>PhonemeSets property of PhPhonData, which is owned in the PhonologicalData property of LangProj</w:t>
       </w:r>
       <w:r>
         <w:t>ect</w:t>
@@ -19590,20 +19600,11 @@
         <w:pStyle w:val="Example"/>
       </w:pPr>
       <w:r>
-        <w:rPr>
-          <w:noProof/>
-        </w:rPr>
         <w:drawing>
-          <wp:inline distT="0" distB="0" distL="0" distR="0" wp14:anchorId="00A0FA00" wp14:editId="2F5834D0">
-            <wp:extent cx="4330598" cy="896604"/>
+          <wp:inline distT="0" distB="0" distL="0" distR="0" wp14:anchorId="39CCA1AA" wp14:editId="2D11E6D7">
+            <wp:extent cx="5089585" cy="877627"/>
             <wp:effectExtent l="0" t="0" r="0" b="0"/>
-            <wp:docPr id="62" name="Picture 6">
-              <a:extLst xmlns:a="http://schemas.openxmlformats.org/drawingml/2006/main">
-                <a:ext uri="{FF2B5EF4-FFF2-40B4-BE49-F238E27FC236}">
-                  <a16:creationId xmlns:a16="http://schemas.microsoft.com/office/drawing/2014/main" id="{84E7A88A-60D9-40ED-BBCA-4E8041B71D25}"/>
-                </a:ext>
-              </a:extLst>
-            </wp:docPr>
+            <wp:docPr id="103" name="Picture 103"/>
             <wp:cNvGraphicFramePr>
               <a:graphicFrameLocks xmlns:a="http://schemas.openxmlformats.org/drawingml/2006/main" noChangeAspect="1"/>
             </wp:cNvGraphicFramePr>
@@ -19611,16 +19612,8 @@
               <a:graphicData uri="http://schemas.openxmlformats.org/drawingml/2006/picture">
                 <pic:pic xmlns:pic="http://schemas.openxmlformats.org/drawingml/2006/picture">
                   <pic:nvPicPr>
-                    <pic:cNvPr id="7" name="Picture 6">
-                      <a:extLst>
-                        <a:ext uri="{FF2B5EF4-FFF2-40B4-BE49-F238E27FC236}">
-                          <a16:creationId xmlns:a16="http://schemas.microsoft.com/office/drawing/2014/main" id="{84E7A88A-60D9-40ED-BBCA-4E8041B71D25}"/>
-                        </a:ext>
-                      </a:extLst>
-                    </pic:cNvPr>
-                    <pic:cNvPicPr>
-                      <a:picLocks noChangeAspect="1"/>
-                    </pic:cNvPicPr>
+                    <pic:cNvPr id="1" name=""/>
+                    <pic:cNvPicPr/>
                   </pic:nvPicPr>
                   <pic:blipFill>
                     <a:blip r:embed="rId49"/>
@@ -19631,7 +19624,7 @@
                   <pic:spPr>
                     <a:xfrm>
                       <a:off x="0" y="0"/>
-                      <a:ext cx="4382736" cy="907399"/>
+                      <a:ext cx="5188463" cy="894677"/>
                     </a:xfrm>
                     <a:prstGeom prst="rect">
                       <a:avLst/>
@@ -19825,11 +19818,8 @@
         <w:pStyle w:val="BodyText"/>
       </w:pPr>
       <w:r>
-        <w:t xml:space="preserve">This is stored in a PhEnvironment class with a name (Preceding voiced), and a StringRepresentation that gives a linguistic representation of the environment (/ _ [VD]) This </w:t>
-      </w:r>
-      <w:r>
         <w:lastRenderedPageBreak/>
-        <w:t>string is parsed by FLEx to make sure it is valid. In this case, the VD matches the abbreviation in the PhNCSegments object.</w:t>
+        <w:t>This is stored in a PhEnvironment class with a name (Preceding voiced), and a StringRepresentation that gives a linguistic representation of the environment (/ _ [VD]) This string is parsed by FLEx to make sure it is valid. In this case, the VD matches the abbreviation in the PhNCSegments object.</w:t>
       </w:r>
     </w:p>
     <w:p>
@@ -19986,14 +19976,12 @@
         <w:pStyle w:val="Example"/>
       </w:pPr>
       <w:r>
-        <w:rPr>
-          <w:noProof/>
-        </w:rPr>
+        <w:lastRenderedPageBreak/>
         <w:drawing>
-          <wp:inline distT="0" distB="0" distL="0" distR="0" wp14:anchorId="74A39FD9" wp14:editId="076A74DC">
-            <wp:extent cx="5353050" cy="4071978"/>
-            <wp:effectExtent l="0" t="0" r="0" b="5080"/>
-            <wp:docPr id="23" name="Picture 23"/>
+          <wp:inline distT="0" distB="0" distL="0" distR="0" wp14:anchorId="24D100EA" wp14:editId="48708AF4">
+            <wp:extent cx="5697418" cy="5218981"/>
+            <wp:effectExtent l="0" t="0" r="0" b="1270"/>
+            <wp:docPr id="108" name="Picture 108"/>
             <wp:cNvGraphicFramePr>
               <a:graphicFrameLocks xmlns:a="http://schemas.openxmlformats.org/drawingml/2006/main" noChangeAspect="1"/>
             </wp:cNvGraphicFramePr>
@@ -20013,7 +20001,7 @@
                   <pic:spPr>
                     <a:xfrm>
                       <a:off x="0" y="0"/>
-                      <a:ext cx="5376282" cy="4089651"/>
+                      <a:ext cx="5710588" cy="5231045"/>
                     </a:xfrm>
                     <a:prstGeom prst="rect">
                       <a:avLst/>
@@ -20030,15 +20018,14 @@
       <w:pPr>
         <w:pStyle w:val="Heading3"/>
       </w:pPr>
-      <w:bookmarkStart w:id="48" w:name="_Toc170205542"/>
-      <w:r>
-        <w:lastRenderedPageBreak/>
+      <w:bookmarkStart w:id="49" w:name="_Toc172275525"/>
+      <w:r>
         <w:t>Grammatical information</w:t>
       </w:r>
       <w:r>
         <w:t>.</w:t>
       </w:r>
-      <w:bookmarkEnd w:id="48"/>
+      <w:bookmarkEnd w:id="49"/>
     </w:p>
     <w:p>
       <w:pPr>
@@ -20082,11 +20069,11 @@
       <w:pPr>
         <w:pStyle w:val="Heading3"/>
       </w:pPr>
-      <w:bookmarkStart w:id="49" w:name="_Toc170205543"/>
+      <w:bookmarkStart w:id="50" w:name="_Toc172275526"/>
       <w:r>
         <w:t>Messages</w:t>
       </w:r>
-      <w:bookmarkEnd w:id="49"/>
+      <w:bookmarkEnd w:id="50"/>
     </w:p>
     <w:p>
       <w:pPr>
@@ -20119,6 +20106,7 @@
         <w:rPr>
           <w:noProof/>
         </w:rPr>
+        <w:lastRenderedPageBreak/>
         <w:drawing>
           <wp:inline distT="0" distB="0" distL="0" distR="0" wp14:anchorId="1DB6C182" wp14:editId="072A566C">
             <wp:extent cx="2562583" cy="247685"/>
@@ -20302,7 +20290,6 @@
         <w:rPr>
           <w:noProof/>
         </w:rPr>
-        <w:lastRenderedPageBreak/>
         <w:drawing>
           <wp:inline distT="0" distB="0" distL="0" distR="0" wp14:anchorId="1DF7AE4A" wp14:editId="23BF0393">
             <wp:extent cx="2847975" cy="3064082"/>
@@ -20384,6 +20371,9 @@
       </w:r>
       <w:r>
         <w:br/>
+      </w:r>
+      <w:r>
+        <w:lastRenderedPageBreak/>
         <w:t xml:space="preserve">   guid="73abfec0-5214-4ace-964d-a6eb990af1b1"&gt;</w:t>
       </w:r>
       <w:r>
@@ -20482,7 +20472,6 @@
         <w:pStyle w:val="BodyText"/>
       </w:pPr>
       <w:r>
-        <w:lastRenderedPageBreak/>
         <w:t>There is no capability built into FLEx for removing information from this ChorusNotes file. Data can be removed manually in the file, or the file can be deleted at any time to remove all Message</w:t>
       </w:r>
       <w:r>
@@ -20496,14 +20485,14 @@
       <w:pPr>
         <w:pStyle w:val="Heading2"/>
       </w:pPr>
-      <w:bookmarkStart w:id="50" w:name="_Toc170205544"/>
+      <w:bookmarkStart w:id="51" w:name="_Toc172275527"/>
       <w:r>
         <w:t>Complex forms</w:t>
       </w:r>
       <w:r>
         <w:t xml:space="preserve"> and variants</w:t>
       </w:r>
-      <w:bookmarkEnd w:id="50"/>
+      <w:bookmarkEnd w:id="51"/>
     </w:p>
     <w:p>
       <w:pPr>
@@ -20520,11 +20509,11 @@
       <w:pPr>
         <w:pStyle w:val="Heading3"/>
       </w:pPr>
-      <w:bookmarkStart w:id="51" w:name="_Toc170205545"/>
+      <w:bookmarkStart w:id="52" w:name="_Toc172275528"/>
       <w:r>
         <w:t>Complex forms</w:t>
       </w:r>
-      <w:bookmarkEnd w:id="51"/>
+      <w:bookmarkEnd w:id="52"/>
     </w:p>
     <w:p>
       <w:pPr>
@@ -20878,11 +20867,11 @@
       <w:pPr>
         <w:pStyle w:val="Heading3"/>
       </w:pPr>
-      <w:bookmarkStart w:id="52" w:name="_Toc170205546"/>
+      <w:bookmarkStart w:id="53" w:name="_Toc172275529"/>
       <w:r>
         <w:t>Variants</w:t>
       </w:r>
-      <w:bookmarkEnd w:id="52"/>
+      <w:bookmarkEnd w:id="53"/>
     </w:p>
     <w:p>
       <w:pPr>
@@ -21169,11 +21158,11 @@
       <w:pPr>
         <w:pStyle w:val="Heading2"/>
       </w:pPr>
-      <w:bookmarkStart w:id="53" w:name="_Toc170205547"/>
+      <w:bookmarkStart w:id="54" w:name="_Toc172275530"/>
       <w:r>
         <w:t>Senses</w:t>
       </w:r>
-      <w:bookmarkEnd w:id="53"/>
+      <w:bookmarkEnd w:id="54"/>
     </w:p>
     <w:p>
       <w:pPr>
@@ -21850,13 +21839,13 @@
       <w:pPr>
         <w:pStyle w:val="Heading3"/>
       </w:pPr>
-      <w:bookmarkStart w:id="54" w:name="_Ref164277547"/>
-      <w:bookmarkStart w:id="55" w:name="_Toc170205548"/>
+      <w:bookmarkStart w:id="55" w:name="_Ref164277547"/>
+      <w:bookmarkStart w:id="56" w:name="_Toc172275531"/>
       <w:r>
         <w:t>Example sentences</w:t>
       </w:r>
-      <w:bookmarkEnd w:id="54"/>
       <w:bookmarkEnd w:id="55"/>
+      <w:bookmarkEnd w:id="56"/>
     </w:p>
     <w:p>
       <w:pPr>
@@ -22021,11 +22010,11 @@
       <w:pPr>
         <w:pStyle w:val="Heading3"/>
       </w:pPr>
-      <w:bookmarkStart w:id="56" w:name="_Toc170205549"/>
+      <w:bookmarkStart w:id="57" w:name="_Toc172275532"/>
       <w:r>
         <w:t>Extended notes</w:t>
       </w:r>
-      <w:bookmarkEnd w:id="56"/>
+      <w:bookmarkEnd w:id="57"/>
     </w:p>
     <w:p>
       <w:pPr>
@@ -22258,7 +22247,7 @@
       <w:pPr>
         <w:pStyle w:val="Heading3"/>
       </w:pPr>
-      <w:bookmarkStart w:id="57" w:name="_Toc170205550"/>
+      <w:bookmarkStart w:id="58" w:name="_Toc172275533"/>
       <w:r>
         <w:lastRenderedPageBreak/>
         <w:t xml:space="preserve">Lexical </w:t>
@@ -22269,7 +22258,7 @@
       <w:r>
         <w:t>elations</w:t>
       </w:r>
-      <w:bookmarkEnd w:id="57"/>
+      <w:bookmarkEnd w:id="58"/>
     </w:p>
     <w:p>
       <w:pPr>
@@ -23352,11 +23341,11 @@
       <w:pPr>
         <w:pStyle w:val="Heading4"/>
       </w:pPr>
-      <w:bookmarkStart w:id="58" w:name="_Toc170205551"/>
+      <w:bookmarkStart w:id="59" w:name="_Toc172275534"/>
       <w:r>
         <w:t>Collection</w:t>
       </w:r>
-      <w:bookmarkEnd w:id="58"/>
+      <w:bookmarkEnd w:id="59"/>
     </w:p>
     <w:p>
       <w:pPr>
@@ -23632,11 +23621,11 @@
       <w:pPr>
         <w:pStyle w:val="Heading4"/>
       </w:pPr>
-      <w:bookmarkStart w:id="59" w:name="_Toc170205552"/>
+      <w:bookmarkStart w:id="60" w:name="_Toc172275535"/>
       <w:r>
         <w:t>Pair with different names</w:t>
       </w:r>
-      <w:bookmarkEnd w:id="59"/>
+      <w:bookmarkEnd w:id="60"/>
     </w:p>
     <w:p>
       <w:pPr>
@@ -23904,11 +23893,11 @@
       <w:pPr>
         <w:pStyle w:val="Heading4"/>
       </w:pPr>
-      <w:bookmarkStart w:id="60" w:name="_Toc170205553"/>
+      <w:bookmarkStart w:id="61" w:name="_Toc172275536"/>
       <w:r>
         <w:t>Sequence</w:t>
       </w:r>
-      <w:bookmarkEnd w:id="60"/>
+      <w:bookmarkEnd w:id="61"/>
     </w:p>
     <w:p>
       <w:pPr>
@@ -24114,11 +24103,11 @@
       <w:pPr>
         <w:pStyle w:val="Heading4"/>
       </w:pPr>
-      <w:bookmarkStart w:id="61" w:name="_Toc170205554"/>
+      <w:bookmarkStart w:id="62" w:name="_Toc172275537"/>
       <w:r>
         <w:t>Tree</w:t>
       </w:r>
-      <w:bookmarkEnd w:id="61"/>
+      <w:bookmarkEnd w:id="62"/>
     </w:p>
     <w:p>
       <w:pPr>
@@ -24401,11 +24390,11 @@
       <w:pPr>
         <w:pStyle w:val="Heading4"/>
       </w:pPr>
-      <w:bookmarkStart w:id="62" w:name="_Toc170205555"/>
+      <w:bookmarkStart w:id="63" w:name="_Toc172275538"/>
       <w:r>
         <w:t>Unidirectional</w:t>
       </w:r>
-      <w:bookmarkEnd w:id="62"/>
+      <w:bookmarkEnd w:id="63"/>
     </w:p>
     <w:p>
       <w:pPr>
@@ -24501,12 +24490,12 @@
       <w:pPr>
         <w:pStyle w:val="Heading3"/>
       </w:pPr>
-      <w:bookmarkStart w:id="63" w:name="_Toc170205556"/>
+      <w:bookmarkStart w:id="64" w:name="_Toc172275539"/>
       <w:r>
         <w:lastRenderedPageBreak/>
         <w:t>Reversals</w:t>
       </w:r>
-      <w:bookmarkEnd w:id="63"/>
+      <w:bookmarkEnd w:id="64"/>
     </w:p>
     <w:p>
       <w:pPr>
@@ -24880,12 +24869,12 @@
       <w:pPr>
         <w:pStyle w:val="Heading3"/>
       </w:pPr>
-      <w:bookmarkStart w:id="64" w:name="_Toc170205557"/>
+      <w:bookmarkStart w:id="65" w:name="_Toc172275540"/>
       <w:r>
         <w:lastRenderedPageBreak/>
         <w:t>Pictures</w:t>
       </w:r>
-      <w:bookmarkEnd w:id="64"/>
+      <w:bookmarkEnd w:id="65"/>
     </w:p>
     <w:p>
       <w:pPr>
@@ -25062,11 +25051,11 @@
       <w:pPr>
         <w:pStyle w:val="Heading3"/>
       </w:pPr>
-      <w:bookmarkStart w:id="65" w:name="_Toc170205558"/>
+      <w:bookmarkStart w:id="66" w:name="_Toc172275541"/>
       <w:r>
         <w:t>Sound files</w:t>
       </w:r>
-      <w:bookmarkEnd w:id="65"/>
+      <w:bookmarkEnd w:id="66"/>
     </w:p>
     <w:p>
       <w:pPr>
@@ -25110,11 +25099,11 @@
       <w:pPr>
         <w:pStyle w:val="Heading2"/>
       </w:pPr>
-      <w:bookmarkStart w:id="66" w:name="_Toc170205559"/>
+      <w:bookmarkStart w:id="67" w:name="_Toc172275542"/>
       <w:r>
         <w:t>Virtual ordering</w:t>
       </w:r>
-      <w:bookmarkEnd w:id="66"/>
+      <w:bookmarkEnd w:id="67"/>
     </w:p>
     <w:p>
       <w:pPr>
@@ -25300,11 +25289,11 @@
       <w:pPr>
         <w:pStyle w:val="Heading2"/>
       </w:pPr>
-      <w:bookmarkStart w:id="67" w:name="_Toc170205560"/>
+      <w:bookmarkStart w:id="68" w:name="_Toc172275543"/>
       <w:r>
         <w:t>Publications</w:t>
       </w:r>
-      <w:bookmarkEnd w:id="67"/>
+      <w:bookmarkEnd w:id="68"/>
     </w:p>
     <w:p>
       <w:pPr>
@@ -25650,13 +25639,13 @@
       <w:pPr>
         <w:pStyle w:val="Heading1"/>
       </w:pPr>
-      <w:bookmarkStart w:id="68" w:name="_Ref165555065"/>
-      <w:bookmarkStart w:id="69" w:name="_Toc170205561"/>
+      <w:bookmarkStart w:id="69" w:name="_Ref165555065"/>
+      <w:bookmarkStart w:id="70" w:name="_Toc172275544"/>
       <w:r>
         <w:t>Grammar model</w:t>
       </w:r>
-      <w:bookmarkEnd w:id="68"/>
       <w:bookmarkEnd w:id="69"/>
+      <w:bookmarkEnd w:id="70"/>
     </w:p>
     <w:p>
       <w:pPr>
@@ -25811,14 +25800,14 @@
       <w:pPr>
         <w:pStyle w:val="Heading2"/>
       </w:pPr>
-      <w:bookmarkStart w:id="70" w:name="_Toc170205562"/>
+      <w:bookmarkStart w:id="71" w:name="_Toc172275545"/>
       <w:r>
         <w:t xml:space="preserve">Inflection </w:t>
       </w:r>
       <w:r>
         <w:t>features</w:t>
       </w:r>
-      <w:bookmarkEnd w:id="70"/>
+      <w:bookmarkEnd w:id="71"/>
     </w:p>
     <w:p>
       <w:pPr>
@@ -25992,11 +25981,11 @@
       <w:pPr>
         <w:pStyle w:val="Heading2"/>
       </w:pPr>
-      <w:bookmarkStart w:id="71" w:name="_Toc170205563"/>
+      <w:bookmarkStart w:id="72" w:name="_Toc172275546"/>
       <w:r>
         <w:t>Categories</w:t>
       </w:r>
-      <w:bookmarkEnd w:id="71"/>
+      <w:bookmarkEnd w:id="72"/>
     </w:p>
     <w:p>
       <w:pPr>
@@ -26135,11 +26124,11 @@
       <w:pPr>
         <w:pStyle w:val="Heading2"/>
       </w:pPr>
-      <w:bookmarkStart w:id="72" w:name="_Toc170205564"/>
+      <w:bookmarkStart w:id="73" w:name="_Toc172275547"/>
       <w:r>
         <w:t>Lexicon</w:t>
       </w:r>
-      <w:bookmarkEnd w:id="72"/>
+      <w:bookmarkEnd w:id="73"/>
     </w:p>
     <w:p>
       <w:pPr>
@@ -26686,14 +26675,14 @@
       <w:pPr>
         <w:pStyle w:val="Heading1"/>
       </w:pPr>
-      <w:bookmarkStart w:id="73" w:name="_Toc170205565"/>
+      <w:bookmarkStart w:id="74" w:name="_Toc172275548"/>
       <w:r>
         <w:t xml:space="preserve">Interlinear </w:t>
       </w:r>
       <w:r>
         <w:t>model</w:t>
       </w:r>
-      <w:bookmarkEnd w:id="73"/>
+      <w:bookmarkEnd w:id="74"/>
     </w:p>
     <w:p>
       <w:pPr>
@@ -26788,11 +26777,11 @@
       <w:pPr>
         <w:pStyle w:val="Heading2"/>
       </w:pPr>
-      <w:bookmarkStart w:id="74" w:name="_Toc170205566"/>
+      <w:bookmarkStart w:id="75" w:name="_Toc172275549"/>
       <w:r>
         <w:t>Structured Text</w:t>
       </w:r>
-      <w:bookmarkEnd w:id="74"/>
+      <w:bookmarkEnd w:id="75"/>
     </w:p>
     <w:p>
       <w:pPr>
@@ -27101,11 +27090,11 @@
       <w:pPr>
         <w:pStyle w:val="Heading2"/>
       </w:pPr>
-      <w:bookmarkStart w:id="75" w:name="_Toc170205567"/>
+      <w:bookmarkStart w:id="76" w:name="_Toc172275550"/>
       <w:r>
         <w:t>Segment</w:t>
       </w:r>
-      <w:bookmarkEnd w:id="75"/>
+      <w:bookmarkEnd w:id="76"/>
     </w:p>
     <w:p>
       <w:pPr>
@@ -27560,14 +27549,14 @@
       <w:pPr>
         <w:pStyle w:val="Heading2"/>
       </w:pPr>
-      <w:bookmarkStart w:id="76" w:name="_Toc170205568"/>
+      <w:bookmarkStart w:id="77" w:name="_Toc172275551"/>
       <w:r>
         <w:t>Wordform</w:t>
       </w:r>
       <w:r>
         <w:t>s</w:t>
       </w:r>
-      <w:bookmarkEnd w:id="76"/>
+      <w:bookmarkEnd w:id="77"/>
     </w:p>
     <w:p>
       <w:pPr>
@@ -27770,11 +27759,11 @@
       <w:pPr>
         <w:pStyle w:val="Heading2"/>
       </w:pPr>
-      <w:bookmarkStart w:id="77" w:name="_Toc170205569"/>
+      <w:bookmarkStart w:id="78" w:name="_Toc172275552"/>
       <w:r>
         <w:t>Analyses</w:t>
       </w:r>
-      <w:bookmarkEnd w:id="77"/>
+      <w:bookmarkEnd w:id="78"/>
     </w:p>
     <w:p>
       <w:pPr>
@@ -28505,11 +28494,11 @@
       <w:pPr>
         <w:pStyle w:val="Heading2"/>
       </w:pPr>
-      <w:bookmarkStart w:id="78" w:name="_Toc170205570"/>
+      <w:bookmarkStart w:id="79" w:name="_Toc172275553"/>
       <w:r>
         <w:t>Approving analyses</w:t>
       </w:r>
-      <w:bookmarkEnd w:id="78"/>
+      <w:bookmarkEnd w:id="79"/>
     </w:p>
     <w:p>
       <w:pPr>
@@ -28933,14 +28922,14 @@
       <w:pPr>
         <w:pStyle w:val="Heading2"/>
       </w:pPr>
-      <w:bookmarkStart w:id="79" w:name="_Toc170205571"/>
+      <w:bookmarkStart w:id="80" w:name="_Toc172275554"/>
       <w:r>
         <w:t xml:space="preserve">Text </w:t>
       </w:r>
       <w:r>
         <w:t>Tagging</w:t>
       </w:r>
-      <w:bookmarkEnd w:id="79"/>
+      <w:bookmarkEnd w:id="80"/>
     </w:p>
     <w:p>
       <w:pPr>
@@ -29219,14 +29208,14 @@
       <w:pPr>
         <w:pStyle w:val="Heading2"/>
       </w:pPr>
-      <w:bookmarkStart w:id="80" w:name="_Toc170205572"/>
+      <w:bookmarkStart w:id="81" w:name="_Toc172275555"/>
       <w:r>
         <w:t>Discourse</w:t>
       </w:r>
       <w:r>
         <w:t xml:space="preserve"> Charting</w:t>
       </w:r>
-      <w:bookmarkEnd w:id="80"/>
+      <w:bookmarkEnd w:id="81"/>
     </w:p>
     <w:p>
       <w:pPr>
@@ -30120,11 +30109,11 @@
       <w:pPr>
         <w:pStyle w:val="Heading2"/>
       </w:pPr>
-      <w:bookmarkStart w:id="81" w:name="_Toc170205573"/>
+      <w:bookmarkStart w:id="82" w:name="_Toc172275556"/>
       <w:r>
         <w:t>Scripture</w:t>
       </w:r>
-      <w:bookmarkEnd w:id="81"/>
+      <w:bookmarkEnd w:id="82"/>
     </w:p>
     <w:p>
       <w:pPr>
@@ -30933,14 +30922,14 @@
       <w:pPr>
         <w:pStyle w:val="Heading1"/>
       </w:pPr>
-      <w:bookmarkStart w:id="82" w:name="_Toc170205574"/>
+      <w:bookmarkStart w:id="83" w:name="_Toc172275557"/>
       <w:r>
         <w:t>N</w:t>
       </w:r>
       <w:r>
         <w:t>otebook model</w:t>
       </w:r>
-      <w:bookmarkEnd w:id="82"/>
+      <w:bookmarkEnd w:id="83"/>
     </w:p>
     <w:p>
       <w:pPr>
@@ -31076,6 +31065,9 @@
         <w:pStyle w:val="Example"/>
       </w:pPr>
       <w:r>
+        <w:rPr>
+          <w:noProof/>
+        </w:rPr>
         <w:lastRenderedPageBreak/>
         <w:drawing>
           <wp:inline distT="0" distB="0" distL="0" distR="0" wp14:anchorId="64DF1BF8" wp14:editId="3754ADF7">
@@ -31154,12 +31146,7 @@
         <w:t>. RnRoledPartic has reference collection Participants property referencing CmPerson objects from the People list. It also has a Role atomic reference to CmPossibility from the Roles list.</w:t>
       </w:r>
       <w:r>
-        <w:t xml:space="preserve"> RnGenericRec has an AnthroCodes reference collection to CmAnthroItem. The display typically shows the abbreviation and name of the anthro items. </w:t>
-      </w:r>
-      <w:bookmarkStart w:id="83" w:name="_GoBack"/>
-      <w:bookmarkEnd w:id="83"/>
-      <w:r>
-        <w:t>RnGenericRec has a Locations reference collection to CmLocation objects in the Locations list. It also has an atomic reference Type property referencing one of the CmPossibility items in the Notebook Record Types list.</w:t>
+        <w:t xml:space="preserve"> RnGenericRec has an AnthroCodes reference collection to CmAnthroItem. The display typically shows the abbreviation and name of the anthro items. RnGenericRec has a Locations reference collection to CmLocation objects in the Locations list. It also has an atomic reference Type property referencing one of the CmPossibility items in the Notebook Record Types list.</w:t>
       </w:r>
     </w:p>
     <w:sectPr>
@@ -31228,7 +31215,7 @@
       <w:rPr>
         <w:noProof/>
       </w:rPr>
-      <w:t>7/9/2024</w:t>
+      <w:t>7/18/2024</w:t>
     </w:r>
     <w:r>
       <w:fldChar w:fldCharType="end"/>
@@ -31275,7 +31262,7 @@
         <w:rStyle w:val="PageNumber"/>
         <w:noProof/>
       </w:rPr>
-      <w:t>7/9/2024</w:t>
+      <w:t>7/18/2024</w:t>
     </w:r>
     <w:r>
       <w:rPr>
@@ -35264,7 +35251,7 @@
 </file>
 
 <file path=customXml/itemProps1.xml><?xml version="1.0" encoding="utf-8"?>
-<ds:datastoreItem xmlns:ds="http://schemas.openxmlformats.org/officeDocument/2006/customXml" ds:itemID="{CFFA4ACD-7A99-4EDC-A073-3B2262421DBB}">
+<ds:datastoreItem xmlns:ds="http://schemas.openxmlformats.org/officeDocument/2006/customXml" ds:itemID="{B77D95C8-E5C3-4F91-B304-741611A0A7D3}">
   <ds:schemaRefs>
     <ds:schemaRef ds:uri="http://schemas.openxmlformats.org/officeDocument/2006/bibliography"/>
   </ds:schemaRefs>

</xml_diff>

<commit_message>
Update 9.1 Conceptual Model doc
Corrected a couple diagrams and text that were not accurate.

Change-Id: I55a7461a581045c48ec31eafc08bfeb7d2b09b13
</commit_message>
<xml_diff>
--- a/HelpResourcesSources/TechnicalNotes/FLEx 9.1 Conceptual Model.docx
+++ b/HelpResourcesSources/TechnicalNotes/FLEx 9.1 Conceptual Model.docx
@@ -25,6 +25,8 @@
       <w:r>
         <w:t>Ken Zook</w:t>
       </w:r>
+      <w:bookmarkStart w:id="1" w:name="_GoBack"/>
+      <w:bookmarkEnd w:id="1"/>
     </w:p>
     <w:p>
       <w:pPr>
@@ -37,25 +39,7 @@
         <w:rPr>
           <w:szCs w:val="36"/>
         </w:rPr>
-        <w:t xml:space="preserve">July </w:t>
-      </w:r>
-      <w:r>
-        <w:rPr>
-          <w:szCs w:val="36"/>
-        </w:rPr>
-        <w:t>1</w:t>
-      </w:r>
-      <w:r>
-        <w:rPr>
-          <w:szCs w:val="36"/>
-        </w:rPr>
-        <w:t>9</w:t>
-      </w:r>
-      <w:r>
-        <w:rPr>
-          <w:szCs w:val="36"/>
-        </w:rPr>
-        <w:t>, 2024</w:t>
+        <w:t>June 11, 2025</w:t>
       </w:r>
     </w:p>
     <w:p>
@@ -6423,14 +6407,14 @@
       <w:r>
         <w:fldChar w:fldCharType="end"/>
       </w:r>
-      <w:bookmarkStart w:id="1" w:name="_Toc172275487"/>
+      <w:bookmarkStart w:id="2" w:name="_Toc172275487"/>
       <w:r>
         <w:t>I</w:t>
       </w:r>
       <w:r>
         <w:t>ntroduction</w:t>
       </w:r>
-      <w:bookmarkEnd w:id="1"/>
+      <w:bookmarkEnd w:id="2"/>
     </w:p>
     <w:p>
       <w:pPr>
@@ -6664,7 +6648,7 @@
       <w:pPr>
         <w:pStyle w:val="Heading1"/>
       </w:pPr>
-      <w:bookmarkStart w:id="2" w:name="_Toc172275488"/>
+      <w:bookmarkStart w:id="3" w:name="_Toc172275488"/>
       <w:r>
         <w:t xml:space="preserve">Basic </w:t>
       </w:r>
@@ -6674,7 +6658,7 @@
       <w:r>
         <w:t>oncepts</w:t>
       </w:r>
-      <w:bookmarkEnd w:id="2"/>
+      <w:bookmarkEnd w:id="3"/>
     </w:p>
     <w:p>
       <w:pPr>
@@ -6950,11 +6934,11 @@
       <w:pPr>
         <w:pStyle w:val="Heading2"/>
       </w:pPr>
-      <w:bookmarkStart w:id="3" w:name="_Toc172275489"/>
+      <w:bookmarkStart w:id="4" w:name="_Toc172275489"/>
       <w:r>
         <w:t>Classes and properties</w:t>
       </w:r>
-      <w:bookmarkEnd w:id="3"/>
+      <w:bookmarkEnd w:id="4"/>
     </w:p>
     <w:p>
       <w:pPr>
@@ -7196,11 +7180,11 @@
       <w:pPr>
         <w:pStyle w:val="Heading2"/>
       </w:pPr>
-      <w:bookmarkStart w:id="4" w:name="_Toc172275490"/>
+      <w:bookmarkStart w:id="5" w:name="_Toc172275490"/>
       <w:r>
         <w:t>Writing systems</w:t>
       </w:r>
-      <w:bookmarkEnd w:id="4"/>
+      <w:bookmarkEnd w:id="5"/>
     </w:p>
     <w:p>
       <w:pPr>
@@ -7841,11 +7825,11 @@
       <w:pPr>
         <w:pStyle w:val="Heading2"/>
       </w:pPr>
-      <w:bookmarkStart w:id="5" w:name="_Toc172275491"/>
+      <w:bookmarkStart w:id="6" w:name="_Toc172275491"/>
       <w:r>
         <w:t>Basic properties</w:t>
       </w:r>
-      <w:bookmarkEnd w:id="5"/>
+      <w:bookmarkEnd w:id="6"/>
     </w:p>
     <w:p>
       <w:pPr>
@@ -7859,14 +7843,14 @@
       <w:pPr>
         <w:pStyle w:val="Heading3"/>
       </w:pPr>
-      <w:bookmarkStart w:id="6" w:name="_Toc318113549"/>
-      <w:bookmarkStart w:id="7" w:name="_Toc172275492"/>
+      <w:bookmarkStart w:id="7" w:name="_Toc318113549"/>
+      <w:bookmarkStart w:id="8" w:name="_Toc172275492"/>
       <w:r>
         <w:lastRenderedPageBreak/>
         <w:t>Strings</w:t>
       </w:r>
-      <w:bookmarkEnd w:id="6"/>
       <w:bookmarkEnd w:id="7"/>
+      <w:bookmarkEnd w:id="8"/>
     </w:p>
     <w:p>
       <w:pPr>
@@ -8000,13 +7984,13 @@
       <w:pPr>
         <w:pStyle w:val="Heading4"/>
       </w:pPr>
-      <w:bookmarkStart w:id="8" w:name="_Toc318113550"/>
-      <w:bookmarkStart w:id="9" w:name="_Toc172275493"/>
+      <w:bookmarkStart w:id="9" w:name="_Toc318113550"/>
+      <w:bookmarkStart w:id="10" w:name="_Toc172275493"/>
       <w:r>
         <w:t>Unicode</w:t>
       </w:r>
-      <w:bookmarkEnd w:id="8"/>
       <w:bookmarkEnd w:id="9"/>
+      <w:bookmarkEnd w:id="10"/>
     </w:p>
     <w:p>
       <w:pPr>
@@ -8107,7 +8091,7 @@
       <w:r>
         <w:t>he FieldWorks display mechanism shows boxes for characters that are not in the current font rather than substituting other fonts as needed. FieldWorks generally chooses a writing system representing the system language on your computer, if the writing system exists, otherwise it defaults to English when displaying these strings.</w:t>
       </w:r>
-      <w:bookmarkStart w:id="10" w:name="_Toc318113551"/>
+      <w:bookmarkStart w:id="11" w:name="_Toc318113551"/>
     </w:p>
     <w:p>
       <w:pPr>
@@ -8167,14 +8151,14 @@
       <w:pPr>
         <w:pStyle w:val="Heading4"/>
       </w:pPr>
-      <w:bookmarkStart w:id="11" w:name="_Ref162943041"/>
-      <w:bookmarkStart w:id="12" w:name="_Toc172275494"/>
+      <w:bookmarkStart w:id="12" w:name="_Ref162943041"/>
+      <w:bookmarkStart w:id="13" w:name="_Toc172275494"/>
       <w:r>
         <w:t>String</w:t>
       </w:r>
-      <w:bookmarkEnd w:id="10"/>
       <w:bookmarkEnd w:id="11"/>
       <w:bookmarkEnd w:id="12"/>
+      <w:bookmarkEnd w:id="13"/>
     </w:p>
     <w:p>
       <w:pPr>
@@ -8542,13 +8526,13 @@
       <w:pPr>
         <w:pStyle w:val="Heading4"/>
       </w:pPr>
-      <w:bookmarkStart w:id="13" w:name="_Toc318113552"/>
-      <w:bookmarkStart w:id="14" w:name="_Toc172275495"/>
+      <w:bookmarkStart w:id="14" w:name="_Toc318113552"/>
+      <w:bookmarkStart w:id="15" w:name="_Toc172275495"/>
       <w:r>
         <w:t>MultiUnicode</w:t>
       </w:r>
-      <w:bookmarkEnd w:id="13"/>
       <w:bookmarkEnd w:id="14"/>
+      <w:bookmarkEnd w:id="15"/>
     </w:p>
     <w:p>
       <w:pPr>
@@ -8600,13 +8584,13 @@
       <w:pPr>
         <w:pStyle w:val="Heading4"/>
       </w:pPr>
-      <w:bookmarkStart w:id="15" w:name="_Toc318113553"/>
-      <w:bookmarkStart w:id="16" w:name="_Toc172275496"/>
+      <w:bookmarkStart w:id="16" w:name="_Toc318113553"/>
+      <w:bookmarkStart w:id="17" w:name="_Toc172275496"/>
       <w:r>
         <w:t>MultiString</w:t>
       </w:r>
-      <w:bookmarkEnd w:id="15"/>
       <w:bookmarkEnd w:id="16"/>
+      <w:bookmarkEnd w:id="17"/>
     </w:p>
     <w:p>
       <w:pPr>
@@ -8714,11 +8698,11 @@
       <w:pPr>
         <w:pStyle w:val="Heading3"/>
       </w:pPr>
-      <w:bookmarkStart w:id="17" w:name="_Toc172275497"/>
+      <w:bookmarkStart w:id="18" w:name="_Toc172275497"/>
       <w:r>
         <w:t>Binary</w:t>
       </w:r>
-      <w:bookmarkEnd w:id="17"/>
+      <w:bookmarkEnd w:id="18"/>
     </w:p>
     <w:p>
       <w:pPr>
@@ -8775,11 +8759,11 @@
       <w:pPr>
         <w:pStyle w:val="Heading3"/>
       </w:pPr>
-      <w:bookmarkStart w:id="18" w:name="_Toc172275498"/>
+      <w:bookmarkStart w:id="19" w:name="_Toc172275498"/>
       <w:r>
         <w:t>Boolean</w:t>
       </w:r>
-      <w:bookmarkEnd w:id="18"/>
+      <w:bookmarkEnd w:id="19"/>
     </w:p>
     <w:p>
       <w:pPr>
@@ -8809,13 +8793,13 @@
       <w:pPr>
         <w:pStyle w:val="Heading3"/>
       </w:pPr>
-      <w:bookmarkStart w:id="19" w:name="_Ref163130885"/>
-      <w:bookmarkStart w:id="20" w:name="_Toc172275499"/>
+      <w:bookmarkStart w:id="20" w:name="_Ref163130885"/>
+      <w:bookmarkStart w:id="21" w:name="_Toc172275499"/>
       <w:r>
         <w:t>GenDate</w:t>
       </w:r>
-      <w:bookmarkEnd w:id="19"/>
       <w:bookmarkEnd w:id="20"/>
+      <w:bookmarkEnd w:id="21"/>
     </w:p>
     <w:p>
       <w:pPr>
@@ -8911,12 +8895,12 @@
       <w:pPr>
         <w:pStyle w:val="Heading3"/>
       </w:pPr>
-      <w:bookmarkStart w:id="21" w:name="_Toc172275500"/>
+      <w:bookmarkStart w:id="22" w:name="_Toc172275500"/>
       <w:r>
         <w:lastRenderedPageBreak/>
         <w:t>Guid</w:t>
       </w:r>
-      <w:bookmarkEnd w:id="21"/>
+      <w:bookmarkEnd w:id="22"/>
     </w:p>
     <w:p>
       <w:pPr>
@@ -8963,11 +8947,11 @@
       <w:pPr>
         <w:pStyle w:val="Heading3"/>
       </w:pPr>
-      <w:bookmarkStart w:id="22" w:name="_Toc172275501"/>
+      <w:bookmarkStart w:id="23" w:name="_Toc172275501"/>
       <w:r>
         <w:t>Integer</w:t>
       </w:r>
-      <w:bookmarkEnd w:id="22"/>
+      <w:bookmarkEnd w:id="23"/>
     </w:p>
     <w:p>
       <w:pPr>
@@ -9015,11 +8999,11 @@
       <w:pPr>
         <w:pStyle w:val="Heading3"/>
       </w:pPr>
-      <w:bookmarkStart w:id="23" w:name="_Toc172275502"/>
+      <w:bookmarkStart w:id="24" w:name="_Toc172275502"/>
       <w:r>
         <w:t>TextPropBinary</w:t>
       </w:r>
-      <w:bookmarkEnd w:id="23"/>
+      <w:bookmarkEnd w:id="24"/>
     </w:p>
     <w:p>
       <w:pPr>
@@ -9648,12 +9632,12 @@
       <w:pPr>
         <w:pStyle w:val="Heading3"/>
       </w:pPr>
-      <w:bookmarkStart w:id="24" w:name="_Toc172275503"/>
+      <w:bookmarkStart w:id="25" w:name="_Toc172275503"/>
       <w:r>
         <w:lastRenderedPageBreak/>
         <w:t>Time</w:t>
       </w:r>
-      <w:bookmarkEnd w:id="24"/>
+      <w:bookmarkEnd w:id="25"/>
     </w:p>
     <w:p>
       <w:pPr>
@@ -9718,14 +9702,14 @@
       <w:pPr>
         <w:pStyle w:val="Heading2"/>
       </w:pPr>
-      <w:bookmarkStart w:id="25" w:name="_Toc172275504"/>
+      <w:bookmarkStart w:id="26" w:name="_Toc172275504"/>
       <w:r>
         <w:t>Linking</w:t>
       </w:r>
       <w:r>
         <w:t xml:space="preserve"> properties</w:t>
       </w:r>
-      <w:bookmarkEnd w:id="25"/>
+      <w:bookmarkEnd w:id="26"/>
     </w:p>
     <w:p>
       <w:pPr>
@@ -9870,11 +9854,11 @@
       <w:pPr>
         <w:pStyle w:val="Heading2"/>
       </w:pPr>
-      <w:bookmarkStart w:id="26" w:name="_Toc172275505"/>
+      <w:bookmarkStart w:id="27" w:name="_Toc172275505"/>
       <w:r>
         <w:t>Owning relationships</w:t>
       </w:r>
-      <w:bookmarkEnd w:id="26"/>
+      <w:bookmarkEnd w:id="27"/>
     </w:p>
     <w:p>
       <w:pPr>
@@ -10396,11 +10380,11 @@
       <w:pPr>
         <w:pStyle w:val="Heading2"/>
       </w:pPr>
-      <w:bookmarkStart w:id="27" w:name="_Toc172275506"/>
+      <w:bookmarkStart w:id="28" w:name="_Toc172275506"/>
       <w:r>
         <w:t>Reference relationships</w:t>
       </w:r>
-      <w:bookmarkEnd w:id="27"/>
+      <w:bookmarkEnd w:id="28"/>
     </w:p>
     <w:p>
       <w:pPr>
@@ -10754,11 +10738,11 @@
       <w:pPr>
         <w:pStyle w:val="Heading2"/>
       </w:pPr>
-      <w:bookmarkStart w:id="28" w:name="_Toc172275507"/>
+      <w:bookmarkStart w:id="29" w:name="_Toc172275507"/>
       <w:r>
         <w:t>Styles</w:t>
       </w:r>
-      <w:bookmarkEnd w:id="28"/>
+      <w:bookmarkEnd w:id="29"/>
     </w:p>
     <w:p>
       <w:pPr>
@@ -10960,11 +10944,11 @@
       <w:pPr>
         <w:pStyle w:val="Heading2"/>
       </w:pPr>
-      <w:bookmarkStart w:id="29" w:name="_Toc172275508"/>
+      <w:bookmarkStart w:id="30" w:name="_Toc172275508"/>
       <w:r>
         <w:t>Possibility lists</w:t>
       </w:r>
-      <w:bookmarkEnd w:id="29"/>
+      <w:bookmarkEnd w:id="30"/>
     </w:p>
     <w:p>
       <w:pPr>
@@ -13203,12 +13187,12 @@
       <w:pPr>
         <w:pStyle w:val="Heading2"/>
       </w:pPr>
-      <w:bookmarkStart w:id="30" w:name="_Toc172275509"/>
+      <w:bookmarkStart w:id="31" w:name="_Toc172275509"/>
       <w:r>
         <w:lastRenderedPageBreak/>
         <w:t>Custom fields</w:t>
       </w:r>
-      <w:bookmarkEnd w:id="30"/>
+      <w:bookmarkEnd w:id="31"/>
     </w:p>
     <w:p>
       <w:pPr>
@@ -13957,11 +13941,11 @@
       <w:pPr>
         <w:pStyle w:val="Heading2"/>
       </w:pPr>
-      <w:bookmarkStart w:id="31" w:name="_Toc172275510"/>
+      <w:bookmarkStart w:id="32" w:name="_Toc172275510"/>
       <w:r>
         <w:t>Send/Receive Data</w:t>
       </w:r>
-      <w:bookmarkEnd w:id="31"/>
+      <w:bookmarkEnd w:id="32"/>
     </w:p>
     <w:p>
       <w:pPr>
@@ -15156,11 +15140,11 @@
       <w:pPr>
         <w:pStyle w:val="Heading1"/>
       </w:pPr>
-      <w:bookmarkStart w:id="32" w:name="_Toc172275511"/>
+      <w:bookmarkStart w:id="33" w:name="_Toc172275511"/>
       <w:r>
         <w:t>Conceptual model resources</w:t>
       </w:r>
-      <w:bookmarkEnd w:id="32"/>
+      <w:bookmarkEnd w:id="33"/>
     </w:p>
     <w:p>
       <w:pPr>
@@ -15294,14 +15278,14 @@
       <w:pPr>
         <w:pStyle w:val="Heading2"/>
       </w:pPr>
-      <w:bookmarkStart w:id="33" w:name="_Toc172275512"/>
+      <w:bookmarkStart w:id="34" w:name="_Toc172275512"/>
       <w:r>
         <w:t>M</w:t>
       </w:r>
       <w:r>
         <w:t>odel diagram chm</w:t>
       </w:r>
-      <w:bookmarkEnd w:id="33"/>
+      <w:bookmarkEnd w:id="34"/>
     </w:p>
     <w:p>
       <w:pPr>
@@ -15648,14 +15632,14 @@
       <w:pPr>
         <w:pStyle w:val="Heading2"/>
       </w:pPr>
-      <w:bookmarkStart w:id="34" w:name="_Toc172275513"/>
+      <w:bookmarkStart w:id="35" w:name="_Toc172275513"/>
       <w:r>
         <w:t>M</w:t>
       </w:r>
       <w:r>
         <w:t>odel class/property spreadsheet</w:t>
       </w:r>
-      <w:bookmarkEnd w:id="34"/>
+      <w:bookmarkEnd w:id="35"/>
     </w:p>
     <w:p>
       <w:pPr>
@@ -16108,13 +16092,13 @@
       <w:pPr>
         <w:pStyle w:val="Heading2"/>
       </w:pPr>
-      <w:bookmarkStart w:id="35" w:name="_Ref162957186"/>
-      <w:bookmarkStart w:id="36" w:name="_Toc172275514"/>
+      <w:bookmarkStart w:id="36" w:name="_Ref162957186"/>
+      <w:bookmarkStart w:id="37" w:name="_Toc172275514"/>
       <w:r>
         <w:t>LCMBrowser</w:t>
       </w:r>
-      <w:bookmarkEnd w:id="35"/>
       <w:bookmarkEnd w:id="36"/>
+      <w:bookmarkEnd w:id="37"/>
     </w:p>
     <w:p>
       <w:pPr>
@@ -16160,7 +16144,7 @@
       <w:pPr>
         <w:pStyle w:val="Heading3"/>
       </w:pPr>
-      <w:bookmarkStart w:id="37" w:name="_Toc172275515"/>
+      <w:bookmarkStart w:id="38" w:name="_Toc172275515"/>
       <w:r>
         <w:t xml:space="preserve">LCM </w:t>
       </w:r>
@@ -16170,7 +16154,7 @@
       <w:r>
         <w:t>odel</w:t>
       </w:r>
-      <w:bookmarkEnd w:id="37"/>
+      <w:bookmarkEnd w:id="38"/>
     </w:p>
     <w:p>
       <w:pPr>
@@ -16301,11 +16285,11 @@
       <w:pPr>
         <w:pStyle w:val="Heading3"/>
       </w:pPr>
-      <w:bookmarkStart w:id="38" w:name="_Toc172275516"/>
+      <w:bookmarkStart w:id="39" w:name="_Toc172275516"/>
       <w:r>
         <w:t>LCM data</w:t>
       </w:r>
-      <w:bookmarkEnd w:id="38"/>
+      <w:bookmarkEnd w:id="39"/>
     </w:p>
     <w:p>
       <w:pPr>
@@ -16620,11 +16604,11 @@
       <w:pPr>
         <w:pStyle w:val="Heading2"/>
       </w:pPr>
-      <w:bookmarkStart w:id="39" w:name="_Toc172275517"/>
+      <w:bookmarkStart w:id="40" w:name="_Toc172275517"/>
       <w:r>
         <w:t>Fieldworks source code</w:t>
       </w:r>
-      <w:bookmarkEnd w:id="39"/>
+      <w:bookmarkEnd w:id="40"/>
     </w:p>
     <w:p>
       <w:pPr>
@@ -16873,11 +16857,11 @@
       <w:pPr>
         <w:pStyle w:val="Heading2"/>
       </w:pPr>
-      <w:bookmarkStart w:id="40" w:name="_Toc172275518"/>
+      <w:bookmarkStart w:id="41" w:name="_Toc172275518"/>
       <w:r>
         <w:t>dnSpy debugger</w:t>
       </w:r>
-      <w:bookmarkEnd w:id="40"/>
+      <w:bookmarkEnd w:id="41"/>
     </w:p>
     <w:p>
       <w:r>
@@ -17007,11 +16991,11 @@
       <w:pPr>
         <w:pStyle w:val="Heading1"/>
       </w:pPr>
-      <w:bookmarkStart w:id="41" w:name="_Toc172275519"/>
+      <w:bookmarkStart w:id="42" w:name="_Toc172275519"/>
       <w:r>
         <w:t>Lexicon model</w:t>
       </w:r>
-      <w:bookmarkEnd w:id="41"/>
+      <w:bookmarkEnd w:id="42"/>
     </w:p>
     <w:p>
       <w:pPr>
@@ -17449,11 +17433,11 @@
       <w:pPr>
         <w:pStyle w:val="Heading2"/>
       </w:pPr>
-      <w:bookmarkStart w:id="42" w:name="_Toc172275520"/>
+      <w:bookmarkStart w:id="43" w:name="_Toc172275520"/>
       <w:r>
         <w:t>Entries</w:t>
       </w:r>
-      <w:bookmarkEnd w:id="42"/>
+      <w:bookmarkEnd w:id="43"/>
     </w:p>
     <w:p>
       <w:pPr>
@@ -18489,11 +18473,11 @@
       <w:pPr>
         <w:pStyle w:val="Heading3"/>
       </w:pPr>
-      <w:bookmarkStart w:id="43" w:name="_Toc172275521"/>
+      <w:bookmarkStart w:id="44" w:name="_Toc172275521"/>
       <w:r>
         <w:t>Headwords</w:t>
       </w:r>
-      <w:bookmarkEnd w:id="43"/>
+      <w:bookmarkEnd w:id="44"/>
     </w:p>
     <w:p>
       <w:pPr>
@@ -18845,13 +18829,13 @@
       <w:pPr>
         <w:pStyle w:val="Heading3"/>
       </w:pPr>
-      <w:bookmarkStart w:id="44" w:name="_Ref164431796"/>
-      <w:bookmarkStart w:id="45" w:name="_Toc172275522"/>
+      <w:bookmarkStart w:id="45" w:name="_Ref164431796"/>
+      <w:bookmarkStart w:id="46" w:name="_Toc172275522"/>
       <w:r>
         <w:t>Pronunciations</w:t>
       </w:r>
-      <w:bookmarkEnd w:id="44"/>
       <w:bookmarkEnd w:id="45"/>
+      <w:bookmarkEnd w:id="46"/>
     </w:p>
     <w:p>
       <w:pPr>
@@ -19076,11 +19060,11 @@
       <w:pPr>
         <w:pStyle w:val="Heading3"/>
       </w:pPr>
-      <w:bookmarkStart w:id="46" w:name="_Toc172275523"/>
+      <w:bookmarkStart w:id="47" w:name="_Toc172275523"/>
       <w:r>
         <w:t>Etymology</w:t>
       </w:r>
-      <w:bookmarkEnd w:id="46"/>
+      <w:bookmarkEnd w:id="47"/>
     </w:p>
     <w:p>
       <w:pPr>
@@ -19419,13 +19403,11 @@
       <w:pPr>
         <w:pStyle w:val="Heading3"/>
       </w:pPr>
-      <w:bookmarkStart w:id="47" w:name="_Toc172275524"/>
-      <w:bookmarkStart w:id="48" w:name="_GoBack"/>
+      <w:bookmarkStart w:id="48" w:name="_Toc172275524"/>
+      <w:r>
+        <w:t>Allomorphs</w:t>
+      </w:r>
       <w:bookmarkEnd w:id="48"/>
-      <w:r>
-        <w:t>Allomorphs</w:t>
-      </w:r>
-      <w:bookmarkEnd w:id="47"/>
     </w:p>
     <w:p>
       <w:pPr>
@@ -19600,6 +19582,9 @@
         <w:pStyle w:val="Example"/>
       </w:pPr>
       <w:r>
+        <w:rPr>
+          <w:noProof/>
+        </w:rPr>
         <w:drawing>
           <wp:inline distT="0" distB="0" distL="0" distR="0" wp14:anchorId="39CCA1AA" wp14:editId="2D11E6D7">
             <wp:extent cx="5089585" cy="877627"/>
@@ -19976,6 +19961,9 @@
         <w:pStyle w:val="Example"/>
       </w:pPr>
       <w:r>
+        <w:rPr>
+          <w:noProof/>
+        </w:rPr>
         <w:lastRenderedPageBreak/>
         <w:drawing>
           <wp:inline distT="0" distB="0" distL="0" distR="0" wp14:anchorId="24D100EA" wp14:editId="48708AF4">
@@ -25885,14 +25873,11 @@
         <w:pStyle w:val="Example"/>
       </w:pPr>
       <w:r>
-        <w:rPr>
-          <w:noProof/>
-        </w:rPr>
         <w:drawing>
-          <wp:inline distT="0" distB="0" distL="0" distR="0" wp14:anchorId="173B1CF4" wp14:editId="0BFC7EFD">
-            <wp:extent cx="4725619" cy="3999962"/>
-            <wp:effectExtent l="0" t="0" r="0" b="635"/>
-            <wp:docPr id="19" name="Picture 19"/>
+          <wp:inline distT="0" distB="0" distL="0" distR="0" wp14:anchorId="20E1ED05" wp14:editId="164E8CE5">
+            <wp:extent cx="4915586" cy="4134427"/>
+            <wp:effectExtent l="0" t="0" r="0" b="0"/>
+            <wp:docPr id="106" name="Picture 106"/>
             <wp:cNvGraphicFramePr>
               <a:graphicFrameLocks xmlns:a="http://schemas.openxmlformats.org/drawingml/2006/main" noChangeAspect="1"/>
             </wp:cNvGraphicFramePr>
@@ -25912,7 +25897,7 @@
                   <pic:spPr>
                     <a:xfrm>
                       <a:off x="0" y="0"/>
-                      <a:ext cx="4743130" cy="4014784"/>
+                      <a:ext cx="4915586" cy="4134427"/>
                     </a:xfrm>
                     <a:prstGeom prst="rect">
                       <a:avLst/>
@@ -26068,14 +26053,11 @@
         <w:pStyle w:val="Example"/>
       </w:pPr>
       <w:r>
-        <w:rPr>
-          <w:noProof/>
-        </w:rPr>
         <w:drawing>
-          <wp:inline distT="0" distB="0" distL="0" distR="0" wp14:anchorId="2C619489" wp14:editId="7A73D6AB">
-            <wp:extent cx="3379622" cy="2107817"/>
-            <wp:effectExtent l="0" t="0" r="0" b="6985"/>
-            <wp:docPr id="97" name="Picture 97"/>
+          <wp:inline distT="0" distB="0" distL="0" distR="0" wp14:anchorId="28F78496" wp14:editId="0723EAC4">
+            <wp:extent cx="3119988" cy="2562225"/>
+            <wp:effectExtent l="0" t="0" r="4445" b="0"/>
+            <wp:docPr id="62" name="Picture 62"/>
             <wp:cNvGraphicFramePr>
               <a:graphicFrameLocks xmlns:a="http://schemas.openxmlformats.org/drawingml/2006/main" noChangeAspect="1"/>
             </wp:cNvGraphicFramePr>
@@ -26095,7 +26077,7 @@
                   <pic:spPr>
                     <a:xfrm>
                       <a:off x="0" y="0"/>
-                      <a:ext cx="3416969" cy="2131110"/>
+                      <a:ext cx="3138202" cy="2577183"/>
                     </a:xfrm>
                     <a:prstGeom prst="rect">
                       <a:avLst/>
@@ -26113,11 +26095,23 @@
         <w:pStyle w:val="BodyText"/>
       </w:pPr>
       <w:r>
-        <w:t xml:space="preserve">In the Verb PartOfSpeech, we have a ‘vPersNum’ MoInflAffixSlot owned in the AffixTemplates. This gives the ‘vPersNum’ column in the ‘Verb Person and Number’ affix template. The InflectableFeats property owns a MoInflAffixTemplate for ‘Verb Person and </w:t>
+        <w:t>In the Verb PartOfSpeech, we have a ‘vPersNum’ MoInflAffixSlot owned in the Affix</w:t>
+      </w:r>
+      <w:r>
+        <w:t>Slots</w:t>
+      </w:r>
+      <w:r>
+        <w:t xml:space="preserve">. This gives the ‘vPersNum’ column in the ‘Verb Person and Number’ affix template. The </w:t>
       </w:r>
       <w:r>
         <w:lastRenderedPageBreak/>
-        <w:t>Number’ and the SuffixSlots in that object is set to the ‘vPersNum’ MoInflAffixSlot object. InflectionClasses owns an ‘ER Verbs’ MoInflClass object.</w:t>
+        <w:t>InflectableFeats property</w:t>
+      </w:r>
+      <w:r>
+        <w:t xml:space="preserve"> references a FsComplexFeature for subject agreement. The Affix Templates property</w:t>
+      </w:r>
+      <w:r>
+        <w:t xml:space="preserve"> owns a MoInflAffixTemplate for ‘Verb Person and Number’ and the SuffixSlots in that object is set to the ‘vPersNum’ MoInflAffixSlot object. InflectionClasses owns an ‘ER Verbs’ MoInflClass object.</w:t>
       </w:r>
     </w:p>
     <w:p>
@@ -26268,15 +26262,12 @@
         <w:pStyle w:val="Example"/>
       </w:pPr>
       <w:r>
-        <w:rPr>
-          <w:noProof/>
-        </w:rPr>
         <w:lastRenderedPageBreak/>
         <w:drawing>
-          <wp:inline distT="0" distB="0" distL="0" distR="0" wp14:anchorId="5DEC347F" wp14:editId="1B348F36">
-            <wp:extent cx="5242153" cy="6677025"/>
+          <wp:inline distT="0" distB="0" distL="0" distR="0" wp14:anchorId="3BCE2B61" wp14:editId="3CB57CF4">
+            <wp:extent cx="5565997" cy="7029450"/>
             <wp:effectExtent l="0" t="0" r="0" b="0"/>
-            <wp:docPr id="84" name="Picture 84"/>
+            <wp:docPr id="23" name="Picture 23"/>
             <wp:cNvGraphicFramePr>
               <a:graphicFrameLocks xmlns:a="http://schemas.openxmlformats.org/drawingml/2006/main" noChangeAspect="1"/>
             </wp:cNvGraphicFramePr>
@@ -26296,7 +26287,7 @@
                   <pic:spPr>
                     <a:xfrm>
                       <a:off x="0" y="0"/>
-                      <a:ext cx="5255669" cy="6694240"/>
+                      <a:ext cx="5586955" cy="7055918"/>
                     </a:xfrm>
                     <a:prstGeom prst="rect">
                       <a:avLst/>
@@ -26391,7 +26382,14 @@
         <w:rPr>
           <w:noProof/>
         </w:rPr>
-        <w:t xml:space="preserve"> the ‘Verb’ PartOfSpeech object via the PartOfSpeech reference property. The Slots reference property references the ‘vPersNum’ MoInflAffixSlot object so that it will show up in the ‘Verb Person and Number</w:t>
+        <w:t xml:space="preserve"> the ‘Verb’ PartOfSpeech object via the PartOfSpeech reference property. The Slots reference property references the </w:t>
+      </w:r>
+      <w:r>
+        <w:rPr>
+          <w:noProof/>
+        </w:rPr>
+        <w:lastRenderedPageBreak/>
+        <w:t>‘vPersNum’ MoInflAffixSlot object so that it will show up in the ‘Verb Person and Number</w:t>
       </w:r>
       <w:r>
         <w:rPr>
@@ -26447,7 +26445,6 @@
         <w:rPr>
           <w:noProof/>
         </w:rPr>
-        <w:lastRenderedPageBreak/>
         <w:t>The 7114 FsFeatStruc objects o</w:t>
       </w:r>
       <w:r>
@@ -31215,7 +31212,7 @@
       <w:rPr>
         <w:noProof/>
       </w:rPr>
-      <w:t>7/18/2024</w:t>
+      <w:t>6/11/2025</w:t>
     </w:r>
     <w:r>
       <w:fldChar w:fldCharType="end"/>
@@ -31262,7 +31259,7 @@
         <w:rStyle w:val="PageNumber"/>
         <w:noProof/>
       </w:rPr>
-      <w:t>7/18/2024</w:t>
+      <w:t>6/11/2025</w:t>
     </w:r>
     <w:r>
       <w:rPr>
@@ -35251,7 +35248,7 @@
 </file>
 
 <file path=customXml/itemProps1.xml><?xml version="1.0" encoding="utf-8"?>
-<ds:datastoreItem xmlns:ds="http://schemas.openxmlformats.org/officeDocument/2006/customXml" ds:itemID="{B77D95C8-E5C3-4F91-B304-741611A0A7D3}">
+<ds:datastoreItem xmlns:ds="http://schemas.openxmlformats.org/officeDocument/2006/customXml" ds:itemID="{26F84EC0-50F3-4C09-8161-B0BDECB3AA61}">
   <ds:schemaRefs>
     <ds:schemaRef ds:uri="http://schemas.openxmlformats.org/officeDocument/2006/bibliography"/>
   </ds:schemaRefs>

</xml_diff>

<commit_message>
Updated technical docs with view to layout change
Change-Id: I7cc29bfca1177ed71ea7295d78150aa42c334bff
</commit_message>
<xml_diff>
--- a/HelpResourcesSources/TechnicalNotes/FLEx 9.1 Conceptual Model.docx
+++ b/HelpResourcesSources/TechnicalNotes/FLEx 9.1 Conceptual Model.docx
@@ -25,8 +25,6 @@
       <w:r>
         <w:t>Ken Zook</w:t>
       </w:r>
-      <w:bookmarkStart w:id="1" w:name="_GoBack"/>
-      <w:bookmarkEnd w:id="1"/>
     </w:p>
     <w:p>
       <w:pPr>
@@ -39,7 +37,7 @@
         <w:rPr>
           <w:szCs w:val="36"/>
         </w:rPr>
-        <w:t>June 11, 2025</w:t>
+        <w:t>February 10, 2026</w:t>
       </w:r>
     </w:p>
     <w:p>
@@ -874,6 +872,8 @@
           </w:rPr>
           <w:tab/>
         </w:r>
+        <w:bookmarkStart w:id="1" w:name="_GoBack"/>
+        <w:bookmarkEnd w:id="1"/>
         <w:r>
           <w:rPr>
             <w:rStyle w:val="Hyperlink"/>
@@ -6453,15 +6453,7 @@
         <w:t xml:space="preserve"> in FieldWorks version 9.1.25</w:t>
       </w:r>
       <w:r>
-        <w:t xml:space="preserve">, mainly stored in an </w:t>
-      </w:r>
-      <w:proofErr w:type="gramStart"/>
-      <w:r>
-        <w:t>XML .fwdata</w:t>
-      </w:r>
-      <w:proofErr w:type="gramEnd"/>
-      <w:r>
-        <w:t xml:space="preserve"> file in the project directory. It covers the basic conceptual model for processing different types of data.</w:t>
+        <w:t>, mainly stored in an XML .fwdata file in the project directory. It covers the basic conceptual model for processing different types of data.</w:t>
       </w:r>
       <w:r>
         <w:t xml:space="preserve"> A corresponding FLEx project, “FLEx Conceptual Model sample project” demonstrates all of the items discussed in this document</w:t>
@@ -6522,15 +6514,7 @@
         <w:pStyle w:val="BodyText"/>
       </w:pPr>
       <w:r>
-        <w:t xml:space="preserve">Data for a language project is stored in a folder, normally under c:\ProgramData\SIL\FieldWorks\Projects. The data is stored in a single XML file with </w:t>
-      </w:r>
-      <w:proofErr w:type="gramStart"/>
-      <w:r>
-        <w:t>a .fwdata</w:t>
-      </w:r>
-      <w:proofErr w:type="gramEnd"/>
-      <w:r>
-        <w:t xml:space="preserve"> </w:t>
+        <w:t xml:space="preserve">Data for a language project is stored in a folder, normally under c:\ProgramData\SIL\FieldWorks\Projects. The data is stored in a single XML file with a .fwdata </w:t>
       </w:r>
       <w:r>
         <w:t xml:space="preserve">file </w:t>
@@ -7079,15 +7063,7 @@
         <w:t>if editing</w:t>
       </w:r>
       <w:r>
-        <w:t xml:space="preserve"> fwdata. Each object is </w:t>
-      </w:r>
-      <w:proofErr w:type="gramStart"/>
-      <w:r>
-        <w:t>an</w:t>
-      </w:r>
-      <w:proofErr w:type="gramEnd"/>
-      <w:r>
-        <w:t xml:space="preserve"> rt element</w:t>
+        <w:t xml:space="preserve"> fwdata. Each object is an rt element</w:t>
       </w:r>
       <w:r>
         <w:t xml:space="preserve"> in scattered locations in the file</w:t>
@@ -7119,15 +7095,7 @@
         <w:t xml:space="preserve">IDs, often abbreviated as flid for field ID in code. </w:t>
       </w:r>
       <w:r>
-        <w:t xml:space="preserve">The flid includes the 4-digit class id followed by a </w:t>
-      </w:r>
-      <w:proofErr w:type="gramStart"/>
-      <w:r>
-        <w:t>3 digit</w:t>
-      </w:r>
-      <w:proofErr w:type="gramEnd"/>
-      <w:r>
-        <w:t xml:space="preserve"> field number. For example, a Definition on LexSense has a flid of 5016005</w:t>
+        <w:t>The flid includes the 4-digit class id followed by a 3 digit field number. For example, a Definition on LexSense has a flid of 5016005</w:t>
       </w:r>
     </w:p>
     <w:p>
@@ -7284,15 +7252,7 @@
         <w:t xml:space="preserve">specification </w:t>
       </w:r>
       <w:r>
-        <w:t xml:space="preserve">in files </w:t>
-      </w:r>
-      <w:proofErr w:type="gramStart"/>
-      <w:r>
-        <w:t>with .ldml</w:t>
-      </w:r>
-      <w:proofErr w:type="gramEnd"/>
-      <w:r>
-        <w:t xml:space="preserve"> as the extension. Unicode Technical Standard #35 describes this </w:t>
+        <w:t xml:space="preserve">in files with .ldml as the extension. Unicode Technical Standard #35 describes this </w:t>
       </w:r>
       <w:r>
         <w:lastRenderedPageBreak/>
@@ -7454,18 +7414,10 @@
         <w:t xml:space="preserve"> writing system file is en-Latn-US</w:t>
       </w:r>
       <w:r>
-        <w:t>-x-</w:t>
-      </w:r>
-      <w:proofErr w:type="gramStart"/>
-      <w:r>
-        <w:t>sci</w:t>
-      </w:r>
-      <w:r>
-        <w:t>.ldml</w:t>
-      </w:r>
-      <w:proofErr w:type="gramEnd"/>
-      <w:r>
-        <w:t>.</w:t>
+        <w:t>-x-sci</w:t>
+      </w:r>
+      <w:r>
+        <w:t>.ldml.</w:t>
       </w:r>
     </w:p>
     <w:p>
@@ -7506,15 +7458,7 @@
         <w:t xml:space="preserve">, </w:t>
       </w:r>
       <w:r>
-        <w:t xml:space="preserve">FLEx will leave the en-Latn data in fwdata, and </w:t>
-      </w:r>
-      <w:proofErr w:type="gramStart"/>
-      <w:r>
-        <w:t>en.ldml</w:t>
-      </w:r>
-      <w:proofErr w:type="gramEnd"/>
-      <w:r>
-        <w:t xml:space="preserve"> and en-Latn.ldml, but the latter only has </w:t>
+        <w:t xml:space="preserve">FLEx will leave the en-Latn data in fwdata, and en.ldml and en-Latn.ldml, but the latter only has </w:t>
       </w:r>
       <w:r>
         <w:t>language type="en" /&gt;</w:t>
@@ -7778,15 +7722,7 @@
         <w:br/>
       </w:r>
       <w:r>
-        <w:t xml:space="preserve">      &lt;LanguageName&gt;Tonga (Nyasa) (tog-Latn-018-x-</w:t>
-      </w:r>
-      <w:proofErr w:type="gramStart"/>
-      <w:r>
-        <w:t>leya)&lt;</w:t>
-      </w:r>
-      <w:proofErr w:type="gramEnd"/>
-      <w:r>
-        <w:t>/LanguageName&gt;</w:t>
+        <w:t xml:space="preserve">      &lt;LanguageName&gt;Tonga (Nyasa) (tog-Latn-018-x-leya)&lt;/LanguageName&gt;</w:t>
       </w:r>
       <w:r>
         <w:br/>
@@ -8205,15 +8141,7 @@
       </w:r>
       <w:r>
         <w:br/>
-        <w:t xml:space="preserve">&lt;Run ws="en"&gt;A contraction is a combination of two lexemes, each of which maintains its own </w:t>
-      </w:r>
-      <w:proofErr w:type="gramStart"/>
-      <w:r>
-        <w:t>meaning.&lt;</w:t>
-      </w:r>
-      <w:proofErr w:type="gramEnd"/>
-      <w:r>
-        <w:t>/Run&gt;</w:t>
+        <w:t>&lt;Run ws="en"&gt;A contraction is a combination of two lexemes, each of which maintains its own meaning.&lt;/Run&gt;</w:t>
       </w:r>
       <w:r>
         <w:br/>
@@ -8387,11 +8315,7 @@
         <w:br/>
       </w:r>
       <w:r>
-        <w:t>&lt;Run ws="en"</w:t>
-      </w:r>
-      <w:proofErr w:type="gramStart"/>
-      <w:r>
-        <w:t>&gt;</w:t>
+        <w:t>&lt;Run ws="en"&gt;</w:t>
       </w:r>
       <w:r>
         <w:rPr>
@@ -8400,11 +8324,7 @@
         <w:t>]</w:t>
       </w:r>
       <w:r>
-        <w:t>&lt;</w:t>
-      </w:r>
-      <w:proofErr w:type="gramEnd"/>
-      <w:r>
-        <w:t>/Run&gt;</w:t>
+        <w:t>&lt;/Run&gt;</w:t>
       </w:r>
       <w:r>
         <w:br/>
@@ -8424,7 +8344,13 @@
         <w:pStyle w:val="BodyText"/>
       </w:pPr>
       <w:r>
-        <w:t>In the FLEx UI, you switch writing systems or styles using the writing system and style combo boxes in the toolbar. Whenever a writing system is changed, FLEx automatically uses the keyboard and font associated with that writing system, or a style that overrides the default font from the Writing System Properties dialog. If the font does not have a glyph for a character in the string, FLEx shows an open box in the display instead of finding a glyph in some related font as is done in Microsoft Word. Note in document view, FLEx is using a web browser view which will substitute glyphs from other fonts, but the data entry fields will show boxes.</w:t>
+        <w:t xml:space="preserve">In the FLEx UI, you switch writing systems or styles using the writing system and style combo boxes in the toolbar. Whenever a writing system is changed, FLEx automatically uses the keyboard and font associated with that writing system, or a style that overrides the default font from the Writing System Properties dialog. If the font does not have a glyph for a character in the string, FLEx shows an open box in the display instead of finding a glyph in some related font as is done in Microsoft Word. Note in </w:t>
+      </w:r>
+      <w:r>
+        <w:t>Dictionary</w:t>
+      </w:r>
+      <w:r>
+        <w:t xml:space="preserve"> view, FLEx is using a web browser view which will substitute glyphs from other fonts, but the data entry fields will show boxes.</w:t>
       </w:r>
     </w:p>
     <w:p>
@@ -8503,15 +8429,7 @@
       </w:r>
       <w:r>
         <w:br/>
-        <w:t>&lt;Run ws="en"</w:t>
-      </w:r>
-      <w:proofErr w:type="gramStart"/>
-      <w:r>
-        <w:t>&gt;.&lt;</w:t>
-      </w:r>
-      <w:proofErr w:type="gramEnd"/>
-      <w:r>
-        <w:t>/Run&gt;</w:t>
+        <w:t>&lt;Run ws="en"&gt;.&lt;/Run&gt;</w:t>
       </w:r>
       <w:r>
         <w:br/>
@@ -8603,15 +8521,7 @@
         <w:t xml:space="preserve"> (e.g., definition, example sentence, example translations, all note fields)</w:t>
       </w:r>
       <w:r>
-        <w:t xml:space="preserve">. Here </w:t>
-      </w:r>
-      <w:proofErr w:type="gramStart"/>
-      <w:r>
-        <w:t>is</w:t>
-      </w:r>
-      <w:proofErr w:type="gramEnd"/>
-      <w:r>
-        <w:t xml:space="preserve"> how these MultiString properties are encoded.</w:t>
+        <w:t>. Here is how these MultiString properties are encoded.</w:t>
       </w:r>
     </w:p>
     <w:p>
@@ -8627,15 +8537,7 @@
       </w:r>
       <w:r>
         <w:br/>
-        <w:t xml:space="preserve">&lt;Run ws="en"&gt;You may damage the </w:t>
-      </w:r>
-      <w:proofErr w:type="gramStart"/>
-      <w:r>
-        <w:t>computer.&lt;</w:t>
-      </w:r>
-      <w:proofErr w:type="gramEnd"/>
-      <w:r>
-        <w:t>/Run&gt;</w:t>
+        <w:t>&lt;Run ws="en"&gt;You may damage the computer.&lt;/Run&gt;</w:t>
       </w:r>
       <w:r>
         <w:br/>
@@ -9672,13 +9574,8 @@
         <w:pStyle w:val="BodyText"/>
       </w:pPr>
       <w:r>
-        <w:t>This is the DateModified property on CmMajorObject. The time is stored in the “val” attribute in the format YYYY-MM-DD HH:</w:t>
-      </w:r>
-      <w:proofErr w:type="gramStart"/>
-      <w:r>
-        <w:t>MM:SS.TTT</w:t>
-      </w:r>
-      <w:proofErr w:type="gramEnd"/>
+        <w:t>This is the DateModified property on CmMajorObject. The time is stored in the “val” attribute in the format YYYY-MM-DD HH:MM:SS.TTT</w:t>
+      </w:r>
       <w:r>
         <w:t xml:space="preserve"> </w:t>
       </w:r>
@@ -10714,15 +10611,7 @@
         <w:t>the deleted</w:t>
       </w:r>
       <w:r>
-        <w:t xml:space="preserve"> object are removed from the referring objects. If something goes wrong and a reference property points to a non-existent object, FLEx will likely crash at some point. The problem can be fixed easily by closing the project, opening another project and running Tools &gt; Utilities &gt; Find and </w:t>
-      </w:r>
-      <w:proofErr w:type="gramStart"/>
-      <w:r>
-        <w:t>fix..</w:t>
-      </w:r>
-      <w:proofErr w:type="gramEnd"/>
-      <w:r>
-        <w:t xml:space="preserve"> and specify the desired project. This will remove any orphaned owning and reference links.</w:t>
+        <w:t xml:space="preserve"> object are removed from the referring objects. If something goes wrong and a reference property points to a non-existent object, FLEx will likely crash at some point. The problem can be fixed easily by closing the project, opening another project and running Tools &gt; Utilities &gt; Find and fix.. and specify the desired project. This will remove any orphaned owning and reference links.</w:t>
       </w:r>
       <w:r>
         <w:t xml:space="preserve"> In the fwdata file, you would remove any orphaned objsur links. If it’s the only link, remove the reference </w:t>
@@ -10955,15 +10844,7 @@
         <w:pStyle w:val="BodyText"/>
       </w:pPr>
       <w:r>
-        <w:t xml:space="preserve">Rather than letting </w:t>
-      </w:r>
-      <w:proofErr w:type="gramStart"/>
-      <w:r>
-        <w:t>users</w:t>
-      </w:r>
-      <w:proofErr w:type="gramEnd"/>
-      <w:r>
-        <w:t xml:space="preserve"> type (and mistype) fixed lists</w:t>
+        <w:t>Rather than letting users type (and mistype) fixed lists</w:t>
       </w:r>
       <w:r>
         <w:t xml:space="preserve">, </w:t>
@@ -11989,15 +11870,7 @@
               <w:pStyle w:val="Tablecells"/>
             </w:pPr>
             <w:r>
-              <w:t xml:space="preserve">Category (Parts </w:t>
-            </w:r>
-            <w:proofErr w:type="gramStart"/>
-            <w:r>
-              <w:t>Of</w:t>
-            </w:r>
-            <w:proofErr w:type="gramEnd"/>
-            <w:r>
-              <w:t xml:space="preserve"> Speech)</w:t>
+              <w:t>Category (Parts Of Speech)</w:t>
             </w:r>
           </w:p>
         </w:tc>
@@ -13799,15 +13672,7 @@
       </w:r>
       <w:r>
         <w:br/>
-        <w:t xml:space="preserve">&lt;Run ws="en"&gt;This is the field </w:t>
-      </w:r>
-      <w:proofErr w:type="gramStart"/>
-      <w:r>
-        <w:t>content.&lt;</w:t>
-      </w:r>
-      <w:proofErr w:type="gramEnd"/>
-      <w:r>
-        <w:t>/Run&gt;</w:t>
+        <w:t>&lt;Run ws="en"&gt;This is the field content.&lt;/Run&gt;</w:t>
       </w:r>
       <w:r>
         <w:br/>
@@ -14189,16 +14054,11 @@
         <w:t xml:space="preserve">Heres </w:t>
       </w:r>
       <w:r>
-        <w:t xml:space="preserve">how this entry would be stored </w:t>
-      </w:r>
-      <w:proofErr w:type="gramStart"/>
-      <w:r>
-        <w:t>in</w:t>
+        <w:t>how this entry would be stored in</w:t>
       </w:r>
       <w:r>
         <w:t xml:space="preserve"> .fwdata</w:t>
       </w:r>
-      <w:proofErr w:type="gramEnd"/>
       <w:r>
         <w:t xml:space="preserve"> with some extra fields removed</w:t>
       </w:r>
@@ -14568,15 +14428,7 @@
         <w:pStyle w:val="BodyText"/>
       </w:pPr>
       <w:r>
-        <w:t xml:space="preserve">Here’s the same sample in </w:t>
-      </w:r>
-      <w:proofErr w:type="gramStart"/>
-      <w:r>
-        <w:t>a .lexdb</w:t>
-      </w:r>
-      <w:proofErr w:type="gramEnd"/>
-      <w:r>
-        <w:t xml:space="preserve"> file</w:t>
+        <w:t>Here’s the same sample in a .lexdb file</w:t>
       </w:r>
       <w:r>
         <w:t xml:space="preserve"> used in Send/Receive</w:t>
@@ -15250,15 +15102,7 @@
         <w:t xml:space="preserve">by typing Zedit into Windows Start or find it </w:t>
       </w:r>
       <w:r>
-        <w:t xml:space="preserve">in c:\Program Files\SIL\FieldWorks 9. </w:t>
-      </w:r>
-      <w:proofErr w:type="gramStart"/>
-      <w:r>
-        <w:t>It</w:t>
-      </w:r>
-      <w:proofErr w:type="gramEnd"/>
-      <w:r>
-        <w:t xml:space="preserve"> </w:t>
+        <w:t xml:space="preserve">in c:\Program Files\SIL\FieldWorks 9. It </w:t>
       </w:r>
       <w:r>
         <w:t>memory-maps the data when a file is opened, so it can open large fwdata files very quickly and can be used to make changes. Just be sure to close the fwdata file before trying to do anything in FLEx that tries to update fwdata, or FLEx will be blocked. Notepad++ takes a lot longer to open a file, but it can remain open while FLEx is being used. One of its advantages is supporting regex for search and replace. In any text editor you can find the desired class by searching for</w:t>
@@ -15424,15 +15268,7 @@
         <w:t>, usually at the destination,</w:t>
       </w:r>
       <w:r>
-        <w:t xml:space="preserve"> there is a number indicating how many objects can be linked with this property. 1 means it’s atomic and </w:t>
-      </w:r>
-      <w:proofErr w:type="gramStart"/>
-      <w:r>
-        <w:t>0..</w:t>
-      </w:r>
-      <w:proofErr w:type="gramEnd"/>
-      <w:r>
-        <w:t>* means it’s a sequence or a collection. A sequence property has (ordered) along the line.</w:t>
+        <w:t xml:space="preserve"> there is a number indicating how many objects can be linked with this property. 1 means it’s atomic and 0..* means it’s a sequence or a collection. A sequence property has (ordered) along the line.</w:t>
       </w:r>
       <w:r>
         <w:t xml:space="preserve"> The property name is given above the line, usually at the source. Class hierarchy is shown sometimes, but not always.</w:t>
@@ -15844,15 +15680,7 @@
         <w:t xml:space="preserve"> </w:t>
       </w:r>
       <w:r>
-        <w:t xml:space="preserve">When false, this class cannot be created in code with a </w:t>
-      </w:r>
-      <w:proofErr w:type="gramStart"/>
-      <w:r>
-        <w:t>Create(</w:t>
-      </w:r>
-      <w:proofErr w:type="gramEnd"/>
-      <w:r>
-        <w:t>) method. Check for required parameters in overrides in both the factory and the class overrides</w:t>
+        <w:t>When false, this class cannot be created in code with a Create() method. Check for required parameters in overrides in both the factory and the class overrides</w:t>
       </w:r>
       <w:r>
         <w:t>.</w:t>
@@ -16046,15 +15874,7 @@
         <w:t xml:space="preserve">What are all of the properties for a given class? </w:t>
       </w:r>
       <w:r>
-        <w:t xml:space="preserve">In the Fields tab </w:t>
-      </w:r>
-      <w:proofErr w:type="gramStart"/>
-      <w:r>
-        <w:t>sort</w:t>
-      </w:r>
-      <w:proofErr w:type="gramEnd"/>
-      <w:r>
-        <w:t xml:space="preserve"> the class names and find the class(</w:t>
+        <w:t>In the Fields tab sort the class names and find the class(</w:t>
       </w:r>
       <w:r>
         <w:t>e</w:t>
@@ -16113,7 +15933,6 @@
       <w:r>
         <w:t xml:space="preserve">. </w:t>
       </w:r>
-      <w:proofErr w:type="gramStart"/>
       <w:r>
         <w:t xml:space="preserve">LCMBrowser.exe </w:t>
       </w:r>
@@ -16121,11 +15940,7 @@
         <w:t xml:space="preserve"> </w:t>
       </w:r>
       <w:r>
-        <w:t>is</w:t>
-      </w:r>
-      <w:proofErr w:type="gramEnd"/>
-      <w:r>
-        <w:t xml:space="preserve"> a program that comes with FieldWorks and can be started by </w:t>
+        <w:t xml:space="preserve">is a program that comes with FieldWorks and can be started by </w:t>
       </w:r>
       <w:r>
         <w:t>typing into the Windows start menu or finding it in c:\Program Files\SIL\FieldWorks 9. The program has a tab for showing the current conceptual model.</w:t>
@@ -16296,23 +16111,7 @@
         <w:pStyle w:val="BodyText"/>
       </w:pPr>
       <w:r>
-        <w:t xml:space="preserve">To see the data in an actual project, choose File &gt; Open Language Project, and navigate to </w:t>
-      </w:r>
-      <w:proofErr w:type="gramStart"/>
-      <w:r>
-        <w:t>an .fwdata</w:t>
-      </w:r>
-      <w:proofErr w:type="gramEnd"/>
-      <w:r>
-        <w:t xml:space="preserve"> file to open. Note, you cannot open a project that is open in FLEx, or one that has </w:t>
-      </w:r>
-      <w:proofErr w:type="gramStart"/>
-      <w:r>
-        <w:t>an .fwdata</w:t>
-      </w:r>
-      <w:proofErr w:type="gramEnd"/>
-      <w:r>
-        <w:t xml:space="preserve">.lock file in the directory. The program will </w:t>
+        <w:t xml:space="preserve">To see the data in an actual project, choose File &gt; Open Language Project, and navigate to an .fwdata file to open. Note, you cannot open a project that is open in FLEx, or one that has an .fwdata.lock file in the directory. The program will </w:t>
       </w:r>
       <w:r>
         <w:t xml:space="preserve">bring up </w:t>
@@ -16976,15 +16775,7 @@
         <w:pStyle w:val="ListNumber"/>
       </w:pPr>
       <w:r>
-        <w:t xml:space="preserve">FieldWorks opens and you can start working. At any </w:t>
-      </w:r>
-      <w:proofErr w:type="gramStart"/>
-      <w:r>
-        <w:t>time</w:t>
-      </w:r>
-      <w:proofErr w:type="gramEnd"/>
-      <w:r>
-        <w:t xml:space="preserve"> you can break execution in the debugger to investigate where it is, look through the stack, set breakpoints, etc. </w:t>
+        <w:t xml:space="preserve">FieldWorks opens and you can start working. At any time you can break execution in the debugger to investigate where it is, look through the stack, set breakpoints, etc. </w:t>
       </w:r>
     </w:p>
     <w:p>
@@ -17395,16 +17186,11 @@
         <w:t>I</w:t>
       </w:r>
       <w:r>
-        <w:t xml:space="preserve">LexEntry </w:t>
-      </w:r>
-      <w:proofErr w:type="gramStart"/>
-      <w:r>
-        <w:t>repository.</w:t>
+        <w:t>LexEntry repository.</w:t>
       </w:r>
       <w:r>
         <w:t>.</w:t>
       </w:r>
-      <w:proofErr w:type="gramEnd"/>
     </w:p>
     <w:p>
       <w:pPr>
@@ -18404,13 +18190,8 @@
         <w:t>”</w:t>
       </w:r>
       <w:r>
-        <w:t xml:space="preserve"> and Prefix: “</w:t>
-      </w:r>
-      <w:proofErr w:type="gramStart"/>
-      <w:r>
-        <w:t>-“</w:t>
-      </w:r>
-      <w:proofErr w:type="gramEnd"/>
+        <w:t xml:space="preserve"> and Prefix: “-“</w:t>
+      </w:r>
       <w:r>
         <w:t xml:space="preserve">.  </w:t>
       </w:r>
@@ -18641,18 +18422,10 @@
         <w:t xml:space="preserve"> In FLEx, the citation form </w:t>
       </w:r>
       <w:r>
-        <w:t xml:space="preserve">is used for this, but </w:t>
-      </w:r>
-      <w:proofErr w:type="gramStart"/>
-      <w:r>
-        <w:t xml:space="preserve">it </w:t>
-      </w:r>
-      <w:r>
-        <w:t xml:space="preserve"> should</w:t>
-      </w:r>
-      <w:proofErr w:type="gramEnd"/>
-      <w:r>
-        <w:t xml:space="preserve"> only be </w:t>
+        <w:t xml:space="preserve">is used for this, but it </w:t>
+      </w:r>
+      <w:r>
+        <w:t xml:space="preserve"> should only be </w:t>
       </w:r>
       <w:r>
         <w:t>used</w:t>
@@ -18822,7 +18595,13 @@
         <w:t xml:space="preserve"> homographs</w:t>
       </w:r>
       <w:r>
-        <w:t xml:space="preserve"> in FLEx using Tools &gt; Utilities &gt; Reassign Homographs. Sometimes you have to use Refresh to get homograph numbers to display correctly after a change. Homograph numbers are automatically adjusted during dictionary views where some entries are excluded from the dictionary.</w:t>
+        <w:t xml:space="preserve"> in FLEx using Tools &gt; Utilities &gt; Reassign Homographs. Sometimes you have to use Refresh to get homograph numbers to display correctly after a change. Homograph numbers are automatically adjusted during dictionary </w:t>
+      </w:r>
+      <w:r>
+        <w:t>layout</w:t>
+      </w:r>
+      <w:r>
+        <w:t>s where some entries are excluded from the dictionary.</w:t>
       </w:r>
     </w:p>
     <w:p>
@@ -20322,24 +20101,14 @@
       <w:r>
         <w:t xml:space="preserve">The data for questions is stored in </w:t>
       </w:r>
-      <w:proofErr w:type="gramStart"/>
       <w:r>
         <w:t>Lexicon.fwstub.ChorusNotes</w:t>
       </w:r>
-      <w:proofErr w:type="gramEnd"/>
       <w:r>
         <w:t xml:space="preserve"> in the project folder. The information is stored in annotation elements</w:t>
       </w:r>
       <w:r>
-        <w:t xml:space="preserve">. Responses and closing information </w:t>
-      </w:r>
-      <w:proofErr w:type="gramStart"/>
-      <w:r>
-        <w:t>is</w:t>
-      </w:r>
-      <w:proofErr w:type="gramEnd"/>
-      <w:r>
-        <w:t xml:space="preserve"> included as additional message elements.</w:t>
+        <w:t>. Responses and closing information is included as additional message elements.</w:t>
       </w:r>
     </w:p>
     <w:p>
@@ -20529,7 +20298,13 @@
         <w:t>R</w:t>
       </w:r>
       <w:r>
-        <w:t>oot-based view.</w:t>
+        <w:t xml:space="preserve">oot-based </w:t>
+      </w:r>
+      <w:r>
+        <w:t>layout</w:t>
+      </w:r>
+      <w:r>
+        <w:t>.</w:t>
       </w:r>
       <w:r>
         <w:t xml:space="preserve"> Showing minor entries is optional. The minor entry can show more information, but typically it’s just a small entry that tells the user where they </w:t>
@@ -20597,7 +20372,10 @@
         <w:t>L</w:t>
       </w:r>
       <w:r>
-        <w:t>exeme-based view</w:t>
+        <w:t xml:space="preserve">exeme-based </w:t>
+      </w:r>
+      <w:r>
+        <w:t>layout</w:t>
       </w:r>
       <w:r>
         <w:t>, we get this display</w:t>
@@ -20813,7 +20591,13 @@
         <w:t>For each PrimaryLexeme, a subentry will be generated for this complex form entry</w:t>
       </w:r>
       <w:r>
-        <w:t xml:space="preserve"> in Root-based views</w:t>
+        <w:t xml:space="preserve"> in Root-based </w:t>
+      </w:r>
+      <w:r>
+        <w:t>layout</w:t>
+      </w:r>
+      <w:r>
+        <w:t>s</w:t>
       </w:r>
       <w:r>
         <w:t>.</w:t>
@@ -20831,7 +20615,13 @@
         <w:t xml:space="preserve">ShowComplexFormsIn </w:t>
       </w:r>
       <w:r>
-        <w:t>references one or more of the entries in ComponentLexemes. For each ShowComplexFormsIn, a complex form will be generated for this complex form entry in Lexeme-based views. This property is changed in the UI at the bottom of the complex form entry by the Referenced Complex Forms field</w:t>
+        <w:t xml:space="preserve">references one or more of the entries in ComponentLexemes. For each ShowComplexFormsIn, a complex form will be generated for this complex form entry in Lexeme-based </w:t>
+      </w:r>
+      <w:r>
+        <w:t>layout</w:t>
+      </w:r>
+      <w:r>
+        <w:t>s. This property is changed in the UI at the bottom of the complex form entry by the Referenced Complex Forms field</w:t>
       </w:r>
       <w:r>
         <w:t>.</w:t>
@@ -23535,15 +23325,7 @@
         <w:pStyle w:val="BodyText"/>
       </w:pPr>
       <w:r>
-        <w:t xml:space="preserve">LexRefType is a subclass of CmPossibility owned in the Lexical Relations </w:t>
-      </w:r>
-      <w:proofErr w:type="gramStart"/>
-      <w:r>
-        <w:t>CmPossibilityList  owned</w:t>
-      </w:r>
-      <w:proofErr w:type="gramEnd"/>
-      <w:r>
-        <w:t xml:space="preserve"> in the References owning property of LexDb, owned in the LexDb atomic owning property of LangProject. The Abbreviation for this object is </w:t>
+        <w:t xml:space="preserve">LexRefType is a subclass of CmPossibility owned in the Lexical Relations CmPossibilityList  owned in the References owning property of LexDb, owned in the LexDb atomic owning property of LangProject. The Abbreviation for this object is </w:t>
       </w:r>
       <w:r>
         <w:t>‘</w:t>
@@ -24427,15 +24209,13 @@
         <w:pStyle w:val="BodyText"/>
       </w:pPr>
       <w:r>
-        <w:t xml:space="preserve">When one of the Entry types are used, everything works the same except the links are to entries instead of senses, and the relations would show up under Cross References instead of Lexical Relations in Lexicon Edit and Dictionary views. An ‘Entry </w:t>
-      </w:r>
-      <w:proofErr w:type="gramStart"/>
-      <w:r>
-        <w:t>Or</w:t>
-      </w:r>
-      <w:proofErr w:type="gramEnd"/>
-      <w:r>
-        <w:t xml:space="preserve"> Sense’ type would allow either Entries or Senses in the set.</w:t>
+        <w:t xml:space="preserve">When one of the Entry types are used, everything works the same except the links are to entries instead of senses, and the relations would show up under Cross References instead of Lexical Relations in Lexicon Edit and Dictionary </w:t>
+      </w:r>
+      <w:r>
+        <w:t>layout</w:t>
+      </w:r>
+      <w:r>
+        <w:t>s. An ‘Entry Or Sense’ type would allow either Entries or Senses in the set.</w:t>
       </w:r>
     </w:p>
     <w:p>
@@ -24449,23 +24229,7 @@
         <w:t>Caution</w:t>
       </w:r>
       <w:r>
-        <w:t xml:space="preserve">: Items in the Lexical Relations list are not simply </w:t>
-      </w:r>
-      <w:proofErr w:type="gramStart"/>
-      <w:r>
-        <w:t>objects</w:t>
-      </w:r>
-      <w:proofErr w:type="gramEnd"/>
-      <w:r>
-        <w:t xml:space="preserve"> that are referenced by other objects. Each item in this list also owns a collection of all of the lexical relation sets that are specified for this type of relation. </w:t>
-      </w:r>
-      <w:proofErr w:type="gramStart"/>
-      <w:r>
-        <w:t>So</w:t>
-      </w:r>
-      <w:proofErr w:type="gramEnd"/>
-      <w:r>
-        <w:t xml:space="preserve"> deleting an item in this list removes every instance of that type of relation. When a user tries to delete these, FLEx gives a warning message indicating how many relations will be delete</w:t>
+        <w:t>: Items in the Lexical Relations list are not simply objects that are referenced by other objects. Each item in this list also owns a collection of all of the lexical relation sets that are specified for this type of relation. So deleting an item in this list removes every instance of that type of relation. When a user tries to delete these, FLEx gives a warning message indicating how many relations will be delete</w:t>
       </w:r>
       <w:r>
         <w:t>d</w:t>
@@ -24833,15 +24597,7 @@
         <w:pStyle w:val="BodyText"/>
       </w:pPr>
       <w:r>
-        <w:t xml:space="preserve">Reversal indexes are sorted and filtered using the Bulk Edit Reversal Entries tool in Lexicon Edit. The collation comes from the writing system of the reversal index. Sorting in this area only affects the main reversal entries. To sort the reversal </w:t>
-      </w:r>
-      <w:proofErr w:type="gramStart"/>
-      <w:r>
-        <w:t>subentries</w:t>
-      </w:r>
-      <w:proofErr w:type="gramEnd"/>
-      <w:r>
-        <w:t xml:space="preserve"> you have to use Tools &gt; Utilities &gt; “Sort Reversal Subentries</w:t>
+        <w:t>Reversal indexes are sorted and filtered using the Bulk Edit Reversal Entries tool in Lexicon Edit. The collation comes from the writing system of the reversal index. Sorting in this area only affects the main reversal entries. To sort the reversal subentries you have to use Tools &gt; Utilities &gt; “Sort Reversal Subentries</w:t>
       </w:r>
       <w:r>
         <w:t>”</w:t>
@@ -24990,15 +24746,7 @@
         <w:t xml:space="preserve"> Pictures are normally stored in a CmFolder in this property with a name “Local Pictures”. </w:t>
       </w:r>
       <w:r>
-        <w:t xml:space="preserve">CmFolder has an owning collection Files property that owns CmFile objects. CmFile has a Unicode InternalPath property to record the location of a picture file. This path is normally a relative path starting at the project LinkedFiles directory, so it would include the Pictures folder as part of the path. Files can be located outside the project folder, and in that </w:t>
-      </w:r>
-      <w:proofErr w:type="gramStart"/>
-      <w:r>
-        <w:t>case</w:t>
-      </w:r>
-      <w:proofErr w:type="gramEnd"/>
-      <w:r>
-        <w:t xml:space="preserve"> it would be a full path to the file on the hard drive. CmFile has other properties</w:t>
+        <w:t>CmFolder has an owning collection Files property that owns CmFile objects. CmFile has a Unicode InternalPath property to record the location of a picture file. This path is normally a relative path starting at the project LinkedFiles directory, so it would include the Pictures folder as part of the path. Files can be located outside the project folder, and in that case it would be a full path to the file on the hard drive. CmFile has other properties</w:t>
       </w:r>
       <w:r>
         <w:t xml:space="preserve"> that are not used in FLEx.</w:t>
@@ -25142,7 +24890,13 @@
         <w:pStyle w:val="BodyText"/>
       </w:pPr>
       <w:r>
-        <w:t>The sample project has the order switched in the ‘lion’ entry in Lexeme-based view by changing the “Referenced Complex Forms” field at the bottom of the entry.</w:t>
+        <w:t xml:space="preserve">The sample project has the order switched in the ‘lion’ entry in Lexeme-based </w:t>
+      </w:r>
+      <w:r>
+        <w:t>layout</w:t>
+      </w:r>
+      <w:r>
+        <w:t xml:space="preserve"> by changing the “Referenced Complex Forms” field at the bottom of the entry.</w:t>
       </w:r>
     </w:p>
     <w:p>
@@ -25297,7 +25051,13 @@
         <w:t xml:space="preserve">multiple publications where </w:t>
       </w:r>
       <w:r>
-        <w:t xml:space="preserve">each publication can pick which parts of the data to include in that publication. This filter, along with custom Dictionary Configuration views for selecting what fields to include and how to format them provides a flexible way of using the </w:t>
+        <w:t xml:space="preserve">each publication can pick which parts of the data to include in that publication. This filter, along with custom Dictionary Configuration </w:t>
+      </w:r>
+      <w:r>
+        <w:t>layout</w:t>
+      </w:r>
+      <w:r>
+        <w:t xml:space="preserve">s for selecting what fields to include and how to format them provides a flexible way of using the </w:t>
       </w:r>
       <w:r>
         <w:t xml:space="preserve">same </w:t>
@@ -25559,7 +25319,19 @@
         <w:t>’</w:t>
       </w:r>
       <w:r>
-        <w:t xml:space="preserve"> removed from the Publish Entry In field. In the Dictionary view, if you choose the Limited publication from the left chooser in the title bar, you will see that ‘lionceaux’ no longer shows in the dictionary view. But if you choose the Main Dictionary publication, then ‘lionceaux’ is included.</w:t>
+        <w:t xml:space="preserve"> removed from the Publish Entry In field. In the Dictionary </w:t>
+      </w:r>
+      <w:r>
+        <w:t>layout</w:t>
+      </w:r>
+      <w:r>
+        <w:t xml:space="preserve">, if you choose the Limited publication from the left chooser in the title bar, you will see that ‘lionceaux’ no longer shows in the dictionary </w:t>
+      </w:r>
+      <w:r>
+        <w:t>layout</w:t>
+      </w:r>
+      <w:r>
+        <w:t>. But if you choose the Main Dictionary publication, then ‘lionceaux’ is included.</w:t>
       </w:r>
     </w:p>
     <w:p>
@@ -25652,15 +25424,7 @@
         <w:t>s</w:t>
       </w:r>
       <w:r>
-        <w:t xml:space="preserve"> from these lists to provide the features they want. The core part of the grammar is the Parts </w:t>
-      </w:r>
-      <w:proofErr w:type="gramStart"/>
-      <w:r>
-        <w:t>Of</w:t>
-      </w:r>
-      <w:proofErr w:type="gramEnd"/>
-      <w:r>
-        <w:t xml:space="preserve"> Speech list seen in the Category Edit </w:t>
+        <w:t xml:space="preserve"> from these lists to provide the features they want. The core part of the grammar is the Parts Of Speech list seen in the Category Edit </w:t>
       </w:r>
       <w:r>
         <w:t>tool in the Grammar area</w:t>
@@ -25718,15 +25482,7 @@
         <w:t>paradigm</w:t>
       </w:r>
       <w:r>
-        <w:t xml:space="preserve">. Only the </w:t>
-      </w:r>
-      <w:proofErr w:type="gramStart"/>
-      <w:r>
-        <w:t>first and third person</w:t>
-      </w:r>
-      <w:proofErr w:type="gramEnd"/>
-      <w:r>
-        <w:t xml:space="preserve"> suffixes are currently defined. This can parse the verb ‘manger’ into ‘mange’ for first person singular (I eat), and ‘mangeons’ for third person singular (we eat).</w:t>
+        <w:t>. Only the first and third person suffixes are currently defined. This can parse the verb ‘manger’ into ‘mange’ for first person singular (I eat), and ‘mangeons’ for third person singular (we eat).</w:t>
       </w:r>
       <w:r>
         <w:t xml:space="preserve"> </w:t>
@@ -25873,6 +25629,9 @@
         <w:pStyle w:val="Example"/>
       </w:pPr>
       <w:r>
+        <w:rPr>
+          <w:noProof/>
+        </w:rPr>
         <w:drawing>
           <wp:inline distT="0" distB="0" distL="0" distR="0" wp14:anchorId="20E1ED05" wp14:editId="164E8CE5">
             <wp:extent cx="4915586" cy="4134427"/>
@@ -26053,6 +25812,9 @@
         <w:pStyle w:val="Example"/>
       </w:pPr>
       <w:r>
+        <w:rPr>
+          <w:noProof/>
+        </w:rPr>
         <w:drawing>
           <wp:inline distT="0" distB="0" distL="0" distR="0" wp14:anchorId="28F78496" wp14:editId="0723EAC4">
             <wp:extent cx="3119988" cy="2562225"/>
@@ -26132,15 +25894,7 @@
         <w:t xml:space="preserve">In the </w:t>
       </w:r>
       <w:r>
-        <w:t xml:space="preserve">entry for ‘manger’, we specify the lexeme form as ‘mang’ and the citation form as ‘manger’. In the Grammatical Info Details </w:t>
-      </w:r>
-      <w:proofErr w:type="gramStart"/>
-      <w:r>
-        <w:t>section</w:t>
-      </w:r>
-      <w:proofErr w:type="gramEnd"/>
-      <w:r>
-        <w:t xml:space="preserve"> the entry is classified as a verb, and the Inflection Class is set to ER Verbs.</w:t>
+        <w:t>entry for ‘manger’, we specify the lexeme form as ‘mang’ and the citation form as ‘manger’. In the Grammatical Info Details section the entry is classified as a verb, and the Inflection Class is set to ER Verbs.</w:t>
       </w:r>
     </w:p>
     <w:p>
@@ -26262,6 +26016,9 @@
         <w:pStyle w:val="Example"/>
       </w:pPr>
       <w:r>
+        <w:rPr>
+          <w:noProof/>
+        </w:rPr>
         <w:lastRenderedPageBreak/>
         <w:drawing>
           <wp:inline distT="0" distB="0" distL="0" distR="0" wp14:anchorId="3BCE2B61" wp14:editId="3CB57CF4">
@@ -27684,15 +27441,7 @@
         <w:t xml:space="preserve">Search </w:t>
       </w:r>
       <w:r>
-        <w:t>&lt;rt class="PunctuationForm</w:t>
-      </w:r>
-      <w:proofErr w:type="gramStart"/>
-      <w:r>
-        <w:t>".*</w:t>
-      </w:r>
-      <w:proofErr w:type="gramEnd"/>
-      <w:r>
-        <w:t>\r\n&lt;Form&gt;\r\n&lt;Str&gt;\r\n&lt;Run.*\r\n&lt;/Str&gt;\r\n&lt;/Form&gt;\r\n&lt;/rt&gt;\r\n</w:t>
+        <w:t>&lt;rt class="PunctuationForm".*\r\n&lt;Form&gt;\r\n&lt;Str&gt;\r\n&lt;Run.*\r\n&lt;/Str&gt;\r\n&lt;/Form&gt;\r\n&lt;/rt&gt;\r\n</w:t>
       </w:r>
       <w:r>
         <w:br/>
@@ -28710,16 +28459,11 @@
       </w:r>
       <w:r>
         <w:br/>
-        <w:t>&lt;objsur guid="b0460a42-7e19-460e-9ec8-4779c4a5f3ff" t="r" /</w:t>
-      </w:r>
-      <w:proofErr w:type="gramStart"/>
-      <w:r>
-        <w:t>&gt;</w:t>
+        <w:t>&lt;objsur guid="b0460a42-7e19-460e-9ec8-4779c4a5f3ff" t="r" /&gt;</w:t>
       </w:r>
       <w:r>
         <w:t xml:space="preserve">  Le</w:t>
       </w:r>
-      <w:proofErr w:type="gramEnd"/>
       <w:r>
         <w:br/>
         <w:t xml:space="preserve">&lt;objsur guid="7dec7244-62f4-441f-bfc9-c9564093c2f0" t="r" /&gt; </w:t>
@@ -28755,15 +28499,7 @@
       </w:r>
       <w:r>
         <w:br/>
-        <w:t>&lt;objsur guid="41581e3a-7ed3-41ac-94c7-6e91dbcc108b" t="r" /</w:t>
-      </w:r>
-      <w:proofErr w:type="gramStart"/>
-      <w:r>
-        <w:t>&gt;  &lt;</w:t>
-      </w:r>
-      <w:proofErr w:type="gramEnd"/>
-      <w:r>
-        <w:t>-  Computer approves</w:t>
+        <w:t>&lt;objsur guid="41581e3a-7ed3-41ac-94c7-6e91dbcc108b" t="r" /&gt;  &lt;-  Computer approves</w:t>
       </w:r>
       <w:r>
         <w:br/>
@@ -28965,15 +28701,7 @@
         <w:pStyle w:val="BodyText"/>
       </w:pPr>
       <w:r>
-        <w:t xml:space="preserve">In the Interlinear Text Tagging </w:t>
-      </w:r>
-      <w:proofErr w:type="gramStart"/>
-      <w:r>
-        <w:t>tab</w:t>
-      </w:r>
-      <w:proofErr w:type="gramEnd"/>
-      <w:r>
-        <w:t xml:space="preserve"> you can highlight a string of wordforms and right-click to choose a tag to assign to these wordforms.</w:t>
+        <w:t>In the Interlinear Text Tagging tab you can highlight a string of wordforms and right-click to choose a tag to assign to these wordforms.</w:t>
       </w:r>
       <w:r>
         <w:t xml:space="preserve"> You can choose from more than one level.</w:t>
@@ -29184,15 +28912,7 @@
         <w:t>S</w:t>
       </w:r>
       <w:r>
-        <w:t xml:space="preserve">egment. The Segment here is showing the wordforms following the index into the Analyses list. The top and bottom TextTag </w:t>
-      </w:r>
-      <w:proofErr w:type="gramStart"/>
-      <w:r>
-        <w:t>objects  reference</w:t>
-      </w:r>
-      <w:proofErr w:type="gramEnd"/>
-      <w:r>
-        <w:t xml:space="preserve"> two </w:t>
+        <w:t xml:space="preserve">egment. The Segment here is showing the wordforms following the index into the Analyses list. The top and bottom TextTag objects  reference two </w:t>
       </w:r>
       <w:r>
         <w:t>subitems</w:t>
@@ -30539,15 +30259,7 @@
         <w:pStyle w:val="ListBullet"/>
       </w:pPr>
       <w:r>
-        <w:t>it appends Footnote(</w:t>
-      </w:r>
-      <w:proofErr w:type="gramStart"/>
-      <w:r>
-        <w:t>c:v</w:t>
-      </w:r>
-      <w:proofErr w:type="gramEnd"/>
-      <w:r>
-        <w:t>) for ScrFootnote with the chapter and verse number in parentheses.</w:t>
+        <w:t>it appends Footnote(c:v) for ScrFootnote with the chapter and verse number in parentheses.</w:t>
       </w:r>
     </w:p>
     <w:p>
@@ -31212,7 +30924,7 @@
       <w:rPr>
         <w:noProof/>
       </w:rPr>
-      <w:t>6/11/2025</w:t>
+      <w:t>2/10/2026</w:t>
     </w:r>
     <w:r>
       <w:fldChar w:fldCharType="end"/>
@@ -31259,7 +30971,7 @@
         <w:rStyle w:val="PageNumber"/>
         <w:noProof/>
       </w:rPr>
-      <w:t>6/11/2025</w:t>
+      <w:t>2/10/2026</w:t>
     </w:r>
     <w:r>
       <w:rPr>
@@ -31380,15 +31092,29 @@
       </w:rPr>
       <w:tab/>
     </w:r>
-    <w:fldSimple w:instr=" STYLEREF &quot;Heading 1&quot; \* MERGEFORMAT ">
-      <w:r>
-        <w:rPr>
-          <w:rStyle w:val="PageNumber"/>
-          <w:noProof/>
-        </w:rPr>
-        <w:t>Introduction</w:t>
-      </w:r>
-    </w:fldSimple>
+    <w:r>
+      <w:fldChar w:fldCharType="begin"/>
+    </w:r>
+    <w:r>
+      <w:instrText xml:space="preserve"> STYLEREF "Heading 1" \* MERGEFORMAT </w:instrText>
+    </w:r>
+    <w:r>
+      <w:fldChar w:fldCharType="separate"/>
+    </w:r>
+    <w:r>
+      <w:rPr>
+        <w:rStyle w:val="PageNumber"/>
+        <w:noProof/>
+      </w:rPr>
+      <w:t>Introduction</w:t>
+    </w:r>
+    <w:r>
+      <w:rPr>
+        <w:rStyle w:val="PageNumber"/>
+        <w:noProof/>
+      </w:rPr>
+      <w:fldChar w:fldCharType="end"/>
+    </w:r>
   </w:p>
 </w:hdr>
 </file>
@@ -35248,7 +34974,7 @@
 </file>
 
 <file path=customXml/itemProps1.xml><?xml version="1.0" encoding="utf-8"?>
-<ds:datastoreItem xmlns:ds="http://schemas.openxmlformats.org/officeDocument/2006/customXml" ds:itemID="{26F84EC0-50F3-4C09-8161-B0BDECB3AA61}">
+<ds:datastoreItem xmlns:ds="http://schemas.openxmlformats.org/officeDocument/2006/customXml" ds:itemID="{9FB997AC-B502-465F-B395-8290E2432027}">
   <ds:schemaRefs>
     <ds:schemaRef ds:uri="http://schemas.openxmlformats.org/officeDocument/2006/bibliography"/>
   </ds:schemaRefs>

</xml_diff>